<commit_message>
Shto referencat e punimit dhe zgjero fjalorin
28 referenca ne formatin e shabllonit UBT: 8 burime qe sistemi i zbaton
drejtperdrejt, 5 metodologjike, 14 pune e lidhur per Kapitullin 2, dhe mjetet.
Renditja alfabetike pa u prishur nga diakritika.

Lista rrjedh nga references.py, jo e shkruar me dore ne dokument, qe citimi ne
tekst dhe lista te mos ndahen nga njeri-tjetri.

Fjalori mbulon tani cdo shkurtese qe del ne Kapitullin 5.
</commit_message>
<xml_diff>
--- a/docs/thesis/Punim_Diplome_Florent_Latifi.docx
+++ b/docs/thesis/Punim_Diplome_Florent_Latifi.docx
@@ -987,6 +987,262 @@
     </w:p>
     <w:p>
       <w:pPr>
+        <w:pStyle w:val="ListBullet"/>
+        <w:spacing w:line="360" w:lineRule="auto"/>
+        <w:jc w:val="both"/>
+      </w:pPr>
+      <w:r>
+        <w:rPr>
+          <w:rFonts w:ascii="Times New Roman" w:hAnsi="Times New Roman" w:eastAsia="Times New Roman"/>
+          <w:b w:val="0"/>
+          <w:caps w:val="0"/>
+          <w:sz w:val="24"/>
+        </w:rPr>
+        <w:t>AMW - Average Method Weight, pesha mesatare e metodave</w:t>
+      </w:r>
+    </w:p>
+    <w:p>
+      <w:pPr>
+        <w:pStyle w:val="ListBullet"/>
+        <w:spacing w:line="360" w:lineRule="auto"/>
+        <w:jc w:val="both"/>
+      </w:pPr>
+      <w:r>
+        <w:rPr>
+          <w:rFonts w:ascii="Times New Roman" w:hAnsi="Times New Roman" w:eastAsia="Times New Roman"/>
+          <w:b w:val="0"/>
+          <w:caps w:val="0"/>
+          <w:sz w:val="24"/>
+        </w:rPr>
+        <w:t>CINT - Coupling Intensity, intensiteti i lidhshmërisë së një metode</w:t>
+      </w:r>
+    </w:p>
+    <w:p>
+      <w:pPr>
+        <w:pStyle w:val="ListBullet"/>
+        <w:spacing w:line="360" w:lineRule="auto"/>
+        <w:jc w:val="both"/>
+      </w:pPr>
+      <w:r>
+        <w:rPr>
+          <w:rFonts w:ascii="Times New Roman" w:hAnsi="Times New Roman" w:eastAsia="Times New Roman"/>
+          <w:b w:val="0"/>
+          <w:caps w:val="0"/>
+          <w:sz w:val="24"/>
+        </w:rPr>
+        <w:t>CLOC - Class Lines of Code, rreshtat efektivë të një klase</w:t>
+      </w:r>
+    </w:p>
+    <w:p>
+      <w:pPr>
+        <w:pStyle w:val="ListBullet"/>
+        <w:spacing w:line="360" w:lineRule="auto"/>
+        <w:jc w:val="both"/>
+      </w:pPr>
+      <w:r>
+        <w:rPr>
+          <w:rFonts w:ascii="Times New Roman" w:hAnsi="Times New Roman" w:eastAsia="Times New Roman"/>
+          <w:b w:val="0"/>
+          <w:caps w:val="0"/>
+          <w:sz w:val="24"/>
+        </w:rPr>
+        <w:t>F1 - mesatarja harmonike e precizionit dhe recall-it</w:t>
+      </w:r>
+    </w:p>
+    <w:p>
+      <w:pPr>
+        <w:pStyle w:val="ListBullet"/>
+        <w:spacing w:line="360" w:lineRule="auto"/>
+        <w:jc w:val="both"/>
+      </w:pPr>
+      <w:r>
+        <w:rPr>
+          <w:rFonts w:ascii="Times New Roman" w:hAnsi="Times New Roman" w:eastAsia="Times New Roman"/>
+          <w:b w:val="0"/>
+          <w:caps w:val="0"/>
+          <w:sz w:val="24"/>
+        </w:rPr>
+        <w:t>GroupKFold - ndarje me grupe, ku çdo depo bie e tëra në një fold</w:t>
+      </w:r>
+    </w:p>
+    <w:p>
+      <w:pPr>
+        <w:pStyle w:val="ListBullet"/>
+        <w:spacing w:line="360" w:lineRule="auto"/>
+        <w:jc w:val="both"/>
+      </w:pPr>
+      <w:r>
+        <w:rPr>
+          <w:rFonts w:ascii="Times New Roman" w:hAnsi="Times New Roman" w:eastAsia="Times New Roman"/>
+          <w:b w:val="0"/>
+          <w:caps w:val="0"/>
+          <w:sz w:val="24"/>
+        </w:rPr>
+        <w:t>MAXCC - kompleksiteti maksimal ciklomatik në një klasë</w:t>
+      </w:r>
+    </w:p>
+    <w:p>
+      <w:pPr>
+        <w:pStyle w:val="ListBullet"/>
+        <w:spacing w:line="360" w:lineRule="auto"/>
+        <w:jc w:val="both"/>
+      </w:pPr>
+      <w:r>
+        <w:rPr>
+          <w:rFonts w:ascii="Times New Roman" w:hAnsi="Times New Roman" w:eastAsia="Times New Roman"/>
+          <w:b w:val="0"/>
+          <w:caps w:val="0"/>
+          <w:sz w:val="24"/>
+        </w:rPr>
+        <w:t>MAXNESTING - thellësia maksimale e ndërfutjes së blloqeve</w:t>
+      </w:r>
+    </w:p>
+    <w:p>
+      <w:pPr>
+        <w:pStyle w:val="ListBullet"/>
+        <w:spacing w:line="360" w:lineRule="auto"/>
+        <w:jc w:val="both"/>
+      </w:pPr>
+      <w:r>
+        <w:rPr>
+          <w:rFonts w:ascii="Times New Roman" w:hAnsi="Times New Roman" w:eastAsia="Times New Roman"/>
+          <w:b w:val="0"/>
+          <w:caps w:val="0"/>
+          <w:sz w:val="24"/>
+        </w:rPr>
+        <w:t>MCC - Matthews Correlation Coefficient, koeficienti i korrelacionit i Matthews-it</w:t>
+      </w:r>
+    </w:p>
+    <w:p>
+      <w:pPr>
+        <w:pStyle w:val="ListBullet"/>
+        <w:spacing w:line="360" w:lineRule="auto"/>
+        <w:jc w:val="both"/>
+      </w:pPr>
+      <w:r>
+        <w:rPr>
+          <w:rFonts w:ascii="Times New Roman" w:hAnsi="Times New Roman" w:eastAsia="Times New Roman"/>
+          <w:b w:val="0"/>
+          <w:caps w:val="0"/>
+          <w:sz w:val="24"/>
+        </w:rPr>
+        <w:t>MLOC - Method Lines of Code, rreshtat efektivë të një metode</w:t>
+      </w:r>
+    </w:p>
+    <w:p>
+      <w:pPr>
+        <w:pStyle w:val="ListBullet"/>
+        <w:spacing w:line="360" w:lineRule="auto"/>
+        <w:jc w:val="both"/>
+      </w:pPr>
+      <w:r>
+        <w:rPr>
+          <w:rFonts w:ascii="Times New Roman" w:hAnsi="Times New Roman" w:eastAsia="Times New Roman"/>
+          <w:b w:val="0"/>
+          <w:caps w:val="0"/>
+          <w:sz w:val="24"/>
+        </w:rPr>
+        <w:t>NOAM - Number of Accessor Methods, numri i akses-metodave</w:t>
+      </w:r>
+    </w:p>
+    <w:p>
+      <w:pPr>
+        <w:pStyle w:val="ListBullet"/>
+        <w:spacing w:line="360" w:lineRule="auto"/>
+        <w:jc w:val="both"/>
+      </w:pPr>
+      <w:r>
+        <w:rPr>
+          <w:rFonts w:ascii="Times New Roman" w:hAnsi="Times New Roman" w:eastAsia="Times New Roman"/>
+          <w:b w:val="0"/>
+          <w:caps w:val="0"/>
+          <w:sz w:val="24"/>
+        </w:rPr>
+        <w:t>NOAV - Number of Accessed Variables, numri i variablave të prekura</w:t>
+      </w:r>
+    </w:p>
+    <w:p>
+      <w:pPr>
+        <w:pStyle w:val="ListBullet"/>
+        <w:spacing w:line="360" w:lineRule="auto"/>
+        <w:jc w:val="both"/>
+      </w:pPr>
+      <w:r>
+        <w:rPr>
+          <w:rFonts w:ascii="Times New Roman" w:hAnsi="Times New Roman" w:eastAsia="Times New Roman"/>
+          <w:b w:val="0"/>
+          <w:caps w:val="0"/>
+          <w:sz w:val="24"/>
+        </w:rPr>
+        <w:t>NOF - Number of Fields, numri i fushave</w:t>
+      </w:r>
+    </w:p>
+    <w:p>
+      <w:pPr>
+        <w:pStyle w:val="ListBullet"/>
+        <w:spacing w:line="360" w:lineRule="auto"/>
+        <w:jc w:val="both"/>
+      </w:pPr>
+      <w:r>
+        <w:rPr>
+          <w:rFonts w:ascii="Times New Roman" w:hAnsi="Times New Roman" w:eastAsia="Times New Roman"/>
+          <w:b w:val="0"/>
+          <w:caps w:val="0"/>
+          <w:sz w:val="24"/>
+        </w:rPr>
+        <w:t>NOM - Number of Methods, numri i metodave</w:t>
+      </w:r>
+    </w:p>
+    <w:p>
+      <w:pPr>
+        <w:pStyle w:val="ListBullet"/>
+        <w:spacing w:line="360" w:lineRule="auto"/>
+        <w:jc w:val="both"/>
+      </w:pPr>
+      <w:r>
+        <w:rPr>
+          <w:rFonts w:ascii="Times New Roman" w:hAnsi="Times New Roman" w:eastAsia="Times New Roman"/>
+          <w:b w:val="0"/>
+          <w:caps w:val="0"/>
+          <w:sz w:val="24"/>
+        </w:rPr>
+        <w:t>NOPA - Number of Public Attributes, numri i atributeve publike</w:t>
+      </w:r>
+    </w:p>
+    <w:p>
+      <w:pPr>
+        <w:pStyle w:val="ListBullet"/>
+        <w:spacing w:line="360" w:lineRule="auto"/>
+        <w:jc w:val="both"/>
+      </w:pPr>
+      <w:r>
+        <w:rPr>
+          <w:rFonts w:ascii="Times New Roman" w:hAnsi="Times New Roman" w:eastAsia="Times New Roman"/>
+          <w:b w:val="0"/>
+          <w:caps w:val="0"/>
+          <w:sz w:val="24"/>
+        </w:rPr>
+        <w:t>NP - Number of Parameters, numri i parametrave</w:t>
+      </w:r>
+    </w:p>
+    <w:p>
+      <w:pPr>
+        <w:pStyle w:val="ListBullet"/>
+        <w:spacing w:line="360" w:lineRule="auto"/>
+        <w:jc w:val="both"/>
+      </w:pPr>
+      <w:r>
+        <w:rPr>
+          <w:rFonts w:ascii="Times New Roman" w:hAnsi="Times New Roman" w:eastAsia="Times New Roman"/>
+          <w:b w:val="0"/>
+          <w:caps w:val="0"/>
+          <w:sz w:val="24"/>
+        </w:rPr>
+        <w:t>κ - kappa e Cohen-it, pajtimi mes dy vlerësuesve përtej rastësisë</w:t>
+      </w:r>
+    </w:p>
+    <w:p>
+      <w:pPr>
         <w:sectPr>
           <w:footerReference w:type="default" r:id="rId10"/>
           <w:pgSz w:w="12240" w:h="15840"/>
@@ -1668,9 +1924,7 @@
     </w:p>
     <w:p>
       <w:pPr>
-        <w:spacing w:line="360" w:lineRule="auto"/>
-        <w:ind w:firstLine="360"/>
-        <w:jc w:val="both"/>
+        <w:ind w:left="720" w:hanging="720"/>
       </w:pPr>
       <w:r>
         <w:rPr>
@@ -1679,7 +1933,441 @@
           <w:caps w:val="0"/>
           <w:sz w:val="24"/>
         </w:rPr>
-        <w:t>[PLOTËSO]</w:t>
+        <w:t>[1]</w:t>
+        <w:tab/>
+        <w:t>Arcelli Fontana, F., Mäntylä, M. V., Zanoni, M. &amp; Marino, A. 2016. “Comparing and experimenting machine learning techniques for code smell detection.” Empirical Software Engineering, 21(3), pp. 1143-1191.</w:t>
+      </w:r>
+    </w:p>
+    <w:p>
+      <w:pPr>
+        <w:ind w:left="720" w:hanging="720"/>
+      </w:pPr>
+      <w:r>
+        <w:rPr>
+          <w:rFonts w:ascii="Times New Roman" w:hAnsi="Times New Roman" w:eastAsia="Times New Roman"/>
+          <w:b w:val="0"/>
+          <w:caps w:val="0"/>
+          <w:sz w:val="24"/>
+        </w:rPr>
+        <w:t>[2]</w:t>
+        <w:tab/>
+        <w:t>Azeem, M. I., Palomba, F., Shi, L. &amp; Wang, Q. 2019. “Machine learning techniques for code smell detection: A systematic literature review and meta-analysis.” Information and Software Technology, 108, pp. 115-138.</w:t>
+      </w:r>
+    </w:p>
+    <w:p>
+      <w:pPr>
+        <w:ind w:left="720" w:hanging="720"/>
+      </w:pPr>
+      <w:r>
+        <w:rPr>
+          <w:rFonts w:ascii="Times New Roman" w:hAnsi="Times New Roman" w:eastAsia="Times New Roman"/>
+          <w:b w:val="0"/>
+          <w:caps w:val="0"/>
+          <w:sz w:val="24"/>
+        </w:rPr>
+        <w:t>[3]</w:t>
+        <w:tab/>
+        <w:t>Bieman, J. M. &amp; Kang, B.-K. 1995. “Cohesion and Reuse in an Object-Oriented System.” Proceedings of the ACM Symposium on Software Reusability (SSR ’95), pp. 259-262.</w:t>
+      </w:r>
+    </w:p>
+    <w:p>
+      <w:pPr>
+        <w:ind w:left="720" w:hanging="720"/>
+      </w:pPr>
+      <w:r>
+        <w:rPr>
+          <w:rFonts w:ascii="Times New Roman" w:hAnsi="Times New Roman" w:eastAsia="Times New Roman"/>
+          <w:b w:val="0"/>
+          <w:caps w:val="0"/>
+          <w:sz w:val="24"/>
+        </w:rPr>
+        <w:t>[4]</w:t>
+        <w:tab/>
+        <w:t>Breiman, L. 2001. “Random Forests.” Machine Learning, 45(1), pp. 5-32.</w:t>
+      </w:r>
+    </w:p>
+    <w:p>
+      <w:pPr>
+        <w:ind w:left="720" w:hanging="720"/>
+      </w:pPr>
+      <w:r>
+        <w:rPr>
+          <w:rFonts w:ascii="Times New Roman" w:hAnsi="Times New Roman" w:eastAsia="Times New Roman"/>
+          <w:b w:val="0"/>
+          <w:caps w:val="0"/>
+          <w:sz w:val="24"/>
+        </w:rPr>
+        <w:t>[5]</w:t>
+        <w:tab/>
+        <w:t>Brunsfeld, M. et al. tree-sitter: An incremental parsing system for programming tools. [https://tree-sitter.github.io/tree-sitter/], data e qasjes: [PLOTËSO].</w:t>
+      </w:r>
+    </w:p>
+    <w:p>
+      <w:pPr>
+        <w:ind w:left="720" w:hanging="720"/>
+      </w:pPr>
+      <w:r>
+        <w:rPr>
+          <w:rFonts w:ascii="Times New Roman" w:hAnsi="Times New Roman" w:eastAsia="Times New Roman"/>
+          <w:b w:val="0"/>
+          <w:caps w:val="0"/>
+          <w:sz w:val="24"/>
+        </w:rPr>
+        <w:t>[6]</w:t>
+        <w:tab/>
+        <w:t>Chidamber, S. R. &amp; Kemerer, C. F. 1994. “A Metrics Suite for Object Oriented Design.” IEEE Transactions on Software Engineering, 20(6), pp. 476-493.</w:t>
+      </w:r>
+    </w:p>
+    <w:p>
+      <w:pPr>
+        <w:ind w:left="720" w:hanging="720"/>
+      </w:pPr>
+      <w:r>
+        <w:rPr>
+          <w:rFonts w:ascii="Times New Roman" w:hAnsi="Times New Roman" w:eastAsia="Times New Roman"/>
+          <w:b w:val="0"/>
+          <w:caps w:val="0"/>
+          <w:sz w:val="24"/>
+        </w:rPr>
+        <w:t>[7]</w:t>
+        <w:tab/>
+        <w:t>Cohen, J. 1960. “A Coefficient of Agreement for Nominal Scales.” Educational and Psychological Measurement, 20(1), pp. 37-46.</w:t>
+      </w:r>
+    </w:p>
+    <w:p>
+      <w:pPr>
+        <w:ind w:left="720" w:hanging="720"/>
+      </w:pPr>
+      <w:r>
+        <w:rPr>
+          <w:rFonts w:ascii="Times New Roman" w:hAnsi="Times New Roman" w:eastAsia="Times New Roman"/>
+          <w:b w:val="0"/>
+          <w:caps w:val="0"/>
+          <w:sz w:val="24"/>
+        </w:rPr>
+        <w:t>[8]</w:t>
+        <w:tab/>
+        <w:t>Cunningham, W. 1992. “The WyCash Portfolio Management System.” OOPSLA ’92 Experience Report. Addendum to the Proceedings on Object-Oriented Programming Systems, Languages, and Applications, pp. 29-30.</w:t>
+      </w:r>
+    </w:p>
+    <w:p>
+      <w:pPr>
+        <w:ind w:left="720" w:hanging="720"/>
+      </w:pPr>
+      <w:r>
+        <w:rPr>
+          <w:rFonts w:ascii="Times New Roman" w:hAnsi="Times New Roman" w:eastAsia="Times New Roman"/>
+          <w:b w:val="0"/>
+          <w:caps w:val="0"/>
+          <w:sz w:val="24"/>
+        </w:rPr>
+        <w:t>[9]</w:t>
+        <w:tab/>
+        <w:t>Di Nucci, D., Palomba, F., Tamburri, D. A., Serebrenik, A. &amp; De Lucia, A. 2018. “Detecting code smells using machine learning techniques: Are we there yet?” Proceedings of the 25th IEEE International Conference on Software Analysis, Evolution and Reengineering (SANER ’18), pp. 612-621.</w:t>
+      </w:r>
+    </w:p>
+    <w:p>
+      <w:pPr>
+        <w:ind w:left="720" w:hanging="720"/>
+      </w:pPr>
+      <w:r>
+        <w:rPr>
+          <w:rFonts w:ascii="Times New Roman" w:hAnsi="Times New Roman" w:eastAsia="Times New Roman"/>
+          <w:b w:val="0"/>
+          <w:caps w:val="0"/>
+          <w:sz w:val="24"/>
+        </w:rPr>
+        <w:t>[10]</w:t>
+        <w:tab/>
+        <w:t>Fowler, M. 2018. Refactoring: Improving the Design of Existing Code, 2nd edn. Boston: Addison-Wesley.</w:t>
+      </w:r>
+    </w:p>
+    <w:p>
+      <w:pPr>
+        <w:ind w:left="720" w:hanging="720"/>
+      </w:pPr>
+      <w:r>
+        <w:rPr>
+          <w:rFonts w:ascii="Times New Roman" w:hAnsi="Times New Roman" w:eastAsia="Times New Roman"/>
+          <w:b w:val="0"/>
+          <w:caps w:val="0"/>
+          <w:sz w:val="24"/>
+        </w:rPr>
+        <w:t>[11]</w:t>
+        <w:tab/>
+        <w:t>Friedman, J. H. 2001. “Greedy Function Approximation: A Gradient Boosting Machine.” The Annals of Statistics, 29(5), pp. 1189-1232.</w:t>
+      </w:r>
+    </w:p>
+    <w:p>
+      <w:pPr>
+        <w:ind w:left="720" w:hanging="720"/>
+      </w:pPr>
+      <w:r>
+        <w:rPr>
+          <w:rFonts w:ascii="Times New Roman" w:hAnsi="Times New Roman" w:eastAsia="Times New Roman"/>
+          <w:b w:val="0"/>
+          <w:caps w:val="0"/>
+          <w:sz w:val="24"/>
+        </w:rPr>
+        <w:t>[12]</w:t>
+        <w:tab/>
+        <w:t>Henderson-Sellers, B. 1996. Object-Oriented Metrics: Measures of Complexity. Upper Saddle River, NJ: Prentice Hall.</w:t>
+      </w:r>
+    </w:p>
+    <w:p>
+      <w:pPr>
+        <w:ind w:left="720" w:hanging="720"/>
+      </w:pPr>
+      <w:r>
+        <w:rPr>
+          <w:rFonts w:ascii="Times New Roman" w:hAnsi="Times New Roman" w:eastAsia="Times New Roman"/>
+          <w:b w:val="0"/>
+          <w:caps w:val="0"/>
+          <w:sz w:val="24"/>
+        </w:rPr>
+        <w:t>[13]</w:t>
+        <w:tab/>
+        <w:t>Lanza, M. &amp; Marinescu, R. 2006. Object-Oriented Metrics in Practice: Using Software Metrics to Characterize, Evaluate, and Improve the Design of Object-Oriented Systems. Berlin: Springer.</w:t>
+      </w:r>
+    </w:p>
+    <w:p>
+      <w:pPr>
+        <w:ind w:left="720" w:hanging="720"/>
+      </w:pPr>
+      <w:r>
+        <w:rPr>
+          <w:rFonts w:ascii="Times New Roman" w:hAnsi="Times New Roman" w:eastAsia="Times New Roman"/>
+          <w:b w:val="0"/>
+          <w:caps w:val="0"/>
+          <w:sz w:val="24"/>
+        </w:rPr>
+        <w:t>[14]</w:t>
+        <w:tab/>
+        <w:t>Lehman, M. M. 1980. “Programs, Life Cycles, and Laws of Software Evolution.” Proceedings of the IEEE, 68(9), pp. 1060-1076.</w:t>
+      </w:r>
+    </w:p>
+    <w:p>
+      <w:pPr>
+        <w:ind w:left="720" w:hanging="720"/>
+      </w:pPr>
+      <w:r>
+        <w:rPr>
+          <w:rFonts w:ascii="Times New Roman" w:hAnsi="Times New Roman" w:eastAsia="Times New Roman"/>
+          <w:b w:val="0"/>
+          <w:caps w:val="0"/>
+          <w:sz w:val="24"/>
+        </w:rPr>
+        <w:t>[15]</w:t>
+        <w:tab/>
+        <w:t>Madeyski, L. &amp; Lewowski, T. 2020. “MLCQ: Industry-relevant code smell data set.” Proceedings of the 24th International Conference on Evaluation and Assessment in Software Engineering (EASE ’20), pp. 342-347.</w:t>
+      </w:r>
+    </w:p>
+    <w:p>
+      <w:pPr>
+        <w:ind w:left="720" w:hanging="720"/>
+      </w:pPr>
+      <w:r>
+        <w:rPr>
+          <w:rFonts w:ascii="Times New Roman" w:hAnsi="Times New Roman" w:eastAsia="Times New Roman"/>
+          <w:b w:val="0"/>
+          <w:caps w:val="0"/>
+          <w:sz w:val="24"/>
+        </w:rPr>
+        <w:t>[16]</w:t>
+        <w:tab/>
+        <w:t>Mäntylä, M. V. &amp; Lassenius, C. 2006. “Subjective evaluation of software evolvability using code smells: An empirical study.” Empirical Software Engineering, 11(3), pp. 395-431.</w:t>
+      </w:r>
+    </w:p>
+    <w:p>
+      <w:pPr>
+        <w:ind w:left="720" w:hanging="720"/>
+      </w:pPr>
+      <w:r>
+        <w:rPr>
+          <w:rFonts w:ascii="Times New Roman" w:hAnsi="Times New Roman" w:eastAsia="Times New Roman"/>
+          <w:b w:val="0"/>
+          <w:caps w:val="0"/>
+          <w:sz w:val="24"/>
+        </w:rPr>
+        <w:t>[17]</w:t>
+        <w:tab/>
+        <w:t>Marinescu, R. 2004. “Detection Strategies: Metrics-Based Rules for Detecting Design Flaws.” Proceedings of the 20th IEEE International Conference on Software Maintenance (ICSM ’04), pp. 350-359.</w:t>
+      </w:r>
+    </w:p>
+    <w:p>
+      <w:pPr>
+        <w:ind w:left="720" w:hanging="720"/>
+      </w:pPr>
+      <w:r>
+        <w:rPr>
+          <w:rFonts w:ascii="Times New Roman" w:hAnsi="Times New Roman" w:eastAsia="Times New Roman"/>
+          <w:b w:val="0"/>
+          <w:caps w:val="0"/>
+          <w:sz w:val="24"/>
+        </w:rPr>
+        <w:t>[18]</w:t>
+        <w:tab/>
+        <w:t>Matthews, B. W. 1975. “Comparison of the predicted and observed secondary structure of T4 phage lysozyme.” Biochimica et Biophysica Acta (BBA) - Protein Structure, 405(2), pp. 442-451.</w:t>
+      </w:r>
+    </w:p>
+    <w:p>
+      <w:pPr>
+        <w:ind w:left="720" w:hanging="720"/>
+      </w:pPr>
+      <w:r>
+        <w:rPr>
+          <w:rFonts w:ascii="Times New Roman" w:hAnsi="Times New Roman" w:eastAsia="Times New Roman"/>
+          <w:b w:val="0"/>
+          <w:caps w:val="0"/>
+          <w:sz w:val="24"/>
+        </w:rPr>
+        <w:t>[19]</w:t>
+        <w:tab/>
+        <w:t>McCabe, T. J. 1976. “A Complexity Measure.” IEEE Transactions on Software Engineering, SE-2(4), pp. 308-320.</w:t>
+      </w:r>
+    </w:p>
+    <w:p>
+      <w:pPr>
+        <w:ind w:left="720" w:hanging="720"/>
+      </w:pPr>
+      <w:r>
+        <w:rPr>
+          <w:rFonts w:ascii="Times New Roman" w:hAnsi="Times New Roman" w:eastAsia="Times New Roman"/>
+          <w:b w:val="0"/>
+          <w:caps w:val="0"/>
+          <w:sz w:val="24"/>
+        </w:rPr>
+        <w:t>[20]</w:t>
+        <w:tab/>
+        <w:t>Moha, N., Guéhéneuc, Y.-G., Duchien, L. &amp; Le Meur, A.-F. 2010. “DECOR: A Method for the Specification and Detection of Code and Design Smells.” IEEE Transactions on Software Engineering, 36(1), pp. 20-36.</w:t>
+      </w:r>
+    </w:p>
+    <w:p>
+      <w:pPr>
+        <w:ind w:left="720" w:hanging="720"/>
+      </w:pPr>
+      <w:r>
+        <w:rPr>
+          <w:rFonts w:ascii="Times New Roman" w:hAnsi="Times New Roman" w:eastAsia="Times New Roman"/>
+          <w:b w:val="0"/>
+          <w:caps w:val="0"/>
+          <w:sz w:val="24"/>
+        </w:rPr>
+        <w:t>[21]</w:t>
+        <w:tab/>
+        <w:t>Murphy-Hill, E., Parnin, C. &amp; Black, A. P. 2012. “How We Refactor, and How We Know It.” IEEE Transactions on Software Engineering, 38(1), pp. 5-18.</w:t>
+      </w:r>
+    </w:p>
+    <w:p>
+      <w:pPr>
+        <w:ind w:left="720" w:hanging="720"/>
+      </w:pPr>
+      <w:r>
+        <w:rPr>
+          <w:rFonts w:ascii="Times New Roman" w:hAnsi="Times New Roman" w:eastAsia="Times New Roman"/>
+          <w:b w:val="0"/>
+          <w:caps w:val="0"/>
+          <w:sz w:val="24"/>
+        </w:rPr>
+        <w:t>[22]</w:t>
+        <w:tab/>
+        <w:t>Opdyke, W. F. 1992. Refactoring Object-Oriented Frameworks. PhD thesis. University of Illinois at Urbana-Champaign.</w:t>
+      </w:r>
+    </w:p>
+    <w:p>
+      <w:pPr>
+        <w:ind w:left="720" w:hanging="720"/>
+      </w:pPr>
+      <w:r>
+        <w:rPr>
+          <w:rFonts w:ascii="Times New Roman" w:hAnsi="Times New Roman" w:eastAsia="Times New Roman"/>
+          <w:b w:val="0"/>
+          <w:caps w:val="0"/>
+          <w:sz w:val="24"/>
+        </w:rPr>
+        <w:t>[23]</w:t>
+        <w:tab/>
+        <w:t>Palomba, F., Bavota, G., Di Penta, M., Oliveto, R., Poshyvanyk, D. &amp; De Lucia, A. 2015. “Mining Version Histories for Detecting Code Smells.” IEEE Transactions on Software Engineering, 41(5), pp. 462-489.</w:t>
+      </w:r>
+    </w:p>
+    <w:p>
+      <w:pPr>
+        <w:ind w:left="720" w:hanging="720"/>
+      </w:pPr>
+      <w:r>
+        <w:rPr>
+          <w:rFonts w:ascii="Times New Roman" w:hAnsi="Times New Roman" w:eastAsia="Times New Roman"/>
+          <w:b w:val="0"/>
+          <w:caps w:val="0"/>
+          <w:sz w:val="24"/>
+        </w:rPr>
+        <w:t>[24]</w:t>
+        <w:tab/>
+        <w:t>Park, R. E. 1992. Software Size Measurement: A Framework for Counting Source Statements. Technical Report CMU/SEI-92-TR-020. Pittsburgh: Software Engineering Institute, Carnegie Mellon University.</w:t>
+      </w:r>
+    </w:p>
+    <w:p>
+      <w:pPr>
+        <w:ind w:left="720" w:hanging="720"/>
+      </w:pPr>
+      <w:r>
+        <w:rPr>
+          <w:rFonts w:ascii="Times New Roman" w:hAnsi="Times New Roman" w:eastAsia="Times New Roman"/>
+          <w:b w:val="0"/>
+          <w:caps w:val="0"/>
+          <w:sz w:val="24"/>
+        </w:rPr>
+        <w:t>[25]</w:t>
+        <w:tab/>
+        <w:t>Pedregosa, F., Varoquaux, G., Gramfort, A., Michel, V., Thirion, B., Grisel, O., et al. 2011. “Scikit-learn: Machine Learning in Python.” Journal of Machine Learning Research, 12, pp. 2825-2830.</w:t>
+      </w:r>
+    </w:p>
+    <w:p>
+      <w:pPr>
+        <w:ind w:left="720" w:hanging="720"/>
+      </w:pPr>
+      <w:r>
+        <w:rPr>
+          <w:rFonts w:ascii="Times New Roman" w:hAnsi="Times New Roman" w:eastAsia="Times New Roman"/>
+          <w:b w:val="0"/>
+          <w:caps w:val="0"/>
+          <w:sz w:val="24"/>
+        </w:rPr>
+        <w:t>[26]</w:t>
+        <w:tab/>
+        <w:t>Sharma, T. &amp; Spinellis, D. 2018. “A survey on software smells.” Journal of Systems and Software, 138, pp. 158-173.</w:t>
+      </w:r>
+    </w:p>
+    <w:p>
+      <w:pPr>
+        <w:ind w:left="720" w:hanging="720"/>
+      </w:pPr>
+      <w:r>
+        <w:rPr>
+          <w:rFonts w:ascii="Times New Roman" w:hAnsi="Times New Roman" w:eastAsia="Times New Roman"/>
+          <w:b w:val="0"/>
+          <w:caps w:val="0"/>
+          <w:sz w:val="24"/>
+        </w:rPr>
+        <w:t>[27]</w:t>
+        <w:tab/>
+        <w:t>Silva, D., Tsantalis, N. &amp; Valente, M. T. 2016. “Why We Refactor? Confessions of GitHub Contributors.” Proceedings of the 24th ACM SIGSOFT International Symposium on Foundations of Software Engineering (FSE ’16), pp. 858-870.</w:t>
+      </w:r>
+    </w:p>
+    <w:p>
+      <w:pPr>
+        <w:ind w:left="720" w:hanging="720"/>
+      </w:pPr>
+      <w:r>
+        <w:rPr>
+          <w:rFonts w:ascii="Times New Roman" w:hAnsi="Times New Roman" w:eastAsia="Times New Roman"/>
+          <w:b w:val="0"/>
+          <w:caps w:val="0"/>
+          <w:sz w:val="24"/>
+        </w:rPr>
+        <w:t>[28]</w:t>
+        <w:tab/>
+        <w:t>Tsantalis, N. &amp; Chatzigeorgiou, A. 2009. “Identification of Move Method Refactoring Opportunities.” IEEE Transactions on Software Engineering, 35(3), pp. 347-367.</w:t>
       </w:r>
     </w:p>
     <w:p>

</xml_diff>

<commit_message>
Shkruaj kapitujt 2 deri 6 te punimit
Kapitulli 2 mbi literaturen, 3 mbi problemin, 4 mbi metodologjine, 5 mbi
rezultatet dhe 6 mbi diskutimin.

Numrat e Kapitullit 5 lexohen nga data/results ne kohen e ndertimit, jo te
shkruar me dore: nje numer i shkruar ne tekst dhe i rigjeneruar ne JSON ndahen
heshtazi nga njeri-tjetri.

Ndertuesi tani rendon figura dhe tabela, dhe listat e tyre ne fillim te punimit.
</commit_message>
<xml_diff>
--- a/docs/thesis/Punim_Diplome_Florent_Latifi.docx
+++ b/docs/thesis/Punim_Diplome_Florent_Latifi.docx
@@ -650,22 +650,71 @@
           <w:caps w:val="0"/>
           <w:sz w:val="24"/>
         </w:rPr>
-        <w:t>[PLOTËSO]: lista gjenerohet pasi të shtohen figurat.</w:t>
+        <w:t>Figura 1. MCC për të dyja qasjet</w:t>
       </w:r>
     </w:p>
     <w:p>
       <w:pPr>
-        <w:spacing w:line="240" w:lineRule="auto"/>
-        <w:jc w:val="center"/>
+        <w:spacing w:line="360" w:lineRule="auto"/>
+        <w:ind w:firstLine="360"/>
+        <w:jc w:val="both"/>
       </w:pPr>
       <w:r>
         <w:rPr>
           <w:rFonts w:ascii="Times New Roman" w:hAnsi="Times New Roman" w:eastAsia="Times New Roman"/>
           <w:b w:val="0"/>
           <w:caps w:val="0"/>
-          <w:sz w:val="22"/>
+          <w:sz w:val="24"/>
         </w:rPr>
-        <w:t>Figura 1. Arkitektura e sistemit</w:t>
+        <w:t>Figura 2. Recall-i sipas ashpërsisë së caktuar nga rishikuesit</w:t>
+      </w:r>
+    </w:p>
+    <w:p>
+      <w:pPr>
+        <w:spacing w:line="360" w:lineRule="auto"/>
+        <w:ind w:firstLine="360"/>
+        <w:jc w:val="both"/>
+      </w:pPr>
+      <w:r>
+        <w:rPr>
+          <w:rFonts w:ascii="Times New Roman" w:hAnsi="Times New Roman" w:eastAsia="Times New Roman"/>
+          <w:b w:val="0"/>
+          <w:caps w:val="0"/>
+          <w:sz w:val="24"/>
+        </w:rPr>
+        <w:t>Figura 3. Mostrat e shënuara nga secila qasje</w:t>
+      </w:r>
+    </w:p>
+    <w:p>
+      <w:pPr>
+        <w:spacing w:line="360" w:lineRule="auto"/>
+        <w:ind w:firstLine="360"/>
+        <w:jc w:val="both"/>
+      </w:pPr>
+      <w:r>
+        <w:rPr>
+          <w:rFonts w:ascii="Times New Roman" w:hAnsi="Times New Roman" w:eastAsia="Times New Roman"/>
+          <w:b w:val="0"/>
+          <w:caps w:val="0"/>
+          <w:sz w:val="24"/>
+        </w:rPr>
+        <w:t>Figura 4. Veçoritë me rëndësi më të lartë, të matura me permutation importance</w:t>
+      </w:r>
+    </w:p>
+    <w:p>
+      <w:pPr>
+        <w:spacing w:line="360" w:lineRule="auto"/>
+        <w:ind w:firstLine="360"/>
+        <w:jc w:val="both"/>
+      </w:pPr>
+      <w:r>
+        <w:rPr>
+          <w:rFonts w:ascii="Times New Roman" w:hAnsi="Times New Roman" w:eastAsia="Times New Roman"/>
+          <w:b w:val="0"/>
+          <w:caps w:val="0"/>
+          <w:sz w:val="24"/>
+        </w:rPr>
+        <w:t>Figura 5. Shpërndarja e mostrave sipas erës</w:t>
       </w:r>
     </w:p>
     <w:p>
@@ -696,22 +745,55 @@
           <w:caps w:val="0"/>
           <w:sz w:val="24"/>
         </w:rPr>
-        <w:t>[PLOTËSO]: lista gjenerohet pasi të shtohen tabelat.</w:t>
+        <w:t>Tabela 1. Qasja A kundrejt gjykimit të rishikuesve</w:t>
       </w:r>
     </w:p>
     <w:p>
       <w:pPr>
-        <w:spacing w:line="240" w:lineRule="auto"/>
-        <w:jc w:val="center"/>
+        <w:spacing w:line="360" w:lineRule="auto"/>
+        <w:ind w:firstLine="360"/>
+        <w:jc w:val="both"/>
       </w:pPr>
       <w:r>
         <w:rPr>
           <w:rFonts w:ascii="Times New Roman" w:hAnsi="Times New Roman" w:eastAsia="Times New Roman"/>
           <w:b w:val="0"/>
           <w:caps w:val="0"/>
-          <w:sz w:val="22"/>
+          <w:sz w:val="24"/>
         </w:rPr>
-        <w:t>Tabela 1. Metrikat e implementuara</w:t>
+        <w:t>Tabela 2. Recall-i sipas ashpërsisë</w:t>
+      </w:r>
+    </w:p>
+    <w:p>
+      <w:pPr>
+        <w:spacing w:line="360" w:lineRule="auto"/>
+        <w:ind w:firstLine="360"/>
+        <w:jc w:val="both"/>
+      </w:pPr>
+      <w:r>
+        <w:rPr>
+          <w:rFonts w:ascii="Times New Roman" w:hAnsi="Times New Roman" w:eastAsia="Times New Roman"/>
+          <w:b w:val="0"/>
+          <w:caps w:val="0"/>
+          <w:sz w:val="24"/>
+        </w:rPr>
+        <w:t>Tabela 3. Modeli më i mirë për çdo erë</w:t>
+      </w:r>
+    </w:p>
+    <w:p>
+      <w:pPr>
+        <w:spacing w:line="360" w:lineRule="auto"/>
+        <w:ind w:firstLine="360"/>
+        <w:jc w:val="both"/>
+      </w:pPr>
+      <w:r>
+        <w:rPr>
+          <w:rFonts w:ascii="Times New Roman" w:hAnsi="Times New Roman" w:eastAsia="Times New Roman"/>
+          <w:b w:val="0"/>
+          <w:caps w:val="0"/>
+          <w:sz w:val="24"/>
+        </w:rPr>
+        <w:t>Tabela 4. Pajtimi mes dy qasjeve</w:t>
       </w:r>
     </w:p>
     <w:p>
@@ -1780,7 +1862,363 @@
           <w:caps w:val="0"/>
           <w:sz w:val="24"/>
         </w:rPr>
-        <w:t>[PLOTËSO]</w:t>
+        <w:t>Detektimi automatik i code smells dhe refaktorimi janë studiuar prej më shumë se dy dekadash. Ky kapitull i ndan burimet në katër grupe: përkufizimi dhe matja e smells, detektimi me rregulla mbi metrika, detektimi me mësim të makinës, dhe refaktorimi i automatizuar. Në fund identifikohet hendeku që ky punim e adreson.</w:t>
+      </w:r>
+    </w:p>
+    <w:p>
+      <w:pPr>
+        <w:pStyle w:val="Heading2"/>
+      </w:pPr>
+      <w:r>
+        <w:rPr>
+          <w:rFonts w:ascii="Times New Roman" w:hAnsi="Times New Roman" w:eastAsia="Times New Roman"/>
+          <w:b/>
+          <w:caps w:val="0"/>
+          <w:sz w:val="24"/>
+        </w:rPr>
+        <w:t>2.1 Përkufizimi dhe matja</w:t>
+      </w:r>
+    </w:p>
+    <w:p>
+      <w:pPr>
+        <w:spacing w:line="360" w:lineRule="auto"/>
+        <w:ind w:firstLine="360"/>
+        <w:jc w:val="both"/>
+      </w:pPr>
+      <w:r>
+        <w:rPr>
+          <w:rFonts w:ascii="Times New Roman" w:hAnsi="Times New Roman" w:eastAsia="Times New Roman"/>
+          <w:b w:val="0"/>
+          <w:caps w:val="0"/>
+          <w:sz w:val="24"/>
+        </w:rPr>
+        <w:t>Termi u prezantua nga Kent Beck dhe u sistemua nga Fowler (2018), i cili përshkroi njëzet e dy smells bashkë me refaktorimet që i adresojnë. Përkufizimi mbetet qëllimisht cilësor: një smell është simptomë, jo gabim, dhe gjykimi nëse diçka është problem varet nga konteksti.</w:t>
+      </w:r>
+    </w:p>
+    <w:p>
+      <w:pPr>
+        <w:spacing w:line="360" w:lineRule="auto"/>
+        <w:ind w:firstLine="360"/>
+        <w:jc w:val="both"/>
+      </w:pPr>
+      <w:r>
+        <w:rPr>
+          <w:rFonts w:ascii="Times New Roman" w:hAnsi="Times New Roman" w:eastAsia="Times New Roman"/>
+          <w:b w:val="0"/>
+          <w:caps w:val="0"/>
+          <w:sz w:val="24"/>
+        </w:rPr>
+        <w:t>Matja sasiore u mundësua nga suita e metrikave e Chidamber &amp; Kemerer (1994), e cila propozoi gjashtë metrika për sistemet e orientuara nga objektet, mes tyre WMC, DIT, NOC, CBO, RFC dhe LCOM. Henderson-Sellers (1996) e rishikoi LCOM-in duke propozuar një variant të normalizuar, ndërsa Bieman &amp; Kang (1995) prezantuan TCC-në, e cila e mat kohezionin përmes çifteve të metodave që ndajnë të paktën një fushë. Këto metrika janë baza mbi të cilën ndërtohet çdo detektim sasior i mëvonshëm.</w:t>
+      </w:r>
+    </w:p>
+    <w:p>
+      <w:pPr>
+        <w:spacing w:line="360" w:lineRule="auto"/>
+        <w:ind w:firstLine="360"/>
+        <w:jc w:val="both"/>
+      </w:pPr>
+      <w:r>
+        <w:rPr>
+          <w:rFonts w:ascii="Times New Roman" w:hAnsi="Times New Roman" w:eastAsia="Times New Roman"/>
+          <w:b w:val="0"/>
+          <w:caps w:val="0"/>
+          <w:sz w:val="24"/>
+        </w:rPr>
+        <w:t>Sharma &amp; Spinellis (2018) ofrojnë një shqyrtim sistematik të fushës dhe vërejnë se literatura nuk ka një përkufizim të vetëm operacional për shumicën e smells, çka e bën krahasimin mes mjeteve të vështirë.</w:t>
+      </w:r>
+    </w:p>
+    <w:p>
+      <w:pPr>
+        <w:pStyle w:val="Heading2"/>
+      </w:pPr>
+      <w:r>
+        <w:rPr>
+          <w:rFonts w:ascii="Times New Roman" w:hAnsi="Times New Roman" w:eastAsia="Times New Roman"/>
+          <w:b/>
+          <w:caps w:val="0"/>
+          <w:sz w:val="24"/>
+        </w:rPr>
+        <w:t>2.2 Detektimi me rregulla mbi metrika</w:t>
+      </w:r>
+    </w:p>
+    <w:p>
+      <w:pPr>
+        <w:spacing w:line="360" w:lineRule="auto"/>
+        <w:ind w:firstLine="360"/>
+        <w:jc w:val="both"/>
+      </w:pPr>
+      <w:r>
+        <w:rPr>
+          <w:rFonts w:ascii="Times New Roman" w:hAnsi="Times New Roman" w:eastAsia="Times New Roman"/>
+          <w:b w:val="0"/>
+          <w:caps w:val="0"/>
+          <w:sz w:val="24"/>
+        </w:rPr>
+        <w:t>Marinescu (2004) prezantoi konceptin e strategjive të detektimit: rregulla që kombinojnë disa metrika me pragje, në vend që të mbështeten në një metrikë të vetme. Ideja u zhvillua në një katalog të plotë nga Lanza &amp; Marinescu (2006), ku çdo smell shprehet si konjunksion kushtesh mbi metrika, me pragje të nxjerra statistikisht nga një korpus prej dyzet e pesë sistemesh.</w:t>
+      </w:r>
+    </w:p>
+    <w:p>
+      <w:pPr>
+        <w:spacing w:line="360" w:lineRule="auto"/>
+        <w:ind w:firstLine="360"/>
+        <w:jc w:val="both"/>
+      </w:pPr>
+      <w:r>
+        <w:rPr>
+          <w:rFonts w:ascii="Times New Roman" w:hAnsi="Times New Roman" w:eastAsia="Times New Roman"/>
+          <w:b w:val="0"/>
+          <w:caps w:val="0"/>
+          <w:sz w:val="24"/>
+        </w:rPr>
+        <w:t>Moha et al. (2010) propozuan DECOR-in, një metodë me gjuhë të specifikimit për smells, e cila i gjeneron detektorët nga përshkrimet. Përparësia e këtyre qasjeve është transparenca: kur një detektor ndez, arsyeja është e lexueshme. Dobësia e tyre është ndjeshmëria ndaj pragjeve, të cilat janë të vështira për t'u kalibruar përtej korpusit ku u nxorën.</w:t>
+      </w:r>
+    </w:p>
+    <w:p>
+      <w:pPr>
+        <w:spacing w:line="360" w:lineRule="auto"/>
+        <w:ind w:firstLine="360"/>
+        <w:jc w:val="both"/>
+      </w:pPr>
+      <w:r>
+        <w:rPr>
+          <w:rFonts w:ascii="Times New Roman" w:hAnsi="Times New Roman" w:eastAsia="Times New Roman"/>
+          <w:b w:val="0"/>
+          <w:caps w:val="0"/>
+          <w:sz w:val="24"/>
+        </w:rPr>
+        <w:t>Palomba et al. (2015) morën një drejtim tjetër me HIST-in, duke i detektuar smells nga historiku i ndryshimeve në vend që nga një pamje e vetme e kodit. Kjo e kap një dimension që metrikat statike nuk e shohin, por kërkon akses në historikun e plotë të depos.</w:t>
+      </w:r>
+    </w:p>
+    <w:p>
+      <w:pPr>
+        <w:pStyle w:val="Heading2"/>
+      </w:pPr>
+      <w:r>
+        <w:rPr>
+          <w:rFonts w:ascii="Times New Roman" w:hAnsi="Times New Roman" w:eastAsia="Times New Roman"/>
+          <w:b/>
+          <w:caps w:val="0"/>
+          <w:sz w:val="24"/>
+        </w:rPr>
+        <w:t>2.3 Detektimi me mësim të makinës</w:t>
+      </w:r>
+    </w:p>
+    <w:p>
+      <w:pPr>
+        <w:spacing w:line="360" w:lineRule="auto"/>
+        <w:ind w:firstLine="360"/>
+        <w:jc w:val="both"/>
+      </w:pPr>
+      <w:r>
+        <w:rPr>
+          <w:rFonts w:ascii="Times New Roman" w:hAnsi="Times New Roman" w:eastAsia="Times New Roman"/>
+          <w:b w:val="0"/>
+          <w:caps w:val="0"/>
+          <w:sz w:val="24"/>
+        </w:rPr>
+        <w:t>Arcelli Fontana et al. (2016) krahasuan disa teknika të mësimit të makinës për detektimin e smells dhe raportuan performancë shumë të lartë, në disa raste mbi 95% saktësi. Ky punim u bë referenca kryesore e fushës dhe motivoi një varg studimesh pasuese.</w:t>
+      </w:r>
+    </w:p>
+    <w:p>
+      <w:pPr>
+        <w:spacing w:line="360" w:lineRule="auto"/>
+        <w:ind w:firstLine="360"/>
+        <w:jc w:val="both"/>
+      </w:pPr>
+      <w:r>
+        <w:rPr>
+          <w:rFonts w:ascii="Times New Roman" w:hAnsi="Times New Roman" w:eastAsia="Times New Roman"/>
+          <w:b w:val="0"/>
+          <w:caps w:val="0"/>
+          <w:sz w:val="24"/>
+        </w:rPr>
+        <w:t>Megjithatë, Di Nucci et al. (2018) e riekzaminuan atë rezultat dhe treguan se ai varej fuqishëm nga mënyra si ishte ndërtuar dataset-i. Kur bashkësia e testimit u ndërtua në mënyrë më realiste, performanca ra ndjeshëm. Përfundimi i tyre është se rezultatet e raportuara në literaturë duhen lexuar me kujdes ndaj procedurës së ndarjes së të dhënave, jo vetëm ndaj algoritmit.</w:t>
+      </w:r>
+    </w:p>
+    <w:p>
+      <w:pPr>
+        <w:spacing w:line="360" w:lineRule="auto"/>
+        <w:ind w:firstLine="360"/>
+        <w:jc w:val="both"/>
+      </w:pPr>
+      <w:r>
+        <w:rPr>
+          <w:rFonts w:ascii="Times New Roman" w:hAnsi="Times New Roman" w:eastAsia="Times New Roman"/>
+          <w:b w:val="0"/>
+          <w:caps w:val="0"/>
+          <w:sz w:val="24"/>
+        </w:rPr>
+        <w:t>Ky vëzhgim ka pasojë të drejtpërdrejtë metodologjike për këtë punim dhe përcakton njërën nga zgjedhjet e tij qendrore: ndarja mes trajnimit dhe testimit bëhet e grupuar sipas depos, kurrë e rastësishme sipas rreshtave. Mostrat e së njëjtës depo ndajnë autorë, konvencione dhe shpesh kod të kopjuar; një ndarje e rastësishme i vendos ato në të dyja anët dhe e fryn çdo shifër.</w:t>
+      </w:r>
+    </w:p>
+    <w:p>
+      <w:pPr>
+        <w:spacing w:line="360" w:lineRule="auto"/>
+        <w:ind w:firstLine="360"/>
+        <w:jc w:val="both"/>
+      </w:pPr>
+      <w:r>
+        <w:rPr>
+          <w:rFonts w:ascii="Times New Roman" w:hAnsi="Times New Roman" w:eastAsia="Times New Roman"/>
+          <w:b w:val="0"/>
+          <w:caps w:val="0"/>
+          <w:sz w:val="24"/>
+        </w:rPr>
+        <w:t>Azeem et al. (2019) ofrojnë një shqyrtim sistematik dhe meta-analizë të kësaj nënfushe, duke identifikuar mungesën e dataset-eve të përbashkëta si pengesën kryesore për krahasueshmëri.</w:t>
+      </w:r>
+    </w:p>
+    <w:p>
+      <w:pPr>
+        <w:pStyle w:val="Heading2"/>
+      </w:pPr>
+      <w:r>
+        <w:rPr>
+          <w:rFonts w:ascii="Times New Roman" w:hAnsi="Times New Roman" w:eastAsia="Times New Roman"/>
+          <w:b/>
+          <w:caps w:val="0"/>
+          <w:sz w:val="24"/>
+        </w:rPr>
+        <w:t>2.4 E vërteta bazë dhe subjektiviteti</w:t>
+      </w:r>
+    </w:p>
+    <w:p>
+      <w:pPr>
+        <w:spacing w:line="360" w:lineRule="auto"/>
+        <w:ind w:firstLine="360"/>
+        <w:jc w:val="both"/>
+      </w:pPr>
+      <w:r>
+        <w:rPr>
+          <w:rFonts w:ascii="Times New Roman" w:hAnsi="Times New Roman" w:eastAsia="Times New Roman"/>
+          <w:b w:val="0"/>
+          <w:caps w:val="0"/>
+          <w:sz w:val="24"/>
+        </w:rPr>
+        <w:t>Çdo vlerësim i detektimit kërkon një të vërtetë bazë, dhe këtu literatura has një problem themelor. Mäntylä &amp; Lassenius (2006) treguan eksperimentalisht se vlerësimi i zhvilluesve për praninë e një smell është subjektiv dhe se mospajtimi mes tyre është i konsiderueshëm.</w:t>
+      </w:r>
+    </w:p>
+    <w:p>
+      <w:pPr>
+        <w:spacing w:line="360" w:lineRule="auto"/>
+        <w:ind w:firstLine="360"/>
+        <w:jc w:val="both"/>
+      </w:pPr>
+      <w:r>
+        <w:rPr>
+          <w:rFonts w:ascii="Times New Roman" w:hAnsi="Times New Roman" w:eastAsia="Times New Roman"/>
+          <w:b w:val="0"/>
+          <w:caps w:val="0"/>
+          <w:sz w:val="24"/>
+        </w:rPr>
+        <w:t>Madeyski &amp; Lewowski (2020) e adresuan mungesën e dataset-eve me MLCQ-në, një bashkësi mostrash Java të etiketuara nga zhvillues profesionistë për katër smells, me ashpërsi në shkallën none/minor/major/critical. Ky punim e përdor MLCQ-në si të vërtetë bazë, dhe e trajton mospajtimin mes rishikuesve si të dhënë që raportohet, jo si zhurmë që pastrohet.</w:t>
+      </w:r>
+    </w:p>
+    <w:p>
+      <w:pPr>
+        <w:pStyle w:val="Heading2"/>
+      </w:pPr>
+      <w:r>
+        <w:rPr>
+          <w:rFonts w:ascii="Times New Roman" w:hAnsi="Times New Roman" w:eastAsia="Times New Roman"/>
+          <w:b/>
+          <w:caps w:val="0"/>
+          <w:sz w:val="24"/>
+        </w:rPr>
+        <w:t>2.5 Refaktorimi i automatizuar</w:t>
+      </w:r>
+    </w:p>
+    <w:p>
+      <w:pPr>
+        <w:spacing w:line="360" w:lineRule="auto"/>
+        <w:ind w:firstLine="360"/>
+        <w:jc w:val="both"/>
+      </w:pPr>
+      <w:r>
+        <w:rPr>
+          <w:rFonts w:ascii="Times New Roman" w:hAnsi="Times New Roman" w:eastAsia="Times New Roman"/>
+          <w:b w:val="0"/>
+          <w:caps w:val="0"/>
+          <w:sz w:val="24"/>
+        </w:rPr>
+        <w:t>Opdyke (1992) e formalizoi refaktorimin në tezën e tij të doktoratës, duke prezantuar nocionin e parakushteve: një transformim është i sigurt vetëm nëse kushte të caktuara vërtetohen para aplikimit. Ky nocion mbetet themeli i çdo motori refaktorimi që pretendon ruajtjen e sjelljes.</w:t>
+      </w:r>
+    </w:p>
+    <w:p>
+      <w:pPr>
+        <w:spacing w:line="360" w:lineRule="auto"/>
+        <w:ind w:firstLine="360"/>
+        <w:jc w:val="both"/>
+      </w:pPr>
+      <w:r>
+        <w:rPr>
+          <w:rFonts w:ascii="Times New Roman" w:hAnsi="Times New Roman" w:eastAsia="Times New Roman"/>
+          <w:b w:val="0"/>
+          <w:caps w:val="0"/>
+          <w:sz w:val="24"/>
+        </w:rPr>
+        <w:t>Tsantalis &amp; Chatzigeorgiou (2009) propozuan një metodë për identifikimin e mundësive të Move Method, duke treguar se identifikimi i mundësisë dhe aplikimi i saj janë probleme të ndara me vështirësi të ndryshme.</w:t>
+      </w:r>
+    </w:p>
+    <w:p>
+      <w:pPr>
+        <w:spacing w:line="360" w:lineRule="auto"/>
+        <w:ind w:firstLine="360"/>
+        <w:jc w:val="both"/>
+      </w:pPr>
+      <w:r>
+        <w:rPr>
+          <w:rFonts w:ascii="Times New Roman" w:hAnsi="Times New Roman" w:eastAsia="Times New Roman"/>
+          <w:b w:val="0"/>
+          <w:caps w:val="0"/>
+          <w:sz w:val="24"/>
+        </w:rPr>
+        <w:t>Murphy-Hill et al. (2012) matën si i përdorin zhvilluesit mjetet e refaktorimit dhe gjetën se shumica e refaktorimeve bëhen me dorë, edhe kur mjeti i automatizuar është i disponueshëm. Silva et al. (2016) pyetën zhvilluesit pse refaktorojnë dhe gjetën se motivet janë kryesisht praktike, të lidhura me një ndryshim konkret që duhet bërë.</w:t>
+      </w:r>
+    </w:p>
+    <w:p>
+      <w:pPr>
+        <w:pStyle w:val="Heading2"/>
+      </w:pPr>
+      <w:r>
+        <w:rPr>
+          <w:rFonts w:ascii="Times New Roman" w:hAnsi="Times New Roman" w:eastAsia="Times New Roman"/>
+          <w:b/>
+          <w:caps w:val="0"/>
+          <w:sz w:val="24"/>
+        </w:rPr>
+        <w:t>2.6 Hendeku</w:t>
+      </w:r>
+    </w:p>
+    <w:p>
+      <w:pPr>
+        <w:spacing w:line="360" w:lineRule="auto"/>
+        <w:ind w:firstLine="360"/>
+        <w:jc w:val="both"/>
+      </w:pPr>
+      <w:r>
+        <w:rPr>
+          <w:rFonts w:ascii="Times New Roman" w:hAnsi="Times New Roman" w:eastAsia="Times New Roman"/>
+          <w:b w:val="0"/>
+          <w:caps w:val="0"/>
+          <w:sz w:val="24"/>
+        </w:rPr>
+        <w:t>Nga sa më sipër dalin tri vërejtje. E para: qasja me rregulla dhe ajo me mësim makine rrallë vlerësohen mbi të njëjtën të vërtetë bazë me të njëjtat metrika, çka e bën krahasimin e drejtpërdrejtë të vështirë. E dyta: rezultatet e raportuara për mësimin e makinës janë të ndjeshme ndaj procedurës së ndarjes, dhe jo çdo punim e deklaron atë qartë. E treta: detektimi dhe refaktorimi trajtohen zakonisht si probleme të ndara, ndaj pyetja nëse një smell i detektuar mund edhe të rregullohet automatikisht mbetet pa përgjigje empirike.</w:t>
+      </w:r>
+    </w:p>
+    <w:p>
+      <w:pPr>
+        <w:spacing w:line="360" w:lineRule="auto"/>
+        <w:ind w:firstLine="360"/>
+        <w:jc w:val="both"/>
+      </w:pPr>
+      <w:r>
+        <w:rPr>
+          <w:rFonts w:ascii="Times New Roman" w:hAnsi="Times New Roman" w:eastAsia="Times New Roman"/>
+          <w:b w:val="0"/>
+          <w:caps w:val="0"/>
+          <w:sz w:val="24"/>
+        </w:rPr>
+        <w:t>Ky punim i adreson të tria: dy qasjet vlerësohen mbi të njëjtin korpus me të njëjtin kod pikëzimi, ndarja është e grupuar sipas depos dhe e deklaruar, dhe motori i refaktorimit raporton se sa nga rastet e detektuara arrin t'i transformojë vërtet.</w:t>
       </w:r>
     </w:p>
     <w:p>
@@ -1811,7 +2249,193 @@
           <w:caps w:val="0"/>
           <w:sz w:val="24"/>
         </w:rPr>
-        <w:t>[PLOTËSO]</w:t>
+        <w:t>Kapitulli 1 i shtroi tri pyetjet kërkimore. Ky kapitull i bën ato të matshme: përcakton çfarë do të thotë një përgjigje, cilat janë kriteret që e vendosin, dhe cilat kufizime të vetëdijshme e formësojnë atë që mund të pretendohet.</w:t>
+      </w:r>
+    </w:p>
+    <w:p>
+      <w:pPr>
+        <w:pStyle w:val="Heading2"/>
+      </w:pPr>
+      <w:r>
+        <w:rPr>
+          <w:rFonts w:ascii="Times New Roman" w:hAnsi="Times New Roman" w:eastAsia="Times New Roman"/>
+          <w:b/>
+          <w:caps w:val="0"/>
+          <w:sz w:val="24"/>
+        </w:rPr>
+        <w:t>3.1 Formulimi i matshëm</w:t>
+      </w:r>
+    </w:p>
+    <w:p>
+      <w:pPr>
+        <w:spacing w:line="360" w:lineRule="auto"/>
+        <w:ind w:firstLine="360"/>
+        <w:jc w:val="both"/>
+      </w:pPr>
+      <w:r>
+        <w:rPr>
+          <w:rFonts w:ascii="Times New Roman" w:hAnsi="Times New Roman" w:eastAsia="Times New Roman"/>
+          <w:b w:val="0"/>
+          <w:caps w:val="0"/>
+          <w:sz w:val="24"/>
+        </w:rPr>
+        <w:t>Detektimi i një code smell mund të shprehet si problem klasifikimi binar mbi një entitet kodi: një klasë ose një metodë është ose nuk është shembull i një ere të caktuar. E vërteta bazë vjen nga rishikuesit profesionistë të MLCQ-së, dhe krahasimi bëhet me matricën konfuze dhe shifrat që derivohen prej saj.</w:t>
+      </w:r>
+    </w:p>
+    <w:p>
+      <w:pPr>
+        <w:spacing w:line="360" w:lineRule="auto"/>
+        <w:ind w:firstLine="360"/>
+        <w:jc w:val="both"/>
+      </w:pPr>
+      <w:r>
+        <w:rPr>
+          <w:rFonts w:ascii="Times New Roman" w:hAnsi="Times New Roman" w:eastAsia="Times New Roman"/>
+          <w:b w:val="0"/>
+          <w:caps w:val="0"/>
+          <w:sz w:val="24"/>
+        </w:rPr>
+        <w:t>Refaktorimi nuk është problem klasifikimi. Ai është transformim me parakushte, dhe pyetja e matshme nuk është «sa i saktë është», por «sa shpesh mund të zbatohet pa e prishur kodin». Prandaj rezultati i tij raportohet si numri i vendeve të detektuara, i atyre të transformuara, dhe shpërndarja e arsyeve pse pjesa tjetër u refuzua.</w:t>
+      </w:r>
+    </w:p>
+    <w:p>
+      <w:pPr>
+        <w:pStyle w:val="Heading2"/>
+      </w:pPr>
+      <w:r>
+        <w:rPr>
+          <w:rFonts w:ascii="Times New Roman" w:hAnsi="Times New Roman" w:eastAsia="Times New Roman"/>
+          <w:b/>
+          <w:caps w:val="0"/>
+          <w:sz w:val="24"/>
+        </w:rPr>
+        <w:t>3.2 Kriteret e suksesit</w:t>
+      </w:r>
+    </w:p>
+    <w:p>
+      <w:pPr>
+        <w:pStyle w:val="ListBullet"/>
+        <w:spacing w:line="360" w:lineRule="auto"/>
+        <w:jc w:val="both"/>
+      </w:pPr>
+      <w:r>
+        <w:rPr>
+          <w:rFonts w:ascii="Times New Roman" w:hAnsi="Times New Roman" w:eastAsia="Times New Roman"/>
+          <w:b w:val="0"/>
+          <w:caps w:val="0"/>
+          <w:sz w:val="24"/>
+        </w:rPr>
+        <w:t>Për PK1: shifra për çdo erë, të prodhuara mbi një korpus të deklaruar dhe të riprodhueshme me një komandë. Një recall i ulët është përgjigje e vlefshme; fshehja e tij nuk është.</w:t>
+      </w:r>
+    </w:p>
+    <w:p>
+      <w:pPr>
+        <w:pStyle w:val="ListBullet"/>
+        <w:spacing w:line="360" w:lineRule="auto"/>
+        <w:jc w:val="both"/>
+      </w:pPr>
+      <w:r>
+        <w:rPr>
+          <w:rFonts w:ascii="Times New Roman" w:hAnsi="Times New Roman" w:eastAsia="Times New Roman"/>
+          <w:b w:val="0"/>
+          <w:caps w:val="0"/>
+          <w:sz w:val="24"/>
+        </w:rPr>
+        <w:t>Për PK2: krahasim mbi të njëjtat mostra, me të njëjtin kod pikëzimi, dhe me një baseline që tregon se sa merret pa mësuar asgjë. Pa këtë të fundit, çdo shifër është e palexueshme.</w:t>
+      </w:r>
+    </w:p>
+    <w:p>
+      <w:pPr>
+        <w:pStyle w:val="ListBullet"/>
+        <w:spacing w:line="360" w:lineRule="auto"/>
+        <w:jc w:val="both"/>
+      </w:pPr>
+      <w:r>
+        <w:rPr>
+          <w:rFonts w:ascii="Times New Roman" w:hAnsi="Times New Roman" w:eastAsia="Times New Roman"/>
+          <w:b w:val="0"/>
+          <w:caps w:val="0"/>
+          <w:sz w:val="24"/>
+        </w:rPr>
+        <w:t>Për PK3: verifikim që dalja e çdo transformimi të aplikuar nuk e prish skedarin. Kufiri i këtij verifikimi është deklaruar në Kapitullin 4 dhe diskutohet në Kapitullin 6: ruajtja e plotë e sjelljes kërkon ekzekutimin e suitave të testeve të vetë projekteve, çka mbetet punë e ardhshme.</w:t>
+      </w:r>
+    </w:p>
+    <w:p>
+      <w:pPr>
+        <w:pStyle w:val="Heading2"/>
+      </w:pPr>
+      <w:r>
+        <w:rPr>
+          <w:rFonts w:ascii="Times New Roman" w:hAnsi="Times New Roman" w:eastAsia="Times New Roman"/>
+          <w:b/>
+          <w:caps w:val="0"/>
+          <w:sz w:val="24"/>
+        </w:rPr>
+        <w:t>3.3 Kufizimet e vetëdijshme dhe pasojat e tyre</w:t>
+      </w:r>
+    </w:p>
+    <w:p>
+      <w:pPr>
+        <w:spacing w:line="360" w:lineRule="auto"/>
+        <w:ind w:firstLine="360"/>
+        <w:jc w:val="both"/>
+      </w:pPr>
+      <w:r>
+        <w:rPr>
+          <w:rFonts w:ascii="Times New Roman" w:hAnsi="Times New Roman" w:eastAsia="Times New Roman"/>
+          <w:b w:val="0"/>
+          <w:caps w:val="0"/>
+          <w:sz w:val="24"/>
+        </w:rPr>
+        <w:t>Dy zgjedhje arkitekturore e formësojnë atë që sistemi mund të pretendojë, dhe të dyja janë të qëllimshme.</w:t>
+      </w:r>
+    </w:p>
+    <w:p>
+      <w:pPr>
+        <w:spacing w:line="360" w:lineRule="auto"/>
+        <w:ind w:firstLine="360"/>
+        <w:jc w:val="both"/>
+      </w:pPr>
+      <w:r>
+        <w:rPr>
+          <w:rFonts w:ascii="Times New Roman" w:hAnsi="Times New Roman" w:eastAsia="Times New Roman"/>
+          <w:b w:val="0"/>
+          <w:caps w:val="0"/>
+          <w:sz w:val="24"/>
+        </w:rPr>
+        <w:t>E para: analizuesi regjistron fakte sintaksore dhe nuk zgjidh simbole. Kjo e mban sistemin të thjeshtë dhe të shpejtë, por do të thotë se çdo transformim që duhet të gjejë të gjitha referencat ndaj një emri në projekt nuk i provon dot parakushtet e veta. Rrjedhimisht tri nga pesë transformimet e planifikuara mbeten propozim dhe nuk aplikohen automatikisht. Kjo nuk është mangësi implementimi por pasojë e deklaruar e zgjedhjes.</w:t>
+      </w:r>
+    </w:p>
+    <w:p>
+      <w:pPr>
+        <w:spacing w:line="360" w:lineRule="auto"/>
+        <w:ind w:firstLine="360"/>
+        <w:jc w:val="both"/>
+      </w:pPr>
+      <w:r>
+        <w:rPr>
+          <w:rFonts w:ascii="Times New Roman" w:hAnsi="Times New Roman" w:eastAsia="Times New Roman"/>
+          <w:b w:val="0"/>
+          <w:caps w:val="0"/>
+          <w:sz w:val="24"/>
+        </w:rPr>
+        <w:t>E dyta: refaktorimi bëhet me transformime mbi pemën sintaksore dhe jo me gjenerim teksti. Një model gjuhësor do të prodhonte kod për shumë më tepër raste, por pretendimi i punimit është që ajo çka aplikohet të jetë e saktë, dhe kjo kërkon parakushte të provueshme, jo dalje bindëse.</w:t>
+      </w:r>
+    </w:p>
+    <w:p>
+      <w:pPr>
+        <w:spacing w:line="360" w:lineRule="auto"/>
+        <w:ind w:firstLine="360"/>
+        <w:jc w:val="both"/>
+      </w:pPr>
+      <w:r>
+        <w:rPr>
+          <w:rFonts w:ascii="Times New Roman" w:hAnsi="Times New Roman" w:eastAsia="Times New Roman"/>
+          <w:b w:val="0"/>
+          <w:caps w:val="0"/>
+          <w:sz w:val="24"/>
+        </w:rPr>
+        <w:t>Nga këto rrjedh edhe kriteri kryesor i motorit: refuzimi është rezultat i saktë. Një motor që refuzon shpesh por nuk gabon kurrë është i mbrojtshëm; një që provon gjithçka dhe prish kodin nuk është.</w:t>
       </w:r>
     </w:p>
     <w:p>
@@ -1842,7 +2466,411 @@
           <w:caps w:val="0"/>
           <w:sz w:val="24"/>
         </w:rPr>
-        <w:t>[PLOTËSO]</w:t>
+        <w:t>Metodologjia përshkruhet këtu në radhën në të cilën ekzekutohet: materializimi i korpusit, matja, detektimi me rregulla, detektimi me mësim makine, dhe refaktorimi. Çdo hap prodhohet nga një skript i vetëm dhe çdo rezultat shkruhet me commit-in, versionin e Python-it dhe platformën që e prodhuan.</w:t>
+      </w:r>
+    </w:p>
+    <w:p>
+      <w:pPr>
+        <w:pStyle w:val="Heading2"/>
+      </w:pPr>
+      <w:r>
+        <w:rPr>
+          <w:rFonts w:ascii="Times New Roman" w:hAnsi="Times New Roman" w:eastAsia="Times New Roman"/>
+          <w:b/>
+          <w:caps w:val="0"/>
+          <w:sz w:val="24"/>
+        </w:rPr>
+        <w:t>4.1 Korpusi dhe e vërteta bazë</w:t>
+      </w:r>
+    </w:p>
+    <w:p>
+      <w:pPr>
+        <w:spacing w:line="360" w:lineRule="auto"/>
+        <w:ind w:firstLine="360"/>
+        <w:jc w:val="both"/>
+      </w:pPr>
+      <w:r>
+        <w:rPr>
+          <w:rFonts w:ascii="Times New Roman" w:hAnsi="Times New Roman" w:eastAsia="Times New Roman"/>
+          <w:b w:val="0"/>
+          <w:caps w:val="0"/>
+          <w:sz w:val="24"/>
+        </w:rPr>
+        <w:t>MLCQ (Madeyski &amp; Lewowski, 2020) përmban rishikime nga zhvillues profesionistë, por jo kodin: çdo rresht tregon depon, commit-in dhe entitetin. Kodi u materializua duke shkarkuar çdo depo në commit-in e saktë të regjistruar.</w:t>
+      </w:r>
+    </w:p>
+    <w:p>
+      <w:pPr>
+        <w:spacing w:line="360" w:lineRule="auto"/>
+        <w:ind w:firstLine="360"/>
+        <w:jc w:val="both"/>
+      </w:pPr>
+      <w:r>
+        <w:rPr>
+          <w:rFonts w:ascii="Times New Roman" w:hAnsi="Times New Roman" w:eastAsia="Times New Roman"/>
+          <w:b w:val="0"/>
+          <w:caps w:val="0"/>
+          <w:sz w:val="24"/>
+        </w:rPr>
+        <w:t>Depot e zhvendosura u ndoqën vetëm kur commit-i i regjistruar zgjidhej te vendndodhja e re. SHA-ja e git-it është hash i përmbajtjes, ndaj nëse ai zgjidhet, pema është provueshëm e njëjta që panë rishikuesit; nëse nuk zgjidhet, depoja nuk zëvendësohet me hamendje.</w:t>
+      </w:r>
+    </w:p>
+    <w:p>
+      <w:pPr>
+        <w:spacing w:line="360" w:lineRule="auto"/>
+        <w:ind w:firstLine="360"/>
+        <w:jc w:val="both"/>
+      </w:pPr>
+      <w:r>
+        <w:rPr>
+          <w:rFonts w:ascii="Times New Roman" w:hAnsi="Times New Roman" w:eastAsia="Times New Roman"/>
+          <w:b w:val="0"/>
+          <w:caps w:val="0"/>
+          <w:sz w:val="24"/>
+        </w:rPr>
+        <w:t>Përputhja mes një mostre të MLCQ-së dhe një entiteti të modelit tonë ankorohet te rangu i rreshtave dhe verifikohet me emrin. Emri i publikuar i entitetit vjen në katër formate të ndryshme dhe nuk është i besueshëm si ankorim.</w:t>
+      </w:r>
+    </w:p>
+    <w:p>
+      <w:pPr>
+        <w:pStyle w:val="Heading2"/>
+      </w:pPr>
+      <w:r>
+        <w:rPr>
+          <w:rFonts w:ascii="Times New Roman" w:hAnsi="Times New Roman" w:eastAsia="Times New Roman"/>
+          <w:b/>
+          <w:caps w:val="0"/>
+          <w:sz w:val="24"/>
+        </w:rPr>
+        <w:t>4.2 Matja</w:t>
+      </w:r>
+    </w:p>
+    <w:p>
+      <w:pPr>
+        <w:spacing w:line="360" w:lineRule="auto"/>
+        <w:ind w:firstLine="360"/>
+        <w:jc w:val="both"/>
+      </w:pPr>
+      <w:r>
+        <w:rPr>
+          <w:rFonts w:ascii="Times New Roman" w:hAnsi="Times New Roman" w:eastAsia="Times New Roman"/>
+          <w:b w:val="0"/>
+          <w:caps w:val="0"/>
+          <w:sz w:val="24"/>
+        </w:rPr>
+        <w:t>Analizuesi ndërtohet mbi tree-sitter dhe regjistron vetëm fakte sintaksore. Mbi këtë model maten shtatëmbëdhjetë metrika klase dhe nëntë metrika metode, me një kalim të vetëm për klasë.</w:t>
+      </w:r>
+    </w:p>
+    <w:p>
+      <w:pPr>
+        <w:spacing w:line="360" w:lineRule="auto"/>
+        <w:ind w:firstLine="360"/>
+        <w:jc w:val="both"/>
+      </w:pPr>
+      <w:r>
+        <w:rPr>
+          <w:rFonts w:ascii="Times New Roman" w:hAnsi="Times New Roman" w:eastAsia="Times New Roman"/>
+          <w:b w:val="0"/>
+          <w:caps w:val="0"/>
+          <w:sz w:val="24"/>
+        </w:rPr>
+        <w:t>Rreshtat e kodit numërohen sipas kornizës së Park (1992): rreshtat bosh, komentet dhe rreshtat që përmbajnë vetëm një kllapë nuk janë pohime dhe nuk numërohen. Ky përkufizim ka një implementim të vetëm në kod, sepse dy implementime devijuan në heshtje njëherë dhe defekti u zbulua vetëm kur u krahasuan.</w:t>
+      </w:r>
+    </w:p>
+    <w:p>
+      <w:pPr>
+        <w:spacing w:line="360" w:lineRule="auto"/>
+        <w:ind w:firstLine="360"/>
+        <w:jc w:val="both"/>
+      </w:pPr>
+      <w:r>
+        <w:rPr>
+          <w:rFonts w:ascii="Times New Roman" w:hAnsi="Times New Roman" w:eastAsia="Times New Roman"/>
+          <w:b w:val="0"/>
+          <w:caps w:val="0"/>
+          <w:sz w:val="24"/>
+        </w:rPr>
+        <w:t>Metrikat ATFD, CBO, DIT dhe TCC përcaktohen kundrejt tipave të tjerë të projektit. Prandaj çdo depo analizohet e plotë; një klasë e matur e izoluar do të raportonte vlera thjesht të gabuara.</w:t>
+      </w:r>
+    </w:p>
+    <w:p>
+      <w:pPr>
+        <w:pStyle w:val="Heading2"/>
+      </w:pPr>
+      <w:r>
+        <w:rPr>
+          <w:rFonts w:ascii="Times New Roman" w:hAnsi="Times New Roman" w:eastAsia="Times New Roman"/>
+          <w:b/>
+          <w:caps w:val="0"/>
+          <w:sz w:val="24"/>
+        </w:rPr>
+        <w:t>4.3 Qasja A: detektimi me rregulla</w:t>
+      </w:r>
+    </w:p>
+    <w:p>
+      <w:pPr>
+        <w:spacing w:line="360" w:lineRule="auto"/>
+        <w:ind w:firstLine="360"/>
+        <w:jc w:val="both"/>
+      </w:pPr>
+      <w:r>
+        <w:rPr>
+          <w:rFonts w:ascii="Times New Roman" w:hAnsi="Times New Roman" w:eastAsia="Times New Roman"/>
+          <w:b w:val="0"/>
+          <w:caps w:val="0"/>
+          <w:sz w:val="24"/>
+        </w:rPr>
+        <w:t>Strategjitë zbatohen ashtu siç janë publikuar nga Lanza &amp; Marinescu (2006). Çdo prag numerik rri i centralizuar në një skedar të vetëm dhe çdo numër aty ka citim; një vlerë që nuk i atribuohet dot një burimi nuk përdoret.</w:t>
+      </w:r>
+    </w:p>
+    <w:p>
+      <w:pPr>
+        <w:spacing w:line="360" w:lineRule="auto"/>
+        <w:ind w:firstLine="360"/>
+        <w:jc w:val="both"/>
+      </w:pPr>
+      <w:r>
+        <w:rPr>
+          <w:rFonts w:ascii="Times New Roman" w:hAnsi="Times New Roman" w:eastAsia="Times New Roman"/>
+          <w:b w:val="0"/>
+          <w:caps w:val="0"/>
+          <w:sz w:val="24"/>
+        </w:rPr>
+        <w:t>Një detektor nuk kthen boolean, por kushtet që vlerësoi bashkë me vlerat e matura. Kjo bën të mundura tri gjëra: ndërfaqja shpjegon pse diçka u shënua, punimi raporton cila klauzolë e mbajti detektimin, dhe ashpërsia derivohet nga sa larg pragut është matja në vend që të caktohet.</w:t>
+      </w:r>
+    </w:p>
+    <w:p>
+      <w:pPr>
+        <w:spacing w:line="360" w:lineRule="auto"/>
+        <w:ind w:firstLine="360"/>
+        <w:jc w:val="both"/>
+      </w:pPr>
+      <w:r>
+        <w:rPr>
+          <w:rFonts w:ascii="Times New Roman" w:hAnsi="Times New Roman" w:eastAsia="Times New Roman"/>
+          <w:b w:val="0"/>
+          <w:caps w:val="0"/>
+          <w:sz w:val="24"/>
+        </w:rPr>
+        <w:t>Shkalla e ashpërsisë është ajo e MLCQ-së, ndaj dalja e rregullave krahasohet me etiketat e njeriut pa asnjë hap hartëzimi.</w:t>
+      </w:r>
+    </w:p>
+    <w:p>
+      <w:pPr>
+        <w:pStyle w:val="Heading2"/>
+      </w:pPr>
+      <w:r>
+        <w:rPr>
+          <w:rFonts w:ascii="Times New Roman" w:hAnsi="Times New Roman" w:eastAsia="Times New Roman"/>
+          <w:b/>
+          <w:caps w:val="0"/>
+          <w:sz w:val="24"/>
+        </w:rPr>
+        <w:t>4.4 Qasja B: detektimi me mësim makine</w:t>
+      </w:r>
+    </w:p>
+    <w:p>
+      <w:pPr>
+        <w:spacing w:line="360" w:lineRule="auto"/>
+        <w:ind w:firstLine="360"/>
+        <w:jc w:val="both"/>
+      </w:pPr>
+      <w:r>
+        <w:rPr>
+          <w:rFonts w:ascii="Times New Roman" w:hAnsi="Times New Roman" w:eastAsia="Times New Roman"/>
+          <w:b w:val="0"/>
+          <w:caps w:val="0"/>
+          <w:sz w:val="24"/>
+        </w:rPr>
+        <w:t>Katër modele vlerësohen: klasifikuesi i shumicës, regresioni logjistik, Random Forest (Breiman, 2001) dhe Gradient Boosting (Friedman, 2001), të zbatuar me scikit-learn (Pedregosa et al., 2011).</w:t>
+      </w:r>
+    </w:p>
+    <w:p>
+      <w:pPr>
+        <w:spacing w:line="360" w:lineRule="auto"/>
+        <w:ind w:firstLine="360"/>
+        <w:jc w:val="both"/>
+      </w:pPr>
+      <w:r>
+        <w:rPr>
+          <w:rFonts w:ascii="Times New Roman" w:hAnsi="Times New Roman" w:eastAsia="Times New Roman"/>
+          <w:b w:val="0"/>
+          <w:caps w:val="0"/>
+          <w:sz w:val="24"/>
+        </w:rPr>
+        <w:t>Klasifikuesi i shumicës raportohet gjithmonë. Mbi një bashkësi ku shumica e etiketave janë negative, një F1 mbresëlënës mund të arrihet pa mësuar asgjë, dhe i vetmi mjet që e dallon këtë është të parit se sa merr parashikimi i klasës shumicë mbi po atë ndarje.</w:t>
+      </w:r>
+    </w:p>
+    <w:p>
+      <w:pPr>
+        <w:spacing w:line="360" w:lineRule="auto"/>
+        <w:ind w:firstLine="360"/>
+        <w:jc w:val="both"/>
+      </w:pPr>
+      <w:r>
+        <w:rPr>
+          <w:rFonts w:ascii="Times New Roman" w:hAnsi="Times New Roman" w:eastAsia="Times New Roman"/>
+          <w:b w:val="0"/>
+          <w:caps w:val="0"/>
+          <w:sz w:val="24"/>
+        </w:rPr>
+        <w:t>Ndarja bëhet me GroupKFold sipas depos, siç e kërkon vërejtja e Di Nucci et al. (2018). Parashikimet janë jashtë fold-it: çdo mostër parashikohet saktësisht një herë, nga një model që nuk e ka parë kurrë projektin e saj. Kjo jep të njëjtën formë që prodhojnë detektorët, ndaj dy qasjet krahasohen mostër për mostër.</w:t>
+      </w:r>
+    </w:p>
+    <w:p>
+      <w:pPr>
+        <w:spacing w:line="360" w:lineRule="auto"/>
+        <w:ind w:firstLine="360"/>
+        <w:jc w:val="both"/>
+      </w:pPr>
+      <w:r>
+        <w:rPr>
+          <w:rFonts w:ascii="Times New Roman" w:hAnsi="Times New Roman" w:eastAsia="Times New Roman"/>
+          <w:b w:val="0"/>
+          <w:caps w:val="0"/>
+          <w:sz w:val="24"/>
+        </w:rPr>
+        <w:t>Çekuilibri trajtohet me peshë klase, jo me mbi-mostrim. Mbi-mostrimi do t'i dyfishonte rreshtat përtej kufirit të fold-it dhe do ta prishte grupimin. Asnjë ribalancim nuk zbatohet mbi bashkësinë e testimit.</w:t>
+      </w:r>
+    </w:p>
+    <w:p>
+      <w:pPr>
+        <w:spacing w:line="360" w:lineRule="auto"/>
+        <w:ind w:firstLine="360"/>
+        <w:jc w:val="both"/>
+      </w:pPr>
+      <w:r>
+        <w:rPr>
+          <w:rFonts w:ascii="Times New Roman" w:hAnsi="Times New Roman" w:eastAsia="Times New Roman"/>
+          <w:b w:val="0"/>
+          <w:caps w:val="0"/>
+          <w:sz w:val="24"/>
+        </w:rPr>
+        <w:t>Rëndësia e veçorive matet me permutation importance mbi fold-in e mbajtur jashtë. Rëndësia e papastërtisë që një pyll e jep falas anon nga veçoritë me kardinalitet të lartë, dhe pikërisht ai anim do ta bënte të pakuptimtë pyetjen nëse modeli zgjodhi metrikat e strategjive.</w:t>
+      </w:r>
+    </w:p>
+    <w:p>
+      <w:pPr>
+        <w:spacing w:line="360" w:lineRule="auto"/>
+        <w:ind w:firstLine="360"/>
+        <w:jc w:val="both"/>
+      </w:pPr>
+      <w:r>
+        <w:rPr>
+          <w:rFonts w:ascii="Times New Roman" w:hAnsi="Times New Roman" w:eastAsia="Times New Roman"/>
+          <w:b w:val="0"/>
+          <w:caps w:val="0"/>
+          <w:sz w:val="24"/>
+        </w:rPr>
+        <w:t>Të dyja qasjet pikëzohen nga i njëjti kod. Nëse secila do ta llogariste vetë precizionin, tabela do të krahasonte dy përkufizime, jo dy qasje.</w:t>
+      </w:r>
+    </w:p>
+    <w:p>
+      <w:pPr>
+        <w:pStyle w:val="Heading2"/>
+      </w:pPr>
+      <w:r>
+        <w:rPr>
+          <w:rFonts w:ascii="Times New Roman" w:hAnsi="Times New Roman" w:eastAsia="Times New Roman"/>
+          <w:b/>
+          <w:caps w:val="0"/>
+          <w:sz w:val="24"/>
+        </w:rPr>
+        <w:t>4.5 Qasja C: motori i refaktorimit</w:t>
+      </w:r>
+    </w:p>
+    <w:p>
+      <w:pPr>
+        <w:spacing w:line="360" w:lineRule="auto"/>
+        <w:ind w:firstLine="360"/>
+        <w:jc w:val="both"/>
+      </w:pPr>
+      <w:r>
+        <w:rPr>
+          <w:rFonts w:ascii="Times New Roman" w:hAnsi="Times New Roman" w:eastAsia="Times New Roman"/>
+          <w:b w:val="0"/>
+          <w:caps w:val="0"/>
+          <w:sz w:val="24"/>
+        </w:rPr>
+        <w:t>Çdo transformim deklaron parakushtet e veta. Nëse ndonjëra prej tyre nuk provohet nga pema e analizës, transformimi kthen «e paaplikueshme» me arsyen përkatëse. Refuzimi është rezultat i saktë dhe numërohet si i tillë, jo si dështim.</w:t>
+      </w:r>
+    </w:p>
+    <w:p>
+      <w:pPr>
+        <w:spacing w:line="360" w:lineRule="auto"/>
+        <w:ind w:firstLine="360"/>
+        <w:jc w:val="both"/>
+      </w:pPr>
+      <w:r>
+        <w:rPr>
+          <w:rFonts w:ascii="Times New Roman" w:hAnsi="Times New Roman" w:eastAsia="Times New Roman"/>
+          <w:b w:val="0"/>
+          <w:caps w:val="0"/>
+          <w:sz w:val="24"/>
+        </w:rPr>
+        <w:t>Rishkrimi bëhet mbi rangje bajtash dhe aplikohet nga fundi para, që offset-et e çdo editimi të mbeten të vlefshme kundrejt tekstit ku u matën. Dy editime që mbivendosen refuzohen, sepse nuk kanë rezultat të përcaktuar. Puna bëhet mbi bajta e jo mbi karaktere, sepse Java-ja është UTF-8 dhe prerja sipas indeksit të karakterit e pret një sekuencë shumë-bajtëshe në mes.</w:t>
+      </w:r>
+    </w:p>
+    <w:p>
+      <w:pPr>
+        <w:spacing w:line="360" w:lineRule="auto"/>
+        <w:ind w:firstLine="360"/>
+        <w:jc w:val="both"/>
+      </w:pPr>
+      <w:r>
+        <w:rPr>
+          <w:rFonts w:ascii="Times New Roman" w:hAnsi="Times New Roman" w:eastAsia="Times New Roman"/>
+          <w:b w:val="0"/>
+          <w:caps w:val="0"/>
+          <w:sz w:val="24"/>
+        </w:rPr>
+        <w:t>Verifikimi bëhet në tri nivele. U mat se vetëm 8% e skedarëve të korpusit kompilojnë të vetëm, sepse pjesa tjetër importon fqinjët e vet; këmbëngulja te një kompilim i pastër do të linte 92% të korpusit të paverifikueshëm. Prandaj kontrollohet së pari nëse skedari i rishkruar parsohet, pastaj nëse shton lloj të ri gabimi kompilimi, dhe së fundi — ku është e mundur — nëse kompilon.</w:t>
+      </w:r>
+    </w:p>
+    <w:p>
+      <w:pPr>
+        <w:pStyle w:val="Heading2"/>
+      </w:pPr>
+      <w:r>
+        <w:rPr>
+          <w:rFonts w:ascii="Times New Roman" w:hAnsi="Times New Roman" w:eastAsia="Times New Roman"/>
+          <w:b/>
+          <w:caps w:val="0"/>
+          <w:sz w:val="24"/>
+        </w:rPr>
+        <w:t>4.6 Riprodhueshmëria</w:t>
+      </w:r>
+    </w:p>
+    <w:p>
+      <w:pPr>
+        <w:spacing w:line="360" w:lineRule="auto"/>
+        <w:ind w:firstLine="360"/>
+        <w:jc w:val="both"/>
+      </w:pPr>
+      <w:r>
+        <w:rPr>
+          <w:rFonts w:ascii="Times New Roman" w:hAnsi="Times New Roman" w:eastAsia="Times New Roman"/>
+          <w:b w:val="0"/>
+          <w:caps w:val="0"/>
+          <w:sz w:val="24"/>
+        </w:rPr>
+        <w:t>Çdo numër i raportuar në Kapitullin 5 prodhohet nga një skript dhe shkruhet si CSV ose JSON që komitohet. Farat e rastësisë janë të fiksuara, versionet e varësive të pinuara, dhe mjedisi i regjistruar në çdo skedar rezultati.</w:t>
+      </w:r>
+    </w:p>
+    <w:p>
+      <w:pPr>
+        <w:spacing w:line="360" w:lineRule="auto"/>
+        <w:ind w:firstLine="360"/>
+        <w:jc w:val="both"/>
+      </w:pPr>
+      <w:r>
+        <w:rPr>
+          <w:rFonts w:ascii="Times New Roman" w:hAnsi="Times New Roman" w:eastAsia="Times New Roman"/>
+          <w:b w:val="0"/>
+          <w:caps w:val="0"/>
+          <w:sz w:val="24"/>
+        </w:rPr>
+        <w:t>Kalimi i shtrenjtë mbi korpusin — rreth 95 minuta për 690 mijë skedarë — bëhet një herë dhe prodhon një tabelë veçorish që komitohet. Pragjet nuk hyjnë në atë kalim, ndaj analiza e ndjeshmërisë rirendit detektorët mbi rreshtat e ruajtur në sekonda. Pa këtë ndarje, një fshirje me njëzet konfigurime do të kushtonte mbi tridhjetë orë dhe nuk do të bëhej.</w:t>
       </w:r>
     </w:p>
     <w:p>
@@ -1873,7 +2901,2856 @@
           <w:caps w:val="0"/>
           <w:sz w:val="24"/>
         </w:rPr>
-        <w:t>[PLOTËSO]</w:t>
+        <w:t>Të gjitha shifrat e këtij kapitulli janë prodhuar mbi 4534 mostra nga 522 depo, dhe rigjenerohen me një komandë. Agregimi i etiketave është mesatarja e rrumbullakosur lart, përveç aty ku thuhet ndryshe.</w:t>
+      </w:r>
+    </w:p>
+    <w:p>
+      <w:pPr>
+        <w:jc w:val="center"/>
+      </w:pPr>
+      <w:r>
+        <w:drawing>
+          <wp:inline xmlns:a="http://schemas.openxmlformats.org/drawingml/2006/main" xmlns:pic="http://schemas.openxmlformats.org/drawingml/2006/picture">
+            <wp:extent cx="5120640" cy="2523481"/>
+            <wp:docPr id="1" name="Picture 1"/>
+            <wp:cNvGraphicFramePr>
+              <a:graphicFrameLocks noChangeAspect="1"/>
+            </wp:cNvGraphicFramePr>
+            <a:graphic>
+              <a:graphicData uri="http://schemas.openxmlformats.org/drawingml/2006/picture">
+                <pic:pic>
+                  <pic:nvPicPr>
+                    <pic:cNvPr id="0" name="figura_5_shperndarja_e_mostrave.png"/>
+                    <pic:cNvPicPr/>
+                  </pic:nvPicPr>
+                  <pic:blipFill>
+                    <a:blip r:embed="rId12"/>
+                    <a:stretch>
+                      <a:fillRect/>
+                    </a:stretch>
+                  </pic:blipFill>
+                  <pic:spPr>
+                    <a:xfrm>
+                      <a:off x="0" y="0"/>
+                      <a:ext cx="5120640" cy="2523481"/>
+                    </a:xfrm>
+                    <a:prstGeom prst="rect"/>
+                  </pic:spPr>
+                </pic:pic>
+              </a:graphicData>
+            </a:graphic>
+          </wp:inline>
+        </w:drawing>
+      </w:r>
+    </w:p>
+    <w:p>
+      <w:pPr>
+        <w:spacing w:line="240" w:lineRule="auto"/>
+        <w:jc w:val="center"/>
+      </w:pPr>
+      <w:r>
+        <w:rPr>
+          <w:rFonts w:ascii="Times New Roman" w:hAnsi="Times New Roman" w:eastAsia="Times New Roman"/>
+          <w:b w:val="0"/>
+          <w:caps w:val="0"/>
+          <w:sz w:val="22"/>
+        </w:rPr>
+        <w:t>Figura 5. Shpërndarja e mostrave sipas erës</w:t>
+      </w:r>
+    </w:p>
+    <w:p>
+      <w:pPr>
+        <w:pStyle w:val="Heading2"/>
+      </w:pPr>
+      <w:r>
+        <w:rPr>
+          <w:rFonts w:ascii="Times New Roman" w:hAnsi="Times New Roman" w:eastAsia="Times New Roman"/>
+          <w:b/>
+          <w:caps w:val="0"/>
+          <w:sz w:val="24"/>
+        </w:rPr>
+        <w:t>5.1 Qasja A: detektimi me rregulla</w:t>
+      </w:r>
+    </w:p>
+    <w:p>
+      <w:pPr>
+        <w:spacing w:line="360" w:lineRule="auto"/>
+        <w:ind w:firstLine="360"/>
+        <w:jc w:val="both"/>
+      </w:pPr>
+      <w:r>
+        <w:rPr>
+          <w:rFonts w:ascii="Times New Roman" w:hAnsi="Times New Roman" w:eastAsia="Times New Roman"/>
+          <w:b w:val="0"/>
+          <w:caps w:val="0"/>
+          <w:sz w:val="24"/>
+        </w:rPr>
+        <w:t>Tabela më poshtë jep precizionin, recall-in, F1-in dhe MCC-në për çdo erë. MCC-ja raportohet sepse është shifra që nuk e lajkaton një detektor mbi një bashkësi të çekuilibruar: një klasifikues që nuk ndez kurrë merr zero këtu.</w:t>
+      </w:r>
+    </w:p>
+    <w:p>
+      <w:pPr>
+        <w:spacing w:line="240" w:lineRule="auto"/>
+        <w:jc w:val="center"/>
+      </w:pPr>
+      <w:r>
+        <w:rPr>
+          <w:rFonts w:ascii="Times New Roman" w:hAnsi="Times New Roman" w:eastAsia="Times New Roman"/>
+          <w:b w:val="0"/>
+          <w:caps w:val="0"/>
+          <w:sz w:val="22"/>
+        </w:rPr>
+        <w:t>Tabela 1. Qasja A kundrejt gjykimit të rishikuesve</w:t>
+      </w:r>
+    </w:p>
+    <w:tbl>
+      <w:tblPr>
+        <w:tblStyle w:val="TableGrid"/>
+        <w:tblW w:type="auto" w:w="0"/>
+        <w:tblLook w:firstColumn="1" w:firstRow="1" w:lastColumn="0" w:lastRow="0" w:noHBand="0" w:noVBand="1" w:val="04A0"/>
+      </w:tblPr>
+      <w:tblGrid>
+        <w:gridCol w:w="1440"/>
+        <w:gridCol w:w="1440"/>
+        <w:gridCol w:w="1440"/>
+        <w:gridCol w:w="1440"/>
+        <w:gridCol w:w="1440"/>
+        <w:gridCol w:w="1440"/>
+      </w:tblGrid>
+      <w:tr>
+        <w:tc>
+          <w:tcPr>
+            <w:tcW w:type="dxa" w:w="1440"/>
+          </w:tcPr>
+          <w:p>
+            <w:pPr>
+              <w:spacing w:line="240" w:lineRule="auto"/>
+            </w:pPr>
+            <w:r>
+              <w:rPr>
+                <w:rFonts w:ascii="Times New Roman" w:hAnsi="Times New Roman" w:eastAsia="Times New Roman"/>
+                <w:b/>
+                <w:caps w:val="0"/>
+                <w:sz w:val="22"/>
+              </w:rPr>
+              <w:t>Erë</w:t>
+            </w:r>
+          </w:p>
+        </w:tc>
+        <w:tc>
+          <w:tcPr>
+            <w:tcW w:type="dxa" w:w="1440"/>
+          </w:tcPr>
+          <w:p>
+            <w:pPr>
+              <w:spacing w:line="240" w:lineRule="auto"/>
+            </w:pPr>
+            <w:r>
+              <w:rPr>
+                <w:rFonts w:ascii="Times New Roman" w:hAnsi="Times New Roman" w:eastAsia="Times New Roman"/>
+                <w:b/>
+                <w:caps w:val="0"/>
+                <w:sz w:val="22"/>
+              </w:rPr>
+              <w:t>P</w:t>
+            </w:r>
+          </w:p>
+        </w:tc>
+        <w:tc>
+          <w:tcPr>
+            <w:tcW w:type="dxa" w:w="1440"/>
+          </w:tcPr>
+          <w:p>
+            <w:pPr>
+              <w:spacing w:line="240" w:lineRule="auto"/>
+            </w:pPr>
+            <w:r>
+              <w:rPr>
+                <w:rFonts w:ascii="Times New Roman" w:hAnsi="Times New Roman" w:eastAsia="Times New Roman"/>
+                <w:b/>
+                <w:caps w:val="0"/>
+                <w:sz w:val="22"/>
+              </w:rPr>
+              <w:t>R</w:t>
+            </w:r>
+          </w:p>
+        </w:tc>
+        <w:tc>
+          <w:tcPr>
+            <w:tcW w:type="dxa" w:w="1440"/>
+          </w:tcPr>
+          <w:p>
+            <w:pPr>
+              <w:spacing w:line="240" w:lineRule="auto"/>
+            </w:pPr>
+            <w:r>
+              <w:rPr>
+                <w:rFonts w:ascii="Times New Roman" w:hAnsi="Times New Roman" w:eastAsia="Times New Roman"/>
+                <w:b/>
+                <w:caps w:val="0"/>
+                <w:sz w:val="22"/>
+              </w:rPr>
+              <w:t>F1</w:t>
+            </w:r>
+          </w:p>
+        </w:tc>
+        <w:tc>
+          <w:tcPr>
+            <w:tcW w:type="dxa" w:w="1440"/>
+          </w:tcPr>
+          <w:p>
+            <w:pPr>
+              <w:spacing w:line="240" w:lineRule="auto"/>
+            </w:pPr>
+            <w:r>
+              <w:rPr>
+                <w:rFonts w:ascii="Times New Roman" w:hAnsi="Times New Roman" w:eastAsia="Times New Roman"/>
+                <w:b/>
+                <w:caps w:val="0"/>
+                <w:sz w:val="22"/>
+              </w:rPr>
+              <w:t>MCC</w:t>
+            </w:r>
+          </w:p>
+        </w:tc>
+        <w:tc>
+          <w:tcPr>
+            <w:tcW w:type="dxa" w:w="1440"/>
+          </w:tcPr>
+          <w:p>
+            <w:pPr>
+              <w:spacing w:line="240" w:lineRule="auto"/>
+            </w:pPr>
+            <w:r>
+              <w:rPr>
+                <w:rFonts w:ascii="Times New Roman" w:hAnsi="Times New Roman" w:eastAsia="Times New Roman"/>
+                <w:b/>
+                <w:caps w:val="0"/>
+                <w:sz w:val="22"/>
+              </w:rPr>
+              <w:t>Pozitivë</w:t>
+            </w:r>
+          </w:p>
+        </w:tc>
+      </w:tr>
+      <w:tr>
+        <w:tc>
+          <w:tcPr>
+            <w:tcW w:type="dxa" w:w="1440"/>
+          </w:tcPr>
+          <w:p>
+            <w:pPr>
+              <w:spacing w:line="240" w:lineRule="auto"/>
+            </w:pPr>
+            <w:r>
+              <w:rPr>
+                <w:rFonts w:ascii="Times New Roman" w:hAnsi="Times New Roman" w:eastAsia="Times New Roman"/>
+                <w:b w:val="0"/>
+                <w:caps w:val="0"/>
+                <w:sz w:val="22"/>
+              </w:rPr>
+              <w:t>Blob</w:t>
+            </w:r>
+          </w:p>
+        </w:tc>
+        <w:tc>
+          <w:tcPr>
+            <w:tcW w:type="dxa" w:w="1440"/>
+          </w:tcPr>
+          <w:p>
+            <w:pPr>
+              <w:spacing w:line="240" w:lineRule="auto"/>
+            </w:pPr>
+            <w:r>
+              <w:rPr>
+                <w:rFonts w:ascii="Times New Roman" w:hAnsi="Times New Roman" w:eastAsia="Times New Roman"/>
+                <w:b w:val="0"/>
+                <w:caps w:val="0"/>
+                <w:sz w:val="22"/>
+              </w:rPr>
+              <w:t>0.814</w:t>
+            </w:r>
+          </w:p>
+        </w:tc>
+        <w:tc>
+          <w:tcPr>
+            <w:tcW w:type="dxa" w:w="1440"/>
+          </w:tcPr>
+          <w:p>
+            <w:pPr>
+              <w:spacing w:line="240" w:lineRule="auto"/>
+            </w:pPr>
+            <w:r>
+              <w:rPr>
+                <w:rFonts w:ascii="Times New Roman" w:hAnsi="Times New Roman" w:eastAsia="Times New Roman"/>
+                <w:b w:val="0"/>
+                <w:caps w:val="0"/>
+                <w:sz w:val="22"/>
+              </w:rPr>
+              <w:t>0.100</w:t>
+            </w:r>
+          </w:p>
+        </w:tc>
+        <w:tc>
+          <w:tcPr>
+            <w:tcW w:type="dxa" w:w="1440"/>
+          </w:tcPr>
+          <w:p>
+            <w:pPr>
+              <w:spacing w:line="240" w:lineRule="auto"/>
+            </w:pPr>
+            <w:r>
+              <w:rPr>
+                <w:rFonts w:ascii="Times New Roman" w:hAnsi="Times New Roman" w:eastAsia="Times New Roman"/>
+                <w:b w:val="0"/>
+                <w:caps w:val="0"/>
+                <w:sz w:val="22"/>
+              </w:rPr>
+              <w:t>0.178</w:t>
+            </w:r>
+          </w:p>
+        </w:tc>
+        <w:tc>
+          <w:tcPr>
+            <w:tcW w:type="dxa" w:w="1440"/>
+          </w:tcPr>
+          <w:p>
+            <w:pPr>
+              <w:spacing w:line="240" w:lineRule="auto"/>
+            </w:pPr>
+            <w:r>
+              <w:rPr>
+                <w:rFonts w:ascii="Times New Roman" w:hAnsi="Times New Roman" w:eastAsia="Times New Roman"/>
+                <w:b w:val="0"/>
+                <w:caps w:val="0"/>
+                <w:sz w:val="22"/>
+              </w:rPr>
+              <w:t>0.232</w:t>
+            </w:r>
+          </w:p>
+        </w:tc>
+        <w:tc>
+          <w:tcPr>
+            <w:tcW w:type="dxa" w:w="1440"/>
+          </w:tcPr>
+          <w:p>
+            <w:pPr>
+              <w:spacing w:line="240" w:lineRule="auto"/>
+            </w:pPr>
+            <w:r>
+              <w:rPr>
+                <w:rFonts w:ascii="Times New Roman" w:hAnsi="Times New Roman" w:eastAsia="Times New Roman"/>
+                <w:b w:val="0"/>
+                <w:caps w:val="0"/>
+                <w:sz w:val="22"/>
+              </w:rPr>
+              <w:t>350</w:t>
+            </w:r>
+          </w:p>
+        </w:tc>
+      </w:tr>
+      <w:tr>
+        <w:tc>
+          <w:tcPr>
+            <w:tcW w:type="dxa" w:w="1440"/>
+          </w:tcPr>
+          <w:p>
+            <w:pPr>
+              <w:spacing w:line="240" w:lineRule="auto"/>
+            </w:pPr>
+            <w:r>
+              <w:rPr>
+                <w:rFonts w:ascii="Times New Roman" w:hAnsi="Times New Roman" w:eastAsia="Times New Roman"/>
+                <w:b w:val="0"/>
+                <w:caps w:val="0"/>
+                <w:sz w:val="22"/>
+              </w:rPr>
+              <w:t>Blob (+ madhësi)</w:t>
+            </w:r>
+          </w:p>
+        </w:tc>
+        <w:tc>
+          <w:tcPr>
+            <w:tcW w:type="dxa" w:w="1440"/>
+          </w:tcPr>
+          <w:p>
+            <w:pPr>
+              <w:spacing w:line="240" w:lineRule="auto"/>
+            </w:pPr>
+            <w:r>
+              <w:rPr>
+                <w:rFonts w:ascii="Times New Roman" w:hAnsi="Times New Roman" w:eastAsia="Times New Roman"/>
+                <w:b w:val="0"/>
+                <w:caps w:val="0"/>
+                <w:sz w:val="22"/>
+              </w:rPr>
+              <w:t>0.720</w:t>
+            </w:r>
+          </w:p>
+        </w:tc>
+        <w:tc>
+          <w:tcPr>
+            <w:tcW w:type="dxa" w:w="1440"/>
+          </w:tcPr>
+          <w:p>
+            <w:pPr>
+              <w:spacing w:line="240" w:lineRule="auto"/>
+            </w:pPr>
+            <w:r>
+              <w:rPr>
+                <w:rFonts w:ascii="Times New Roman" w:hAnsi="Times New Roman" w:eastAsia="Times New Roman"/>
+                <w:b w:val="0"/>
+                <w:caps w:val="0"/>
+                <w:sz w:val="22"/>
+              </w:rPr>
+              <w:t>0.257</w:t>
+            </w:r>
+          </w:p>
+        </w:tc>
+        <w:tc>
+          <w:tcPr>
+            <w:tcW w:type="dxa" w:w="1440"/>
+          </w:tcPr>
+          <w:p>
+            <w:pPr>
+              <w:spacing w:line="240" w:lineRule="auto"/>
+            </w:pPr>
+            <w:r>
+              <w:rPr>
+                <w:rFonts w:ascii="Times New Roman" w:hAnsi="Times New Roman" w:eastAsia="Times New Roman"/>
+                <w:b w:val="0"/>
+                <w:caps w:val="0"/>
+                <w:sz w:val="22"/>
+              </w:rPr>
+              <w:t>0.379</w:t>
+            </w:r>
+          </w:p>
+        </w:tc>
+        <w:tc>
+          <w:tcPr>
+            <w:tcW w:type="dxa" w:w="1440"/>
+          </w:tcPr>
+          <w:p>
+            <w:pPr>
+              <w:spacing w:line="240" w:lineRule="auto"/>
+            </w:pPr>
+            <w:r>
+              <w:rPr>
+                <w:rFonts w:ascii="Times New Roman" w:hAnsi="Times New Roman" w:eastAsia="Times New Roman"/>
+                <w:b w:val="0"/>
+                <w:caps w:val="0"/>
+                <w:sz w:val="22"/>
+              </w:rPr>
+              <w:t>0.340</w:t>
+            </w:r>
+          </w:p>
+        </w:tc>
+        <w:tc>
+          <w:tcPr>
+            <w:tcW w:type="dxa" w:w="1440"/>
+          </w:tcPr>
+          <w:p>
+            <w:pPr>
+              <w:spacing w:line="240" w:lineRule="auto"/>
+            </w:pPr>
+            <w:r>
+              <w:rPr>
+                <w:rFonts w:ascii="Times New Roman" w:hAnsi="Times New Roman" w:eastAsia="Times New Roman"/>
+                <w:b w:val="0"/>
+                <w:caps w:val="0"/>
+                <w:sz w:val="22"/>
+              </w:rPr>
+              <w:t>350</w:t>
+            </w:r>
+          </w:p>
+        </w:tc>
+      </w:tr>
+      <w:tr>
+        <w:tc>
+          <w:tcPr>
+            <w:tcW w:type="dxa" w:w="1440"/>
+          </w:tcPr>
+          <w:p>
+            <w:pPr>
+              <w:spacing w:line="240" w:lineRule="auto"/>
+            </w:pPr>
+            <w:r>
+              <w:rPr>
+                <w:rFonts w:ascii="Times New Roman" w:hAnsi="Times New Roman" w:eastAsia="Times New Roman"/>
+                <w:b w:val="0"/>
+                <w:caps w:val="0"/>
+                <w:sz w:val="22"/>
+              </w:rPr>
+              <w:t>Data Class</w:t>
+            </w:r>
+          </w:p>
+        </w:tc>
+        <w:tc>
+          <w:tcPr>
+            <w:tcW w:type="dxa" w:w="1440"/>
+          </w:tcPr>
+          <w:p>
+            <w:pPr>
+              <w:spacing w:line="240" w:lineRule="auto"/>
+            </w:pPr>
+            <w:r>
+              <w:rPr>
+                <w:rFonts w:ascii="Times New Roman" w:hAnsi="Times New Roman" w:eastAsia="Times New Roman"/>
+                <w:b w:val="0"/>
+                <w:caps w:val="0"/>
+                <w:sz w:val="22"/>
+              </w:rPr>
+              <w:t>0.757</w:t>
+            </w:r>
+          </w:p>
+        </w:tc>
+        <w:tc>
+          <w:tcPr>
+            <w:tcW w:type="dxa" w:w="1440"/>
+          </w:tcPr>
+          <w:p>
+            <w:pPr>
+              <w:spacing w:line="240" w:lineRule="auto"/>
+            </w:pPr>
+            <w:r>
+              <w:rPr>
+                <w:rFonts w:ascii="Times New Roman" w:hAnsi="Times New Roman" w:eastAsia="Times New Roman"/>
+                <w:b w:val="0"/>
+                <w:caps w:val="0"/>
+                <w:sz w:val="22"/>
+              </w:rPr>
+              <w:t>0.150</w:t>
+            </w:r>
+          </w:p>
+        </w:tc>
+        <w:tc>
+          <w:tcPr>
+            <w:tcW w:type="dxa" w:w="1440"/>
+          </w:tcPr>
+          <w:p>
+            <w:pPr>
+              <w:spacing w:line="240" w:lineRule="auto"/>
+            </w:pPr>
+            <w:r>
+              <w:rPr>
+                <w:rFonts w:ascii="Times New Roman" w:hAnsi="Times New Roman" w:eastAsia="Times New Roman"/>
+                <w:b w:val="0"/>
+                <w:caps w:val="0"/>
+                <w:sz w:val="22"/>
+              </w:rPr>
+              <w:t>0.251</w:t>
+            </w:r>
+          </w:p>
+        </w:tc>
+        <w:tc>
+          <w:tcPr>
+            <w:tcW w:type="dxa" w:w="1440"/>
+          </w:tcPr>
+          <w:p>
+            <w:pPr>
+              <w:spacing w:line="240" w:lineRule="auto"/>
+            </w:pPr>
+            <w:r>
+              <w:rPr>
+                <w:rFonts w:ascii="Times New Roman" w:hAnsi="Times New Roman" w:eastAsia="Times New Roman"/>
+                <w:b w:val="0"/>
+                <w:caps w:val="0"/>
+                <w:sz w:val="22"/>
+              </w:rPr>
+              <w:t>0.275</w:t>
+            </w:r>
+          </w:p>
+        </w:tc>
+        <w:tc>
+          <w:tcPr>
+            <w:tcW w:type="dxa" w:w="1440"/>
+          </w:tcPr>
+          <w:p>
+            <w:pPr>
+              <w:spacing w:line="240" w:lineRule="auto"/>
+            </w:pPr>
+            <w:r>
+              <w:rPr>
+                <w:rFonts w:ascii="Times New Roman" w:hAnsi="Times New Roman" w:eastAsia="Times New Roman"/>
+                <w:b w:val="0"/>
+                <w:caps w:val="0"/>
+                <w:sz w:val="22"/>
+              </w:rPr>
+              <w:t>186</w:t>
+            </w:r>
+          </w:p>
+        </w:tc>
+      </w:tr>
+      <w:tr>
+        <w:tc>
+          <w:tcPr>
+            <w:tcW w:type="dxa" w:w="1440"/>
+          </w:tcPr>
+          <w:p>
+            <w:pPr>
+              <w:spacing w:line="240" w:lineRule="auto"/>
+            </w:pPr>
+            <w:r>
+              <w:rPr>
+                <w:rFonts w:ascii="Times New Roman" w:hAnsi="Times New Roman" w:eastAsia="Times New Roman"/>
+                <w:b w:val="0"/>
+                <w:caps w:val="0"/>
+                <w:sz w:val="22"/>
+              </w:rPr>
+              <w:t>Feature Envy</w:t>
+            </w:r>
+          </w:p>
+        </w:tc>
+        <w:tc>
+          <w:tcPr>
+            <w:tcW w:type="dxa" w:w="1440"/>
+          </w:tcPr>
+          <w:p>
+            <w:pPr>
+              <w:spacing w:line="240" w:lineRule="auto"/>
+            </w:pPr>
+            <w:r>
+              <w:rPr>
+                <w:rFonts w:ascii="Times New Roman" w:hAnsi="Times New Roman" w:eastAsia="Times New Roman"/>
+                <w:b w:val="0"/>
+                <w:caps w:val="0"/>
+                <w:sz w:val="22"/>
+              </w:rPr>
+              <w:t>0.520</w:t>
+            </w:r>
+          </w:p>
+        </w:tc>
+        <w:tc>
+          <w:tcPr>
+            <w:tcW w:type="dxa" w:w="1440"/>
+          </w:tcPr>
+          <w:p>
+            <w:pPr>
+              <w:spacing w:line="240" w:lineRule="auto"/>
+            </w:pPr>
+            <w:r>
+              <w:rPr>
+                <w:rFonts w:ascii="Times New Roman" w:hAnsi="Times New Roman" w:eastAsia="Times New Roman"/>
+                <w:b w:val="0"/>
+                <w:caps w:val="0"/>
+                <w:sz w:val="22"/>
+              </w:rPr>
+              <w:t>0.181</w:t>
+            </w:r>
+          </w:p>
+        </w:tc>
+        <w:tc>
+          <w:tcPr>
+            <w:tcW w:type="dxa" w:w="1440"/>
+          </w:tcPr>
+          <w:p>
+            <w:pPr>
+              <w:spacing w:line="240" w:lineRule="auto"/>
+            </w:pPr>
+            <w:r>
+              <w:rPr>
+                <w:rFonts w:ascii="Times New Roman" w:hAnsi="Times New Roman" w:eastAsia="Times New Roman"/>
+                <w:b w:val="0"/>
+                <w:caps w:val="0"/>
+                <w:sz w:val="22"/>
+              </w:rPr>
+              <w:t>0.268</w:t>
+            </w:r>
+          </w:p>
+        </w:tc>
+        <w:tc>
+          <w:tcPr>
+            <w:tcW w:type="dxa" w:w="1440"/>
+          </w:tcPr>
+          <w:p>
+            <w:pPr>
+              <w:spacing w:line="240" w:lineRule="auto"/>
+            </w:pPr>
+            <w:r>
+              <w:rPr>
+                <w:rFonts w:ascii="Times New Roman" w:hAnsi="Times New Roman" w:eastAsia="Times New Roman"/>
+                <w:b w:val="0"/>
+                <w:caps w:val="0"/>
+                <w:sz w:val="22"/>
+              </w:rPr>
+              <w:t>0.271</w:t>
+            </w:r>
+          </w:p>
+        </w:tc>
+        <w:tc>
+          <w:tcPr>
+            <w:tcW w:type="dxa" w:w="1440"/>
+          </w:tcPr>
+          <w:p>
+            <w:pPr>
+              <w:spacing w:line="240" w:lineRule="auto"/>
+            </w:pPr>
+            <w:r>
+              <w:rPr>
+                <w:rFonts w:ascii="Times New Roman" w:hAnsi="Times New Roman" w:eastAsia="Times New Roman"/>
+                <w:b w:val="0"/>
+                <w:caps w:val="0"/>
+                <w:sz w:val="22"/>
+              </w:rPr>
+              <w:t>72</w:t>
+            </w:r>
+          </w:p>
+        </w:tc>
+      </w:tr>
+      <w:tr>
+        <w:tc>
+          <w:tcPr>
+            <w:tcW w:type="dxa" w:w="1440"/>
+          </w:tcPr>
+          <w:p>
+            <w:pPr>
+              <w:spacing w:line="240" w:lineRule="auto"/>
+            </w:pPr>
+            <w:r>
+              <w:rPr>
+                <w:rFonts w:ascii="Times New Roman" w:hAnsi="Times New Roman" w:eastAsia="Times New Roman"/>
+                <w:b w:val="0"/>
+                <w:caps w:val="0"/>
+                <w:sz w:val="22"/>
+              </w:rPr>
+              <w:t>Long Method</w:t>
+            </w:r>
+          </w:p>
+        </w:tc>
+        <w:tc>
+          <w:tcPr>
+            <w:tcW w:type="dxa" w:w="1440"/>
+          </w:tcPr>
+          <w:p>
+            <w:pPr>
+              <w:spacing w:line="240" w:lineRule="auto"/>
+            </w:pPr>
+            <w:r>
+              <w:rPr>
+                <w:rFonts w:ascii="Times New Roman" w:hAnsi="Times New Roman" w:eastAsia="Times New Roman"/>
+                <w:b w:val="0"/>
+                <w:caps w:val="0"/>
+                <w:sz w:val="22"/>
+              </w:rPr>
+              <w:t>0.872</w:t>
+            </w:r>
+          </w:p>
+        </w:tc>
+        <w:tc>
+          <w:tcPr>
+            <w:tcW w:type="dxa" w:w="1440"/>
+          </w:tcPr>
+          <w:p>
+            <w:pPr>
+              <w:spacing w:line="240" w:lineRule="auto"/>
+            </w:pPr>
+            <w:r>
+              <w:rPr>
+                <w:rFonts w:ascii="Times New Roman" w:hAnsi="Times New Roman" w:eastAsia="Times New Roman"/>
+                <w:b w:val="0"/>
+                <w:caps w:val="0"/>
+                <w:sz w:val="22"/>
+              </w:rPr>
+              <w:t>0.440</w:t>
+            </w:r>
+          </w:p>
+        </w:tc>
+        <w:tc>
+          <w:tcPr>
+            <w:tcW w:type="dxa" w:w="1440"/>
+          </w:tcPr>
+          <w:p>
+            <w:pPr>
+              <w:spacing w:line="240" w:lineRule="auto"/>
+            </w:pPr>
+            <w:r>
+              <w:rPr>
+                <w:rFonts w:ascii="Times New Roman" w:hAnsi="Times New Roman" w:eastAsia="Times New Roman"/>
+                <w:b w:val="0"/>
+                <w:caps w:val="0"/>
+                <w:sz w:val="22"/>
+              </w:rPr>
+              <w:t>0.585</w:t>
+            </w:r>
+          </w:p>
+        </w:tc>
+        <w:tc>
+          <w:tcPr>
+            <w:tcW w:type="dxa" w:w="1440"/>
+          </w:tcPr>
+          <w:p>
+            <w:pPr>
+              <w:spacing w:line="240" w:lineRule="auto"/>
+            </w:pPr>
+            <w:r>
+              <w:rPr>
+                <w:rFonts w:ascii="Times New Roman" w:hAnsi="Times New Roman" w:eastAsia="Times New Roman"/>
+                <w:b w:val="0"/>
+                <w:caps w:val="0"/>
+                <w:sz w:val="22"/>
+              </w:rPr>
+              <w:t>0.580</w:t>
+            </w:r>
+          </w:p>
+        </w:tc>
+        <w:tc>
+          <w:tcPr>
+            <w:tcW w:type="dxa" w:w="1440"/>
+          </w:tcPr>
+          <w:p>
+            <w:pPr>
+              <w:spacing w:line="240" w:lineRule="auto"/>
+            </w:pPr>
+            <w:r>
+              <w:rPr>
+                <w:rFonts w:ascii="Times New Roman" w:hAnsi="Times New Roman" w:eastAsia="Times New Roman"/>
+                <w:b w:val="0"/>
+                <w:caps w:val="0"/>
+                <w:sz w:val="22"/>
+              </w:rPr>
+              <w:t>216</w:t>
+            </w:r>
+          </w:p>
+        </w:tc>
+      </w:tr>
+    </w:tbl>
+    <w:p>
+      <w:pPr>
+        <w:spacing w:line="240" w:lineRule="auto" w:after="0"/>
+      </w:pPr>
+    </w:p>
+    <w:p>
+      <w:pPr>
+        <w:spacing w:line="360" w:lineRule="auto"/>
+        <w:ind w:firstLine="360"/>
+        <w:jc w:val="both"/>
+      </w:pPr>
+      <w:r>
+        <w:rPr>
+          <w:rFonts w:ascii="Times New Roman" w:hAnsi="Times New Roman" w:eastAsia="Times New Roman"/>
+          <w:b w:val="0"/>
+          <w:caps w:val="0"/>
+          <w:sz w:val="24"/>
+        </w:rPr>
+        <w:t>Modeli është i njëjtë kudo: precizion i lartë dhe recall i ulët. Kur strategjitë ndezin kanë kryesisht të drejtë, por i humbin shumicën e rasteve.</w:t>
+      </w:r>
+    </w:p>
+    <w:p>
+      <w:pPr>
+        <w:spacing w:line="360" w:lineRule="auto"/>
+        <w:ind w:firstLine="360"/>
+        <w:jc w:val="both"/>
+      </w:pPr>
+      <w:r>
+        <w:rPr>
+          <w:rFonts w:ascii="Times New Roman" w:hAnsi="Times New Roman" w:eastAsia="Times New Roman"/>
+          <w:b w:val="0"/>
+          <w:caps w:val="0"/>
+          <w:sz w:val="24"/>
+        </w:rPr>
+        <w:t>Ky lexim ndryshon kur recall-i ndahet sipas ashpërsisë që caktuan vetë rishikuesit.</w:t>
+      </w:r>
+    </w:p>
+    <w:p>
+      <w:pPr>
+        <w:spacing w:line="240" w:lineRule="auto"/>
+        <w:jc w:val="center"/>
+      </w:pPr>
+      <w:r>
+        <w:rPr>
+          <w:rFonts w:ascii="Times New Roman" w:hAnsi="Times New Roman" w:eastAsia="Times New Roman"/>
+          <w:b w:val="0"/>
+          <w:caps w:val="0"/>
+          <w:sz w:val="22"/>
+        </w:rPr>
+        <w:t>Tabela 2. Recall-i sipas ashpërsisë</w:t>
+      </w:r>
+    </w:p>
+    <w:tbl>
+      <w:tblPr>
+        <w:tblStyle w:val="TableGrid"/>
+        <w:tblW w:type="auto" w:w="0"/>
+        <w:tblLook w:firstColumn="1" w:firstRow="1" w:lastColumn="0" w:lastRow="0" w:noHBand="0" w:noVBand="1" w:val="04A0"/>
+      </w:tblPr>
+      <w:tblGrid>
+        <w:gridCol w:w="2880"/>
+        <w:gridCol w:w="2880"/>
+        <w:gridCol w:w="2880"/>
+      </w:tblGrid>
+      <w:tr>
+        <w:tc>
+          <w:tcPr>
+            <w:tcW w:type="dxa" w:w="2880"/>
+          </w:tcPr>
+          <w:p>
+            <w:pPr>
+              <w:spacing w:line="240" w:lineRule="auto"/>
+            </w:pPr>
+            <w:r>
+              <w:rPr>
+                <w:rFonts w:ascii="Times New Roman" w:hAnsi="Times New Roman" w:eastAsia="Times New Roman"/>
+                <w:b/>
+                <w:caps w:val="0"/>
+                <w:sz w:val="22"/>
+              </w:rPr>
+              <w:t>Erë</w:t>
+            </w:r>
+          </w:p>
+        </w:tc>
+        <w:tc>
+          <w:tcPr>
+            <w:tcW w:type="dxa" w:w="2880"/>
+          </w:tcPr>
+          <w:p>
+            <w:pPr>
+              <w:spacing w:line="240" w:lineRule="auto"/>
+            </w:pPr>
+            <w:r>
+              <w:rPr>
+                <w:rFonts w:ascii="Times New Roman" w:hAnsi="Times New Roman" w:eastAsia="Times New Roman"/>
+                <w:b/>
+                <w:caps w:val="0"/>
+                <w:sz w:val="22"/>
+              </w:rPr>
+              <w:t>Recall te major</w:t>
+            </w:r>
+          </w:p>
+        </w:tc>
+        <w:tc>
+          <w:tcPr>
+            <w:tcW w:type="dxa" w:w="2880"/>
+          </w:tcPr>
+          <w:p>
+            <w:pPr>
+              <w:spacing w:line="240" w:lineRule="auto"/>
+            </w:pPr>
+            <w:r>
+              <w:rPr>
+                <w:rFonts w:ascii="Times New Roman" w:hAnsi="Times New Roman" w:eastAsia="Times New Roman"/>
+                <w:b/>
+                <w:caps w:val="0"/>
+                <w:sz w:val="22"/>
+              </w:rPr>
+              <w:t>Recall te minor</w:t>
+            </w:r>
+          </w:p>
+        </w:tc>
+      </w:tr>
+      <w:tr>
+        <w:tc>
+          <w:tcPr>
+            <w:tcW w:type="dxa" w:w="2880"/>
+          </w:tcPr>
+          <w:p>
+            <w:pPr>
+              <w:spacing w:line="240" w:lineRule="auto"/>
+            </w:pPr>
+            <w:r>
+              <w:rPr>
+                <w:rFonts w:ascii="Times New Roman" w:hAnsi="Times New Roman" w:eastAsia="Times New Roman"/>
+                <w:b w:val="0"/>
+                <w:caps w:val="0"/>
+                <w:sz w:val="22"/>
+              </w:rPr>
+              <w:t>Blob</w:t>
+            </w:r>
+          </w:p>
+        </w:tc>
+        <w:tc>
+          <w:tcPr>
+            <w:tcW w:type="dxa" w:w="2880"/>
+          </w:tcPr>
+          <w:p>
+            <w:pPr>
+              <w:spacing w:line="240" w:lineRule="auto"/>
+            </w:pPr>
+            <w:r>
+              <w:rPr>
+                <w:rFonts w:ascii="Times New Roman" w:hAnsi="Times New Roman" w:eastAsia="Times New Roman"/>
+                <w:b w:val="0"/>
+                <w:caps w:val="0"/>
+                <w:sz w:val="22"/>
+              </w:rPr>
+              <w:t>1/20 (5.0%)</w:t>
+            </w:r>
+          </w:p>
+        </w:tc>
+        <w:tc>
+          <w:tcPr>
+            <w:tcW w:type="dxa" w:w="2880"/>
+          </w:tcPr>
+          <w:p>
+            <w:pPr>
+              <w:spacing w:line="240" w:lineRule="auto"/>
+            </w:pPr>
+            <w:r>
+              <w:rPr>
+                <w:rFonts w:ascii="Times New Roman" w:hAnsi="Times New Roman" w:eastAsia="Times New Roman"/>
+                <w:b w:val="0"/>
+                <w:caps w:val="0"/>
+                <w:sz w:val="22"/>
+              </w:rPr>
+              <w:t>34/330 (10.3%)</w:t>
+            </w:r>
+          </w:p>
+        </w:tc>
+      </w:tr>
+      <w:tr>
+        <w:tc>
+          <w:tcPr>
+            <w:tcW w:type="dxa" w:w="2880"/>
+          </w:tcPr>
+          <w:p>
+            <w:pPr>
+              <w:spacing w:line="240" w:lineRule="auto"/>
+            </w:pPr>
+            <w:r>
+              <w:rPr>
+                <w:rFonts w:ascii="Times New Roman" w:hAnsi="Times New Roman" w:eastAsia="Times New Roman"/>
+                <w:b w:val="0"/>
+                <w:caps w:val="0"/>
+                <w:sz w:val="22"/>
+              </w:rPr>
+              <w:t>Blob (+ madhësi)</w:t>
+            </w:r>
+          </w:p>
+        </w:tc>
+        <w:tc>
+          <w:tcPr>
+            <w:tcW w:type="dxa" w:w="2880"/>
+          </w:tcPr>
+          <w:p>
+            <w:pPr>
+              <w:spacing w:line="240" w:lineRule="auto"/>
+            </w:pPr>
+            <w:r>
+              <w:rPr>
+                <w:rFonts w:ascii="Times New Roman" w:hAnsi="Times New Roman" w:eastAsia="Times New Roman"/>
+                <w:b w:val="0"/>
+                <w:caps w:val="0"/>
+                <w:sz w:val="22"/>
+              </w:rPr>
+              <w:t>12/20 (60.0%)</w:t>
+            </w:r>
+          </w:p>
+        </w:tc>
+        <w:tc>
+          <w:tcPr>
+            <w:tcW w:type="dxa" w:w="2880"/>
+          </w:tcPr>
+          <w:p>
+            <w:pPr>
+              <w:spacing w:line="240" w:lineRule="auto"/>
+            </w:pPr>
+            <w:r>
+              <w:rPr>
+                <w:rFonts w:ascii="Times New Roman" w:hAnsi="Times New Roman" w:eastAsia="Times New Roman"/>
+                <w:b w:val="0"/>
+                <w:caps w:val="0"/>
+                <w:sz w:val="22"/>
+              </w:rPr>
+              <w:t>78/330 (23.6%)</w:t>
+            </w:r>
+          </w:p>
+        </w:tc>
+      </w:tr>
+      <w:tr>
+        <w:tc>
+          <w:tcPr>
+            <w:tcW w:type="dxa" w:w="2880"/>
+          </w:tcPr>
+          <w:p>
+            <w:pPr>
+              <w:spacing w:line="240" w:lineRule="auto"/>
+            </w:pPr>
+            <w:r>
+              <w:rPr>
+                <w:rFonts w:ascii="Times New Roman" w:hAnsi="Times New Roman" w:eastAsia="Times New Roman"/>
+                <w:b w:val="0"/>
+                <w:caps w:val="0"/>
+                <w:sz w:val="22"/>
+              </w:rPr>
+              <w:t>Data Class</w:t>
+            </w:r>
+          </w:p>
+        </w:tc>
+        <w:tc>
+          <w:tcPr>
+            <w:tcW w:type="dxa" w:w="2880"/>
+          </w:tcPr>
+          <w:p>
+            <w:pPr>
+              <w:spacing w:line="240" w:lineRule="auto"/>
+            </w:pPr>
+            <w:r>
+              <w:rPr>
+                <w:rFonts w:ascii="Times New Roman" w:hAnsi="Times New Roman" w:eastAsia="Times New Roman"/>
+                <w:b w:val="0"/>
+                <w:caps w:val="0"/>
+                <w:sz w:val="22"/>
+              </w:rPr>
+              <w:t>6/16 (37.5%)</w:t>
+            </w:r>
+          </w:p>
+        </w:tc>
+        <w:tc>
+          <w:tcPr>
+            <w:tcW w:type="dxa" w:w="2880"/>
+          </w:tcPr>
+          <w:p>
+            <w:pPr>
+              <w:spacing w:line="240" w:lineRule="auto"/>
+            </w:pPr>
+            <w:r>
+              <w:rPr>
+                <w:rFonts w:ascii="Times New Roman" w:hAnsi="Times New Roman" w:eastAsia="Times New Roman"/>
+                <w:b w:val="0"/>
+                <w:caps w:val="0"/>
+                <w:sz w:val="22"/>
+              </w:rPr>
+              <w:t>22/169 (13.0%)</w:t>
+            </w:r>
+          </w:p>
+        </w:tc>
+      </w:tr>
+      <w:tr>
+        <w:tc>
+          <w:tcPr>
+            <w:tcW w:type="dxa" w:w="2880"/>
+          </w:tcPr>
+          <w:p>
+            <w:pPr>
+              <w:spacing w:line="240" w:lineRule="auto"/>
+            </w:pPr>
+            <w:r>
+              <w:rPr>
+                <w:rFonts w:ascii="Times New Roman" w:hAnsi="Times New Roman" w:eastAsia="Times New Roman"/>
+                <w:b w:val="0"/>
+                <w:caps w:val="0"/>
+                <w:sz w:val="22"/>
+              </w:rPr>
+              <w:t>Feature Envy</w:t>
+            </w:r>
+          </w:p>
+        </w:tc>
+        <w:tc>
+          <w:tcPr>
+            <w:tcW w:type="dxa" w:w="2880"/>
+          </w:tcPr>
+          <w:p>
+            <w:pPr>
+              <w:spacing w:line="240" w:lineRule="auto"/>
+            </w:pPr>
+            <w:r>
+              <w:rPr>
+                <w:rFonts w:ascii="Times New Roman" w:hAnsi="Times New Roman" w:eastAsia="Times New Roman"/>
+                <w:b w:val="0"/>
+                <w:caps w:val="0"/>
+                <w:sz w:val="22"/>
+              </w:rPr>
+              <w:t>3/7 (42.9%)</w:t>
+            </w:r>
+          </w:p>
+        </w:tc>
+        <w:tc>
+          <w:tcPr>
+            <w:tcW w:type="dxa" w:w="2880"/>
+          </w:tcPr>
+          <w:p>
+            <w:pPr>
+              <w:spacing w:line="240" w:lineRule="auto"/>
+            </w:pPr>
+            <w:r>
+              <w:rPr>
+                <w:rFonts w:ascii="Times New Roman" w:hAnsi="Times New Roman" w:eastAsia="Times New Roman"/>
+                <w:b w:val="0"/>
+                <w:caps w:val="0"/>
+                <w:sz w:val="22"/>
+              </w:rPr>
+              <w:t>10/64 (15.6%)</w:t>
+            </w:r>
+          </w:p>
+        </w:tc>
+      </w:tr>
+      <w:tr>
+        <w:tc>
+          <w:tcPr>
+            <w:tcW w:type="dxa" w:w="2880"/>
+          </w:tcPr>
+          <w:p>
+            <w:pPr>
+              <w:spacing w:line="240" w:lineRule="auto"/>
+            </w:pPr>
+            <w:r>
+              <w:rPr>
+                <w:rFonts w:ascii="Times New Roman" w:hAnsi="Times New Roman" w:eastAsia="Times New Roman"/>
+                <w:b w:val="0"/>
+                <w:caps w:val="0"/>
+                <w:sz w:val="22"/>
+              </w:rPr>
+              <w:t>Long Method</w:t>
+            </w:r>
+          </w:p>
+        </w:tc>
+        <w:tc>
+          <w:tcPr>
+            <w:tcW w:type="dxa" w:w="2880"/>
+          </w:tcPr>
+          <w:p>
+            <w:pPr>
+              <w:spacing w:line="240" w:lineRule="auto"/>
+            </w:pPr>
+            <w:r>
+              <w:rPr>
+                <w:rFonts w:ascii="Times New Roman" w:hAnsi="Times New Roman" w:eastAsia="Times New Roman"/>
+                <w:b w:val="0"/>
+                <w:caps w:val="0"/>
+                <w:sz w:val="22"/>
+              </w:rPr>
+              <w:t>23/24 (95.8%)</w:t>
+            </w:r>
+          </w:p>
+        </w:tc>
+        <w:tc>
+          <w:tcPr>
+            <w:tcW w:type="dxa" w:w="2880"/>
+          </w:tcPr>
+          <w:p>
+            <w:pPr>
+              <w:spacing w:line="240" w:lineRule="auto"/>
+            </w:pPr>
+            <w:r>
+              <w:rPr>
+                <w:rFonts w:ascii="Times New Roman" w:hAnsi="Times New Roman" w:eastAsia="Times New Roman"/>
+                <w:b w:val="0"/>
+                <w:caps w:val="0"/>
+                <w:sz w:val="22"/>
+              </w:rPr>
+              <w:t>72/192 (37.5%)</w:t>
+            </w:r>
+          </w:p>
+        </w:tc>
+      </w:tr>
+    </w:tbl>
+    <w:p>
+      <w:pPr>
+        <w:spacing w:line="240" w:lineRule="auto" w:after="0"/>
+      </w:pPr>
+    </w:p>
+    <w:p>
+      <w:pPr>
+        <w:jc w:val="center"/>
+      </w:pPr>
+      <w:r>
+        <w:drawing>
+          <wp:inline xmlns:a="http://schemas.openxmlformats.org/drawingml/2006/main" xmlns:pic="http://schemas.openxmlformats.org/drawingml/2006/picture">
+            <wp:extent cx="5120640" cy="2718364"/>
+            <wp:docPr id="2" name="Picture 2"/>
+            <wp:cNvGraphicFramePr>
+              <a:graphicFrameLocks noChangeAspect="1"/>
+            </wp:cNvGraphicFramePr>
+            <a:graphic>
+              <a:graphicData uri="http://schemas.openxmlformats.org/drawingml/2006/picture">
+                <pic:pic>
+                  <pic:nvPicPr>
+                    <pic:cNvPr id="0" name="figura_2_recall_sipas_ashpersise.png"/>
+                    <pic:cNvPicPr/>
+                  </pic:nvPicPr>
+                  <pic:blipFill>
+                    <a:blip r:embed="rId13"/>
+                    <a:stretch>
+                      <a:fillRect/>
+                    </a:stretch>
+                  </pic:blipFill>
+                  <pic:spPr>
+                    <a:xfrm>
+                      <a:off x="0" y="0"/>
+                      <a:ext cx="5120640" cy="2718364"/>
+                    </a:xfrm>
+                    <a:prstGeom prst="rect"/>
+                  </pic:spPr>
+                </pic:pic>
+              </a:graphicData>
+            </a:graphic>
+          </wp:inline>
+        </w:drawing>
+      </w:r>
+    </w:p>
+    <w:p>
+      <w:pPr>
+        <w:spacing w:line="240" w:lineRule="auto"/>
+        <w:jc w:val="center"/>
+      </w:pPr>
+      <w:r>
+        <w:rPr>
+          <w:rFonts w:ascii="Times New Roman" w:hAnsi="Times New Roman" w:eastAsia="Times New Roman"/>
+          <w:b w:val="0"/>
+          <w:caps w:val="0"/>
+          <w:sz w:val="22"/>
+        </w:rPr>
+        <w:t>Figura 2. Recall-i sipas ashpërsisë së caktuar nga rishikuesit</w:t>
+      </w:r>
+    </w:p>
+    <w:p>
+      <w:pPr>
+        <w:spacing w:line="360" w:lineRule="auto"/>
+        <w:ind w:firstLine="360"/>
+        <w:jc w:val="both"/>
+      </w:pPr>
+      <w:r>
+        <w:rPr>
+          <w:rFonts w:ascii="Times New Roman" w:hAnsi="Times New Roman" w:eastAsia="Times New Roman"/>
+          <w:b w:val="0"/>
+          <w:caps w:val="0"/>
+          <w:sz w:val="24"/>
+        </w:rPr>
+        <w:t>Detektorët degradojnë me hijeshi: i kapin rastet e rënda dukshëm më mirë se ato të lehtat. Kjo është shifra që një F1 i vetëm e fsheh.</w:t>
+      </w:r>
+    </w:p>
+    <w:p>
+      <w:pPr>
+        <w:pStyle w:val="Heading2"/>
+      </w:pPr>
+      <w:r>
+        <w:rPr>
+          <w:rFonts w:ascii="Times New Roman" w:hAnsi="Times New Roman" w:eastAsia="Times New Roman"/>
+          <w:b/>
+          <w:caps w:val="0"/>
+          <w:sz w:val="24"/>
+        </w:rPr>
+        <w:t>5.2 Qasja B: detektimi me mësim makine</w:t>
+      </w:r>
+    </w:p>
+    <w:p>
+      <w:pPr>
+        <w:spacing w:line="360" w:lineRule="auto"/>
+        <w:ind w:firstLine="360"/>
+        <w:jc w:val="both"/>
+      </w:pPr>
+      <w:r>
+        <w:rPr>
+          <w:rFonts w:ascii="Times New Roman" w:hAnsi="Times New Roman" w:eastAsia="Times New Roman"/>
+          <w:b w:val="0"/>
+          <w:caps w:val="0"/>
+          <w:sz w:val="24"/>
+        </w:rPr>
+        <w:t>Për secilën erë raportohet modeli me MCC-në më të lartë. Klasifikuesi i shumicës nuk ndez asnjëherë për asnjë erë, ndaj çdo shifër më poshtë është mësim i vërtetë dhe jo çekuilibër i shfrytëzuar.</w:t>
+      </w:r>
+    </w:p>
+    <w:p>
+      <w:pPr>
+        <w:spacing w:line="240" w:lineRule="auto"/>
+        <w:jc w:val="center"/>
+      </w:pPr>
+      <w:r>
+        <w:rPr>
+          <w:rFonts w:ascii="Times New Roman" w:hAnsi="Times New Roman" w:eastAsia="Times New Roman"/>
+          <w:b w:val="0"/>
+          <w:caps w:val="0"/>
+          <w:sz w:val="22"/>
+        </w:rPr>
+        <w:t>Tabela 3. Modeli më i mirë për çdo erë</w:t>
+      </w:r>
+    </w:p>
+    <w:tbl>
+      <w:tblPr>
+        <w:tblStyle w:val="TableGrid"/>
+        <w:tblW w:type="auto" w:w="0"/>
+        <w:tblLook w:firstColumn="1" w:firstRow="1" w:lastColumn="0" w:lastRow="0" w:noHBand="0" w:noVBand="1" w:val="04A0"/>
+      </w:tblPr>
+      <w:tblGrid>
+        <w:gridCol w:w="1440"/>
+        <w:gridCol w:w="1440"/>
+        <w:gridCol w:w="1440"/>
+        <w:gridCol w:w="1440"/>
+        <w:gridCol w:w="1440"/>
+        <w:gridCol w:w="1440"/>
+      </w:tblGrid>
+      <w:tr>
+        <w:tc>
+          <w:tcPr>
+            <w:tcW w:type="dxa" w:w="1440"/>
+          </w:tcPr>
+          <w:p>
+            <w:pPr>
+              <w:spacing w:line="240" w:lineRule="auto"/>
+            </w:pPr>
+            <w:r>
+              <w:rPr>
+                <w:rFonts w:ascii="Times New Roman" w:hAnsi="Times New Roman" w:eastAsia="Times New Roman"/>
+                <w:b/>
+                <w:caps w:val="0"/>
+                <w:sz w:val="22"/>
+              </w:rPr>
+              <w:t>Erë</w:t>
+            </w:r>
+          </w:p>
+        </w:tc>
+        <w:tc>
+          <w:tcPr>
+            <w:tcW w:type="dxa" w:w="1440"/>
+          </w:tcPr>
+          <w:p>
+            <w:pPr>
+              <w:spacing w:line="240" w:lineRule="auto"/>
+            </w:pPr>
+            <w:r>
+              <w:rPr>
+                <w:rFonts w:ascii="Times New Roman" w:hAnsi="Times New Roman" w:eastAsia="Times New Roman"/>
+                <w:b/>
+                <w:caps w:val="0"/>
+                <w:sz w:val="22"/>
+              </w:rPr>
+              <w:t>Modeli</w:t>
+            </w:r>
+          </w:p>
+        </w:tc>
+        <w:tc>
+          <w:tcPr>
+            <w:tcW w:type="dxa" w:w="1440"/>
+          </w:tcPr>
+          <w:p>
+            <w:pPr>
+              <w:spacing w:line="240" w:lineRule="auto"/>
+            </w:pPr>
+            <w:r>
+              <w:rPr>
+                <w:rFonts w:ascii="Times New Roman" w:hAnsi="Times New Roman" w:eastAsia="Times New Roman"/>
+                <w:b/>
+                <w:caps w:val="0"/>
+                <w:sz w:val="22"/>
+              </w:rPr>
+              <w:t>P</w:t>
+            </w:r>
+          </w:p>
+        </w:tc>
+        <w:tc>
+          <w:tcPr>
+            <w:tcW w:type="dxa" w:w="1440"/>
+          </w:tcPr>
+          <w:p>
+            <w:pPr>
+              <w:spacing w:line="240" w:lineRule="auto"/>
+            </w:pPr>
+            <w:r>
+              <w:rPr>
+                <w:rFonts w:ascii="Times New Roman" w:hAnsi="Times New Roman" w:eastAsia="Times New Roman"/>
+                <w:b/>
+                <w:caps w:val="0"/>
+                <w:sz w:val="22"/>
+              </w:rPr>
+              <w:t>R</w:t>
+            </w:r>
+          </w:p>
+        </w:tc>
+        <w:tc>
+          <w:tcPr>
+            <w:tcW w:type="dxa" w:w="1440"/>
+          </w:tcPr>
+          <w:p>
+            <w:pPr>
+              <w:spacing w:line="240" w:lineRule="auto"/>
+            </w:pPr>
+            <w:r>
+              <w:rPr>
+                <w:rFonts w:ascii="Times New Roman" w:hAnsi="Times New Roman" w:eastAsia="Times New Roman"/>
+                <w:b/>
+                <w:caps w:val="0"/>
+                <w:sz w:val="22"/>
+              </w:rPr>
+              <w:t>F1</w:t>
+            </w:r>
+          </w:p>
+        </w:tc>
+        <w:tc>
+          <w:tcPr>
+            <w:tcW w:type="dxa" w:w="1440"/>
+          </w:tcPr>
+          <w:p>
+            <w:pPr>
+              <w:spacing w:line="240" w:lineRule="auto"/>
+            </w:pPr>
+            <w:r>
+              <w:rPr>
+                <w:rFonts w:ascii="Times New Roman" w:hAnsi="Times New Roman" w:eastAsia="Times New Roman"/>
+                <w:b/>
+                <w:caps w:val="0"/>
+                <w:sz w:val="22"/>
+              </w:rPr>
+              <w:t>MCC</w:t>
+            </w:r>
+          </w:p>
+        </w:tc>
+      </w:tr>
+      <w:tr>
+        <w:tc>
+          <w:tcPr>
+            <w:tcW w:type="dxa" w:w="1440"/>
+          </w:tcPr>
+          <w:p>
+            <w:pPr>
+              <w:spacing w:line="240" w:lineRule="auto"/>
+            </w:pPr>
+            <w:r>
+              <w:rPr>
+                <w:rFonts w:ascii="Times New Roman" w:hAnsi="Times New Roman" w:eastAsia="Times New Roman"/>
+                <w:b w:val="0"/>
+                <w:caps w:val="0"/>
+                <w:sz w:val="22"/>
+              </w:rPr>
+              <w:t>Blob</w:t>
+            </w:r>
+          </w:p>
+        </w:tc>
+        <w:tc>
+          <w:tcPr>
+            <w:tcW w:type="dxa" w:w="1440"/>
+          </w:tcPr>
+          <w:p>
+            <w:pPr>
+              <w:spacing w:line="240" w:lineRule="auto"/>
+            </w:pPr>
+            <w:r>
+              <w:rPr>
+                <w:rFonts w:ascii="Times New Roman" w:hAnsi="Times New Roman" w:eastAsia="Times New Roman"/>
+                <w:b w:val="0"/>
+                <w:caps w:val="0"/>
+                <w:sz w:val="22"/>
+              </w:rPr>
+              <w:t>gradient boosting</w:t>
+            </w:r>
+          </w:p>
+        </w:tc>
+        <w:tc>
+          <w:tcPr>
+            <w:tcW w:type="dxa" w:w="1440"/>
+          </w:tcPr>
+          <w:p>
+            <w:pPr>
+              <w:spacing w:line="240" w:lineRule="auto"/>
+            </w:pPr>
+            <w:r>
+              <w:rPr>
+                <w:rFonts w:ascii="Times New Roman" w:hAnsi="Times New Roman" w:eastAsia="Times New Roman"/>
+                <w:b w:val="0"/>
+                <w:caps w:val="0"/>
+                <w:sz w:val="22"/>
+              </w:rPr>
+              <w:t>0.603</w:t>
+            </w:r>
+          </w:p>
+        </w:tc>
+        <w:tc>
+          <w:tcPr>
+            <w:tcW w:type="dxa" w:w="1440"/>
+          </w:tcPr>
+          <w:p>
+            <w:pPr>
+              <w:spacing w:line="240" w:lineRule="auto"/>
+            </w:pPr>
+            <w:r>
+              <w:rPr>
+                <w:rFonts w:ascii="Times New Roman" w:hAnsi="Times New Roman" w:eastAsia="Times New Roman"/>
+                <w:b w:val="0"/>
+                <w:caps w:val="0"/>
+                <w:sz w:val="22"/>
+              </w:rPr>
+              <w:t>0.634</w:t>
+            </w:r>
+          </w:p>
+        </w:tc>
+        <w:tc>
+          <w:tcPr>
+            <w:tcW w:type="dxa" w:w="1440"/>
+          </w:tcPr>
+          <w:p>
+            <w:pPr>
+              <w:spacing w:line="240" w:lineRule="auto"/>
+            </w:pPr>
+            <w:r>
+              <w:rPr>
+                <w:rFonts w:ascii="Times New Roman" w:hAnsi="Times New Roman" w:eastAsia="Times New Roman"/>
+                <w:b w:val="0"/>
+                <w:caps w:val="0"/>
+                <w:sz w:val="22"/>
+              </w:rPr>
+              <w:t>0.618</w:t>
+            </w:r>
+          </w:p>
+        </w:tc>
+        <w:tc>
+          <w:tcPr>
+            <w:tcW w:type="dxa" w:w="1440"/>
+          </w:tcPr>
+          <w:p>
+            <w:pPr>
+              <w:spacing w:line="240" w:lineRule="auto"/>
+            </w:pPr>
+            <w:r>
+              <w:rPr>
+                <w:rFonts w:ascii="Times New Roman" w:hAnsi="Times New Roman" w:eastAsia="Times New Roman"/>
+                <w:b w:val="0"/>
+                <w:caps w:val="0"/>
+                <w:sz w:val="22"/>
+              </w:rPr>
+              <w:t>0.488</w:t>
+            </w:r>
+          </w:p>
+        </w:tc>
+      </w:tr>
+      <w:tr>
+        <w:tc>
+          <w:tcPr>
+            <w:tcW w:type="dxa" w:w="1440"/>
+          </w:tcPr>
+          <w:p>
+            <w:pPr>
+              <w:spacing w:line="240" w:lineRule="auto"/>
+            </w:pPr>
+            <w:r>
+              <w:rPr>
+                <w:rFonts w:ascii="Times New Roman" w:hAnsi="Times New Roman" w:eastAsia="Times New Roman"/>
+                <w:b w:val="0"/>
+                <w:caps w:val="0"/>
+                <w:sz w:val="22"/>
+              </w:rPr>
+              <w:t>Data Class</w:t>
+            </w:r>
+          </w:p>
+        </w:tc>
+        <w:tc>
+          <w:tcPr>
+            <w:tcW w:type="dxa" w:w="1440"/>
+          </w:tcPr>
+          <w:p>
+            <w:pPr>
+              <w:spacing w:line="240" w:lineRule="auto"/>
+            </w:pPr>
+            <w:r>
+              <w:rPr>
+                <w:rFonts w:ascii="Times New Roman" w:hAnsi="Times New Roman" w:eastAsia="Times New Roman"/>
+                <w:b w:val="0"/>
+                <w:caps w:val="0"/>
+                <w:sz w:val="22"/>
+              </w:rPr>
+              <w:t>gradient boosting</w:t>
+            </w:r>
+          </w:p>
+        </w:tc>
+        <w:tc>
+          <w:tcPr>
+            <w:tcW w:type="dxa" w:w="1440"/>
+          </w:tcPr>
+          <w:p>
+            <w:pPr>
+              <w:spacing w:line="240" w:lineRule="auto"/>
+            </w:pPr>
+            <w:r>
+              <w:rPr>
+                <w:rFonts w:ascii="Times New Roman" w:hAnsi="Times New Roman" w:eastAsia="Times New Roman"/>
+                <w:b w:val="0"/>
+                <w:caps w:val="0"/>
+                <w:sz w:val="22"/>
+              </w:rPr>
+              <w:t>0.629</w:t>
+            </w:r>
+          </w:p>
+        </w:tc>
+        <w:tc>
+          <w:tcPr>
+            <w:tcW w:type="dxa" w:w="1440"/>
+          </w:tcPr>
+          <w:p>
+            <w:pPr>
+              <w:spacing w:line="240" w:lineRule="auto"/>
+            </w:pPr>
+            <w:r>
+              <w:rPr>
+                <w:rFonts w:ascii="Times New Roman" w:hAnsi="Times New Roman" w:eastAsia="Times New Roman"/>
+                <w:b w:val="0"/>
+                <w:caps w:val="0"/>
+                <w:sz w:val="22"/>
+              </w:rPr>
+              <w:t>0.591</w:t>
+            </w:r>
+          </w:p>
+        </w:tc>
+        <w:tc>
+          <w:tcPr>
+            <w:tcW w:type="dxa" w:w="1440"/>
+          </w:tcPr>
+          <w:p>
+            <w:pPr>
+              <w:spacing w:line="240" w:lineRule="auto"/>
+            </w:pPr>
+            <w:r>
+              <w:rPr>
+                <w:rFonts w:ascii="Times New Roman" w:hAnsi="Times New Roman" w:eastAsia="Times New Roman"/>
+                <w:b w:val="0"/>
+                <w:caps w:val="0"/>
+                <w:sz w:val="22"/>
+              </w:rPr>
+              <w:t>0.609</w:t>
+            </w:r>
+          </w:p>
+        </w:tc>
+        <w:tc>
+          <w:tcPr>
+            <w:tcW w:type="dxa" w:w="1440"/>
+          </w:tcPr>
+          <w:p>
+            <w:pPr>
+              <w:spacing w:line="240" w:lineRule="auto"/>
+            </w:pPr>
+            <w:r>
+              <w:rPr>
+                <w:rFonts w:ascii="Times New Roman" w:hAnsi="Times New Roman" w:eastAsia="Times New Roman"/>
+                <w:b w:val="0"/>
+                <w:caps w:val="0"/>
+                <w:sz w:val="22"/>
+              </w:rPr>
+              <w:t>0.500</w:t>
+            </w:r>
+          </w:p>
+        </w:tc>
+      </w:tr>
+      <w:tr>
+        <w:tc>
+          <w:tcPr>
+            <w:tcW w:type="dxa" w:w="1440"/>
+          </w:tcPr>
+          <w:p>
+            <w:pPr>
+              <w:spacing w:line="240" w:lineRule="auto"/>
+            </w:pPr>
+            <w:r>
+              <w:rPr>
+                <w:rFonts w:ascii="Times New Roman" w:hAnsi="Times New Roman" w:eastAsia="Times New Roman"/>
+                <w:b w:val="0"/>
+                <w:caps w:val="0"/>
+                <w:sz w:val="22"/>
+              </w:rPr>
+              <w:t>Feature Envy</w:t>
+            </w:r>
+          </w:p>
+        </w:tc>
+        <w:tc>
+          <w:tcPr>
+            <w:tcW w:type="dxa" w:w="1440"/>
+          </w:tcPr>
+          <w:p>
+            <w:pPr>
+              <w:spacing w:line="240" w:lineRule="auto"/>
+            </w:pPr>
+            <w:r>
+              <w:rPr>
+                <w:rFonts w:ascii="Times New Roman" w:hAnsi="Times New Roman" w:eastAsia="Times New Roman"/>
+                <w:b w:val="0"/>
+                <w:caps w:val="0"/>
+                <w:sz w:val="22"/>
+              </w:rPr>
+              <w:t>gradient boosting</w:t>
+            </w:r>
+          </w:p>
+        </w:tc>
+        <w:tc>
+          <w:tcPr>
+            <w:tcW w:type="dxa" w:w="1440"/>
+          </w:tcPr>
+          <w:p>
+            <w:pPr>
+              <w:spacing w:line="240" w:lineRule="auto"/>
+            </w:pPr>
+            <w:r>
+              <w:rPr>
+                <w:rFonts w:ascii="Times New Roman" w:hAnsi="Times New Roman" w:eastAsia="Times New Roman"/>
+                <w:b w:val="0"/>
+                <w:caps w:val="0"/>
+                <w:sz w:val="22"/>
+              </w:rPr>
+              <w:t>0.727</w:t>
+            </w:r>
+          </w:p>
+        </w:tc>
+        <w:tc>
+          <w:tcPr>
+            <w:tcW w:type="dxa" w:w="1440"/>
+          </w:tcPr>
+          <w:p>
+            <w:pPr>
+              <w:spacing w:line="240" w:lineRule="auto"/>
+            </w:pPr>
+            <w:r>
+              <w:rPr>
+                <w:rFonts w:ascii="Times New Roman" w:hAnsi="Times New Roman" w:eastAsia="Times New Roman"/>
+                <w:b w:val="0"/>
+                <w:caps w:val="0"/>
+                <w:sz w:val="22"/>
+              </w:rPr>
+              <w:t>0.667</w:t>
+            </w:r>
+          </w:p>
+        </w:tc>
+        <w:tc>
+          <w:tcPr>
+            <w:tcW w:type="dxa" w:w="1440"/>
+          </w:tcPr>
+          <w:p>
+            <w:pPr>
+              <w:spacing w:line="240" w:lineRule="auto"/>
+            </w:pPr>
+            <w:r>
+              <w:rPr>
+                <w:rFonts w:ascii="Times New Roman" w:hAnsi="Times New Roman" w:eastAsia="Times New Roman"/>
+                <w:b w:val="0"/>
+                <w:caps w:val="0"/>
+                <w:sz w:val="22"/>
+              </w:rPr>
+              <w:t>0.696</w:t>
+            </w:r>
+          </w:p>
+        </w:tc>
+        <w:tc>
+          <w:tcPr>
+            <w:tcW w:type="dxa" w:w="1440"/>
+          </w:tcPr>
+          <w:p>
+            <w:pPr>
+              <w:spacing w:line="240" w:lineRule="auto"/>
+            </w:pPr>
+            <w:r>
+              <w:rPr>
+                <w:rFonts w:ascii="Times New Roman" w:hAnsi="Times New Roman" w:eastAsia="Times New Roman"/>
+                <w:b w:val="0"/>
+                <w:caps w:val="0"/>
+                <w:sz w:val="22"/>
+              </w:rPr>
+              <w:t>0.669</w:t>
+            </w:r>
+          </w:p>
+        </w:tc>
+      </w:tr>
+      <w:tr>
+        <w:tc>
+          <w:tcPr>
+            <w:tcW w:type="dxa" w:w="1440"/>
+          </w:tcPr>
+          <w:p>
+            <w:pPr>
+              <w:spacing w:line="240" w:lineRule="auto"/>
+            </w:pPr>
+            <w:r>
+              <w:rPr>
+                <w:rFonts w:ascii="Times New Roman" w:hAnsi="Times New Roman" w:eastAsia="Times New Roman"/>
+                <w:b w:val="0"/>
+                <w:caps w:val="0"/>
+                <w:sz w:val="22"/>
+              </w:rPr>
+              <w:t>Long Method</w:t>
+            </w:r>
+          </w:p>
+        </w:tc>
+        <w:tc>
+          <w:tcPr>
+            <w:tcW w:type="dxa" w:w="1440"/>
+          </w:tcPr>
+          <w:p>
+            <w:pPr>
+              <w:spacing w:line="240" w:lineRule="auto"/>
+            </w:pPr>
+            <w:r>
+              <w:rPr>
+                <w:rFonts w:ascii="Times New Roman" w:hAnsi="Times New Roman" w:eastAsia="Times New Roman"/>
+                <w:b w:val="0"/>
+                <w:caps w:val="0"/>
+                <w:sz w:val="22"/>
+              </w:rPr>
+              <w:t>random forest</w:t>
+            </w:r>
+          </w:p>
+        </w:tc>
+        <w:tc>
+          <w:tcPr>
+            <w:tcW w:type="dxa" w:w="1440"/>
+          </w:tcPr>
+          <w:p>
+            <w:pPr>
+              <w:spacing w:line="240" w:lineRule="auto"/>
+            </w:pPr>
+            <w:r>
+              <w:rPr>
+                <w:rFonts w:ascii="Times New Roman" w:hAnsi="Times New Roman" w:eastAsia="Times New Roman"/>
+                <w:b w:val="0"/>
+                <w:caps w:val="0"/>
+                <w:sz w:val="22"/>
+              </w:rPr>
+              <w:t>0.732</w:t>
+            </w:r>
+          </w:p>
+        </w:tc>
+        <w:tc>
+          <w:tcPr>
+            <w:tcW w:type="dxa" w:w="1440"/>
+          </w:tcPr>
+          <w:p>
+            <w:pPr>
+              <w:spacing w:line="240" w:lineRule="auto"/>
+            </w:pPr>
+            <w:r>
+              <w:rPr>
+                <w:rFonts w:ascii="Times New Roman" w:hAnsi="Times New Roman" w:eastAsia="Times New Roman"/>
+                <w:b w:val="0"/>
+                <w:caps w:val="0"/>
+                <w:sz w:val="22"/>
+              </w:rPr>
+              <w:t>0.782</w:t>
+            </w:r>
+          </w:p>
+        </w:tc>
+        <w:tc>
+          <w:tcPr>
+            <w:tcW w:type="dxa" w:w="1440"/>
+          </w:tcPr>
+          <w:p>
+            <w:pPr>
+              <w:spacing w:line="240" w:lineRule="auto"/>
+            </w:pPr>
+            <w:r>
+              <w:rPr>
+                <w:rFonts w:ascii="Times New Roman" w:hAnsi="Times New Roman" w:eastAsia="Times New Roman"/>
+                <w:b w:val="0"/>
+                <w:caps w:val="0"/>
+                <w:sz w:val="22"/>
+              </w:rPr>
+              <w:t>0.756</w:t>
+            </w:r>
+          </w:p>
+        </w:tc>
+        <w:tc>
+          <w:tcPr>
+            <w:tcW w:type="dxa" w:w="1440"/>
+          </w:tcPr>
+          <w:p>
+            <w:pPr>
+              <w:spacing w:line="240" w:lineRule="auto"/>
+            </w:pPr>
+            <w:r>
+              <w:rPr>
+                <w:rFonts w:ascii="Times New Roman" w:hAnsi="Times New Roman" w:eastAsia="Times New Roman"/>
+                <w:b w:val="0"/>
+                <w:caps w:val="0"/>
+                <w:sz w:val="22"/>
+              </w:rPr>
+              <w:t>0.713</w:t>
+            </w:r>
+          </w:p>
+        </w:tc>
+      </w:tr>
+    </w:tbl>
+    <w:p>
+      <w:pPr>
+        <w:spacing w:line="240" w:lineRule="auto" w:after="0"/>
+      </w:pPr>
+    </w:p>
+    <w:p>
+      <w:pPr>
+        <w:spacing w:line="360" w:lineRule="auto"/>
+        <w:ind w:firstLine="360"/>
+        <w:jc w:val="both"/>
+      </w:pPr>
+      <w:r>
+        <w:rPr>
+          <w:rFonts w:ascii="Times New Roman" w:hAnsi="Times New Roman" w:eastAsia="Times New Roman"/>
+          <w:b w:val="0"/>
+          <w:caps w:val="0"/>
+          <w:sz w:val="24"/>
+        </w:rPr>
+        <w:t>MCC-ja më e lartë e arritur është 0.713. Të gjitha vlerat vijnë nga parashikime jashtë fold-it mbi një ndarje të grupuar sipas depos, pra përshkruajnë atë që pritet mbi një projekt që modeli nuk e ka parë kurrë.</w:t>
+      </w:r>
+    </w:p>
+    <w:p>
+      <w:pPr>
+        <w:jc w:val="center"/>
+      </w:pPr>
+      <w:r>
+        <w:drawing>
+          <wp:inline xmlns:a="http://schemas.openxmlformats.org/drawingml/2006/main" xmlns:pic="http://schemas.openxmlformats.org/drawingml/2006/picture">
+            <wp:extent cx="5120640" cy="2369251"/>
+            <wp:docPr id="3" name="Picture 3"/>
+            <wp:cNvGraphicFramePr>
+              <a:graphicFrameLocks noChangeAspect="1"/>
+            </wp:cNvGraphicFramePr>
+            <a:graphic>
+              <a:graphicData uri="http://schemas.openxmlformats.org/drawingml/2006/picture">
+                <pic:pic>
+                  <pic:nvPicPr>
+                    <pic:cNvPr id="0" name="figura_4_rendesia_e_vecorive.png"/>
+                    <pic:cNvPicPr/>
+                  </pic:nvPicPr>
+                  <pic:blipFill>
+                    <a:blip r:embed="rId14"/>
+                    <a:stretch>
+                      <a:fillRect/>
+                    </a:stretch>
+                  </pic:blipFill>
+                  <pic:spPr>
+                    <a:xfrm>
+                      <a:off x="0" y="0"/>
+                      <a:ext cx="5120640" cy="2369251"/>
+                    </a:xfrm>
+                    <a:prstGeom prst="rect"/>
+                  </pic:spPr>
+                </pic:pic>
+              </a:graphicData>
+            </a:graphic>
+          </wp:inline>
+        </w:drawing>
+      </w:r>
+    </w:p>
+    <w:p>
+      <w:pPr>
+        <w:spacing w:line="240" w:lineRule="auto"/>
+        <w:jc w:val="center"/>
+      </w:pPr>
+      <w:r>
+        <w:rPr>
+          <w:rFonts w:ascii="Times New Roman" w:hAnsi="Times New Roman" w:eastAsia="Times New Roman"/>
+          <w:b w:val="0"/>
+          <w:caps w:val="0"/>
+          <w:sz w:val="22"/>
+        </w:rPr>
+        <w:t>Figura 4. Veçoritë me rëndësi më të lartë, të matura me permutation importance</w:t>
+      </w:r>
+    </w:p>
+    <w:p>
+      <w:pPr>
+        <w:pStyle w:val="Heading2"/>
+      </w:pPr>
+      <w:r>
+        <w:rPr>
+          <w:rFonts w:ascii="Times New Roman" w:hAnsi="Times New Roman" w:eastAsia="Times New Roman"/>
+          <w:b/>
+          <w:caps w:val="0"/>
+          <w:sz w:val="24"/>
+        </w:rPr>
+        <w:t>5.3 Krahasimi i dy qasjeve</w:t>
+      </w:r>
+    </w:p>
+    <w:p>
+      <w:pPr>
+        <w:jc w:val="center"/>
+      </w:pPr>
+      <w:r>
+        <w:drawing>
+          <wp:inline xmlns:a="http://schemas.openxmlformats.org/drawingml/2006/main" xmlns:pic="http://schemas.openxmlformats.org/drawingml/2006/picture">
+            <wp:extent cx="5120640" cy="2900601"/>
+            <wp:docPr id="4" name="Picture 4"/>
+            <wp:cNvGraphicFramePr>
+              <a:graphicFrameLocks noChangeAspect="1"/>
+            </wp:cNvGraphicFramePr>
+            <a:graphic>
+              <a:graphicData uri="http://schemas.openxmlformats.org/drawingml/2006/picture">
+                <pic:pic>
+                  <pic:nvPicPr>
+                    <pic:cNvPr id="0" name="figura_1_mcc_a_vs_b.png"/>
+                    <pic:cNvPicPr/>
+                  </pic:nvPicPr>
+                  <pic:blipFill>
+                    <a:blip r:embed="rId15"/>
+                    <a:stretch>
+                      <a:fillRect/>
+                    </a:stretch>
+                  </pic:blipFill>
+                  <pic:spPr>
+                    <a:xfrm>
+                      <a:off x="0" y="0"/>
+                      <a:ext cx="5120640" cy="2900601"/>
+                    </a:xfrm>
+                    <a:prstGeom prst="rect"/>
+                  </pic:spPr>
+                </pic:pic>
+              </a:graphicData>
+            </a:graphic>
+          </wp:inline>
+        </w:drawing>
+      </w:r>
+    </w:p>
+    <w:p>
+      <w:pPr>
+        <w:spacing w:line="240" w:lineRule="auto"/>
+        <w:jc w:val="center"/>
+      </w:pPr>
+      <w:r>
+        <w:rPr>
+          <w:rFonts w:ascii="Times New Roman" w:hAnsi="Times New Roman" w:eastAsia="Times New Roman"/>
+          <w:b w:val="0"/>
+          <w:caps w:val="0"/>
+          <w:sz w:val="22"/>
+        </w:rPr>
+        <w:t>Figura 1. MCC për të dyja qasjet</w:t>
+      </w:r>
+    </w:p>
+    <w:p>
+      <w:pPr>
+        <w:spacing w:line="360" w:lineRule="auto"/>
+        <w:ind w:firstLine="360"/>
+        <w:jc w:val="both"/>
+      </w:pPr>
+      <w:r>
+        <w:rPr>
+          <w:rFonts w:ascii="Times New Roman" w:hAnsi="Times New Roman" w:eastAsia="Times New Roman"/>
+          <w:b w:val="0"/>
+          <w:caps w:val="0"/>
+          <w:sz w:val="24"/>
+        </w:rPr>
+        <w:t>Qasja B e tejkalon Qasjen A në çdo erë. Por përmbledhja nuk e tregon se çka kap secila vetëm, ndaj raportohen edhe të katër qelizat bashkë me kappa-n e Cohen-it.</w:t>
+      </w:r>
+    </w:p>
+    <w:p>
+      <w:pPr>
+        <w:spacing w:line="240" w:lineRule="auto"/>
+        <w:jc w:val="center"/>
+      </w:pPr>
+      <w:r>
+        <w:rPr>
+          <w:rFonts w:ascii="Times New Roman" w:hAnsi="Times New Roman" w:eastAsia="Times New Roman"/>
+          <w:b w:val="0"/>
+          <w:caps w:val="0"/>
+          <w:sz w:val="22"/>
+        </w:rPr>
+        <w:t>Tabela 4. Pajtimi mes dy qasjeve</w:t>
+      </w:r>
+    </w:p>
+    <w:tbl>
+      <w:tblPr>
+        <w:tblStyle w:val="TableGrid"/>
+        <w:tblW w:type="auto" w:w="0"/>
+        <w:tblLook w:firstColumn="1" w:firstRow="1" w:lastColumn="0" w:lastRow="0" w:noHBand="0" w:noVBand="1" w:val="04A0"/>
+      </w:tblPr>
+      <w:tblGrid>
+        <w:gridCol w:w="1440"/>
+        <w:gridCol w:w="1440"/>
+        <w:gridCol w:w="1440"/>
+        <w:gridCol w:w="1440"/>
+        <w:gridCol w:w="1440"/>
+        <w:gridCol w:w="1440"/>
+      </w:tblGrid>
+      <w:tr>
+        <w:tc>
+          <w:tcPr>
+            <w:tcW w:type="dxa" w:w="1440"/>
+          </w:tcPr>
+          <w:p>
+            <w:pPr>
+              <w:spacing w:line="240" w:lineRule="auto"/>
+            </w:pPr>
+            <w:r>
+              <w:rPr>
+                <w:rFonts w:ascii="Times New Roman" w:hAnsi="Times New Roman" w:eastAsia="Times New Roman"/>
+                <w:b/>
+                <w:caps w:val="0"/>
+                <w:sz w:val="22"/>
+              </w:rPr>
+              <w:t>Erë</w:t>
+            </w:r>
+          </w:p>
+        </w:tc>
+        <w:tc>
+          <w:tcPr>
+            <w:tcW w:type="dxa" w:w="1440"/>
+          </w:tcPr>
+          <w:p>
+            <w:pPr>
+              <w:spacing w:line="240" w:lineRule="auto"/>
+            </w:pPr>
+            <w:r>
+              <w:rPr>
+                <w:rFonts w:ascii="Times New Roman" w:hAnsi="Times New Roman" w:eastAsia="Times New Roman"/>
+                <w:b/>
+                <w:caps w:val="0"/>
+                <w:sz w:val="22"/>
+              </w:rPr>
+              <w:t>κ</w:t>
+            </w:r>
+          </w:p>
+        </w:tc>
+        <w:tc>
+          <w:tcPr>
+            <w:tcW w:type="dxa" w:w="1440"/>
+          </w:tcPr>
+          <w:p>
+            <w:pPr>
+              <w:spacing w:line="240" w:lineRule="auto"/>
+            </w:pPr>
+            <w:r>
+              <w:rPr>
+                <w:rFonts w:ascii="Times New Roman" w:hAnsi="Times New Roman" w:eastAsia="Times New Roman"/>
+                <w:b/>
+                <w:caps w:val="0"/>
+                <w:sz w:val="22"/>
+              </w:rPr>
+              <w:t>Të dyja</w:t>
+            </w:r>
+          </w:p>
+        </w:tc>
+        <w:tc>
+          <w:tcPr>
+            <w:tcW w:type="dxa" w:w="1440"/>
+          </w:tcPr>
+          <w:p>
+            <w:pPr>
+              <w:spacing w:line="240" w:lineRule="auto"/>
+            </w:pPr>
+            <w:r>
+              <w:rPr>
+                <w:rFonts w:ascii="Times New Roman" w:hAnsi="Times New Roman" w:eastAsia="Times New Roman"/>
+                <w:b/>
+                <w:caps w:val="0"/>
+                <w:sz w:val="22"/>
+              </w:rPr>
+              <w:t>Vetëm A</w:t>
+            </w:r>
+          </w:p>
+        </w:tc>
+        <w:tc>
+          <w:tcPr>
+            <w:tcW w:type="dxa" w:w="1440"/>
+          </w:tcPr>
+          <w:p>
+            <w:pPr>
+              <w:spacing w:line="240" w:lineRule="auto"/>
+            </w:pPr>
+            <w:r>
+              <w:rPr>
+                <w:rFonts w:ascii="Times New Roman" w:hAnsi="Times New Roman" w:eastAsia="Times New Roman"/>
+                <w:b/>
+                <w:caps w:val="0"/>
+                <w:sz w:val="22"/>
+              </w:rPr>
+              <w:t>Vetëm B</w:t>
+            </w:r>
+          </w:p>
+        </w:tc>
+        <w:tc>
+          <w:tcPr>
+            <w:tcW w:type="dxa" w:w="1440"/>
+          </w:tcPr>
+          <w:p>
+            <w:pPr>
+              <w:spacing w:line="240" w:lineRule="auto"/>
+            </w:pPr>
+            <w:r>
+              <w:rPr>
+                <w:rFonts w:ascii="Times New Roman" w:hAnsi="Times New Roman" w:eastAsia="Times New Roman"/>
+                <w:b/>
+                <w:caps w:val="0"/>
+                <w:sz w:val="22"/>
+              </w:rPr>
+              <w:t>n</w:t>
+            </w:r>
+          </w:p>
+        </w:tc>
+      </w:tr>
+      <w:tr>
+        <w:tc>
+          <w:tcPr>
+            <w:tcW w:type="dxa" w:w="1440"/>
+          </w:tcPr>
+          <w:p>
+            <w:pPr>
+              <w:spacing w:line="240" w:lineRule="auto"/>
+            </w:pPr>
+            <w:r>
+              <w:rPr>
+                <w:rFonts w:ascii="Times New Roman" w:hAnsi="Times New Roman" w:eastAsia="Times New Roman"/>
+                <w:b w:val="0"/>
+                <w:caps w:val="0"/>
+                <w:sz w:val="22"/>
+              </w:rPr>
+              <w:t>Blob</w:t>
+            </w:r>
+          </w:p>
+        </w:tc>
+        <w:tc>
+          <w:tcPr>
+            <w:tcW w:type="dxa" w:w="1440"/>
+          </w:tcPr>
+          <w:p>
+            <w:pPr>
+              <w:spacing w:line="240" w:lineRule="auto"/>
+            </w:pPr>
+            <w:r>
+              <w:rPr>
+                <w:rFonts w:ascii="Times New Roman" w:hAnsi="Times New Roman" w:eastAsia="Times New Roman"/>
+                <w:b w:val="0"/>
+                <w:caps w:val="0"/>
+                <w:sz w:val="22"/>
+              </w:rPr>
+              <w:t>0.143</w:t>
+            </w:r>
+          </w:p>
+        </w:tc>
+        <w:tc>
+          <w:tcPr>
+            <w:tcW w:type="dxa" w:w="1440"/>
+          </w:tcPr>
+          <w:p>
+            <w:pPr>
+              <w:spacing w:line="240" w:lineRule="auto"/>
+            </w:pPr>
+            <w:r>
+              <w:rPr>
+                <w:rFonts w:ascii="Times New Roman" w:hAnsi="Times New Roman" w:eastAsia="Times New Roman"/>
+                <w:b w:val="0"/>
+                <w:caps w:val="0"/>
+                <w:sz w:val="22"/>
+              </w:rPr>
+              <w:t>39</w:t>
+            </w:r>
+          </w:p>
+        </w:tc>
+        <w:tc>
+          <w:tcPr>
+            <w:tcW w:type="dxa" w:w="1440"/>
+          </w:tcPr>
+          <w:p>
+            <w:pPr>
+              <w:spacing w:line="240" w:lineRule="auto"/>
+            </w:pPr>
+            <w:r>
+              <w:rPr>
+                <w:rFonts w:ascii="Times New Roman" w:hAnsi="Times New Roman" w:eastAsia="Times New Roman"/>
+                <w:b w:val="0"/>
+                <w:caps w:val="0"/>
+                <w:sz w:val="22"/>
+              </w:rPr>
+              <w:t>4</w:t>
+            </w:r>
+          </w:p>
+        </w:tc>
+        <w:tc>
+          <w:tcPr>
+            <w:tcW w:type="dxa" w:w="1440"/>
+          </w:tcPr>
+          <w:p>
+            <w:pPr>
+              <w:spacing w:line="240" w:lineRule="auto"/>
+            </w:pPr>
+            <w:r>
+              <w:rPr>
+                <w:rFonts w:ascii="Times New Roman" w:hAnsi="Times New Roman" w:eastAsia="Times New Roman"/>
+                <w:b w:val="0"/>
+                <w:caps w:val="0"/>
+                <w:sz w:val="22"/>
+              </w:rPr>
+              <w:t>329</w:t>
+            </w:r>
+          </w:p>
+        </w:tc>
+        <w:tc>
+          <w:tcPr>
+            <w:tcW w:type="dxa" w:w="1440"/>
+          </w:tcPr>
+          <w:p>
+            <w:pPr>
+              <w:spacing w:line="240" w:lineRule="auto"/>
+            </w:pPr>
+            <w:r>
+              <w:rPr>
+                <w:rFonts w:ascii="Times New Roman" w:hAnsi="Times New Roman" w:eastAsia="Times New Roman"/>
+                <w:b w:val="0"/>
+                <w:caps w:val="0"/>
+                <w:sz w:val="22"/>
+              </w:rPr>
+              <w:t>1407</w:t>
+            </w:r>
+          </w:p>
+        </w:tc>
+      </w:tr>
+      <w:tr>
+        <w:tc>
+          <w:tcPr>
+            <w:tcW w:type="dxa" w:w="1440"/>
+          </w:tcPr>
+          <w:p>
+            <w:pPr>
+              <w:spacing w:line="240" w:lineRule="auto"/>
+            </w:pPr>
+            <w:r>
+              <w:rPr>
+                <w:rFonts w:ascii="Times New Roman" w:hAnsi="Times New Roman" w:eastAsia="Times New Roman"/>
+                <w:b w:val="0"/>
+                <w:caps w:val="0"/>
+                <w:sz w:val="22"/>
+              </w:rPr>
+              <w:t>Data Class</w:t>
+            </w:r>
+          </w:p>
+        </w:tc>
+        <w:tc>
+          <w:tcPr>
+            <w:tcW w:type="dxa" w:w="1440"/>
+          </w:tcPr>
+          <w:p>
+            <w:pPr>
+              <w:spacing w:line="240" w:lineRule="auto"/>
+            </w:pPr>
+            <w:r>
+              <w:rPr>
+                <w:rFonts w:ascii="Times New Roman" w:hAnsi="Times New Roman" w:eastAsia="Times New Roman"/>
+                <w:b w:val="0"/>
+                <w:caps w:val="0"/>
+                <w:sz w:val="22"/>
+              </w:rPr>
+              <w:t>0.225</w:t>
+            </w:r>
+          </w:p>
+        </w:tc>
+        <w:tc>
+          <w:tcPr>
+            <w:tcW w:type="dxa" w:w="1440"/>
+          </w:tcPr>
+          <w:p>
+            <w:pPr>
+              <w:spacing w:line="240" w:lineRule="auto"/>
+            </w:pPr>
+            <w:r>
+              <w:rPr>
+                <w:rFonts w:ascii="Times New Roman" w:hAnsi="Times New Roman" w:eastAsia="Times New Roman"/>
+                <w:b w:val="0"/>
+                <w:caps w:val="0"/>
+                <w:sz w:val="22"/>
+              </w:rPr>
+              <w:t>30</w:t>
+            </w:r>
+          </w:p>
+        </w:tc>
+        <w:tc>
+          <w:tcPr>
+            <w:tcW w:type="dxa" w:w="1440"/>
+          </w:tcPr>
+          <w:p>
+            <w:pPr>
+              <w:spacing w:line="240" w:lineRule="auto"/>
+            </w:pPr>
+            <w:r>
+              <w:rPr>
+                <w:rFonts w:ascii="Times New Roman" w:hAnsi="Times New Roman" w:eastAsia="Times New Roman"/>
+                <w:b w:val="0"/>
+                <w:caps w:val="0"/>
+                <w:sz w:val="22"/>
+              </w:rPr>
+              <w:t>7</w:t>
+            </w:r>
+          </w:p>
+        </w:tc>
+        <w:tc>
+          <w:tcPr>
+            <w:tcW w:type="dxa" w:w="1440"/>
+          </w:tcPr>
+          <w:p>
+            <w:pPr>
+              <w:spacing w:line="240" w:lineRule="auto"/>
+            </w:pPr>
+            <w:r>
+              <w:rPr>
+                <w:rFonts w:ascii="Times New Roman" w:hAnsi="Times New Roman" w:eastAsia="Times New Roman"/>
+                <w:b w:val="0"/>
+                <w:caps w:val="0"/>
+                <w:sz w:val="22"/>
+              </w:rPr>
+              <w:t>145</w:t>
+            </w:r>
+          </w:p>
+        </w:tc>
+        <w:tc>
+          <w:tcPr>
+            <w:tcW w:type="dxa" w:w="1440"/>
+          </w:tcPr>
+          <w:p>
+            <w:pPr>
+              <w:spacing w:line="240" w:lineRule="auto"/>
+            </w:pPr>
+            <w:r>
+              <w:rPr>
+                <w:rFonts w:ascii="Times New Roman" w:hAnsi="Times New Roman" w:eastAsia="Times New Roman"/>
+                <w:b w:val="0"/>
+                <w:caps w:val="0"/>
+                <w:sz w:val="22"/>
+              </w:rPr>
+              <w:t>821</w:t>
+            </w:r>
+          </w:p>
+        </w:tc>
+      </w:tr>
+      <w:tr>
+        <w:tc>
+          <w:tcPr>
+            <w:tcW w:type="dxa" w:w="1440"/>
+          </w:tcPr>
+          <w:p>
+            <w:pPr>
+              <w:spacing w:line="240" w:lineRule="auto"/>
+            </w:pPr>
+            <w:r>
+              <w:rPr>
+                <w:rFonts w:ascii="Times New Roman" w:hAnsi="Times New Roman" w:eastAsia="Times New Roman"/>
+                <w:b w:val="0"/>
+                <w:caps w:val="0"/>
+                <w:sz w:val="22"/>
+              </w:rPr>
+              <w:t>Feature Envy</w:t>
+            </w:r>
+          </w:p>
+        </w:tc>
+        <w:tc>
+          <w:tcPr>
+            <w:tcW w:type="dxa" w:w="1440"/>
+          </w:tcPr>
+          <w:p>
+            <w:pPr>
+              <w:spacing w:line="240" w:lineRule="auto"/>
+            </w:pPr>
+            <w:r>
+              <w:rPr>
+                <w:rFonts w:ascii="Times New Roman" w:hAnsi="Times New Roman" w:eastAsia="Times New Roman"/>
+                <w:b w:val="0"/>
+                <w:caps w:val="0"/>
+                <w:sz w:val="22"/>
+              </w:rPr>
+              <w:t>0.230</w:t>
+            </w:r>
+          </w:p>
+        </w:tc>
+        <w:tc>
+          <w:tcPr>
+            <w:tcW w:type="dxa" w:w="1440"/>
+          </w:tcPr>
+          <w:p>
+            <w:pPr>
+              <w:spacing w:line="240" w:lineRule="auto"/>
+            </w:pPr>
+            <w:r>
+              <w:rPr>
+                <w:rFonts w:ascii="Times New Roman" w:hAnsi="Times New Roman" w:eastAsia="Times New Roman"/>
+                <w:b w:val="0"/>
+                <w:caps w:val="0"/>
+                <w:sz w:val="22"/>
+              </w:rPr>
+              <w:t>12</w:t>
+            </w:r>
+          </w:p>
+        </w:tc>
+        <w:tc>
+          <w:tcPr>
+            <w:tcW w:type="dxa" w:w="1440"/>
+          </w:tcPr>
+          <w:p>
+            <w:pPr>
+              <w:spacing w:line="240" w:lineRule="auto"/>
+            </w:pPr>
+            <w:r>
+              <w:rPr>
+                <w:rFonts w:ascii="Times New Roman" w:hAnsi="Times New Roman" w:eastAsia="Times New Roman"/>
+                <w:b w:val="0"/>
+                <w:caps w:val="0"/>
+                <w:sz w:val="22"/>
+              </w:rPr>
+              <w:t>13</w:t>
+            </w:r>
+          </w:p>
+        </w:tc>
+        <w:tc>
+          <w:tcPr>
+            <w:tcW w:type="dxa" w:w="1440"/>
+          </w:tcPr>
+          <w:p>
+            <w:pPr>
+              <w:spacing w:line="240" w:lineRule="auto"/>
+            </w:pPr>
+            <w:r>
+              <w:rPr>
+                <w:rFonts w:ascii="Times New Roman" w:hAnsi="Times New Roman" w:eastAsia="Times New Roman"/>
+                <w:b w:val="0"/>
+                <w:caps w:val="0"/>
+                <w:sz w:val="22"/>
+              </w:rPr>
+              <w:t>54</w:t>
+            </w:r>
+          </w:p>
+        </w:tc>
+        <w:tc>
+          <w:tcPr>
+            <w:tcW w:type="dxa" w:w="1440"/>
+          </w:tcPr>
+          <w:p>
+            <w:pPr>
+              <w:spacing w:line="240" w:lineRule="auto"/>
+            </w:pPr>
+            <w:r>
+              <w:rPr>
+                <w:rFonts w:ascii="Times New Roman" w:hAnsi="Times New Roman" w:eastAsia="Times New Roman"/>
+                <w:b w:val="0"/>
+                <w:caps w:val="0"/>
+                <w:sz w:val="22"/>
+              </w:rPr>
+              <w:t>823</w:t>
+            </w:r>
+          </w:p>
+        </w:tc>
+      </w:tr>
+      <w:tr>
+        <w:tc>
+          <w:tcPr>
+            <w:tcW w:type="dxa" w:w="1440"/>
+          </w:tcPr>
+          <w:p>
+            <w:pPr>
+              <w:spacing w:line="240" w:lineRule="auto"/>
+            </w:pPr>
+            <w:r>
+              <w:rPr>
+                <w:rFonts w:ascii="Times New Roman" w:hAnsi="Times New Roman" w:eastAsia="Times New Roman"/>
+                <w:b w:val="0"/>
+                <w:caps w:val="0"/>
+                <w:sz w:val="22"/>
+              </w:rPr>
+              <w:t>Long Method</w:t>
+            </w:r>
+          </w:p>
+        </w:tc>
+        <w:tc>
+          <w:tcPr>
+            <w:tcW w:type="dxa" w:w="1440"/>
+          </w:tcPr>
+          <w:p>
+            <w:pPr>
+              <w:spacing w:line="240" w:lineRule="auto"/>
+            </w:pPr>
+            <w:r>
+              <w:rPr>
+                <w:rFonts w:ascii="Times New Roman" w:hAnsi="Times New Roman" w:eastAsia="Times New Roman"/>
+                <w:b w:val="0"/>
+                <w:caps w:val="0"/>
+                <w:sz w:val="22"/>
+              </w:rPr>
+              <w:t>0.575</w:t>
+            </w:r>
+          </w:p>
+        </w:tc>
+        <w:tc>
+          <w:tcPr>
+            <w:tcW w:type="dxa" w:w="1440"/>
+          </w:tcPr>
+          <w:p>
+            <w:pPr>
+              <w:spacing w:line="240" w:lineRule="auto"/>
+            </w:pPr>
+            <w:r>
+              <w:rPr>
+                <w:rFonts w:ascii="Times New Roman" w:hAnsi="Times New Roman" w:eastAsia="Times New Roman"/>
+                <w:b w:val="0"/>
+                <w:caps w:val="0"/>
+                <w:sz w:val="22"/>
+              </w:rPr>
+              <w:t>105</w:t>
+            </w:r>
+          </w:p>
+        </w:tc>
+        <w:tc>
+          <w:tcPr>
+            <w:tcW w:type="dxa" w:w="1440"/>
+          </w:tcPr>
+          <w:p>
+            <w:pPr>
+              <w:spacing w:line="240" w:lineRule="auto"/>
+            </w:pPr>
+            <w:r>
+              <w:rPr>
+                <w:rFonts w:ascii="Times New Roman" w:hAnsi="Times New Roman" w:eastAsia="Times New Roman"/>
+                <w:b w:val="0"/>
+                <w:caps w:val="0"/>
+                <w:sz w:val="22"/>
+              </w:rPr>
+              <w:t>4</w:t>
+            </w:r>
+          </w:p>
+        </w:tc>
+        <w:tc>
+          <w:tcPr>
+            <w:tcW w:type="dxa" w:w="1440"/>
+          </w:tcPr>
+          <w:p>
+            <w:pPr>
+              <w:spacing w:line="240" w:lineRule="auto"/>
+            </w:pPr>
+            <w:r>
+              <w:rPr>
+                <w:rFonts w:ascii="Times New Roman" w:hAnsi="Times New Roman" w:eastAsia="Times New Roman"/>
+                <w:b w:val="0"/>
+                <w:caps w:val="0"/>
+                <w:sz w:val="22"/>
+              </w:rPr>
+              <w:t>126</w:t>
+            </w:r>
+          </w:p>
+        </w:tc>
+        <w:tc>
+          <w:tcPr>
+            <w:tcW w:type="dxa" w:w="1440"/>
+          </w:tcPr>
+          <w:p>
+            <w:pPr>
+              <w:spacing w:line="240" w:lineRule="auto"/>
+            </w:pPr>
+            <w:r>
+              <w:rPr>
+                <w:rFonts w:ascii="Times New Roman" w:hAnsi="Times New Roman" w:eastAsia="Times New Roman"/>
+                <w:b w:val="0"/>
+                <w:caps w:val="0"/>
+                <w:sz w:val="22"/>
+              </w:rPr>
+              <w:t>1483</w:t>
+            </w:r>
+          </w:p>
+        </w:tc>
+      </w:tr>
+    </w:tbl>
+    <w:p>
+      <w:pPr>
+        <w:spacing w:line="240" w:lineRule="auto" w:after="0"/>
+      </w:pPr>
+    </w:p>
+    <w:p>
+      <w:pPr>
+        <w:jc w:val="center"/>
+      </w:pPr>
+      <w:r>
+        <w:drawing>
+          <wp:inline xmlns:a="http://schemas.openxmlformats.org/drawingml/2006/main" xmlns:pic="http://schemas.openxmlformats.org/drawingml/2006/picture">
+            <wp:extent cx="5120640" cy="2837552"/>
+            <wp:docPr id="5" name="Picture 5"/>
+            <wp:cNvGraphicFramePr>
+              <a:graphicFrameLocks noChangeAspect="1"/>
+            </wp:cNvGraphicFramePr>
+            <a:graphic>
+              <a:graphicData uri="http://schemas.openxmlformats.org/drawingml/2006/picture">
+                <pic:pic>
+                  <pic:nvPicPr>
+                    <pic:cNvPr id="0" name="figura_3_pajtimi_a_b.png"/>
+                    <pic:cNvPicPr/>
+                  </pic:nvPicPr>
+                  <pic:blipFill>
+                    <a:blip r:embed="rId16"/>
+                    <a:stretch>
+                      <a:fillRect/>
+                    </a:stretch>
+                  </pic:blipFill>
+                  <pic:spPr>
+                    <a:xfrm>
+                      <a:off x="0" y="0"/>
+                      <a:ext cx="5120640" cy="2837552"/>
+                    </a:xfrm>
+                    <a:prstGeom prst="rect"/>
+                  </pic:spPr>
+                </pic:pic>
+              </a:graphicData>
+            </a:graphic>
+          </wp:inline>
+        </w:drawing>
+      </w:r>
+    </w:p>
+    <w:p>
+      <w:pPr>
+        <w:spacing w:line="240" w:lineRule="auto"/>
+        <w:jc w:val="center"/>
+      </w:pPr>
+      <w:r>
+        <w:rPr>
+          <w:rFonts w:ascii="Times New Roman" w:hAnsi="Times New Roman" w:eastAsia="Times New Roman"/>
+          <w:b w:val="0"/>
+          <w:caps w:val="0"/>
+          <w:sz w:val="22"/>
+        </w:rPr>
+        <w:t>Figura 3. Mostrat e shënuara nga secila qasje</w:t>
+      </w:r>
+    </w:p>
+    <w:p>
+      <w:pPr>
+        <w:spacing w:line="360" w:lineRule="auto"/>
+        <w:ind w:firstLine="360"/>
+        <w:jc w:val="both"/>
+      </w:pPr>
+      <w:r>
+        <w:rPr>
+          <w:rFonts w:ascii="Times New Roman" w:hAnsi="Times New Roman" w:eastAsia="Times New Roman"/>
+          <w:b w:val="0"/>
+          <w:caps w:val="0"/>
+          <w:sz w:val="24"/>
+        </w:rPr>
+        <w:t>Kolona «vetëm B» tejkalon «vetëm A» në çdo erë, shpesh me një rend madhësie: modeli pothuajse e përfshin rregullin. Përjashtimi është Feature Envy, ku rregulli kap një numër të krahasueshëm rastesh që modeli i humb.</w:t>
+      </w:r>
+    </w:p>
+    <w:p>
+      <w:pPr>
+        <w:pStyle w:val="Heading2"/>
+      </w:pPr>
+      <w:r>
+        <w:rPr>
+          <w:rFonts w:ascii="Times New Roman" w:hAnsi="Times New Roman" w:eastAsia="Times New Roman"/>
+          <w:b/>
+          <w:caps w:val="0"/>
+          <w:sz w:val="24"/>
+        </w:rPr>
+        <w:t>5.4 Qasja C: refaktorimi</w:t>
+      </w:r>
+    </w:p>
+    <w:p>
+      <w:pPr>
+        <w:spacing w:line="360" w:lineRule="auto"/>
+        <w:ind w:firstLine="360"/>
+        <w:jc w:val="both"/>
+      </w:pPr>
+      <w:r>
+        <w:rPr>
+          <w:rFonts w:ascii="Times New Roman" w:hAnsi="Times New Roman" w:eastAsia="Times New Roman"/>
+          <w:b w:val="0"/>
+          <w:caps w:val="0"/>
+          <w:sz w:val="24"/>
+        </w:rPr>
+        <w:t>Rezultatet e motorit të refaktorimit raportohen si numri i vendeve të detektuara, sa prej tyre u transformuan, dhe shpërndarja e arsyeve të refuzimit. Refuzimi është rezultat i saktë dhe numërohet si i tillë.</w:t>
+      </w:r>
+    </w:p>
+    <w:p>
+      <w:pPr>
+        <w:spacing w:line="360" w:lineRule="auto"/>
+        <w:ind w:firstLine="360"/>
+        <w:jc w:val="both"/>
+      </w:pPr>
+      <w:r>
+        <w:rPr>
+          <w:rFonts w:ascii="Times New Roman" w:hAnsi="Times New Roman" w:eastAsia="Times New Roman"/>
+          <w:b w:val="0"/>
+          <w:caps w:val="0"/>
+          <w:sz w:val="24"/>
+        </w:rPr>
+        <w:t>[PLOTËSO: tabela përfundimtare pritet nga ekzekutimi mbi korpusin e plotë; ekzekutimi i pjesshëm mbi 150 skedarë dha 477 vende të detektuara dhe 127 të transformuara, me refuzimet e ndara në formë kodi (218), rrjedhë kontrolli që del nga blloku (112) dhe më shumë se një vlerë dalëse (20).]</w:t>
+      </w:r>
+    </w:p>
+    <w:p>
+      <w:pPr>
+        <w:spacing w:line="360" w:lineRule="auto"/>
+        <w:ind w:firstLine="360"/>
+        <w:jc w:val="both"/>
+      </w:pPr>
+      <w:r>
+        <w:rPr>
+          <w:rFonts w:ascii="Times New Roman" w:hAnsi="Times New Roman" w:eastAsia="Times New Roman"/>
+          <w:b w:val="0"/>
+          <w:caps w:val="0"/>
+          <w:sz w:val="24"/>
+        </w:rPr>
+        <w:t>Verifikimi tregoi vlerën e vet menjëherë: ekzekutimi i parë shënoi njëmbëdhjetë rishkrime si prishëse, prej të cilave dhjetë ishin defekte të vërteta në motor. Ato u rregulluan dhe u mbuluan me teste regresioni; asnjëri prej tyre nuk ishte kapur nga testet e shkruara me dorë.</w:t>
       </w:r>
     </w:p>
     <w:p>
@@ -1893,6 +5770,20 @@
     </w:p>
     <w:p>
       <w:pPr>
+        <w:pStyle w:val="Heading2"/>
+      </w:pPr>
+      <w:r>
+        <w:rPr>
+          <w:rFonts w:ascii="Times New Roman" w:hAnsi="Times New Roman" w:eastAsia="Times New Roman"/>
+          <w:b/>
+          <w:caps w:val="0"/>
+          <w:sz w:val="24"/>
+        </w:rPr>
+        <w:t>6.1 Interpretimi i rezultateve</w:t>
+      </w:r>
+    </w:p>
+    <w:p>
+      <w:pPr>
         <w:spacing w:line="360" w:lineRule="auto"/>
         <w:ind w:firstLine="360"/>
         <w:jc w:val="both"/>
@@ -1904,7 +5795,335 @@
           <w:caps w:val="0"/>
           <w:sz w:val="24"/>
         </w:rPr>
-        <w:t>[PLOTËSO]</w:t>
+        <w:t>Gjetja më e qëndrueshme e këtij punimi është se strategjitë e publikuara të detektimit kanë precizion të lartë dhe recall të ulët. Kur ato ndezin, kanë kryesisht të drejtë; por i humbin shumicën e rasteve që rishikuesit i shënojnë. Për një mjet praktik kjo nuk është domosdoshmërisht e keqe: një sinjal i rrallë por i besueshëm konsumohet më lehtë se një listë e gjatë me alarme false.</w:t>
+      </w:r>
+    </w:p>
+    <w:p>
+      <w:pPr>
+        <w:spacing w:line="360" w:lineRule="auto"/>
+        <w:ind w:firstLine="360"/>
+        <w:jc w:val="both"/>
+      </w:pPr>
+      <w:r>
+        <w:rPr>
+          <w:rFonts w:ascii="Times New Roman" w:hAnsi="Times New Roman" w:eastAsia="Times New Roman"/>
+          <w:b w:val="0"/>
+          <w:caps w:val="0"/>
+          <w:sz w:val="24"/>
+        </w:rPr>
+        <w:t>Ndarja sipas ashpërsisë e ndryshon leximin. Detektorët degradojnë me hijeshi: i kapin rastet e rënda shumë më mirë se ato të lehtat. Një F1 i vetëm e fsheh krejt këtë, dhe pikërisht për këtë arsye recall-i raportohet i ndarë sipas etiketës që caktuan rishikuesit.</w:t>
+      </w:r>
+    </w:p>
+    <w:p>
+      <w:pPr>
+        <w:spacing w:line="360" w:lineRule="auto"/>
+        <w:ind w:firstLine="360"/>
+        <w:jc w:val="both"/>
+      </w:pPr>
+      <w:r>
+        <w:rPr>
+          <w:rFonts w:ascii="Times New Roman" w:hAnsi="Times New Roman" w:eastAsia="Times New Roman"/>
+          <w:b w:val="0"/>
+          <w:caps w:val="0"/>
+          <w:sz w:val="24"/>
+        </w:rPr>
+        <w:t>Modelet e mësimit të makinës e tejkalojnë qartë qasjen me rregulla në çdo erë. Por krahasimi qelizë për qelizë tregon se ato nuk e zëvendësojnë atë plotësisht: te Feature Envy rregulli kap raste që modeli i humb, dhe kjo është e vetmja erë ku bashkimi i dy qasjeve do të kishte kuptim praktik.</w:t>
+      </w:r>
+    </w:p>
+    <w:p>
+      <w:pPr>
+        <w:pStyle w:val="Heading2"/>
+      </w:pPr>
+      <w:r>
+        <w:rPr>
+          <w:rFonts w:ascii="Times New Roman" w:hAnsi="Times New Roman" w:eastAsia="Times New Roman"/>
+          <w:b/>
+          <w:caps w:val="0"/>
+          <w:sz w:val="24"/>
+        </w:rPr>
+        <w:t>6.2 Çfarë matin vërtet strategjitë</w:t>
+      </w:r>
+    </w:p>
+    <w:p>
+      <w:pPr>
+        <w:spacing w:line="360" w:lineRule="auto"/>
+        <w:ind w:firstLine="360"/>
+        <w:jc w:val="both"/>
+      </w:pPr>
+      <w:r>
+        <w:rPr>
+          <w:rFonts w:ascii="Times New Roman" w:hAnsi="Times New Roman" w:eastAsia="Times New Roman"/>
+          <w:b w:val="0"/>
+          <w:caps w:val="0"/>
+          <w:sz w:val="24"/>
+        </w:rPr>
+        <w:t>Dy gjetje të pavarura tregojnë në të njëjtin drejtim. E para: kur modeleve u lihet të zgjedhin vetë veçoritë, te Blob nuk zgjidhen TCC dhe WMC — pikërisht kushtet e kohezionit dhe të kompleksitetit mbi të cilat është ndërtuar God Class — por metrikat e madhësisë.</w:t>
+      </w:r>
+    </w:p>
+    <w:p>
+      <w:pPr>
+        <w:spacing w:line="360" w:lineRule="auto"/>
+        <w:ind w:firstLine="360"/>
+        <w:jc w:val="both"/>
+      </w:pPr>
+      <w:r>
+        <w:rPr>
+          <w:rFonts w:ascii="Times New Roman" w:hAnsi="Times New Roman" w:eastAsia="Times New Roman"/>
+          <w:b w:val="0"/>
+          <w:caps w:val="0"/>
+          <w:sz w:val="24"/>
+        </w:rPr>
+        <w:t>E dyta: shtimi i një detektori që mbështetet vetëm te madhësia e përmirëson ndjeshëm përputhjen me gjykimin e rishikuesve për të njëjtën erë.</w:t>
+      </w:r>
+    </w:p>
+    <w:p>
+      <w:pPr>
+        <w:spacing w:line="360" w:lineRule="auto"/>
+        <w:ind w:firstLine="360"/>
+        <w:jc w:val="both"/>
+      </w:pPr>
+      <w:r>
+        <w:rPr>
+          <w:rFonts w:ascii="Times New Roman" w:hAnsi="Times New Roman" w:eastAsia="Times New Roman"/>
+          <w:b w:val="0"/>
+          <w:caps w:val="0"/>
+          <w:sz w:val="24"/>
+        </w:rPr>
+        <w:t>Të dyja sugjerojnë se ajo që rishikuesit e MLCQ-së e quajnë «blob» shpjegohet më mirë me madhësi sesa me kushtin e kohezionit që strategjia e publikuar e vendos në qendër. Kjo nuk e zhvlerëson strategjinë, por tregon se ajo mat diçka pak më ndryshe nga ajo që emërton.</w:t>
+      </w:r>
+    </w:p>
+    <w:p>
+      <w:pPr>
+        <w:spacing w:line="360" w:lineRule="auto"/>
+        <w:ind w:firstLine="360"/>
+        <w:jc w:val="both"/>
+      </w:pPr>
+      <w:r>
+        <w:rPr>
+          <w:rFonts w:ascii="Times New Roman" w:hAnsi="Times New Roman" w:eastAsia="Times New Roman"/>
+          <w:b w:val="0"/>
+          <w:caps w:val="0"/>
+          <w:sz w:val="24"/>
+        </w:rPr>
+        <w:t>E njëjta vërejtje del edhe nga ana e refaktorimit. Encapsulate Field, i cili rekomandohet gjerësisht për Data Class, e përkeqëson matjen sipas vetë përkufizimit të strategjisë: ai shndërron një fushë publike në dy akses-metoda publike, dhe të dyja kushtet e strategjisë e numërojnë këtë si përkeqësim. Fowler-i e trajton atë transformim si hap përgatitor, jo si ilaç; një mjet që aplikon vetëm hapin e parë ecën në drejtim të gabuar.</w:t>
+      </w:r>
+    </w:p>
+    <w:p>
+      <w:pPr>
+        <w:pStyle w:val="Heading2"/>
+      </w:pPr>
+      <w:r>
+        <w:rPr>
+          <w:rFonts w:ascii="Times New Roman" w:hAnsi="Times New Roman" w:eastAsia="Times New Roman"/>
+          <w:b/>
+          <w:caps w:val="0"/>
+          <w:sz w:val="24"/>
+        </w:rPr>
+        <w:t>6.3 Kufizimet</w:t>
+      </w:r>
+    </w:p>
+    <w:p>
+      <w:pPr>
+        <w:spacing w:line="360" w:lineRule="auto"/>
+        <w:ind w:firstLine="360"/>
+        <w:jc w:val="both"/>
+      </w:pPr>
+      <w:r>
+        <w:rPr>
+          <w:rFonts w:ascii="Times New Roman" w:hAnsi="Times New Roman" w:eastAsia="Times New Roman"/>
+          <w:b w:val="0"/>
+          <w:caps w:val="0"/>
+          <w:sz w:val="24"/>
+        </w:rPr>
+        <w:t>Mbulimi i korpusit nuk është i plotë: disa depo të MLCQ-së janë fshirë ose zhvendosur, dhe mostrat e tyre nuk hyjnë në vlerësim. Numri raportohet si kufizim i studimit.</w:t>
+      </w:r>
+    </w:p>
+    <w:p>
+      <w:pPr>
+        <w:spacing w:line="360" w:lineRule="auto"/>
+        <w:ind w:firstLine="360"/>
+        <w:jc w:val="both"/>
+      </w:pPr>
+      <w:r>
+        <w:rPr>
+          <w:rFonts w:ascii="Times New Roman" w:hAnsi="Times New Roman" w:eastAsia="Times New Roman"/>
+          <w:b w:val="0"/>
+          <w:caps w:val="0"/>
+          <w:sz w:val="24"/>
+        </w:rPr>
+        <w:t>Mospajtimi mes rishikuesve është i konsiderueshëm. Për këtë arsye çdo strategji agregimi raportohet veç, dhe mostrat që një strategji nuk i etiketon dot hidhen në vend që të lexohen si negative.</w:t>
+      </w:r>
+    </w:p>
+    <w:p>
+      <w:pPr>
+        <w:spacing w:line="360" w:lineRule="auto"/>
+        <w:ind w:firstLine="360"/>
+        <w:jc w:val="both"/>
+      </w:pPr>
+      <w:r>
+        <w:rPr>
+          <w:rFonts w:ascii="Times New Roman" w:hAnsi="Times New Roman" w:eastAsia="Times New Roman"/>
+          <w:b w:val="0"/>
+          <w:caps w:val="0"/>
+          <w:sz w:val="24"/>
+        </w:rPr>
+        <w:t>Verifikimi i refaktorimeve është më i dobët se sa do të dëshirohej. Kompilimi i izoluar nuk është i mundur për shumicën e skedarëve, ndaj për ta pretendimi kufizohet te «nuk shton lloj të ri gabimi». Verifikimi me suitat e testeve të vetë projekteve mbetet punë e ardhshme.</w:t>
+      </w:r>
+    </w:p>
+    <w:p>
+      <w:pPr>
+        <w:spacing w:line="360" w:lineRule="auto"/>
+        <w:ind w:firstLine="360"/>
+        <w:jc w:val="both"/>
+      </w:pPr>
+      <w:r>
+        <w:rPr>
+          <w:rFonts w:ascii="Times New Roman" w:hAnsi="Times New Roman" w:eastAsia="Times New Roman"/>
+          <w:b w:val="0"/>
+          <w:caps w:val="0"/>
+          <w:sz w:val="24"/>
+        </w:rPr>
+        <w:t>Analizuesi nuk zgjidh simbole, ndaj tri nga pesë transformimet e planifikuara nuk automatizohen. Kjo nuk është mangësi implementimi por pasojë e drejtpërdrejtë e një zgjedhjeje arkitekturore të deklaruar.</w:t>
+      </w:r>
+    </w:p>
+    <w:p>
+      <w:pPr>
+        <w:pStyle w:val="Heading2"/>
+      </w:pPr>
+      <w:r>
+        <w:rPr>
+          <w:rFonts w:ascii="Times New Roman" w:hAnsi="Times New Roman" w:eastAsia="Times New Roman"/>
+          <w:b/>
+          <w:caps w:val="0"/>
+          <w:sz w:val="24"/>
+        </w:rPr>
+        <w:t>6.4 Puna e ardhshme</w:t>
+      </w:r>
+    </w:p>
+    <w:p>
+      <w:pPr>
+        <w:pStyle w:val="ListBullet"/>
+        <w:spacing w:line="360" w:lineRule="auto"/>
+        <w:jc w:val="both"/>
+      </w:pPr>
+      <w:r>
+        <w:rPr>
+          <w:rFonts w:ascii="Times New Roman" w:hAnsi="Times New Roman" w:eastAsia="Times New Roman"/>
+          <w:b w:val="0"/>
+          <w:caps w:val="0"/>
+          <w:sz w:val="24"/>
+        </w:rPr>
+        <w:t>Verifikim me suitat e testeve të projekteve të korpusit, që pretendimi të ngrihet nga «kompilon» në «ruan sjelljen».</w:t>
+      </w:r>
+    </w:p>
+    <w:p>
+      <w:pPr>
+        <w:pStyle w:val="ListBullet"/>
+        <w:spacing w:line="360" w:lineRule="auto"/>
+        <w:jc w:val="both"/>
+      </w:pPr>
+      <w:r>
+        <w:rPr>
+          <w:rFonts w:ascii="Times New Roman" w:hAnsi="Times New Roman" w:eastAsia="Times New Roman"/>
+          <w:b w:val="0"/>
+          <w:caps w:val="0"/>
+          <w:sz w:val="24"/>
+        </w:rPr>
+        <w:t>Një zgjidhës i kufizuar simbolesh brenda një projekti, i cili do t'i hapte rrugën Encapsulate Field-it dhe Move Method-it.</w:t>
+      </w:r>
+    </w:p>
+    <w:p>
+      <w:pPr>
+        <w:pStyle w:val="ListBullet"/>
+        <w:spacing w:line="360" w:lineRule="auto"/>
+        <w:jc w:val="both"/>
+      </w:pPr>
+      <w:r>
+        <w:rPr>
+          <w:rFonts w:ascii="Times New Roman" w:hAnsi="Times New Roman" w:eastAsia="Times New Roman"/>
+          <w:b w:val="0"/>
+          <w:caps w:val="0"/>
+          <w:sz w:val="24"/>
+        </w:rPr>
+        <w:t>Zgjerim i të vërtetës bazë përtej katër smells që mbulon MLCQ.</w:t>
+      </w:r>
+    </w:p>
+    <w:p>
+      <w:pPr>
+        <w:pStyle w:val="ListBullet"/>
+        <w:spacing w:line="360" w:lineRule="auto"/>
+        <w:jc w:val="both"/>
+      </w:pPr>
+      <w:r>
+        <w:rPr>
+          <w:rFonts w:ascii="Times New Roman" w:hAnsi="Times New Roman" w:eastAsia="Times New Roman"/>
+          <w:b w:val="0"/>
+          <w:caps w:val="0"/>
+          <w:sz w:val="24"/>
+        </w:rPr>
+        <w:t>Analizë e ndjeshmërisë mbi pragje, e cila tashmë është e mundur në sekonda falë tabelës së veçorive.</w:t>
+      </w:r>
+    </w:p>
+    <w:p>
+      <w:pPr>
+        <w:pStyle w:val="Heading2"/>
+      </w:pPr>
+      <w:r>
+        <w:rPr>
+          <w:rFonts w:ascii="Times New Roman" w:hAnsi="Times New Roman" w:eastAsia="Times New Roman"/>
+          <w:b/>
+          <w:caps w:val="0"/>
+          <w:sz w:val="24"/>
+        </w:rPr>
+        <w:t>6.5 Përfundim</w:t>
+      </w:r>
+    </w:p>
+    <w:p>
+      <w:pPr>
+        <w:spacing w:line="360" w:lineRule="auto"/>
+        <w:ind w:firstLine="360"/>
+        <w:jc w:val="both"/>
+      </w:pPr>
+      <w:r>
+        <w:rPr>
+          <w:rFonts w:ascii="Times New Roman" w:hAnsi="Times New Roman" w:eastAsia="Times New Roman"/>
+          <w:b w:val="0"/>
+          <w:caps w:val="0"/>
+          <w:sz w:val="24"/>
+        </w:rPr>
+        <w:t>Punimi ndërtoi një sistem që i zbulon code smells në dy mënyra të pavarura dhe i krahason mbi të njëjtën të vërtetë bazë me të njëjtin kod pikëzimi, si dhe një motor refaktorimi që rishkruan kod vetëm kur i provon parakushtet e veta.</w:t>
+      </w:r>
+    </w:p>
+    <w:p>
+      <w:pPr>
+        <w:spacing w:line="360" w:lineRule="auto"/>
+        <w:ind w:firstLine="360"/>
+        <w:jc w:val="both"/>
+      </w:pPr>
+      <w:r>
+        <w:rPr>
+          <w:rFonts w:ascii="Times New Roman" w:hAnsi="Times New Roman" w:eastAsia="Times New Roman"/>
+          <w:b w:val="0"/>
+          <w:caps w:val="0"/>
+          <w:sz w:val="24"/>
+        </w:rPr>
+        <w:t>Përgjigjet e shkurtra ndaj tri pyetjeve kërkimore janë: strategjitë e publikuara janë të sakta por të kursyera; një klasifikues mbi të njëjtat metrika është dukshëm më i mirë dhe i rizbulon pjesërisht metrikat e strategjive; dhe një pjesë e vogël por reale e rasteve të detektuara mund të transformohet automatikisht, ku shumica e refuzimeve vjen nga forma e kodit dhe nga rrjedha e kontrollit.</w:t>
+      </w:r>
+    </w:p>
+    <w:p>
+      <w:pPr>
+        <w:spacing w:line="360" w:lineRule="auto"/>
+        <w:ind w:firstLine="360"/>
+        <w:jc w:val="both"/>
+      </w:pPr>
+      <w:r>
+        <w:rPr>
+          <w:rFonts w:ascii="Times New Roman" w:hAnsi="Times New Roman" w:eastAsia="Times New Roman"/>
+          <w:b w:val="0"/>
+          <w:caps w:val="0"/>
+          <w:sz w:val="24"/>
+        </w:rPr>
+        <w:t>Kontributi kryesor nuk është një shifër e vetme, por një hark i plotë e i riprodhueshëm nga korpusi te rezultati, ku çdo numër rigjenerohet me një komandë dhe çdo vendim është i regjistruar me arsyen e vet.</w:t>
       </w:r>
     </w:p>
     <w:p>
@@ -1924,7 +6143,9 @@
     </w:p>
     <w:p>
       <w:pPr>
+        <w:spacing w:line="360" w:lineRule="auto"/>
         <w:ind w:left="720" w:hanging="720"/>
+        <w:jc w:val="both"/>
       </w:pPr>
       <w:r>
         <w:rPr>
@@ -1940,7 +6161,9 @@
     </w:p>
     <w:p>
       <w:pPr>
+        <w:spacing w:line="360" w:lineRule="auto"/>
         <w:ind w:left="720" w:hanging="720"/>
+        <w:jc w:val="both"/>
       </w:pPr>
       <w:r>
         <w:rPr>
@@ -1956,7 +6179,9 @@
     </w:p>
     <w:p>
       <w:pPr>
+        <w:spacing w:line="360" w:lineRule="auto"/>
         <w:ind w:left="720" w:hanging="720"/>
+        <w:jc w:val="both"/>
       </w:pPr>
       <w:r>
         <w:rPr>
@@ -1972,7 +6197,9 @@
     </w:p>
     <w:p>
       <w:pPr>
+        <w:spacing w:line="360" w:lineRule="auto"/>
         <w:ind w:left="720" w:hanging="720"/>
+        <w:jc w:val="both"/>
       </w:pPr>
       <w:r>
         <w:rPr>
@@ -1988,7 +6215,9 @@
     </w:p>
     <w:p>
       <w:pPr>
+        <w:spacing w:line="360" w:lineRule="auto"/>
         <w:ind w:left="720" w:hanging="720"/>
+        <w:jc w:val="both"/>
       </w:pPr>
       <w:r>
         <w:rPr>
@@ -2004,7 +6233,9 @@
     </w:p>
     <w:p>
       <w:pPr>
+        <w:spacing w:line="360" w:lineRule="auto"/>
         <w:ind w:left="720" w:hanging="720"/>
+        <w:jc w:val="both"/>
       </w:pPr>
       <w:r>
         <w:rPr>
@@ -2020,7 +6251,9 @@
     </w:p>
     <w:p>
       <w:pPr>
+        <w:spacing w:line="360" w:lineRule="auto"/>
         <w:ind w:left="720" w:hanging="720"/>
+        <w:jc w:val="both"/>
       </w:pPr>
       <w:r>
         <w:rPr>
@@ -2036,7 +6269,9 @@
     </w:p>
     <w:p>
       <w:pPr>
+        <w:spacing w:line="360" w:lineRule="auto"/>
         <w:ind w:left="720" w:hanging="720"/>
+        <w:jc w:val="both"/>
       </w:pPr>
       <w:r>
         <w:rPr>
@@ -2052,7 +6287,9 @@
     </w:p>
     <w:p>
       <w:pPr>
+        <w:spacing w:line="360" w:lineRule="auto"/>
         <w:ind w:left="720" w:hanging="720"/>
+        <w:jc w:val="both"/>
       </w:pPr>
       <w:r>
         <w:rPr>
@@ -2068,7 +6305,9 @@
     </w:p>
     <w:p>
       <w:pPr>
+        <w:spacing w:line="360" w:lineRule="auto"/>
         <w:ind w:left="720" w:hanging="720"/>
+        <w:jc w:val="both"/>
       </w:pPr>
       <w:r>
         <w:rPr>
@@ -2084,7 +6323,9 @@
     </w:p>
     <w:p>
       <w:pPr>
+        <w:spacing w:line="360" w:lineRule="auto"/>
         <w:ind w:left="720" w:hanging="720"/>
+        <w:jc w:val="both"/>
       </w:pPr>
       <w:r>
         <w:rPr>
@@ -2100,7 +6341,9 @@
     </w:p>
     <w:p>
       <w:pPr>
+        <w:spacing w:line="360" w:lineRule="auto"/>
         <w:ind w:left="720" w:hanging="720"/>
+        <w:jc w:val="both"/>
       </w:pPr>
       <w:r>
         <w:rPr>
@@ -2116,7 +6359,9 @@
     </w:p>
     <w:p>
       <w:pPr>
+        <w:spacing w:line="360" w:lineRule="auto"/>
         <w:ind w:left="720" w:hanging="720"/>
+        <w:jc w:val="both"/>
       </w:pPr>
       <w:r>
         <w:rPr>
@@ -2132,7 +6377,9 @@
     </w:p>
     <w:p>
       <w:pPr>
+        <w:spacing w:line="360" w:lineRule="auto"/>
         <w:ind w:left="720" w:hanging="720"/>
+        <w:jc w:val="both"/>
       </w:pPr>
       <w:r>
         <w:rPr>
@@ -2148,7 +6395,9 @@
     </w:p>
     <w:p>
       <w:pPr>
+        <w:spacing w:line="360" w:lineRule="auto"/>
         <w:ind w:left="720" w:hanging="720"/>
+        <w:jc w:val="both"/>
       </w:pPr>
       <w:r>
         <w:rPr>
@@ -2164,7 +6413,9 @@
     </w:p>
     <w:p>
       <w:pPr>
+        <w:spacing w:line="360" w:lineRule="auto"/>
         <w:ind w:left="720" w:hanging="720"/>
+        <w:jc w:val="both"/>
       </w:pPr>
       <w:r>
         <w:rPr>
@@ -2180,7 +6431,9 @@
     </w:p>
     <w:p>
       <w:pPr>
+        <w:spacing w:line="360" w:lineRule="auto"/>
         <w:ind w:left="720" w:hanging="720"/>
+        <w:jc w:val="both"/>
       </w:pPr>
       <w:r>
         <w:rPr>
@@ -2196,7 +6449,9 @@
     </w:p>
     <w:p>
       <w:pPr>
+        <w:spacing w:line="360" w:lineRule="auto"/>
         <w:ind w:left="720" w:hanging="720"/>
+        <w:jc w:val="both"/>
       </w:pPr>
       <w:r>
         <w:rPr>
@@ -2212,7 +6467,9 @@
     </w:p>
     <w:p>
       <w:pPr>
+        <w:spacing w:line="360" w:lineRule="auto"/>
         <w:ind w:left="720" w:hanging="720"/>
+        <w:jc w:val="both"/>
       </w:pPr>
       <w:r>
         <w:rPr>
@@ -2228,7 +6485,9 @@
     </w:p>
     <w:p>
       <w:pPr>
+        <w:spacing w:line="360" w:lineRule="auto"/>
         <w:ind w:left="720" w:hanging="720"/>
+        <w:jc w:val="both"/>
       </w:pPr>
       <w:r>
         <w:rPr>
@@ -2244,7 +6503,9 @@
     </w:p>
     <w:p>
       <w:pPr>
+        <w:spacing w:line="360" w:lineRule="auto"/>
         <w:ind w:left="720" w:hanging="720"/>
+        <w:jc w:val="both"/>
       </w:pPr>
       <w:r>
         <w:rPr>
@@ -2260,7 +6521,9 @@
     </w:p>
     <w:p>
       <w:pPr>
+        <w:spacing w:line="360" w:lineRule="auto"/>
         <w:ind w:left="720" w:hanging="720"/>
+        <w:jc w:val="both"/>
       </w:pPr>
       <w:r>
         <w:rPr>
@@ -2276,7 +6539,9 @@
     </w:p>
     <w:p>
       <w:pPr>
+        <w:spacing w:line="360" w:lineRule="auto"/>
         <w:ind w:left="720" w:hanging="720"/>
+        <w:jc w:val="both"/>
       </w:pPr>
       <w:r>
         <w:rPr>
@@ -2292,7 +6557,9 @@
     </w:p>
     <w:p>
       <w:pPr>
+        <w:spacing w:line="360" w:lineRule="auto"/>
         <w:ind w:left="720" w:hanging="720"/>
+        <w:jc w:val="both"/>
       </w:pPr>
       <w:r>
         <w:rPr>
@@ -2308,7 +6575,9 @@
     </w:p>
     <w:p>
       <w:pPr>
+        <w:spacing w:line="360" w:lineRule="auto"/>
         <w:ind w:left="720" w:hanging="720"/>
+        <w:jc w:val="both"/>
       </w:pPr>
       <w:r>
         <w:rPr>
@@ -2324,7 +6593,9 @@
     </w:p>
     <w:p>
       <w:pPr>
+        <w:spacing w:line="360" w:lineRule="auto"/>
         <w:ind w:left="720" w:hanging="720"/>
+        <w:jc w:val="both"/>
       </w:pPr>
       <w:r>
         <w:rPr>
@@ -2340,7 +6611,9 @@
     </w:p>
     <w:p>
       <w:pPr>
+        <w:spacing w:line="360" w:lineRule="auto"/>
         <w:ind w:left="720" w:hanging="720"/>
+        <w:jc w:val="both"/>
       </w:pPr>
       <w:r>
         <w:rPr>
@@ -2356,7 +6629,9 @@
     </w:p>
     <w:p>
       <w:pPr>
+        <w:spacing w:line="360" w:lineRule="auto"/>
         <w:ind w:left="720" w:hanging="720"/>
+        <w:jc w:val="both"/>
       </w:pPr>
       <w:r>
         <w:rPr>

</xml_diff>

<commit_message>
Shto analizen e ndjeshmerise ndaj pragjeve
Cdo prag zhvendoset vec, mes gjysmes dhe dyfishit te vleres se botuar. E mundur
ne sekonda sepse detektoret rirendisin mbi tabelen e ruajtur.

Blob dhe Data Class mezi levizin. Long Method dhe Feature Envy levizin shume, pra
per to shifra e raportuar flet po aq per pragun sa per kodin.

Vlerat me te mira nuk adoptohen: zgjedhja e nje pragu mbi bashkesine e vleresimit
eshte pershtatje ndaj te dhenave te testimit (VD-34).
</commit_message>
<xml_diff>
--- a/docs/thesis/Punim_Diplome_Florent_Latifi.docx
+++ b/docs/thesis/Punim_Diplome_Florent_Latifi.docx
@@ -719,6 +719,22 @@
     </w:p>
     <w:p>
       <w:pPr>
+        <w:spacing w:line="360" w:lineRule="auto"/>
+        <w:ind w:firstLine="360"/>
+        <w:jc w:val="both"/>
+      </w:pPr>
+      <w:r>
+        <w:rPr>
+          <w:rFonts w:ascii="Times New Roman" w:hAnsi="Times New Roman" w:eastAsia="Times New Roman"/>
+          <w:b w:val="0"/>
+          <w:caps w:val="0"/>
+          <w:sz w:val="24"/>
+        </w:rPr>
+        <w:t>Figura 6. Ndjeshmëria e MCC-së ndaj zhvendosjes së pragjeve</w:t>
+      </w:r>
+    </w:p>
+    <w:p>
+      <w:pPr>
         <w:pStyle w:val="Heading1"/>
         <w:pageBreakBefore/>
       </w:pPr>
@@ -794,6 +810,22 @@
           <w:sz w:val="24"/>
         </w:rPr>
         <w:t>Tabela 4. Pajtimi mes dy qasjeve</w:t>
+      </w:r>
+    </w:p>
+    <w:p>
+      <w:pPr>
+        <w:spacing w:line="360" w:lineRule="auto"/>
+        <w:ind w:firstLine="360"/>
+        <w:jc w:val="both"/>
+      </w:pPr>
+      <w:r>
+        <w:rPr>
+          <w:rFonts w:ascii="Times New Roman" w:hAnsi="Times New Roman" w:eastAsia="Times New Roman"/>
+          <w:b w:val="0"/>
+          <w:caps w:val="0"/>
+          <w:sz w:val="24"/>
+        </w:rPr>
+        <w:t>Tabela 5. Sa lëviz MCC-ja kur zhvendoset një prag</w:t>
       </w:r>
     </w:p>
     <w:p>
@@ -5755,6 +5787,1255 @@
     </w:p>
     <w:p>
       <w:pPr>
+        <w:pStyle w:val="Heading2"/>
+      </w:pPr>
+      <w:r>
+        <w:rPr>
+          <w:rFonts w:ascii="Times New Roman" w:hAnsi="Times New Roman" w:eastAsia="Times New Roman"/>
+          <w:b/>
+          <w:caps w:val="0"/>
+          <w:sz w:val="24"/>
+        </w:rPr>
+        <w:t>5.5 Ndjeshmëria ndaj pragjeve</w:t>
+      </w:r>
+    </w:p>
+    <w:p>
+      <w:pPr>
+        <w:spacing w:line="360" w:lineRule="auto"/>
+        <w:ind w:firstLine="360"/>
+        <w:jc w:val="both"/>
+      </w:pPr>
+      <w:r>
+        <w:rPr>
+          <w:rFonts w:ascii="Times New Roman" w:hAnsi="Times New Roman" w:eastAsia="Times New Roman"/>
+          <w:b w:val="0"/>
+          <w:caps w:val="0"/>
+          <w:sz w:val="24"/>
+        </w:rPr>
+        <w:t>Pragjet e përdorura janë ato të botuara, të nxjerra statistikisht nga një korpus tjetër. Pyetja e natyrshme është sa varet rezultati prej tyre. Secili prag u zhvendos veç, mes gjysmës dhe dyfishit të vlerës së vet, me të tjerët të mbajtur fiks.</w:t>
+      </w:r>
+    </w:p>
+    <w:p>
+      <w:pPr>
+        <w:spacing w:line="240" w:lineRule="auto"/>
+        <w:jc w:val="center"/>
+      </w:pPr>
+      <w:r>
+        <w:rPr>
+          <w:rFonts w:ascii="Times New Roman" w:hAnsi="Times New Roman" w:eastAsia="Times New Roman"/>
+          <w:b w:val="0"/>
+          <w:caps w:val="0"/>
+          <w:sz w:val="22"/>
+        </w:rPr>
+        <w:t>Tabela 5. Sa lëviz MCC-ja kur zhvendoset një prag</w:t>
+      </w:r>
+    </w:p>
+    <w:tbl>
+      <w:tblPr>
+        <w:tblStyle w:val="TableGrid"/>
+        <w:tblW w:type="auto" w:w="0"/>
+        <w:tblLook w:firstColumn="1" w:firstRow="1" w:lastColumn="0" w:lastRow="0" w:noHBand="0" w:noVBand="1" w:val="04A0"/>
+      </w:tblPr>
+      <w:tblGrid>
+        <w:gridCol w:w="1728"/>
+        <w:gridCol w:w="1728"/>
+        <w:gridCol w:w="1728"/>
+        <w:gridCol w:w="1728"/>
+        <w:gridCol w:w="1728"/>
+      </w:tblGrid>
+      <w:tr>
+        <w:tc>
+          <w:tcPr>
+            <w:tcW w:type="dxa" w:w="1728"/>
+          </w:tcPr>
+          <w:p>
+            <w:pPr>
+              <w:spacing w:line="240" w:lineRule="auto"/>
+            </w:pPr>
+            <w:r>
+              <w:rPr>
+                <w:rFonts w:ascii="Times New Roman" w:hAnsi="Times New Roman" w:eastAsia="Times New Roman"/>
+                <w:b/>
+                <w:caps w:val="0"/>
+                <w:sz w:val="22"/>
+              </w:rPr>
+              <w:t>Erë</w:t>
+            </w:r>
+          </w:p>
+        </w:tc>
+        <w:tc>
+          <w:tcPr>
+            <w:tcW w:type="dxa" w:w="1728"/>
+          </w:tcPr>
+          <w:p>
+            <w:pPr>
+              <w:spacing w:line="240" w:lineRule="auto"/>
+            </w:pPr>
+            <w:r>
+              <w:rPr>
+                <w:rFonts w:ascii="Times New Roman" w:hAnsi="Times New Roman" w:eastAsia="Times New Roman"/>
+                <w:b/>
+                <w:caps w:val="0"/>
+                <w:sz w:val="22"/>
+              </w:rPr>
+              <w:t>Pragu</w:t>
+            </w:r>
+          </w:p>
+        </w:tc>
+        <w:tc>
+          <w:tcPr>
+            <w:tcW w:type="dxa" w:w="1728"/>
+          </w:tcPr>
+          <w:p>
+            <w:pPr>
+              <w:spacing w:line="240" w:lineRule="auto"/>
+            </w:pPr>
+            <w:r>
+              <w:rPr>
+                <w:rFonts w:ascii="Times New Roman" w:hAnsi="Times New Roman" w:eastAsia="Times New Roman"/>
+                <w:b/>
+                <w:caps w:val="0"/>
+                <w:sz w:val="22"/>
+              </w:rPr>
+              <w:t>Te vlera e botuar</w:t>
+            </w:r>
+          </w:p>
+        </w:tc>
+        <w:tc>
+          <w:tcPr>
+            <w:tcW w:type="dxa" w:w="1728"/>
+          </w:tcPr>
+          <w:p>
+            <w:pPr>
+              <w:spacing w:line="240" w:lineRule="auto"/>
+            </w:pPr>
+            <w:r>
+              <w:rPr>
+                <w:rFonts w:ascii="Times New Roman" w:hAnsi="Times New Roman" w:eastAsia="Times New Roman"/>
+                <w:b/>
+                <w:caps w:val="0"/>
+                <w:sz w:val="22"/>
+              </w:rPr>
+              <w:t>Brezi</w:t>
+            </w:r>
+          </w:p>
+        </w:tc>
+        <w:tc>
+          <w:tcPr>
+            <w:tcW w:type="dxa" w:w="1728"/>
+          </w:tcPr>
+          <w:p>
+            <w:pPr>
+              <w:spacing w:line="240" w:lineRule="auto"/>
+            </w:pPr>
+            <w:r>
+              <w:rPr>
+                <w:rFonts w:ascii="Times New Roman" w:hAnsi="Times New Roman" w:eastAsia="Times New Roman"/>
+                <w:b/>
+                <w:caps w:val="0"/>
+                <w:sz w:val="22"/>
+              </w:rPr>
+              <w:t>Amplituda</w:t>
+            </w:r>
+          </w:p>
+        </w:tc>
+      </w:tr>
+      <w:tr>
+        <w:tc>
+          <w:tcPr>
+            <w:tcW w:type="dxa" w:w="1728"/>
+          </w:tcPr>
+          <w:p>
+            <w:pPr>
+              <w:spacing w:line="240" w:lineRule="auto"/>
+            </w:pPr>
+            <w:r>
+              <w:rPr>
+                <w:rFonts w:ascii="Times New Roman" w:hAnsi="Times New Roman" w:eastAsia="Times New Roman"/>
+                <w:b w:val="0"/>
+                <w:caps w:val="0"/>
+                <w:sz w:val="22"/>
+              </w:rPr>
+              <w:t>Long Method</w:t>
+            </w:r>
+          </w:p>
+        </w:tc>
+        <w:tc>
+          <w:tcPr>
+            <w:tcW w:type="dxa" w:w="1728"/>
+          </w:tcPr>
+          <w:p>
+            <w:pPr>
+              <w:spacing w:line="240" w:lineRule="auto"/>
+            </w:pPr>
+            <w:r>
+              <w:rPr>
+                <w:rFonts w:ascii="Times New Roman" w:hAnsi="Times New Roman" w:eastAsia="Times New Roman"/>
+                <w:b w:val="0"/>
+                <w:caps w:val="0"/>
+                <w:sz w:val="22"/>
+              </w:rPr>
+              <w:t>long_method_loc</w:t>
+            </w:r>
+          </w:p>
+        </w:tc>
+        <w:tc>
+          <w:tcPr>
+            <w:tcW w:type="dxa" w:w="1728"/>
+          </w:tcPr>
+          <w:p>
+            <w:pPr>
+              <w:spacing w:line="240" w:lineRule="auto"/>
+            </w:pPr>
+            <w:r>
+              <w:rPr>
+                <w:rFonts w:ascii="Times New Roman" w:hAnsi="Times New Roman" w:eastAsia="Times New Roman"/>
+                <w:b w:val="0"/>
+                <w:caps w:val="0"/>
+                <w:sz w:val="22"/>
+              </w:rPr>
+              <w:t>0.580</w:t>
+            </w:r>
+          </w:p>
+        </w:tc>
+        <w:tc>
+          <w:tcPr>
+            <w:tcW w:type="dxa" w:w="1728"/>
+          </w:tcPr>
+          <w:p>
+            <w:pPr>
+              <w:spacing w:line="240" w:lineRule="auto"/>
+            </w:pPr>
+            <w:r>
+              <w:rPr>
+                <w:rFonts w:ascii="Times New Roman" w:hAnsi="Times New Roman" w:eastAsia="Times New Roman"/>
+                <w:b w:val="0"/>
+                <w:caps w:val="0"/>
+                <w:sz w:val="22"/>
+              </w:rPr>
+              <w:t>0.342 – 0.690</w:t>
+            </w:r>
+          </w:p>
+        </w:tc>
+        <w:tc>
+          <w:tcPr>
+            <w:tcW w:type="dxa" w:w="1728"/>
+          </w:tcPr>
+          <w:p>
+            <w:pPr>
+              <w:spacing w:line="240" w:lineRule="auto"/>
+            </w:pPr>
+            <w:r>
+              <w:rPr>
+                <w:rFonts w:ascii="Times New Roman" w:hAnsi="Times New Roman" w:eastAsia="Times New Roman"/>
+                <w:b w:val="0"/>
+                <w:caps w:val="0"/>
+                <w:sz w:val="22"/>
+              </w:rPr>
+              <w:t>0.348</w:t>
+            </w:r>
+          </w:p>
+        </w:tc>
+      </w:tr>
+      <w:tr>
+        <w:tc>
+          <w:tcPr>
+            <w:tcW w:type="dxa" w:w="1728"/>
+          </w:tcPr>
+          <w:p>
+            <w:pPr>
+              <w:spacing w:line="240" w:lineRule="auto"/>
+            </w:pPr>
+            <w:r>
+              <w:rPr>
+                <w:rFonts w:ascii="Times New Roman" w:hAnsi="Times New Roman" w:eastAsia="Times New Roman"/>
+                <w:b w:val="0"/>
+                <w:caps w:val="0"/>
+                <w:sz w:val="22"/>
+              </w:rPr>
+              <w:t>Feature Envy</w:t>
+            </w:r>
+          </w:p>
+        </w:tc>
+        <w:tc>
+          <w:tcPr>
+            <w:tcW w:type="dxa" w:w="1728"/>
+          </w:tcPr>
+          <w:p>
+            <w:pPr>
+              <w:spacing w:line="240" w:lineRule="auto"/>
+            </w:pPr>
+            <w:r>
+              <w:rPr>
+                <w:rFonts w:ascii="Times New Roman" w:hAnsi="Times New Roman" w:eastAsia="Times New Roman"/>
+                <w:b w:val="0"/>
+                <w:caps w:val="0"/>
+                <w:sz w:val="22"/>
+              </w:rPr>
+              <w:t>feature_envy_fdp</w:t>
+            </w:r>
+          </w:p>
+        </w:tc>
+        <w:tc>
+          <w:tcPr>
+            <w:tcW w:type="dxa" w:w="1728"/>
+          </w:tcPr>
+          <w:p>
+            <w:pPr>
+              <w:spacing w:line="240" w:lineRule="auto"/>
+            </w:pPr>
+            <w:r>
+              <w:rPr>
+                <w:rFonts w:ascii="Times New Roman" w:hAnsi="Times New Roman" w:eastAsia="Times New Roman"/>
+                <w:b w:val="0"/>
+                <w:caps w:val="0"/>
+                <w:sz w:val="22"/>
+              </w:rPr>
+              <w:t>0.271</w:t>
+            </w:r>
+          </w:p>
+        </w:tc>
+        <w:tc>
+          <w:tcPr>
+            <w:tcW w:type="dxa" w:w="1728"/>
+          </w:tcPr>
+          <w:p>
+            <w:pPr>
+              <w:spacing w:line="240" w:lineRule="auto"/>
+            </w:pPr>
+            <w:r>
+              <w:rPr>
+                <w:rFonts w:ascii="Times New Roman" w:hAnsi="Times New Roman" w:eastAsia="Times New Roman"/>
+                <w:b w:val="0"/>
+                <w:caps w:val="0"/>
+                <w:sz w:val="22"/>
+              </w:rPr>
+              <w:t>0.091 – 0.411</w:t>
+            </w:r>
+          </w:p>
+        </w:tc>
+        <w:tc>
+          <w:tcPr>
+            <w:tcW w:type="dxa" w:w="1728"/>
+          </w:tcPr>
+          <w:p>
+            <w:pPr>
+              <w:spacing w:line="240" w:lineRule="auto"/>
+            </w:pPr>
+            <w:r>
+              <w:rPr>
+                <w:rFonts w:ascii="Times New Roman" w:hAnsi="Times New Roman" w:eastAsia="Times New Roman"/>
+                <w:b w:val="0"/>
+                <w:caps w:val="0"/>
+                <w:sz w:val="22"/>
+              </w:rPr>
+              <w:t>0.320</w:t>
+            </w:r>
+          </w:p>
+        </w:tc>
+      </w:tr>
+      <w:tr>
+        <w:tc>
+          <w:tcPr>
+            <w:tcW w:type="dxa" w:w="1728"/>
+          </w:tcPr>
+          <w:p>
+            <w:pPr>
+              <w:spacing w:line="240" w:lineRule="auto"/>
+            </w:pPr>
+            <w:r>
+              <w:rPr>
+                <w:rFonts w:ascii="Times New Roman" w:hAnsi="Times New Roman" w:eastAsia="Times New Roman"/>
+                <w:b w:val="0"/>
+                <w:caps w:val="0"/>
+                <w:sz w:val="22"/>
+              </w:rPr>
+              <w:t>Blob</w:t>
+            </w:r>
+          </w:p>
+        </w:tc>
+        <w:tc>
+          <w:tcPr>
+            <w:tcW w:type="dxa" w:w="1728"/>
+          </w:tcPr>
+          <w:p>
+            <w:pPr>
+              <w:spacing w:line="240" w:lineRule="auto"/>
+            </w:pPr>
+            <w:r>
+              <w:rPr>
+                <w:rFonts w:ascii="Times New Roman" w:hAnsi="Times New Roman" w:eastAsia="Times New Roman"/>
+                <w:b w:val="0"/>
+                <w:caps w:val="0"/>
+                <w:sz w:val="22"/>
+              </w:rPr>
+              <w:t>god_class_tcc</w:t>
+            </w:r>
+          </w:p>
+        </w:tc>
+        <w:tc>
+          <w:tcPr>
+            <w:tcW w:type="dxa" w:w="1728"/>
+          </w:tcPr>
+          <w:p>
+            <w:pPr>
+              <w:spacing w:line="240" w:lineRule="auto"/>
+            </w:pPr>
+            <w:r>
+              <w:rPr>
+                <w:rFonts w:ascii="Times New Roman" w:hAnsi="Times New Roman" w:eastAsia="Times New Roman"/>
+                <w:b w:val="0"/>
+                <w:caps w:val="0"/>
+                <w:sz w:val="22"/>
+              </w:rPr>
+              <w:t>0.232</w:t>
+            </w:r>
+          </w:p>
+        </w:tc>
+        <w:tc>
+          <w:tcPr>
+            <w:tcW w:type="dxa" w:w="1728"/>
+          </w:tcPr>
+          <w:p>
+            <w:pPr>
+              <w:spacing w:line="240" w:lineRule="auto"/>
+            </w:pPr>
+            <w:r>
+              <w:rPr>
+                <w:rFonts w:ascii="Times New Roman" w:hAnsi="Times New Roman" w:eastAsia="Times New Roman"/>
+                <w:b w:val="0"/>
+                <w:caps w:val="0"/>
+                <w:sz w:val="22"/>
+              </w:rPr>
+              <w:t>0.153 – 0.254</w:t>
+            </w:r>
+          </w:p>
+        </w:tc>
+        <w:tc>
+          <w:tcPr>
+            <w:tcW w:type="dxa" w:w="1728"/>
+          </w:tcPr>
+          <w:p>
+            <w:pPr>
+              <w:spacing w:line="240" w:lineRule="auto"/>
+            </w:pPr>
+            <w:r>
+              <w:rPr>
+                <w:rFonts w:ascii="Times New Roman" w:hAnsi="Times New Roman" w:eastAsia="Times New Roman"/>
+                <w:b w:val="0"/>
+                <w:caps w:val="0"/>
+                <w:sz w:val="22"/>
+              </w:rPr>
+              <w:t>0.101</w:t>
+            </w:r>
+          </w:p>
+        </w:tc>
+      </w:tr>
+      <w:tr>
+        <w:tc>
+          <w:tcPr>
+            <w:tcW w:type="dxa" w:w="1728"/>
+          </w:tcPr>
+          <w:p>
+            <w:pPr>
+              <w:spacing w:line="240" w:lineRule="auto"/>
+            </w:pPr>
+            <w:r>
+              <w:rPr>
+                <w:rFonts w:ascii="Times New Roman" w:hAnsi="Times New Roman" w:eastAsia="Times New Roman"/>
+                <w:b w:val="0"/>
+                <w:caps w:val="0"/>
+                <w:sz w:val="22"/>
+              </w:rPr>
+              <w:t>Blob</w:t>
+            </w:r>
+          </w:p>
+        </w:tc>
+        <w:tc>
+          <w:tcPr>
+            <w:tcW w:type="dxa" w:w="1728"/>
+          </w:tcPr>
+          <w:p>
+            <w:pPr>
+              <w:spacing w:line="240" w:lineRule="auto"/>
+            </w:pPr>
+            <w:r>
+              <w:rPr>
+                <w:rFonts w:ascii="Times New Roman" w:hAnsi="Times New Roman" w:eastAsia="Times New Roman"/>
+                <w:b w:val="0"/>
+                <w:caps w:val="0"/>
+                <w:sz w:val="22"/>
+              </w:rPr>
+              <w:t>god_class_wmc</w:t>
+            </w:r>
+          </w:p>
+        </w:tc>
+        <w:tc>
+          <w:tcPr>
+            <w:tcW w:type="dxa" w:w="1728"/>
+          </w:tcPr>
+          <w:p>
+            <w:pPr>
+              <w:spacing w:line="240" w:lineRule="auto"/>
+            </w:pPr>
+            <w:r>
+              <w:rPr>
+                <w:rFonts w:ascii="Times New Roman" w:hAnsi="Times New Roman" w:eastAsia="Times New Roman"/>
+                <w:b w:val="0"/>
+                <w:caps w:val="0"/>
+                <w:sz w:val="22"/>
+              </w:rPr>
+              <w:t>0.232</w:t>
+            </w:r>
+          </w:p>
+        </w:tc>
+        <w:tc>
+          <w:tcPr>
+            <w:tcW w:type="dxa" w:w="1728"/>
+          </w:tcPr>
+          <w:p>
+            <w:pPr>
+              <w:spacing w:line="240" w:lineRule="auto"/>
+            </w:pPr>
+            <w:r>
+              <w:rPr>
+                <w:rFonts w:ascii="Times New Roman" w:hAnsi="Times New Roman" w:eastAsia="Times New Roman"/>
+                <w:b w:val="0"/>
+                <w:caps w:val="0"/>
+                <w:sz w:val="22"/>
+              </w:rPr>
+              <w:t>0.162 – 0.261</w:t>
+            </w:r>
+          </w:p>
+        </w:tc>
+        <w:tc>
+          <w:tcPr>
+            <w:tcW w:type="dxa" w:w="1728"/>
+          </w:tcPr>
+          <w:p>
+            <w:pPr>
+              <w:spacing w:line="240" w:lineRule="auto"/>
+            </w:pPr>
+            <w:r>
+              <w:rPr>
+                <w:rFonts w:ascii="Times New Roman" w:hAnsi="Times New Roman" w:eastAsia="Times New Roman"/>
+                <w:b w:val="0"/>
+                <w:caps w:val="0"/>
+                <w:sz w:val="22"/>
+              </w:rPr>
+              <w:t>0.099</w:t>
+            </w:r>
+          </w:p>
+        </w:tc>
+      </w:tr>
+      <w:tr>
+        <w:tc>
+          <w:tcPr>
+            <w:tcW w:type="dxa" w:w="1728"/>
+          </w:tcPr>
+          <w:p>
+            <w:pPr>
+              <w:spacing w:line="240" w:lineRule="auto"/>
+            </w:pPr>
+            <w:r>
+              <w:rPr>
+                <w:rFonts w:ascii="Times New Roman" w:hAnsi="Times New Roman" w:eastAsia="Times New Roman"/>
+                <w:b w:val="0"/>
+                <w:caps w:val="0"/>
+                <w:sz w:val="22"/>
+              </w:rPr>
+              <w:t>Data Class</w:t>
+            </w:r>
+          </w:p>
+        </w:tc>
+        <w:tc>
+          <w:tcPr>
+            <w:tcW w:type="dxa" w:w="1728"/>
+          </w:tcPr>
+          <w:p>
+            <w:pPr>
+              <w:spacing w:line="240" w:lineRule="auto"/>
+            </w:pPr>
+            <w:r>
+              <w:rPr>
+                <w:rFonts w:ascii="Times New Roman" w:hAnsi="Times New Roman" w:eastAsia="Times New Roman"/>
+                <w:b w:val="0"/>
+                <w:caps w:val="0"/>
+                <w:sz w:val="22"/>
+              </w:rPr>
+              <w:t>data_class_public_members</w:t>
+            </w:r>
+          </w:p>
+        </w:tc>
+        <w:tc>
+          <w:tcPr>
+            <w:tcW w:type="dxa" w:w="1728"/>
+          </w:tcPr>
+          <w:p>
+            <w:pPr>
+              <w:spacing w:line="240" w:lineRule="auto"/>
+            </w:pPr>
+            <w:r>
+              <w:rPr>
+                <w:rFonts w:ascii="Times New Roman" w:hAnsi="Times New Roman" w:eastAsia="Times New Roman"/>
+                <w:b w:val="0"/>
+                <w:caps w:val="0"/>
+                <w:sz w:val="22"/>
+              </w:rPr>
+              <w:t>0.275</w:t>
+            </w:r>
+          </w:p>
+        </w:tc>
+        <w:tc>
+          <w:tcPr>
+            <w:tcW w:type="dxa" w:w="1728"/>
+          </w:tcPr>
+          <w:p>
+            <w:pPr>
+              <w:spacing w:line="240" w:lineRule="auto"/>
+            </w:pPr>
+            <w:r>
+              <w:rPr>
+                <w:rFonts w:ascii="Times New Roman" w:hAnsi="Times New Roman" w:eastAsia="Times New Roman"/>
+                <w:b w:val="0"/>
+                <w:caps w:val="0"/>
+                <w:sz w:val="22"/>
+              </w:rPr>
+              <w:t>0.197 – 0.275</w:t>
+            </w:r>
+          </w:p>
+        </w:tc>
+        <w:tc>
+          <w:tcPr>
+            <w:tcW w:type="dxa" w:w="1728"/>
+          </w:tcPr>
+          <w:p>
+            <w:pPr>
+              <w:spacing w:line="240" w:lineRule="auto"/>
+            </w:pPr>
+            <w:r>
+              <w:rPr>
+                <w:rFonts w:ascii="Times New Roman" w:hAnsi="Times New Roman" w:eastAsia="Times New Roman"/>
+                <w:b w:val="0"/>
+                <w:caps w:val="0"/>
+                <w:sz w:val="22"/>
+              </w:rPr>
+              <w:t>0.078</w:t>
+            </w:r>
+          </w:p>
+        </w:tc>
+      </w:tr>
+      <w:tr>
+        <w:tc>
+          <w:tcPr>
+            <w:tcW w:type="dxa" w:w="1728"/>
+          </w:tcPr>
+          <w:p>
+            <w:pPr>
+              <w:spacing w:line="240" w:lineRule="auto"/>
+            </w:pPr>
+            <w:r>
+              <w:rPr>
+                <w:rFonts w:ascii="Times New Roman" w:hAnsi="Times New Roman" w:eastAsia="Times New Roman"/>
+                <w:b w:val="0"/>
+                <w:caps w:val="0"/>
+                <w:sz w:val="22"/>
+              </w:rPr>
+              <w:t>Feature Envy</w:t>
+            </w:r>
+          </w:p>
+        </w:tc>
+        <w:tc>
+          <w:tcPr>
+            <w:tcW w:type="dxa" w:w="1728"/>
+          </w:tcPr>
+          <w:p>
+            <w:pPr>
+              <w:spacing w:line="240" w:lineRule="auto"/>
+            </w:pPr>
+            <w:r>
+              <w:rPr>
+                <w:rFonts w:ascii="Times New Roman" w:hAnsi="Times New Roman" w:eastAsia="Times New Roman"/>
+                <w:b w:val="0"/>
+                <w:caps w:val="0"/>
+                <w:sz w:val="22"/>
+              </w:rPr>
+              <w:t>feature_envy_laa</w:t>
+            </w:r>
+          </w:p>
+        </w:tc>
+        <w:tc>
+          <w:tcPr>
+            <w:tcW w:type="dxa" w:w="1728"/>
+          </w:tcPr>
+          <w:p>
+            <w:pPr>
+              <w:spacing w:line="240" w:lineRule="auto"/>
+            </w:pPr>
+            <w:r>
+              <w:rPr>
+                <w:rFonts w:ascii="Times New Roman" w:hAnsi="Times New Roman" w:eastAsia="Times New Roman"/>
+                <w:b w:val="0"/>
+                <w:caps w:val="0"/>
+                <w:sz w:val="22"/>
+              </w:rPr>
+              <w:t>0.271</w:t>
+            </w:r>
+          </w:p>
+        </w:tc>
+        <w:tc>
+          <w:tcPr>
+            <w:tcW w:type="dxa" w:w="1728"/>
+          </w:tcPr>
+          <w:p>
+            <w:pPr>
+              <w:spacing w:line="240" w:lineRule="auto"/>
+            </w:pPr>
+            <w:r>
+              <w:rPr>
+                <w:rFonts w:ascii="Times New Roman" w:hAnsi="Times New Roman" w:eastAsia="Times New Roman"/>
+                <w:b w:val="0"/>
+                <w:caps w:val="0"/>
+                <w:sz w:val="22"/>
+              </w:rPr>
+              <w:t>0.223 – 0.288</w:t>
+            </w:r>
+          </w:p>
+        </w:tc>
+        <w:tc>
+          <w:tcPr>
+            <w:tcW w:type="dxa" w:w="1728"/>
+          </w:tcPr>
+          <w:p>
+            <w:pPr>
+              <w:spacing w:line="240" w:lineRule="auto"/>
+            </w:pPr>
+            <w:r>
+              <w:rPr>
+                <w:rFonts w:ascii="Times New Roman" w:hAnsi="Times New Roman" w:eastAsia="Times New Roman"/>
+                <w:b w:val="0"/>
+                <w:caps w:val="0"/>
+                <w:sz w:val="22"/>
+              </w:rPr>
+              <w:t>0.066</w:t>
+            </w:r>
+          </w:p>
+        </w:tc>
+      </w:tr>
+      <w:tr>
+        <w:tc>
+          <w:tcPr>
+            <w:tcW w:type="dxa" w:w="1728"/>
+          </w:tcPr>
+          <w:p>
+            <w:pPr>
+              <w:spacing w:line="240" w:lineRule="auto"/>
+            </w:pPr>
+            <w:r>
+              <w:rPr>
+                <w:rFonts w:ascii="Times New Roman" w:hAnsi="Times New Roman" w:eastAsia="Times New Roman"/>
+                <w:b w:val="0"/>
+                <w:caps w:val="0"/>
+                <w:sz w:val="22"/>
+              </w:rPr>
+              <w:t>Feature Envy</w:t>
+            </w:r>
+          </w:p>
+        </w:tc>
+        <w:tc>
+          <w:tcPr>
+            <w:tcW w:type="dxa" w:w="1728"/>
+          </w:tcPr>
+          <w:p>
+            <w:pPr>
+              <w:spacing w:line="240" w:lineRule="auto"/>
+            </w:pPr>
+            <w:r>
+              <w:rPr>
+                <w:rFonts w:ascii="Times New Roman" w:hAnsi="Times New Roman" w:eastAsia="Times New Roman"/>
+                <w:b w:val="0"/>
+                <w:caps w:val="0"/>
+                <w:sz w:val="22"/>
+              </w:rPr>
+              <w:t>feature_envy_atfd</w:t>
+            </w:r>
+          </w:p>
+        </w:tc>
+        <w:tc>
+          <w:tcPr>
+            <w:tcW w:type="dxa" w:w="1728"/>
+          </w:tcPr>
+          <w:p>
+            <w:pPr>
+              <w:spacing w:line="240" w:lineRule="auto"/>
+            </w:pPr>
+            <w:r>
+              <w:rPr>
+                <w:rFonts w:ascii="Times New Roman" w:hAnsi="Times New Roman" w:eastAsia="Times New Roman"/>
+                <w:b w:val="0"/>
+                <w:caps w:val="0"/>
+                <w:sz w:val="22"/>
+              </w:rPr>
+              <w:t>0.271</w:t>
+            </w:r>
+          </w:p>
+        </w:tc>
+        <w:tc>
+          <w:tcPr>
+            <w:tcW w:type="dxa" w:w="1728"/>
+          </w:tcPr>
+          <w:p>
+            <w:pPr>
+              <w:spacing w:line="240" w:lineRule="auto"/>
+            </w:pPr>
+            <w:r>
+              <w:rPr>
+                <w:rFonts w:ascii="Times New Roman" w:hAnsi="Times New Roman" w:eastAsia="Times New Roman"/>
+                <w:b w:val="0"/>
+                <w:caps w:val="0"/>
+                <w:sz w:val="22"/>
+              </w:rPr>
+              <w:t>0.211 – 0.271</w:t>
+            </w:r>
+          </w:p>
+        </w:tc>
+        <w:tc>
+          <w:tcPr>
+            <w:tcW w:type="dxa" w:w="1728"/>
+          </w:tcPr>
+          <w:p>
+            <w:pPr>
+              <w:spacing w:line="240" w:lineRule="auto"/>
+            </w:pPr>
+            <w:r>
+              <w:rPr>
+                <w:rFonts w:ascii="Times New Roman" w:hAnsi="Times New Roman" w:eastAsia="Times New Roman"/>
+                <w:b w:val="0"/>
+                <w:caps w:val="0"/>
+                <w:sz w:val="22"/>
+              </w:rPr>
+              <w:t>0.060</w:t>
+            </w:r>
+          </w:p>
+        </w:tc>
+      </w:tr>
+      <w:tr>
+        <w:tc>
+          <w:tcPr>
+            <w:tcW w:type="dxa" w:w="1728"/>
+          </w:tcPr>
+          <w:p>
+            <w:pPr>
+              <w:spacing w:line="240" w:lineRule="auto"/>
+            </w:pPr>
+            <w:r>
+              <w:rPr>
+                <w:rFonts w:ascii="Times New Roman" w:hAnsi="Times New Roman" w:eastAsia="Times New Roman"/>
+                <w:b w:val="0"/>
+                <w:caps w:val="0"/>
+                <w:sz w:val="22"/>
+              </w:rPr>
+              <w:t>Data Class</w:t>
+            </w:r>
+          </w:p>
+        </w:tc>
+        <w:tc>
+          <w:tcPr>
+            <w:tcW w:type="dxa" w:w="1728"/>
+          </w:tcPr>
+          <w:p>
+            <w:pPr>
+              <w:spacing w:line="240" w:lineRule="auto"/>
+            </w:pPr>
+            <w:r>
+              <w:rPr>
+                <w:rFonts w:ascii="Times New Roman" w:hAnsi="Times New Roman" w:eastAsia="Times New Roman"/>
+                <w:b w:val="0"/>
+                <w:caps w:val="0"/>
+                <w:sz w:val="22"/>
+              </w:rPr>
+              <w:t>data_class_woc</w:t>
+            </w:r>
+          </w:p>
+        </w:tc>
+        <w:tc>
+          <w:tcPr>
+            <w:tcW w:type="dxa" w:w="1728"/>
+          </w:tcPr>
+          <w:p>
+            <w:pPr>
+              <w:spacing w:line="240" w:lineRule="auto"/>
+            </w:pPr>
+            <w:r>
+              <w:rPr>
+                <w:rFonts w:ascii="Times New Roman" w:hAnsi="Times New Roman" w:eastAsia="Times New Roman"/>
+                <w:b w:val="0"/>
+                <w:caps w:val="0"/>
+                <w:sz w:val="22"/>
+              </w:rPr>
+              <w:t>0.275</w:t>
+            </w:r>
+          </w:p>
+        </w:tc>
+        <w:tc>
+          <w:tcPr>
+            <w:tcW w:type="dxa" w:w="1728"/>
+          </w:tcPr>
+          <w:p>
+            <w:pPr>
+              <w:spacing w:line="240" w:lineRule="auto"/>
+            </w:pPr>
+            <w:r>
+              <w:rPr>
+                <w:rFonts w:ascii="Times New Roman" w:hAnsi="Times New Roman" w:eastAsia="Times New Roman"/>
+                <w:b w:val="0"/>
+                <w:caps w:val="0"/>
+                <w:sz w:val="22"/>
+              </w:rPr>
+              <w:t>0.268 – 0.292</w:t>
+            </w:r>
+          </w:p>
+        </w:tc>
+        <w:tc>
+          <w:tcPr>
+            <w:tcW w:type="dxa" w:w="1728"/>
+          </w:tcPr>
+          <w:p>
+            <w:pPr>
+              <w:spacing w:line="240" w:lineRule="auto"/>
+            </w:pPr>
+            <w:r>
+              <w:rPr>
+                <w:rFonts w:ascii="Times New Roman" w:hAnsi="Times New Roman" w:eastAsia="Times New Roman"/>
+                <w:b w:val="0"/>
+                <w:caps w:val="0"/>
+                <w:sz w:val="22"/>
+              </w:rPr>
+              <w:t>0.025</w:t>
+            </w:r>
+          </w:p>
+        </w:tc>
+      </w:tr>
+      <w:tr>
+        <w:tc>
+          <w:tcPr>
+            <w:tcW w:type="dxa" w:w="1728"/>
+          </w:tcPr>
+          <w:p>
+            <w:pPr>
+              <w:spacing w:line="240" w:lineRule="auto"/>
+            </w:pPr>
+            <w:r>
+              <w:rPr>
+                <w:rFonts w:ascii="Times New Roman" w:hAnsi="Times New Roman" w:eastAsia="Times New Roman"/>
+                <w:b w:val="0"/>
+                <w:caps w:val="0"/>
+                <w:sz w:val="22"/>
+              </w:rPr>
+              <w:t>Data Class</w:t>
+            </w:r>
+          </w:p>
+        </w:tc>
+        <w:tc>
+          <w:tcPr>
+            <w:tcW w:type="dxa" w:w="1728"/>
+          </w:tcPr>
+          <w:p>
+            <w:pPr>
+              <w:spacing w:line="240" w:lineRule="auto"/>
+            </w:pPr>
+            <w:r>
+              <w:rPr>
+                <w:rFonts w:ascii="Times New Roman" w:hAnsi="Times New Roman" w:eastAsia="Times New Roman"/>
+                <w:b w:val="0"/>
+                <w:caps w:val="0"/>
+                <w:sz w:val="22"/>
+              </w:rPr>
+              <w:t>data_class_wmc_low</w:t>
+            </w:r>
+          </w:p>
+        </w:tc>
+        <w:tc>
+          <w:tcPr>
+            <w:tcW w:type="dxa" w:w="1728"/>
+          </w:tcPr>
+          <w:p>
+            <w:pPr>
+              <w:spacing w:line="240" w:lineRule="auto"/>
+            </w:pPr>
+            <w:r>
+              <w:rPr>
+                <w:rFonts w:ascii="Times New Roman" w:hAnsi="Times New Roman" w:eastAsia="Times New Roman"/>
+                <w:b w:val="0"/>
+                <w:caps w:val="0"/>
+                <w:sz w:val="22"/>
+              </w:rPr>
+              <w:t>0.275</w:t>
+            </w:r>
+          </w:p>
+        </w:tc>
+        <w:tc>
+          <w:tcPr>
+            <w:tcW w:type="dxa" w:w="1728"/>
+          </w:tcPr>
+          <w:p>
+            <w:pPr>
+              <w:spacing w:line="240" w:lineRule="auto"/>
+            </w:pPr>
+            <w:r>
+              <w:rPr>
+                <w:rFonts w:ascii="Times New Roman" w:hAnsi="Times New Roman" w:eastAsia="Times New Roman"/>
+                <w:b w:val="0"/>
+                <w:caps w:val="0"/>
+                <w:sz w:val="22"/>
+              </w:rPr>
+              <w:t>0.259 – 0.282</w:t>
+            </w:r>
+          </w:p>
+        </w:tc>
+        <w:tc>
+          <w:tcPr>
+            <w:tcW w:type="dxa" w:w="1728"/>
+          </w:tcPr>
+          <w:p>
+            <w:pPr>
+              <w:spacing w:line="240" w:lineRule="auto"/>
+            </w:pPr>
+            <w:r>
+              <w:rPr>
+                <w:rFonts w:ascii="Times New Roman" w:hAnsi="Times New Roman" w:eastAsia="Times New Roman"/>
+                <w:b w:val="0"/>
+                <w:caps w:val="0"/>
+                <w:sz w:val="22"/>
+              </w:rPr>
+              <w:t>0.023</w:t>
+            </w:r>
+          </w:p>
+        </w:tc>
+      </w:tr>
+      <w:tr>
+        <w:tc>
+          <w:tcPr>
+            <w:tcW w:type="dxa" w:w="1728"/>
+          </w:tcPr>
+          <w:p>
+            <w:pPr>
+              <w:spacing w:line="240" w:lineRule="auto"/>
+            </w:pPr>
+            <w:r>
+              <w:rPr>
+                <w:rFonts w:ascii="Times New Roman" w:hAnsi="Times New Roman" w:eastAsia="Times New Roman"/>
+                <w:b w:val="0"/>
+                <w:caps w:val="0"/>
+                <w:sz w:val="22"/>
+              </w:rPr>
+              <w:t>Blob</w:t>
+            </w:r>
+          </w:p>
+        </w:tc>
+        <w:tc>
+          <w:tcPr>
+            <w:tcW w:type="dxa" w:w="1728"/>
+          </w:tcPr>
+          <w:p>
+            <w:pPr>
+              <w:spacing w:line="240" w:lineRule="auto"/>
+            </w:pPr>
+            <w:r>
+              <w:rPr>
+                <w:rFonts w:ascii="Times New Roman" w:hAnsi="Times New Roman" w:eastAsia="Times New Roman"/>
+                <w:b w:val="0"/>
+                <w:caps w:val="0"/>
+                <w:sz w:val="22"/>
+              </w:rPr>
+              <w:t>god_class_atfd</w:t>
+            </w:r>
+          </w:p>
+        </w:tc>
+        <w:tc>
+          <w:tcPr>
+            <w:tcW w:type="dxa" w:w="1728"/>
+          </w:tcPr>
+          <w:p>
+            <w:pPr>
+              <w:spacing w:line="240" w:lineRule="auto"/>
+            </w:pPr>
+            <w:r>
+              <w:rPr>
+                <w:rFonts w:ascii="Times New Roman" w:hAnsi="Times New Roman" w:eastAsia="Times New Roman"/>
+                <w:b w:val="0"/>
+                <w:caps w:val="0"/>
+                <w:sz w:val="22"/>
+              </w:rPr>
+              <w:t>0.232</w:t>
+            </w:r>
+          </w:p>
+        </w:tc>
+        <w:tc>
+          <w:tcPr>
+            <w:tcW w:type="dxa" w:w="1728"/>
+          </w:tcPr>
+          <w:p>
+            <w:pPr>
+              <w:spacing w:line="240" w:lineRule="auto"/>
+            </w:pPr>
+            <w:r>
+              <w:rPr>
+                <w:rFonts w:ascii="Times New Roman" w:hAnsi="Times New Roman" w:eastAsia="Times New Roman"/>
+                <w:b w:val="0"/>
+                <w:caps w:val="0"/>
+                <w:sz w:val="22"/>
+              </w:rPr>
+              <w:t>0.214 – 0.232</w:t>
+            </w:r>
+          </w:p>
+        </w:tc>
+        <w:tc>
+          <w:tcPr>
+            <w:tcW w:type="dxa" w:w="1728"/>
+          </w:tcPr>
+          <w:p>
+            <w:pPr>
+              <w:spacing w:line="240" w:lineRule="auto"/>
+            </w:pPr>
+            <w:r>
+              <w:rPr>
+                <w:rFonts w:ascii="Times New Roman" w:hAnsi="Times New Roman" w:eastAsia="Times New Roman"/>
+                <w:b w:val="0"/>
+                <w:caps w:val="0"/>
+                <w:sz w:val="22"/>
+              </w:rPr>
+              <w:t>0.018</w:t>
+            </w:r>
+          </w:p>
+        </w:tc>
+      </w:tr>
+    </w:tbl>
+    <w:p>
+      <w:pPr>
+        <w:spacing w:line="240" w:lineRule="auto" w:after="0"/>
+      </w:pPr>
+    </w:p>
+    <w:p>
+      <w:pPr>
+        <w:jc w:val="center"/>
+      </w:pPr>
+      <w:r>
+        <w:drawing>
+          <wp:inline xmlns:a="http://schemas.openxmlformats.org/drawingml/2006/main" xmlns:pic="http://schemas.openxmlformats.org/drawingml/2006/picture">
+            <wp:extent cx="5120640" cy="3172826"/>
+            <wp:docPr id="6" name="Picture 6"/>
+            <wp:cNvGraphicFramePr>
+              <a:graphicFrameLocks noChangeAspect="1"/>
+            </wp:cNvGraphicFramePr>
+            <a:graphic>
+              <a:graphicData uri="http://schemas.openxmlformats.org/drawingml/2006/picture">
+                <pic:pic>
+                  <pic:nvPicPr>
+                    <pic:cNvPr id="0" name="figura_6_ndjeshmeria_e_pragjeve.png"/>
+                    <pic:cNvPicPr/>
+                  </pic:nvPicPr>
+                  <pic:blipFill>
+                    <a:blip r:embed="rId17"/>
+                    <a:stretch>
+                      <a:fillRect/>
+                    </a:stretch>
+                  </pic:blipFill>
+                  <pic:spPr>
+                    <a:xfrm>
+                      <a:off x="0" y="0"/>
+                      <a:ext cx="5120640" cy="3172826"/>
+                    </a:xfrm>
+                    <a:prstGeom prst="rect"/>
+                  </pic:spPr>
+                </pic:pic>
+              </a:graphicData>
+            </a:graphic>
+          </wp:inline>
+        </w:drawing>
+      </w:r>
+    </w:p>
+    <w:p>
+      <w:pPr>
+        <w:spacing w:line="240" w:lineRule="auto"/>
+        <w:jc w:val="center"/>
+      </w:pPr>
+      <w:r>
+        <w:rPr>
+          <w:rFonts w:ascii="Times New Roman" w:hAnsi="Times New Roman" w:eastAsia="Times New Roman"/>
+          <w:b w:val="0"/>
+          <w:caps w:val="0"/>
+          <w:sz w:val="22"/>
+        </w:rPr>
+        <w:t>Figura 6. Ndjeshmëria e MCC-së ndaj zhvendosjes së pragjeve</w:t>
+      </w:r>
+    </w:p>
+    <w:p>
+      <w:pPr>
+        <w:spacing w:line="360" w:lineRule="auto"/>
+        <w:ind w:firstLine="360"/>
+        <w:jc w:val="both"/>
+      </w:pPr>
+      <w:r>
+        <w:rPr>
+          <w:rFonts w:ascii="Times New Roman" w:hAnsi="Times New Roman" w:eastAsia="Times New Roman"/>
+          <w:b w:val="0"/>
+          <w:caps w:val="0"/>
+          <w:sz w:val="24"/>
+        </w:rPr>
+        <w:t>Ndarja është e qartë. Për Blob dhe Data Class rezultati mezi lëviz, pra shifrat e raportuara për to flasin për kodin. Për Long Method dhe Feature Envy amplituda është e madhe, dhe kjo do të thotë se shifra e raportuar flet po aq për pragun sa për kodin — vërejtje që duhet mbajtur parasysh sa herë krahasohen mjete të ndryshme detektimi.</w:t>
+      </w:r>
+    </w:p>
+    <w:p>
+      <w:pPr>
+        <w:spacing w:line="360" w:lineRule="auto"/>
+        <w:ind w:firstLine="360"/>
+        <w:jc w:val="both"/>
+      </w:pPr>
+      <w:r>
+        <w:rPr>
+          <w:rFonts w:ascii="Times New Roman" w:hAnsi="Times New Roman" w:eastAsia="Times New Roman"/>
+          <w:b w:val="0"/>
+          <w:caps w:val="0"/>
+          <w:sz w:val="24"/>
+        </w:rPr>
+        <w:t>Te Long Method pragu i botuar rezulton konservativ për këtë korpus: ulja e tij e rrit ndjeshëm recall-in me kosto të vogël precizioni, çka sugjeron se rishikuesit e MLCQ-së e quajnë një metodë të gjatë më herët se sa e vendos pragu.</w:t>
+      </w:r>
+    </w:p>
+    <w:p>
+      <w:pPr>
+        <w:spacing w:line="360" w:lineRule="auto"/>
+        <w:ind w:firstLine="360"/>
+        <w:jc w:val="both"/>
+      </w:pPr>
+      <w:r>
+        <w:rPr>
+          <w:rFonts w:ascii="Times New Roman" w:hAnsi="Times New Roman" w:eastAsia="Times New Roman"/>
+          <w:b w:val="0"/>
+          <w:caps w:val="0"/>
+          <w:sz w:val="24"/>
+        </w:rPr>
+        <w:t>Te Feature Envy vërehet diçka më e veçantë. Klauzola që kërkon që numri i klasave-burim të jetë i vogël, kur relaksohet, i përmirëson njëkohësisht edhe precizionin edhe recall-in. Një kufizim që heq pozitivë të vërtetë pa hequr të rremë nuk po e ndan sinjalin nga zhurma; pra ajo klauzolë, të paktën mbi këtë korpus, nuk e bën punën për të cilën është vendosur.</w:t>
+      </w:r>
+    </w:p>
+    <w:p>
+      <w:pPr>
+        <w:spacing w:line="360" w:lineRule="auto"/>
+        <w:ind w:firstLine="360"/>
+        <w:jc w:val="both"/>
+      </w:pPr>
+      <w:r>
+        <w:rPr>
+          <w:rFonts w:ascii="Times New Roman" w:hAnsi="Times New Roman" w:eastAsia="Times New Roman"/>
+          <w:b w:val="0"/>
+          <w:caps w:val="0"/>
+          <w:sz w:val="24"/>
+        </w:rPr>
+        <w:t>Këto vlera nuk adoptohen. Zgjedhja e një pragu sepse jep shifrën më të mirë mbi bashkësinë e vlerësimit është përshtatje ndaj të dhënave të testimit, dhe numri që do të raportohej pas saj do të matte sa mirë u zgjodh pragu, jo sa mirë funksionon detektimi. Kalibrimi do të kërkonte një bashkësi të ndarë dhe një bashkësi tjetër të paprekur për vlerësim; kjo mbetet punë e ardhshme.</w:t>
+      </w:r>
+    </w:p>
+    <w:p>
+      <w:pPr>
         <w:pStyle w:val="Heading1"/>
         <w:pageBreakBefore/>
       </w:pPr>

</xml_diff>

<commit_message>
Lidh Kapitullin 5.4 me rezultatet e refaktorimit
Tabelat N/M/K, arsyet e refuzimit dhe verdiktet gjenerohen nga
refactoring_evaluation.json sapo ai te ekzistoje. Deri atehere seksioni e thote
hapur se ekzekutimi eshte ne vazhdim, ne vend qe te citoje numra te pjesshem si
perfundimtare.
</commit_message>
<xml_diff>
--- a/docs/thesis/Punim_Diplome_Florent_Latifi.docx
+++ b/docs/thesis/Punim_Diplome_Florent_Latifi.docx
@@ -5766,7 +5766,7 @@
           <w:caps w:val="0"/>
           <w:sz w:val="24"/>
         </w:rPr>
-        <w:t>[PLOTËSO: tabela përfundimtare pritet nga ekzekutimi mbi korpusin e plotë; ekzekutimi i pjesshëm mbi 150 skedarë dha 477 vende të detektuara dhe 127 të transformuara, me refuzimet e ndara në formë kodi (218), rrjedhë kontrolli që del nga blloku (112) dhe më shumë se një vlerë dalëse (20).]</w:t>
+        <w:t>[PLOTËSO: ekzekutimi mbi korpusin e plotë është ende në vazhdim; kjo tabelë gjenerohet automatikisht sapo të përfundojë.]</w:t>
       </w:r>
     </w:p>
     <w:p>
@@ -5782,7 +5782,23 @@
           <w:caps w:val="0"/>
           <w:sz w:val="24"/>
         </w:rPr>
-        <w:t>Verifikimi tregoi vlerën e vet menjëherë: ekzekutimi i parë shënoi njëmbëdhjetë rishkrime si prishëse, prej të cilave dhjetë ishin defekte të vërteta në motor. Ato u rregulluan dhe u mbuluan me teste regresioni; asnjëri prej tyre nuk ishte kapur nga testet e shkruara me dorë.</w:t>
+        <w:t>Verifikimi tregoi vlerën e vet menjëherë. Mbi ekzekutimet e para u shënuan si prishëse dhjetëra rishkrime, dhe hetimi i tyre nxori tri defekte të vërteta në motor: deklarimet brenda një cikli të mëparshëm numëroheshin si të dukshme, kllapat e stilit C pas emrit nuk hynin në tip, dhe një variabël e pacaktuar kalohej si parametër. Të treja prodhonin kod që nuk kompilon.</w:t>
+      </w:r>
+    </w:p>
+    <w:p>
+      <w:pPr>
+        <w:spacing w:line="360" w:lineRule="auto"/>
+        <w:ind w:firstLine="360"/>
+        <w:jc w:val="both"/>
+      </w:pPr>
+      <w:r>
+        <w:rPr>
+          <w:rFonts w:ascii="Times New Roman" w:hAnsi="Times New Roman" w:eastAsia="Times New Roman"/>
+          <w:b w:val="0"/>
+          <w:caps w:val="0"/>
+          <w:sz w:val="24"/>
+        </w:rPr>
+        <w:t>Asnjëri prej tyre nuk ishte kapur nga njëzet e një testet e shkruara me dorë për këtë transformim. I kapi korpusi. Kjo është arsyeja pse verifikimi empirik nuk zëvendësohet dot me teste njësie, sado të kujdesshme, dhe është vetë një gjetje e këtij punimi.</w:t>
       </w:r>
     </w:p>
     <w:p>

</xml_diff>

<commit_message>
Shto rezultatet e motorit te refaktorimit ne Kapitullin 5
15 991 vende te detektuara mbi 4 409 skedare, 3 495 te transformuara (21.9%).
Refuzimet ndahen ne forme kodi (45.6%), rrjedhe kontrolli qe del nga blloku
(26.2%), vlere e pacaktuar (3.9%) dhe me shume se nje vlere dalese (2.3%).
</commit_message>
<xml_diff>
--- a/docs/thesis/Punim_Diplome_Florent_Latifi.docx
+++ b/docs/thesis/Punim_Diplome_Florent_Latifi.docx
@@ -518,7 +518,7 @@
           <w:caps w:val="0"/>
           <w:sz w:val="24"/>
         </w:rPr>
-        <w:t>[PLOTËSO]: Ky paragraf përshkruan çka u ndërtua dhe si u vlerësua. Shkruhet pasi të përfundojnë eksperimentet, sepse duhet të përmbajë rezultate konkrete.</w:t>
+        <w:t>Ky punim ndërton një sistem që i zbulon code smells në dy mënyra të pavarura dhe i krahason mbi të njëjtën të vërtetë bazë. Qasja e parë zbaton strategjitë e publikuara të detektimit mbi njëzet e gjashtë metrika; e dyta trajnon klasifikues mbi po ato metrika. Të dyja vlerësohen mbi 4 534 mostra nga 522 depo Java, të etiketuara nga zhvillues profesionistë, me ndarje të grupuar sipas depos dhe me të njëjtin kod pikëzimi. Sistemi përfshin edhe një motor refaktorimi që rishkruan kod vetëm kur i provon parakushtet e veta nga pema sintaksore, dhe një ndërfaqe web mbi të tria.</w:t>
       </w:r>
     </w:p>
     <w:p>
@@ -534,7 +534,7 @@
           <w:caps w:val="0"/>
           <w:sz w:val="24"/>
         </w:rPr>
-        <w:t>[PLOTËSO]: Ky paragraf përmbledh gjetjet kryesore dhe përfundimin.</w:t>
+        <w:t>Strategjitë e publikuara dolën të sakta por të kursyera: precizion 0.52 deri 0.87 me recall 0.10 deri 0.44. Të ndara sipas ashpërsisë, ato degradojnë me hijeshi, duke i kapur rastet e rënda shumë më mirë se ato të lehtat. Klasifikuesit i tejkaluan qartë, me MCC nga 0.488 te 0.713 kundrejt 0.232 deri 0.580, dhe i rizbuluan pjesërisht metrikat që përdorin vetë strategjitë. Motori i refaktorimit transformoi një pjesë të matur të rasteve të detektuara, ku shumica e refuzimeve vjen nga forma e kodit dhe nga rrjedha e kontrollit. Kontributi kryesor nuk është një shifër e vetme, por një hark i plotë e i riprodhueshëm nga korpusi te rezultati.</w:t>
       </w:r>
     </w:p>
     <w:p>
@@ -826,6 +826,54 @@
           <w:sz w:val="24"/>
         </w:rPr>
         <w:t>Tabela 5. Sa lëviz MCC-ja kur zhvendoset një prag</w:t>
+      </w:r>
+    </w:p>
+    <w:p>
+      <w:pPr>
+        <w:spacing w:line="360" w:lineRule="auto"/>
+        <w:ind w:firstLine="360"/>
+        <w:jc w:val="both"/>
+      </w:pPr>
+      <w:r>
+        <w:rPr>
+          <w:rFonts w:ascii="Times New Roman" w:hAnsi="Times New Roman" w:eastAsia="Times New Roman"/>
+          <w:b w:val="0"/>
+          <w:caps w:val="0"/>
+          <w:sz w:val="24"/>
+        </w:rPr>
+        <w:t>Tabela 6. Rezultati i motorit të refaktorimit</w:t>
+      </w:r>
+    </w:p>
+    <w:p>
+      <w:pPr>
+        <w:spacing w:line="360" w:lineRule="auto"/>
+        <w:ind w:firstLine="360"/>
+        <w:jc w:val="both"/>
+      </w:pPr>
+      <w:r>
+        <w:rPr>
+          <w:rFonts w:ascii="Times New Roman" w:hAnsi="Times New Roman" w:eastAsia="Times New Roman"/>
+          <w:b w:val="0"/>
+          <w:caps w:val="0"/>
+          <w:sz w:val="24"/>
+        </w:rPr>
+        <w:t>Tabela 7. Pse u refuzuan</w:t>
+      </w:r>
+    </w:p>
+    <w:p>
+      <w:pPr>
+        <w:spacing w:line="360" w:lineRule="auto"/>
+        <w:ind w:firstLine="360"/>
+        <w:jc w:val="both"/>
+      </w:pPr>
+      <w:r>
+        <w:rPr>
+          <w:rFonts w:ascii="Times New Roman" w:hAnsi="Times New Roman" w:eastAsia="Times New Roman"/>
+          <w:b w:val="0"/>
+          <w:caps w:val="0"/>
+          <w:sz w:val="24"/>
+        </w:rPr>
+        <w:t>Tabela 8. Verifikimi i atyre që u aplikuan</w:t>
       </w:r>
     </w:p>
     <w:p>
@@ -5766,7 +5814,1018 @@
           <w:caps w:val="0"/>
           <w:sz w:val="24"/>
         </w:rPr>
-        <w:t>[PLOTËSO: ekzekutimi mbi korpusin e plotë është ende në vazhdim; kjo tabelë gjenerohet automatikisht sapo të përfundojë.]</w:t>
+        <w:t>Mbi 4409 skedarë të korpusit u detektuan 15991 vende ku motori ka një transformim; prej tyre 3495 u transformuan.</w:t>
+      </w:r>
+    </w:p>
+    <w:p>
+      <w:pPr>
+        <w:spacing w:line="240" w:lineRule="auto"/>
+        <w:jc w:val="center"/>
+      </w:pPr>
+      <w:r>
+        <w:rPr>
+          <w:rFonts w:ascii="Times New Roman" w:hAnsi="Times New Roman" w:eastAsia="Times New Roman"/>
+          <w:b w:val="0"/>
+          <w:caps w:val="0"/>
+          <w:sz w:val="22"/>
+        </w:rPr>
+        <w:t>Tabela 6. Rezultati i motorit të refaktorimit</w:t>
+      </w:r>
+    </w:p>
+    <w:tbl>
+      <w:tblPr>
+        <w:tblStyle w:val="TableGrid"/>
+        <w:tblW w:type="auto" w:w="0"/>
+        <w:tblLook w:firstColumn="1" w:firstRow="1" w:lastColumn="0" w:lastRow="0" w:noHBand="0" w:noVBand="1" w:val="04A0"/>
+      </w:tblPr>
+      <w:tblGrid>
+        <w:gridCol w:w="2880"/>
+        <w:gridCol w:w="2880"/>
+        <w:gridCol w:w="2880"/>
+      </w:tblGrid>
+      <w:tr>
+        <w:tc>
+          <w:tcPr>
+            <w:tcW w:type="dxa" w:w="2880"/>
+          </w:tcPr>
+          <w:p>
+            <w:pPr>
+              <w:spacing w:line="240" w:lineRule="auto"/>
+            </w:pPr>
+            <w:r>
+              <w:rPr>
+                <w:rFonts w:ascii="Times New Roman" w:hAnsi="Times New Roman" w:eastAsia="Times New Roman"/>
+                <w:b/>
+                <w:caps w:val="0"/>
+                <w:sz w:val="22"/>
+              </w:rPr>
+            </w:r>
+          </w:p>
+        </w:tc>
+        <w:tc>
+          <w:tcPr>
+            <w:tcW w:type="dxa" w:w="2880"/>
+          </w:tcPr>
+          <w:p>
+            <w:pPr>
+              <w:spacing w:line="240" w:lineRule="auto"/>
+            </w:pPr>
+            <w:r>
+              <w:rPr>
+                <w:rFonts w:ascii="Times New Roman" w:hAnsi="Times New Roman" w:eastAsia="Times New Roman"/>
+                <w:b/>
+                <w:caps w:val="0"/>
+                <w:sz w:val="22"/>
+              </w:rPr>
+              <w:t>Numri</w:t>
+            </w:r>
+          </w:p>
+        </w:tc>
+        <w:tc>
+          <w:tcPr>
+            <w:tcW w:type="dxa" w:w="2880"/>
+          </w:tcPr>
+          <w:p>
+            <w:pPr>
+              <w:spacing w:line="240" w:lineRule="auto"/>
+            </w:pPr>
+            <w:r>
+              <w:rPr>
+                <w:rFonts w:ascii="Times New Roman" w:hAnsi="Times New Roman" w:eastAsia="Times New Roman"/>
+                <w:b/>
+                <w:caps w:val="0"/>
+                <w:sz w:val="22"/>
+              </w:rPr>
+              <w:t>Pjesa</w:t>
+            </w:r>
+          </w:p>
+        </w:tc>
+      </w:tr>
+      <w:tr>
+        <w:tc>
+          <w:tcPr>
+            <w:tcW w:type="dxa" w:w="2880"/>
+          </w:tcPr>
+          <w:p>
+            <w:pPr>
+              <w:spacing w:line="240" w:lineRule="auto"/>
+            </w:pPr>
+            <w:r>
+              <w:rPr>
+                <w:rFonts w:ascii="Times New Roman" w:hAnsi="Times New Roman" w:eastAsia="Times New Roman"/>
+                <w:b w:val="0"/>
+                <w:caps w:val="0"/>
+                <w:sz w:val="22"/>
+              </w:rPr>
+              <w:t>Vende të detektuara</w:t>
+            </w:r>
+          </w:p>
+        </w:tc>
+        <w:tc>
+          <w:tcPr>
+            <w:tcW w:type="dxa" w:w="2880"/>
+          </w:tcPr>
+          <w:p>
+            <w:pPr>
+              <w:spacing w:line="240" w:lineRule="auto"/>
+            </w:pPr>
+            <w:r>
+              <w:rPr>
+                <w:rFonts w:ascii="Times New Roman" w:hAnsi="Times New Roman" w:eastAsia="Times New Roman"/>
+                <w:b w:val="0"/>
+                <w:caps w:val="0"/>
+                <w:sz w:val="22"/>
+              </w:rPr>
+              <w:t>15991</w:t>
+            </w:r>
+          </w:p>
+        </w:tc>
+        <w:tc>
+          <w:tcPr>
+            <w:tcW w:type="dxa" w:w="2880"/>
+          </w:tcPr>
+          <w:p>
+            <w:pPr>
+              <w:spacing w:line="240" w:lineRule="auto"/>
+            </w:pPr>
+            <w:r>
+              <w:rPr>
+                <w:rFonts w:ascii="Times New Roman" w:hAnsi="Times New Roman" w:eastAsia="Times New Roman"/>
+                <w:b w:val="0"/>
+                <w:caps w:val="0"/>
+                <w:sz w:val="22"/>
+              </w:rPr>
+              <w:t>100%</w:t>
+            </w:r>
+          </w:p>
+        </w:tc>
+      </w:tr>
+      <w:tr>
+        <w:tc>
+          <w:tcPr>
+            <w:tcW w:type="dxa" w:w="2880"/>
+          </w:tcPr>
+          <w:p>
+            <w:pPr>
+              <w:spacing w:line="240" w:lineRule="auto"/>
+            </w:pPr>
+            <w:r>
+              <w:rPr>
+                <w:rFonts w:ascii="Times New Roman" w:hAnsi="Times New Roman" w:eastAsia="Times New Roman"/>
+                <w:b w:val="0"/>
+                <w:caps w:val="0"/>
+                <w:sz w:val="22"/>
+              </w:rPr>
+              <w:t>Të transformuara</w:t>
+            </w:r>
+          </w:p>
+        </w:tc>
+        <w:tc>
+          <w:tcPr>
+            <w:tcW w:type="dxa" w:w="2880"/>
+          </w:tcPr>
+          <w:p>
+            <w:pPr>
+              <w:spacing w:line="240" w:lineRule="auto"/>
+            </w:pPr>
+            <w:r>
+              <w:rPr>
+                <w:rFonts w:ascii="Times New Roman" w:hAnsi="Times New Roman" w:eastAsia="Times New Roman"/>
+                <w:b w:val="0"/>
+                <w:caps w:val="0"/>
+                <w:sz w:val="22"/>
+              </w:rPr>
+              <w:t>3495</w:t>
+            </w:r>
+          </w:p>
+        </w:tc>
+        <w:tc>
+          <w:tcPr>
+            <w:tcW w:type="dxa" w:w="2880"/>
+          </w:tcPr>
+          <w:p>
+            <w:pPr>
+              <w:spacing w:line="240" w:lineRule="auto"/>
+            </w:pPr>
+            <w:r>
+              <w:rPr>
+                <w:rFonts w:ascii="Times New Roman" w:hAnsi="Times New Roman" w:eastAsia="Times New Roman"/>
+                <w:b w:val="0"/>
+                <w:caps w:val="0"/>
+                <w:sz w:val="22"/>
+              </w:rPr>
+              <w:t>21.9%</w:t>
+            </w:r>
+          </w:p>
+        </w:tc>
+      </w:tr>
+      <w:tr>
+        <w:tc>
+          <w:tcPr>
+            <w:tcW w:type="dxa" w:w="2880"/>
+          </w:tcPr>
+          <w:p>
+            <w:pPr>
+              <w:spacing w:line="240" w:lineRule="auto"/>
+            </w:pPr>
+            <w:r>
+              <w:rPr>
+                <w:rFonts w:ascii="Times New Roman" w:hAnsi="Times New Roman" w:eastAsia="Times New Roman"/>
+                <w:b w:val="0"/>
+                <w:caps w:val="0"/>
+                <w:sz w:val="22"/>
+              </w:rPr>
+              <w:t>Të refuzuara</w:t>
+            </w:r>
+          </w:p>
+        </w:tc>
+        <w:tc>
+          <w:tcPr>
+            <w:tcW w:type="dxa" w:w="2880"/>
+          </w:tcPr>
+          <w:p>
+            <w:pPr>
+              <w:spacing w:line="240" w:lineRule="auto"/>
+            </w:pPr>
+            <w:r>
+              <w:rPr>
+                <w:rFonts w:ascii="Times New Roman" w:hAnsi="Times New Roman" w:eastAsia="Times New Roman"/>
+                <w:b w:val="0"/>
+                <w:caps w:val="0"/>
+                <w:sz w:val="22"/>
+              </w:rPr>
+              <w:t>12479</w:t>
+            </w:r>
+          </w:p>
+        </w:tc>
+        <w:tc>
+          <w:tcPr>
+            <w:tcW w:type="dxa" w:w="2880"/>
+          </w:tcPr>
+          <w:p>
+            <w:pPr>
+              <w:spacing w:line="240" w:lineRule="auto"/>
+            </w:pPr>
+            <w:r>
+              <w:rPr>
+                <w:rFonts w:ascii="Times New Roman" w:hAnsi="Times New Roman" w:eastAsia="Times New Roman"/>
+                <w:b w:val="0"/>
+                <w:caps w:val="0"/>
+                <w:sz w:val="22"/>
+              </w:rPr>
+              <w:t>78.0%</w:t>
+            </w:r>
+          </w:p>
+        </w:tc>
+      </w:tr>
+      <w:tr>
+        <w:tc>
+          <w:tcPr>
+            <w:tcW w:type="dxa" w:w="2880"/>
+          </w:tcPr>
+          <w:p>
+            <w:pPr>
+              <w:spacing w:line="240" w:lineRule="auto"/>
+            </w:pPr>
+            <w:r>
+              <w:rPr>
+                <w:rFonts w:ascii="Times New Roman" w:hAnsi="Times New Roman" w:eastAsia="Times New Roman"/>
+                <w:b w:val="0"/>
+                <w:caps w:val="0"/>
+                <w:sz w:val="22"/>
+              </w:rPr>
+              <w:t>Të palokalizueshme</w:t>
+            </w:r>
+          </w:p>
+        </w:tc>
+        <w:tc>
+          <w:tcPr>
+            <w:tcW w:type="dxa" w:w="2880"/>
+          </w:tcPr>
+          <w:p>
+            <w:pPr>
+              <w:spacing w:line="240" w:lineRule="auto"/>
+            </w:pPr>
+            <w:r>
+              <w:rPr>
+                <w:rFonts w:ascii="Times New Roman" w:hAnsi="Times New Roman" w:eastAsia="Times New Roman"/>
+                <w:b w:val="0"/>
+                <w:caps w:val="0"/>
+                <w:sz w:val="22"/>
+              </w:rPr>
+              <w:t>17</w:t>
+            </w:r>
+          </w:p>
+        </w:tc>
+        <w:tc>
+          <w:tcPr>
+            <w:tcW w:type="dxa" w:w="2880"/>
+          </w:tcPr>
+          <w:p>
+            <w:pPr>
+              <w:spacing w:line="240" w:lineRule="auto"/>
+            </w:pPr>
+            <w:r>
+              <w:rPr>
+                <w:rFonts w:ascii="Times New Roman" w:hAnsi="Times New Roman" w:eastAsia="Times New Roman"/>
+                <w:b w:val="0"/>
+                <w:caps w:val="0"/>
+                <w:sz w:val="22"/>
+              </w:rPr>
+            </w:r>
+          </w:p>
+        </w:tc>
+      </w:tr>
+    </w:tbl>
+    <w:p>
+      <w:pPr>
+        <w:spacing w:line="240" w:lineRule="auto" w:after="0"/>
+      </w:pPr>
+    </w:p>
+    <w:p>
+      <w:pPr>
+        <w:spacing w:line="360" w:lineRule="auto"/>
+        <w:ind w:firstLine="360"/>
+        <w:jc w:val="both"/>
+      </w:pPr>
+      <w:r>
+        <w:rPr>
+          <w:rFonts w:ascii="Times New Roman" w:hAnsi="Times New Roman" w:eastAsia="Times New Roman"/>
+          <w:b w:val="0"/>
+          <w:caps w:val="0"/>
+          <w:sz w:val="24"/>
+        </w:rPr>
+        <w:t>Shpërndarja e arsyeve të refuzimit është vetë rezultat: ajo tregon çfarë e pengon automatizimin, dhe jo se ku dështon zbatimi.</w:t>
+      </w:r>
+    </w:p>
+    <w:p>
+      <w:pPr>
+        <w:spacing w:line="240" w:lineRule="auto"/>
+        <w:jc w:val="center"/>
+      </w:pPr>
+      <w:r>
+        <w:rPr>
+          <w:rFonts w:ascii="Times New Roman" w:hAnsi="Times New Roman" w:eastAsia="Times New Roman"/>
+          <w:b w:val="0"/>
+          <w:caps w:val="0"/>
+          <w:sz w:val="22"/>
+        </w:rPr>
+        <w:t>Tabela 7. Pse u refuzuan</w:t>
+      </w:r>
+    </w:p>
+    <w:tbl>
+      <w:tblPr>
+        <w:tblStyle w:val="TableGrid"/>
+        <w:tblW w:type="auto" w:w="0"/>
+        <w:tblLook w:firstColumn="1" w:firstRow="1" w:lastColumn="0" w:lastRow="0" w:noHBand="0" w:noVBand="1" w:val="04A0"/>
+      </w:tblPr>
+      <w:tblGrid>
+        <w:gridCol w:w="2880"/>
+        <w:gridCol w:w="2880"/>
+        <w:gridCol w:w="2880"/>
+      </w:tblGrid>
+      <w:tr>
+        <w:tc>
+          <w:tcPr>
+            <w:tcW w:type="dxa" w:w="2880"/>
+          </w:tcPr>
+          <w:p>
+            <w:pPr>
+              <w:spacing w:line="240" w:lineRule="auto"/>
+            </w:pPr>
+            <w:r>
+              <w:rPr>
+                <w:rFonts w:ascii="Times New Roman" w:hAnsi="Times New Roman" w:eastAsia="Times New Roman"/>
+                <w:b/>
+                <w:caps w:val="0"/>
+                <w:sz w:val="22"/>
+              </w:rPr>
+              <w:t>Arsyeja</w:t>
+            </w:r>
+          </w:p>
+        </w:tc>
+        <w:tc>
+          <w:tcPr>
+            <w:tcW w:type="dxa" w:w="2880"/>
+          </w:tcPr>
+          <w:p>
+            <w:pPr>
+              <w:spacing w:line="240" w:lineRule="auto"/>
+            </w:pPr>
+            <w:r>
+              <w:rPr>
+                <w:rFonts w:ascii="Times New Roman" w:hAnsi="Times New Roman" w:eastAsia="Times New Roman"/>
+                <w:b/>
+                <w:caps w:val="0"/>
+                <w:sz w:val="22"/>
+              </w:rPr>
+              <w:t>Numri</w:t>
+            </w:r>
+          </w:p>
+        </w:tc>
+        <w:tc>
+          <w:tcPr>
+            <w:tcW w:type="dxa" w:w="2880"/>
+          </w:tcPr>
+          <w:p>
+            <w:pPr>
+              <w:spacing w:line="240" w:lineRule="auto"/>
+            </w:pPr>
+            <w:r>
+              <w:rPr>
+                <w:rFonts w:ascii="Times New Roman" w:hAnsi="Times New Roman" w:eastAsia="Times New Roman"/>
+                <w:b/>
+                <w:caps w:val="0"/>
+                <w:sz w:val="22"/>
+              </w:rPr>
+              <w:t>Pjesa e vendeve</w:t>
+            </w:r>
+          </w:p>
+        </w:tc>
+      </w:tr>
+      <w:tr>
+        <w:tc>
+          <w:tcPr>
+            <w:tcW w:type="dxa" w:w="2880"/>
+          </w:tcPr>
+          <w:p>
+            <w:pPr>
+              <w:spacing w:line="240" w:lineRule="auto"/>
+            </w:pPr>
+            <w:r>
+              <w:rPr>
+                <w:rFonts w:ascii="Times New Roman" w:hAnsi="Times New Roman" w:eastAsia="Times New Roman"/>
+                <w:b w:val="0"/>
+                <w:caps w:val="0"/>
+                <w:sz w:val="22"/>
+              </w:rPr>
+              <w:t>shape not matched</w:t>
+            </w:r>
+          </w:p>
+        </w:tc>
+        <w:tc>
+          <w:tcPr>
+            <w:tcW w:type="dxa" w:w="2880"/>
+          </w:tcPr>
+          <w:p>
+            <w:pPr>
+              <w:spacing w:line="240" w:lineRule="auto"/>
+            </w:pPr>
+            <w:r>
+              <w:rPr>
+                <w:rFonts w:ascii="Times New Roman" w:hAnsi="Times New Roman" w:eastAsia="Times New Roman"/>
+                <w:b w:val="0"/>
+                <w:caps w:val="0"/>
+                <w:sz w:val="22"/>
+              </w:rPr>
+              <w:t>7298</w:t>
+            </w:r>
+          </w:p>
+        </w:tc>
+        <w:tc>
+          <w:tcPr>
+            <w:tcW w:type="dxa" w:w="2880"/>
+          </w:tcPr>
+          <w:p>
+            <w:pPr>
+              <w:spacing w:line="240" w:lineRule="auto"/>
+            </w:pPr>
+            <w:r>
+              <w:rPr>
+                <w:rFonts w:ascii="Times New Roman" w:hAnsi="Times New Roman" w:eastAsia="Times New Roman"/>
+                <w:b w:val="0"/>
+                <w:caps w:val="0"/>
+                <w:sz w:val="22"/>
+              </w:rPr>
+              <w:t>45.6%</w:t>
+            </w:r>
+          </w:p>
+        </w:tc>
+      </w:tr>
+      <w:tr>
+        <w:tc>
+          <w:tcPr>
+            <w:tcW w:type="dxa" w:w="2880"/>
+          </w:tcPr>
+          <w:p>
+            <w:pPr>
+              <w:spacing w:line="240" w:lineRule="auto"/>
+            </w:pPr>
+            <w:r>
+              <w:rPr>
+                <w:rFonts w:ascii="Times New Roman" w:hAnsi="Times New Roman" w:eastAsia="Times New Roman"/>
+                <w:b w:val="0"/>
+                <w:caps w:val="0"/>
+                <w:sz w:val="22"/>
+              </w:rPr>
+              <w:t>control flow escapes</w:t>
+            </w:r>
+          </w:p>
+        </w:tc>
+        <w:tc>
+          <w:tcPr>
+            <w:tcW w:type="dxa" w:w="2880"/>
+          </w:tcPr>
+          <w:p>
+            <w:pPr>
+              <w:spacing w:line="240" w:lineRule="auto"/>
+            </w:pPr>
+            <w:r>
+              <w:rPr>
+                <w:rFonts w:ascii="Times New Roman" w:hAnsi="Times New Roman" w:eastAsia="Times New Roman"/>
+                <w:b w:val="0"/>
+                <w:caps w:val="0"/>
+                <w:sz w:val="22"/>
+              </w:rPr>
+              <w:t>4185</w:t>
+            </w:r>
+          </w:p>
+        </w:tc>
+        <w:tc>
+          <w:tcPr>
+            <w:tcW w:type="dxa" w:w="2880"/>
+          </w:tcPr>
+          <w:p>
+            <w:pPr>
+              <w:spacing w:line="240" w:lineRule="auto"/>
+            </w:pPr>
+            <w:r>
+              <w:rPr>
+                <w:rFonts w:ascii="Times New Roman" w:hAnsi="Times New Roman" w:eastAsia="Times New Roman"/>
+                <w:b w:val="0"/>
+                <w:caps w:val="0"/>
+                <w:sz w:val="22"/>
+              </w:rPr>
+              <w:t>26.2%</w:t>
+            </w:r>
+          </w:p>
+        </w:tc>
+      </w:tr>
+      <w:tr>
+        <w:tc>
+          <w:tcPr>
+            <w:tcW w:type="dxa" w:w="2880"/>
+          </w:tcPr>
+          <w:p>
+            <w:pPr>
+              <w:spacing w:line="240" w:lineRule="auto"/>
+            </w:pPr>
+            <w:r>
+              <w:rPr>
+                <w:rFonts w:ascii="Times New Roman" w:hAnsi="Times New Roman" w:eastAsia="Times New Roman"/>
+                <w:b w:val="0"/>
+                <w:caps w:val="0"/>
+                <w:sz w:val="22"/>
+              </w:rPr>
+              <w:t>not definitely assigned</w:t>
+            </w:r>
+          </w:p>
+        </w:tc>
+        <w:tc>
+          <w:tcPr>
+            <w:tcW w:type="dxa" w:w="2880"/>
+          </w:tcPr>
+          <w:p>
+            <w:pPr>
+              <w:spacing w:line="240" w:lineRule="auto"/>
+            </w:pPr>
+            <w:r>
+              <w:rPr>
+                <w:rFonts w:ascii="Times New Roman" w:hAnsi="Times New Roman" w:eastAsia="Times New Roman"/>
+                <w:b w:val="0"/>
+                <w:caps w:val="0"/>
+                <w:sz w:val="22"/>
+              </w:rPr>
+              <w:t>628</w:t>
+            </w:r>
+          </w:p>
+        </w:tc>
+        <w:tc>
+          <w:tcPr>
+            <w:tcW w:type="dxa" w:w="2880"/>
+          </w:tcPr>
+          <w:p>
+            <w:pPr>
+              <w:spacing w:line="240" w:lineRule="auto"/>
+            </w:pPr>
+            <w:r>
+              <w:rPr>
+                <w:rFonts w:ascii="Times New Roman" w:hAnsi="Times New Roman" w:eastAsia="Times New Roman"/>
+                <w:b w:val="0"/>
+                <w:caps w:val="0"/>
+                <w:sz w:val="22"/>
+              </w:rPr>
+              <w:t>3.9%</w:t>
+            </w:r>
+          </w:p>
+        </w:tc>
+      </w:tr>
+      <w:tr>
+        <w:tc>
+          <w:tcPr>
+            <w:tcW w:type="dxa" w:w="2880"/>
+          </w:tcPr>
+          <w:p>
+            <w:pPr>
+              <w:spacing w:line="240" w:lineRule="auto"/>
+            </w:pPr>
+            <w:r>
+              <w:rPr>
+                <w:rFonts w:ascii="Times New Roman" w:hAnsi="Times New Roman" w:eastAsia="Times New Roman"/>
+                <w:b w:val="0"/>
+                <w:caps w:val="0"/>
+                <w:sz w:val="22"/>
+              </w:rPr>
+              <w:t>multiple outputs</w:t>
+            </w:r>
+          </w:p>
+        </w:tc>
+        <w:tc>
+          <w:tcPr>
+            <w:tcW w:type="dxa" w:w="2880"/>
+          </w:tcPr>
+          <w:p>
+            <w:pPr>
+              <w:spacing w:line="240" w:lineRule="auto"/>
+            </w:pPr>
+            <w:r>
+              <w:rPr>
+                <w:rFonts w:ascii="Times New Roman" w:hAnsi="Times New Roman" w:eastAsia="Times New Roman"/>
+                <w:b w:val="0"/>
+                <w:caps w:val="0"/>
+                <w:sz w:val="22"/>
+              </w:rPr>
+              <w:t>368</w:t>
+            </w:r>
+          </w:p>
+        </w:tc>
+        <w:tc>
+          <w:tcPr>
+            <w:tcW w:type="dxa" w:w="2880"/>
+          </w:tcPr>
+          <w:p>
+            <w:pPr>
+              <w:spacing w:line="240" w:lineRule="auto"/>
+            </w:pPr>
+            <w:r>
+              <w:rPr>
+                <w:rFonts w:ascii="Times New Roman" w:hAnsi="Times New Roman" w:eastAsia="Times New Roman"/>
+                <w:b w:val="0"/>
+                <w:caps w:val="0"/>
+                <w:sz w:val="22"/>
+              </w:rPr>
+              <w:t>2.3%</w:t>
+            </w:r>
+          </w:p>
+        </w:tc>
+      </w:tr>
+    </w:tbl>
+    <w:p>
+      <w:pPr>
+        <w:spacing w:line="240" w:lineRule="auto" w:after="0"/>
+      </w:pPr>
+    </w:p>
+    <w:p>
+      <w:pPr>
+        <w:spacing w:line="240" w:lineRule="auto"/>
+        <w:jc w:val="center"/>
+      </w:pPr>
+      <w:r>
+        <w:rPr>
+          <w:rFonts w:ascii="Times New Roman" w:hAnsi="Times New Roman" w:eastAsia="Times New Roman"/>
+          <w:b w:val="0"/>
+          <w:caps w:val="0"/>
+          <w:sz w:val="22"/>
+        </w:rPr>
+        <w:t>Tabela 8. Verifikimi i atyre që u aplikuan</w:t>
+      </w:r>
+    </w:p>
+    <w:tbl>
+      <w:tblPr>
+        <w:tblStyle w:val="TableGrid"/>
+        <w:tblW w:type="auto" w:w="0"/>
+        <w:tblLook w:firstColumn="1" w:firstRow="1" w:lastColumn="0" w:lastRow="0" w:noHBand="0" w:noVBand="1" w:val="04A0"/>
+      </w:tblPr>
+      <w:tblGrid>
+        <w:gridCol w:w="2880"/>
+        <w:gridCol w:w="2880"/>
+        <w:gridCol w:w="2880"/>
+      </w:tblGrid>
+      <w:tr>
+        <w:tc>
+          <w:tcPr>
+            <w:tcW w:type="dxa" w:w="2880"/>
+          </w:tcPr>
+          <w:p>
+            <w:pPr>
+              <w:spacing w:line="240" w:lineRule="auto"/>
+            </w:pPr>
+            <w:r>
+              <w:rPr>
+                <w:rFonts w:ascii="Times New Roman" w:hAnsi="Times New Roman" w:eastAsia="Times New Roman"/>
+                <w:b/>
+                <w:caps w:val="0"/>
+                <w:sz w:val="22"/>
+              </w:rPr>
+              <w:t>Verdikti</w:t>
+            </w:r>
+          </w:p>
+        </w:tc>
+        <w:tc>
+          <w:tcPr>
+            <w:tcW w:type="dxa" w:w="2880"/>
+          </w:tcPr>
+          <w:p>
+            <w:pPr>
+              <w:spacing w:line="240" w:lineRule="auto"/>
+            </w:pPr>
+            <w:r>
+              <w:rPr>
+                <w:rFonts w:ascii="Times New Roman" w:hAnsi="Times New Roman" w:eastAsia="Times New Roman"/>
+                <w:b/>
+                <w:caps w:val="0"/>
+                <w:sz w:val="22"/>
+              </w:rPr>
+              <w:t>Numri</w:t>
+            </w:r>
+          </w:p>
+        </w:tc>
+        <w:tc>
+          <w:tcPr>
+            <w:tcW w:type="dxa" w:w="2880"/>
+          </w:tcPr>
+          <w:p>
+            <w:pPr>
+              <w:spacing w:line="240" w:lineRule="auto"/>
+            </w:pPr>
+            <w:r>
+              <w:rPr>
+                <w:rFonts w:ascii="Times New Roman" w:hAnsi="Times New Roman" w:eastAsia="Times New Roman"/>
+                <w:b/>
+                <w:caps w:val="0"/>
+                <w:sz w:val="22"/>
+              </w:rPr>
+              <w:t>Pjesa e të aplikuarave</w:t>
+            </w:r>
+          </w:p>
+        </w:tc>
+      </w:tr>
+      <w:tr>
+        <w:tc>
+          <w:tcPr>
+            <w:tcW w:type="dxa" w:w="2880"/>
+          </w:tcPr>
+          <w:p>
+            <w:pPr>
+              <w:spacing w:line="240" w:lineRule="auto"/>
+            </w:pPr>
+            <w:r>
+              <w:rPr>
+                <w:rFonts w:ascii="Times New Roman" w:hAnsi="Times New Roman" w:eastAsia="Times New Roman"/>
+                <w:b w:val="0"/>
+                <w:caps w:val="0"/>
+                <w:sz w:val="22"/>
+              </w:rPr>
+              <w:t>no new errors</w:t>
+            </w:r>
+          </w:p>
+        </w:tc>
+        <w:tc>
+          <w:tcPr>
+            <w:tcW w:type="dxa" w:w="2880"/>
+          </w:tcPr>
+          <w:p>
+            <w:pPr>
+              <w:spacing w:line="240" w:lineRule="auto"/>
+            </w:pPr>
+            <w:r>
+              <w:rPr>
+                <w:rFonts w:ascii="Times New Roman" w:hAnsi="Times New Roman" w:eastAsia="Times New Roman"/>
+                <w:b w:val="0"/>
+                <w:caps w:val="0"/>
+                <w:sz w:val="22"/>
+              </w:rPr>
+              <w:t>3421</w:t>
+            </w:r>
+          </w:p>
+        </w:tc>
+        <w:tc>
+          <w:tcPr>
+            <w:tcW w:type="dxa" w:w="2880"/>
+          </w:tcPr>
+          <w:p>
+            <w:pPr>
+              <w:spacing w:line="240" w:lineRule="auto"/>
+            </w:pPr>
+            <w:r>
+              <w:rPr>
+                <w:rFonts w:ascii="Times New Roman" w:hAnsi="Times New Roman" w:eastAsia="Times New Roman"/>
+                <w:b w:val="0"/>
+                <w:caps w:val="0"/>
+                <w:sz w:val="22"/>
+              </w:rPr>
+              <w:t>97.9%</w:t>
+            </w:r>
+          </w:p>
+        </w:tc>
+      </w:tr>
+      <w:tr>
+        <w:tc>
+          <w:tcPr>
+            <w:tcW w:type="dxa" w:w="2880"/>
+          </w:tcPr>
+          <w:p>
+            <w:pPr>
+              <w:spacing w:line="240" w:lineRule="auto"/>
+            </w:pPr>
+            <w:r>
+              <w:rPr>
+                <w:rFonts w:ascii="Times New Roman" w:hAnsi="Times New Roman" w:eastAsia="Times New Roman"/>
+                <w:b w:val="0"/>
+                <w:caps w:val="0"/>
+                <w:sz w:val="22"/>
+              </w:rPr>
+              <w:t>new errors</w:t>
+            </w:r>
+          </w:p>
+        </w:tc>
+        <w:tc>
+          <w:tcPr>
+            <w:tcW w:type="dxa" w:w="2880"/>
+          </w:tcPr>
+          <w:p>
+            <w:pPr>
+              <w:spacing w:line="240" w:lineRule="auto"/>
+            </w:pPr>
+            <w:r>
+              <w:rPr>
+                <w:rFonts w:ascii="Times New Roman" w:hAnsi="Times New Roman" w:eastAsia="Times New Roman"/>
+                <w:b w:val="0"/>
+                <w:caps w:val="0"/>
+                <w:sz w:val="22"/>
+              </w:rPr>
+              <w:t>60</w:t>
+            </w:r>
+          </w:p>
+        </w:tc>
+        <w:tc>
+          <w:tcPr>
+            <w:tcW w:type="dxa" w:w="2880"/>
+          </w:tcPr>
+          <w:p>
+            <w:pPr>
+              <w:spacing w:line="240" w:lineRule="auto"/>
+            </w:pPr>
+            <w:r>
+              <w:rPr>
+                <w:rFonts w:ascii="Times New Roman" w:hAnsi="Times New Roman" w:eastAsia="Times New Roman"/>
+                <w:b w:val="0"/>
+                <w:caps w:val="0"/>
+                <w:sz w:val="22"/>
+              </w:rPr>
+              <w:t>1.7%</w:t>
+            </w:r>
+          </w:p>
+        </w:tc>
+      </w:tr>
+      <w:tr>
+        <w:tc>
+          <w:tcPr>
+            <w:tcW w:type="dxa" w:w="2880"/>
+          </w:tcPr>
+          <w:p>
+            <w:pPr>
+              <w:spacing w:line="240" w:lineRule="auto"/>
+            </w:pPr>
+            <w:r>
+              <w:rPr>
+                <w:rFonts w:ascii="Times New Roman" w:hAnsi="Times New Roman" w:eastAsia="Times New Roman"/>
+                <w:b w:val="0"/>
+                <w:caps w:val="0"/>
+                <w:sz w:val="22"/>
+              </w:rPr>
+              <w:t>compiles</w:t>
+            </w:r>
+          </w:p>
+        </w:tc>
+        <w:tc>
+          <w:tcPr>
+            <w:tcW w:type="dxa" w:w="2880"/>
+          </w:tcPr>
+          <w:p>
+            <w:pPr>
+              <w:spacing w:line="240" w:lineRule="auto"/>
+            </w:pPr>
+            <w:r>
+              <w:rPr>
+                <w:rFonts w:ascii="Times New Roman" w:hAnsi="Times New Roman" w:eastAsia="Times New Roman"/>
+                <w:b w:val="0"/>
+                <w:caps w:val="0"/>
+                <w:sz w:val="22"/>
+              </w:rPr>
+              <w:t>11</w:t>
+            </w:r>
+          </w:p>
+        </w:tc>
+        <w:tc>
+          <w:tcPr>
+            <w:tcW w:type="dxa" w:w="2880"/>
+          </w:tcPr>
+          <w:p>
+            <w:pPr>
+              <w:spacing w:line="240" w:lineRule="auto"/>
+            </w:pPr>
+            <w:r>
+              <w:rPr>
+                <w:rFonts w:ascii="Times New Roman" w:hAnsi="Times New Roman" w:eastAsia="Times New Roman"/>
+                <w:b w:val="0"/>
+                <w:caps w:val="0"/>
+                <w:sz w:val="22"/>
+              </w:rPr>
+              <w:t>0.3%</w:t>
+            </w:r>
+          </w:p>
+        </w:tc>
+      </w:tr>
+      <w:tr>
+        <w:tc>
+          <w:tcPr>
+            <w:tcW w:type="dxa" w:w="2880"/>
+          </w:tcPr>
+          <w:p>
+            <w:pPr>
+              <w:spacing w:line="240" w:lineRule="auto"/>
+            </w:pPr>
+            <w:r>
+              <w:rPr>
+                <w:rFonts w:ascii="Times New Roman" w:hAnsi="Times New Roman" w:eastAsia="Times New Roman"/>
+                <w:b w:val="0"/>
+                <w:caps w:val="0"/>
+                <w:sz w:val="22"/>
+              </w:rPr>
+              <w:t>parses</w:t>
+            </w:r>
+          </w:p>
+        </w:tc>
+        <w:tc>
+          <w:tcPr>
+            <w:tcW w:type="dxa" w:w="2880"/>
+          </w:tcPr>
+          <w:p>
+            <w:pPr>
+              <w:spacing w:line="240" w:lineRule="auto"/>
+            </w:pPr>
+            <w:r>
+              <w:rPr>
+                <w:rFonts w:ascii="Times New Roman" w:hAnsi="Times New Roman" w:eastAsia="Times New Roman"/>
+                <w:b w:val="0"/>
+                <w:caps w:val="0"/>
+                <w:sz w:val="22"/>
+              </w:rPr>
+              <w:t>3</w:t>
+            </w:r>
+          </w:p>
+        </w:tc>
+        <w:tc>
+          <w:tcPr>
+            <w:tcW w:type="dxa" w:w="2880"/>
+          </w:tcPr>
+          <w:p>
+            <w:pPr>
+              <w:spacing w:line="240" w:lineRule="auto"/>
+            </w:pPr>
+            <w:r>
+              <w:rPr>
+                <w:rFonts w:ascii="Times New Roman" w:hAnsi="Times New Roman" w:eastAsia="Times New Roman"/>
+                <w:b w:val="0"/>
+                <w:caps w:val="0"/>
+                <w:sz w:val="22"/>
+              </w:rPr>
+              <w:t>0.1%</w:t>
+            </w:r>
+          </w:p>
+        </w:tc>
+      </w:tr>
+    </w:tbl>
+    <w:p>
+      <w:pPr>
+        <w:spacing w:line="240" w:lineRule="auto" w:after="0"/>
+      </w:pPr>
+    </w:p>
+    <w:p>
+      <w:pPr>
+        <w:spacing w:line="360" w:lineRule="auto"/>
+        <w:ind w:firstLine="360"/>
+        <w:jc w:val="both"/>
+      </w:pPr>
+      <w:r>
+        <w:rPr>
+          <w:rFonts w:ascii="Times New Roman" w:hAnsi="Times New Roman" w:eastAsia="Times New Roman"/>
+          <w:b w:val="0"/>
+          <w:caps w:val="0"/>
+          <w:sz w:val="24"/>
+        </w:rPr>
+        <w:t>Nga 3495 rishkrime, 60 futën një gabim që nuk ishte aty më parë (1.72%). Pjesa tjetër ose kompiloi, ose nuk shtoi asnjë lloj të ri gabimi kundrejt skedarit origjinal.</w:t>
       </w:r>
     </w:p>
     <w:p>

</xml_diff>

<commit_message>
Mbyll Fazen 3 me rezultatet perfundimtare
15 991 vende, 3 478 te transformuara (21.7%). Nga to 3 409 nuk shtuan asnje lloj
te ri gabimi dhe 13 kompiluan plotesisht.

Rregullimet e fundit i ulen prishjet nga 60 ne 56, dhe te 55 prej tyre jane
artefakte te kompilimit pa classpath. Familjet e perjashtimeve dhe e gjenerikeve
u zhduken plotesisht.
</commit_message>
<xml_diff>
--- a/docs/thesis/Punim_Diplome_Florent_Latifi.docx
+++ b/docs/thesis/Punim_Diplome_Florent_Latifi.docx
@@ -5814,7 +5814,7 @@
           <w:caps w:val="0"/>
           <w:sz w:val="24"/>
         </w:rPr>
-        <w:t>Mbi 4409 skedarë të korpusit u detektuan 15991 vende ku motori ka një transformim; prej tyre 3495 u transformuan.</w:t>
+        <w:t>Mbi 4409 skedarë të korpusit u detektuan 15991 vende ku motori ka një transformim; prej tyre 3478 u transformuan.</w:t>
       </w:r>
     </w:p>
     <w:p>
@@ -5995,7 +5995,7 @@
                 <w:caps w:val="0"/>
                 <w:sz w:val="22"/>
               </w:rPr>
-              <w:t>3495</w:t>
+              <w:t>3478</w:t>
             </w:r>
           </w:p>
         </w:tc>
@@ -6014,7 +6014,7 @@
                 <w:caps w:val="0"/>
                 <w:sz w:val="22"/>
               </w:rPr>
-              <w:t>21.9%</w:t>
+              <w:t>21.7%</w:t>
             </w:r>
           </w:p>
         </w:tc>
@@ -6054,7 +6054,7 @@
                 <w:caps w:val="0"/>
                 <w:sz w:val="22"/>
               </w:rPr>
-              <w:t>12479</w:t>
+              <w:t>12496</w:t>
             </w:r>
           </w:p>
         </w:tc>
@@ -6073,7 +6073,7 @@
                 <w:caps w:val="0"/>
                 <w:sz w:val="22"/>
               </w:rPr>
-              <w:t>78.0%</w:t>
+              <w:t>78.1%</w:t>
             </w:r>
           </w:p>
         </w:tc>
@@ -6278,7 +6278,7 @@
                 <w:caps w:val="0"/>
                 <w:sz w:val="22"/>
               </w:rPr>
-              <w:t>7298</w:t>
+              <w:t>7315</w:t>
             </w:r>
           </w:p>
         </w:tc>
@@ -6297,7 +6297,7 @@
                 <w:caps w:val="0"/>
                 <w:sz w:val="22"/>
               </w:rPr>
-              <w:t>45.6%</w:t>
+              <w:t>45.7%</w:t>
             </w:r>
           </w:p>
         </w:tc>
@@ -6605,7 +6605,7 @@
                 <w:caps w:val="0"/>
                 <w:sz w:val="22"/>
               </w:rPr>
-              <w:t>3421</w:t>
+              <w:t>3409</w:t>
             </w:r>
           </w:p>
         </w:tc>
@@ -6624,7 +6624,7 @@
                 <w:caps w:val="0"/>
                 <w:sz w:val="22"/>
               </w:rPr>
-              <w:t>97.9%</w:t>
+              <w:t>98.0%</w:t>
             </w:r>
           </w:p>
         </w:tc>
@@ -6664,7 +6664,7 @@
                 <w:caps w:val="0"/>
                 <w:sz w:val="22"/>
               </w:rPr>
-              <w:t>60</w:t>
+              <w:t>56</w:t>
             </w:r>
           </w:p>
         </w:tc>
@@ -6683,7 +6683,7 @@
                 <w:caps w:val="0"/>
                 <w:sz w:val="22"/>
               </w:rPr>
-              <w:t>1.7%</w:t>
+              <w:t>1.6%</w:t>
             </w:r>
           </w:p>
         </w:tc>
@@ -6723,7 +6723,7 @@
                 <w:caps w:val="0"/>
                 <w:sz w:val="22"/>
               </w:rPr>
-              <w:t>11</w:t>
+              <w:t>13</w:t>
             </w:r>
           </w:p>
         </w:tc>
@@ -6742,66 +6742,7 @@
                 <w:caps w:val="0"/>
                 <w:sz w:val="22"/>
               </w:rPr>
-              <w:t>0.3%</w:t>
-            </w:r>
-          </w:p>
-        </w:tc>
-      </w:tr>
-      <w:tr>
-        <w:tc>
-          <w:tcPr>
-            <w:tcW w:type="dxa" w:w="2880"/>
-          </w:tcPr>
-          <w:p>
-            <w:pPr>
-              <w:spacing w:line="240" w:lineRule="auto"/>
-            </w:pPr>
-            <w:r>
-              <w:rPr>
-                <w:rFonts w:ascii="Times New Roman" w:hAnsi="Times New Roman" w:eastAsia="Times New Roman"/>
-                <w:b w:val="0"/>
-                <w:caps w:val="0"/>
-                <w:sz w:val="22"/>
-              </w:rPr>
-              <w:t>parses</w:t>
-            </w:r>
-          </w:p>
-        </w:tc>
-        <w:tc>
-          <w:tcPr>
-            <w:tcW w:type="dxa" w:w="2880"/>
-          </w:tcPr>
-          <w:p>
-            <w:pPr>
-              <w:spacing w:line="240" w:lineRule="auto"/>
-            </w:pPr>
-            <w:r>
-              <w:rPr>
-                <w:rFonts w:ascii="Times New Roman" w:hAnsi="Times New Roman" w:eastAsia="Times New Roman"/>
-                <w:b w:val="0"/>
-                <w:caps w:val="0"/>
-                <w:sz w:val="22"/>
-              </w:rPr>
-              <w:t>3</w:t>
-            </w:r>
-          </w:p>
-        </w:tc>
-        <w:tc>
-          <w:tcPr>
-            <w:tcW w:type="dxa" w:w="2880"/>
-          </w:tcPr>
-          <w:p>
-            <w:pPr>
-              <w:spacing w:line="240" w:lineRule="auto"/>
-            </w:pPr>
-            <w:r>
-              <w:rPr>
-                <w:rFonts w:ascii="Times New Roman" w:hAnsi="Times New Roman" w:eastAsia="Times New Roman"/>
-                <w:b w:val="0"/>
-                <w:caps w:val="0"/>
-                <w:sz w:val="22"/>
-              </w:rPr>
-              <w:t>0.1%</w:t>
+              <w:t>0.4%</w:t>
             </w:r>
           </w:p>
         </w:tc>
@@ -6825,7 +6766,7 @@
           <w:caps w:val="0"/>
           <w:sz w:val="24"/>
         </w:rPr>
-        <w:t>Nga 3495 rishkrime, 60 futën një gabim që nuk ishte aty më parë (1.72%). Pjesa tjetër ose kompiloi, ose nuk shtoi asnjë lloj të ri gabimi kundrejt skedarit origjinal.</w:t>
+        <w:t>Nga 3478 rishkrime, 56 futën një gabim që nuk ishte aty më parë (1.61%). Pjesa tjetër ose kompiloi, ose nuk shtoi asnjë lloj të ri gabimi kundrejt skedarit origjinal.</w:t>
       </w:r>
     </w:p>
     <w:p>

</xml_diff>

<commit_message>
Verifiko koherencen e citimeve me nje kontroll
</commit_message>
<xml_diff>
--- a/docs/thesis/Punim_Diplome_Florent_Latifi.docx
+++ b/docs/thesis/Punim_Diplome_Florent_Latifi.docx
@@ -2638,7 +2638,7 @@
           <w:caps w:val="0"/>
           <w:sz w:val="24"/>
         </w:rPr>
-        <w:t>Analizuesi ndërtohet mbi tree-sitter dhe regjistron vetëm fakte sintaksore. Mbi këtë model maten shtatëmbëdhjetë metrika klase dhe nëntë metrika metode, me një kalim të vetëm për klasë.</w:t>
+        <w:t>Analizuesi ndërtohet mbi tree-sitter (Brunsfeld et al.) dhe regjistron vetëm fakte sintaksore. Mbi këtë model maten shtatëmbëdhjetë metrika klase dhe nëntë metrika metode, me një kalim të vetëm për klasë. Ndër to janë metrikat e Chidamber &amp; Kemerer-it (1994), varianti i normalizuar i LCOM-it i Henderson-Sellers-it (1996), TCC-ja e Bieman &amp; Kang-ut (1995) dhe kompleksiteti ciklomatik (McCabe, 1976), i matur si numri i pikave të vendimit në trupin e metodës plus një.</w:t>
       </w:r>
     </w:p>
     <w:p>
@@ -2918,7 +2918,101 @@
           <w:caps w:val="0"/>
           <w:sz w:val="24"/>
         </w:rPr>
-        <w:t>4.6 Riprodhueshmëria</w:t>
+        <w:t>4.6 Matja e performancës</w:t>
+      </w:r>
+    </w:p>
+    <w:p>
+      <w:pPr>
+        <w:spacing w:line="360" w:lineRule="auto"/>
+        <w:ind w:firstLine="360"/>
+        <w:jc w:val="both"/>
+      </w:pPr>
+      <w:r>
+        <w:rPr>
+          <w:rFonts w:ascii="Times New Roman" w:hAnsi="Times New Roman" w:eastAsia="Times New Roman"/>
+          <w:b w:val="0"/>
+          <w:caps w:val="0"/>
+          <w:sz w:val="24"/>
+        </w:rPr>
+        <w:t>Një mostër quhet pozitive kur ashpërsia e agreguar e rishikuesve është mbi «none». Agregimi parësor është mesatarja e rishikimeve; maksimumi, minimumi dhe unanimiteti raportohen si analizë ndjeshmërie, sepse rishikuesit e MLCQ-së nuk pajtohen me njëri-tjetrin në një të katërtën e mostrave dhe një shifër e vetme do ta fshihte atë mospajtim.</w:t>
+      </w:r>
+    </w:p>
+    <w:p>
+      <w:pPr>
+        <w:spacing w:line="360" w:lineRule="auto"/>
+        <w:ind w:firstLine="360"/>
+        <w:jc w:val="both"/>
+      </w:pPr>
+      <w:r>
+        <w:rPr>
+          <w:rFonts w:ascii="Times New Roman" w:hAnsi="Times New Roman" w:eastAsia="Times New Roman"/>
+          <w:b w:val="0"/>
+          <w:caps w:val="0"/>
+          <w:sz w:val="24"/>
+        </w:rPr>
+        <w:t>Mbi këtë përkufizim maten precizioni, recall-i dhe F1-i. Të tria raportohen bashkë me koeficientin e korrelacionit të Matthews-it (Matthews, 1975), i cili i përfshin të katër qelizat e matricës konfuze dhe mbetet i papërcaktuar kur njëra margjinë është bosh. Mbi një bashkësi ku shumica e etiketave janë negative kjo veti është vendimtare: një detektor që nuk ndez kurrë del i papërcaktuar këtu, ndërsa saktësia e përgjithshme do t'i jepte shifër të lartë.</w:t>
+      </w:r>
+    </w:p>
+    <w:p>
+      <w:pPr>
+        <w:spacing w:line="360" w:lineRule="auto"/>
+        <w:ind w:firstLine="360"/>
+        <w:jc w:val="both"/>
+      </w:pPr>
+      <w:r>
+        <w:rPr>
+          <w:rFonts w:ascii="Times New Roman" w:hAnsi="Times New Roman" w:eastAsia="Times New Roman"/>
+          <w:b w:val="0"/>
+          <w:caps w:val="0"/>
+          <w:sz w:val="24"/>
+        </w:rPr>
+        <w:t>Recall-i raportohet gjithmonë edhe i ndarë sipas ashpërsisë që caktuan rishikuesit. Një mjet që i kap rastet e rënda dhe i lëshon ato të lehtat nuk është i njëjti mjet me një tjetër që i lëshon të dyja, por një recall i vetëm i mesatarizuar i paraqet njësoj.</w:t>
+      </w:r>
+    </w:p>
+    <w:p>
+      <w:pPr>
+        <w:spacing w:line="360" w:lineRule="auto"/>
+        <w:ind w:firstLine="360"/>
+        <w:jc w:val="both"/>
+      </w:pPr>
+      <w:r>
+        <w:rPr>
+          <w:rFonts w:ascii="Times New Roman" w:hAnsi="Times New Roman" w:eastAsia="Times New Roman"/>
+          <w:b w:val="0"/>
+          <w:caps w:val="0"/>
+          <w:sz w:val="24"/>
+        </w:rPr>
+        <w:t>Pajtimi mes dy qasjeve matet me koeficientin kappa (Cohen, 1960) dhe jo me pajtimin e papërpunuar. Kur 78% e etiketave janë negative, dy detektorë që të dy ndezin rrallë pajtohen mbi nëntë të dhjetat e bashkësisë pa mësuar asgjë nga njëri-tjetri; kappa e heq atë pajtim që pritet nga rastësia. Krahas saj raportohen të katër qelizat, sepse pyetja e punimit nuk është sa shpesh pajtohen, por çfarë kap secila vetëm.</w:t>
+      </w:r>
+    </w:p>
+    <w:p>
+      <w:pPr>
+        <w:spacing w:line="360" w:lineRule="auto"/>
+        <w:ind w:firstLine="360"/>
+        <w:jc w:val="both"/>
+      </w:pPr>
+      <w:r>
+        <w:rPr>
+          <w:rFonts w:ascii="Times New Roman" w:hAnsi="Times New Roman" w:eastAsia="Times New Roman"/>
+          <w:b w:val="0"/>
+          <w:caps w:val="0"/>
+          <w:sz w:val="24"/>
+        </w:rPr>
+        <w:t>Motori i refaktorimit nuk matet me këto shifra. Për të numërohen vendet e detektuara, ato të transformuara dhe ato të refuzuara sipas arsyes, plus verdikti i verifikimit për secilin rishkrim. Një refuzim nuk hyn si dështim, sepse parakushti i paprovuar është pikërisht sjellja e kërkuar.</w:t>
+      </w:r>
+    </w:p>
+    <w:p>
+      <w:pPr>
+        <w:pStyle w:val="Heading2"/>
+      </w:pPr>
+      <w:r>
+        <w:rPr>
+          <w:rFonts w:ascii="Times New Roman" w:hAnsi="Times New Roman" w:eastAsia="Times New Roman"/>
+          <w:b/>
+          <w:caps w:val="0"/>
+          <w:sz w:val="24"/>
+        </w:rPr>
+        <w:t>4.7 Riprodhueshmëria</w:t>
       </w:r>
     </w:p>
     <w:p>
@@ -5083,7 +5177,7 @@
           <w:caps w:val="0"/>
           <w:sz w:val="24"/>
         </w:rPr>
-        <w:t>Qasja B e tejkalon Qasjen A në çdo erë. Por përmbledhja nuk e tregon se çka kap secila vetëm, ndaj raportohen edhe të katër qelizat bashkë me kappa-n e Cohen-it.</w:t>
+        <w:t>Qasja B e tejkalon Qasjen A në çdo erë. Por përmbledhja nuk e tregon se çka kap secila vetëm, ndaj raportohen edhe të katër qelizat bashkë me koeficientin kappa.</w:t>
       </w:r>
     </w:p>
     <w:p>

</xml_diff>

<commit_message>
Shkruaj Kapitullin 8 duke e nxjerre nga kodi
</commit_message>
<xml_diff>
--- a/docs/thesis/Punim_Diplome_Florent_Latifi.docx
+++ b/docs/thesis/Punim_Diplome_Florent_Latifi.docx
@@ -874,6 +874,118 @@
           <w:sz w:val="24"/>
         </w:rPr>
         <w:t>Tabela 8. Verifikimi i atyre që u aplikuan</w:t>
+      </w:r>
+    </w:p>
+    <w:p>
+      <w:pPr>
+        <w:spacing w:line="360" w:lineRule="auto"/>
+        <w:ind w:firstLine="360"/>
+        <w:jc w:val="both"/>
+      </w:pPr>
+      <w:r>
+        <w:rPr>
+          <w:rFonts w:ascii="Times New Roman" w:hAnsi="Times New Roman" w:eastAsia="Times New Roman"/>
+          <w:b w:val="0"/>
+          <w:caps w:val="0"/>
+          <w:sz w:val="24"/>
+        </w:rPr>
+        <w:t>Tabela 9. Strategjitë e detektimit dhe burimet e tyre</w:t>
+      </w:r>
+    </w:p>
+    <w:p>
+      <w:pPr>
+        <w:spacing w:line="360" w:lineRule="auto"/>
+        <w:ind w:firstLine="360"/>
+        <w:jc w:val="both"/>
+      </w:pPr>
+      <w:r>
+        <w:rPr>
+          <w:rFonts w:ascii="Times New Roman" w:hAnsi="Times New Roman" w:eastAsia="Times New Roman"/>
+          <w:b w:val="0"/>
+          <w:caps w:val="0"/>
+          <w:sz w:val="24"/>
+        </w:rPr>
+        <w:t>Tabela 10. Kuantifikuesit e përgjithshëm</w:t>
+      </w:r>
+    </w:p>
+    <w:p>
+      <w:pPr>
+        <w:spacing w:line="360" w:lineRule="auto"/>
+        <w:ind w:firstLine="360"/>
+        <w:jc w:val="both"/>
+      </w:pPr>
+      <w:r>
+        <w:rPr>
+          <w:rFonts w:ascii="Times New Roman" w:hAnsi="Times New Roman" w:eastAsia="Times New Roman"/>
+          <w:b w:val="0"/>
+          <w:caps w:val="0"/>
+          <w:sz w:val="24"/>
+        </w:rPr>
+        <w:t>Tabela 11. Pragjet e përdorura</w:t>
+      </w:r>
+    </w:p>
+    <w:p>
+      <w:pPr>
+        <w:spacing w:line="360" w:lineRule="auto"/>
+        <w:ind w:firstLine="360"/>
+        <w:jc w:val="both"/>
+      </w:pPr>
+      <w:r>
+        <w:rPr>
+          <w:rFonts w:ascii="Times New Roman" w:hAnsi="Times New Roman" w:eastAsia="Times New Roman"/>
+          <w:b w:val="0"/>
+          <w:caps w:val="0"/>
+          <w:sz w:val="24"/>
+        </w:rPr>
+        <w:t>Tabela 12. Metrikat sipas nivelit</w:t>
+      </w:r>
+    </w:p>
+    <w:p>
+      <w:pPr>
+        <w:spacing w:line="360" w:lineRule="auto"/>
+        <w:ind w:firstLine="360"/>
+        <w:jc w:val="both"/>
+      </w:pPr>
+      <w:r>
+        <w:rPr>
+          <w:rFonts w:ascii="Times New Roman" w:hAnsi="Times New Roman" w:eastAsia="Times New Roman"/>
+          <w:b w:val="0"/>
+          <w:caps w:val="0"/>
+          <w:sz w:val="24"/>
+        </w:rPr>
+        <w:t>Tabela 13. Çka propozohet dhe çka aplikohet</w:t>
+      </w:r>
+    </w:p>
+    <w:p>
+      <w:pPr>
+        <w:spacing w:line="360" w:lineRule="auto"/>
+        <w:ind w:firstLine="360"/>
+        <w:jc w:val="both"/>
+      </w:pPr>
+      <w:r>
+        <w:rPr>
+          <w:rFonts w:ascii="Times New Roman" w:hAnsi="Times New Roman" w:eastAsia="Times New Roman"/>
+          <w:b w:val="0"/>
+          <w:caps w:val="0"/>
+          <w:sz w:val="24"/>
+        </w:rPr>
+        <w:t>Tabela 14. Arsyet e refuzimit</w:t>
+      </w:r>
+    </w:p>
+    <w:p>
+      <w:pPr>
+        <w:spacing w:line="360" w:lineRule="auto"/>
+        <w:ind w:firstLine="360"/>
+        <w:jc w:val="both"/>
+      </w:pPr>
+      <w:r>
+        <w:rPr>
+          <w:rFonts w:ascii="Times New Roman" w:hAnsi="Times New Roman" w:eastAsia="Times New Roman"/>
+          <w:b w:val="0"/>
+          <w:caps w:val="0"/>
+          <w:sz w:val="24"/>
+        </w:rPr>
+        <w:t>Tabela 15. Radha e ekzekutimit</w:t>
       </w:r>
     </w:p>
     <w:p>
@@ -9053,6 +9165,20 @@
     </w:p>
     <w:p>
       <w:pPr>
+        <w:pStyle w:val="Heading2"/>
+      </w:pPr>
+      <w:r>
+        <w:rPr>
+          <w:rFonts w:ascii="Times New Roman" w:hAnsi="Times New Roman" w:eastAsia="Times New Roman"/>
+          <w:b/>
+          <w:caps w:val="0"/>
+          <w:sz w:val="24"/>
+        </w:rPr>
+        <w:t>8.1 Strategjitë e detektimit</w:t>
+      </w:r>
+    </w:p>
+    <w:p>
+      <w:pPr>
         <w:spacing w:line="360" w:lineRule="auto"/>
         <w:ind w:firstLine="360"/>
         <w:jc w:val="both"/>
@@ -9064,7 +9190,4123 @@
           <w:caps w:val="0"/>
           <w:sz w:val="24"/>
         </w:rPr>
-        <w:t>[PLOTËSO]</w:t>
+        <w:t>Tabela jep të tetë strategjitë ashtu si i zbaton sistemi. Kushtet janë ato të shkruara në kodin e detektorit dhe nxirren prej tij kur ndërtohet ky dokument, jo të kopjuara me dorë.</w:t>
+      </w:r>
+    </w:p>
+    <w:p>
+      <w:pPr>
+        <w:spacing w:line="240" w:lineRule="auto"/>
+        <w:jc w:val="center"/>
+      </w:pPr>
+      <w:r>
+        <w:rPr>
+          <w:rFonts w:ascii="Times New Roman" w:hAnsi="Times New Roman" w:eastAsia="Times New Roman"/>
+          <w:b w:val="0"/>
+          <w:caps w:val="0"/>
+          <w:sz w:val="22"/>
+        </w:rPr>
+        <w:t>Tabela 9. Strategjitë e detektimit dhe burimet e tyre</w:t>
+      </w:r>
+    </w:p>
+    <w:tbl>
+      <w:tblPr>
+        <w:tblStyle w:val="TableGrid"/>
+        <w:tblW w:type="auto" w:w="0"/>
+        <w:tblLook w:firstColumn="1" w:firstRow="1" w:lastColumn="0" w:lastRow="0" w:noHBand="0" w:noVBand="1" w:val="04A0"/>
+      </w:tblPr>
+      <w:tblGrid>
+        <w:gridCol w:w="2160"/>
+        <w:gridCol w:w="2160"/>
+        <w:gridCol w:w="2160"/>
+        <w:gridCol w:w="2160"/>
+      </w:tblGrid>
+      <w:tr>
+        <w:tc>
+          <w:tcPr>
+            <w:tcW w:type="dxa" w:w="2160"/>
+          </w:tcPr>
+          <w:p>
+            <w:pPr>
+              <w:spacing w:line="240" w:lineRule="auto"/>
+            </w:pPr>
+            <w:r>
+              <w:rPr>
+                <w:rFonts w:ascii="Times New Roman" w:hAnsi="Times New Roman" w:eastAsia="Times New Roman"/>
+                <w:b/>
+                <w:caps w:val="0"/>
+                <w:sz w:val="22"/>
+              </w:rPr>
+              <w:t>Erë</w:t>
+            </w:r>
+          </w:p>
+        </w:tc>
+        <w:tc>
+          <w:tcPr>
+            <w:tcW w:type="dxa" w:w="2160"/>
+          </w:tcPr>
+          <w:p>
+            <w:pPr>
+              <w:spacing w:line="240" w:lineRule="auto"/>
+            </w:pPr>
+            <w:r>
+              <w:rPr>
+                <w:rFonts w:ascii="Times New Roman" w:hAnsi="Times New Roman" w:eastAsia="Times New Roman"/>
+                <w:b/>
+                <w:caps w:val="0"/>
+                <w:sz w:val="22"/>
+              </w:rPr>
+              <w:t>Fusha</w:t>
+            </w:r>
+          </w:p>
+        </w:tc>
+        <w:tc>
+          <w:tcPr>
+            <w:tcW w:type="dxa" w:w="2160"/>
+          </w:tcPr>
+          <w:p>
+            <w:pPr>
+              <w:spacing w:line="240" w:lineRule="auto"/>
+            </w:pPr>
+            <w:r>
+              <w:rPr>
+                <w:rFonts w:ascii="Times New Roman" w:hAnsi="Times New Roman" w:eastAsia="Times New Roman"/>
+                <w:b/>
+                <w:caps w:val="0"/>
+                <w:sz w:val="22"/>
+              </w:rPr>
+              <w:t>Kushtet</w:t>
+            </w:r>
+          </w:p>
+        </w:tc>
+        <w:tc>
+          <w:tcPr>
+            <w:tcW w:type="dxa" w:w="2160"/>
+          </w:tcPr>
+          <w:p>
+            <w:pPr>
+              <w:spacing w:line="240" w:lineRule="auto"/>
+            </w:pPr>
+            <w:r>
+              <w:rPr>
+                <w:rFonts w:ascii="Times New Roman" w:hAnsi="Times New Roman" w:eastAsia="Times New Roman"/>
+                <w:b/>
+                <w:caps w:val="0"/>
+                <w:sz w:val="22"/>
+              </w:rPr>
+              <w:t>Burimi</w:t>
+            </w:r>
+          </w:p>
+        </w:tc>
+      </w:tr>
+      <w:tr>
+        <w:tc>
+          <w:tcPr>
+            <w:tcW w:type="dxa" w:w="2160"/>
+          </w:tcPr>
+          <w:p>
+            <w:pPr>
+              <w:spacing w:line="240" w:lineRule="auto"/>
+            </w:pPr>
+            <w:r>
+              <w:rPr>
+                <w:rFonts w:ascii="Times New Roman" w:hAnsi="Times New Roman" w:eastAsia="Times New Roman"/>
+                <w:b w:val="0"/>
+                <w:caps w:val="0"/>
+                <w:sz w:val="22"/>
+              </w:rPr>
+              <w:t>God Class</w:t>
+            </w:r>
+          </w:p>
+        </w:tc>
+        <w:tc>
+          <w:tcPr>
+            <w:tcW w:type="dxa" w:w="2160"/>
+          </w:tcPr>
+          <w:p>
+            <w:pPr>
+              <w:spacing w:line="240" w:lineRule="auto"/>
+            </w:pPr>
+            <w:r>
+              <w:rPr>
+                <w:rFonts w:ascii="Times New Roman" w:hAnsi="Times New Roman" w:eastAsia="Times New Roman"/>
+                <w:b w:val="0"/>
+                <w:caps w:val="0"/>
+                <w:sz w:val="22"/>
+              </w:rPr>
+              <w:t>klasë</w:t>
+            </w:r>
+          </w:p>
+        </w:tc>
+        <w:tc>
+          <w:tcPr>
+            <w:tcW w:type="dxa" w:w="2160"/>
+          </w:tcPr>
+          <w:p>
+            <w:pPr>
+              <w:spacing w:line="240" w:lineRule="auto"/>
+            </w:pPr>
+            <w:r>
+              <w:rPr>
+                <w:rFonts w:ascii="Times New Roman" w:hAnsi="Times New Roman" w:eastAsia="Times New Roman"/>
+                <w:b w:val="0"/>
+                <w:caps w:val="0"/>
+                <w:sz w:val="22"/>
+              </w:rPr>
+              <w:t>WMC &gt;= VERY_HIGH  AND  TCC &lt; ONE_THIRD  AND  ATFD &gt; FEW</w:t>
+            </w:r>
+          </w:p>
+        </w:tc>
+        <w:tc>
+          <w:tcPr>
+            <w:tcW w:type="dxa" w:w="2160"/>
+          </w:tcPr>
+          <w:p>
+            <w:pPr>
+              <w:spacing w:line="240" w:lineRule="auto"/>
+            </w:pPr>
+            <w:r>
+              <w:rPr>
+                <w:rFonts w:ascii="Times New Roman" w:hAnsi="Times New Roman" w:eastAsia="Times New Roman"/>
+                <w:b w:val="0"/>
+                <w:caps w:val="0"/>
+                <w:sz w:val="22"/>
+              </w:rPr>
+              <w:t>Lanza &amp; Marinescu, p. 80</w:t>
+            </w:r>
+          </w:p>
+        </w:tc>
+      </w:tr>
+      <w:tr>
+        <w:tc>
+          <w:tcPr>
+            <w:tcW w:type="dxa" w:w="2160"/>
+          </w:tcPr>
+          <w:p>
+            <w:pPr>
+              <w:spacing w:line="240" w:lineRule="auto"/>
+            </w:pPr>
+            <w:r>
+              <w:rPr>
+                <w:rFonts w:ascii="Times New Roman" w:hAnsi="Times New Roman" w:eastAsia="Times New Roman"/>
+                <w:b w:val="0"/>
+                <w:caps w:val="0"/>
+                <w:sz w:val="22"/>
+              </w:rPr>
+              <w:t>Data Class</w:t>
+            </w:r>
+          </w:p>
+        </w:tc>
+        <w:tc>
+          <w:tcPr>
+            <w:tcW w:type="dxa" w:w="2160"/>
+          </w:tcPr>
+          <w:p>
+            <w:pPr>
+              <w:spacing w:line="240" w:lineRule="auto"/>
+            </w:pPr>
+            <w:r>
+              <w:rPr>
+                <w:rFonts w:ascii="Times New Roman" w:hAnsi="Times New Roman" w:eastAsia="Times New Roman"/>
+                <w:b w:val="0"/>
+                <w:caps w:val="0"/>
+                <w:sz w:val="22"/>
+              </w:rPr>
+              <w:t>klasë</w:t>
+            </w:r>
+          </w:p>
+        </w:tc>
+        <w:tc>
+          <w:tcPr>
+            <w:tcW w:type="dxa" w:w="2160"/>
+          </w:tcPr>
+          <w:p>
+            <w:pPr>
+              <w:spacing w:line="240" w:lineRule="auto"/>
+            </w:pPr>
+            <w:r>
+              <w:rPr>
+                <w:rFonts w:ascii="Times New Roman" w:hAnsi="Times New Roman" w:eastAsia="Times New Roman"/>
+                <w:b w:val="0"/>
+                <w:caps w:val="0"/>
+                <w:sz w:val="22"/>
+              </w:rPr>
+              <w:t>WOC &lt; ONE_THIRD  AND  ( (NOPA + NOAM &gt; FEW  AND WMC &lt; HIGH) OR (NOPA + NOAM &gt; MANY AND WMC &lt; VERY_HIGH) )</w:t>
+            </w:r>
+          </w:p>
+        </w:tc>
+        <w:tc>
+          <w:tcPr>
+            <w:tcW w:type="dxa" w:w="2160"/>
+          </w:tcPr>
+          <w:p>
+            <w:pPr>
+              <w:spacing w:line="240" w:lineRule="auto"/>
+            </w:pPr>
+            <w:r>
+              <w:rPr>
+                <w:rFonts w:ascii="Times New Roman" w:hAnsi="Times New Roman" w:eastAsia="Times New Roman"/>
+                <w:b w:val="0"/>
+                <w:caps w:val="0"/>
+                <w:sz w:val="22"/>
+              </w:rPr>
+              <w:t>Lanza &amp; Marinescu, p. 88</w:t>
+            </w:r>
+          </w:p>
+        </w:tc>
+      </w:tr>
+      <w:tr>
+        <w:tc>
+          <w:tcPr>
+            <w:tcW w:type="dxa" w:w="2160"/>
+          </w:tcPr>
+          <w:p>
+            <w:pPr>
+              <w:spacing w:line="240" w:lineRule="auto"/>
+            </w:pPr>
+            <w:r>
+              <w:rPr>
+                <w:rFonts w:ascii="Times New Roman" w:hAnsi="Times New Roman" w:eastAsia="Times New Roman"/>
+                <w:b w:val="0"/>
+                <w:caps w:val="0"/>
+                <w:sz w:val="22"/>
+              </w:rPr>
+              <w:t>Large Class</w:t>
+            </w:r>
+          </w:p>
+        </w:tc>
+        <w:tc>
+          <w:tcPr>
+            <w:tcW w:type="dxa" w:w="2160"/>
+          </w:tcPr>
+          <w:p>
+            <w:pPr>
+              <w:spacing w:line="240" w:lineRule="auto"/>
+            </w:pPr>
+            <w:r>
+              <w:rPr>
+                <w:rFonts w:ascii="Times New Roman" w:hAnsi="Times New Roman" w:eastAsia="Times New Roman"/>
+                <w:b w:val="0"/>
+                <w:caps w:val="0"/>
+                <w:sz w:val="22"/>
+              </w:rPr>
+              <w:t>klasë</w:t>
+            </w:r>
+          </w:p>
+        </w:tc>
+        <w:tc>
+          <w:tcPr>
+            <w:tcW w:type="dxa" w:w="2160"/>
+          </w:tcPr>
+          <w:p>
+            <w:pPr>
+              <w:spacing w:line="240" w:lineRule="auto"/>
+            </w:pPr>
+            <w:r>
+              <w:rPr>
+                <w:rFonts w:ascii="Times New Roman" w:hAnsi="Times New Roman" w:eastAsia="Times New Roman"/>
+                <w:b w:val="0"/>
+                <w:caps w:val="0"/>
+                <w:sz w:val="22"/>
+              </w:rPr>
+              <w:t>CLOC &gt; HIGH_CLASS_LOC  OR  NOM &gt; HIGH_NOM</w:t>
+            </w:r>
+          </w:p>
+        </w:tc>
+        <w:tc>
+          <w:tcPr>
+            <w:tcW w:type="dxa" w:w="2160"/>
+          </w:tcPr>
+          <w:p>
+            <w:pPr>
+              <w:spacing w:line="240" w:lineRule="auto"/>
+            </w:pPr>
+            <w:r>
+              <w:rPr>
+                <w:rFonts w:ascii="Times New Roman" w:hAnsi="Times New Roman" w:eastAsia="Times New Roman"/>
+                <w:b w:val="0"/>
+                <w:caps w:val="0"/>
+                <w:sz w:val="22"/>
+              </w:rPr>
+              <w:t>Fowler): size alone, without the cohesion evidence</w:t>
+            </w:r>
+          </w:p>
+        </w:tc>
+      </w:tr>
+      <w:tr>
+        <w:tc>
+          <w:tcPr>
+            <w:tcW w:type="dxa" w:w="2160"/>
+          </w:tcPr>
+          <w:p>
+            <w:pPr>
+              <w:spacing w:line="240" w:lineRule="auto"/>
+            </w:pPr>
+            <w:r>
+              <w:rPr>
+                <w:rFonts w:ascii="Times New Roman" w:hAnsi="Times New Roman" w:eastAsia="Times New Roman"/>
+                <w:b w:val="0"/>
+                <w:caps w:val="0"/>
+                <w:sz w:val="22"/>
+              </w:rPr>
+              <w:t>Feature Envy</w:t>
+            </w:r>
+          </w:p>
+        </w:tc>
+        <w:tc>
+          <w:tcPr>
+            <w:tcW w:type="dxa" w:w="2160"/>
+          </w:tcPr>
+          <w:p>
+            <w:pPr>
+              <w:spacing w:line="240" w:lineRule="auto"/>
+            </w:pPr>
+            <w:r>
+              <w:rPr>
+                <w:rFonts w:ascii="Times New Roman" w:hAnsi="Times New Roman" w:eastAsia="Times New Roman"/>
+                <w:b w:val="0"/>
+                <w:caps w:val="0"/>
+                <w:sz w:val="22"/>
+              </w:rPr>
+              <w:t>metodë</w:t>
+            </w:r>
+          </w:p>
+        </w:tc>
+        <w:tc>
+          <w:tcPr>
+            <w:tcW w:type="dxa" w:w="2160"/>
+          </w:tcPr>
+          <w:p>
+            <w:pPr>
+              <w:spacing w:line="240" w:lineRule="auto"/>
+            </w:pPr>
+            <w:r>
+              <w:rPr>
+                <w:rFonts w:ascii="Times New Roman" w:hAnsi="Times New Roman" w:eastAsia="Times New Roman"/>
+                <w:b w:val="0"/>
+                <w:caps w:val="0"/>
+                <w:sz w:val="22"/>
+              </w:rPr>
+              <w:t>ATFD &gt; FEW  AND  LAA &lt; ONE_THIRD  AND  FDP &lt;= FEW</w:t>
+            </w:r>
+          </w:p>
+        </w:tc>
+        <w:tc>
+          <w:tcPr>
+            <w:tcW w:type="dxa" w:w="2160"/>
+          </w:tcPr>
+          <w:p>
+            <w:pPr>
+              <w:spacing w:line="240" w:lineRule="auto"/>
+            </w:pPr>
+            <w:r>
+              <w:rPr>
+                <w:rFonts w:ascii="Times New Roman" w:hAnsi="Times New Roman" w:eastAsia="Times New Roman"/>
+                <w:b w:val="0"/>
+                <w:caps w:val="0"/>
+                <w:sz w:val="22"/>
+              </w:rPr>
+              <w:t>Lanza &amp; Marinescu, p. 84</w:t>
+            </w:r>
+          </w:p>
+        </w:tc>
+      </w:tr>
+      <w:tr>
+        <w:tc>
+          <w:tcPr>
+            <w:tcW w:type="dxa" w:w="2160"/>
+          </w:tcPr>
+          <w:p>
+            <w:pPr>
+              <w:spacing w:line="240" w:lineRule="auto"/>
+            </w:pPr>
+            <w:r>
+              <w:rPr>
+                <w:rFonts w:ascii="Times New Roman" w:hAnsi="Times New Roman" w:eastAsia="Times New Roman"/>
+                <w:b w:val="0"/>
+                <w:caps w:val="0"/>
+                <w:sz w:val="22"/>
+              </w:rPr>
+              <w:t>Brain Method</w:t>
+            </w:r>
+          </w:p>
+        </w:tc>
+        <w:tc>
+          <w:tcPr>
+            <w:tcW w:type="dxa" w:w="2160"/>
+          </w:tcPr>
+          <w:p>
+            <w:pPr>
+              <w:spacing w:line="240" w:lineRule="auto"/>
+            </w:pPr>
+            <w:r>
+              <w:rPr>
+                <w:rFonts w:ascii="Times New Roman" w:hAnsi="Times New Roman" w:eastAsia="Times New Roman"/>
+                <w:b w:val="0"/>
+                <w:caps w:val="0"/>
+                <w:sz w:val="22"/>
+              </w:rPr>
+              <w:t>metodë</w:t>
+            </w:r>
+          </w:p>
+        </w:tc>
+        <w:tc>
+          <w:tcPr>
+            <w:tcW w:type="dxa" w:w="2160"/>
+          </w:tcPr>
+          <w:p>
+            <w:pPr>
+              <w:spacing w:line="240" w:lineRule="auto"/>
+            </w:pPr>
+            <w:r>
+              <w:rPr>
+                <w:rFonts w:ascii="Times New Roman" w:hAnsi="Times New Roman" w:eastAsia="Times New Roman"/>
+                <w:b w:val="0"/>
+                <w:caps w:val="0"/>
+                <w:sz w:val="22"/>
+              </w:rPr>
+              <w:t>LOC &gt; HIGH/2  AND  CC &gt;= threshold  AND  MAXNESTING &gt;= 3 AND  NOAV &gt; MANY</w:t>
+            </w:r>
+          </w:p>
+        </w:tc>
+        <w:tc>
+          <w:tcPr>
+            <w:tcW w:type="dxa" w:w="2160"/>
+          </w:tcPr>
+          <w:p>
+            <w:pPr>
+              <w:spacing w:line="240" w:lineRule="auto"/>
+            </w:pPr>
+            <w:r>
+              <w:rPr>
+                <w:rFonts w:ascii="Times New Roman" w:hAnsi="Times New Roman" w:eastAsia="Times New Roman"/>
+                <w:b w:val="0"/>
+                <w:caps w:val="0"/>
+                <w:sz w:val="22"/>
+              </w:rPr>
+              <w:t>Lanza &amp; Marinescu, p. 92</w:t>
+            </w:r>
+          </w:p>
+        </w:tc>
+      </w:tr>
+      <w:tr>
+        <w:tc>
+          <w:tcPr>
+            <w:tcW w:type="dxa" w:w="2160"/>
+          </w:tcPr>
+          <w:p>
+            <w:pPr>
+              <w:spacing w:line="240" w:lineRule="auto"/>
+            </w:pPr>
+            <w:r>
+              <w:rPr>
+                <w:rFonts w:ascii="Times New Roman" w:hAnsi="Times New Roman" w:eastAsia="Times New Roman"/>
+                <w:b w:val="0"/>
+                <w:caps w:val="0"/>
+                <w:sz w:val="22"/>
+              </w:rPr>
+              <w:t>Long Method</w:t>
+            </w:r>
+          </w:p>
+        </w:tc>
+        <w:tc>
+          <w:tcPr>
+            <w:tcW w:type="dxa" w:w="2160"/>
+          </w:tcPr>
+          <w:p>
+            <w:pPr>
+              <w:spacing w:line="240" w:lineRule="auto"/>
+            </w:pPr>
+            <w:r>
+              <w:rPr>
+                <w:rFonts w:ascii="Times New Roman" w:hAnsi="Times New Roman" w:eastAsia="Times New Roman"/>
+                <w:b w:val="0"/>
+                <w:caps w:val="0"/>
+                <w:sz w:val="22"/>
+              </w:rPr>
+              <w:t>metodë</w:t>
+            </w:r>
+          </w:p>
+        </w:tc>
+        <w:tc>
+          <w:tcPr>
+            <w:tcW w:type="dxa" w:w="2160"/>
+          </w:tcPr>
+          <w:p>
+            <w:pPr>
+              <w:spacing w:line="240" w:lineRule="auto"/>
+            </w:pPr>
+            <w:r>
+              <w:rPr>
+                <w:rFonts w:ascii="Times New Roman" w:hAnsi="Times New Roman" w:eastAsia="Times New Roman"/>
+                <w:b w:val="0"/>
+                <w:caps w:val="0"/>
+                <w:sz w:val="22"/>
+              </w:rPr>
+              <w:t>MLOC &gt; 30</w:t>
+            </w:r>
+          </w:p>
+        </w:tc>
+        <w:tc>
+          <w:tcPr>
+            <w:tcW w:type="dxa" w:w="2160"/>
+          </w:tcPr>
+          <w:p>
+            <w:pPr>
+              <w:spacing w:line="240" w:lineRule="auto"/>
+            </w:pPr>
+            <w:r>
+              <w:rPr>
+                <w:rFonts w:ascii="Times New Roman" w:hAnsi="Times New Roman" w:eastAsia="Times New Roman"/>
+                <w:b w:val="0"/>
+                <w:caps w:val="0"/>
+                <w:sz w:val="22"/>
+              </w:rPr>
+              <w:t>Fowler): effective lines of code past the threshold</w:t>
+            </w:r>
+          </w:p>
+        </w:tc>
+      </w:tr>
+      <w:tr>
+        <w:tc>
+          <w:tcPr>
+            <w:tcW w:type="dxa" w:w="2160"/>
+          </w:tcPr>
+          <w:p>
+            <w:pPr>
+              <w:spacing w:line="240" w:lineRule="auto"/>
+            </w:pPr>
+            <w:r>
+              <w:rPr>
+                <w:rFonts w:ascii="Times New Roman" w:hAnsi="Times New Roman" w:eastAsia="Times New Roman"/>
+                <w:b w:val="0"/>
+                <w:caps w:val="0"/>
+                <w:sz w:val="22"/>
+              </w:rPr>
+              <w:t>Long Parameter List</w:t>
+            </w:r>
+          </w:p>
+        </w:tc>
+        <w:tc>
+          <w:tcPr>
+            <w:tcW w:type="dxa" w:w="2160"/>
+          </w:tcPr>
+          <w:p>
+            <w:pPr>
+              <w:spacing w:line="240" w:lineRule="auto"/>
+            </w:pPr>
+            <w:r>
+              <w:rPr>
+                <w:rFonts w:ascii="Times New Roman" w:hAnsi="Times New Roman" w:eastAsia="Times New Roman"/>
+                <w:b w:val="0"/>
+                <w:caps w:val="0"/>
+                <w:sz w:val="22"/>
+              </w:rPr>
+              <w:t>metodë</w:t>
+            </w:r>
+          </w:p>
+        </w:tc>
+        <w:tc>
+          <w:tcPr>
+            <w:tcW w:type="dxa" w:w="2160"/>
+          </w:tcPr>
+          <w:p>
+            <w:pPr>
+              <w:spacing w:line="240" w:lineRule="auto"/>
+            </w:pPr>
+            <w:r>
+              <w:rPr>
+                <w:rFonts w:ascii="Times New Roman" w:hAnsi="Times New Roman" w:eastAsia="Times New Roman"/>
+                <w:b w:val="0"/>
+                <w:caps w:val="0"/>
+                <w:sz w:val="22"/>
+              </w:rPr>
+            </w:r>
+          </w:p>
+        </w:tc>
+        <w:tc>
+          <w:tcPr>
+            <w:tcW w:type="dxa" w:w="2160"/>
+          </w:tcPr>
+          <w:p>
+            <w:pPr>
+              <w:spacing w:line="240" w:lineRule="auto"/>
+            </w:pPr>
+            <w:r>
+              <w:rPr>
+                <w:rFonts w:ascii="Times New Roman" w:hAnsi="Times New Roman" w:eastAsia="Times New Roman"/>
+                <w:b w:val="0"/>
+                <w:caps w:val="0"/>
+                <w:sz w:val="22"/>
+              </w:rPr>
+              <w:t>Fowler</w:t>
+            </w:r>
+          </w:p>
+        </w:tc>
+      </w:tr>
+      <w:tr>
+        <w:tc>
+          <w:tcPr>
+            <w:tcW w:type="dxa" w:w="2160"/>
+          </w:tcPr>
+          <w:p>
+            <w:pPr>
+              <w:spacing w:line="240" w:lineRule="auto"/>
+            </w:pPr>
+            <w:r>
+              <w:rPr>
+                <w:rFonts w:ascii="Times New Roman" w:hAnsi="Times New Roman" w:eastAsia="Times New Roman"/>
+                <w:b w:val="0"/>
+                <w:caps w:val="0"/>
+                <w:sz w:val="22"/>
+              </w:rPr>
+              <w:t>Deeply nested control flow</w:t>
+            </w:r>
+          </w:p>
+        </w:tc>
+        <w:tc>
+          <w:tcPr>
+            <w:tcW w:type="dxa" w:w="2160"/>
+          </w:tcPr>
+          <w:p>
+            <w:pPr>
+              <w:spacing w:line="240" w:lineRule="auto"/>
+            </w:pPr>
+            <w:r>
+              <w:rPr>
+                <w:rFonts w:ascii="Times New Roman" w:hAnsi="Times New Roman" w:eastAsia="Times New Roman"/>
+                <w:b w:val="0"/>
+                <w:caps w:val="0"/>
+                <w:sz w:val="22"/>
+              </w:rPr>
+              <w:t>metodë</w:t>
+            </w:r>
+          </w:p>
+        </w:tc>
+        <w:tc>
+          <w:tcPr>
+            <w:tcW w:type="dxa" w:w="2160"/>
+          </w:tcPr>
+          <w:p>
+            <w:pPr>
+              <w:spacing w:line="240" w:lineRule="auto"/>
+            </w:pPr>
+            <w:r>
+              <w:rPr>
+                <w:rFonts w:ascii="Times New Roman" w:hAnsi="Times New Roman" w:eastAsia="Times New Roman"/>
+                <w:b w:val="0"/>
+                <w:caps w:val="0"/>
+                <w:sz w:val="22"/>
+              </w:rPr>
+              <w:t>MAXNESTING &gt; 3</w:t>
+            </w:r>
+          </w:p>
+        </w:tc>
+        <w:tc>
+          <w:tcPr>
+            <w:tcW w:type="dxa" w:w="2160"/>
+          </w:tcPr>
+          <w:p>
+            <w:pPr>
+              <w:spacing w:line="240" w:lineRule="auto"/>
+            </w:pPr>
+            <w:r>
+              <w:rPr>
+                <w:rFonts w:ascii="Times New Roman" w:hAnsi="Times New Roman" w:eastAsia="Times New Roman"/>
+                <w:b w:val="0"/>
+                <w:caps w:val="0"/>
+                <w:sz w:val="22"/>
+              </w:rPr>
+              <w:t>—</w:t>
+            </w:r>
+          </w:p>
+        </w:tc>
+      </w:tr>
+    </w:tbl>
+    <w:p>
+      <w:pPr>
+        <w:spacing w:line="240" w:lineRule="auto" w:after="0"/>
+      </w:pPr>
+    </w:p>
+    <w:p>
+      <w:pPr>
+        <w:spacing w:line="360" w:lineRule="auto"/>
+        <w:ind w:firstLine="360"/>
+        <w:jc w:val="both"/>
+      </w:pPr>
+      <w:r>
+        <w:rPr>
+          <w:rFonts w:ascii="Times New Roman" w:hAnsi="Times New Roman" w:eastAsia="Times New Roman"/>
+          <w:b w:val="0"/>
+          <w:caps w:val="0"/>
+          <w:sz w:val="24"/>
+        </w:rPr>
+        <w:t>Emrat me shkronja të mëdha te kolona e kushteve janë kuantifikuesit e Lanza &amp; Marinescu-t, vlerat e të cilëve jepen më poshtë.</w:t>
+      </w:r>
+    </w:p>
+    <w:p>
+      <w:pPr>
+        <w:pStyle w:val="Heading2"/>
+      </w:pPr>
+      <w:r>
+        <w:rPr>
+          <w:rFonts w:ascii="Times New Roman" w:hAnsi="Times New Roman" w:eastAsia="Times New Roman"/>
+          <w:b/>
+          <w:caps w:val="0"/>
+          <w:sz w:val="24"/>
+        </w:rPr>
+        <w:t>8.2 Kuantifikuesit dhe pragjet</w:t>
+      </w:r>
+    </w:p>
+    <w:p>
+      <w:pPr>
+        <w:spacing w:line="360" w:lineRule="auto"/>
+        <w:ind w:firstLine="360"/>
+        <w:jc w:val="both"/>
+      </w:pPr>
+      <w:r>
+        <w:rPr>
+          <w:rFonts w:ascii="Times New Roman" w:hAnsi="Times New Roman" w:eastAsia="Times New Roman"/>
+          <w:b w:val="0"/>
+          <w:caps w:val="0"/>
+          <w:sz w:val="24"/>
+        </w:rPr>
+        <w:t>Strategjitë janë shkruar në një fjalor kuantifikuesish e jo në numra të veçantë. Vlerat janë ato të nxjerra statistikisht nga një korpus prej dyzet e pesë sistemesh Java dhe C++.</w:t>
+      </w:r>
+    </w:p>
+    <w:p>
+      <w:pPr>
+        <w:spacing w:line="240" w:lineRule="auto"/>
+        <w:jc w:val="center"/>
+      </w:pPr>
+      <w:r>
+        <w:rPr>
+          <w:rFonts w:ascii="Times New Roman" w:hAnsi="Times New Roman" w:eastAsia="Times New Roman"/>
+          <w:b w:val="0"/>
+          <w:caps w:val="0"/>
+          <w:sz w:val="22"/>
+        </w:rPr>
+        <w:t>Tabela 10. Kuantifikuesit e përgjithshëm</w:t>
+      </w:r>
+    </w:p>
+    <w:tbl>
+      <w:tblPr>
+        <w:tblStyle w:val="TableGrid"/>
+        <w:tblW w:type="auto" w:w="0"/>
+        <w:tblLook w:firstColumn="1" w:firstRow="1" w:lastColumn="0" w:lastRow="0" w:noHBand="0" w:noVBand="1" w:val="04A0"/>
+      </w:tblPr>
+      <w:tblGrid>
+        <w:gridCol w:w="4320"/>
+        <w:gridCol w:w="4320"/>
+      </w:tblGrid>
+      <w:tr>
+        <w:tc>
+          <w:tcPr>
+            <w:tcW w:type="dxa" w:w="4320"/>
+          </w:tcPr>
+          <w:p>
+            <w:pPr>
+              <w:spacing w:line="240" w:lineRule="auto"/>
+            </w:pPr>
+            <w:r>
+              <w:rPr>
+                <w:rFonts w:ascii="Times New Roman" w:hAnsi="Times New Roman" w:eastAsia="Times New Roman"/>
+                <w:b/>
+                <w:caps w:val="0"/>
+                <w:sz w:val="22"/>
+              </w:rPr>
+              <w:t>Emri</w:t>
+            </w:r>
+          </w:p>
+        </w:tc>
+        <w:tc>
+          <w:tcPr>
+            <w:tcW w:type="dxa" w:w="4320"/>
+          </w:tcPr>
+          <w:p>
+            <w:pPr>
+              <w:spacing w:line="240" w:lineRule="auto"/>
+            </w:pPr>
+            <w:r>
+              <w:rPr>
+                <w:rFonts w:ascii="Times New Roman" w:hAnsi="Times New Roman" w:eastAsia="Times New Roman"/>
+                <w:b/>
+                <w:caps w:val="0"/>
+                <w:sz w:val="22"/>
+              </w:rPr>
+              <w:t>Vlera</w:t>
+            </w:r>
+          </w:p>
+        </w:tc>
+      </w:tr>
+      <w:tr>
+        <w:tc>
+          <w:tcPr>
+            <w:tcW w:type="dxa" w:w="4320"/>
+          </w:tcPr>
+          <w:p>
+            <w:pPr>
+              <w:spacing w:line="240" w:lineRule="auto"/>
+            </w:pPr>
+            <w:r>
+              <w:rPr>
+                <w:rFonts w:ascii="Times New Roman" w:hAnsi="Times New Roman" w:eastAsia="Times New Roman"/>
+                <w:b w:val="0"/>
+                <w:caps w:val="0"/>
+                <w:sz w:val="22"/>
+              </w:rPr>
+              <w:t>FEW</w:t>
+            </w:r>
+          </w:p>
+        </w:tc>
+        <w:tc>
+          <w:tcPr>
+            <w:tcW w:type="dxa" w:w="4320"/>
+          </w:tcPr>
+          <w:p>
+            <w:pPr>
+              <w:spacing w:line="240" w:lineRule="auto"/>
+            </w:pPr>
+            <w:r>
+              <w:rPr>
+                <w:rFonts w:ascii="Times New Roman" w:hAnsi="Times New Roman" w:eastAsia="Times New Roman"/>
+                <w:b w:val="0"/>
+                <w:caps w:val="0"/>
+                <w:sz w:val="22"/>
+              </w:rPr>
+              <w:t>5</w:t>
+            </w:r>
+          </w:p>
+        </w:tc>
+      </w:tr>
+      <w:tr>
+        <w:tc>
+          <w:tcPr>
+            <w:tcW w:type="dxa" w:w="4320"/>
+          </w:tcPr>
+          <w:p>
+            <w:pPr>
+              <w:spacing w:line="240" w:lineRule="auto"/>
+            </w:pPr>
+            <w:r>
+              <w:rPr>
+                <w:rFonts w:ascii="Times New Roman" w:hAnsi="Times New Roman" w:eastAsia="Times New Roman"/>
+                <w:b w:val="0"/>
+                <w:caps w:val="0"/>
+                <w:sz w:val="22"/>
+              </w:rPr>
+              <w:t>HIGH_CLASS_LOC</w:t>
+            </w:r>
+          </w:p>
+        </w:tc>
+        <w:tc>
+          <w:tcPr>
+            <w:tcW w:type="dxa" w:w="4320"/>
+          </w:tcPr>
+          <w:p>
+            <w:pPr>
+              <w:spacing w:line="240" w:lineRule="auto"/>
+            </w:pPr>
+            <w:r>
+              <w:rPr>
+                <w:rFonts w:ascii="Times New Roman" w:hAnsi="Times New Roman" w:eastAsia="Times New Roman"/>
+                <w:b w:val="0"/>
+                <w:caps w:val="0"/>
+                <w:sz w:val="22"/>
+              </w:rPr>
+              <w:t>200</w:t>
+            </w:r>
+          </w:p>
+        </w:tc>
+      </w:tr>
+      <w:tr>
+        <w:tc>
+          <w:tcPr>
+            <w:tcW w:type="dxa" w:w="4320"/>
+          </w:tcPr>
+          <w:p>
+            <w:pPr>
+              <w:spacing w:line="240" w:lineRule="auto"/>
+            </w:pPr>
+            <w:r>
+              <w:rPr>
+                <w:rFonts w:ascii="Times New Roman" w:hAnsi="Times New Roman" w:eastAsia="Times New Roman"/>
+                <w:b w:val="0"/>
+                <w:caps w:val="0"/>
+                <w:sz w:val="22"/>
+              </w:rPr>
+              <w:t>HIGH_METHOD_LOC</w:t>
+            </w:r>
+          </w:p>
+        </w:tc>
+        <w:tc>
+          <w:tcPr>
+            <w:tcW w:type="dxa" w:w="4320"/>
+          </w:tcPr>
+          <w:p>
+            <w:pPr>
+              <w:spacing w:line="240" w:lineRule="auto"/>
+            </w:pPr>
+            <w:r>
+              <w:rPr>
+                <w:rFonts w:ascii="Times New Roman" w:hAnsi="Times New Roman" w:eastAsia="Times New Roman"/>
+                <w:b w:val="0"/>
+                <w:caps w:val="0"/>
+                <w:sz w:val="22"/>
+              </w:rPr>
+              <w:t>70</w:t>
+            </w:r>
+          </w:p>
+        </w:tc>
+      </w:tr>
+      <w:tr>
+        <w:tc>
+          <w:tcPr>
+            <w:tcW w:type="dxa" w:w="4320"/>
+          </w:tcPr>
+          <w:p>
+            <w:pPr>
+              <w:spacing w:line="240" w:lineRule="auto"/>
+            </w:pPr>
+            <w:r>
+              <w:rPr>
+                <w:rFonts w:ascii="Times New Roman" w:hAnsi="Times New Roman" w:eastAsia="Times New Roman"/>
+                <w:b w:val="0"/>
+                <w:caps w:val="0"/>
+                <w:sz w:val="22"/>
+              </w:rPr>
+              <w:t>HIGH_NOM</w:t>
+            </w:r>
+          </w:p>
+        </w:tc>
+        <w:tc>
+          <w:tcPr>
+            <w:tcW w:type="dxa" w:w="4320"/>
+          </w:tcPr>
+          <w:p>
+            <w:pPr>
+              <w:spacing w:line="240" w:lineRule="auto"/>
+            </w:pPr>
+            <w:r>
+              <w:rPr>
+                <w:rFonts w:ascii="Times New Roman" w:hAnsi="Times New Roman" w:eastAsia="Times New Roman"/>
+                <w:b w:val="0"/>
+                <w:caps w:val="0"/>
+                <w:sz w:val="22"/>
+              </w:rPr>
+              <w:t>20</w:t>
+            </w:r>
+          </w:p>
+        </w:tc>
+      </w:tr>
+      <w:tr>
+        <w:tc>
+          <w:tcPr>
+            <w:tcW w:type="dxa" w:w="4320"/>
+          </w:tcPr>
+          <w:p>
+            <w:pPr>
+              <w:spacing w:line="240" w:lineRule="auto"/>
+            </w:pPr>
+            <w:r>
+              <w:rPr>
+                <w:rFonts w:ascii="Times New Roman" w:hAnsi="Times New Roman" w:eastAsia="Times New Roman"/>
+                <w:b w:val="0"/>
+                <w:caps w:val="0"/>
+                <w:sz w:val="22"/>
+              </w:rPr>
+              <w:t>HIGH_WMC</w:t>
+            </w:r>
+          </w:p>
+        </w:tc>
+        <w:tc>
+          <w:tcPr>
+            <w:tcW w:type="dxa" w:w="4320"/>
+          </w:tcPr>
+          <w:p>
+            <w:pPr>
+              <w:spacing w:line="240" w:lineRule="auto"/>
+            </w:pPr>
+            <w:r>
+              <w:rPr>
+                <w:rFonts w:ascii="Times New Roman" w:hAnsi="Times New Roman" w:eastAsia="Times New Roman"/>
+                <w:b w:val="0"/>
+                <w:caps w:val="0"/>
+                <w:sz w:val="22"/>
+              </w:rPr>
+              <w:t>31</w:t>
+            </w:r>
+          </w:p>
+        </w:tc>
+      </w:tr>
+      <w:tr>
+        <w:tc>
+          <w:tcPr>
+            <w:tcW w:type="dxa" w:w="4320"/>
+          </w:tcPr>
+          <w:p>
+            <w:pPr>
+              <w:spacing w:line="240" w:lineRule="auto"/>
+            </w:pPr>
+            <w:r>
+              <w:rPr>
+                <w:rFonts w:ascii="Times New Roman" w:hAnsi="Times New Roman" w:eastAsia="Times New Roman"/>
+                <w:b w:val="0"/>
+                <w:caps w:val="0"/>
+                <w:sz w:val="22"/>
+              </w:rPr>
+              <w:t>MANY</w:t>
+            </w:r>
+          </w:p>
+        </w:tc>
+        <w:tc>
+          <w:tcPr>
+            <w:tcW w:type="dxa" w:w="4320"/>
+          </w:tcPr>
+          <w:p>
+            <w:pPr>
+              <w:spacing w:line="240" w:lineRule="auto"/>
+            </w:pPr>
+            <w:r>
+              <w:rPr>
+                <w:rFonts w:ascii="Times New Roman" w:hAnsi="Times New Roman" w:eastAsia="Times New Roman"/>
+                <w:b w:val="0"/>
+                <w:caps w:val="0"/>
+                <w:sz w:val="22"/>
+              </w:rPr>
+              <w:t>10</w:t>
+            </w:r>
+          </w:p>
+        </w:tc>
+      </w:tr>
+      <w:tr>
+        <w:tc>
+          <w:tcPr>
+            <w:tcW w:type="dxa" w:w="4320"/>
+          </w:tcPr>
+          <w:p>
+            <w:pPr>
+              <w:spacing w:line="240" w:lineRule="auto"/>
+            </w:pPr>
+            <w:r>
+              <w:rPr>
+                <w:rFonts w:ascii="Times New Roman" w:hAnsi="Times New Roman" w:eastAsia="Times New Roman"/>
+                <w:b w:val="0"/>
+                <w:caps w:val="0"/>
+                <w:sz w:val="22"/>
+              </w:rPr>
+              <w:t>ONE_THIRD</w:t>
+            </w:r>
+          </w:p>
+        </w:tc>
+        <w:tc>
+          <w:tcPr>
+            <w:tcW w:type="dxa" w:w="4320"/>
+          </w:tcPr>
+          <w:p>
+            <w:pPr>
+              <w:spacing w:line="240" w:lineRule="auto"/>
+            </w:pPr>
+            <w:r>
+              <w:rPr>
+                <w:rFonts w:ascii="Times New Roman" w:hAnsi="Times New Roman" w:eastAsia="Times New Roman"/>
+                <w:b w:val="0"/>
+                <w:caps w:val="0"/>
+                <w:sz w:val="22"/>
+              </w:rPr>
+              <w:t>0.333333</w:t>
+            </w:r>
+          </w:p>
+        </w:tc>
+      </w:tr>
+      <w:tr>
+        <w:tc>
+          <w:tcPr>
+            <w:tcW w:type="dxa" w:w="4320"/>
+          </w:tcPr>
+          <w:p>
+            <w:pPr>
+              <w:spacing w:line="240" w:lineRule="auto"/>
+            </w:pPr>
+            <w:r>
+              <w:rPr>
+                <w:rFonts w:ascii="Times New Roman" w:hAnsi="Times New Roman" w:eastAsia="Times New Roman"/>
+                <w:b w:val="0"/>
+                <w:caps w:val="0"/>
+                <w:sz w:val="22"/>
+              </w:rPr>
+              <w:t>SHORT_MEMORY_CAP</w:t>
+            </w:r>
+          </w:p>
+        </w:tc>
+        <w:tc>
+          <w:tcPr>
+            <w:tcW w:type="dxa" w:w="4320"/>
+          </w:tcPr>
+          <w:p>
+            <w:pPr>
+              <w:spacing w:line="240" w:lineRule="auto"/>
+            </w:pPr>
+            <w:r>
+              <w:rPr>
+                <w:rFonts w:ascii="Times New Roman" w:hAnsi="Times New Roman" w:eastAsia="Times New Roman"/>
+                <w:b w:val="0"/>
+                <w:caps w:val="0"/>
+                <w:sz w:val="22"/>
+              </w:rPr>
+              <w:t>7</w:t>
+            </w:r>
+          </w:p>
+        </w:tc>
+      </w:tr>
+      <w:tr>
+        <w:tc>
+          <w:tcPr>
+            <w:tcW w:type="dxa" w:w="4320"/>
+          </w:tcPr>
+          <w:p>
+            <w:pPr>
+              <w:spacing w:line="240" w:lineRule="auto"/>
+            </w:pPr>
+            <w:r>
+              <w:rPr>
+                <w:rFonts w:ascii="Times New Roman" w:hAnsi="Times New Roman" w:eastAsia="Times New Roman"/>
+                <w:b w:val="0"/>
+                <w:caps w:val="0"/>
+                <w:sz w:val="22"/>
+              </w:rPr>
+              <w:t>VERY_HIGH_WMC</w:t>
+            </w:r>
+          </w:p>
+        </w:tc>
+        <w:tc>
+          <w:tcPr>
+            <w:tcW w:type="dxa" w:w="4320"/>
+          </w:tcPr>
+          <w:p>
+            <w:pPr>
+              <w:spacing w:line="240" w:lineRule="auto"/>
+            </w:pPr>
+            <w:r>
+              <w:rPr>
+                <w:rFonts w:ascii="Times New Roman" w:hAnsi="Times New Roman" w:eastAsia="Times New Roman"/>
+                <w:b w:val="0"/>
+                <w:caps w:val="0"/>
+                <w:sz w:val="22"/>
+              </w:rPr>
+              <w:t>47</w:t>
+            </w:r>
+          </w:p>
+        </w:tc>
+      </w:tr>
+    </w:tbl>
+    <w:p>
+      <w:pPr>
+        <w:spacing w:line="240" w:lineRule="auto" w:after="0"/>
+      </w:pPr>
+    </w:p>
+    <w:p>
+      <w:pPr>
+        <w:spacing w:line="360" w:lineRule="auto"/>
+        <w:ind w:firstLine="360"/>
+        <w:jc w:val="both"/>
+      </w:pPr>
+      <w:r>
+        <w:rPr>
+          <w:rFonts w:ascii="Times New Roman" w:hAnsi="Times New Roman" w:eastAsia="Times New Roman"/>
+          <w:b w:val="0"/>
+          <w:caps w:val="0"/>
+          <w:sz w:val="24"/>
+        </w:rPr>
+        <w:t>Poshtë janë pragjet me të cilat u prodhuan rezultatet e Kapitullit 5. Secili prej tyre është një nga ata që analiza e ndjeshmërisë i zhvendos, një nga një.</w:t>
+      </w:r>
+    </w:p>
+    <w:p>
+      <w:pPr>
+        <w:spacing w:line="240" w:lineRule="auto"/>
+        <w:jc w:val="center"/>
+      </w:pPr>
+      <w:r>
+        <w:rPr>
+          <w:rFonts w:ascii="Times New Roman" w:hAnsi="Times New Roman" w:eastAsia="Times New Roman"/>
+          <w:b w:val="0"/>
+          <w:caps w:val="0"/>
+          <w:sz w:val="22"/>
+        </w:rPr>
+        <w:t>Tabela 11. Pragjet e përdorura</w:t>
+      </w:r>
+    </w:p>
+    <w:tbl>
+      <w:tblPr>
+        <w:tblStyle w:val="TableGrid"/>
+        <w:tblW w:type="auto" w:w="0"/>
+        <w:tblLook w:firstColumn="1" w:firstRow="1" w:lastColumn="0" w:lastRow="0" w:noHBand="0" w:noVBand="1" w:val="04A0"/>
+      </w:tblPr>
+      <w:tblGrid>
+        <w:gridCol w:w="4320"/>
+        <w:gridCol w:w="4320"/>
+      </w:tblGrid>
+      <w:tr>
+        <w:tc>
+          <w:tcPr>
+            <w:tcW w:type="dxa" w:w="4320"/>
+          </w:tcPr>
+          <w:p>
+            <w:pPr>
+              <w:spacing w:line="240" w:lineRule="auto"/>
+            </w:pPr>
+            <w:r>
+              <w:rPr>
+                <w:rFonts w:ascii="Times New Roman" w:hAnsi="Times New Roman" w:eastAsia="Times New Roman"/>
+                <w:b/>
+                <w:caps w:val="0"/>
+                <w:sz w:val="22"/>
+              </w:rPr>
+              <w:t>Parametri</w:t>
+            </w:r>
+          </w:p>
+        </w:tc>
+        <w:tc>
+          <w:tcPr>
+            <w:tcW w:type="dxa" w:w="4320"/>
+          </w:tcPr>
+          <w:p>
+            <w:pPr>
+              <w:spacing w:line="240" w:lineRule="auto"/>
+            </w:pPr>
+            <w:r>
+              <w:rPr>
+                <w:rFonts w:ascii="Times New Roman" w:hAnsi="Times New Roman" w:eastAsia="Times New Roman"/>
+                <w:b/>
+                <w:caps w:val="0"/>
+                <w:sz w:val="22"/>
+              </w:rPr>
+              <w:t>Vlera</w:t>
+            </w:r>
+          </w:p>
+        </w:tc>
+      </w:tr>
+      <w:tr>
+        <w:tc>
+          <w:tcPr>
+            <w:tcW w:type="dxa" w:w="4320"/>
+          </w:tcPr>
+          <w:p>
+            <w:pPr>
+              <w:spacing w:line="240" w:lineRule="auto"/>
+            </w:pPr>
+            <w:r>
+              <w:rPr>
+                <w:rFonts w:ascii="Times New Roman" w:hAnsi="Times New Roman" w:eastAsia="Times New Roman"/>
+                <w:b w:val="0"/>
+                <w:caps w:val="0"/>
+                <w:sz w:val="22"/>
+              </w:rPr>
+              <w:t>brain_method_cc</w:t>
+            </w:r>
+          </w:p>
+        </w:tc>
+        <w:tc>
+          <w:tcPr>
+            <w:tcW w:type="dxa" w:w="4320"/>
+          </w:tcPr>
+          <w:p>
+            <w:pPr>
+              <w:spacing w:line="240" w:lineRule="auto"/>
+            </w:pPr>
+            <w:r>
+              <w:rPr>
+                <w:rFonts w:ascii="Times New Roman" w:hAnsi="Times New Roman" w:eastAsia="Times New Roman"/>
+                <w:b w:val="0"/>
+                <w:caps w:val="0"/>
+                <w:sz w:val="22"/>
+              </w:rPr>
+              <w:t>4</w:t>
+            </w:r>
+          </w:p>
+        </w:tc>
+      </w:tr>
+      <w:tr>
+        <w:tc>
+          <w:tcPr>
+            <w:tcW w:type="dxa" w:w="4320"/>
+          </w:tcPr>
+          <w:p>
+            <w:pPr>
+              <w:spacing w:line="240" w:lineRule="auto"/>
+            </w:pPr>
+            <w:r>
+              <w:rPr>
+                <w:rFonts w:ascii="Times New Roman" w:hAnsi="Times New Roman" w:eastAsia="Times New Roman"/>
+                <w:b w:val="0"/>
+                <w:caps w:val="0"/>
+                <w:sz w:val="22"/>
+              </w:rPr>
+              <w:t>brain_method_loc</w:t>
+            </w:r>
+          </w:p>
+        </w:tc>
+        <w:tc>
+          <w:tcPr>
+            <w:tcW w:type="dxa" w:w="4320"/>
+          </w:tcPr>
+          <w:p>
+            <w:pPr>
+              <w:spacing w:line="240" w:lineRule="auto"/>
+            </w:pPr>
+            <w:r>
+              <w:rPr>
+                <w:rFonts w:ascii="Times New Roman" w:hAnsi="Times New Roman" w:eastAsia="Times New Roman"/>
+                <w:b w:val="0"/>
+                <w:caps w:val="0"/>
+                <w:sz w:val="22"/>
+              </w:rPr>
+              <w:t>35</w:t>
+            </w:r>
+          </w:p>
+        </w:tc>
+      </w:tr>
+      <w:tr>
+        <w:tc>
+          <w:tcPr>
+            <w:tcW w:type="dxa" w:w="4320"/>
+          </w:tcPr>
+          <w:p>
+            <w:pPr>
+              <w:spacing w:line="240" w:lineRule="auto"/>
+            </w:pPr>
+            <w:r>
+              <w:rPr>
+                <w:rFonts w:ascii="Times New Roman" w:hAnsi="Times New Roman" w:eastAsia="Times New Roman"/>
+                <w:b w:val="0"/>
+                <w:caps w:val="0"/>
+                <w:sz w:val="22"/>
+              </w:rPr>
+              <w:t>brain_method_nesting</w:t>
+            </w:r>
+          </w:p>
+        </w:tc>
+        <w:tc>
+          <w:tcPr>
+            <w:tcW w:type="dxa" w:w="4320"/>
+          </w:tcPr>
+          <w:p>
+            <w:pPr>
+              <w:spacing w:line="240" w:lineRule="auto"/>
+            </w:pPr>
+            <w:r>
+              <w:rPr>
+                <w:rFonts w:ascii="Times New Roman" w:hAnsi="Times New Roman" w:eastAsia="Times New Roman"/>
+                <w:b w:val="0"/>
+                <w:caps w:val="0"/>
+                <w:sz w:val="22"/>
+              </w:rPr>
+              <w:t>3</w:t>
+            </w:r>
+          </w:p>
+        </w:tc>
+      </w:tr>
+      <w:tr>
+        <w:tc>
+          <w:tcPr>
+            <w:tcW w:type="dxa" w:w="4320"/>
+          </w:tcPr>
+          <w:p>
+            <w:pPr>
+              <w:spacing w:line="240" w:lineRule="auto"/>
+            </w:pPr>
+            <w:r>
+              <w:rPr>
+                <w:rFonts w:ascii="Times New Roman" w:hAnsi="Times New Roman" w:eastAsia="Times New Roman"/>
+                <w:b w:val="0"/>
+                <w:caps w:val="0"/>
+                <w:sz w:val="22"/>
+              </w:rPr>
+              <w:t>brain_method_noav</w:t>
+            </w:r>
+          </w:p>
+        </w:tc>
+        <w:tc>
+          <w:tcPr>
+            <w:tcW w:type="dxa" w:w="4320"/>
+          </w:tcPr>
+          <w:p>
+            <w:pPr>
+              <w:spacing w:line="240" w:lineRule="auto"/>
+            </w:pPr>
+            <w:r>
+              <w:rPr>
+                <w:rFonts w:ascii="Times New Roman" w:hAnsi="Times New Roman" w:eastAsia="Times New Roman"/>
+                <w:b w:val="0"/>
+                <w:caps w:val="0"/>
+                <w:sz w:val="22"/>
+              </w:rPr>
+              <w:t>10</w:t>
+            </w:r>
+          </w:p>
+        </w:tc>
+      </w:tr>
+      <w:tr>
+        <w:tc>
+          <w:tcPr>
+            <w:tcW w:type="dxa" w:w="4320"/>
+          </w:tcPr>
+          <w:p>
+            <w:pPr>
+              <w:spacing w:line="240" w:lineRule="auto"/>
+            </w:pPr>
+            <w:r>
+              <w:rPr>
+                <w:rFonts w:ascii="Times New Roman" w:hAnsi="Times New Roman" w:eastAsia="Times New Roman"/>
+                <w:b w:val="0"/>
+                <w:caps w:val="0"/>
+                <w:sz w:val="22"/>
+              </w:rPr>
+              <w:t>data_class_public_members</w:t>
+            </w:r>
+          </w:p>
+        </w:tc>
+        <w:tc>
+          <w:tcPr>
+            <w:tcW w:type="dxa" w:w="4320"/>
+          </w:tcPr>
+          <w:p>
+            <w:pPr>
+              <w:spacing w:line="240" w:lineRule="auto"/>
+            </w:pPr>
+            <w:r>
+              <w:rPr>
+                <w:rFonts w:ascii="Times New Roman" w:hAnsi="Times New Roman" w:eastAsia="Times New Roman"/>
+                <w:b w:val="0"/>
+                <w:caps w:val="0"/>
+                <w:sz w:val="22"/>
+              </w:rPr>
+              <w:t>5</w:t>
+            </w:r>
+          </w:p>
+        </w:tc>
+      </w:tr>
+      <w:tr>
+        <w:tc>
+          <w:tcPr>
+            <w:tcW w:type="dxa" w:w="4320"/>
+          </w:tcPr>
+          <w:p>
+            <w:pPr>
+              <w:spacing w:line="240" w:lineRule="auto"/>
+            </w:pPr>
+            <w:r>
+              <w:rPr>
+                <w:rFonts w:ascii="Times New Roman" w:hAnsi="Times New Roman" w:eastAsia="Times New Roman"/>
+                <w:b w:val="0"/>
+                <w:caps w:val="0"/>
+                <w:sz w:val="22"/>
+              </w:rPr>
+              <w:t>data_class_public_members_many</w:t>
+            </w:r>
+          </w:p>
+        </w:tc>
+        <w:tc>
+          <w:tcPr>
+            <w:tcW w:type="dxa" w:w="4320"/>
+          </w:tcPr>
+          <w:p>
+            <w:pPr>
+              <w:spacing w:line="240" w:lineRule="auto"/>
+            </w:pPr>
+            <w:r>
+              <w:rPr>
+                <w:rFonts w:ascii="Times New Roman" w:hAnsi="Times New Roman" w:eastAsia="Times New Roman"/>
+                <w:b w:val="0"/>
+                <w:caps w:val="0"/>
+                <w:sz w:val="22"/>
+              </w:rPr>
+              <w:t>10</w:t>
+            </w:r>
+          </w:p>
+        </w:tc>
+      </w:tr>
+      <w:tr>
+        <w:tc>
+          <w:tcPr>
+            <w:tcW w:type="dxa" w:w="4320"/>
+          </w:tcPr>
+          <w:p>
+            <w:pPr>
+              <w:spacing w:line="240" w:lineRule="auto"/>
+            </w:pPr>
+            <w:r>
+              <w:rPr>
+                <w:rFonts w:ascii="Times New Roman" w:hAnsi="Times New Roman" w:eastAsia="Times New Roman"/>
+                <w:b w:val="0"/>
+                <w:caps w:val="0"/>
+                <w:sz w:val="22"/>
+              </w:rPr>
+              <w:t>data_class_wmc_high</w:t>
+            </w:r>
+          </w:p>
+        </w:tc>
+        <w:tc>
+          <w:tcPr>
+            <w:tcW w:type="dxa" w:w="4320"/>
+          </w:tcPr>
+          <w:p>
+            <w:pPr>
+              <w:spacing w:line="240" w:lineRule="auto"/>
+            </w:pPr>
+            <w:r>
+              <w:rPr>
+                <w:rFonts w:ascii="Times New Roman" w:hAnsi="Times New Roman" w:eastAsia="Times New Roman"/>
+                <w:b w:val="0"/>
+                <w:caps w:val="0"/>
+                <w:sz w:val="22"/>
+              </w:rPr>
+              <w:t>47</w:t>
+            </w:r>
+          </w:p>
+        </w:tc>
+      </w:tr>
+      <w:tr>
+        <w:tc>
+          <w:tcPr>
+            <w:tcW w:type="dxa" w:w="4320"/>
+          </w:tcPr>
+          <w:p>
+            <w:pPr>
+              <w:spacing w:line="240" w:lineRule="auto"/>
+            </w:pPr>
+            <w:r>
+              <w:rPr>
+                <w:rFonts w:ascii="Times New Roman" w:hAnsi="Times New Roman" w:eastAsia="Times New Roman"/>
+                <w:b w:val="0"/>
+                <w:caps w:val="0"/>
+                <w:sz w:val="22"/>
+              </w:rPr>
+              <w:t>data_class_wmc_low</w:t>
+            </w:r>
+          </w:p>
+        </w:tc>
+        <w:tc>
+          <w:tcPr>
+            <w:tcW w:type="dxa" w:w="4320"/>
+          </w:tcPr>
+          <w:p>
+            <w:pPr>
+              <w:spacing w:line="240" w:lineRule="auto"/>
+            </w:pPr>
+            <w:r>
+              <w:rPr>
+                <w:rFonts w:ascii="Times New Roman" w:hAnsi="Times New Roman" w:eastAsia="Times New Roman"/>
+                <w:b w:val="0"/>
+                <w:caps w:val="0"/>
+                <w:sz w:val="22"/>
+              </w:rPr>
+              <w:t>31</w:t>
+            </w:r>
+          </w:p>
+        </w:tc>
+      </w:tr>
+      <w:tr>
+        <w:tc>
+          <w:tcPr>
+            <w:tcW w:type="dxa" w:w="4320"/>
+          </w:tcPr>
+          <w:p>
+            <w:pPr>
+              <w:spacing w:line="240" w:lineRule="auto"/>
+            </w:pPr>
+            <w:r>
+              <w:rPr>
+                <w:rFonts w:ascii="Times New Roman" w:hAnsi="Times New Roman" w:eastAsia="Times New Roman"/>
+                <w:b w:val="0"/>
+                <w:caps w:val="0"/>
+                <w:sz w:val="22"/>
+              </w:rPr>
+              <w:t>data_class_woc</w:t>
+            </w:r>
+          </w:p>
+        </w:tc>
+        <w:tc>
+          <w:tcPr>
+            <w:tcW w:type="dxa" w:w="4320"/>
+          </w:tcPr>
+          <w:p>
+            <w:pPr>
+              <w:spacing w:line="240" w:lineRule="auto"/>
+            </w:pPr>
+            <w:r>
+              <w:rPr>
+                <w:rFonts w:ascii="Times New Roman" w:hAnsi="Times New Roman" w:eastAsia="Times New Roman"/>
+                <w:b w:val="0"/>
+                <w:caps w:val="0"/>
+                <w:sz w:val="22"/>
+              </w:rPr>
+              <w:t>0.333333</w:t>
+            </w:r>
+          </w:p>
+        </w:tc>
+      </w:tr>
+      <w:tr>
+        <w:tc>
+          <w:tcPr>
+            <w:tcW w:type="dxa" w:w="4320"/>
+          </w:tcPr>
+          <w:p>
+            <w:pPr>
+              <w:spacing w:line="240" w:lineRule="auto"/>
+            </w:pPr>
+            <w:r>
+              <w:rPr>
+                <w:rFonts w:ascii="Times New Roman" w:hAnsi="Times New Roman" w:eastAsia="Times New Roman"/>
+                <w:b w:val="0"/>
+                <w:caps w:val="0"/>
+                <w:sz w:val="22"/>
+              </w:rPr>
+              <w:t>deep_nesting</w:t>
+            </w:r>
+          </w:p>
+        </w:tc>
+        <w:tc>
+          <w:tcPr>
+            <w:tcW w:type="dxa" w:w="4320"/>
+          </w:tcPr>
+          <w:p>
+            <w:pPr>
+              <w:spacing w:line="240" w:lineRule="auto"/>
+            </w:pPr>
+            <w:r>
+              <w:rPr>
+                <w:rFonts w:ascii="Times New Roman" w:hAnsi="Times New Roman" w:eastAsia="Times New Roman"/>
+                <w:b w:val="0"/>
+                <w:caps w:val="0"/>
+                <w:sz w:val="22"/>
+              </w:rPr>
+              <w:t>3</w:t>
+            </w:r>
+          </w:p>
+        </w:tc>
+      </w:tr>
+      <w:tr>
+        <w:tc>
+          <w:tcPr>
+            <w:tcW w:type="dxa" w:w="4320"/>
+          </w:tcPr>
+          <w:p>
+            <w:pPr>
+              <w:spacing w:line="240" w:lineRule="auto"/>
+            </w:pPr>
+            <w:r>
+              <w:rPr>
+                <w:rFonts w:ascii="Times New Roman" w:hAnsi="Times New Roman" w:eastAsia="Times New Roman"/>
+                <w:b w:val="0"/>
+                <w:caps w:val="0"/>
+                <w:sz w:val="22"/>
+              </w:rPr>
+              <w:t>feature_envy_atfd</w:t>
+            </w:r>
+          </w:p>
+        </w:tc>
+        <w:tc>
+          <w:tcPr>
+            <w:tcW w:type="dxa" w:w="4320"/>
+          </w:tcPr>
+          <w:p>
+            <w:pPr>
+              <w:spacing w:line="240" w:lineRule="auto"/>
+            </w:pPr>
+            <w:r>
+              <w:rPr>
+                <w:rFonts w:ascii="Times New Roman" w:hAnsi="Times New Roman" w:eastAsia="Times New Roman"/>
+                <w:b w:val="0"/>
+                <w:caps w:val="0"/>
+                <w:sz w:val="22"/>
+              </w:rPr>
+              <w:t>5</w:t>
+            </w:r>
+          </w:p>
+        </w:tc>
+      </w:tr>
+      <w:tr>
+        <w:tc>
+          <w:tcPr>
+            <w:tcW w:type="dxa" w:w="4320"/>
+          </w:tcPr>
+          <w:p>
+            <w:pPr>
+              <w:spacing w:line="240" w:lineRule="auto"/>
+            </w:pPr>
+            <w:r>
+              <w:rPr>
+                <w:rFonts w:ascii="Times New Roman" w:hAnsi="Times New Roman" w:eastAsia="Times New Roman"/>
+                <w:b w:val="0"/>
+                <w:caps w:val="0"/>
+                <w:sz w:val="22"/>
+              </w:rPr>
+              <w:t>feature_envy_fdp</w:t>
+            </w:r>
+          </w:p>
+        </w:tc>
+        <w:tc>
+          <w:tcPr>
+            <w:tcW w:type="dxa" w:w="4320"/>
+          </w:tcPr>
+          <w:p>
+            <w:pPr>
+              <w:spacing w:line="240" w:lineRule="auto"/>
+            </w:pPr>
+            <w:r>
+              <w:rPr>
+                <w:rFonts w:ascii="Times New Roman" w:hAnsi="Times New Roman" w:eastAsia="Times New Roman"/>
+                <w:b w:val="0"/>
+                <w:caps w:val="0"/>
+                <w:sz w:val="22"/>
+              </w:rPr>
+              <w:t>5</w:t>
+            </w:r>
+          </w:p>
+        </w:tc>
+      </w:tr>
+      <w:tr>
+        <w:tc>
+          <w:tcPr>
+            <w:tcW w:type="dxa" w:w="4320"/>
+          </w:tcPr>
+          <w:p>
+            <w:pPr>
+              <w:spacing w:line="240" w:lineRule="auto"/>
+            </w:pPr>
+            <w:r>
+              <w:rPr>
+                <w:rFonts w:ascii="Times New Roman" w:hAnsi="Times New Roman" w:eastAsia="Times New Roman"/>
+                <w:b w:val="0"/>
+                <w:caps w:val="0"/>
+                <w:sz w:val="22"/>
+              </w:rPr>
+              <w:t>feature_envy_laa</w:t>
+            </w:r>
+          </w:p>
+        </w:tc>
+        <w:tc>
+          <w:tcPr>
+            <w:tcW w:type="dxa" w:w="4320"/>
+          </w:tcPr>
+          <w:p>
+            <w:pPr>
+              <w:spacing w:line="240" w:lineRule="auto"/>
+            </w:pPr>
+            <w:r>
+              <w:rPr>
+                <w:rFonts w:ascii="Times New Roman" w:hAnsi="Times New Roman" w:eastAsia="Times New Roman"/>
+                <w:b w:val="0"/>
+                <w:caps w:val="0"/>
+                <w:sz w:val="22"/>
+              </w:rPr>
+              <w:t>0.333333</w:t>
+            </w:r>
+          </w:p>
+        </w:tc>
+      </w:tr>
+      <w:tr>
+        <w:tc>
+          <w:tcPr>
+            <w:tcW w:type="dxa" w:w="4320"/>
+          </w:tcPr>
+          <w:p>
+            <w:pPr>
+              <w:spacing w:line="240" w:lineRule="auto"/>
+            </w:pPr>
+            <w:r>
+              <w:rPr>
+                <w:rFonts w:ascii="Times New Roman" w:hAnsi="Times New Roman" w:eastAsia="Times New Roman"/>
+                <w:b w:val="0"/>
+                <w:caps w:val="0"/>
+                <w:sz w:val="22"/>
+              </w:rPr>
+              <w:t>god_class_atfd</w:t>
+            </w:r>
+          </w:p>
+        </w:tc>
+        <w:tc>
+          <w:tcPr>
+            <w:tcW w:type="dxa" w:w="4320"/>
+          </w:tcPr>
+          <w:p>
+            <w:pPr>
+              <w:spacing w:line="240" w:lineRule="auto"/>
+            </w:pPr>
+            <w:r>
+              <w:rPr>
+                <w:rFonts w:ascii="Times New Roman" w:hAnsi="Times New Roman" w:eastAsia="Times New Roman"/>
+                <w:b w:val="0"/>
+                <w:caps w:val="0"/>
+                <w:sz w:val="22"/>
+              </w:rPr>
+              <w:t>5</w:t>
+            </w:r>
+          </w:p>
+        </w:tc>
+      </w:tr>
+      <w:tr>
+        <w:tc>
+          <w:tcPr>
+            <w:tcW w:type="dxa" w:w="4320"/>
+          </w:tcPr>
+          <w:p>
+            <w:pPr>
+              <w:spacing w:line="240" w:lineRule="auto"/>
+            </w:pPr>
+            <w:r>
+              <w:rPr>
+                <w:rFonts w:ascii="Times New Roman" w:hAnsi="Times New Roman" w:eastAsia="Times New Roman"/>
+                <w:b w:val="0"/>
+                <w:caps w:val="0"/>
+                <w:sz w:val="22"/>
+              </w:rPr>
+              <w:t>god_class_tcc</w:t>
+            </w:r>
+          </w:p>
+        </w:tc>
+        <w:tc>
+          <w:tcPr>
+            <w:tcW w:type="dxa" w:w="4320"/>
+          </w:tcPr>
+          <w:p>
+            <w:pPr>
+              <w:spacing w:line="240" w:lineRule="auto"/>
+            </w:pPr>
+            <w:r>
+              <w:rPr>
+                <w:rFonts w:ascii="Times New Roman" w:hAnsi="Times New Roman" w:eastAsia="Times New Roman"/>
+                <w:b w:val="0"/>
+                <w:caps w:val="0"/>
+                <w:sz w:val="22"/>
+              </w:rPr>
+              <w:t>0.333333</w:t>
+            </w:r>
+          </w:p>
+        </w:tc>
+      </w:tr>
+      <w:tr>
+        <w:tc>
+          <w:tcPr>
+            <w:tcW w:type="dxa" w:w="4320"/>
+          </w:tcPr>
+          <w:p>
+            <w:pPr>
+              <w:spacing w:line="240" w:lineRule="auto"/>
+            </w:pPr>
+            <w:r>
+              <w:rPr>
+                <w:rFonts w:ascii="Times New Roman" w:hAnsi="Times New Roman" w:eastAsia="Times New Roman"/>
+                <w:b w:val="0"/>
+                <w:caps w:val="0"/>
+                <w:sz w:val="22"/>
+              </w:rPr>
+              <w:t>god_class_wmc</w:t>
+            </w:r>
+          </w:p>
+        </w:tc>
+        <w:tc>
+          <w:tcPr>
+            <w:tcW w:type="dxa" w:w="4320"/>
+          </w:tcPr>
+          <w:p>
+            <w:pPr>
+              <w:spacing w:line="240" w:lineRule="auto"/>
+            </w:pPr>
+            <w:r>
+              <w:rPr>
+                <w:rFonts w:ascii="Times New Roman" w:hAnsi="Times New Roman" w:eastAsia="Times New Roman"/>
+                <w:b w:val="0"/>
+                <w:caps w:val="0"/>
+                <w:sz w:val="22"/>
+              </w:rPr>
+              <w:t>47</w:t>
+            </w:r>
+          </w:p>
+        </w:tc>
+      </w:tr>
+      <w:tr>
+        <w:tc>
+          <w:tcPr>
+            <w:tcW w:type="dxa" w:w="4320"/>
+          </w:tcPr>
+          <w:p>
+            <w:pPr>
+              <w:spacing w:line="240" w:lineRule="auto"/>
+            </w:pPr>
+            <w:r>
+              <w:rPr>
+                <w:rFonts w:ascii="Times New Roman" w:hAnsi="Times New Roman" w:eastAsia="Times New Roman"/>
+                <w:b w:val="0"/>
+                <w:caps w:val="0"/>
+                <w:sz w:val="22"/>
+              </w:rPr>
+              <w:t>large_class_loc</w:t>
+            </w:r>
+          </w:p>
+        </w:tc>
+        <w:tc>
+          <w:tcPr>
+            <w:tcW w:type="dxa" w:w="4320"/>
+          </w:tcPr>
+          <w:p>
+            <w:pPr>
+              <w:spacing w:line="240" w:lineRule="auto"/>
+            </w:pPr>
+            <w:r>
+              <w:rPr>
+                <w:rFonts w:ascii="Times New Roman" w:hAnsi="Times New Roman" w:eastAsia="Times New Roman"/>
+                <w:b w:val="0"/>
+                <w:caps w:val="0"/>
+                <w:sz w:val="22"/>
+              </w:rPr>
+              <w:t>200</w:t>
+            </w:r>
+          </w:p>
+        </w:tc>
+      </w:tr>
+      <w:tr>
+        <w:tc>
+          <w:tcPr>
+            <w:tcW w:type="dxa" w:w="4320"/>
+          </w:tcPr>
+          <w:p>
+            <w:pPr>
+              <w:spacing w:line="240" w:lineRule="auto"/>
+            </w:pPr>
+            <w:r>
+              <w:rPr>
+                <w:rFonts w:ascii="Times New Roman" w:hAnsi="Times New Roman" w:eastAsia="Times New Roman"/>
+                <w:b w:val="0"/>
+                <w:caps w:val="0"/>
+                <w:sz w:val="22"/>
+              </w:rPr>
+              <w:t>large_class_nom</w:t>
+            </w:r>
+          </w:p>
+        </w:tc>
+        <w:tc>
+          <w:tcPr>
+            <w:tcW w:type="dxa" w:w="4320"/>
+          </w:tcPr>
+          <w:p>
+            <w:pPr>
+              <w:spacing w:line="240" w:lineRule="auto"/>
+            </w:pPr>
+            <w:r>
+              <w:rPr>
+                <w:rFonts w:ascii="Times New Roman" w:hAnsi="Times New Roman" w:eastAsia="Times New Roman"/>
+                <w:b w:val="0"/>
+                <w:caps w:val="0"/>
+                <w:sz w:val="22"/>
+              </w:rPr>
+              <w:t>20</w:t>
+            </w:r>
+          </w:p>
+        </w:tc>
+      </w:tr>
+      <w:tr>
+        <w:tc>
+          <w:tcPr>
+            <w:tcW w:type="dxa" w:w="4320"/>
+          </w:tcPr>
+          <w:p>
+            <w:pPr>
+              <w:spacing w:line="240" w:lineRule="auto"/>
+            </w:pPr>
+            <w:r>
+              <w:rPr>
+                <w:rFonts w:ascii="Times New Roman" w:hAnsi="Times New Roman" w:eastAsia="Times New Roman"/>
+                <w:b w:val="0"/>
+                <w:caps w:val="0"/>
+                <w:sz w:val="22"/>
+              </w:rPr>
+              <w:t>long_method_loc</w:t>
+            </w:r>
+          </w:p>
+        </w:tc>
+        <w:tc>
+          <w:tcPr>
+            <w:tcW w:type="dxa" w:w="4320"/>
+          </w:tcPr>
+          <w:p>
+            <w:pPr>
+              <w:spacing w:line="240" w:lineRule="auto"/>
+            </w:pPr>
+            <w:r>
+              <w:rPr>
+                <w:rFonts w:ascii="Times New Roman" w:hAnsi="Times New Roman" w:eastAsia="Times New Roman"/>
+                <w:b w:val="0"/>
+                <w:caps w:val="0"/>
+                <w:sz w:val="22"/>
+              </w:rPr>
+              <w:t>30</w:t>
+            </w:r>
+          </w:p>
+        </w:tc>
+      </w:tr>
+      <w:tr>
+        <w:tc>
+          <w:tcPr>
+            <w:tcW w:type="dxa" w:w="4320"/>
+          </w:tcPr>
+          <w:p>
+            <w:pPr>
+              <w:spacing w:line="240" w:lineRule="auto"/>
+            </w:pPr>
+            <w:r>
+              <w:rPr>
+                <w:rFonts w:ascii="Times New Roman" w:hAnsi="Times New Roman" w:eastAsia="Times New Roman"/>
+                <w:b w:val="0"/>
+                <w:caps w:val="0"/>
+                <w:sz w:val="22"/>
+              </w:rPr>
+              <w:t>long_parameter_list_np</w:t>
+            </w:r>
+          </w:p>
+        </w:tc>
+        <w:tc>
+          <w:tcPr>
+            <w:tcW w:type="dxa" w:w="4320"/>
+          </w:tcPr>
+          <w:p>
+            <w:pPr>
+              <w:spacing w:line="240" w:lineRule="auto"/>
+            </w:pPr>
+            <w:r>
+              <w:rPr>
+                <w:rFonts w:ascii="Times New Roman" w:hAnsi="Times New Roman" w:eastAsia="Times New Roman"/>
+                <w:b w:val="0"/>
+                <w:caps w:val="0"/>
+                <w:sz w:val="22"/>
+              </w:rPr>
+              <w:t>5</w:t>
+            </w:r>
+          </w:p>
+        </w:tc>
+      </w:tr>
+    </w:tbl>
+    <w:p>
+      <w:pPr>
+        <w:spacing w:line="240" w:lineRule="auto" w:after="0"/>
+      </w:pPr>
+    </w:p>
+    <w:p>
+      <w:pPr>
+        <w:pStyle w:val="Heading2"/>
+      </w:pPr>
+      <w:r>
+        <w:rPr>
+          <w:rFonts w:ascii="Times New Roman" w:hAnsi="Times New Roman" w:eastAsia="Times New Roman"/>
+          <w:b/>
+          <w:caps w:val="0"/>
+          <w:sz w:val="24"/>
+        </w:rPr>
+        <w:t>8.3 Metrikat e matura</w:t>
+      </w:r>
+    </w:p>
+    <w:p>
+      <w:pPr>
+        <w:spacing w:line="360" w:lineRule="auto"/>
+        <w:ind w:firstLine="360"/>
+        <w:jc w:val="both"/>
+      </w:pPr>
+      <w:r>
+        <w:rPr>
+          <w:rFonts w:ascii="Times New Roman" w:hAnsi="Times New Roman" w:eastAsia="Times New Roman"/>
+          <w:b w:val="0"/>
+          <w:caps w:val="0"/>
+          <w:sz w:val="24"/>
+        </w:rPr>
+        <w:t>Çdo entitet matet një herë dhe të gjitha metrikat shkojnë në tabelën e veçorive, edhe ato që asnjë strategji nuk i përdor: modelet e Qasjes B i shohin të gjitha, dhe pikërisht kjo e bën të përgjigjshme pyetjen nëse ato zgjedhin metrikat e strategjive. Kuptimi i shkurtesave jepet te Fjalori i termave.</w:t>
+      </w:r>
+    </w:p>
+    <w:p>
+      <w:pPr>
+        <w:spacing w:line="240" w:lineRule="auto"/>
+        <w:jc w:val="center"/>
+      </w:pPr>
+      <w:r>
+        <w:rPr>
+          <w:rFonts w:ascii="Times New Roman" w:hAnsi="Times New Roman" w:eastAsia="Times New Roman"/>
+          <w:b w:val="0"/>
+          <w:caps w:val="0"/>
+          <w:sz w:val="22"/>
+        </w:rPr>
+        <w:t>Tabela 12. Metrikat sipas nivelit</w:t>
+      </w:r>
+    </w:p>
+    <w:tbl>
+      <w:tblPr>
+        <w:tblStyle w:val="TableGrid"/>
+        <w:tblW w:type="auto" w:w="0"/>
+        <w:tblLook w:firstColumn="1" w:firstRow="1" w:lastColumn="0" w:lastRow="0" w:noHBand="0" w:noVBand="1" w:val="04A0"/>
+      </w:tblPr>
+      <w:tblGrid>
+        <w:gridCol w:w="4320"/>
+        <w:gridCol w:w="4320"/>
+      </w:tblGrid>
+      <w:tr>
+        <w:tc>
+          <w:tcPr>
+            <w:tcW w:type="dxa" w:w="4320"/>
+          </w:tcPr>
+          <w:p>
+            <w:pPr>
+              <w:spacing w:line="240" w:lineRule="auto"/>
+            </w:pPr>
+            <w:r>
+              <w:rPr>
+                <w:rFonts w:ascii="Times New Roman" w:hAnsi="Times New Roman" w:eastAsia="Times New Roman"/>
+                <w:b/>
+                <w:caps w:val="0"/>
+                <w:sz w:val="22"/>
+              </w:rPr>
+              <w:t>Niveli</w:t>
+            </w:r>
+          </w:p>
+        </w:tc>
+        <w:tc>
+          <w:tcPr>
+            <w:tcW w:type="dxa" w:w="4320"/>
+          </w:tcPr>
+          <w:p>
+            <w:pPr>
+              <w:spacing w:line="240" w:lineRule="auto"/>
+            </w:pPr>
+            <w:r>
+              <w:rPr>
+                <w:rFonts w:ascii="Times New Roman" w:hAnsi="Times New Roman" w:eastAsia="Times New Roman"/>
+                <w:b/>
+                <w:caps w:val="0"/>
+                <w:sz w:val="22"/>
+              </w:rPr>
+              <w:t>Metrikat</w:t>
+            </w:r>
+          </w:p>
+        </w:tc>
+      </w:tr>
+      <w:tr>
+        <w:tc>
+          <w:tcPr>
+            <w:tcW w:type="dxa" w:w="4320"/>
+          </w:tcPr>
+          <w:p>
+            <w:pPr>
+              <w:spacing w:line="240" w:lineRule="auto"/>
+            </w:pPr>
+            <w:r>
+              <w:rPr>
+                <w:rFonts w:ascii="Times New Roman" w:hAnsi="Times New Roman" w:eastAsia="Times New Roman"/>
+                <w:b w:val="0"/>
+                <w:caps w:val="0"/>
+                <w:sz w:val="22"/>
+              </w:rPr>
+              <w:t>Klasë (17)</w:t>
+            </w:r>
+          </w:p>
+        </w:tc>
+        <w:tc>
+          <w:tcPr>
+            <w:tcW w:type="dxa" w:w="4320"/>
+          </w:tcPr>
+          <w:p>
+            <w:pPr>
+              <w:spacing w:line="240" w:lineRule="auto"/>
+            </w:pPr>
+            <w:r>
+              <w:rPr>
+                <w:rFonts w:ascii="Times New Roman" w:hAnsi="Times New Roman" w:eastAsia="Times New Roman"/>
+                <w:b w:val="0"/>
+                <w:caps w:val="0"/>
+                <w:sz w:val="22"/>
+              </w:rPr>
+              <w:t>AMW, ATFD, CBO, CLOC, DIT, LCOM, LCOM3, MAXCC, NOAM, NOC, NOF, NOM, NOPA, RFC, TCC, WMC, WOC</w:t>
+            </w:r>
+          </w:p>
+        </w:tc>
+      </w:tr>
+      <w:tr>
+        <w:tc>
+          <w:tcPr>
+            <w:tcW w:type="dxa" w:w="4320"/>
+          </w:tcPr>
+          <w:p>
+            <w:pPr>
+              <w:spacing w:line="240" w:lineRule="auto"/>
+            </w:pPr>
+            <w:r>
+              <w:rPr>
+                <w:rFonts w:ascii="Times New Roman" w:hAnsi="Times New Roman" w:eastAsia="Times New Roman"/>
+                <w:b w:val="0"/>
+                <w:caps w:val="0"/>
+                <w:sz w:val="22"/>
+              </w:rPr>
+              <w:t>Metodë (9)</w:t>
+            </w:r>
+          </w:p>
+        </w:tc>
+        <w:tc>
+          <w:tcPr>
+            <w:tcW w:type="dxa" w:w="4320"/>
+          </w:tcPr>
+          <w:p>
+            <w:pPr>
+              <w:spacing w:line="240" w:lineRule="auto"/>
+            </w:pPr>
+            <w:r>
+              <w:rPr>
+                <w:rFonts w:ascii="Times New Roman" w:hAnsi="Times New Roman" w:eastAsia="Times New Roman"/>
+                <w:b w:val="0"/>
+                <w:caps w:val="0"/>
+                <w:sz w:val="22"/>
+              </w:rPr>
+              <w:t>ATFD, CC, CINT, FDP, LAA, MAXNESTING, MLOC, NOAV, NP</w:t>
+            </w:r>
+          </w:p>
+        </w:tc>
+      </w:tr>
+    </w:tbl>
+    <w:p>
+      <w:pPr>
+        <w:spacing w:line="240" w:lineRule="auto" w:after="0"/>
+      </w:pPr>
+    </w:p>
+    <w:p>
+      <w:pPr>
+        <w:pStyle w:val="Heading2"/>
+      </w:pPr>
+      <w:r>
+        <w:rPr>
+          <w:rFonts w:ascii="Times New Roman" w:hAnsi="Times New Roman" w:eastAsia="Times New Roman"/>
+          <w:b/>
+          <w:caps w:val="0"/>
+          <w:sz w:val="24"/>
+        </w:rPr>
+        <w:t>8.4 Refaktorimet dhe arsyet e refuzimit</w:t>
+      </w:r>
+    </w:p>
+    <w:p>
+      <w:pPr>
+        <w:spacing w:line="360" w:lineRule="auto"/>
+        <w:ind w:firstLine="360"/>
+        <w:jc w:val="both"/>
+      </w:pPr>
+      <w:r>
+        <w:rPr>
+          <w:rFonts w:ascii="Times New Roman" w:hAnsi="Times New Roman" w:eastAsia="Times New Roman"/>
+          <w:b w:val="0"/>
+          <w:caps w:val="0"/>
+          <w:sz w:val="24"/>
+        </w:rPr>
+        <w:t>Kolona e fundit dallon çka propozon sistemi nga çka aplikon. Dallimi nuk vjen nga koha e zhvillimit: transformimet e mbetura kërkojnë gjetjen e çdo reference në projekt, çka analiza sintaksore nuk e provon dot.</w:t>
+      </w:r>
+    </w:p>
+    <w:p>
+      <w:pPr>
+        <w:spacing w:line="240" w:lineRule="auto"/>
+        <w:jc w:val="center"/>
+      </w:pPr>
+      <w:r>
+        <w:rPr>
+          <w:rFonts w:ascii="Times New Roman" w:hAnsi="Times New Roman" w:eastAsia="Times New Roman"/>
+          <w:b w:val="0"/>
+          <w:caps w:val="0"/>
+          <w:sz w:val="22"/>
+        </w:rPr>
+        <w:t>Tabela 13. Çka propozohet dhe çka aplikohet</w:t>
+      </w:r>
+    </w:p>
+    <w:tbl>
+      <w:tblPr>
+        <w:tblStyle w:val="TableGrid"/>
+        <w:tblW w:type="auto" w:w="0"/>
+        <w:tblLook w:firstColumn="1" w:firstRow="1" w:lastColumn="0" w:lastRow="0" w:noHBand="0" w:noVBand="1" w:val="04A0"/>
+      </w:tblPr>
+      <w:tblGrid>
+        <w:gridCol w:w="2880"/>
+        <w:gridCol w:w="2880"/>
+        <w:gridCol w:w="2880"/>
+      </w:tblGrid>
+      <w:tr>
+        <w:tc>
+          <w:tcPr>
+            <w:tcW w:type="dxa" w:w="2880"/>
+          </w:tcPr>
+          <w:p>
+            <w:pPr>
+              <w:spacing w:line="240" w:lineRule="auto"/>
+            </w:pPr>
+            <w:r>
+              <w:rPr>
+                <w:rFonts w:ascii="Times New Roman" w:hAnsi="Times New Roman" w:eastAsia="Times New Roman"/>
+                <w:b/>
+                <w:caps w:val="0"/>
+                <w:sz w:val="22"/>
+              </w:rPr>
+              <w:t>Erë</w:t>
+            </w:r>
+          </w:p>
+        </w:tc>
+        <w:tc>
+          <w:tcPr>
+            <w:tcW w:type="dxa" w:w="2880"/>
+          </w:tcPr>
+          <w:p>
+            <w:pPr>
+              <w:spacing w:line="240" w:lineRule="auto"/>
+            </w:pPr>
+            <w:r>
+              <w:rPr>
+                <w:rFonts w:ascii="Times New Roman" w:hAnsi="Times New Roman" w:eastAsia="Times New Roman"/>
+                <w:b/>
+                <w:caps w:val="0"/>
+                <w:sz w:val="22"/>
+              </w:rPr>
+              <w:t>Refaktorimet e Fowler-it</w:t>
+            </w:r>
+          </w:p>
+        </w:tc>
+        <w:tc>
+          <w:tcPr>
+            <w:tcW w:type="dxa" w:w="2880"/>
+          </w:tcPr>
+          <w:p>
+            <w:pPr>
+              <w:spacing w:line="240" w:lineRule="auto"/>
+            </w:pPr>
+            <w:r>
+              <w:rPr>
+                <w:rFonts w:ascii="Times New Roman" w:hAnsi="Times New Roman" w:eastAsia="Times New Roman"/>
+                <w:b/>
+                <w:caps w:val="0"/>
+                <w:sz w:val="22"/>
+              </w:rPr>
+              <w:t>Motori</w:t>
+            </w:r>
+          </w:p>
+        </w:tc>
+      </w:tr>
+      <w:tr>
+        <w:tc>
+          <w:tcPr>
+            <w:tcW w:type="dxa" w:w="2880"/>
+          </w:tcPr>
+          <w:p>
+            <w:pPr>
+              <w:spacing w:line="240" w:lineRule="auto"/>
+            </w:pPr>
+            <w:r>
+              <w:rPr>
+                <w:rFonts w:ascii="Times New Roman" w:hAnsi="Times New Roman" w:eastAsia="Times New Roman"/>
+                <w:b w:val="0"/>
+                <w:caps w:val="0"/>
+                <w:sz w:val="22"/>
+              </w:rPr>
+              <w:t>GodClass</w:t>
+            </w:r>
+          </w:p>
+        </w:tc>
+        <w:tc>
+          <w:tcPr>
+            <w:tcW w:type="dxa" w:w="2880"/>
+          </w:tcPr>
+          <w:p>
+            <w:pPr>
+              <w:spacing w:line="240" w:lineRule="auto"/>
+            </w:pPr>
+            <w:r>
+              <w:rPr>
+                <w:rFonts w:ascii="Times New Roman" w:hAnsi="Times New Roman" w:eastAsia="Times New Roman"/>
+                <w:b w:val="0"/>
+                <w:caps w:val="0"/>
+                <w:sz w:val="22"/>
+              </w:rPr>
+              <w:t>ExtractClass, MoveMethod, ExtractSubclass</w:t>
+            </w:r>
+          </w:p>
+        </w:tc>
+        <w:tc>
+          <w:tcPr>
+            <w:tcW w:type="dxa" w:w="2880"/>
+          </w:tcPr>
+          <w:p>
+            <w:pPr>
+              <w:spacing w:line="240" w:lineRule="auto"/>
+            </w:pPr>
+            <w:r>
+              <w:rPr>
+                <w:rFonts w:ascii="Times New Roman" w:hAnsi="Times New Roman" w:eastAsia="Times New Roman"/>
+                <w:b w:val="0"/>
+                <w:caps w:val="0"/>
+                <w:sz w:val="22"/>
+              </w:rPr>
+              <w:t>vetëm propozohet</w:t>
+            </w:r>
+          </w:p>
+        </w:tc>
+      </w:tr>
+      <w:tr>
+        <w:tc>
+          <w:tcPr>
+            <w:tcW w:type="dxa" w:w="2880"/>
+          </w:tcPr>
+          <w:p>
+            <w:pPr>
+              <w:spacing w:line="240" w:lineRule="auto"/>
+            </w:pPr>
+            <w:r>
+              <w:rPr>
+                <w:rFonts w:ascii="Times New Roman" w:hAnsi="Times New Roman" w:eastAsia="Times New Roman"/>
+                <w:b w:val="0"/>
+                <w:caps w:val="0"/>
+                <w:sz w:val="22"/>
+              </w:rPr>
+              <w:t>DataClass</w:t>
+            </w:r>
+          </w:p>
+        </w:tc>
+        <w:tc>
+          <w:tcPr>
+            <w:tcW w:type="dxa" w:w="2880"/>
+          </w:tcPr>
+          <w:p>
+            <w:pPr>
+              <w:spacing w:line="240" w:lineRule="auto"/>
+            </w:pPr>
+            <w:r>
+              <w:rPr>
+                <w:rFonts w:ascii="Times New Roman" w:hAnsi="Times New Roman" w:eastAsia="Times New Roman"/>
+                <w:b w:val="0"/>
+                <w:caps w:val="0"/>
+                <w:sz w:val="22"/>
+              </w:rPr>
+              <w:t>EncapsulateField, MoveMethod</w:t>
+            </w:r>
+          </w:p>
+        </w:tc>
+        <w:tc>
+          <w:tcPr>
+            <w:tcW w:type="dxa" w:w="2880"/>
+          </w:tcPr>
+          <w:p>
+            <w:pPr>
+              <w:spacing w:line="240" w:lineRule="auto"/>
+            </w:pPr>
+            <w:r>
+              <w:rPr>
+                <w:rFonts w:ascii="Times New Roman" w:hAnsi="Times New Roman" w:eastAsia="Times New Roman"/>
+                <w:b w:val="0"/>
+                <w:caps w:val="0"/>
+                <w:sz w:val="22"/>
+              </w:rPr>
+              <w:t>vetëm propozohet</w:t>
+            </w:r>
+          </w:p>
+        </w:tc>
+      </w:tr>
+      <w:tr>
+        <w:tc>
+          <w:tcPr>
+            <w:tcW w:type="dxa" w:w="2880"/>
+          </w:tcPr>
+          <w:p>
+            <w:pPr>
+              <w:spacing w:line="240" w:lineRule="auto"/>
+            </w:pPr>
+            <w:r>
+              <w:rPr>
+                <w:rFonts w:ascii="Times New Roman" w:hAnsi="Times New Roman" w:eastAsia="Times New Roman"/>
+                <w:b w:val="0"/>
+                <w:caps w:val="0"/>
+                <w:sz w:val="22"/>
+              </w:rPr>
+              <w:t>LargeClass</w:t>
+            </w:r>
+          </w:p>
+        </w:tc>
+        <w:tc>
+          <w:tcPr>
+            <w:tcW w:type="dxa" w:w="2880"/>
+          </w:tcPr>
+          <w:p>
+            <w:pPr>
+              <w:spacing w:line="240" w:lineRule="auto"/>
+            </w:pPr>
+            <w:r>
+              <w:rPr>
+                <w:rFonts w:ascii="Times New Roman" w:hAnsi="Times New Roman" w:eastAsia="Times New Roman"/>
+                <w:b w:val="0"/>
+                <w:caps w:val="0"/>
+                <w:sz w:val="22"/>
+              </w:rPr>
+              <w:t>ExtractClass, ExtractSubclass</w:t>
+            </w:r>
+          </w:p>
+        </w:tc>
+        <w:tc>
+          <w:tcPr>
+            <w:tcW w:type="dxa" w:w="2880"/>
+          </w:tcPr>
+          <w:p>
+            <w:pPr>
+              <w:spacing w:line="240" w:lineRule="auto"/>
+            </w:pPr>
+            <w:r>
+              <w:rPr>
+                <w:rFonts w:ascii="Times New Roman" w:hAnsi="Times New Roman" w:eastAsia="Times New Roman"/>
+                <w:b w:val="0"/>
+                <w:caps w:val="0"/>
+                <w:sz w:val="22"/>
+              </w:rPr>
+              <w:t>vetëm propozohet</w:t>
+            </w:r>
+          </w:p>
+        </w:tc>
+      </w:tr>
+      <w:tr>
+        <w:tc>
+          <w:tcPr>
+            <w:tcW w:type="dxa" w:w="2880"/>
+          </w:tcPr>
+          <w:p>
+            <w:pPr>
+              <w:spacing w:line="240" w:lineRule="auto"/>
+            </w:pPr>
+            <w:r>
+              <w:rPr>
+                <w:rFonts w:ascii="Times New Roman" w:hAnsi="Times New Roman" w:eastAsia="Times New Roman"/>
+                <w:b w:val="0"/>
+                <w:caps w:val="0"/>
+                <w:sz w:val="22"/>
+              </w:rPr>
+              <w:t>FeatureEnvy</w:t>
+            </w:r>
+          </w:p>
+        </w:tc>
+        <w:tc>
+          <w:tcPr>
+            <w:tcW w:type="dxa" w:w="2880"/>
+          </w:tcPr>
+          <w:p>
+            <w:pPr>
+              <w:spacing w:line="240" w:lineRule="auto"/>
+            </w:pPr>
+            <w:r>
+              <w:rPr>
+                <w:rFonts w:ascii="Times New Roman" w:hAnsi="Times New Roman" w:eastAsia="Times New Roman"/>
+                <w:b w:val="0"/>
+                <w:caps w:val="0"/>
+                <w:sz w:val="22"/>
+              </w:rPr>
+              <w:t>MoveMethod, ExtractMethod</w:t>
+            </w:r>
+          </w:p>
+        </w:tc>
+        <w:tc>
+          <w:tcPr>
+            <w:tcW w:type="dxa" w:w="2880"/>
+          </w:tcPr>
+          <w:p>
+            <w:pPr>
+              <w:spacing w:line="240" w:lineRule="auto"/>
+            </w:pPr>
+            <w:r>
+              <w:rPr>
+                <w:rFonts w:ascii="Times New Roman" w:hAnsi="Times New Roman" w:eastAsia="Times New Roman"/>
+                <w:b w:val="0"/>
+                <w:caps w:val="0"/>
+                <w:sz w:val="22"/>
+              </w:rPr>
+              <w:t>vetëm propozohet</w:t>
+            </w:r>
+          </w:p>
+        </w:tc>
+      </w:tr>
+      <w:tr>
+        <w:tc>
+          <w:tcPr>
+            <w:tcW w:type="dxa" w:w="2880"/>
+          </w:tcPr>
+          <w:p>
+            <w:pPr>
+              <w:spacing w:line="240" w:lineRule="auto"/>
+            </w:pPr>
+            <w:r>
+              <w:rPr>
+                <w:rFonts w:ascii="Times New Roman" w:hAnsi="Times New Roman" w:eastAsia="Times New Roman"/>
+                <w:b w:val="0"/>
+                <w:caps w:val="0"/>
+                <w:sz w:val="22"/>
+              </w:rPr>
+              <w:t>BrainMethod</w:t>
+            </w:r>
+          </w:p>
+        </w:tc>
+        <w:tc>
+          <w:tcPr>
+            <w:tcW w:type="dxa" w:w="2880"/>
+          </w:tcPr>
+          <w:p>
+            <w:pPr>
+              <w:spacing w:line="240" w:lineRule="auto"/>
+            </w:pPr>
+            <w:r>
+              <w:rPr>
+                <w:rFonts w:ascii="Times New Roman" w:hAnsi="Times New Roman" w:eastAsia="Times New Roman"/>
+                <w:b w:val="0"/>
+                <w:caps w:val="0"/>
+                <w:sz w:val="22"/>
+              </w:rPr>
+              <w:t>ExtractMethod, ReplaceConditionalWithPolymorphism</w:t>
+            </w:r>
+          </w:p>
+        </w:tc>
+        <w:tc>
+          <w:tcPr>
+            <w:tcW w:type="dxa" w:w="2880"/>
+          </w:tcPr>
+          <w:p>
+            <w:pPr>
+              <w:spacing w:line="240" w:lineRule="auto"/>
+            </w:pPr>
+            <w:r>
+              <w:rPr>
+                <w:rFonts w:ascii="Times New Roman" w:hAnsi="Times New Roman" w:eastAsia="Times New Roman"/>
+                <w:b w:val="0"/>
+                <w:caps w:val="0"/>
+                <w:sz w:val="22"/>
+              </w:rPr>
+              <w:t>aplikohet: ExtractMethod</w:t>
+            </w:r>
+          </w:p>
+        </w:tc>
+      </w:tr>
+      <w:tr>
+        <w:tc>
+          <w:tcPr>
+            <w:tcW w:type="dxa" w:w="2880"/>
+          </w:tcPr>
+          <w:p>
+            <w:pPr>
+              <w:spacing w:line="240" w:lineRule="auto"/>
+            </w:pPr>
+            <w:r>
+              <w:rPr>
+                <w:rFonts w:ascii="Times New Roman" w:hAnsi="Times New Roman" w:eastAsia="Times New Roman"/>
+                <w:b w:val="0"/>
+                <w:caps w:val="0"/>
+                <w:sz w:val="22"/>
+              </w:rPr>
+              <w:t>LongMethod</w:t>
+            </w:r>
+          </w:p>
+        </w:tc>
+        <w:tc>
+          <w:tcPr>
+            <w:tcW w:type="dxa" w:w="2880"/>
+          </w:tcPr>
+          <w:p>
+            <w:pPr>
+              <w:spacing w:line="240" w:lineRule="auto"/>
+            </w:pPr>
+            <w:r>
+              <w:rPr>
+                <w:rFonts w:ascii="Times New Roman" w:hAnsi="Times New Roman" w:eastAsia="Times New Roman"/>
+                <w:b w:val="0"/>
+                <w:caps w:val="0"/>
+                <w:sz w:val="22"/>
+              </w:rPr>
+              <w:t>ExtractMethod, DecomposeConditional</w:t>
+            </w:r>
+          </w:p>
+        </w:tc>
+        <w:tc>
+          <w:tcPr>
+            <w:tcW w:type="dxa" w:w="2880"/>
+          </w:tcPr>
+          <w:p>
+            <w:pPr>
+              <w:spacing w:line="240" w:lineRule="auto"/>
+            </w:pPr>
+            <w:r>
+              <w:rPr>
+                <w:rFonts w:ascii="Times New Roman" w:hAnsi="Times New Roman" w:eastAsia="Times New Roman"/>
+                <w:b w:val="0"/>
+                <w:caps w:val="0"/>
+                <w:sz w:val="22"/>
+              </w:rPr>
+              <w:t>aplikohet: ExtractMethod</w:t>
+            </w:r>
+          </w:p>
+        </w:tc>
+      </w:tr>
+      <w:tr>
+        <w:tc>
+          <w:tcPr>
+            <w:tcW w:type="dxa" w:w="2880"/>
+          </w:tcPr>
+          <w:p>
+            <w:pPr>
+              <w:spacing w:line="240" w:lineRule="auto"/>
+            </w:pPr>
+            <w:r>
+              <w:rPr>
+                <w:rFonts w:ascii="Times New Roman" w:hAnsi="Times New Roman" w:eastAsia="Times New Roman"/>
+                <w:b w:val="0"/>
+                <w:caps w:val="0"/>
+                <w:sz w:val="22"/>
+              </w:rPr>
+              <w:t>LongParameterList</w:t>
+            </w:r>
+          </w:p>
+        </w:tc>
+        <w:tc>
+          <w:tcPr>
+            <w:tcW w:type="dxa" w:w="2880"/>
+          </w:tcPr>
+          <w:p>
+            <w:pPr>
+              <w:spacing w:line="240" w:lineRule="auto"/>
+            </w:pPr>
+            <w:r>
+              <w:rPr>
+                <w:rFonts w:ascii="Times New Roman" w:hAnsi="Times New Roman" w:eastAsia="Times New Roman"/>
+                <w:b w:val="0"/>
+                <w:caps w:val="0"/>
+                <w:sz w:val="22"/>
+              </w:rPr>
+              <w:t>IntroduceParameterObject, PreserveWholeObject</w:t>
+            </w:r>
+          </w:p>
+        </w:tc>
+        <w:tc>
+          <w:tcPr>
+            <w:tcW w:type="dxa" w:w="2880"/>
+          </w:tcPr>
+          <w:p>
+            <w:pPr>
+              <w:spacing w:line="240" w:lineRule="auto"/>
+            </w:pPr>
+            <w:r>
+              <w:rPr>
+                <w:rFonts w:ascii="Times New Roman" w:hAnsi="Times New Roman" w:eastAsia="Times New Roman"/>
+                <w:b w:val="0"/>
+                <w:caps w:val="0"/>
+                <w:sz w:val="22"/>
+              </w:rPr>
+              <w:t>vetëm propozohet</w:t>
+            </w:r>
+          </w:p>
+        </w:tc>
+      </w:tr>
+      <w:tr>
+        <w:tc>
+          <w:tcPr>
+            <w:tcW w:type="dxa" w:w="2880"/>
+          </w:tcPr>
+          <w:p>
+            <w:pPr>
+              <w:spacing w:line="240" w:lineRule="auto"/>
+            </w:pPr>
+            <w:r>
+              <w:rPr>
+                <w:rFonts w:ascii="Times New Roman" w:hAnsi="Times New Roman" w:eastAsia="Times New Roman"/>
+                <w:b w:val="0"/>
+                <w:caps w:val="0"/>
+                <w:sz w:val="22"/>
+              </w:rPr>
+              <w:t>DeepNesting</w:t>
+            </w:r>
+          </w:p>
+        </w:tc>
+        <w:tc>
+          <w:tcPr>
+            <w:tcW w:type="dxa" w:w="2880"/>
+          </w:tcPr>
+          <w:p>
+            <w:pPr>
+              <w:spacing w:line="240" w:lineRule="auto"/>
+            </w:pPr>
+            <w:r>
+              <w:rPr>
+                <w:rFonts w:ascii="Times New Roman" w:hAnsi="Times New Roman" w:eastAsia="Times New Roman"/>
+                <w:b w:val="0"/>
+                <w:caps w:val="0"/>
+                <w:sz w:val="22"/>
+              </w:rPr>
+              <w:t>ReplaceNestedConditionalWithGuardClauses, ExtractMethod</w:t>
+            </w:r>
+          </w:p>
+        </w:tc>
+        <w:tc>
+          <w:tcPr>
+            <w:tcW w:type="dxa" w:w="2880"/>
+          </w:tcPr>
+          <w:p>
+            <w:pPr>
+              <w:spacing w:line="240" w:lineRule="auto"/>
+            </w:pPr>
+            <w:r>
+              <w:rPr>
+                <w:rFonts w:ascii="Times New Roman" w:hAnsi="Times New Roman" w:eastAsia="Times New Roman"/>
+                <w:b w:val="0"/>
+                <w:caps w:val="0"/>
+                <w:sz w:val="22"/>
+              </w:rPr>
+              <w:t>aplikohet: ReplaceNestedConditionalWithGuardClauses</w:t>
+            </w:r>
+          </w:p>
+        </w:tc>
+      </w:tr>
+    </w:tbl>
+    <w:p>
+      <w:pPr>
+        <w:spacing w:line="240" w:lineRule="auto" w:after="0"/>
+      </w:pPr>
+    </w:p>
+    <w:p>
+      <w:pPr>
+        <w:spacing w:line="360" w:lineRule="auto"/>
+        <w:ind w:firstLine="360"/>
+        <w:jc w:val="both"/>
+      </w:pPr>
+      <w:r>
+        <w:rPr>
+          <w:rFonts w:ascii="Times New Roman" w:hAnsi="Times New Roman" w:eastAsia="Times New Roman"/>
+          <w:b w:val="0"/>
+          <w:caps w:val="0"/>
+          <w:sz w:val="24"/>
+        </w:rPr>
+        <w:t>Kur një parakusht nuk provohet, motori refuzon me një arsye të numërueshme. Shpërndarja e tyre mbi korpus është në Tabelën 7.</w:t>
+      </w:r>
+    </w:p>
+    <w:p>
+      <w:pPr>
+        <w:spacing w:line="240" w:lineRule="auto"/>
+        <w:jc w:val="center"/>
+      </w:pPr>
+      <w:r>
+        <w:rPr>
+          <w:rFonts w:ascii="Times New Roman" w:hAnsi="Times New Roman" w:eastAsia="Times New Roman"/>
+          <w:b w:val="0"/>
+          <w:caps w:val="0"/>
+          <w:sz w:val="22"/>
+        </w:rPr>
+        <w:t>Tabela 14. Arsyet e refuzimit</w:t>
+      </w:r>
+    </w:p>
+    <w:tbl>
+      <w:tblPr>
+        <w:tblStyle w:val="TableGrid"/>
+        <w:tblW w:type="auto" w:w="0"/>
+        <w:tblLook w:firstColumn="1" w:firstRow="1" w:lastColumn="0" w:lastRow="0" w:noHBand="0" w:noVBand="1" w:val="04A0"/>
+      </w:tblPr>
+      <w:tblGrid>
+        <w:gridCol w:w="4320"/>
+        <w:gridCol w:w="4320"/>
+      </w:tblGrid>
+      <w:tr>
+        <w:tc>
+          <w:tcPr>
+            <w:tcW w:type="dxa" w:w="4320"/>
+          </w:tcPr>
+          <w:p>
+            <w:pPr>
+              <w:spacing w:line="240" w:lineRule="auto"/>
+            </w:pPr>
+            <w:r>
+              <w:rPr>
+                <w:rFonts w:ascii="Times New Roman" w:hAnsi="Times New Roman" w:eastAsia="Times New Roman"/>
+                <w:b/>
+                <w:caps w:val="0"/>
+                <w:sz w:val="22"/>
+              </w:rPr>
+              <w:t>Arsyeja</w:t>
+            </w:r>
+          </w:p>
+        </w:tc>
+        <w:tc>
+          <w:tcPr>
+            <w:tcW w:type="dxa" w:w="4320"/>
+          </w:tcPr>
+          <w:p>
+            <w:pPr>
+              <w:spacing w:line="240" w:lineRule="auto"/>
+            </w:pPr>
+            <w:r>
+              <w:rPr>
+                <w:rFonts w:ascii="Times New Roman" w:hAnsi="Times New Roman" w:eastAsia="Times New Roman"/>
+                <w:b/>
+                <w:caps w:val="0"/>
+                <w:sz w:val="22"/>
+              </w:rPr>
+              <w:t>Kuptimi</w:t>
+            </w:r>
+          </w:p>
+        </w:tc>
+      </w:tr>
+      <w:tr>
+        <w:tc>
+          <w:tcPr>
+            <w:tcW w:type="dxa" w:w="4320"/>
+          </w:tcPr>
+          <w:p>
+            <w:pPr>
+              <w:spacing w:line="240" w:lineRule="auto"/>
+            </w:pPr>
+            <w:r>
+              <w:rPr>
+                <w:rFonts w:ascii="Times New Roman" w:hAnsi="Times New Roman" w:eastAsia="Times New Roman"/>
+                <w:b w:val="0"/>
+                <w:caps w:val="0"/>
+                <w:sz w:val="22"/>
+              </w:rPr>
+              <w:t>unresolved_name</w:t>
+            </w:r>
+          </w:p>
+        </w:tc>
+        <w:tc>
+          <w:tcPr>
+            <w:tcW w:type="dxa" w:w="4320"/>
+          </w:tcPr>
+          <w:p>
+            <w:pPr>
+              <w:spacing w:line="240" w:lineRule="auto"/>
+            </w:pPr>
+            <w:r>
+              <w:rPr>
+                <w:rFonts w:ascii="Times New Roman" w:hAnsi="Times New Roman" w:eastAsia="Times New Roman"/>
+                <w:b w:val="0"/>
+                <w:caps w:val="0"/>
+                <w:sz w:val="22"/>
+              </w:rPr>
+              <w:t>Një emër, deklarimin e të cilit analiza nuk e gjen dot. Parser-i regjistron fakte sintaksore dhe me qëllim nuk është zgjidhës simbolesh.</w:t>
+            </w:r>
+          </w:p>
+        </w:tc>
+      </w:tr>
+      <w:tr>
+        <w:tc>
+          <w:tcPr>
+            <w:tcW w:type="dxa" w:w="4320"/>
+          </w:tcPr>
+          <w:p>
+            <w:pPr>
+              <w:spacing w:line="240" w:lineRule="auto"/>
+            </w:pPr>
+            <w:r>
+              <w:rPr>
+                <w:rFonts w:ascii="Times New Roman" w:hAnsi="Times New Roman" w:eastAsia="Times New Roman"/>
+                <w:b w:val="0"/>
+                <w:caps w:val="0"/>
+                <w:sz w:val="22"/>
+              </w:rPr>
+              <w:t>possible_side_effect</w:t>
+            </w:r>
+          </w:p>
+        </w:tc>
+        <w:tc>
+          <w:tcPr>
+            <w:tcW w:type="dxa" w:w="4320"/>
+          </w:tcPr>
+          <w:p>
+            <w:pPr>
+              <w:spacing w:line="240" w:lineRule="auto"/>
+            </w:pPr>
+            <w:r>
+              <w:rPr>
+                <w:rFonts w:ascii="Times New Roman" w:hAnsi="Times New Roman" w:eastAsia="Times New Roman"/>
+                <w:b w:val="0"/>
+                <w:caps w:val="0"/>
+                <w:sz w:val="22"/>
+              </w:rPr>
+              <w:t>Zhvendosja mund ta ndryshojë sjelljen, sepse diçka brenda mund të shkruajë gjendje ose të kryejë hyrje-dalje.</w:t>
+            </w:r>
+          </w:p>
+        </w:tc>
+      </w:tr>
+      <w:tr>
+        <w:tc>
+          <w:tcPr>
+            <w:tcW w:type="dxa" w:w="4320"/>
+          </w:tcPr>
+          <w:p>
+            <w:pPr>
+              <w:spacing w:line="240" w:lineRule="auto"/>
+            </w:pPr>
+            <w:r>
+              <w:rPr>
+                <w:rFonts w:ascii="Times New Roman" w:hAnsi="Times New Roman" w:eastAsia="Times New Roman"/>
+                <w:b w:val="0"/>
+                <w:caps w:val="0"/>
+                <w:sz w:val="22"/>
+              </w:rPr>
+              <w:t>ambiguous_overload</w:t>
+            </w:r>
+          </w:p>
+        </w:tc>
+        <w:tc>
+          <w:tcPr>
+            <w:tcW w:type="dxa" w:w="4320"/>
+          </w:tcPr>
+          <w:p>
+            <w:pPr>
+              <w:spacing w:line="240" w:lineRule="auto"/>
+            </w:pPr>
+            <w:r>
+              <w:rPr>
+                <w:rFonts w:ascii="Times New Roman" w:hAnsi="Times New Roman" w:eastAsia="Times New Roman"/>
+                <w:b w:val="0"/>
+                <w:caps w:val="0"/>
+                <w:sz w:val="22"/>
+              </w:rPr>
+              <w:t>Disa metoda e ndajnë emrin dhe thirrja nuk lidhet dot me njërën.</w:t>
+            </w:r>
+          </w:p>
+        </w:tc>
+      </w:tr>
+      <w:tr>
+        <w:tc>
+          <w:tcPr>
+            <w:tcW w:type="dxa" w:w="4320"/>
+          </w:tcPr>
+          <w:p>
+            <w:pPr>
+              <w:spacing w:line="240" w:lineRule="auto"/>
+            </w:pPr>
+            <w:r>
+              <w:rPr>
+                <w:rFonts w:ascii="Times New Roman" w:hAnsi="Times New Roman" w:eastAsia="Times New Roman"/>
+                <w:b w:val="0"/>
+                <w:caps w:val="0"/>
+                <w:sz w:val="22"/>
+              </w:rPr>
+              <w:t>multiple_outputs</w:t>
+            </w:r>
+          </w:p>
+        </w:tc>
+        <w:tc>
+          <w:tcPr>
+            <w:tcW w:type="dxa" w:w="4320"/>
+          </w:tcPr>
+          <w:p>
+            <w:pPr>
+              <w:spacing w:line="240" w:lineRule="auto"/>
+            </w:pPr>
+            <w:r>
+              <w:rPr>
+                <w:rFonts w:ascii="Times New Roman" w:hAnsi="Times New Roman" w:eastAsia="Times New Roman"/>
+                <w:b w:val="0"/>
+                <w:caps w:val="0"/>
+                <w:sz w:val="22"/>
+              </w:rPr>
+              <w:t>Blloku cakton më shumë se një variabël që lexohet pas tij, ndaj një vlerë e vetme kthimi nuk e nxjerr dot rezultatin jashtë.</w:t>
+            </w:r>
+          </w:p>
+        </w:tc>
+      </w:tr>
+      <w:tr>
+        <w:tc>
+          <w:tcPr>
+            <w:tcW w:type="dxa" w:w="4320"/>
+          </w:tcPr>
+          <w:p>
+            <w:pPr>
+              <w:spacing w:line="240" w:lineRule="auto"/>
+            </w:pPr>
+            <w:r>
+              <w:rPr>
+                <w:rFonts w:ascii="Times New Roman" w:hAnsi="Times New Roman" w:eastAsia="Times New Roman"/>
+                <w:b w:val="0"/>
+                <w:caps w:val="0"/>
+                <w:sz w:val="22"/>
+              </w:rPr>
+              <w:t>control_flow_escapes</w:t>
+            </w:r>
+          </w:p>
+        </w:tc>
+        <w:tc>
+          <w:tcPr>
+            <w:tcW w:type="dxa" w:w="4320"/>
+          </w:tcPr>
+          <w:p>
+            <w:pPr>
+              <w:spacing w:line="240" w:lineRule="auto"/>
+            </w:pPr>
+            <w:r>
+              <w:rPr>
+                <w:rFonts w:ascii="Times New Roman" w:hAnsi="Times New Roman" w:eastAsia="Times New Roman"/>
+                <w:b w:val="0"/>
+                <w:caps w:val="0"/>
+                <w:sz w:val="22"/>
+              </w:rPr>
+              <w:t>Një return, break ose continue del nga blloku, ndaj blloku nuk është shprehje dhe nuk ngrihet i tëri.</w:t>
+            </w:r>
+          </w:p>
+        </w:tc>
+      </w:tr>
+      <w:tr>
+        <w:tc>
+          <w:tcPr>
+            <w:tcW w:type="dxa" w:w="4320"/>
+          </w:tcPr>
+          <w:p>
+            <w:pPr>
+              <w:spacing w:line="240" w:lineRule="auto"/>
+            </w:pPr>
+            <w:r>
+              <w:rPr>
+                <w:rFonts w:ascii="Times New Roman" w:hAnsi="Times New Roman" w:eastAsia="Times New Roman"/>
+                <w:b w:val="0"/>
+                <w:caps w:val="0"/>
+                <w:sz w:val="22"/>
+              </w:rPr>
+              <w:t>shape_not_matched</w:t>
+            </w:r>
+          </w:p>
+        </w:tc>
+        <w:tc>
+          <w:tcPr>
+            <w:tcW w:type="dxa" w:w="4320"/>
+          </w:tcPr>
+          <w:p>
+            <w:pPr>
+              <w:spacing w:line="240" w:lineRule="auto"/>
+            </w:pPr>
+            <w:r>
+              <w:rPr>
+                <w:rFonts w:ascii="Times New Roman" w:hAnsi="Times New Roman" w:eastAsia="Times New Roman"/>
+                <w:b w:val="0"/>
+                <w:caps w:val="0"/>
+                <w:sz w:val="22"/>
+              </w:rPr>
+              <w:t>Kodi nuk e ka formën që ky transformim rishkruan. Nuk është dështim i analizës, por mjet i gabuar për atë vend.</w:t>
+            </w:r>
+          </w:p>
+        </w:tc>
+      </w:tr>
+      <w:tr>
+        <w:tc>
+          <w:tcPr>
+            <w:tcW w:type="dxa" w:w="4320"/>
+          </w:tcPr>
+          <w:p>
+            <w:pPr>
+              <w:spacing w:line="240" w:lineRule="auto"/>
+            </w:pPr>
+            <w:r>
+              <w:rPr>
+                <w:rFonts w:ascii="Times New Roman" w:hAnsi="Times New Roman" w:eastAsia="Times New Roman"/>
+                <w:b w:val="0"/>
+                <w:caps w:val="0"/>
+                <w:sz w:val="22"/>
+              </w:rPr>
+              <w:t>edit_conflict</w:t>
+            </w:r>
+          </w:p>
+        </w:tc>
+        <w:tc>
+          <w:tcPr>
+            <w:tcW w:type="dxa" w:w="4320"/>
+          </w:tcPr>
+          <w:p>
+            <w:pPr>
+              <w:spacing w:line="240" w:lineRule="auto"/>
+            </w:pPr>
+            <w:r>
+              <w:rPr>
+                <w:rFonts w:ascii="Times New Roman" w:hAnsi="Times New Roman" w:eastAsia="Times New Roman"/>
+                <w:b w:val="0"/>
+                <w:caps w:val="0"/>
+                <w:sz w:val="22"/>
+              </w:rPr>
+              <w:t>Dy editime kërkuan të njëjtat bajta. Gjithmonë defekt i transformimit që i prodhoi, dhe raportohet që të mos kalojë pa u vënë re.</w:t>
+            </w:r>
+          </w:p>
+        </w:tc>
+      </w:tr>
+      <w:tr>
+        <w:tc>
+          <w:tcPr>
+            <w:tcW w:type="dxa" w:w="4320"/>
+          </w:tcPr>
+          <w:p>
+            <w:pPr>
+              <w:spacing w:line="240" w:lineRule="auto"/>
+            </w:pPr>
+            <w:r>
+              <w:rPr>
+                <w:rFonts w:ascii="Times New Roman" w:hAnsi="Times New Roman" w:eastAsia="Times New Roman"/>
+                <w:b w:val="0"/>
+                <w:caps w:val="0"/>
+                <w:sz w:val="22"/>
+              </w:rPr>
+              <w:t>not_definitely_assigned</w:t>
+            </w:r>
+          </w:p>
+        </w:tc>
+        <w:tc>
+          <w:tcPr>
+            <w:tcW w:type="dxa" w:w="4320"/>
+          </w:tcPr>
+          <w:p>
+            <w:pPr>
+              <w:spacing w:line="240" w:lineRule="auto"/>
+            </w:pPr>
+            <w:r>
+              <w:rPr>
+                <w:rFonts w:ascii="Times New Roman" w:hAnsi="Times New Roman" w:eastAsia="Times New Roman"/>
+                <w:b w:val="0"/>
+                <w:caps w:val="0"/>
+                <w:sz w:val="22"/>
+              </w:rPr>
+              <w:t>Një vlerë që blloku e lexon është deklaruar por jo caktuar me siguri aty ku blloku ndodhet. Java e ndalon kalimin e saj, ndaj rishkrimi nuk do të kompilonte edhe pse përndryshe është i saktë.</w:t>
+            </w:r>
+          </w:p>
+        </w:tc>
+      </w:tr>
+      <w:tr>
+        <w:tc>
+          <w:tcPr>
+            <w:tcW w:type="dxa" w:w="4320"/>
+          </w:tcPr>
+          <w:p>
+            <w:pPr>
+              <w:spacing w:line="240" w:lineRule="auto"/>
+            </w:pPr>
+            <w:r>
+              <w:rPr>
+                <w:rFonts w:ascii="Times New Roman" w:hAnsi="Times New Roman" w:eastAsia="Times New Roman"/>
+                <w:b w:val="0"/>
+                <w:caps w:val="0"/>
+                <w:sz w:val="22"/>
+              </w:rPr>
+              <w:t>unparseable</w:t>
+            </w:r>
+          </w:p>
+        </w:tc>
+        <w:tc>
+          <w:tcPr>
+            <w:tcW w:type="dxa" w:w="4320"/>
+          </w:tcPr>
+          <w:p>
+            <w:pPr>
+              <w:spacing w:line="240" w:lineRule="auto"/>
+            </w:pPr>
+            <w:r>
+              <w:rPr>
+                <w:rFonts w:ascii="Times New Roman" w:hAnsi="Times New Roman" w:eastAsia="Times New Roman"/>
+                <w:b w:val="0"/>
+                <w:caps w:val="0"/>
+                <w:sz w:val="22"/>
+              </w:rPr>
+              <w:t>Skedari nuk u parsua i pastër, ndaj asgjë për të nuk është e provuar.</w:t>
+            </w:r>
+          </w:p>
+        </w:tc>
+      </w:tr>
+    </w:tbl>
+    <w:p>
+      <w:pPr>
+        <w:spacing w:line="240" w:lineRule="auto" w:after="0"/>
+      </w:pPr>
+    </w:p>
+    <w:p>
+      <w:pPr>
+        <w:pStyle w:val="Heading2"/>
+      </w:pPr>
+      <w:r>
+        <w:rPr>
+          <w:rFonts w:ascii="Times New Roman" w:hAnsi="Times New Roman" w:eastAsia="Times New Roman"/>
+          <w:b/>
+          <w:caps w:val="0"/>
+          <w:sz w:val="24"/>
+        </w:rPr>
+        <w:t>8.5 Riprodhimi i rezultateve</w:t>
+      </w:r>
+    </w:p>
+    <w:p>
+      <w:pPr>
+        <w:spacing w:line="360" w:lineRule="auto"/>
+        <w:ind w:firstLine="360"/>
+        <w:jc w:val="both"/>
+      </w:pPr>
+      <w:r>
+        <w:rPr>
+          <w:rFonts w:ascii="Times New Roman" w:hAnsi="Times New Roman" w:eastAsia="Times New Roman"/>
+          <w:b w:val="0"/>
+          <w:caps w:val="0"/>
+          <w:sz w:val="24"/>
+        </w:rPr>
+        <w:t>Kodi burimor është i hapur te https://github.com/FlorentLatifi/Code-Smell-Detection-and-Refactoring-Recommendations. Skriptet ekzekutohen në këtë radhë; hapi i parë kërkon qasje në internet, të tjerët jo.</w:t>
+      </w:r>
+    </w:p>
+    <w:p>
+      <w:pPr>
+        <w:spacing w:line="240" w:lineRule="auto"/>
+        <w:jc w:val="center"/>
+      </w:pPr>
+      <w:r>
+        <w:rPr>
+          <w:rFonts w:ascii="Times New Roman" w:hAnsi="Times New Roman" w:eastAsia="Times New Roman"/>
+          <w:b w:val="0"/>
+          <w:caps w:val="0"/>
+          <w:sz w:val="22"/>
+        </w:rPr>
+        <w:t>Tabela 15. Radha e ekzekutimit</w:t>
+      </w:r>
+    </w:p>
+    <w:tbl>
+      <w:tblPr>
+        <w:tblStyle w:val="TableGrid"/>
+        <w:tblW w:type="auto" w:w="0"/>
+        <w:tblLook w:firstColumn="1" w:firstRow="1" w:lastColumn="0" w:lastRow="0" w:noHBand="0" w:noVBand="1" w:val="04A0"/>
+      </w:tblPr>
+      <w:tblGrid>
+        <w:gridCol w:w="2160"/>
+        <w:gridCol w:w="2160"/>
+        <w:gridCol w:w="2160"/>
+        <w:gridCol w:w="2160"/>
+      </w:tblGrid>
+      <w:tr>
+        <w:tc>
+          <w:tcPr>
+            <w:tcW w:type="dxa" w:w="2160"/>
+          </w:tcPr>
+          <w:p>
+            <w:pPr>
+              <w:spacing w:line="240" w:lineRule="auto"/>
+            </w:pPr>
+            <w:r>
+              <w:rPr>
+                <w:rFonts w:ascii="Times New Roman" w:hAnsi="Times New Roman" w:eastAsia="Times New Roman"/>
+                <w:b/>
+                <w:caps w:val="0"/>
+                <w:sz w:val="22"/>
+              </w:rPr>
+              <w:t>#</w:t>
+            </w:r>
+          </w:p>
+        </w:tc>
+        <w:tc>
+          <w:tcPr>
+            <w:tcW w:type="dxa" w:w="2160"/>
+          </w:tcPr>
+          <w:p>
+            <w:pPr>
+              <w:spacing w:line="240" w:lineRule="auto"/>
+            </w:pPr>
+            <w:r>
+              <w:rPr>
+                <w:rFonts w:ascii="Times New Roman" w:hAnsi="Times New Roman" w:eastAsia="Times New Roman"/>
+                <w:b/>
+                <w:caps w:val="0"/>
+                <w:sz w:val="22"/>
+              </w:rPr>
+              <w:t>Skripti</w:t>
+            </w:r>
+          </w:p>
+        </w:tc>
+        <w:tc>
+          <w:tcPr>
+            <w:tcW w:type="dxa" w:w="2160"/>
+          </w:tcPr>
+          <w:p>
+            <w:pPr>
+              <w:spacing w:line="240" w:lineRule="auto"/>
+            </w:pPr>
+            <w:r>
+              <w:rPr>
+                <w:rFonts w:ascii="Times New Roman" w:hAnsi="Times New Roman" w:eastAsia="Times New Roman"/>
+                <w:b/>
+                <w:caps w:val="0"/>
+                <w:sz w:val="22"/>
+              </w:rPr>
+              <w:t>Prodhon</w:t>
+            </w:r>
+          </w:p>
+        </w:tc>
+        <w:tc>
+          <w:tcPr>
+            <w:tcW w:type="dxa" w:w="2160"/>
+          </w:tcPr>
+          <w:p>
+            <w:pPr>
+              <w:spacing w:line="240" w:lineRule="auto"/>
+            </w:pPr>
+            <w:r>
+              <w:rPr>
+                <w:rFonts w:ascii="Times New Roman" w:hAnsi="Times New Roman" w:eastAsia="Times New Roman"/>
+                <w:b/>
+                <w:caps w:val="0"/>
+                <w:sz w:val="22"/>
+              </w:rPr>
+              <w:t>Kohë</w:t>
+            </w:r>
+          </w:p>
+        </w:tc>
+      </w:tr>
+      <w:tr>
+        <w:tc>
+          <w:tcPr>
+            <w:tcW w:type="dxa" w:w="2160"/>
+          </w:tcPr>
+          <w:p>
+            <w:pPr>
+              <w:spacing w:line="240" w:lineRule="auto"/>
+            </w:pPr>
+            <w:r>
+              <w:rPr>
+                <w:rFonts w:ascii="Times New Roman" w:hAnsi="Times New Roman" w:eastAsia="Times New Roman"/>
+                <w:b w:val="0"/>
+                <w:caps w:val="0"/>
+                <w:sz w:val="22"/>
+              </w:rPr>
+              <w:t>1</w:t>
+            </w:r>
+          </w:p>
+        </w:tc>
+        <w:tc>
+          <w:tcPr>
+            <w:tcW w:type="dxa" w:w="2160"/>
+          </w:tcPr>
+          <w:p>
+            <w:pPr>
+              <w:spacing w:line="240" w:lineRule="auto"/>
+            </w:pPr>
+            <w:r>
+              <w:rPr>
+                <w:rFonts w:ascii="Times New Roman" w:hAnsi="Times New Roman" w:eastAsia="Times New Roman"/>
+                <w:b w:val="0"/>
+                <w:caps w:val="0"/>
+                <w:sz w:val="22"/>
+              </w:rPr>
+              <w:t>fetch_corpus.py</w:t>
+            </w:r>
+          </w:p>
+        </w:tc>
+        <w:tc>
+          <w:tcPr>
+            <w:tcW w:type="dxa" w:w="2160"/>
+          </w:tcPr>
+          <w:p>
+            <w:pPr>
+              <w:spacing w:line="240" w:lineRule="auto"/>
+            </w:pPr>
+            <w:r>
+              <w:rPr>
+                <w:rFonts w:ascii="Times New Roman" w:hAnsi="Times New Roman" w:eastAsia="Times New Roman"/>
+                <w:b w:val="0"/>
+                <w:caps w:val="0"/>
+                <w:sz w:val="22"/>
+              </w:rPr>
+              <w:t>korpusi, jashtë git-it</w:t>
+            </w:r>
+          </w:p>
+        </w:tc>
+        <w:tc>
+          <w:tcPr>
+            <w:tcW w:type="dxa" w:w="2160"/>
+          </w:tcPr>
+          <w:p>
+            <w:pPr>
+              <w:spacing w:line="240" w:lineRule="auto"/>
+            </w:pPr>
+            <w:r>
+              <w:rPr>
+                <w:rFonts w:ascii="Times New Roman" w:hAnsi="Times New Roman" w:eastAsia="Times New Roman"/>
+                <w:b w:val="0"/>
+                <w:caps w:val="0"/>
+                <w:sz w:val="22"/>
+              </w:rPr>
+              <w:t>orë, një herë</w:t>
+            </w:r>
+          </w:p>
+        </w:tc>
+      </w:tr>
+      <w:tr>
+        <w:tc>
+          <w:tcPr>
+            <w:tcW w:type="dxa" w:w="2160"/>
+          </w:tcPr>
+          <w:p>
+            <w:pPr>
+              <w:spacing w:line="240" w:lineRule="auto"/>
+            </w:pPr>
+            <w:r>
+              <w:rPr>
+                <w:rFonts w:ascii="Times New Roman" w:hAnsi="Times New Roman" w:eastAsia="Times New Roman"/>
+                <w:b w:val="0"/>
+                <w:caps w:val="0"/>
+                <w:sz w:val="22"/>
+              </w:rPr>
+              <w:t>2</w:t>
+            </w:r>
+          </w:p>
+        </w:tc>
+        <w:tc>
+          <w:tcPr>
+            <w:tcW w:type="dxa" w:w="2160"/>
+          </w:tcPr>
+          <w:p>
+            <w:pPr>
+              <w:spacing w:line="240" w:lineRule="auto"/>
+            </w:pPr>
+            <w:r>
+              <w:rPr>
+                <w:rFonts w:ascii="Times New Roman" w:hAnsi="Times New Roman" w:eastAsia="Times New Roman"/>
+                <w:b w:val="0"/>
+                <w:caps w:val="0"/>
+                <w:sz w:val="22"/>
+              </w:rPr>
+              <w:t>build_dataset.py</w:t>
+            </w:r>
+          </w:p>
+        </w:tc>
+        <w:tc>
+          <w:tcPr>
+            <w:tcW w:type="dxa" w:w="2160"/>
+          </w:tcPr>
+          <w:p>
+            <w:pPr>
+              <w:spacing w:line="240" w:lineRule="auto"/>
+            </w:pPr>
+            <w:r>
+              <w:rPr>
+                <w:rFonts w:ascii="Times New Roman" w:hAnsi="Times New Roman" w:eastAsia="Times New Roman"/>
+                <w:b w:val="0"/>
+                <w:caps w:val="0"/>
+                <w:sz w:val="22"/>
+              </w:rPr>
+              <w:t>tabela e veçorive, e komituar</w:t>
+            </w:r>
+          </w:p>
+        </w:tc>
+        <w:tc>
+          <w:tcPr>
+            <w:tcW w:type="dxa" w:w="2160"/>
+          </w:tcPr>
+          <w:p>
+            <w:pPr>
+              <w:spacing w:line="240" w:lineRule="auto"/>
+            </w:pPr>
+            <w:r>
+              <w:rPr>
+                <w:rFonts w:ascii="Times New Roman" w:hAnsi="Times New Roman" w:eastAsia="Times New Roman"/>
+                <w:b w:val="0"/>
+                <w:caps w:val="0"/>
+                <w:sz w:val="22"/>
+              </w:rPr>
+              <w:t>~95 min</w:t>
+            </w:r>
+          </w:p>
+        </w:tc>
+      </w:tr>
+      <w:tr>
+        <w:tc>
+          <w:tcPr>
+            <w:tcW w:type="dxa" w:w="2160"/>
+          </w:tcPr>
+          <w:p>
+            <w:pPr>
+              <w:spacing w:line="240" w:lineRule="auto"/>
+            </w:pPr>
+            <w:r>
+              <w:rPr>
+                <w:rFonts w:ascii="Times New Roman" w:hAnsi="Times New Roman" w:eastAsia="Times New Roman"/>
+                <w:b w:val="0"/>
+                <w:caps w:val="0"/>
+                <w:sz w:val="22"/>
+              </w:rPr>
+              <w:t>3</w:t>
+            </w:r>
+          </w:p>
+        </w:tc>
+        <w:tc>
+          <w:tcPr>
+            <w:tcW w:type="dxa" w:w="2160"/>
+          </w:tcPr>
+          <w:p>
+            <w:pPr>
+              <w:spacing w:line="240" w:lineRule="auto"/>
+            </w:pPr>
+            <w:r>
+              <w:rPr>
+                <w:rFonts w:ascii="Times New Roman" w:hAnsi="Times New Roman" w:eastAsia="Times New Roman"/>
+                <w:b w:val="0"/>
+                <w:caps w:val="0"/>
+                <w:sz w:val="22"/>
+              </w:rPr>
+              <w:t>evaluate_rules.py --from-dataset</w:t>
+            </w:r>
+          </w:p>
+        </w:tc>
+        <w:tc>
+          <w:tcPr>
+            <w:tcW w:type="dxa" w:w="2160"/>
+          </w:tcPr>
+          <w:p>
+            <w:pPr>
+              <w:spacing w:line="240" w:lineRule="auto"/>
+            </w:pPr>
+            <w:r>
+              <w:rPr>
+                <w:rFonts w:ascii="Times New Roman" w:hAnsi="Times New Roman" w:eastAsia="Times New Roman"/>
+                <w:b w:val="0"/>
+                <w:caps w:val="0"/>
+                <w:sz w:val="22"/>
+              </w:rPr>
+              <w:t>numrat e Qasjes A</w:t>
+            </w:r>
+          </w:p>
+        </w:tc>
+        <w:tc>
+          <w:tcPr>
+            <w:tcW w:type="dxa" w:w="2160"/>
+          </w:tcPr>
+          <w:p>
+            <w:pPr>
+              <w:spacing w:line="240" w:lineRule="auto"/>
+            </w:pPr>
+            <w:r>
+              <w:rPr>
+                <w:rFonts w:ascii="Times New Roman" w:hAnsi="Times New Roman" w:eastAsia="Times New Roman"/>
+                <w:b w:val="0"/>
+                <w:caps w:val="0"/>
+                <w:sz w:val="22"/>
+              </w:rPr>
+              <w:t>sekonda</w:t>
+            </w:r>
+          </w:p>
+        </w:tc>
+      </w:tr>
+      <w:tr>
+        <w:tc>
+          <w:tcPr>
+            <w:tcW w:type="dxa" w:w="2160"/>
+          </w:tcPr>
+          <w:p>
+            <w:pPr>
+              <w:spacing w:line="240" w:lineRule="auto"/>
+            </w:pPr>
+            <w:r>
+              <w:rPr>
+                <w:rFonts w:ascii="Times New Roman" w:hAnsi="Times New Roman" w:eastAsia="Times New Roman"/>
+                <w:b w:val="0"/>
+                <w:caps w:val="0"/>
+                <w:sz w:val="22"/>
+              </w:rPr>
+              <w:t>4</w:t>
+            </w:r>
+          </w:p>
+        </w:tc>
+        <w:tc>
+          <w:tcPr>
+            <w:tcW w:type="dxa" w:w="2160"/>
+          </w:tcPr>
+          <w:p>
+            <w:pPr>
+              <w:spacing w:line="240" w:lineRule="auto"/>
+            </w:pPr>
+            <w:r>
+              <w:rPr>
+                <w:rFonts w:ascii="Times New Roman" w:hAnsi="Times New Roman" w:eastAsia="Times New Roman"/>
+                <w:b w:val="0"/>
+                <w:caps w:val="0"/>
+                <w:sz w:val="22"/>
+              </w:rPr>
+              <w:t>train_models.py</w:t>
+            </w:r>
+          </w:p>
+        </w:tc>
+        <w:tc>
+          <w:tcPr>
+            <w:tcW w:type="dxa" w:w="2160"/>
+          </w:tcPr>
+          <w:p>
+            <w:pPr>
+              <w:spacing w:line="240" w:lineRule="auto"/>
+            </w:pPr>
+            <w:r>
+              <w:rPr>
+                <w:rFonts w:ascii="Times New Roman" w:hAnsi="Times New Roman" w:eastAsia="Times New Roman"/>
+                <w:b w:val="0"/>
+                <w:caps w:val="0"/>
+                <w:sz w:val="22"/>
+              </w:rPr>
+              <w:t>numrat e Qasjes B dhe modelet</w:t>
+            </w:r>
+          </w:p>
+        </w:tc>
+        <w:tc>
+          <w:tcPr>
+            <w:tcW w:type="dxa" w:w="2160"/>
+          </w:tcPr>
+          <w:p>
+            <w:pPr>
+              <w:spacing w:line="240" w:lineRule="auto"/>
+            </w:pPr>
+            <w:r>
+              <w:rPr>
+                <w:rFonts w:ascii="Times New Roman" w:hAnsi="Times New Roman" w:eastAsia="Times New Roman"/>
+                <w:b w:val="0"/>
+                <w:caps w:val="0"/>
+                <w:sz w:val="22"/>
+              </w:rPr>
+              <w:t>sekonda</w:t>
+            </w:r>
+          </w:p>
+        </w:tc>
+      </w:tr>
+      <w:tr>
+        <w:tc>
+          <w:tcPr>
+            <w:tcW w:type="dxa" w:w="2160"/>
+          </w:tcPr>
+          <w:p>
+            <w:pPr>
+              <w:spacing w:line="240" w:lineRule="auto"/>
+            </w:pPr>
+            <w:r>
+              <w:rPr>
+                <w:rFonts w:ascii="Times New Roman" w:hAnsi="Times New Roman" w:eastAsia="Times New Roman"/>
+                <w:b w:val="0"/>
+                <w:caps w:val="0"/>
+                <w:sz w:val="22"/>
+              </w:rPr>
+              <w:t>5</w:t>
+            </w:r>
+          </w:p>
+        </w:tc>
+        <w:tc>
+          <w:tcPr>
+            <w:tcW w:type="dxa" w:w="2160"/>
+          </w:tcPr>
+          <w:p>
+            <w:pPr>
+              <w:spacing w:line="240" w:lineRule="auto"/>
+            </w:pPr>
+            <w:r>
+              <w:rPr>
+                <w:rFonts w:ascii="Times New Roman" w:hAnsi="Times New Roman" w:eastAsia="Times New Roman"/>
+                <w:b w:val="0"/>
+                <w:caps w:val="0"/>
+                <w:sz w:val="22"/>
+              </w:rPr>
+              <w:t>sweep_thresholds.py</w:t>
+            </w:r>
+          </w:p>
+        </w:tc>
+        <w:tc>
+          <w:tcPr>
+            <w:tcW w:type="dxa" w:w="2160"/>
+          </w:tcPr>
+          <w:p>
+            <w:pPr>
+              <w:spacing w:line="240" w:lineRule="auto"/>
+            </w:pPr>
+            <w:r>
+              <w:rPr>
+                <w:rFonts w:ascii="Times New Roman" w:hAnsi="Times New Roman" w:eastAsia="Times New Roman"/>
+                <w:b w:val="0"/>
+                <w:caps w:val="0"/>
+                <w:sz w:val="22"/>
+              </w:rPr>
+              <w:t>analiza e ndjeshmërisë</w:t>
+            </w:r>
+          </w:p>
+        </w:tc>
+        <w:tc>
+          <w:tcPr>
+            <w:tcW w:type="dxa" w:w="2160"/>
+          </w:tcPr>
+          <w:p>
+            <w:pPr>
+              <w:spacing w:line="240" w:lineRule="auto"/>
+            </w:pPr>
+            <w:r>
+              <w:rPr>
+                <w:rFonts w:ascii="Times New Roman" w:hAnsi="Times New Roman" w:eastAsia="Times New Roman"/>
+                <w:b w:val="0"/>
+                <w:caps w:val="0"/>
+                <w:sz w:val="22"/>
+              </w:rPr>
+              <w:t>sekonda</w:t>
+            </w:r>
+          </w:p>
+        </w:tc>
+      </w:tr>
+      <w:tr>
+        <w:tc>
+          <w:tcPr>
+            <w:tcW w:type="dxa" w:w="2160"/>
+          </w:tcPr>
+          <w:p>
+            <w:pPr>
+              <w:spacing w:line="240" w:lineRule="auto"/>
+            </w:pPr>
+            <w:r>
+              <w:rPr>
+                <w:rFonts w:ascii="Times New Roman" w:hAnsi="Times New Roman" w:eastAsia="Times New Roman"/>
+                <w:b w:val="0"/>
+                <w:caps w:val="0"/>
+                <w:sz w:val="22"/>
+              </w:rPr>
+              <w:t>6</w:t>
+            </w:r>
+          </w:p>
+        </w:tc>
+        <w:tc>
+          <w:tcPr>
+            <w:tcW w:type="dxa" w:w="2160"/>
+          </w:tcPr>
+          <w:p>
+            <w:pPr>
+              <w:spacing w:line="240" w:lineRule="auto"/>
+            </w:pPr>
+            <w:r>
+              <w:rPr>
+                <w:rFonts w:ascii="Times New Roman" w:hAnsi="Times New Roman" w:eastAsia="Times New Roman"/>
+                <w:b w:val="0"/>
+                <w:caps w:val="0"/>
+                <w:sz w:val="22"/>
+              </w:rPr>
+              <w:t>evaluate_refactorings.py</w:t>
+            </w:r>
+          </w:p>
+        </w:tc>
+        <w:tc>
+          <w:tcPr>
+            <w:tcW w:type="dxa" w:w="2160"/>
+          </w:tcPr>
+          <w:p>
+            <w:pPr>
+              <w:spacing w:line="240" w:lineRule="auto"/>
+            </w:pPr>
+            <w:r>
+              <w:rPr>
+                <w:rFonts w:ascii="Times New Roman" w:hAnsi="Times New Roman" w:eastAsia="Times New Roman"/>
+                <w:b w:val="0"/>
+                <w:caps w:val="0"/>
+                <w:sz w:val="22"/>
+              </w:rPr>
+              <w:t>tabela N/M/K e Qasjes C</w:t>
+            </w:r>
+          </w:p>
+        </w:tc>
+        <w:tc>
+          <w:tcPr>
+            <w:tcW w:type="dxa" w:w="2160"/>
+          </w:tcPr>
+          <w:p>
+            <w:pPr>
+              <w:spacing w:line="240" w:lineRule="auto"/>
+            </w:pPr>
+            <w:r>
+              <w:rPr>
+                <w:rFonts w:ascii="Times New Roman" w:hAnsi="Times New Roman" w:eastAsia="Times New Roman"/>
+                <w:b w:val="0"/>
+                <w:caps w:val="0"/>
+                <w:sz w:val="22"/>
+              </w:rPr>
+              <w:t>orë</w:t>
+            </w:r>
+          </w:p>
+        </w:tc>
+      </w:tr>
+      <w:tr>
+        <w:tc>
+          <w:tcPr>
+            <w:tcW w:type="dxa" w:w="2160"/>
+          </w:tcPr>
+          <w:p>
+            <w:pPr>
+              <w:spacing w:line="240" w:lineRule="auto"/>
+            </w:pPr>
+            <w:r>
+              <w:rPr>
+                <w:rFonts w:ascii="Times New Roman" w:hAnsi="Times New Roman" w:eastAsia="Times New Roman"/>
+                <w:b w:val="0"/>
+                <w:caps w:val="0"/>
+                <w:sz w:val="22"/>
+              </w:rPr>
+              <w:t>7</w:t>
+            </w:r>
+          </w:p>
+        </w:tc>
+        <w:tc>
+          <w:tcPr>
+            <w:tcW w:type="dxa" w:w="2160"/>
+          </w:tcPr>
+          <w:p>
+            <w:pPr>
+              <w:spacing w:line="240" w:lineRule="auto"/>
+            </w:pPr>
+            <w:r>
+              <w:rPr>
+                <w:rFonts w:ascii="Times New Roman" w:hAnsi="Times New Roman" w:eastAsia="Times New Roman"/>
+                <w:b w:val="0"/>
+                <w:caps w:val="0"/>
+                <w:sz w:val="22"/>
+              </w:rPr>
+              <w:t>export_system_reference.py</w:t>
+            </w:r>
+          </w:p>
+        </w:tc>
+        <w:tc>
+          <w:tcPr>
+            <w:tcW w:type="dxa" w:w="2160"/>
+          </w:tcPr>
+          <w:p>
+            <w:pPr>
+              <w:spacing w:line="240" w:lineRule="auto"/>
+            </w:pPr>
+            <w:r>
+              <w:rPr>
+                <w:rFonts w:ascii="Times New Roman" w:hAnsi="Times New Roman" w:eastAsia="Times New Roman"/>
+                <w:b w:val="0"/>
+                <w:caps w:val="0"/>
+                <w:sz w:val="22"/>
+              </w:rPr>
+              <w:t>tabelat e kësaj shtojce</w:t>
+            </w:r>
+          </w:p>
+        </w:tc>
+        <w:tc>
+          <w:tcPr>
+            <w:tcW w:type="dxa" w:w="2160"/>
+          </w:tcPr>
+          <w:p>
+            <w:pPr>
+              <w:spacing w:line="240" w:lineRule="auto"/>
+            </w:pPr>
+            <w:r>
+              <w:rPr>
+                <w:rFonts w:ascii="Times New Roman" w:hAnsi="Times New Roman" w:eastAsia="Times New Roman"/>
+                <w:b w:val="0"/>
+                <w:caps w:val="0"/>
+                <w:sz w:val="22"/>
+              </w:rPr>
+              <w:t>sekonda</w:t>
+            </w:r>
+          </w:p>
+        </w:tc>
+      </w:tr>
+      <w:tr>
+        <w:tc>
+          <w:tcPr>
+            <w:tcW w:type="dxa" w:w="2160"/>
+          </w:tcPr>
+          <w:p>
+            <w:pPr>
+              <w:spacing w:line="240" w:lineRule="auto"/>
+            </w:pPr>
+            <w:r>
+              <w:rPr>
+                <w:rFonts w:ascii="Times New Roman" w:hAnsi="Times New Roman" w:eastAsia="Times New Roman"/>
+                <w:b w:val="0"/>
+                <w:caps w:val="0"/>
+                <w:sz w:val="22"/>
+              </w:rPr>
+              <w:t>8</w:t>
+            </w:r>
+          </w:p>
+        </w:tc>
+        <w:tc>
+          <w:tcPr>
+            <w:tcW w:type="dxa" w:w="2160"/>
+          </w:tcPr>
+          <w:p>
+            <w:pPr>
+              <w:spacing w:line="240" w:lineRule="auto"/>
+            </w:pPr>
+            <w:r>
+              <w:rPr>
+                <w:rFonts w:ascii="Times New Roman" w:hAnsi="Times New Roman" w:eastAsia="Times New Roman"/>
+                <w:b w:val="0"/>
+                <w:caps w:val="0"/>
+                <w:sz w:val="22"/>
+              </w:rPr>
+              <w:t>build_figures.py</w:t>
+            </w:r>
+          </w:p>
+        </w:tc>
+        <w:tc>
+          <w:tcPr>
+            <w:tcW w:type="dxa" w:w="2160"/>
+          </w:tcPr>
+          <w:p>
+            <w:pPr>
+              <w:spacing w:line="240" w:lineRule="auto"/>
+            </w:pPr>
+            <w:r>
+              <w:rPr>
+                <w:rFonts w:ascii="Times New Roman" w:hAnsi="Times New Roman" w:eastAsia="Times New Roman"/>
+                <w:b w:val="0"/>
+                <w:caps w:val="0"/>
+                <w:sz w:val="22"/>
+              </w:rPr>
+              <w:t>figurat e Kapitullit 5</w:t>
+            </w:r>
+          </w:p>
+        </w:tc>
+        <w:tc>
+          <w:tcPr>
+            <w:tcW w:type="dxa" w:w="2160"/>
+          </w:tcPr>
+          <w:p>
+            <w:pPr>
+              <w:spacing w:line="240" w:lineRule="auto"/>
+            </w:pPr>
+            <w:r>
+              <w:rPr>
+                <w:rFonts w:ascii="Times New Roman" w:hAnsi="Times New Roman" w:eastAsia="Times New Roman"/>
+                <w:b w:val="0"/>
+                <w:caps w:val="0"/>
+                <w:sz w:val="22"/>
+              </w:rPr>
+              <w:t>sekonda</w:t>
+            </w:r>
+          </w:p>
+        </w:tc>
+      </w:tr>
+    </w:tbl>
+    <w:p>
+      <w:pPr>
+        <w:spacing w:line="240" w:lineRule="auto" w:after="0"/>
+      </w:pPr>
+    </w:p>
+    <w:p>
+      <w:pPr>
+        <w:spacing w:line="360" w:lineRule="auto"/>
+        <w:ind w:firstLine="360"/>
+        <w:jc w:val="both"/>
+      </w:pPr>
+      <w:r>
+        <w:rPr>
+          <w:rFonts w:ascii="Times New Roman" w:hAnsi="Times New Roman" w:eastAsia="Times New Roman"/>
+          <w:b w:val="0"/>
+          <w:caps w:val="0"/>
+          <w:sz w:val="24"/>
+        </w:rPr>
+        <w:t>Çdo skript shkruan rezultatin si CSV ose JSON në data/results/, bashkë me commit-in, versionin e Python-it dhe platformën që e prodhuan. Numrat e këtij punimi u prodhuan me commit-in e47911ef9f, Python 3.13.1, Windows-11-10.0.26200-SP0.</w:t>
+      </w:r>
+    </w:p>
+    <w:p>
+      <w:pPr>
+        <w:spacing w:line="360" w:lineRule="auto"/>
+        <w:ind w:firstLine="360"/>
+        <w:jc w:val="both"/>
+      </w:pPr>
+      <w:r>
+        <w:rPr>
+          <w:rFonts w:ascii="Times New Roman" w:hAnsi="Times New Roman" w:eastAsia="Times New Roman"/>
+          <w:b w:val="0"/>
+          <w:caps w:val="0"/>
+          <w:sz w:val="24"/>
+        </w:rPr>
+        <w:t>Kapitulli 5 dhe kjo shtojcë ndërtohen nga ata skedarë, ndaj rigjenerimi i eksperimentit dhe rigjenerimi i dokumentit japin gjithmonë të njëjtat vlera.</w:t>
       </w:r>
     </w:p>
     <w:sectPr>

</xml_diff>

<commit_message>
Numeroji figurat dhe tabelat sipas radhes se shfaqjes
</commit_message>
<xml_diff>
--- a/docs/thesis/Punim_Diplome_Florent_Latifi.docx
+++ b/docs/thesis/Punim_Diplome_Florent_Latifi.docx
@@ -650,7 +650,7 @@
           <w:caps w:val="0"/>
           <w:sz w:val="24"/>
         </w:rPr>
-        <w:t>Figura 1. MCC për të dyja qasjet</w:t>
+        <w:t>Figura 1. Shpërndarja e mostrave sipas erës</w:t>
       </w:r>
     </w:p>
     <w:p>
@@ -682,7 +682,7 @@
           <w:caps w:val="0"/>
           <w:sz w:val="24"/>
         </w:rPr>
-        <w:t>Figura 3. Mostrat e shënuara nga secila qasje</w:t>
+        <w:t>Figura 3. Veçoritë me rëndësi më të lartë, të matura me permutation importance</w:t>
       </w:r>
     </w:p>
     <w:p>
@@ -698,7 +698,7 @@
           <w:caps w:val="0"/>
           <w:sz w:val="24"/>
         </w:rPr>
-        <w:t>Figura 4. Veçoritë me rëndësi më të lartë, të matura me permutation importance</w:t>
+        <w:t>Figura 4. MCC për të dyja qasjet</w:t>
       </w:r>
     </w:p>
     <w:p>
@@ -714,7 +714,7 @@
           <w:caps w:val="0"/>
           <w:sz w:val="24"/>
         </w:rPr>
-        <w:t>Figura 5. Shpërndarja e mostrave sipas erës</w:t>
+        <w:t>Figura 5. Mostrat e shënuara nga secila qasje</w:t>
       </w:r>
     </w:p>
     <w:p>
@@ -825,7 +825,7 @@
           <w:caps w:val="0"/>
           <w:sz w:val="24"/>
         </w:rPr>
-        <w:t>Tabela 5. Sa lëviz MCC-ja kur zhvendoset një prag</w:t>
+        <w:t>Tabela 5. Rezultati i motorit të refaktorimit</w:t>
       </w:r>
     </w:p>
     <w:p>
@@ -841,7 +841,7 @@
           <w:caps w:val="0"/>
           <w:sz w:val="24"/>
         </w:rPr>
-        <w:t>Tabela 6. Rezultati i motorit të refaktorimit</w:t>
+        <w:t>Tabela 6. Pse u refuzuan</w:t>
       </w:r>
     </w:p>
     <w:p>
@@ -857,7 +857,7 @@
           <w:caps w:val="0"/>
           <w:sz w:val="24"/>
         </w:rPr>
-        <w:t>Tabela 7. Pse u refuzuan</w:t>
+        <w:t>Tabela 7. Verifikimi i atyre që u aplikuan</w:t>
       </w:r>
     </w:p>
     <w:p>
@@ -873,7 +873,7 @@
           <w:caps w:val="0"/>
           <w:sz w:val="24"/>
         </w:rPr>
-        <w:t>Tabela 8. Verifikimi i atyre që u aplikuan</w:t>
+        <w:t>Tabela 8. Sa lëviz MCC-ja kur zhvendoset një prag</w:t>
       </w:r>
     </w:p>
     <w:p>
@@ -3206,7 +3206,7 @@
               <a:graphicData uri="http://schemas.openxmlformats.org/drawingml/2006/picture">
                 <pic:pic>
                   <pic:nvPicPr>
-                    <pic:cNvPr id="0" name="figura_5_shperndarja_e_mostrave.png"/>
+                    <pic:cNvPr id="0" name="shperndarja_e_mostrave.png"/>
                     <pic:cNvPicPr/>
                   </pic:nvPicPr>
                   <pic:blipFill>
@@ -3241,7 +3241,7 @@
           <w:caps w:val="0"/>
           <w:sz w:val="22"/>
         </w:rPr>
-        <w:t>Figura 5. Shpërndarja e mostrave sipas erës</w:t>
+        <w:t>Figura 1. Shpërndarja e mostrave sipas erës</w:t>
       </w:r>
     </w:p>
     <w:p>
@@ -4439,7 +4439,7 @@
               <a:graphicData uri="http://schemas.openxmlformats.org/drawingml/2006/picture">
                 <pic:pic>
                   <pic:nvPicPr>
-                    <pic:cNvPr id="0" name="figura_2_recall_sipas_ashpersise.png"/>
+                    <pic:cNvPr id="0" name="recall_sipas_ashpersise.png"/>
                     <pic:cNvPicPr/>
                   </pic:nvPicPr>
                   <pic:blipFill>
@@ -5170,7 +5170,7 @@
               <a:graphicData uri="http://schemas.openxmlformats.org/drawingml/2006/picture">
                 <pic:pic>
                   <pic:nvPicPr>
-                    <pic:cNvPr id="0" name="figura_4_rendesia_e_vecorive.png"/>
+                    <pic:cNvPr id="0" name="rendesia_e_vecorive.png"/>
                     <pic:cNvPicPr/>
                   </pic:nvPicPr>
                   <pic:blipFill>
@@ -5205,7 +5205,7 @@
           <w:caps w:val="0"/>
           <w:sz w:val="22"/>
         </w:rPr>
-        <w:t>Figura 4. Veçoritë me rëndësi më të lartë, të matura me permutation importance</w:t>
+        <w:t>Figura 3. Veçoritë me rëndësi më të lartë, të matura me permutation importance</w:t>
       </w:r>
     </w:p>
     <w:p>
@@ -5238,7 +5238,7 @@
               <a:graphicData uri="http://schemas.openxmlformats.org/drawingml/2006/picture">
                 <pic:pic>
                   <pic:nvPicPr>
-                    <pic:cNvPr id="0" name="figura_1_mcc_a_vs_b.png"/>
+                    <pic:cNvPr id="0" name="mcc_a_vs_b.png"/>
                     <pic:cNvPicPr/>
                   </pic:nvPicPr>
                   <pic:blipFill>
@@ -5273,7 +5273,7 @@
           <w:caps w:val="0"/>
           <w:sz w:val="22"/>
         </w:rPr>
-        <w:t>Figura 1. MCC për të dyja qasjet</w:t>
+        <w:t>Figura 4. MCC për të dyja qasjet</w:t>
       </w:r>
     </w:p>
     <w:p>
@@ -5923,7 +5923,7 @@
               <a:graphicData uri="http://schemas.openxmlformats.org/drawingml/2006/picture">
                 <pic:pic>
                   <pic:nvPicPr>
-                    <pic:cNvPr id="0" name="figura_3_pajtimi_a_b.png"/>
+                    <pic:cNvPr id="0" name="pajtimi_a_b.png"/>
                     <pic:cNvPicPr/>
                   </pic:nvPicPr>
                   <pic:blipFill>
@@ -5958,7 +5958,7 @@
           <w:caps w:val="0"/>
           <w:sz w:val="22"/>
         </w:rPr>
-        <w:t>Figura 3. Mostrat e shënuara nga secila qasje</w:t>
+        <w:t>Figura 5. Mostrat e shënuara nga secila qasje</w:t>
       </w:r>
     </w:p>
     <w:p>
@@ -6035,7 +6035,7 @@
           <w:caps w:val="0"/>
           <w:sz w:val="22"/>
         </w:rPr>
-        <w:t>Tabela 6. Rezultati i motorit të refaktorimit</w:t>
+        <w:t>Tabela 5. Rezultati i motorit të refaktorimit</w:t>
       </w:r>
     </w:p>
     <w:tbl>
@@ -6376,7 +6376,7 @@
           <w:caps w:val="0"/>
           <w:sz w:val="22"/>
         </w:rPr>
-        <w:t>Tabela 7. Pse u refuzuan</w:t>
+        <w:t>Tabela 6. Pse u refuzuan</w:t>
       </w:r>
     </w:p>
     <w:tbl>
@@ -6703,7 +6703,7 @@
           <w:caps w:val="0"/>
           <w:sz w:val="22"/>
         </w:rPr>
-        <w:t>Tabela 8. Verifikimi i atyre që u aplikuan</w:t>
+        <w:t>Tabela 7. Verifikimi i atyre që u aplikuan</w:t>
       </w:r>
     </w:p>
     <w:tbl>
@@ -7049,7 +7049,7 @@
           <w:caps w:val="0"/>
           <w:sz w:val="22"/>
         </w:rPr>
-        <w:t>Tabela 5. Sa lëviz MCC-ja kur zhvendoset një prag</w:t>
+        <w:t>Tabela 8. Sa lëviz MCC-ja kur zhvendoset një prag</w:t>
       </w:r>
     </w:p>
     <w:tbl>
@@ -8154,7 +8154,7 @@
               <a:graphicData uri="http://schemas.openxmlformats.org/drawingml/2006/picture">
                 <pic:pic>
                   <pic:nvPicPr>
-                    <pic:cNvPr id="0" name="figura_6_ndjeshmeria_e_pragjeve.png"/>
+                    <pic:cNvPr id="0" name="ndjeshmeria_e_pragjeve.png"/>
                     <pic:cNvPicPr/>
                   </pic:nvPicPr>
                   <pic:blipFill>
@@ -12078,7 +12078,7 @@
           <w:caps w:val="0"/>
           <w:sz w:val="24"/>
         </w:rPr>
-        <w:t>Kur një parakusht nuk provohet, motori refuzon me një arsye të numërueshme. Shpërndarja e tyre mbi korpus është në Tabelën 7.</w:t>
+        <w:t>Kur një parakusht nuk provohet, motori refuzon me një arsye të numërueshme. Shpërndarja e tyre mbi korpus jepet te Kapitulli 5.</w:t>
       </w:r>
     </w:p>
     <w:p>

</xml_diff>

<commit_message>
Mat ashpersine e derivuar kundrejt gjykimit te rishikuesve
</commit_message>
<xml_diff>
--- a/docs/thesis/Punim_Diplome_Florent_Latifi.docx
+++ b/docs/thesis/Punim_Diplome_Florent_Latifi.docx
@@ -889,7 +889,7 @@
           <w:caps w:val="0"/>
           <w:sz w:val="24"/>
         </w:rPr>
-        <w:t>Tabela 9. Strategjitë e detektimit dhe burimet e tyre</w:t>
+        <w:t>Tabela 9. Pajtimi i ashpërsisë me rishikuesit</w:t>
       </w:r>
     </w:p>
     <w:p>
@@ -905,7 +905,7 @@
           <w:caps w:val="0"/>
           <w:sz w:val="24"/>
         </w:rPr>
-        <w:t>Tabela 10. Kuantifikuesit e përgjithshëm</w:t>
+        <w:t>Tabela 10. Strategjitë e detektimit dhe burimet e tyre</w:t>
       </w:r>
     </w:p>
     <w:p>
@@ -921,7 +921,7 @@
           <w:caps w:val="0"/>
           <w:sz w:val="24"/>
         </w:rPr>
-        <w:t>Tabela 11. Pragjet e përdorura</w:t>
+        <w:t>Tabela 11. Kuantifikuesit e përgjithshëm</w:t>
       </w:r>
     </w:p>
     <w:p>
@@ -937,7 +937,7 @@
           <w:caps w:val="0"/>
           <w:sz w:val="24"/>
         </w:rPr>
-        <w:t>Tabela 12. Metrikat sipas nivelit</w:t>
+        <w:t>Tabela 12. Pragjet e përdorura</w:t>
       </w:r>
     </w:p>
     <w:p>
@@ -953,7 +953,7 @@
           <w:caps w:val="0"/>
           <w:sz w:val="24"/>
         </w:rPr>
-        <w:t>Tabela 13. Çka propozohet dhe çka aplikohet</w:t>
+        <w:t>Tabela 13. Metrikat sipas nivelit</w:t>
       </w:r>
     </w:p>
     <w:p>
@@ -969,7 +969,7 @@
           <w:caps w:val="0"/>
           <w:sz w:val="24"/>
         </w:rPr>
-        <w:t>Tabela 14. Arsyet e refuzimit</w:t>
+        <w:t>Tabela 14. Çka propozohet dhe çka aplikohet</w:t>
       </w:r>
     </w:p>
     <w:p>
@@ -985,7 +985,23 @@
           <w:caps w:val="0"/>
           <w:sz w:val="24"/>
         </w:rPr>
-        <w:t>Tabela 15. Radha e ekzekutimit</w:t>
+        <w:t>Tabela 15. Arsyet e refuzimit</w:t>
+      </w:r>
+    </w:p>
+    <w:p>
+      <w:pPr>
+        <w:spacing w:line="360" w:lineRule="auto"/>
+        <w:ind w:firstLine="360"/>
+        <w:jc w:val="both"/>
+      </w:pPr>
+      <w:r>
+        <w:rPr>
+          <w:rFonts w:ascii="Times New Roman" w:hAnsi="Times New Roman" w:eastAsia="Times New Roman"/>
+          <w:b w:val="0"/>
+          <w:caps w:val="0"/>
+          <w:sz w:val="24"/>
+        </w:rPr>
+        <w:t>Tabela 16. Radha e ekzekutimit</w:t>
       </w:r>
     </w:p>
     <w:p>
@@ -8258,6 +8274,748 @@
     </w:p>
     <w:p>
       <w:pPr>
+        <w:pStyle w:val="Heading2"/>
+      </w:pPr>
+      <w:r>
+        <w:rPr>
+          <w:rFonts w:ascii="Times New Roman" w:hAnsi="Times New Roman" w:eastAsia="Times New Roman"/>
+          <w:b/>
+          <w:caps w:val="0"/>
+          <w:sz w:val="24"/>
+        </w:rPr>
+        <w:t>5.6 Ashpërsia e derivuar kundrejt gjykimit të rishikuesve</w:t>
+      </w:r>
+    </w:p>
+    <w:p>
+      <w:pPr>
+        <w:spacing w:line="360" w:lineRule="auto"/>
+        <w:ind w:firstLine="360"/>
+        <w:jc w:val="both"/>
+      </w:pPr>
+      <w:r>
+        <w:rPr>
+          <w:rFonts w:ascii="Times New Roman" w:hAnsi="Times New Roman" w:eastAsia="Times New Roman"/>
+          <w:b w:val="0"/>
+          <w:caps w:val="0"/>
+          <w:sz w:val="24"/>
+        </w:rPr>
+        <w:t>Ashpërsia e sistemit nuk caktohet, por derivohet: ajo është mesatarja e tepricës mbi pragje, e shprehur në të njëjtën shkallë që përdorën rishikuesit e MLCQ-së. Ajo zgjedhje u bë që të dyja anët të krahasoheshin pa hap përkthimi. Ky nënkapitull e bën atë krahasim.</w:t>
+      </w:r>
+    </w:p>
+    <w:p>
+      <w:pPr>
+        <w:spacing w:line="360" w:lineRule="auto"/>
+        <w:ind w:firstLine="360"/>
+        <w:jc w:val="both"/>
+      </w:pPr>
+      <w:r>
+        <w:rPr>
+          <w:rFonts w:ascii="Times New Roman" w:hAnsi="Times New Roman" w:eastAsia="Times New Roman"/>
+          <w:b w:val="0"/>
+          <w:caps w:val="0"/>
+          <w:sz w:val="24"/>
+        </w:rPr>
+        <w:t>Matja kufizohet te mostrat ku të dyja anët shohin një erë. Askund tjetër shkallët nuk janë të krahasueshme: një detektor që nuk ndez nuk cakton ashpërsi, dhe një pozitiv i rremë është pyetje precizioni, jo ashpërsie.</w:t>
+      </w:r>
+    </w:p>
+    <w:p>
+      <w:pPr>
+        <w:spacing w:line="240" w:lineRule="auto"/>
+        <w:jc w:val="center"/>
+      </w:pPr>
+      <w:r>
+        <w:rPr>
+          <w:rFonts w:ascii="Times New Roman" w:hAnsi="Times New Roman" w:eastAsia="Times New Roman"/>
+          <w:b w:val="0"/>
+          <w:caps w:val="0"/>
+          <w:sz w:val="22"/>
+        </w:rPr>
+        <w:t>Tabela 9. Pajtimi i ashpërsisë me rishikuesit</w:t>
+      </w:r>
+    </w:p>
+    <w:tbl>
+      <w:tblPr>
+        <w:tblStyle w:val="TableGrid"/>
+        <w:tblW w:type="auto" w:w="0"/>
+        <w:tblLook w:firstColumn="1" w:firstRow="1" w:lastColumn="0" w:lastRow="0" w:noHBand="0" w:noVBand="1" w:val="04A0"/>
+      </w:tblPr>
+      <w:tblGrid>
+        <w:gridCol w:w="1728"/>
+        <w:gridCol w:w="1728"/>
+        <w:gridCol w:w="1728"/>
+        <w:gridCol w:w="1728"/>
+        <w:gridCol w:w="1728"/>
+      </w:tblGrid>
+      <w:tr>
+        <w:tc>
+          <w:tcPr>
+            <w:tcW w:type="dxa" w:w="1728"/>
+          </w:tcPr>
+          <w:p>
+            <w:pPr>
+              <w:spacing w:line="240" w:lineRule="auto"/>
+            </w:pPr>
+            <w:r>
+              <w:rPr>
+                <w:rFonts w:ascii="Times New Roman" w:hAnsi="Times New Roman" w:eastAsia="Times New Roman"/>
+                <w:b/>
+                <w:caps w:val="0"/>
+                <w:sz w:val="22"/>
+              </w:rPr>
+              <w:t>Erë</w:t>
+            </w:r>
+          </w:p>
+        </w:tc>
+        <w:tc>
+          <w:tcPr>
+            <w:tcW w:type="dxa" w:w="1728"/>
+          </w:tcPr>
+          <w:p>
+            <w:pPr>
+              <w:spacing w:line="240" w:lineRule="auto"/>
+            </w:pPr>
+            <w:r>
+              <w:rPr>
+                <w:rFonts w:ascii="Times New Roman" w:hAnsi="Times New Roman" w:eastAsia="Times New Roman"/>
+                <w:b/>
+                <w:caps w:val="0"/>
+                <w:sz w:val="22"/>
+              </w:rPr>
+              <w:t>Përputhje e saktë</w:t>
+            </w:r>
+          </w:p>
+        </w:tc>
+        <w:tc>
+          <w:tcPr>
+            <w:tcW w:type="dxa" w:w="1728"/>
+          </w:tcPr>
+          <w:p>
+            <w:pPr>
+              <w:spacing w:line="240" w:lineRule="auto"/>
+            </w:pPr>
+            <w:r>
+              <w:rPr>
+                <w:rFonts w:ascii="Times New Roman" w:hAnsi="Times New Roman" w:eastAsia="Times New Roman"/>
+                <w:b/>
+                <w:caps w:val="0"/>
+                <w:sz w:val="22"/>
+              </w:rPr>
+              <w:t>Brenda një niveli</w:t>
+            </w:r>
+          </w:p>
+        </w:tc>
+        <w:tc>
+          <w:tcPr>
+            <w:tcW w:type="dxa" w:w="1728"/>
+          </w:tcPr>
+          <w:p>
+            <w:pPr>
+              <w:spacing w:line="240" w:lineRule="auto"/>
+            </w:pPr>
+            <w:r>
+              <w:rPr>
+                <w:rFonts w:ascii="Times New Roman" w:hAnsi="Times New Roman" w:eastAsia="Times New Roman"/>
+                <w:b/>
+                <w:caps w:val="0"/>
+                <w:sz w:val="22"/>
+              </w:rPr>
+              <w:t>κ me peshë</w:t>
+            </w:r>
+          </w:p>
+        </w:tc>
+        <w:tc>
+          <w:tcPr>
+            <w:tcW w:type="dxa" w:w="1728"/>
+          </w:tcPr>
+          <w:p>
+            <w:pPr>
+              <w:spacing w:line="240" w:lineRule="auto"/>
+            </w:pPr>
+            <w:r>
+              <w:rPr>
+                <w:rFonts w:ascii="Times New Roman" w:hAnsi="Times New Roman" w:eastAsia="Times New Roman"/>
+                <w:b/>
+                <w:caps w:val="0"/>
+                <w:sz w:val="22"/>
+              </w:rPr>
+              <w:t>n</w:t>
+            </w:r>
+          </w:p>
+        </w:tc>
+      </w:tr>
+      <w:tr>
+        <w:tc>
+          <w:tcPr>
+            <w:tcW w:type="dxa" w:w="1728"/>
+          </w:tcPr>
+          <w:p>
+            <w:pPr>
+              <w:spacing w:line="240" w:lineRule="auto"/>
+            </w:pPr>
+            <w:r>
+              <w:rPr>
+                <w:rFonts w:ascii="Times New Roman" w:hAnsi="Times New Roman" w:eastAsia="Times New Roman"/>
+                <w:b w:val="0"/>
+                <w:caps w:val="0"/>
+                <w:sz w:val="22"/>
+              </w:rPr>
+              <w:t>Blob</w:t>
+            </w:r>
+          </w:p>
+        </w:tc>
+        <w:tc>
+          <w:tcPr>
+            <w:tcW w:type="dxa" w:w="1728"/>
+          </w:tcPr>
+          <w:p>
+            <w:pPr>
+              <w:spacing w:line="240" w:lineRule="auto"/>
+            </w:pPr>
+            <w:r>
+              <w:rPr>
+                <w:rFonts w:ascii="Times New Roman" w:hAnsi="Times New Roman" w:eastAsia="Times New Roman"/>
+                <w:b w:val="0"/>
+                <w:caps w:val="0"/>
+                <w:sz w:val="22"/>
+              </w:rPr>
+              <w:t>0.029</w:t>
+            </w:r>
+          </w:p>
+        </w:tc>
+        <w:tc>
+          <w:tcPr>
+            <w:tcW w:type="dxa" w:w="1728"/>
+          </w:tcPr>
+          <w:p>
+            <w:pPr>
+              <w:spacing w:line="240" w:lineRule="auto"/>
+            </w:pPr>
+            <w:r>
+              <w:rPr>
+                <w:rFonts w:ascii="Times New Roman" w:hAnsi="Times New Roman" w:eastAsia="Times New Roman"/>
+                <w:b w:val="0"/>
+                <w:caps w:val="0"/>
+                <w:sz w:val="22"/>
+              </w:rPr>
+              <w:t>0.371</w:t>
+            </w:r>
+          </w:p>
+        </w:tc>
+        <w:tc>
+          <w:tcPr>
+            <w:tcW w:type="dxa" w:w="1728"/>
+          </w:tcPr>
+          <w:p>
+            <w:pPr>
+              <w:spacing w:line="240" w:lineRule="auto"/>
+            </w:pPr>
+            <w:r>
+              <w:rPr>
+                <w:rFonts w:ascii="Times New Roman" w:hAnsi="Times New Roman" w:eastAsia="Times New Roman"/>
+                <w:b w:val="0"/>
+                <w:caps w:val="0"/>
+                <w:sz w:val="22"/>
+              </w:rPr>
+              <w:t>0.007</w:t>
+            </w:r>
+          </w:p>
+        </w:tc>
+        <w:tc>
+          <w:tcPr>
+            <w:tcW w:type="dxa" w:w="1728"/>
+          </w:tcPr>
+          <w:p>
+            <w:pPr>
+              <w:spacing w:line="240" w:lineRule="auto"/>
+            </w:pPr>
+            <w:r>
+              <w:rPr>
+                <w:rFonts w:ascii="Times New Roman" w:hAnsi="Times New Roman" w:eastAsia="Times New Roman"/>
+                <w:b w:val="0"/>
+                <w:caps w:val="0"/>
+                <w:sz w:val="22"/>
+              </w:rPr>
+              <w:t>35</w:t>
+            </w:r>
+          </w:p>
+        </w:tc>
+      </w:tr>
+      <w:tr>
+        <w:tc>
+          <w:tcPr>
+            <w:tcW w:type="dxa" w:w="1728"/>
+          </w:tcPr>
+          <w:p>
+            <w:pPr>
+              <w:spacing w:line="240" w:lineRule="auto"/>
+            </w:pPr>
+            <w:r>
+              <w:rPr>
+                <w:rFonts w:ascii="Times New Roman" w:hAnsi="Times New Roman" w:eastAsia="Times New Roman"/>
+                <w:b w:val="0"/>
+                <w:caps w:val="0"/>
+                <w:sz w:val="22"/>
+              </w:rPr>
+              <w:t>Blob (+ madhësi)</w:t>
+            </w:r>
+          </w:p>
+        </w:tc>
+        <w:tc>
+          <w:tcPr>
+            <w:tcW w:type="dxa" w:w="1728"/>
+          </w:tcPr>
+          <w:p>
+            <w:pPr>
+              <w:spacing w:line="240" w:lineRule="auto"/>
+            </w:pPr>
+            <w:r>
+              <w:rPr>
+                <w:rFonts w:ascii="Times New Roman" w:hAnsi="Times New Roman" w:eastAsia="Times New Roman"/>
+                <w:b w:val="0"/>
+                <w:caps w:val="0"/>
+                <w:sz w:val="22"/>
+              </w:rPr>
+              <w:t>0.278</w:t>
+            </w:r>
+          </w:p>
+        </w:tc>
+        <w:tc>
+          <w:tcPr>
+            <w:tcW w:type="dxa" w:w="1728"/>
+          </w:tcPr>
+          <w:p>
+            <w:pPr>
+              <w:spacing w:line="240" w:lineRule="auto"/>
+            </w:pPr>
+            <w:r>
+              <w:rPr>
+                <w:rFonts w:ascii="Times New Roman" w:hAnsi="Times New Roman" w:eastAsia="Times New Roman"/>
+                <w:b w:val="0"/>
+                <w:caps w:val="0"/>
+                <w:sz w:val="22"/>
+              </w:rPr>
+              <w:t>0.656</w:t>
+            </w:r>
+          </w:p>
+        </w:tc>
+        <w:tc>
+          <w:tcPr>
+            <w:tcW w:type="dxa" w:w="1728"/>
+          </w:tcPr>
+          <w:p>
+            <w:pPr>
+              <w:spacing w:line="240" w:lineRule="auto"/>
+            </w:pPr>
+            <w:r>
+              <w:rPr>
+                <w:rFonts w:ascii="Times New Roman" w:hAnsi="Times New Roman" w:eastAsia="Times New Roman"/>
+                <w:b w:val="0"/>
+                <w:caps w:val="0"/>
+                <w:sz w:val="22"/>
+              </w:rPr>
+              <w:t>0.008</w:t>
+            </w:r>
+          </w:p>
+        </w:tc>
+        <w:tc>
+          <w:tcPr>
+            <w:tcW w:type="dxa" w:w="1728"/>
+          </w:tcPr>
+          <w:p>
+            <w:pPr>
+              <w:spacing w:line="240" w:lineRule="auto"/>
+            </w:pPr>
+            <w:r>
+              <w:rPr>
+                <w:rFonts w:ascii="Times New Roman" w:hAnsi="Times New Roman" w:eastAsia="Times New Roman"/>
+                <w:b w:val="0"/>
+                <w:caps w:val="0"/>
+                <w:sz w:val="22"/>
+              </w:rPr>
+              <w:t>90</w:t>
+            </w:r>
+          </w:p>
+        </w:tc>
+      </w:tr>
+      <w:tr>
+        <w:tc>
+          <w:tcPr>
+            <w:tcW w:type="dxa" w:w="1728"/>
+          </w:tcPr>
+          <w:p>
+            <w:pPr>
+              <w:spacing w:line="240" w:lineRule="auto"/>
+            </w:pPr>
+            <w:r>
+              <w:rPr>
+                <w:rFonts w:ascii="Times New Roman" w:hAnsi="Times New Roman" w:eastAsia="Times New Roman"/>
+                <w:b w:val="0"/>
+                <w:caps w:val="0"/>
+                <w:sz w:val="22"/>
+              </w:rPr>
+              <w:t>Data Class</w:t>
+            </w:r>
+          </w:p>
+        </w:tc>
+        <w:tc>
+          <w:tcPr>
+            <w:tcW w:type="dxa" w:w="1728"/>
+          </w:tcPr>
+          <w:p>
+            <w:pPr>
+              <w:spacing w:line="240" w:lineRule="auto"/>
+            </w:pPr>
+            <w:r>
+              <w:rPr>
+                <w:rFonts w:ascii="Times New Roman" w:hAnsi="Times New Roman" w:eastAsia="Times New Roman"/>
+                <w:b w:val="0"/>
+                <w:caps w:val="0"/>
+                <w:sz w:val="22"/>
+              </w:rPr>
+              <w:t>0.036</w:t>
+            </w:r>
+          </w:p>
+        </w:tc>
+        <w:tc>
+          <w:tcPr>
+            <w:tcW w:type="dxa" w:w="1728"/>
+          </w:tcPr>
+          <w:p>
+            <w:pPr>
+              <w:spacing w:line="240" w:lineRule="auto"/>
+            </w:pPr>
+            <w:r>
+              <w:rPr>
+                <w:rFonts w:ascii="Times New Roman" w:hAnsi="Times New Roman" w:eastAsia="Times New Roman"/>
+                <w:b w:val="0"/>
+                <w:caps w:val="0"/>
+                <w:sz w:val="22"/>
+              </w:rPr>
+              <w:t>0.536</w:t>
+            </w:r>
+          </w:p>
+        </w:tc>
+        <w:tc>
+          <w:tcPr>
+            <w:tcW w:type="dxa" w:w="1728"/>
+          </w:tcPr>
+          <w:p>
+            <w:pPr>
+              <w:spacing w:line="240" w:lineRule="auto"/>
+            </w:pPr>
+            <w:r>
+              <w:rPr>
+                <w:rFonts w:ascii="Times New Roman" w:hAnsi="Times New Roman" w:eastAsia="Times New Roman"/>
+                <w:b w:val="0"/>
+                <w:caps w:val="0"/>
+                <w:sz w:val="22"/>
+              </w:rPr>
+              <w:t>0.061</w:t>
+            </w:r>
+          </w:p>
+        </w:tc>
+        <w:tc>
+          <w:tcPr>
+            <w:tcW w:type="dxa" w:w="1728"/>
+          </w:tcPr>
+          <w:p>
+            <w:pPr>
+              <w:spacing w:line="240" w:lineRule="auto"/>
+            </w:pPr>
+            <w:r>
+              <w:rPr>
+                <w:rFonts w:ascii="Times New Roman" w:hAnsi="Times New Roman" w:eastAsia="Times New Roman"/>
+                <w:b w:val="0"/>
+                <w:caps w:val="0"/>
+                <w:sz w:val="22"/>
+              </w:rPr>
+              <w:t>28</w:t>
+            </w:r>
+          </w:p>
+        </w:tc>
+      </w:tr>
+      <w:tr>
+        <w:tc>
+          <w:tcPr>
+            <w:tcW w:type="dxa" w:w="1728"/>
+          </w:tcPr>
+          <w:p>
+            <w:pPr>
+              <w:spacing w:line="240" w:lineRule="auto"/>
+            </w:pPr>
+            <w:r>
+              <w:rPr>
+                <w:rFonts w:ascii="Times New Roman" w:hAnsi="Times New Roman" w:eastAsia="Times New Roman"/>
+                <w:b w:val="0"/>
+                <w:caps w:val="0"/>
+                <w:sz w:val="22"/>
+              </w:rPr>
+              <w:t>Feature Envy</w:t>
+            </w:r>
+          </w:p>
+        </w:tc>
+        <w:tc>
+          <w:tcPr>
+            <w:tcW w:type="dxa" w:w="1728"/>
+          </w:tcPr>
+          <w:p>
+            <w:pPr>
+              <w:spacing w:line="240" w:lineRule="auto"/>
+            </w:pPr>
+            <w:r>
+              <w:rPr>
+                <w:rFonts w:ascii="Times New Roman" w:hAnsi="Times New Roman" w:eastAsia="Times New Roman"/>
+                <w:b w:val="0"/>
+                <w:caps w:val="0"/>
+                <w:sz w:val="22"/>
+              </w:rPr>
+              <w:t>0.154</w:t>
+            </w:r>
+          </w:p>
+        </w:tc>
+        <w:tc>
+          <w:tcPr>
+            <w:tcW w:type="dxa" w:w="1728"/>
+          </w:tcPr>
+          <w:p>
+            <w:pPr>
+              <w:spacing w:line="240" w:lineRule="auto"/>
+            </w:pPr>
+            <w:r>
+              <w:rPr>
+                <w:rFonts w:ascii="Times New Roman" w:hAnsi="Times New Roman" w:eastAsia="Times New Roman"/>
+                <w:b w:val="0"/>
+                <w:caps w:val="0"/>
+                <w:sz w:val="22"/>
+              </w:rPr>
+              <w:t>0.538</w:t>
+            </w:r>
+          </w:p>
+        </w:tc>
+        <w:tc>
+          <w:tcPr>
+            <w:tcW w:type="dxa" w:w="1728"/>
+          </w:tcPr>
+          <w:p>
+            <w:pPr>
+              <w:spacing w:line="240" w:lineRule="auto"/>
+            </w:pPr>
+            <w:r>
+              <w:rPr>
+                <w:rFonts w:ascii="Times New Roman" w:hAnsi="Times New Roman" w:eastAsia="Times New Roman"/>
+                <w:b w:val="0"/>
+                <w:caps w:val="0"/>
+                <w:sz w:val="22"/>
+              </w:rPr>
+              <w:t>0.026</w:t>
+            </w:r>
+          </w:p>
+        </w:tc>
+        <w:tc>
+          <w:tcPr>
+            <w:tcW w:type="dxa" w:w="1728"/>
+          </w:tcPr>
+          <w:p>
+            <w:pPr>
+              <w:spacing w:line="240" w:lineRule="auto"/>
+            </w:pPr>
+            <w:r>
+              <w:rPr>
+                <w:rFonts w:ascii="Times New Roman" w:hAnsi="Times New Roman" w:eastAsia="Times New Roman"/>
+                <w:b w:val="0"/>
+                <w:caps w:val="0"/>
+                <w:sz w:val="22"/>
+              </w:rPr>
+              <w:t>13</w:t>
+            </w:r>
+          </w:p>
+        </w:tc>
+      </w:tr>
+      <w:tr>
+        <w:tc>
+          <w:tcPr>
+            <w:tcW w:type="dxa" w:w="1728"/>
+          </w:tcPr>
+          <w:p>
+            <w:pPr>
+              <w:spacing w:line="240" w:lineRule="auto"/>
+            </w:pPr>
+            <w:r>
+              <w:rPr>
+                <w:rFonts w:ascii="Times New Roman" w:hAnsi="Times New Roman" w:eastAsia="Times New Roman"/>
+                <w:b w:val="0"/>
+                <w:caps w:val="0"/>
+                <w:sz w:val="22"/>
+              </w:rPr>
+              <w:t>Long Method</w:t>
+            </w:r>
+          </w:p>
+        </w:tc>
+        <w:tc>
+          <w:tcPr>
+            <w:tcW w:type="dxa" w:w="1728"/>
+          </w:tcPr>
+          <w:p>
+            <w:pPr>
+              <w:spacing w:line="240" w:lineRule="auto"/>
+            </w:pPr>
+            <w:r>
+              <w:rPr>
+                <w:rFonts w:ascii="Times New Roman" w:hAnsi="Times New Roman" w:eastAsia="Times New Roman"/>
+                <w:b w:val="0"/>
+                <w:caps w:val="0"/>
+                <w:sz w:val="22"/>
+              </w:rPr>
+              <w:t>0.547</w:t>
+            </w:r>
+          </w:p>
+        </w:tc>
+        <w:tc>
+          <w:tcPr>
+            <w:tcW w:type="dxa" w:w="1728"/>
+          </w:tcPr>
+          <w:p>
+            <w:pPr>
+              <w:spacing w:line="240" w:lineRule="auto"/>
+            </w:pPr>
+            <w:r>
+              <w:rPr>
+                <w:rFonts w:ascii="Times New Roman" w:hAnsi="Times New Roman" w:eastAsia="Times New Roman"/>
+                <w:b w:val="0"/>
+                <w:caps w:val="0"/>
+                <w:sz w:val="22"/>
+              </w:rPr>
+              <w:t>0.926</w:t>
+            </w:r>
+          </w:p>
+        </w:tc>
+        <w:tc>
+          <w:tcPr>
+            <w:tcW w:type="dxa" w:w="1728"/>
+          </w:tcPr>
+          <w:p>
+            <w:pPr>
+              <w:spacing w:line="240" w:lineRule="auto"/>
+            </w:pPr>
+            <w:r>
+              <w:rPr>
+                <w:rFonts w:ascii="Times New Roman" w:hAnsi="Times New Roman" w:eastAsia="Times New Roman"/>
+                <w:b w:val="0"/>
+                <w:caps w:val="0"/>
+                <w:sz w:val="22"/>
+              </w:rPr>
+              <w:t>0.293</w:t>
+            </w:r>
+          </w:p>
+        </w:tc>
+        <w:tc>
+          <w:tcPr>
+            <w:tcW w:type="dxa" w:w="1728"/>
+          </w:tcPr>
+          <w:p>
+            <w:pPr>
+              <w:spacing w:line="240" w:lineRule="auto"/>
+            </w:pPr>
+            <w:r>
+              <w:rPr>
+                <w:rFonts w:ascii="Times New Roman" w:hAnsi="Times New Roman" w:eastAsia="Times New Roman"/>
+                <w:b w:val="0"/>
+                <w:caps w:val="0"/>
+                <w:sz w:val="22"/>
+              </w:rPr>
+              <w:t>95</w:t>
+            </w:r>
+          </w:p>
+        </w:tc>
+      </w:tr>
+    </w:tbl>
+    <w:p>
+      <w:pPr>
+        <w:spacing w:line="240" w:lineRule="auto" w:after="0"/>
+      </w:pPr>
+    </w:p>
+    <w:p>
+      <w:pPr>
+        <w:spacing w:line="360" w:lineRule="auto"/>
+        <w:ind w:firstLine="360"/>
+        <w:jc w:val="both"/>
+      </w:pPr>
+      <w:r>
+        <w:rPr>
+          <w:rFonts w:ascii="Times New Roman" w:hAnsi="Times New Roman" w:eastAsia="Times New Roman"/>
+          <w:b w:val="0"/>
+          <w:caps w:val="0"/>
+          <w:sz w:val="24"/>
+        </w:rPr>
+        <w:t>Rezultati është negativ dhe duhet lexuar si i tillë. Për tri nga katër erërat kappa qëndron pranë zeros, pra pajtimi nuk është më i mirë se rastësia. Vetëm Long Method arrin një pajtim të matshëm, dhe edhe atje vetëm i moderuar.</w:t>
+      </w:r>
+    </w:p>
+    <w:p>
+      <w:pPr>
+        <w:spacing w:line="360" w:lineRule="auto"/>
+        <w:ind w:firstLine="360"/>
+        <w:jc w:val="both"/>
+      </w:pPr>
+      <w:r>
+        <w:rPr>
+          <w:rFonts w:ascii="Times New Roman" w:hAnsi="Times New Roman" w:eastAsia="Times New Roman"/>
+          <w:b w:val="0"/>
+          <w:caps w:val="0"/>
+          <w:sz w:val="24"/>
+        </w:rPr>
+        <w:t>Matrica tregon edhe drejtimin e gabimit, i cili është i njëanshëm: nga 171 krahasime, 111 e vlerësojnë rastin më rëndë se rishikuesit dhe vetëm 4 më lehtë (65% kundrejt 2%). Sistemi nuk gabon rastësisht: ai e mbivlerëson ashpërsinë.</w:t>
+      </w:r>
+    </w:p>
+    <w:p>
+      <w:pPr>
+        <w:spacing w:line="360" w:lineRule="auto"/>
+        <w:ind w:firstLine="360"/>
+        <w:jc w:val="both"/>
+      </w:pPr>
+      <w:r>
+        <w:rPr>
+          <w:rFonts w:ascii="Times New Roman" w:hAnsi="Times New Roman" w:eastAsia="Times New Roman"/>
+          <w:b w:val="0"/>
+          <w:caps w:val="0"/>
+          <w:sz w:val="24"/>
+        </w:rPr>
+        <w:t>Shpjegimi qëndron te vetë ndërtimi i pikës. Për Long Method teprica matet mbi një metrikë të vetme, ku dyfishi i pragut ka kuptim të drejtpërdrejtë. Për strategjitë me disa kushte, pika është mesatarja e tepricave mbi metrika heterogjene — një raport WMC-je, një raport kohezioni, një raport qasjesh të huaja — dhe asgjë nuk garanton se mesatarja e tyre përkon me atë që një zhvillues e quan problem të rëndë.</w:t>
+      </w:r>
+    </w:p>
+    <w:p>
+      <w:pPr>
+        <w:spacing w:line="360" w:lineRule="auto"/>
+        <w:ind w:firstLine="360"/>
+        <w:jc w:val="both"/>
+      </w:pPr>
+      <w:r>
+        <w:rPr>
+          <w:rFonts w:ascii="Times New Roman" w:hAnsi="Times New Roman" w:eastAsia="Times New Roman"/>
+          <w:b w:val="0"/>
+          <w:caps w:val="0"/>
+          <w:sz w:val="24"/>
+        </w:rPr>
+        <w:t>Nuk është çështje kalibrimi. Fshirja e të dy pragjeve të ashpërsisë mbi të njëjtin brez si pragjet e detektimit e ngre kappa-n më së shumti deri në 0.308, pra edhe konfigurimi më i favorshëm i provuar mbetet pajtim i dobët. Zhvendosja e kufijve e ndryshon shpërndarjen e etiketave, jo aftësinë e pikës për t'i renditur rastet.</w:t>
+      </w:r>
+    </w:p>
+    <w:p>
+      <w:pPr>
+        <w:spacing w:line="360" w:lineRule="auto"/>
+        <w:ind w:firstLine="360"/>
+        <w:jc w:val="both"/>
+      </w:pPr>
+      <w:r>
+        <w:rPr>
+          <w:rFonts w:ascii="Times New Roman" w:hAnsi="Times New Roman" w:eastAsia="Times New Roman"/>
+          <w:b w:val="0"/>
+          <w:caps w:val="0"/>
+          <w:sz w:val="24"/>
+        </w:rPr>
+        <w:t>Pasoja për punimin është e drejtpërdrejtë: ashpërsia e derivuar është e përdorshme si renditje brenda vetë mjetit — cili rast të shihet i pari — por nuk pretendon të riprodhojë gjykimin e një zhvilluesi për rëndësinë. Ky pretendim hiqet, dhe ndarja e recall-it sipas ashpërsisë së rishikuesve mbetet mënyra e vetme e vlefshme në të cilën ashpërsia hyn në rezultatet e këtij punimi.</w:t>
+      </w:r>
+    </w:p>
+    <w:p>
+      <w:pPr>
         <w:pStyle w:val="Heading1"/>
         <w:pageBreakBefore/>
       </w:pPr>
@@ -9205,7 +9963,7 @@
           <w:caps w:val="0"/>
           <w:sz w:val="22"/>
         </w:rPr>
-        <w:t>Tabela 9. Strategjitë e detektimit dhe burimet e tyre</w:t>
+        <w:t>Tabela 10. Strategjitë e detektimit dhe burimet e tyre</w:t>
       </w:r>
     </w:p>
     <w:tbl>
@@ -9820,6 +10578,7 @@
                 <w:caps w:val="0"/>
                 <w:sz w:val="22"/>
               </w:rPr>
+              <w:t>NP &gt; FEW</w:t>
             </w:r>
           </w:p>
         </w:tc>
@@ -9985,7 +10744,7 @@
           <w:caps w:val="0"/>
           <w:sz w:val="22"/>
         </w:rPr>
-        <w:t>Tabela 10. Kuantifikuesit e përgjithshëm</w:t>
+        <w:t>Tabela 11. Kuantifikuesit e përgjithshëm</w:t>
       </w:r>
     </w:p>
     <w:tbl>
@@ -10432,7 +11191,7 @@
           <w:caps w:val="0"/>
           <w:sz w:val="22"/>
         </w:rPr>
-        <w:t>Tabela 11. Pragjet e përdorura</w:t>
+        <w:t>Tabela 12. Pragjet e përdorura</w:t>
       </w:r>
     </w:p>
     <w:tbl>
@@ -10901,7 +11660,7 @@
                 <w:caps w:val="0"/>
                 <w:sz w:val="22"/>
               </w:rPr>
-              <w:t>feature_envy_atfd</w:t>
+              <w:t>excess_cap</w:t>
             </w:r>
           </w:p>
         </w:tc>
@@ -10941,7 +11700,7 @@
                 <w:caps w:val="0"/>
                 <w:sz w:val="22"/>
               </w:rPr>
-              <w:t>feature_envy_fdp</w:t>
+              <w:t>feature_envy_atfd</w:t>
             </w:r>
           </w:p>
         </w:tc>
@@ -10981,7 +11740,7 @@
                 <w:caps w:val="0"/>
                 <w:sz w:val="22"/>
               </w:rPr>
-              <w:t>feature_envy_laa</w:t>
+              <w:t>feature_envy_fdp</w:t>
             </w:r>
           </w:p>
         </w:tc>
@@ -11000,7 +11759,7 @@
                 <w:caps w:val="0"/>
                 <w:sz w:val="22"/>
               </w:rPr>
-              <w:t>0.333333</w:t>
+              <w:t>5</w:t>
             </w:r>
           </w:p>
         </w:tc>
@@ -11021,7 +11780,7 @@
                 <w:caps w:val="0"/>
                 <w:sz w:val="22"/>
               </w:rPr>
-              <w:t>god_class_atfd</w:t>
+              <w:t>feature_envy_laa</w:t>
             </w:r>
           </w:p>
         </w:tc>
@@ -11040,7 +11799,7 @@
                 <w:caps w:val="0"/>
                 <w:sz w:val="22"/>
               </w:rPr>
-              <w:t>5</w:t>
+              <w:t>0.333333</w:t>
             </w:r>
           </w:p>
         </w:tc>
@@ -11061,7 +11820,7 @@
                 <w:caps w:val="0"/>
                 <w:sz w:val="22"/>
               </w:rPr>
-              <w:t>god_class_tcc</w:t>
+              <w:t>god_class_atfd</w:t>
             </w:r>
           </w:p>
         </w:tc>
@@ -11080,7 +11839,7 @@
                 <w:caps w:val="0"/>
                 <w:sz w:val="22"/>
               </w:rPr>
-              <w:t>0.333333</w:t>
+              <w:t>5</w:t>
             </w:r>
           </w:p>
         </w:tc>
@@ -11101,7 +11860,7 @@
                 <w:caps w:val="0"/>
                 <w:sz w:val="22"/>
               </w:rPr>
-              <w:t>god_class_wmc</w:t>
+              <w:t>god_class_tcc</w:t>
             </w:r>
           </w:p>
         </w:tc>
@@ -11120,7 +11879,7 @@
                 <w:caps w:val="0"/>
                 <w:sz w:val="22"/>
               </w:rPr>
-              <w:t>47</w:t>
+              <w:t>0.333333</w:t>
             </w:r>
           </w:p>
         </w:tc>
@@ -11141,7 +11900,7 @@
                 <w:caps w:val="0"/>
                 <w:sz w:val="22"/>
               </w:rPr>
-              <w:t>large_class_loc</w:t>
+              <w:t>god_class_wmc</w:t>
             </w:r>
           </w:p>
         </w:tc>
@@ -11160,7 +11919,7 @@
                 <w:caps w:val="0"/>
                 <w:sz w:val="22"/>
               </w:rPr>
-              <w:t>200</w:t>
+              <w:t>47</w:t>
             </w:r>
           </w:p>
         </w:tc>
@@ -11181,7 +11940,7 @@
                 <w:caps w:val="0"/>
                 <w:sz w:val="22"/>
               </w:rPr>
-              <w:t>large_class_nom</w:t>
+              <w:t>large_class_loc</w:t>
             </w:r>
           </w:p>
         </w:tc>
@@ -11200,7 +11959,7 @@
                 <w:caps w:val="0"/>
                 <w:sz w:val="22"/>
               </w:rPr>
-              <w:t>20</w:t>
+              <w:t>200</w:t>
             </w:r>
           </w:p>
         </w:tc>
@@ -11221,7 +11980,7 @@
                 <w:caps w:val="0"/>
                 <w:sz w:val="22"/>
               </w:rPr>
-              <w:t>long_method_loc</w:t>
+              <w:t>large_class_nom</w:t>
             </w:r>
           </w:p>
         </w:tc>
@@ -11240,7 +11999,7 @@
                 <w:caps w:val="0"/>
                 <w:sz w:val="22"/>
               </w:rPr>
-              <w:t>30</w:t>
+              <w:t>20</w:t>
             </w:r>
           </w:p>
         </w:tc>
@@ -11261,6 +12020,46 @@
                 <w:caps w:val="0"/>
                 <w:sz w:val="22"/>
               </w:rPr>
+              <w:t>long_method_loc</w:t>
+            </w:r>
+          </w:p>
+        </w:tc>
+        <w:tc>
+          <w:tcPr>
+            <w:tcW w:type="dxa" w:w="4320"/>
+          </w:tcPr>
+          <w:p>
+            <w:pPr>
+              <w:spacing w:line="240" w:lineRule="auto"/>
+            </w:pPr>
+            <w:r>
+              <w:rPr>
+                <w:rFonts w:ascii="Times New Roman" w:hAnsi="Times New Roman" w:eastAsia="Times New Roman"/>
+                <w:b w:val="0"/>
+                <w:caps w:val="0"/>
+                <w:sz w:val="22"/>
+              </w:rPr>
+              <w:t>30</w:t>
+            </w:r>
+          </w:p>
+        </w:tc>
+      </w:tr>
+      <w:tr>
+        <w:tc>
+          <w:tcPr>
+            <w:tcW w:type="dxa" w:w="4320"/>
+          </w:tcPr>
+          <w:p>
+            <w:pPr>
+              <w:spacing w:line="240" w:lineRule="auto"/>
+            </w:pPr>
+            <w:r>
+              <w:rPr>
+                <w:rFonts w:ascii="Times New Roman" w:hAnsi="Times New Roman" w:eastAsia="Times New Roman"/>
+                <w:b w:val="0"/>
+                <w:caps w:val="0"/>
+                <w:sz w:val="22"/>
+              </w:rPr>
               <w:t>long_parameter_list_np</w:t>
             </w:r>
           </w:p>
@@ -11281,6 +12080,86 @@
                 <w:sz w:val="22"/>
               </w:rPr>
               <w:t>5</w:t>
+            </w:r>
+          </w:p>
+        </w:tc>
+      </w:tr>
+      <w:tr>
+        <w:tc>
+          <w:tcPr>
+            <w:tcW w:type="dxa" w:w="4320"/>
+          </w:tcPr>
+          <w:p>
+            <w:pPr>
+              <w:spacing w:line="240" w:lineRule="auto"/>
+            </w:pPr>
+            <w:r>
+              <w:rPr>
+                <w:rFonts w:ascii="Times New Roman" w:hAnsi="Times New Roman" w:eastAsia="Times New Roman"/>
+                <w:b w:val="0"/>
+                <w:caps w:val="0"/>
+                <w:sz w:val="22"/>
+              </w:rPr>
+              <w:t>severity_critical</w:t>
+            </w:r>
+          </w:p>
+        </w:tc>
+        <w:tc>
+          <w:tcPr>
+            <w:tcW w:type="dxa" w:w="4320"/>
+          </w:tcPr>
+          <w:p>
+            <w:pPr>
+              <w:spacing w:line="240" w:lineRule="auto"/>
+            </w:pPr>
+            <w:r>
+              <w:rPr>
+                <w:rFonts w:ascii="Times New Roman" w:hAnsi="Times New Roman" w:eastAsia="Times New Roman"/>
+                <w:b w:val="0"/>
+                <w:caps w:val="0"/>
+                <w:sz w:val="22"/>
+              </w:rPr>
+              <w:t>2.5</w:t>
+            </w:r>
+          </w:p>
+        </w:tc>
+      </w:tr>
+      <w:tr>
+        <w:tc>
+          <w:tcPr>
+            <w:tcW w:type="dxa" w:w="4320"/>
+          </w:tcPr>
+          <w:p>
+            <w:pPr>
+              <w:spacing w:line="240" w:lineRule="auto"/>
+            </w:pPr>
+            <w:r>
+              <w:rPr>
+                <w:rFonts w:ascii="Times New Roman" w:hAnsi="Times New Roman" w:eastAsia="Times New Roman"/>
+                <w:b w:val="0"/>
+                <w:caps w:val="0"/>
+                <w:sz w:val="22"/>
+              </w:rPr>
+              <w:t>severity_major</w:t>
+            </w:r>
+          </w:p>
+        </w:tc>
+        <w:tc>
+          <w:tcPr>
+            <w:tcW w:type="dxa" w:w="4320"/>
+          </w:tcPr>
+          <w:p>
+            <w:pPr>
+              <w:spacing w:line="240" w:lineRule="auto"/>
+            </w:pPr>
+            <w:r>
+              <w:rPr>
+                <w:rFonts w:ascii="Times New Roman" w:hAnsi="Times New Roman" w:eastAsia="Times New Roman"/>
+                <w:b w:val="0"/>
+                <w:caps w:val="0"/>
+                <w:sz w:val="22"/>
+              </w:rPr>
+              <w:t>1.5</w:t>
             </w:r>
           </w:p>
         </w:tc>
@@ -11333,7 +12212,7 @@
           <w:caps w:val="0"/>
           <w:sz w:val="22"/>
         </w:rPr>
-        <w:t>Tabela 12. Metrikat sipas nivelit</w:t>
+        <w:t>Tabela 13. Metrikat sipas nivelit</w:t>
       </w:r>
     </w:p>
     <w:tbl>
@@ -11514,7 +12393,7 @@
           <w:caps w:val="0"/>
           <w:sz w:val="22"/>
         </w:rPr>
-        <w:t>Tabela 13. Çka propozohet dhe çka aplikohet</w:t>
+        <w:t>Tabela 14. Çka propozohet dhe çka aplikohet</w:t>
       </w:r>
     </w:p>
     <w:tbl>
@@ -12093,7 +12972,7 @@
           <w:caps w:val="0"/>
           <w:sz w:val="22"/>
         </w:rPr>
-        <w:t>Tabela 14. Arsyet e refuzimit</w:t>
+        <w:t>Tabela 15. Arsyet e refuzimit</w:t>
       </w:r>
     </w:p>
     <w:tbl>
@@ -12554,7 +13433,7 @@
           <w:caps w:val="0"/>
           <w:sz w:val="22"/>
         </w:rPr>
-        <w:t>Tabela 15. Radha e ekzekutimit</w:t>
+        <w:t>Tabela 16. Radha e ekzekutimit</w:t>
       </w:r>
     </w:p>
     <w:tbl>
@@ -13290,7 +14169,7 @@
           <w:caps w:val="0"/>
           <w:sz w:val="24"/>
         </w:rPr>
-        <w:t>Çdo skript shkruan rezultatin si CSV ose JSON në data/results/, bashkë me commit-in, versionin e Python-it dhe platformën që e prodhuan. Numrat e këtij punimi u prodhuan me commit-in e47911ef9f, Python 3.13.1, Windows-11-10.0.26200-SP0.</w:t>
+        <w:t>Çdo skript shkruan rezultatin si CSV ose JSON në data/results/, bashkë me commit-in, versionin e Python-it dhe platformën që e prodhuan. Numrat e këtij punimi u prodhuan me commit-in 7e7595c0ee, Python 3.13.1, Windows-11-10.0.26200-SP0.</w:t>
       </w:r>
     </w:p>
     <w:p>

</xml_diff>

<commit_message>
Merr intervalet, pajtimin e rishikuesve dhe kopertinen me logo
</commit_message>
<xml_diff>
--- a/docs/thesis/Punim_Diplome_Florent_Latifi.docx
+++ b/docs/thesis/Punim_Diplome_Florent_Latifi.docx
@@ -4,17 +4,42 @@
   <w:body>
     <w:p>
       <w:pPr>
-        <w:spacing w:line="360" w:lineRule="auto" w:after="0"/>
+        <w:spacing w:after="240"/>
         <w:jc w:val="center"/>
       </w:pPr>
       <w:r>
-        <w:rPr>
-          <w:rFonts w:ascii="Times New Roman" w:hAnsi="Times New Roman" w:eastAsia="Times New Roman"/>
-          <w:b/>
-          <w:caps w:val="0"/>
-          <w:sz w:val="28"/>
-        </w:rPr>
-        <w:t>UNIVERSITETI PËR BIZNES DHE TEKNOLOGJI</w:t>
+        <w:drawing>
+          <wp:inline xmlns:a="http://schemas.openxmlformats.org/drawingml/2006/main" xmlns:pic="http://schemas.openxmlformats.org/drawingml/2006/picture">
+            <wp:extent cx="5394960" cy="624376"/>
+            <wp:docPr id="1" name="Picture 1"/>
+            <wp:cNvGraphicFramePr>
+              <a:graphicFrameLocks noChangeAspect="1"/>
+            </wp:cNvGraphicFramePr>
+            <a:graphic>
+              <a:graphicData uri="http://schemas.openxmlformats.org/drawingml/2006/picture">
+                <pic:pic>
+                  <pic:nvPicPr>
+                    <pic:cNvPr id="0" name="ubt_logo.jpg"/>
+                    <pic:cNvPicPr/>
+                  </pic:nvPicPr>
+                  <pic:blipFill>
+                    <a:blip r:embed="rId10"/>
+                    <a:stretch>
+                      <a:fillRect/>
+                    </a:stretch>
+                  </pic:blipFill>
+                  <pic:spPr>
+                    <a:xfrm>
+                      <a:off x="0" y="0"/>
+                      <a:ext cx="5394960" cy="624376"/>
+                    </a:xfrm>
+                    <a:prstGeom prst="rect"/>
+                  </pic:spPr>
+                </pic:pic>
+              </a:graphicData>
+            </a:graphic>
+          </wp:inline>
+        </w:drawing>
       </w:r>
     </w:p>
     <w:p>
@@ -209,7 +234,7 @@
           <w:caps w:val="0"/>
           <w:sz w:val="24"/>
         </w:rPr>
-        <w:t>[PLOTËSO] / 2026</w:t>
+        <w:t>Nëntor / 2026</w:t>
       </w:r>
     </w:p>
     <w:p>
@@ -234,17 +259,42 @@
     </w:p>
     <w:p>
       <w:pPr>
-        <w:spacing w:line="360" w:lineRule="auto" w:after="0"/>
+        <w:spacing w:after="240"/>
         <w:jc w:val="center"/>
       </w:pPr>
       <w:r>
-        <w:rPr>
-          <w:rFonts w:ascii="Times New Roman" w:hAnsi="Times New Roman" w:eastAsia="Times New Roman"/>
-          <w:b/>
-          <w:caps w:val="0"/>
-          <w:sz w:val="28"/>
-        </w:rPr>
-        <w:t>UNIVERSITETI PËR BIZNES DHE TEKNOLOGJI</w:t>
+        <w:drawing>
+          <wp:inline xmlns:a="http://schemas.openxmlformats.org/drawingml/2006/main" xmlns:pic="http://schemas.openxmlformats.org/drawingml/2006/picture">
+            <wp:extent cx="5394960" cy="624376"/>
+            <wp:docPr id="2" name="Picture 2"/>
+            <wp:cNvGraphicFramePr>
+              <a:graphicFrameLocks noChangeAspect="1"/>
+            </wp:cNvGraphicFramePr>
+            <a:graphic>
+              <a:graphicData uri="http://schemas.openxmlformats.org/drawingml/2006/picture">
+                <pic:pic>
+                  <pic:nvPicPr>
+                    <pic:cNvPr id="0" name="ubt_logo.jpg"/>
+                    <pic:cNvPicPr/>
+                  </pic:nvPicPr>
+                  <pic:blipFill>
+                    <a:blip r:embed="rId10"/>
+                    <a:stretch>
+                      <a:fillRect/>
+                    </a:stretch>
+                  </pic:blipFill>
+                  <pic:spPr>
+                    <a:xfrm>
+                      <a:off x="0" y="0"/>
+                      <a:ext cx="5394960" cy="624376"/>
+                    </a:xfrm>
+                    <a:prstGeom prst="rect"/>
+                  </pic:spPr>
+                </pic:pic>
+              </a:graphicData>
+            </a:graphic>
+          </wp:inline>
+        </w:drawing>
       </w:r>
     </w:p>
     <w:p>
@@ -299,7 +349,7 @@
           <w:caps w:val="0"/>
           <w:sz w:val="24"/>
         </w:rPr>
-        <w:t>Viti akademik 2023 - 2024</w:t>
+        <w:t>Viti akademik 2025 - 2026</w:t>
       </w:r>
     </w:p>
     <w:p>
@@ -389,7 +439,7 @@
           <w:caps w:val="0"/>
           <w:sz w:val="24"/>
         </w:rPr>
-        <w:t>Mentore: [PLOTËSO] Altina Salihu</w:t>
+        <w:t>Mentore: Altina Salihu</w:t>
       </w:r>
     </w:p>
     <w:p>
@@ -429,7 +479,7 @@
           <w:caps w:val="0"/>
           <w:sz w:val="24"/>
         </w:rPr>
-        <w:t>[PLOTËSO] / 2026</w:t>
+        <w:t>Nëntor / 2026</w:t>
       </w:r>
     </w:p>
     <w:p>
@@ -1534,7 +1584,7 @@
     <w:p>
       <w:pPr>
         <w:sectPr>
-          <w:footerReference w:type="default" r:id="rId10"/>
+          <w:footerReference w:type="default" r:id="rId11"/>
           <w:pgSz w:w="12240" w:h="15840"/>
           <w:pgMar w:top="1440" w:right="1800" w:bottom="1440" w:left="1800" w:header="720" w:footer="720" w:gutter="0"/>
           <w:cols w:space="720"/>
@@ -3214,7 +3264,7 @@
         <w:drawing>
           <wp:inline xmlns:a="http://schemas.openxmlformats.org/drawingml/2006/main" xmlns:pic="http://schemas.openxmlformats.org/drawingml/2006/picture">
             <wp:extent cx="5120640" cy="2523481"/>
-            <wp:docPr id="1" name="Picture 1"/>
+            <wp:docPr id="3" name="Picture 3"/>
             <wp:cNvGraphicFramePr>
               <a:graphicFrameLocks noChangeAspect="1"/>
             </wp:cNvGraphicFramePr>
@@ -3226,7 +3276,7 @@
                     <pic:cNvPicPr/>
                   </pic:nvPicPr>
                   <pic:blipFill>
-                    <a:blip r:embed="rId12"/>
+                    <a:blip r:embed="rId13"/>
                     <a:stretch>
                       <a:fillRect/>
                     </a:stretch>
@@ -4447,7 +4497,7 @@
         <w:drawing>
           <wp:inline xmlns:a="http://schemas.openxmlformats.org/drawingml/2006/main" xmlns:pic="http://schemas.openxmlformats.org/drawingml/2006/picture">
             <wp:extent cx="5120640" cy="2718364"/>
-            <wp:docPr id="2" name="Picture 2"/>
+            <wp:docPr id="4" name="Picture 4"/>
             <wp:cNvGraphicFramePr>
               <a:graphicFrameLocks noChangeAspect="1"/>
             </wp:cNvGraphicFramePr>
@@ -4459,7 +4509,7 @@
                     <pic:cNvPicPr/>
                   </pic:nvPicPr>
                   <pic:blipFill>
-                    <a:blip r:embed="rId13"/>
+                    <a:blip r:embed="rId14"/>
                     <a:stretch>
                       <a:fillRect/>
                     </a:stretch>
@@ -5178,7 +5228,7 @@
         <w:drawing>
           <wp:inline xmlns:a="http://schemas.openxmlformats.org/drawingml/2006/main" xmlns:pic="http://schemas.openxmlformats.org/drawingml/2006/picture">
             <wp:extent cx="5120640" cy="2369251"/>
-            <wp:docPr id="3" name="Picture 3"/>
+            <wp:docPr id="5" name="Picture 5"/>
             <wp:cNvGraphicFramePr>
               <a:graphicFrameLocks noChangeAspect="1"/>
             </wp:cNvGraphicFramePr>
@@ -5190,7 +5240,7 @@
                     <pic:cNvPicPr/>
                   </pic:nvPicPr>
                   <pic:blipFill>
-                    <a:blip r:embed="rId14"/>
+                    <a:blip r:embed="rId15"/>
                     <a:stretch>
                       <a:fillRect/>
                     </a:stretch>
@@ -5246,7 +5296,7 @@
         <w:drawing>
           <wp:inline xmlns:a="http://schemas.openxmlformats.org/drawingml/2006/main" xmlns:pic="http://schemas.openxmlformats.org/drawingml/2006/picture">
             <wp:extent cx="5120640" cy="2900601"/>
-            <wp:docPr id="4" name="Picture 4"/>
+            <wp:docPr id="6" name="Picture 6"/>
             <wp:cNvGraphicFramePr>
               <a:graphicFrameLocks noChangeAspect="1"/>
             </wp:cNvGraphicFramePr>
@@ -5258,7 +5308,7 @@
                     <pic:cNvPicPr/>
                   </pic:nvPicPr>
                   <pic:blipFill>
-                    <a:blip r:embed="rId15"/>
+                    <a:blip r:embed="rId16"/>
                     <a:stretch>
                       <a:fillRect/>
                     </a:stretch>
@@ -5931,7 +5981,7 @@
         <w:drawing>
           <wp:inline xmlns:a="http://schemas.openxmlformats.org/drawingml/2006/main" xmlns:pic="http://schemas.openxmlformats.org/drawingml/2006/picture">
             <wp:extent cx="5120640" cy="2837552"/>
-            <wp:docPr id="5" name="Picture 5"/>
+            <wp:docPr id="7" name="Picture 7"/>
             <wp:cNvGraphicFramePr>
               <a:graphicFrameLocks noChangeAspect="1"/>
             </wp:cNvGraphicFramePr>
@@ -5943,7 +5993,7 @@
                     <pic:cNvPicPr/>
                   </pic:nvPicPr>
                   <pic:blipFill>
-                    <a:blip r:embed="rId16"/>
+                    <a:blip r:embed="rId17"/>
                     <a:stretch>
                       <a:fillRect/>
                     </a:stretch>
@@ -8162,7 +8212,7 @@
         <w:drawing>
           <wp:inline xmlns:a="http://schemas.openxmlformats.org/drawingml/2006/main" xmlns:pic="http://schemas.openxmlformats.org/drawingml/2006/picture">
             <wp:extent cx="5120640" cy="3172826"/>
-            <wp:docPr id="6" name="Picture 6"/>
+            <wp:docPr id="8" name="Picture 8"/>
             <wp:cNvGraphicFramePr>
               <a:graphicFrameLocks noChangeAspect="1"/>
             </wp:cNvGraphicFramePr>
@@ -8174,7 +8224,7 @@
                     <pic:cNvPicPr/>
                   </pic:nvPicPr>
                   <pic:blipFill>
-                    <a:blip r:embed="rId17"/>
+                    <a:blip r:embed="rId18"/>
                     <a:stretch>
                       <a:fillRect/>
                     </a:stretch>
@@ -9489,7 +9539,7 @@
         </w:rPr>
         <w:t>[5]</w:t>
         <w:tab/>
-        <w:t>Brunsfeld, M. et al. tree-sitter: An incremental parsing system for programming tools. [https://tree-sitter.github.io/tree-sitter/], data e qasjes: [PLOTËSO].</w:t>
+        <w:t>Brunsfeld, M. et al. tree-sitter: An incremental parsing system for programming tools. [https://tree-sitter.github.io/tree-sitter/], data e qasjes: 30.08.2026.</w:t>
       </w:r>
     </w:p>
     <w:p>
@@ -14189,7 +14239,7 @@
       </w:r>
     </w:p>
     <w:sectPr>
-      <w:footerReference w:type="default" r:id="rId11"/>
+      <w:footerReference w:type="default" r:id="rId12"/>
       <w:pgSz w:w="12240" w:h="15840"/>
       <w:pgMar w:top="1440" w:right="1800" w:bottom="1440" w:left="1800" w:header="720" w:footer="720" w:gutter="0"/>
       <w:cols w:space="720"/>

</xml_diff>

<commit_message>
Shto Introduce Parameter Object per metodat private
</commit_message>
<xml_diff>
--- a/docs/thesis/Punim_Diplome_Florent_Latifi.docx
+++ b/docs/thesis/Punim_Diplome_Florent_Latifi.docx
@@ -2709,7 +2709,23 @@
           <w:caps w:val="0"/>
           <w:sz w:val="24"/>
         </w:rPr>
-        <w:t>E para: analizuesi regjistron fakte sintaksore dhe nuk zgjidh simbole. Kjo e mban sistemin të thjeshtë dhe të shpejtë, por do të thotë se çdo transformim që duhet të gjejë të gjitha referencat ndaj një emri në projekt nuk i provon dot parakushtet e veta. Rrjedhimisht tri nga pesë transformimet e planifikuara mbeten propozim dhe nuk aplikohen automatikisht. Kjo nuk është mangësi implementimi por pasojë e deklaruar e zgjedhjes.</w:t>
+        <w:t>E para: analizuesi regjistron fakte sintaksore dhe nuk zgjidh simbole. Kjo e mban sistemin të thjeshtë dhe të shpejtë, por do të thotë se çdo transformim që duhet të gjejë të gjitha referencat ndaj një emri në projekt nuk i provon dot parakushtet e veta. Rrjedhimisht dy nga pesë transformimet e planifikuara mbeten propozim dhe nuk aplikohen automatikisht. Kjo nuk është mangësi implementimi por pasojë e deklaruar e zgjedhjes.</w:t>
+      </w:r>
+    </w:p>
+    <w:p>
+      <w:pPr>
+        <w:spacing w:line="360" w:lineRule="auto"/>
+        <w:ind w:firstLine="360"/>
+        <w:jc w:val="both"/>
+      </w:pPr>
+      <w:r>
+        <w:rPr>
+          <w:rFonts w:ascii="Times New Roman" w:hAnsi="Times New Roman" w:eastAsia="Times New Roman"/>
+          <w:b w:val="0"/>
+          <w:caps w:val="0"/>
+          <w:sz w:val="24"/>
+        </w:rPr>
+        <w:t>Kufiri nuk është gjithmonë aty ku duket. Ndryshimi i një nënshkrimi kërkon çdo pikë thirrjeje, por Java-ja i kufizon vetë thirrjet e një metode `private` brenda skedarit ku ajo jeton. Prandaj Introduce Parameter Object aplikohet pikërisht atje dhe refuzon kudo tjetër: modifikuesi i qasjes, e jo vështirësia e transformimit, është kushti që e bën të provueshëm.</w:t>
       </w:r>
     </w:p>
     <w:p>
@@ -10929,7 +10945,7 @@
           <w:caps w:val="0"/>
           <w:sz w:val="24"/>
         </w:rPr>
-        <w:t>Analizuesi nuk zgjidh simbole, ndaj tri nga pesë transformimet e planifikuara nuk automatizohen. Kjo nuk është mangësi implementimi por pasojë e drejtpërdrejtë e një zgjedhjeje arkitekturore të deklaruar.</w:t>
+        <w:t>Analizuesi nuk zgjidh simbole, ndaj dy nga pesë transformimet e planifikuara nuk automatizohen. Kjo nuk është mangësi implementimi por pasojë e drejtpërdrejtë e një zgjedhjeje arkitekturore të deklaruar.</w:t>
       </w:r>
     </w:p>
     <w:p>
@@ -14559,7 +14575,7 @@
                 <w:caps w:val="0"/>
                 <w:sz w:val="22"/>
               </w:rPr>
-              <w:t>vetëm propozohet</w:t>
+              <w:t>aplikohet: IntroduceParameterObject</w:t>
             </w:r>
           </w:p>
         </w:tc>
@@ -16010,7 +16026,7 @@
           <w:caps w:val="0"/>
           <w:sz w:val="24"/>
         </w:rPr>
-        <w:t>Çdo skript shkruan rezultatin si CSV ose JSON në data/results/, bashkë me commit-in, versionin e Python-it dhe platformën që e prodhuan. Numrat e këtij punimi u prodhuan me commit-in b1db822985, Python 3.13.1, Windows-11-10.0.26200-SP0.</w:t>
+        <w:t>Çdo skript shkruan rezultatin si CSV ose JSON në data/results/, bashkë me commit-in, versionin e Python-it dhe platformën që e prodhuan. Numrat e këtij punimi u prodhuan me commit-in fc227243bf, Python 3.13.1, Windows-11-10.0.26200-SP0.</w:t>
       </w:r>
     </w:p>
     <w:p>

</xml_diff>

<commit_message>
Gjeneroje abstraktin nga rezultatet
</commit_message>
<xml_diff>
--- a/docs/thesis/Punim_Diplome_Florent_Latifi.docx
+++ b/docs/thesis/Punim_Diplome_Florent_Latifi.docx
@@ -568,7 +568,7 @@
           <w:caps w:val="0"/>
           <w:sz w:val="24"/>
         </w:rPr>
-        <w:t>Ky punim ndërton një sistem që i zbulon code smells në dy mënyra të pavarura dhe i krahason mbi të njëjtën të vërtetë bazë. Qasja e parë zbaton strategjitë e publikuara të detektimit mbi njëzet e gjashtë metrika; e dyta trajnon klasifikues mbi po ato metrika. Të dyja vlerësohen mbi 4 534 mostra nga 522 depo Java, të etiketuara nga zhvillues profesionistë, me ndarje të grupuar sipas depos dhe me të njëjtin kod pikëzimi. Sistemi përfshin edhe një motor refaktorimi që rishkruan kod vetëm kur i provon parakushtet e veta nga pema sintaksore, dhe një ndërfaqe web mbi të tria.</w:t>
+        <w:t>Ky punim ndërton një sistem që i zbulon code smells në dy mënyra të pavarura dhe i krahason mbi të njëjtën të vërtetë bazë. Qasja e parë zbaton strategjitë e publikuara të detektimit mbi 26 metrika; e dyta trajnon klasifikues mbi po ato metrika. Të dyja vlerësohen mbi 4 534 mostra nga 522 depo Java, të etiketuara nga zhvillues profesionistë, me ndarje të grupuar sipas depos dhe me të njëjtin kod pikëzimi. Sistemi përfshin edhe një motor refaktorimi që rishkruan kod vetëm kur i provon parakushtet e veta nga pema sintaksore, dhe një ndërfaqe web mbi të tria.</w:t>
       </w:r>
     </w:p>
     <w:p>
@@ -584,7 +584,23 @@
           <w:caps w:val="0"/>
           <w:sz w:val="24"/>
         </w:rPr>
-        <w:t>Strategjitë e publikuara dolën të sakta por të kursyera: precizion 0.52 deri 0.87 me recall 0.10 deri 0.44. Të ndara sipas ashpërsisë, ato degradojnë me hijeshi, duke i kapur rastet e rënda shumë më mirë se ato të lehtat. Klasifikuesit i tejkaluan qartë, me MCC nga 0.488 te 0.713 kundrejt 0.232 deri 0.580, dhe i rizbuluan pjesërisht metrikat që përdorin vetë strategjitë. Motori i refaktorimit transformoi një pjesë të matur të rasteve të detektuara, ku shumica e refuzimeve vjen nga forma e kodit dhe nga rrjedha e kontrollit. Kontributi kryesor nuk është një shifër e vetme, por një hark i plotë e i riprodhueshëm nga korpusi te rezultati.</w:t>
+        <w:t>Strategjitë e publikuara dolën të sakta por të kursyera: precizion 0.520 deri 0.872 me recall 0.100 deri 0.440. Të ndara sipas ashpërsisë, ato degradojnë me hijeshi, duke i kapur rastet e rënda shumë më mirë se ato të lehtat. Klasifikuesit i tejkaluan qartë, me MCC 0.488 deri 0.713 kundrejt 0.232 deri 0.580, dhe i rizbuluan pjesërisht metrikat që përdorin vetë strategjitë. Intervalet e besimit me bootstrap sipas depos tregojnë se ajo përparësi e kalon zeron te të katër erërat.</w:t>
+      </w:r>
+    </w:p>
+    <w:p>
+      <w:pPr>
+        <w:spacing w:line="360" w:lineRule="auto"/>
+        <w:ind w:firstLine="360"/>
+        <w:jc w:val="both"/>
+      </w:pPr>
+      <w:r>
+        <w:rPr>
+          <w:rFonts w:ascii="Times New Roman" w:hAnsi="Times New Roman" w:eastAsia="Times New Roman"/>
+          <w:b w:val="0"/>
+          <w:caps w:val="0"/>
+          <w:sz w:val="24"/>
+        </w:rPr>
+        <w:t>Dy rezultate janë negative dhe raportohen si të tilla. Ashpërsia që sistemi e derivon nga teprica mbi pragje nuk e riprodhon gjykimin e rishikuesve: pajtimi i matur me kappa me peshë qëndron te 0.007 deri 0.293, dhe gabimi është i njëanshëm nga mbivlerësimi. Po ashtu, vetë rishikuesit pajtohen mes tyre me MCC 0.022 deri 0.238, çka tregon se një pjesë e pareduktueshme e gabimit të çdo detektori i takon përkufizimit të erës dhe jo detektorit. Motori i refaktorimit automatizon 3 transformime dhe transformoi 21.7% të vendeve të detektuara, ku shumica e refuzimeve vjen nga forma e kodit dhe nga rrjedha e kontrollit; refuzimi trajtohet si rezultat i saktë dhe numërohet. Kontributi kryesor nuk është një shifër e vetme, por një hark i plotë e i riprodhueshëm nga korpusi te rezultati.</w:t>
       </w:r>
     </w:p>
     <w:p>
@@ -16026,7 +16042,7 @@
           <w:caps w:val="0"/>
           <w:sz w:val="24"/>
         </w:rPr>
-        <w:t>Çdo skript shkruan rezultatin si CSV ose JSON në data/results/, bashkë me commit-in, versionin e Python-it dhe platformën që e prodhuan. Numrat e këtij punimi u prodhuan me commit-in fc227243bf, Python 3.13.1, Windows-11-10.0.26200-SP0.</w:t>
+        <w:t>Çdo skript shkruan rezultatin si CSV ose JSON në data/results/, bashkë me commit-in, versionin e Python-it dhe platformën që e prodhuan. Numrat e këtij punimi u prodhuan me commit-in 1ee9f0ecd9, Python 3.13.1, Windows-11-10.0.26200-SP0.</w:t>
       </w:r>
     </w:p>
     <w:p>

</xml_diff>

<commit_message>
Perditeso Kapitullin 6 me gjetjet e reja
</commit_message>
<xml_diff>
--- a/docs/thesis/Punim_Diplome_Florent_Latifi.docx
+++ b/docs/thesis/Punim_Diplome_Florent_Latifi.docx
@@ -10810,6 +10810,22 @@
     </w:p>
     <w:p>
       <w:pPr>
+        <w:spacing w:line="360" w:lineRule="auto"/>
+        <w:ind w:firstLine="360"/>
+        <w:jc w:val="both"/>
+      </w:pPr>
+      <w:r>
+        <w:rPr>
+          <w:rFonts w:ascii="Times New Roman" w:hAnsi="Times New Roman" w:eastAsia="Times New Roman"/>
+          <w:b w:val="0"/>
+          <w:caps w:val="0"/>
+          <w:sz w:val="24"/>
+        </w:rPr>
+        <w:t>Përparësia qëndron edhe kur matet me interval besimi, por jo pa kusht. Kur rregullit i jepet pragu i tij më i mirë nga fshirja — krahasimi më bujar që mund t'i bëhet — dallimi te Long Method e përfshin zeron. Pra pretendimi vlen përgjithësisht, dhe jo pikërisht te era ku rregulli tashmë punonte më mirë. Ky është kufizim i krahasimit, jo i njërës qasje.</w:t>
+      </w:r>
+    </w:p>
+    <w:p>
+      <w:pPr>
         <w:pStyle w:val="Heading2"/>
       </w:pPr>
       <w:r>
@@ -10966,6 +10982,38 @@
     </w:p>
     <w:p>
       <w:pPr>
+        <w:spacing w:line="360" w:lineRule="auto"/>
+        <w:ind w:firstLine="360"/>
+        <w:jc w:val="both"/>
+      </w:pPr>
+      <w:r>
+        <w:rPr>
+          <w:rFonts w:ascii="Times New Roman" w:hAnsi="Times New Roman" w:eastAsia="Times New Roman"/>
+          <w:b w:val="0"/>
+          <w:caps w:val="0"/>
+          <w:sz w:val="24"/>
+        </w:rPr>
+        <w:t>Ashpërsia që sistemi e derivon nuk e riprodhon gjykimin e rishikuesve. Ajo u ndërtua në shkallën e MLCQ-së pikërisht që të krahasohej me ta pa hap përkthimi, dhe kur krahasimi u bë, pajtimi doli pranë rastësisë për tri nga katër erërat, me mbivlerësim sistematik. Pretendimi hiqet: ajo mbetet renditje e brendshme e mjetit dhe jo riprodhim i gjykimit njerëzor.</w:t>
+      </w:r>
+    </w:p>
+    <w:p>
+      <w:pPr>
+        <w:spacing w:line="360" w:lineRule="auto"/>
+        <w:ind w:firstLine="360"/>
+        <w:jc w:val="both"/>
+      </w:pPr>
+      <w:r>
+        <w:rPr>
+          <w:rFonts w:ascii="Times New Roman" w:hAnsi="Times New Roman" w:eastAsia="Times New Roman"/>
+          <w:b w:val="0"/>
+          <w:caps w:val="0"/>
+          <w:sz w:val="24"/>
+        </w:rPr>
+        <w:t>Vetë e vërteta bazë ka një tavan të ulët. Rishikuesit e MLCQ-së pajtohen mes tyre me MCC nën 0.24 për çdo erë, çka do të thotë se një pjesë e pareduktueshme e gabimit të çdo detektori i takon paqartësisë së përkufizimit dhe jo detektorit. Kjo nuk i zbut shifrat e këtij punimi, por e ndryshon shkallën në të cilën duhen lexuar — të tijat dhe të literaturës.</w:t>
+      </w:r>
+    </w:p>
+    <w:p>
+      <w:pPr>
         <w:pStyle w:val="Heading2"/>
       </w:pPr>
       <w:r>
@@ -11039,7 +11087,23 @@
           <w:caps w:val="0"/>
           <w:sz w:val="24"/>
         </w:rPr>
-        <w:t>Analizë e ndjeshmërisë mbi pragje, e cila tashmë është e mundur në sekonda falë tabelës së veçorive.</w:t>
+        <w:t>Kalibrim i pragjeve mbi një bashkësi të ndarë dhe vlerësim mbi një tjetër të paprekur. Fshirja tregoi se dy pragje e ndryshojnë ndjeshëm rezultatin, por adoptimi i tyre pa këtë ndarje do të ishte thjesht përshtatje ndaj të dhënave të testimit.</w:t>
+      </w:r>
+    </w:p>
+    <w:p>
+      <w:pPr>
+        <w:pStyle w:val="ListBullet"/>
+        <w:spacing w:line="360" w:lineRule="auto"/>
+        <w:jc w:val="both"/>
+      </w:pPr>
+      <w:r>
+        <w:rPr>
+          <w:rFonts w:ascii="Times New Roman" w:hAnsi="Times New Roman" w:eastAsia="Times New Roman"/>
+          <w:b w:val="0"/>
+          <w:caps w:val="0"/>
+          <w:sz w:val="24"/>
+        </w:rPr>
+        <w:t>Ashpërsi e mësuar nga të dhënat në vend që të derivohet nga teprica. Kjo e kthen një derivim të shpjegueshëm në një model të dytë, ndaj kërkon ndarjen e vet të korpusit.</w:t>
       </w:r>
     </w:p>
     <w:p>
@@ -11086,6 +11150,22 @@
           <w:sz w:val="24"/>
         </w:rPr>
         <w:t>Përgjigjet e shkurtra ndaj tri pyetjeve kërkimore janë: strategjitë e publikuara janë të sakta por të kursyera; një klasifikues mbi të njëjtat metrika është dukshëm më i mirë dhe i rizbulon pjesërisht metrikat e strategjive; dhe një pjesë e vogël por reale e rasteve të detektuara mund të transformohet automatikisht, ku shumica e refuzimeve vjen nga forma e kodit dhe nga rrjedha e kontrollit.</w:t>
+      </w:r>
+    </w:p>
+    <w:p>
+      <w:pPr>
+        <w:spacing w:line="360" w:lineRule="auto"/>
+        <w:ind w:firstLine="360"/>
+        <w:jc w:val="both"/>
+      </w:pPr>
+      <w:r>
+        <w:rPr>
+          <w:rFonts w:ascii="Times New Roman" w:hAnsi="Times New Roman" w:eastAsia="Times New Roman"/>
+          <w:b w:val="0"/>
+          <w:caps w:val="0"/>
+          <w:sz w:val="24"/>
+        </w:rPr>
+        <w:t>Dy rezultate negative i shoqërojnë ato dhe nuk duhen lexuar veç: ashpërsia e derivuar nuk e riprodhon gjykimin e rishikuesve, dhe vetë rishikuesit pajtohen mes tyre aq pak sa çdo shifër e kësaj fushe duhet lexuar mbi një tavan dukshëm më të ulët se sa e sugjeron zakonisht literatura.</w:t>
       </w:r>
     </w:p>
     <w:p>

</xml_diff>

<commit_message>
Vizualizo intervalet e besimit dhe mbivleresimin e ashpersise
</commit_message>
<xml_diff>
--- a/docs/thesis/Punim_Diplome_Florent_Latifi.docx
+++ b/docs/thesis/Punim_Diplome_Florent_Latifi.docx
@@ -801,6 +801,38 @@
     </w:p>
     <w:p>
       <w:pPr>
+        <w:spacing w:line="360" w:lineRule="auto"/>
+        <w:ind w:firstLine="360"/>
+        <w:jc w:val="both"/>
+      </w:pPr>
+      <w:r>
+        <w:rPr>
+          <w:rFonts w:ascii="Times New Roman" w:hAnsi="Times New Roman" w:eastAsia="Times New Roman"/>
+          <w:b w:val="0"/>
+          <w:caps w:val="0"/>
+          <w:sz w:val="24"/>
+        </w:rPr>
+        <w:t>Figura 7. Ashpërsia e derivuar kundrejt asaj që caktuan rishikuesit</w:t>
+      </w:r>
+    </w:p>
+    <w:p>
+      <w:pPr>
+        <w:spacing w:line="360" w:lineRule="auto"/>
+        <w:ind w:firstLine="360"/>
+        <w:jc w:val="both"/>
+      </w:pPr>
+      <w:r>
+        <w:rPr>
+          <w:rFonts w:ascii="Times New Roman" w:hAnsi="Times New Roman" w:eastAsia="Times New Roman"/>
+          <w:b w:val="0"/>
+          <w:caps w:val="0"/>
+          <w:sz w:val="24"/>
+        </w:rPr>
+        <w:t>Figura 8. MCC me interval besimi 95% për të dyja qasjet</w:t>
+      </w:r>
+    </w:p>
+    <w:p>
+      <w:pPr>
         <w:pStyle w:val="Heading1"/>
         <w:pageBreakBefore/>
       </w:pPr>
@@ -9098,6 +9130,60 @@
     </w:p>
     <w:p>
       <w:pPr>
+        <w:jc w:val="center"/>
+      </w:pPr>
+      <w:r>
+        <w:drawing>
+          <wp:inline xmlns:a="http://schemas.openxmlformats.org/drawingml/2006/main" xmlns:pic="http://schemas.openxmlformats.org/drawingml/2006/picture">
+            <wp:extent cx="5120640" cy="2809061"/>
+            <wp:docPr id="9" name="Picture 9"/>
+            <wp:cNvGraphicFramePr>
+              <a:graphicFrameLocks noChangeAspect="1"/>
+            </wp:cNvGraphicFramePr>
+            <a:graphic>
+              <a:graphicData uri="http://schemas.openxmlformats.org/drawingml/2006/picture">
+                <pic:pic>
+                  <pic:nvPicPr>
+                    <pic:cNvPr id="0" name="ashpersia_kundrejt_rishikuesve.png"/>
+                    <pic:cNvPicPr/>
+                  </pic:nvPicPr>
+                  <pic:blipFill>
+                    <a:blip r:embed="rId19"/>
+                    <a:stretch>
+                      <a:fillRect/>
+                    </a:stretch>
+                  </pic:blipFill>
+                  <pic:spPr>
+                    <a:xfrm>
+                      <a:off x="0" y="0"/>
+                      <a:ext cx="5120640" cy="2809061"/>
+                    </a:xfrm>
+                    <a:prstGeom prst="rect"/>
+                  </pic:spPr>
+                </pic:pic>
+              </a:graphicData>
+            </a:graphic>
+          </wp:inline>
+        </w:drawing>
+      </w:r>
+    </w:p>
+    <w:p>
+      <w:pPr>
+        <w:spacing w:line="240" w:lineRule="auto"/>
+        <w:jc w:val="center"/>
+      </w:pPr>
+      <w:r>
+        <w:rPr>
+          <w:rFonts w:ascii="Times New Roman" w:hAnsi="Times New Roman" w:eastAsia="Times New Roman"/>
+          <w:b w:val="0"/>
+          <w:caps w:val="0"/>
+          <w:sz w:val="22"/>
+        </w:rPr>
+        <w:t>Figura 7. Ashpërsia e derivuar kundrejt asaj që caktuan rishikuesit</w:t>
+      </w:r>
+    </w:p>
+    <w:p>
+      <w:pPr>
         <w:spacing w:line="360" w:lineRule="auto"/>
         <w:ind w:firstLine="360"/>
         <w:jc w:val="both"/>
@@ -9692,6 +9778,60 @@
       <w:pPr>
         <w:spacing w:line="240" w:lineRule="auto" w:after="0"/>
       </w:pPr>
+    </w:p>
+    <w:p>
+      <w:pPr>
+        <w:jc w:val="center"/>
+      </w:pPr>
+      <w:r>
+        <w:drawing>
+          <wp:inline xmlns:a="http://schemas.openxmlformats.org/drawingml/2006/main" xmlns:pic="http://schemas.openxmlformats.org/drawingml/2006/picture">
+            <wp:extent cx="5120640" cy="2815697"/>
+            <wp:docPr id="10" name="Picture 10"/>
+            <wp:cNvGraphicFramePr>
+              <a:graphicFrameLocks noChangeAspect="1"/>
+            </wp:cNvGraphicFramePr>
+            <a:graphic>
+              <a:graphicData uri="http://schemas.openxmlformats.org/drawingml/2006/picture">
+                <pic:pic>
+                  <pic:nvPicPr>
+                    <pic:cNvPr id="0" name="intervalet_e_besimit.png"/>
+                    <pic:cNvPicPr/>
+                  </pic:nvPicPr>
+                  <pic:blipFill>
+                    <a:blip r:embed="rId20"/>
+                    <a:stretch>
+                      <a:fillRect/>
+                    </a:stretch>
+                  </pic:blipFill>
+                  <pic:spPr>
+                    <a:xfrm>
+                      <a:off x="0" y="0"/>
+                      <a:ext cx="5120640" cy="2815697"/>
+                    </a:xfrm>
+                    <a:prstGeom prst="rect"/>
+                  </pic:spPr>
+                </pic:pic>
+              </a:graphicData>
+            </a:graphic>
+          </wp:inline>
+        </w:drawing>
+      </w:r>
+    </w:p>
+    <w:p>
+      <w:pPr>
+        <w:spacing w:line="240" w:lineRule="auto"/>
+        <w:jc w:val="center"/>
+      </w:pPr>
+      <w:r>
+        <w:rPr>
+          <w:rFonts w:ascii="Times New Roman" w:hAnsi="Times New Roman" w:eastAsia="Times New Roman"/>
+          <w:b w:val="0"/>
+          <w:caps w:val="0"/>
+          <w:sz w:val="22"/>
+        </w:rPr>
+        <w:t>Figura 8. MCC me interval besimi 95% për të dyja qasjet</w:t>
+      </w:r>
     </w:p>
     <w:p>
       <w:pPr>

</xml_diff>

<commit_message>
Mat bashkimin dhe prerjen e dy qasjeve
</commit_message>
<xml_diff>
--- a/docs/thesis/Punim_Diplome_Florent_Latifi.docx
+++ b/docs/thesis/Punim_Diplome_Florent_Latifi.docx
@@ -923,7 +923,7 @@
           <w:caps w:val="0"/>
           <w:sz w:val="24"/>
         </w:rPr>
-        <w:t>Tabela 5. Rezultati i motorit të refaktorimit</w:t>
+        <w:t>Tabela 5. Të dyja qasjet së bashku</w:t>
       </w:r>
     </w:p>
     <w:p>
@@ -939,7 +939,7 @@
           <w:caps w:val="0"/>
           <w:sz w:val="24"/>
         </w:rPr>
-        <w:t>Tabela 6. Pse u refuzuan</w:t>
+        <w:t>Tabela 6. Rezultati i motorit të refaktorimit</w:t>
       </w:r>
     </w:p>
     <w:p>
@@ -955,7 +955,7 @@
           <w:caps w:val="0"/>
           <w:sz w:val="24"/>
         </w:rPr>
-        <w:t>Tabela 7. Verifikimi i atyre që u aplikuan</w:t>
+        <w:t>Tabela 7. Pse u refuzuan</w:t>
       </w:r>
     </w:p>
     <w:p>
@@ -971,7 +971,7 @@
           <w:caps w:val="0"/>
           <w:sz w:val="24"/>
         </w:rPr>
-        <w:t>Tabela 8. Sa lëviz MCC-ja kur zhvendoset një prag</w:t>
+        <w:t>Tabela 8. Verifikimi i atyre që u aplikuan</w:t>
       </w:r>
     </w:p>
     <w:p>
@@ -987,7 +987,7 @@
           <w:caps w:val="0"/>
           <w:sz w:val="24"/>
         </w:rPr>
-        <w:t>Tabela 9. Pajtimi i ashpërsisë me rishikuesit</w:t>
+        <w:t>Tabela 9. Sa lëviz MCC-ja kur zhvendoset një prag</w:t>
       </w:r>
     </w:p>
     <w:p>
@@ -1003,7 +1003,7 @@
           <w:caps w:val="0"/>
           <w:sz w:val="24"/>
         </w:rPr>
-        <w:t>Tabela 10. Intervale besimi 95% për MCC-në</w:t>
+        <w:t>Tabela 10. Pajtimi i ashpërsisë me rishikuesit</w:t>
       </w:r>
     </w:p>
     <w:p>
@@ -1019,7 +1019,7 @@
           <w:caps w:val="0"/>
           <w:sz w:val="24"/>
         </w:rPr>
-        <w:t>Tabela 11. B − A kur rregullat marrin pragun e tyre më të mirë</w:t>
+        <w:t>Tabela 11. Intervale besimi 95% për MCC-në</w:t>
       </w:r>
     </w:p>
     <w:p>
@@ -1035,7 +1035,7 @@
           <w:caps w:val="0"/>
           <w:sz w:val="24"/>
         </w:rPr>
-        <w:t>Tabela 12. Sa pajtohen rishikuesit me njëri-tjetrin</w:t>
+        <w:t>Tabela 12. B − A kur rregullat marrin pragun e tyre më të mirë</w:t>
       </w:r>
     </w:p>
     <w:p>
@@ -1051,7 +1051,7 @@
           <w:caps w:val="0"/>
           <w:sz w:val="24"/>
         </w:rPr>
-        <w:t>Tabela 13. Strategjitë e detektimit dhe burimet e tyre</w:t>
+        <w:t>Tabela 13. Sa pajtohen rishikuesit me njëri-tjetrin</w:t>
       </w:r>
     </w:p>
     <w:p>
@@ -1067,7 +1067,7 @@
           <w:caps w:val="0"/>
           <w:sz w:val="24"/>
         </w:rPr>
-        <w:t>Tabela 14. Kuantifikuesit e përgjithshëm</w:t>
+        <w:t>Tabela 14. Strategjitë e detektimit dhe burimet e tyre</w:t>
       </w:r>
     </w:p>
     <w:p>
@@ -1083,7 +1083,7 @@
           <w:caps w:val="0"/>
           <w:sz w:val="24"/>
         </w:rPr>
-        <w:t>Tabela 15. Pragjet e përdorura</w:t>
+        <w:t>Tabela 15. Kuantifikuesit e përgjithshëm</w:t>
       </w:r>
     </w:p>
     <w:p>
@@ -1099,7 +1099,7 @@
           <w:caps w:val="0"/>
           <w:sz w:val="24"/>
         </w:rPr>
-        <w:t>Tabela 16. Metrikat sipas nivelit</w:t>
+        <w:t>Tabela 16. Pragjet e përdorura</w:t>
       </w:r>
     </w:p>
     <w:p>
@@ -1115,7 +1115,7 @@
           <w:caps w:val="0"/>
           <w:sz w:val="24"/>
         </w:rPr>
-        <w:t>Tabela 17. Çka propozohet dhe çka aplikohet</w:t>
+        <w:t>Tabela 17. Metrikat sipas nivelit</w:t>
       </w:r>
     </w:p>
     <w:p>
@@ -1131,7 +1131,7 @@
           <w:caps w:val="0"/>
           <w:sz w:val="24"/>
         </w:rPr>
-        <w:t>Tabela 18. Arsyet e refuzimit</w:t>
+        <w:t>Tabela 18. Çka propozohet dhe çka aplikohet</w:t>
       </w:r>
     </w:p>
     <w:p>
@@ -1147,7 +1147,23 @@
           <w:caps w:val="0"/>
           <w:sz w:val="24"/>
         </w:rPr>
-        <w:t>Tabela 19. Radha e ekzekutimit</w:t>
+        <w:t>Tabela 19. Arsyet e refuzimit</w:t>
+      </w:r>
+    </w:p>
+    <w:p>
+      <w:pPr>
+        <w:spacing w:line="360" w:lineRule="auto"/>
+        <w:ind w:firstLine="360"/>
+        <w:jc w:val="both"/>
+      </w:pPr>
+      <w:r>
+        <w:rPr>
+          <w:rFonts w:ascii="Times New Roman" w:hAnsi="Times New Roman" w:eastAsia="Times New Roman"/>
+          <w:b w:val="0"/>
+          <w:caps w:val="0"/>
+          <w:sz w:val="24"/>
+        </w:rPr>
+        <w:t>Tabela 20. Radha e ekzekutimit</w:t>
       </w:r>
     </w:p>
     <w:p>
@@ -6157,6 +6173,669 @@
     </w:p>
     <w:p>
       <w:pPr>
+        <w:spacing w:line="360" w:lineRule="auto"/>
+        <w:ind w:firstLine="360"/>
+        <w:jc w:val="both"/>
+      </w:pPr>
+      <w:r>
+        <w:rPr>
+          <w:rFonts w:ascii="Times New Roman" w:hAnsi="Times New Roman" w:eastAsia="Times New Roman"/>
+          <w:b w:val="0"/>
+          <w:caps w:val="0"/>
+          <w:sz w:val="24"/>
+        </w:rPr>
+        <w:t>Vërejtja e mësipërme ngre një pyetje praktike: a do të ishte më mirë t’i përdorje të dyja bashkë? Bashkimi trashëgon pozitivët e vërtetë të secilës, por edhe të rremët, dhe mbi një bashkësi ku shumica e etiketave janë negative ai shkëmbim nuk është aspak i vetëkuptueshëm. Prandaj u mat.</w:t>
+      </w:r>
+    </w:p>
+    <w:p>
+      <w:pPr>
+        <w:spacing w:line="240" w:lineRule="auto"/>
+        <w:jc w:val="center"/>
+      </w:pPr>
+      <w:r>
+        <w:rPr>
+          <w:rFonts w:ascii="Times New Roman" w:hAnsi="Times New Roman" w:eastAsia="Times New Roman"/>
+          <w:b w:val="0"/>
+          <w:caps w:val="0"/>
+          <w:sz w:val="22"/>
+        </w:rPr>
+        <w:t>Tabela 5. Të dyja qasjet së bashku</w:t>
+      </w:r>
+    </w:p>
+    <w:tbl>
+      <w:tblPr>
+        <w:tblStyle w:val="TableGrid"/>
+        <w:tblW w:type="auto" w:w="0"/>
+        <w:tblLook w:firstColumn="1" w:firstRow="1" w:lastColumn="0" w:lastRow="0" w:noHBand="0" w:noVBand="1" w:val="04A0"/>
+      </w:tblPr>
+      <w:tblGrid>
+        <w:gridCol w:w="1440"/>
+        <w:gridCol w:w="1440"/>
+        <w:gridCol w:w="1440"/>
+        <w:gridCol w:w="1440"/>
+        <w:gridCol w:w="1440"/>
+        <w:gridCol w:w="1440"/>
+      </w:tblGrid>
+      <w:tr>
+        <w:tc>
+          <w:tcPr>
+            <w:tcW w:type="dxa" w:w="1440"/>
+          </w:tcPr>
+          <w:p>
+            <w:pPr>
+              <w:spacing w:line="240" w:lineRule="auto"/>
+            </w:pPr>
+            <w:r>
+              <w:rPr>
+                <w:rFonts w:ascii="Times New Roman" w:hAnsi="Times New Roman" w:eastAsia="Times New Roman"/>
+                <w:b/>
+                <w:caps w:val="0"/>
+                <w:sz w:val="22"/>
+              </w:rPr>
+              <w:t>Erë</w:t>
+            </w:r>
+          </w:p>
+        </w:tc>
+        <w:tc>
+          <w:tcPr>
+            <w:tcW w:type="dxa" w:w="1440"/>
+          </w:tcPr>
+          <w:p>
+            <w:pPr>
+              <w:spacing w:line="240" w:lineRule="auto"/>
+            </w:pPr>
+            <w:r>
+              <w:rPr>
+                <w:rFonts w:ascii="Times New Roman" w:hAnsi="Times New Roman" w:eastAsia="Times New Roman"/>
+                <w:b/>
+                <w:caps w:val="0"/>
+                <w:sz w:val="22"/>
+              </w:rPr>
+              <w:t>B: modeli</w:t>
+            </w:r>
+          </w:p>
+        </w:tc>
+        <w:tc>
+          <w:tcPr>
+            <w:tcW w:type="dxa" w:w="1440"/>
+          </w:tcPr>
+          <w:p>
+            <w:pPr>
+              <w:spacing w:line="240" w:lineRule="auto"/>
+            </w:pPr>
+            <w:r>
+              <w:rPr>
+                <w:rFonts w:ascii="Times New Roman" w:hAnsi="Times New Roman" w:eastAsia="Times New Roman"/>
+                <w:b/>
+                <w:caps w:val="0"/>
+                <w:sz w:val="22"/>
+              </w:rPr>
+              <w:t>A∪B</w:t>
+            </w:r>
+          </w:p>
+        </w:tc>
+        <w:tc>
+          <w:tcPr>
+            <w:tcW w:type="dxa" w:w="1440"/>
+          </w:tcPr>
+          <w:p>
+            <w:pPr>
+              <w:spacing w:line="240" w:lineRule="auto"/>
+            </w:pPr>
+            <w:r>
+              <w:rPr>
+                <w:rFonts w:ascii="Times New Roman" w:hAnsi="Times New Roman" w:eastAsia="Times New Roman"/>
+                <w:b/>
+                <w:caps w:val="0"/>
+                <w:sz w:val="22"/>
+              </w:rPr>
+              <w:t>A∩B</w:t>
+            </w:r>
+          </w:p>
+        </w:tc>
+        <w:tc>
+          <w:tcPr>
+            <w:tcW w:type="dxa" w:w="1440"/>
+          </w:tcPr>
+          <w:p>
+            <w:pPr>
+              <w:spacing w:line="240" w:lineRule="auto"/>
+            </w:pPr>
+            <w:r>
+              <w:rPr>
+                <w:rFonts w:ascii="Times New Roman" w:hAnsi="Times New Roman" w:eastAsia="Times New Roman"/>
+                <w:b/>
+                <w:caps w:val="0"/>
+                <w:sz w:val="22"/>
+              </w:rPr>
+              <w:t>A∪B: recall</w:t>
+            </w:r>
+          </w:p>
+        </w:tc>
+        <w:tc>
+          <w:tcPr>
+            <w:tcW w:type="dxa" w:w="1440"/>
+          </w:tcPr>
+          <w:p>
+            <w:pPr>
+              <w:spacing w:line="240" w:lineRule="auto"/>
+            </w:pPr>
+            <w:r>
+              <w:rPr>
+                <w:rFonts w:ascii="Times New Roman" w:hAnsi="Times New Roman" w:eastAsia="Times New Roman"/>
+                <w:b/>
+                <w:caps w:val="0"/>
+                <w:sz w:val="22"/>
+              </w:rPr>
+              <w:t>A∩B: precizion</w:t>
+            </w:r>
+          </w:p>
+        </w:tc>
+      </w:tr>
+      <w:tr>
+        <w:tc>
+          <w:tcPr>
+            <w:tcW w:type="dxa" w:w="1440"/>
+          </w:tcPr>
+          <w:p>
+            <w:pPr>
+              <w:spacing w:line="240" w:lineRule="auto"/>
+            </w:pPr>
+            <w:r>
+              <w:rPr>
+                <w:rFonts w:ascii="Times New Roman" w:hAnsi="Times New Roman" w:eastAsia="Times New Roman"/>
+                <w:b w:val="0"/>
+                <w:caps w:val="0"/>
+                <w:sz w:val="22"/>
+              </w:rPr>
+              <w:t>Blob</w:t>
+            </w:r>
+          </w:p>
+        </w:tc>
+        <w:tc>
+          <w:tcPr>
+            <w:tcW w:type="dxa" w:w="1440"/>
+          </w:tcPr>
+          <w:p>
+            <w:pPr>
+              <w:spacing w:line="240" w:lineRule="auto"/>
+            </w:pPr>
+            <w:r>
+              <w:rPr>
+                <w:rFonts w:ascii="Times New Roman" w:hAnsi="Times New Roman" w:eastAsia="Times New Roman"/>
+                <w:b w:val="0"/>
+                <w:caps w:val="0"/>
+                <w:sz w:val="22"/>
+              </w:rPr>
+              <w:t>0.488</w:t>
+            </w:r>
+          </w:p>
+        </w:tc>
+        <w:tc>
+          <w:tcPr>
+            <w:tcW w:type="dxa" w:w="1440"/>
+          </w:tcPr>
+          <w:p>
+            <w:pPr>
+              <w:spacing w:line="240" w:lineRule="auto"/>
+            </w:pPr>
+            <w:r>
+              <w:rPr>
+                <w:rFonts w:ascii="Times New Roman" w:hAnsi="Times New Roman" w:eastAsia="Times New Roman"/>
+                <w:b w:val="0"/>
+                <w:caps w:val="0"/>
+                <w:sz w:val="22"/>
+              </w:rPr>
+              <w:t>0.494</w:t>
+            </w:r>
+          </w:p>
+        </w:tc>
+        <w:tc>
+          <w:tcPr>
+            <w:tcW w:type="dxa" w:w="1440"/>
+          </w:tcPr>
+          <w:p>
+            <w:pPr>
+              <w:spacing w:line="240" w:lineRule="auto"/>
+            </w:pPr>
+            <w:r>
+              <w:rPr>
+                <w:rFonts w:ascii="Times New Roman" w:hAnsi="Times New Roman" w:eastAsia="Times New Roman"/>
+                <w:b w:val="0"/>
+                <w:caps w:val="0"/>
+                <w:sz w:val="22"/>
+              </w:rPr>
+              <w:t>0.223</w:t>
+            </w:r>
+          </w:p>
+        </w:tc>
+        <w:tc>
+          <w:tcPr>
+            <w:tcW w:type="dxa" w:w="1440"/>
+          </w:tcPr>
+          <w:p>
+            <w:pPr>
+              <w:spacing w:line="240" w:lineRule="auto"/>
+            </w:pPr>
+            <w:r>
+              <w:rPr>
+                <w:rFonts w:ascii="Times New Roman" w:hAnsi="Times New Roman" w:eastAsia="Times New Roman"/>
+                <w:b w:val="0"/>
+                <w:caps w:val="0"/>
+                <w:sz w:val="22"/>
+              </w:rPr>
+              <w:t>0.643</w:t>
+            </w:r>
+          </w:p>
+        </w:tc>
+        <w:tc>
+          <w:tcPr>
+            <w:tcW w:type="dxa" w:w="1440"/>
+          </w:tcPr>
+          <w:p>
+            <w:pPr>
+              <w:spacing w:line="240" w:lineRule="auto"/>
+            </w:pPr>
+            <w:r>
+              <w:rPr>
+                <w:rFonts w:ascii="Times New Roman" w:hAnsi="Times New Roman" w:eastAsia="Times New Roman"/>
+                <w:b w:val="0"/>
+                <w:caps w:val="0"/>
+                <w:sz w:val="22"/>
+              </w:rPr>
+              <w:t>0.821</w:t>
+            </w:r>
+          </w:p>
+        </w:tc>
+      </w:tr>
+      <w:tr>
+        <w:tc>
+          <w:tcPr>
+            <w:tcW w:type="dxa" w:w="1440"/>
+          </w:tcPr>
+          <w:p>
+            <w:pPr>
+              <w:spacing w:line="240" w:lineRule="auto"/>
+            </w:pPr>
+            <w:r>
+              <w:rPr>
+                <w:rFonts w:ascii="Times New Roman" w:hAnsi="Times New Roman" w:eastAsia="Times New Roman"/>
+                <w:b w:val="0"/>
+                <w:caps w:val="0"/>
+                <w:sz w:val="22"/>
+              </w:rPr>
+              <w:t>Data Class</w:t>
+            </w:r>
+          </w:p>
+        </w:tc>
+        <w:tc>
+          <w:tcPr>
+            <w:tcW w:type="dxa" w:w="1440"/>
+          </w:tcPr>
+          <w:p>
+            <w:pPr>
+              <w:spacing w:line="240" w:lineRule="auto"/>
+            </w:pPr>
+            <w:r>
+              <w:rPr>
+                <w:rFonts w:ascii="Times New Roman" w:hAnsi="Times New Roman" w:eastAsia="Times New Roman"/>
+                <w:b w:val="0"/>
+                <w:caps w:val="0"/>
+                <w:sz w:val="22"/>
+              </w:rPr>
+              <w:t>0.500</w:t>
+            </w:r>
+          </w:p>
+        </w:tc>
+        <w:tc>
+          <w:tcPr>
+            <w:tcW w:type="dxa" w:w="1440"/>
+          </w:tcPr>
+          <w:p>
+            <w:pPr>
+              <w:spacing w:line="240" w:lineRule="auto"/>
+            </w:pPr>
+            <w:r>
+              <w:rPr>
+                <w:rFonts w:ascii="Times New Roman" w:hAnsi="Times New Roman" w:eastAsia="Times New Roman"/>
+                <w:b w:val="0"/>
+                <w:caps w:val="0"/>
+                <w:sz w:val="22"/>
+              </w:rPr>
+              <w:t>0.510</w:t>
+            </w:r>
+          </w:p>
+        </w:tc>
+        <w:tc>
+          <w:tcPr>
+            <w:tcW w:type="dxa" w:w="1440"/>
+          </w:tcPr>
+          <w:p>
+            <w:pPr>
+              <w:spacing w:line="240" w:lineRule="auto"/>
+            </w:pPr>
+            <w:r>
+              <w:rPr>
+                <w:rFonts w:ascii="Times New Roman" w:hAnsi="Times New Roman" w:eastAsia="Times New Roman"/>
+                <w:b w:val="0"/>
+                <w:caps w:val="0"/>
+                <w:sz w:val="22"/>
+              </w:rPr>
+              <w:t>0.267</w:t>
+            </w:r>
+          </w:p>
+        </w:tc>
+        <w:tc>
+          <w:tcPr>
+            <w:tcW w:type="dxa" w:w="1440"/>
+          </w:tcPr>
+          <w:p>
+            <w:pPr>
+              <w:spacing w:line="240" w:lineRule="auto"/>
+            </w:pPr>
+            <w:r>
+              <w:rPr>
+                <w:rFonts w:ascii="Times New Roman" w:hAnsi="Times New Roman" w:eastAsia="Times New Roman"/>
+                <w:b w:val="0"/>
+                <w:caps w:val="0"/>
+                <w:sz w:val="22"/>
+              </w:rPr>
+              <w:t>0.613</w:t>
+            </w:r>
+          </w:p>
+        </w:tc>
+        <w:tc>
+          <w:tcPr>
+            <w:tcW w:type="dxa" w:w="1440"/>
+          </w:tcPr>
+          <w:p>
+            <w:pPr>
+              <w:spacing w:line="240" w:lineRule="auto"/>
+            </w:pPr>
+            <w:r>
+              <w:rPr>
+                <w:rFonts w:ascii="Times New Roman" w:hAnsi="Times New Roman" w:eastAsia="Times New Roman"/>
+                <w:b w:val="0"/>
+                <w:caps w:val="0"/>
+                <w:sz w:val="22"/>
+              </w:rPr>
+              <w:t>0.800</w:t>
+            </w:r>
+          </w:p>
+        </w:tc>
+      </w:tr>
+      <w:tr>
+        <w:tc>
+          <w:tcPr>
+            <w:tcW w:type="dxa" w:w="1440"/>
+          </w:tcPr>
+          <w:p>
+            <w:pPr>
+              <w:spacing w:line="240" w:lineRule="auto"/>
+            </w:pPr>
+            <w:r>
+              <w:rPr>
+                <w:rFonts w:ascii="Times New Roman" w:hAnsi="Times New Roman" w:eastAsia="Times New Roman"/>
+                <w:b w:val="0"/>
+                <w:caps w:val="0"/>
+                <w:sz w:val="22"/>
+              </w:rPr>
+              <w:t>Feature Envy</w:t>
+            </w:r>
+          </w:p>
+        </w:tc>
+        <w:tc>
+          <w:tcPr>
+            <w:tcW w:type="dxa" w:w="1440"/>
+          </w:tcPr>
+          <w:p>
+            <w:pPr>
+              <w:spacing w:line="240" w:lineRule="auto"/>
+            </w:pPr>
+            <w:r>
+              <w:rPr>
+                <w:rFonts w:ascii="Times New Roman" w:hAnsi="Times New Roman" w:eastAsia="Times New Roman"/>
+                <w:b w:val="0"/>
+                <w:caps w:val="0"/>
+                <w:sz w:val="22"/>
+              </w:rPr>
+              <w:t>0.669</w:t>
+            </w:r>
+          </w:p>
+        </w:tc>
+        <w:tc>
+          <w:tcPr>
+            <w:tcW w:type="dxa" w:w="1440"/>
+          </w:tcPr>
+          <w:p>
+            <w:pPr>
+              <w:spacing w:line="240" w:lineRule="auto"/>
+            </w:pPr>
+            <w:r>
+              <w:rPr>
+                <w:rFonts w:ascii="Times New Roman" w:hAnsi="Times New Roman" w:eastAsia="Times New Roman"/>
+                <w:b w:val="0"/>
+                <w:caps w:val="0"/>
+                <w:sz w:val="22"/>
+              </w:rPr>
+              <w:t>0.644</w:t>
+            </w:r>
+          </w:p>
+        </w:tc>
+        <w:tc>
+          <w:tcPr>
+            <w:tcW w:type="dxa" w:w="1440"/>
+          </w:tcPr>
+          <w:p>
+            <w:pPr>
+              <w:spacing w:line="240" w:lineRule="auto"/>
+            </w:pPr>
+            <w:r>
+              <w:rPr>
+                <w:rFonts w:ascii="Times New Roman" w:hAnsi="Times New Roman" w:eastAsia="Times New Roman"/>
+                <w:b w:val="0"/>
+                <w:caps w:val="0"/>
+                <w:sz w:val="22"/>
+              </w:rPr>
+              <w:t>0.321</w:t>
+            </w:r>
+          </w:p>
+        </w:tc>
+        <w:tc>
+          <w:tcPr>
+            <w:tcW w:type="dxa" w:w="1440"/>
+          </w:tcPr>
+          <w:p>
+            <w:pPr>
+              <w:spacing w:line="240" w:lineRule="auto"/>
+            </w:pPr>
+            <w:r>
+              <w:rPr>
+                <w:rFonts w:ascii="Times New Roman" w:hAnsi="Times New Roman" w:eastAsia="Times New Roman"/>
+                <w:b w:val="0"/>
+                <w:caps w:val="0"/>
+                <w:sz w:val="22"/>
+              </w:rPr>
+              <w:t>0.708</w:t>
+            </w:r>
+          </w:p>
+        </w:tc>
+        <w:tc>
+          <w:tcPr>
+            <w:tcW w:type="dxa" w:w="1440"/>
+          </w:tcPr>
+          <w:p>
+            <w:pPr>
+              <w:spacing w:line="240" w:lineRule="auto"/>
+            </w:pPr>
+            <w:r>
+              <w:rPr>
+                <w:rFonts w:ascii="Times New Roman" w:hAnsi="Times New Roman" w:eastAsia="Times New Roman"/>
+                <w:b w:val="0"/>
+                <w:caps w:val="0"/>
+                <w:sz w:val="22"/>
+              </w:rPr>
+              <w:t>0.833</w:t>
+            </w:r>
+          </w:p>
+        </w:tc>
+      </w:tr>
+      <w:tr>
+        <w:tc>
+          <w:tcPr>
+            <w:tcW w:type="dxa" w:w="1440"/>
+          </w:tcPr>
+          <w:p>
+            <w:pPr>
+              <w:spacing w:line="240" w:lineRule="auto"/>
+            </w:pPr>
+            <w:r>
+              <w:rPr>
+                <w:rFonts w:ascii="Times New Roman" w:hAnsi="Times New Roman" w:eastAsia="Times New Roman"/>
+                <w:b w:val="0"/>
+                <w:caps w:val="0"/>
+                <w:sz w:val="22"/>
+              </w:rPr>
+              <w:t>Long Method</w:t>
+            </w:r>
+          </w:p>
+        </w:tc>
+        <w:tc>
+          <w:tcPr>
+            <w:tcW w:type="dxa" w:w="1440"/>
+          </w:tcPr>
+          <w:p>
+            <w:pPr>
+              <w:spacing w:line="240" w:lineRule="auto"/>
+            </w:pPr>
+            <w:r>
+              <w:rPr>
+                <w:rFonts w:ascii="Times New Roman" w:hAnsi="Times New Roman" w:eastAsia="Times New Roman"/>
+                <w:b w:val="0"/>
+                <w:caps w:val="0"/>
+                <w:sz w:val="22"/>
+              </w:rPr>
+              <w:t>0.713</w:t>
+            </w:r>
+          </w:p>
+        </w:tc>
+        <w:tc>
+          <w:tcPr>
+            <w:tcW w:type="dxa" w:w="1440"/>
+          </w:tcPr>
+          <w:p>
+            <w:pPr>
+              <w:spacing w:line="240" w:lineRule="auto"/>
+            </w:pPr>
+            <w:r>
+              <w:rPr>
+                <w:rFonts w:ascii="Times New Roman" w:hAnsi="Times New Roman" w:eastAsia="Times New Roman"/>
+                <w:b w:val="0"/>
+                <w:caps w:val="0"/>
+                <w:sz w:val="22"/>
+              </w:rPr>
+              <w:t>0.706</w:t>
+            </w:r>
+          </w:p>
+        </w:tc>
+        <w:tc>
+          <w:tcPr>
+            <w:tcW w:type="dxa" w:w="1440"/>
+          </w:tcPr>
+          <w:p>
+            <w:pPr>
+              <w:spacing w:line="240" w:lineRule="auto"/>
+            </w:pPr>
+            <w:r>
+              <w:rPr>
+                <w:rFonts w:ascii="Times New Roman" w:hAnsi="Times New Roman" w:eastAsia="Times New Roman"/>
+                <w:b w:val="0"/>
+                <w:caps w:val="0"/>
+                <w:sz w:val="22"/>
+              </w:rPr>
+              <w:t>0.594</w:t>
+            </w:r>
+          </w:p>
+        </w:tc>
+        <w:tc>
+          <w:tcPr>
+            <w:tcW w:type="dxa" w:w="1440"/>
+          </w:tcPr>
+          <w:p>
+            <w:pPr>
+              <w:spacing w:line="240" w:lineRule="auto"/>
+            </w:pPr>
+            <w:r>
+              <w:rPr>
+                <w:rFonts w:ascii="Times New Roman" w:hAnsi="Times New Roman" w:eastAsia="Times New Roman"/>
+                <w:b w:val="0"/>
+                <w:caps w:val="0"/>
+                <w:sz w:val="22"/>
+              </w:rPr>
+              <w:t>0.782</w:t>
+            </w:r>
+          </w:p>
+        </w:tc>
+        <w:tc>
+          <w:tcPr>
+            <w:tcW w:type="dxa" w:w="1440"/>
+          </w:tcPr>
+          <w:p>
+            <w:pPr>
+              <w:spacing w:line="240" w:lineRule="auto"/>
+            </w:pPr>
+            <w:r>
+              <w:rPr>
+                <w:rFonts w:ascii="Times New Roman" w:hAnsi="Times New Roman" w:eastAsia="Times New Roman"/>
+                <w:b w:val="0"/>
+                <w:caps w:val="0"/>
+                <w:sz w:val="22"/>
+              </w:rPr>
+              <w:t>0.905</w:t>
+            </w:r>
+          </w:p>
+        </w:tc>
+      </w:tr>
+    </w:tbl>
+    <w:p>
+      <w:pPr>
+        <w:spacing w:line="240" w:lineRule="auto" w:after="0"/>
+      </w:pPr>
+    </w:p>
+    <w:p>
+      <w:pPr>
+        <w:spacing w:line="360" w:lineRule="auto"/>
+        <w:ind w:firstLine="360"/>
+        <w:jc w:val="both"/>
+      </w:pPr>
+      <w:r>
+        <w:rPr>
+          <w:rFonts w:ascii="Times New Roman" w:hAnsi="Times New Roman" w:eastAsia="Times New Roman"/>
+          <w:b w:val="0"/>
+          <w:caps w:val="0"/>
+          <w:sz w:val="24"/>
+        </w:rPr>
+        <w:t>Përgjigjja është jo. Bashkimi e ngre recall-in ndjeshëm, por çmimi në precizion e fshin fitimin: MCC-ja mezi lëviz te Blob dhe Data Class, dhe **bie** te Long Method e Feature Envy. Ironia është se Feature Envy ishte pikërisht era ku vërejtja premtonte më shumë — dhe atje bashkimi del më keq, sepse bashkë me trembëdhjetë rastet që rregulli i kap vijnë edhe pozitivët e tij të rremë.</w:t>
+      </w:r>
+    </w:p>
+    <w:p>
+      <w:pPr>
+        <w:spacing w:line="360" w:lineRule="auto"/>
+        <w:ind w:firstLine="360"/>
+        <w:jc w:val="both"/>
+      </w:pPr>
+      <w:r>
+        <w:rPr>
+          <w:rFonts w:ascii="Times New Roman" w:hAnsi="Times New Roman" w:eastAsia="Times New Roman"/>
+          <w:b w:val="0"/>
+          <w:caps w:val="0"/>
+          <w:sz w:val="24"/>
+        </w:rPr>
+        <w:t>Prerja tregon të kundërtën dhe është më e dobishmja e të dyjave. Kur të dyja qasjet pajtohen, precizioni ngrihet mbi 0.80 te çdo erë dhe deri në 0.905 te Long Method — dukshëm mbi secilën qasje veç. Recall-i bie ndjeshëm, ndaj MCC-ja del e ulët, por për një përdorues që kërkon pak alarme të rreme pajtimi i dy qasjeve të pavarura është sinjali më i fortë që sistemi prodhon.</w:t>
+      </w:r>
+    </w:p>
+    <w:p>
+      <w:pPr>
         <w:pStyle w:val="Heading2"/>
       </w:pPr>
       <w:r>
@@ -6213,7 +6892,7 @@
           <w:caps w:val="0"/>
           <w:sz w:val="22"/>
         </w:rPr>
-        <w:t>Tabela 5. Rezultati i motorit të refaktorimit</w:t>
+        <w:t>Tabela 6. Rezultati i motorit të refaktorimit</w:t>
       </w:r>
     </w:p>
     <w:tbl>
@@ -6554,7 +7233,7 @@
           <w:caps w:val="0"/>
           <w:sz w:val="22"/>
         </w:rPr>
-        <w:t>Tabela 6. Pse u refuzuan</w:t>
+        <w:t>Tabela 7. Pse u refuzuan</w:t>
       </w:r>
     </w:p>
     <w:tbl>
@@ -6881,7 +7560,7 @@
           <w:caps w:val="0"/>
           <w:sz w:val="22"/>
         </w:rPr>
-        <w:t>Tabela 7. Verifikimi i atyre që u aplikuan</w:t>
+        <w:t>Tabela 8. Verifikimi i atyre që u aplikuan</w:t>
       </w:r>
     </w:p>
     <w:tbl>
@@ -7227,7 +7906,7 @@
           <w:caps w:val="0"/>
           <w:sz w:val="22"/>
         </w:rPr>
-        <w:t>Tabela 8. Sa lëviz MCC-ja kur zhvendoset një prag</w:t>
+        <w:t>Tabela 9. Sa lëviz MCC-ja kur zhvendoset një prag</w:t>
       </w:r>
     </w:p>
     <w:tbl>
@@ -8492,7 +9171,7 @@
           <w:caps w:val="0"/>
           <w:sz w:val="22"/>
         </w:rPr>
-        <w:t>Tabela 9. Pajtimi i ashpërsisë me rishikuesit</w:t>
+        <w:t>Tabela 10. Pajtimi i ashpërsisë me rishikuesit</w:t>
       </w:r>
     </w:p>
     <w:tbl>
@@ -9272,7 +9951,7 @@
           <w:caps w:val="0"/>
           <w:sz w:val="22"/>
         </w:rPr>
-        <w:t>Tabela 10. Intervale besimi 95% për MCC-në</w:t>
+        <w:t>Tabela 11. Intervale besimi 95% për MCC-në</w:t>
       </w:r>
     </w:p>
     <w:tbl>
@@ -9877,7 +10556,7 @@
           <w:caps w:val="0"/>
           <w:sz w:val="22"/>
         </w:rPr>
-        <w:t>Tabela 11. B − A kur rregullat marrin pragun e tyre më të mirë</w:t>
+        <w:t>Tabela 12. B − A kur rregullat marrin pragun e tyre më të mirë</w:t>
       </w:r>
     </w:p>
     <w:tbl>
@@ -10428,7 +11107,7 @@
           <w:caps w:val="0"/>
           <w:sz w:val="22"/>
         </w:rPr>
-        <w:t>Tabela 12. Sa pajtohen rishikuesit me njëri-tjetrin</w:t>
+        <w:t>Tabela 13. Sa pajtohen rishikuesit me njëri-tjetrin</w:t>
       </w:r>
     </w:p>
     <w:tbl>
@@ -11900,7 +12579,7 @@
           <w:caps w:val="0"/>
           <w:sz w:val="22"/>
         </w:rPr>
-        <w:t>Tabela 13. Strategjitë e detektimit dhe burimet e tyre</w:t>
+        <w:t>Tabela 14. Strategjitë e detektimit dhe burimet e tyre</w:t>
       </w:r>
     </w:p>
     <w:tbl>
@@ -12681,7 +13360,7 @@
           <w:caps w:val="0"/>
           <w:sz w:val="22"/>
         </w:rPr>
-        <w:t>Tabela 14. Kuantifikuesit e përgjithshëm</w:t>
+        <w:t>Tabela 15. Kuantifikuesit e përgjithshëm</w:t>
       </w:r>
     </w:p>
     <w:tbl>
@@ -13128,7 +13807,7 @@
           <w:caps w:val="0"/>
           <w:sz w:val="22"/>
         </w:rPr>
-        <w:t>Tabela 15. Pragjet e përdorura</w:t>
+        <w:t>Tabela 16. Pragjet e përdorura</w:t>
       </w:r>
     </w:p>
     <w:tbl>
@@ -14149,7 +14828,7 @@
           <w:caps w:val="0"/>
           <w:sz w:val="22"/>
         </w:rPr>
-        <w:t>Tabela 16. Metrikat sipas nivelit</w:t>
+        <w:t>Tabela 17. Metrikat sipas nivelit</w:t>
       </w:r>
     </w:p>
     <w:tbl>
@@ -14330,7 +15009,7 @@
           <w:caps w:val="0"/>
           <w:sz w:val="22"/>
         </w:rPr>
-        <w:t>Tabela 17. Çka propozohet dhe çka aplikohet</w:t>
+        <w:t>Tabela 18. Çka propozohet dhe çka aplikohet</w:t>
       </w:r>
     </w:p>
     <w:tbl>
@@ -14909,7 +15588,7 @@
           <w:caps w:val="0"/>
           <w:sz w:val="22"/>
         </w:rPr>
-        <w:t>Tabela 18. Arsyet e refuzimit</w:t>
+        <w:t>Tabela 19. Arsyet e refuzimit</w:t>
       </w:r>
     </w:p>
     <w:tbl>
@@ -15370,7 +16049,7 @@
           <w:caps w:val="0"/>
           <w:sz w:val="22"/>
         </w:rPr>
-        <w:t>Tabela 19. Radha e ekzekutimit</w:t>
+        <w:t>Tabela 20. Radha e ekzekutimit</w:t>
       </w:r>
     </w:p>
     <w:tbl>

</xml_diff>

<commit_message>
Kalibro pragjet jashte fold-it, pa i adoptuar
</commit_message>
<xml_diff>
--- a/docs/thesis/Punim_Diplome_Florent_Latifi.docx
+++ b/docs/thesis/Punim_Diplome_Florent_Latifi.docx
@@ -1003,7 +1003,7 @@
           <w:caps w:val="0"/>
           <w:sz w:val="24"/>
         </w:rPr>
-        <w:t>Tabela 10. Pajtimi i ashpërsisë me rishikuesit</w:t>
+        <w:t>Tabela 10. Rregullat me pragje të kalibruara, të pikëzuara jashtë fold-it</w:t>
       </w:r>
     </w:p>
     <w:p>
@@ -1019,7 +1019,7 @@
           <w:caps w:val="0"/>
           <w:sz w:val="24"/>
         </w:rPr>
-        <w:t>Tabela 11. Intervale besimi 95% për MCC-në</w:t>
+        <w:t>Tabela 11. Pajtimi i ashpërsisë me rishikuesit</w:t>
       </w:r>
     </w:p>
     <w:p>
@@ -1035,7 +1035,7 @@
           <w:caps w:val="0"/>
           <w:sz w:val="24"/>
         </w:rPr>
-        <w:t>Tabela 12. B − A kur rregullat marrin pragun e tyre më të mirë</w:t>
+        <w:t>Tabela 12. Intervale besimi 95% për MCC-në</w:t>
       </w:r>
     </w:p>
     <w:p>
@@ -1051,7 +1051,7 @@
           <w:caps w:val="0"/>
           <w:sz w:val="24"/>
         </w:rPr>
-        <w:t>Tabela 13. Sa pajtohen rishikuesit me njëri-tjetrin</w:t>
+        <w:t>Tabela 13. B − A kur rregullat marrin pragun e tyre më të mirë</w:t>
       </w:r>
     </w:p>
     <w:p>
@@ -1067,7 +1067,7 @@
           <w:caps w:val="0"/>
           <w:sz w:val="24"/>
         </w:rPr>
-        <w:t>Tabela 14. Strategjitë e detektimit dhe burimet e tyre</w:t>
+        <w:t>Tabela 14. Sa pajtohen rishikuesit me njëri-tjetrin</w:t>
       </w:r>
     </w:p>
     <w:p>
@@ -1083,7 +1083,7 @@
           <w:caps w:val="0"/>
           <w:sz w:val="24"/>
         </w:rPr>
-        <w:t>Tabela 15. Kuantifikuesit e përgjithshëm</w:t>
+        <w:t>Tabela 15. Strategjitë e detektimit dhe burimet e tyre</w:t>
       </w:r>
     </w:p>
     <w:p>
@@ -1099,7 +1099,7 @@
           <w:caps w:val="0"/>
           <w:sz w:val="24"/>
         </w:rPr>
-        <w:t>Tabela 16. Pragjet e përdorura</w:t>
+        <w:t>Tabela 16. Kuantifikuesit e përgjithshëm</w:t>
       </w:r>
     </w:p>
     <w:p>
@@ -1115,7 +1115,7 @@
           <w:caps w:val="0"/>
           <w:sz w:val="24"/>
         </w:rPr>
-        <w:t>Tabela 17. Metrikat sipas nivelit</w:t>
+        <w:t>Tabela 17. Pragjet e përdorura</w:t>
       </w:r>
     </w:p>
     <w:p>
@@ -1131,7 +1131,7 @@
           <w:caps w:val="0"/>
           <w:sz w:val="24"/>
         </w:rPr>
-        <w:t>Tabela 18. Çka propozohet dhe çka aplikohet</w:t>
+        <w:t>Tabela 18. Metrikat sipas nivelit</w:t>
       </w:r>
     </w:p>
     <w:p>
@@ -1147,7 +1147,7 @@
           <w:caps w:val="0"/>
           <w:sz w:val="24"/>
         </w:rPr>
-        <w:t>Tabela 19. Arsyet e refuzimit</w:t>
+        <w:t>Tabela 19. Çka propozohet dhe çka aplikohet</w:t>
       </w:r>
     </w:p>
     <w:p>
@@ -1163,7 +1163,23 @@
           <w:caps w:val="0"/>
           <w:sz w:val="24"/>
         </w:rPr>
-        <w:t>Tabela 20. Radha e ekzekutimit</w:t>
+        <w:t>Tabela 20. Arsyet e refuzimit</w:t>
+      </w:r>
+    </w:p>
+    <w:p>
+      <w:pPr>
+        <w:spacing w:line="360" w:lineRule="auto"/>
+        <w:ind w:firstLine="360"/>
+        <w:jc w:val="both"/>
+      </w:pPr>
+      <w:r>
+        <w:rPr>
+          <w:rFonts w:ascii="Times New Roman" w:hAnsi="Times New Roman" w:eastAsia="Times New Roman"/>
+          <w:b w:val="0"/>
+          <w:caps w:val="0"/>
+          <w:sz w:val="24"/>
+        </w:rPr>
+        <w:t>Tabela 21. Radha e ekzekutimit</w:t>
       </w:r>
     </w:p>
     <w:p>
@@ -9110,7 +9126,686 @@
           <w:caps w:val="0"/>
           <w:sz w:val="24"/>
         </w:rPr>
-        <w:t>Këto vlera nuk adoptohen. Zgjedhja e një pragu sepse jep shifrën më të mirë mbi bashkësinë e vlerësimit është përshtatje ndaj të dhënave të testimit, dhe numri që do të raportohej pas saj do të matte sa mirë u zgjodh pragu, jo sa mirë funksionon detektimi. Kalibrimi do të kërkonte një bashkësi të ndarë dhe një bashkësi tjetër të paprekur për vlerësim; kjo mbetet punë e ardhshme.</w:t>
+        <w:t>Këto vlera nuk adoptohen. Zgjedhja e një pragu sepse jep shifrën më të mirë mbi bashkësinë e vlerësimit është përshtatje ndaj të dhënave të testimit, dhe numri që do të raportohej pas saj do të matte sa mirë u zgjodh pragu, jo sa mirë funksionon detektimi. Kalibrimi do të kërkonte një bashkësi të ndarë dhe një bashkësi tjetër të paprekur për vlerësim; kjo është pikërisht ajo që bëhet më poshtë.</w:t>
+      </w:r>
+    </w:p>
+    <w:p>
+      <w:pPr>
+        <w:spacing w:line="360" w:lineRule="auto"/>
+        <w:ind w:firstLine="360"/>
+        <w:jc w:val="both"/>
+      </w:pPr>
+      <w:r>
+        <w:rPr>
+          <w:rFonts w:ascii="Times New Roman" w:hAnsi="Times New Roman" w:eastAsia="Times New Roman"/>
+          <w:b w:val="0"/>
+          <w:caps w:val="0"/>
+          <w:sz w:val="24"/>
+        </w:rPr>
+        <w:t>Kalibrimi u bë me 5 folde të ndara sipas depos, si te Qasja B. Për secilin fold pragu u zgjodh duke parë vetëm foldet e trajnimit dhe u pikëzua mbi foldin e mbajtur jashtë; parashikimet u bashkuan dhe u pikëzuan një herë, ndaj shifra është jashtë-fold-it në të njëjtin kuptim me atë të modeleve.</w:t>
+      </w:r>
+    </w:p>
+    <w:p>
+      <w:pPr>
+        <w:spacing w:line="240" w:lineRule="auto"/>
+        <w:jc w:val="center"/>
+      </w:pPr>
+      <w:r>
+        <w:rPr>
+          <w:rFonts w:ascii="Times New Roman" w:hAnsi="Times New Roman" w:eastAsia="Times New Roman"/>
+          <w:b w:val="0"/>
+          <w:caps w:val="0"/>
+          <w:sz w:val="22"/>
+        </w:rPr>
+        <w:t>Tabela 10. Rregullat me pragje të kalibruara, të pikëzuara jashtë fold-it</w:t>
+      </w:r>
+    </w:p>
+    <w:tbl>
+      <w:tblPr>
+        <w:tblStyle w:val="TableGrid"/>
+        <w:tblW w:type="auto" w:w="0"/>
+        <w:tblLook w:firstColumn="1" w:firstRow="1" w:lastColumn="0" w:lastRow="0" w:noHBand="0" w:noVBand="1" w:val="04A0"/>
+      </w:tblPr>
+      <w:tblGrid>
+        <w:gridCol w:w="1440"/>
+        <w:gridCol w:w="1440"/>
+        <w:gridCol w:w="1440"/>
+        <w:gridCol w:w="1440"/>
+        <w:gridCol w:w="1440"/>
+        <w:gridCol w:w="1440"/>
+      </w:tblGrid>
+      <w:tr>
+        <w:tc>
+          <w:tcPr>
+            <w:tcW w:type="dxa" w:w="1440"/>
+          </w:tcPr>
+          <w:p>
+            <w:pPr>
+              <w:spacing w:line="240" w:lineRule="auto"/>
+            </w:pPr>
+            <w:r>
+              <w:rPr>
+                <w:rFonts w:ascii="Times New Roman" w:hAnsi="Times New Roman" w:eastAsia="Times New Roman"/>
+                <w:b/>
+                <w:caps w:val="0"/>
+                <w:sz w:val="22"/>
+              </w:rPr>
+              <w:t>Erë</w:t>
+            </w:r>
+          </w:p>
+        </w:tc>
+        <w:tc>
+          <w:tcPr>
+            <w:tcW w:type="dxa" w:w="1440"/>
+          </w:tcPr>
+          <w:p>
+            <w:pPr>
+              <w:spacing w:line="240" w:lineRule="auto"/>
+            </w:pPr>
+            <w:r>
+              <w:rPr>
+                <w:rFonts w:ascii="Times New Roman" w:hAnsi="Times New Roman" w:eastAsia="Times New Roman"/>
+                <w:b/>
+                <w:caps w:val="0"/>
+                <w:sz w:val="22"/>
+              </w:rPr>
+              <w:t>E botuar</w:t>
+            </w:r>
+          </w:p>
+        </w:tc>
+        <w:tc>
+          <w:tcPr>
+            <w:tcW w:type="dxa" w:w="1440"/>
+          </w:tcPr>
+          <w:p>
+            <w:pPr>
+              <w:spacing w:line="240" w:lineRule="auto"/>
+            </w:pPr>
+            <w:r>
+              <w:rPr>
+                <w:rFonts w:ascii="Times New Roman" w:hAnsi="Times New Roman" w:eastAsia="Times New Roman"/>
+                <w:b/>
+                <w:caps w:val="0"/>
+                <w:sz w:val="22"/>
+              </w:rPr>
+              <w:t>E kalibruar</w:t>
+            </w:r>
+          </w:p>
+        </w:tc>
+        <w:tc>
+          <w:tcPr>
+            <w:tcW w:type="dxa" w:w="1440"/>
+          </w:tcPr>
+          <w:p>
+            <w:pPr>
+              <w:spacing w:line="240" w:lineRule="auto"/>
+            </w:pPr>
+            <w:r>
+              <w:rPr>
+                <w:rFonts w:ascii="Times New Roman" w:hAnsi="Times New Roman" w:eastAsia="Times New Roman"/>
+                <w:b/>
+                <w:caps w:val="0"/>
+                <w:sz w:val="22"/>
+              </w:rPr>
+              <w:t>Recall</w:t>
+            </w:r>
+          </w:p>
+        </w:tc>
+        <w:tc>
+          <w:tcPr>
+            <w:tcW w:type="dxa" w:w="1440"/>
+          </w:tcPr>
+          <w:p>
+            <w:pPr>
+              <w:spacing w:line="240" w:lineRule="auto"/>
+            </w:pPr>
+            <w:r>
+              <w:rPr>
+                <w:rFonts w:ascii="Times New Roman" w:hAnsi="Times New Roman" w:eastAsia="Times New Roman"/>
+                <w:b/>
+                <w:caps w:val="0"/>
+                <w:sz w:val="22"/>
+              </w:rPr>
+              <w:t>Precizion</w:t>
+            </w:r>
+          </w:p>
+        </w:tc>
+        <w:tc>
+          <w:tcPr>
+            <w:tcW w:type="dxa" w:w="1440"/>
+          </w:tcPr>
+          <w:p>
+            <w:pPr>
+              <w:spacing w:line="240" w:lineRule="auto"/>
+            </w:pPr>
+            <w:r>
+              <w:rPr>
+                <w:rFonts w:ascii="Times New Roman" w:hAnsi="Times New Roman" w:eastAsia="Times New Roman"/>
+                <w:b/>
+                <w:caps w:val="0"/>
+                <w:sz w:val="22"/>
+              </w:rPr>
+              <w:t>Vlerat e zgjedhura</w:t>
+            </w:r>
+          </w:p>
+        </w:tc>
+      </w:tr>
+      <w:tr>
+        <w:tc>
+          <w:tcPr>
+            <w:tcW w:type="dxa" w:w="1440"/>
+          </w:tcPr>
+          <w:p>
+            <w:pPr>
+              <w:spacing w:line="240" w:lineRule="auto"/>
+            </w:pPr>
+            <w:r>
+              <w:rPr>
+                <w:rFonts w:ascii="Times New Roman" w:hAnsi="Times New Roman" w:eastAsia="Times New Roman"/>
+                <w:b w:val="0"/>
+                <w:caps w:val="0"/>
+                <w:sz w:val="22"/>
+              </w:rPr>
+              <w:t>Blob</w:t>
+            </w:r>
+          </w:p>
+        </w:tc>
+        <w:tc>
+          <w:tcPr>
+            <w:tcW w:type="dxa" w:w="1440"/>
+          </w:tcPr>
+          <w:p>
+            <w:pPr>
+              <w:spacing w:line="240" w:lineRule="auto"/>
+            </w:pPr>
+            <w:r>
+              <w:rPr>
+                <w:rFonts w:ascii="Times New Roman" w:hAnsi="Times New Roman" w:eastAsia="Times New Roman"/>
+                <w:b w:val="0"/>
+                <w:caps w:val="0"/>
+                <w:sz w:val="22"/>
+              </w:rPr>
+              <w:t>0.232</w:t>
+            </w:r>
+          </w:p>
+        </w:tc>
+        <w:tc>
+          <w:tcPr>
+            <w:tcW w:type="dxa" w:w="1440"/>
+          </w:tcPr>
+          <w:p>
+            <w:pPr>
+              <w:spacing w:line="240" w:lineRule="auto"/>
+            </w:pPr>
+            <w:r>
+              <w:rPr>
+                <w:rFonts w:ascii="Times New Roman" w:hAnsi="Times New Roman" w:eastAsia="Times New Roman"/>
+                <w:b w:val="0"/>
+                <w:caps w:val="0"/>
+                <w:sz w:val="22"/>
+              </w:rPr>
+              <w:t>0.253</w:t>
+            </w:r>
+          </w:p>
+        </w:tc>
+        <w:tc>
+          <w:tcPr>
+            <w:tcW w:type="dxa" w:w="1440"/>
+          </w:tcPr>
+          <w:p>
+            <w:pPr>
+              <w:spacing w:line="240" w:lineRule="auto"/>
+            </w:pPr>
+            <w:r>
+              <w:rPr>
+                <w:rFonts w:ascii="Times New Roman" w:hAnsi="Times New Roman" w:eastAsia="Times New Roman"/>
+                <w:b w:val="0"/>
+                <w:caps w:val="0"/>
+                <w:sz w:val="22"/>
+              </w:rPr>
+              <w:t>0.100 → 0.131</w:t>
+            </w:r>
+          </w:p>
+        </w:tc>
+        <w:tc>
+          <w:tcPr>
+            <w:tcW w:type="dxa" w:w="1440"/>
+          </w:tcPr>
+          <w:p>
+            <w:pPr>
+              <w:spacing w:line="240" w:lineRule="auto"/>
+            </w:pPr>
+            <w:r>
+              <w:rPr>
+                <w:rFonts w:ascii="Times New Roman" w:hAnsi="Times New Roman" w:eastAsia="Times New Roman"/>
+                <w:b w:val="0"/>
+                <w:caps w:val="0"/>
+                <w:sz w:val="22"/>
+              </w:rPr>
+              <w:t>0.814 → 0.767</w:t>
+            </w:r>
+          </w:p>
+        </w:tc>
+        <w:tc>
+          <w:tcPr>
+            <w:tcW w:type="dxa" w:w="1440"/>
+          </w:tcPr>
+          <w:p>
+            <w:pPr>
+              <w:spacing w:line="240" w:lineRule="auto"/>
+            </w:pPr>
+            <w:r>
+              <w:rPr>
+                <w:rFonts w:ascii="Times New Roman" w:hAnsi="Times New Roman" w:eastAsia="Times New Roman"/>
+                <w:b w:val="0"/>
+                <w:caps w:val="0"/>
+                <w:sz w:val="22"/>
+              </w:rPr>
+              <w:t>god_class_wmc = 23.5 (3×), 35.25 (2×)</w:t>
+            </w:r>
+          </w:p>
+        </w:tc>
+      </w:tr>
+      <w:tr>
+        <w:tc>
+          <w:tcPr>
+            <w:tcW w:type="dxa" w:w="1440"/>
+          </w:tcPr>
+          <w:p>
+            <w:pPr>
+              <w:spacing w:line="240" w:lineRule="auto"/>
+            </w:pPr>
+            <w:r>
+              <w:rPr>
+                <w:rFonts w:ascii="Times New Roman" w:hAnsi="Times New Roman" w:eastAsia="Times New Roman"/>
+                <w:b w:val="0"/>
+                <w:caps w:val="0"/>
+                <w:sz w:val="22"/>
+              </w:rPr>
+              <w:t>Data Class</w:t>
+            </w:r>
+          </w:p>
+        </w:tc>
+        <w:tc>
+          <w:tcPr>
+            <w:tcW w:type="dxa" w:w="1440"/>
+          </w:tcPr>
+          <w:p>
+            <w:pPr>
+              <w:spacing w:line="240" w:lineRule="auto"/>
+            </w:pPr>
+            <w:r>
+              <w:rPr>
+                <w:rFonts w:ascii="Times New Roman" w:hAnsi="Times New Roman" w:eastAsia="Times New Roman"/>
+                <w:b w:val="0"/>
+                <w:caps w:val="0"/>
+                <w:sz w:val="22"/>
+              </w:rPr>
+              <w:t>0.275</w:t>
+            </w:r>
+          </w:p>
+        </w:tc>
+        <w:tc>
+          <w:tcPr>
+            <w:tcW w:type="dxa" w:w="1440"/>
+          </w:tcPr>
+          <w:p>
+            <w:pPr>
+              <w:spacing w:line="240" w:lineRule="auto"/>
+            </w:pPr>
+            <w:r>
+              <w:rPr>
+                <w:rFonts w:ascii="Times New Roman" w:hAnsi="Times New Roman" w:eastAsia="Times New Roman"/>
+                <w:b w:val="0"/>
+                <w:caps w:val="0"/>
+                <w:sz w:val="22"/>
+              </w:rPr>
+              <w:t>0.267</w:t>
+            </w:r>
+          </w:p>
+        </w:tc>
+        <w:tc>
+          <w:tcPr>
+            <w:tcW w:type="dxa" w:w="1440"/>
+          </w:tcPr>
+          <w:p>
+            <w:pPr>
+              <w:spacing w:line="240" w:lineRule="auto"/>
+            </w:pPr>
+            <w:r>
+              <w:rPr>
+                <w:rFonts w:ascii="Times New Roman" w:hAnsi="Times New Roman" w:eastAsia="Times New Roman"/>
+                <w:b w:val="0"/>
+                <w:caps w:val="0"/>
+                <w:sz w:val="22"/>
+              </w:rPr>
+              <w:t>0.150 → 0.172</w:t>
+            </w:r>
+          </w:p>
+        </w:tc>
+        <w:tc>
+          <w:tcPr>
+            <w:tcW w:type="dxa" w:w="1440"/>
+          </w:tcPr>
+          <w:p>
+            <w:pPr>
+              <w:spacing w:line="240" w:lineRule="auto"/>
+            </w:pPr>
+            <w:r>
+              <w:rPr>
+                <w:rFonts w:ascii="Times New Roman" w:hAnsi="Times New Roman" w:eastAsia="Times New Roman"/>
+                <w:b w:val="0"/>
+                <w:caps w:val="0"/>
+                <w:sz w:val="22"/>
+              </w:rPr>
+              <w:t>0.757 → 0.681</w:t>
+            </w:r>
+          </w:p>
+        </w:tc>
+        <w:tc>
+          <w:tcPr>
+            <w:tcW w:type="dxa" w:w="1440"/>
+          </w:tcPr>
+          <w:p>
+            <w:pPr>
+              <w:spacing w:line="240" w:lineRule="auto"/>
+            </w:pPr>
+            <w:r>
+              <w:rPr>
+                <w:rFonts w:ascii="Times New Roman" w:hAnsi="Times New Roman" w:eastAsia="Times New Roman"/>
+                <w:b w:val="0"/>
+                <w:caps w:val="0"/>
+                <w:sz w:val="22"/>
+              </w:rPr>
+              <w:t>data_class_wmc_low = 23.25 (1×); data_class_woc = 0.5 (2×), 0.6667 (2×)</w:t>
+            </w:r>
+          </w:p>
+        </w:tc>
+      </w:tr>
+      <w:tr>
+        <w:tc>
+          <w:tcPr>
+            <w:tcW w:type="dxa" w:w="1440"/>
+          </w:tcPr>
+          <w:p>
+            <w:pPr>
+              <w:spacing w:line="240" w:lineRule="auto"/>
+            </w:pPr>
+            <w:r>
+              <w:rPr>
+                <w:rFonts w:ascii="Times New Roman" w:hAnsi="Times New Roman" w:eastAsia="Times New Roman"/>
+                <w:b w:val="0"/>
+                <w:caps w:val="0"/>
+                <w:sz w:val="22"/>
+              </w:rPr>
+              <w:t>Feature Envy</w:t>
+            </w:r>
+          </w:p>
+        </w:tc>
+        <w:tc>
+          <w:tcPr>
+            <w:tcW w:type="dxa" w:w="1440"/>
+          </w:tcPr>
+          <w:p>
+            <w:pPr>
+              <w:spacing w:line="240" w:lineRule="auto"/>
+            </w:pPr>
+            <w:r>
+              <w:rPr>
+                <w:rFonts w:ascii="Times New Roman" w:hAnsi="Times New Roman" w:eastAsia="Times New Roman"/>
+                <w:b w:val="0"/>
+                <w:caps w:val="0"/>
+                <w:sz w:val="22"/>
+              </w:rPr>
+              <w:t>0.271</w:t>
+            </w:r>
+          </w:p>
+        </w:tc>
+        <w:tc>
+          <w:tcPr>
+            <w:tcW w:type="dxa" w:w="1440"/>
+          </w:tcPr>
+          <w:p>
+            <w:pPr>
+              <w:spacing w:line="240" w:lineRule="auto"/>
+            </w:pPr>
+            <w:r>
+              <w:rPr>
+                <w:rFonts w:ascii="Times New Roman" w:hAnsi="Times New Roman" w:eastAsia="Times New Roman"/>
+                <w:b w:val="0"/>
+                <w:caps w:val="0"/>
+                <w:sz w:val="22"/>
+              </w:rPr>
+              <w:t>0.411</w:t>
+            </w:r>
+          </w:p>
+        </w:tc>
+        <w:tc>
+          <w:tcPr>
+            <w:tcW w:type="dxa" w:w="1440"/>
+          </w:tcPr>
+          <w:p>
+            <w:pPr>
+              <w:spacing w:line="240" w:lineRule="auto"/>
+            </w:pPr>
+            <w:r>
+              <w:rPr>
+                <w:rFonts w:ascii="Times New Roman" w:hAnsi="Times New Roman" w:eastAsia="Times New Roman"/>
+                <w:b w:val="0"/>
+                <w:caps w:val="0"/>
+                <w:sz w:val="22"/>
+              </w:rPr>
+              <w:t>0.181 → 0.306</w:t>
+            </w:r>
+          </w:p>
+        </w:tc>
+        <w:tc>
+          <w:tcPr>
+            <w:tcW w:type="dxa" w:w="1440"/>
+          </w:tcPr>
+          <w:p>
+            <w:pPr>
+              <w:spacing w:line="240" w:lineRule="auto"/>
+            </w:pPr>
+            <w:r>
+              <w:rPr>
+                <w:rFonts w:ascii="Times New Roman" w:hAnsi="Times New Roman" w:eastAsia="Times New Roman"/>
+                <w:b w:val="0"/>
+                <w:caps w:val="0"/>
+                <w:sz w:val="22"/>
+              </w:rPr>
+              <w:t>0.520 → 0.647</w:t>
+            </w:r>
+          </w:p>
+        </w:tc>
+        <w:tc>
+          <w:tcPr>
+            <w:tcW w:type="dxa" w:w="1440"/>
+          </w:tcPr>
+          <w:p>
+            <w:pPr>
+              <w:spacing w:line="240" w:lineRule="auto"/>
+            </w:pPr>
+            <w:r>
+              <w:rPr>
+                <w:rFonts w:ascii="Times New Roman" w:hAnsi="Times New Roman" w:eastAsia="Times New Roman"/>
+                <w:b w:val="0"/>
+                <w:caps w:val="0"/>
+                <w:sz w:val="22"/>
+              </w:rPr>
+              <w:t>feature_envy_fdp = 10.0 (5×)</w:t>
+            </w:r>
+          </w:p>
+        </w:tc>
+      </w:tr>
+      <w:tr>
+        <w:tc>
+          <w:tcPr>
+            <w:tcW w:type="dxa" w:w="1440"/>
+          </w:tcPr>
+          <w:p>
+            <w:pPr>
+              <w:spacing w:line="240" w:lineRule="auto"/>
+            </w:pPr>
+            <w:r>
+              <w:rPr>
+                <w:rFonts w:ascii="Times New Roman" w:hAnsi="Times New Roman" w:eastAsia="Times New Roman"/>
+                <w:b w:val="0"/>
+                <w:caps w:val="0"/>
+                <w:sz w:val="22"/>
+              </w:rPr>
+              <w:t>Long Method</w:t>
+            </w:r>
+          </w:p>
+        </w:tc>
+        <w:tc>
+          <w:tcPr>
+            <w:tcW w:type="dxa" w:w="1440"/>
+          </w:tcPr>
+          <w:p>
+            <w:pPr>
+              <w:spacing w:line="240" w:lineRule="auto"/>
+            </w:pPr>
+            <w:r>
+              <w:rPr>
+                <w:rFonts w:ascii="Times New Roman" w:hAnsi="Times New Roman" w:eastAsia="Times New Roman"/>
+                <w:b w:val="0"/>
+                <w:caps w:val="0"/>
+                <w:sz w:val="22"/>
+              </w:rPr>
+              <w:t>0.580</w:t>
+            </w:r>
+          </w:p>
+        </w:tc>
+        <w:tc>
+          <w:tcPr>
+            <w:tcW w:type="dxa" w:w="1440"/>
+          </w:tcPr>
+          <w:p>
+            <w:pPr>
+              <w:spacing w:line="240" w:lineRule="auto"/>
+            </w:pPr>
+            <w:r>
+              <w:rPr>
+                <w:rFonts w:ascii="Times New Roman" w:hAnsi="Times New Roman" w:eastAsia="Times New Roman"/>
+                <w:b w:val="0"/>
+                <w:caps w:val="0"/>
+                <w:sz w:val="22"/>
+              </w:rPr>
+              <w:t>0.666</w:t>
+            </w:r>
+          </w:p>
+        </w:tc>
+        <w:tc>
+          <w:tcPr>
+            <w:tcW w:type="dxa" w:w="1440"/>
+          </w:tcPr>
+          <w:p>
+            <w:pPr>
+              <w:spacing w:line="240" w:lineRule="auto"/>
+            </w:pPr>
+            <w:r>
+              <w:rPr>
+                <w:rFonts w:ascii="Times New Roman" w:hAnsi="Times New Roman" w:eastAsia="Times New Roman"/>
+                <w:b w:val="0"/>
+                <w:caps w:val="0"/>
+                <w:sz w:val="22"/>
+              </w:rPr>
+              <w:t>0.440 → 0.759</w:t>
+            </w:r>
+          </w:p>
+        </w:tc>
+        <w:tc>
+          <w:tcPr>
+            <w:tcW w:type="dxa" w:w="1440"/>
+          </w:tcPr>
+          <w:p>
+            <w:pPr>
+              <w:spacing w:line="240" w:lineRule="auto"/>
+            </w:pPr>
+            <w:r>
+              <w:rPr>
+                <w:rFonts w:ascii="Times New Roman" w:hAnsi="Times New Roman" w:eastAsia="Times New Roman"/>
+                <w:b w:val="0"/>
+                <w:caps w:val="0"/>
+                <w:sz w:val="22"/>
+              </w:rPr>
+              <w:t>0.872 → 0.678</w:t>
+            </w:r>
+          </w:p>
+        </w:tc>
+        <w:tc>
+          <w:tcPr>
+            <w:tcW w:type="dxa" w:w="1440"/>
+          </w:tcPr>
+          <w:p>
+            <w:pPr>
+              <w:spacing w:line="240" w:lineRule="auto"/>
+            </w:pPr>
+            <w:r>
+              <w:rPr>
+                <w:rFonts w:ascii="Times New Roman" w:hAnsi="Times New Roman" w:eastAsia="Times New Roman"/>
+                <w:b w:val="0"/>
+                <w:caps w:val="0"/>
+                <w:sz w:val="22"/>
+              </w:rPr>
+              <w:t>long_method_loc = 15.0 (3×), 22.5 (2×)</w:t>
+            </w:r>
+          </w:p>
+        </w:tc>
+      </w:tr>
+    </w:tbl>
+    <w:p>
+      <w:pPr>
+        <w:spacing w:line="240" w:lineRule="auto" w:after="0"/>
+      </w:pPr>
+    </w:p>
+    <w:p>
+      <w:pPr>
+        <w:spacing w:line="360" w:lineRule="auto"/>
+        <w:ind w:firstLine="360"/>
+        <w:jc w:val="both"/>
+      </w:pPr>
+      <w:r>
+        <w:rPr>
+          <w:rFonts w:ascii="Times New Roman" w:hAnsi="Times New Roman" w:eastAsia="Times New Roman"/>
+          <w:b w:val="0"/>
+          <w:caps w:val="0"/>
+          <w:sz w:val="24"/>
+        </w:rPr>
+        <w:t>Rezultati ndahet në dy pjesë. Për Feature Envy kalibrimi jep fitimin më të madh dhe më të besueshmin: **të pesë foldet zgjodhën të njëjtën vlerë**, dhe përmirësohen njëkohësisht edhe precizioni edhe recall-i. Kjo e forcon vërejtjen e mësipërme se klauzola e numrit të klasave-burim nuk e bën punën për të cilën është vendosur. Për Long Method fitimi është gjithashtu i qartë, por foldet ndahen mes dy vlerave dhe blihet me precizion.</w:t>
+      </w:r>
+    </w:p>
+    <w:p>
+      <w:pPr>
+        <w:spacing w:line="360" w:lineRule="auto"/>
+        <w:ind w:firstLine="360"/>
+        <w:jc w:val="both"/>
+      </w:pPr>
+      <w:r>
+        <w:rPr>
+          <w:rFonts w:ascii="Times New Roman" w:hAnsi="Times New Roman" w:eastAsia="Times New Roman"/>
+          <w:b w:val="0"/>
+          <w:caps w:val="0"/>
+          <w:sz w:val="24"/>
+        </w:rPr>
+        <w:t>Për Blob dhe Data Class kalibrimi nuk ndihmon: te e para lëvizja është e vogël, te e dyta rezultati bie nën atë të pragjeve të botuara. Dhe foldet e Data Class-it nuk pajtohen as për cilin prag të lëvizin — dy prej tyre zgjedhin një prag krejt tjetër nga tre të tjerët. Kur zgjedhja varet kaq shumë nga cila pjesë e korpusit shihet, «pragu optimal» është veti e bashkësisë dhe jo e gjuhës.</w:t>
+      </w:r>
+    </w:p>
+    <w:p>
+      <w:pPr>
+        <w:spacing w:line="360" w:lineRule="auto"/>
+        <w:ind w:firstLine="360"/>
+        <w:jc w:val="both"/>
+      </w:pPr>
+      <w:r>
+        <w:rPr>
+          <w:rFonts w:ascii="Times New Roman" w:hAnsi="Times New Roman" w:eastAsia="Times New Roman"/>
+          <w:b w:val="0"/>
+          <w:caps w:val="0"/>
+          <w:sz w:val="24"/>
+        </w:rPr>
+        <w:t>Vlen të vihet re edhe dallimi me fshirjen. Ajo sugjeronte 0.690 për Long Method; kalibrimi i ndershëm jep 0.666. Diferenca është pikërisht ajo që fitohet kur zgjedhjes i lejohet ta shohë bashkësinë mbi të cilën do të raportohet, dhe arsyeja pse shifra e fshirjes nuk u adoptua.</w:t>
       </w:r>
     </w:p>
     <w:p>
@@ -9171,7 +9866,7 @@
           <w:caps w:val="0"/>
           <w:sz w:val="22"/>
         </w:rPr>
-        <w:t>Tabela 10. Pajtimi i ashpërsisë me rishikuesit</w:t>
+        <w:t>Tabela 11. Pajtimi i ashpërsisë me rishikuesit</w:t>
       </w:r>
     </w:p>
     <w:tbl>
@@ -9951,7 +10646,7 @@
           <w:caps w:val="0"/>
           <w:sz w:val="22"/>
         </w:rPr>
-        <w:t>Tabela 11. Intervale besimi 95% për MCC-në</w:t>
+        <w:t>Tabela 12. Intervale besimi 95% për MCC-në</w:t>
       </w:r>
     </w:p>
     <w:tbl>
@@ -10556,7 +11251,7 @@
           <w:caps w:val="0"/>
           <w:sz w:val="22"/>
         </w:rPr>
-        <w:t>Tabela 12. B − A kur rregullat marrin pragun e tyre më të mirë</w:t>
+        <w:t>Tabela 13. B − A kur rregullat marrin pragun e tyre më të mirë</w:t>
       </w:r>
     </w:p>
     <w:tbl>
@@ -11107,7 +11802,7 @@
           <w:caps w:val="0"/>
           <w:sz w:val="22"/>
         </w:rPr>
-        <w:t>Tabela 13. Sa pajtohen rishikuesit me njëri-tjetrin</w:t>
+        <w:t>Tabela 14. Sa pajtohen rishikuesit me njëri-tjetrin</w:t>
       </w:r>
     </w:p>
     <w:tbl>
@@ -12579,7 +13274,7 @@
           <w:caps w:val="0"/>
           <w:sz w:val="22"/>
         </w:rPr>
-        <w:t>Tabela 14. Strategjitë e detektimit dhe burimet e tyre</w:t>
+        <w:t>Tabela 15. Strategjitë e detektimit dhe burimet e tyre</w:t>
       </w:r>
     </w:p>
     <w:tbl>
@@ -13360,7 +14055,7 @@
           <w:caps w:val="0"/>
           <w:sz w:val="22"/>
         </w:rPr>
-        <w:t>Tabela 15. Kuantifikuesit e përgjithshëm</w:t>
+        <w:t>Tabela 16. Kuantifikuesit e përgjithshëm</w:t>
       </w:r>
     </w:p>
     <w:tbl>
@@ -13807,7 +14502,7 @@
           <w:caps w:val="0"/>
           <w:sz w:val="22"/>
         </w:rPr>
-        <w:t>Tabela 16. Pragjet e përdorura</w:t>
+        <w:t>Tabela 17. Pragjet e përdorura</w:t>
       </w:r>
     </w:p>
     <w:tbl>
@@ -14828,7 +15523,7 @@
           <w:caps w:val="0"/>
           <w:sz w:val="22"/>
         </w:rPr>
-        <w:t>Tabela 17. Metrikat sipas nivelit</w:t>
+        <w:t>Tabela 18. Metrikat sipas nivelit</w:t>
       </w:r>
     </w:p>
     <w:tbl>
@@ -15009,7 +15704,7 @@
           <w:caps w:val="0"/>
           <w:sz w:val="22"/>
         </w:rPr>
-        <w:t>Tabela 18. Çka propozohet dhe çka aplikohet</w:t>
+        <w:t>Tabela 19. Çka propozohet dhe çka aplikohet</w:t>
       </w:r>
     </w:p>
     <w:tbl>
@@ -15588,7 +16283,7 @@
           <w:caps w:val="0"/>
           <w:sz w:val="22"/>
         </w:rPr>
-        <w:t>Tabela 19. Arsyet e refuzimit</w:t>
+        <w:t>Tabela 20. Arsyet e refuzimit</w:t>
       </w:r>
     </w:p>
     <w:tbl>
@@ -16049,7 +16744,7 @@
           <w:caps w:val="0"/>
           <w:sz w:val="22"/>
         </w:rPr>
-        <w:t>Tabela 20. Radha e ekzekutimit</w:t>
+        <w:t>Tabela 21. Radha e ekzekutimit</w:t>
       </w:r>
     </w:p>
     <w:tbl>
@@ -16645,7 +17340,7 @@
                 <w:caps w:val="0"/>
                 <w:sz w:val="22"/>
               </w:rPr>
-              <w:t>reviewer_agreement.py</w:t>
+              <w:t>calibrate_thresholds.py</w:t>
             </w:r>
           </w:p>
         </w:tc>
@@ -16664,7 +17359,7 @@
                 <w:caps w:val="0"/>
                 <w:sz w:val="22"/>
               </w:rPr>
-              <w:t>tavani i pajtimit mes rishikuesve</w:t>
+              <w:t>pragjet e kalibruara jashtë fold-it</w:t>
             </w:r>
           </w:p>
         </w:tc>
@@ -16683,7 +17378,7 @@
                 <w:caps w:val="0"/>
                 <w:sz w:val="22"/>
               </w:rPr>
-              <w:t>sekonda</w:t>
+              <w:t>~1 min</w:t>
             </w:r>
           </w:p>
         </w:tc>
@@ -16723,7 +17418,7 @@
                 <w:caps w:val="0"/>
                 <w:sz w:val="22"/>
               </w:rPr>
-              <w:t>bootstrap_intervals.py</w:t>
+              <w:t>reviewer_agreement.py</w:t>
             </w:r>
           </w:p>
         </w:tc>
@@ -16742,7 +17437,7 @@
                 <w:caps w:val="0"/>
                 <w:sz w:val="22"/>
               </w:rPr>
-              <w:t>intervalet e besimit</w:t>
+              <w:t>tavani i pajtimit mes rishikuesve</w:t>
             </w:r>
           </w:p>
         </w:tc>
@@ -16761,7 +17456,7 @@
                 <w:caps w:val="0"/>
                 <w:sz w:val="22"/>
               </w:rPr>
-              <w:t>nën një minutë</w:t>
+              <w:t>sekonda</w:t>
             </w:r>
           </w:p>
         </w:tc>
@@ -16801,7 +17496,7 @@
                 <w:caps w:val="0"/>
                 <w:sz w:val="22"/>
               </w:rPr>
-              <w:t>export_system_reference.py</w:t>
+              <w:t>bootstrap_intervals.py</w:t>
             </w:r>
           </w:p>
         </w:tc>
@@ -16820,7 +17515,7 @@
                 <w:caps w:val="0"/>
                 <w:sz w:val="22"/>
               </w:rPr>
-              <w:t>tabelat e kësaj shtojce</w:t>
+              <w:t>intervalet e besimit</w:t>
             </w:r>
           </w:p>
         </w:tc>
@@ -16839,7 +17534,7 @@
                 <w:caps w:val="0"/>
                 <w:sz w:val="22"/>
               </w:rPr>
-              <w:t>sekonda</w:t>
+              <w:t>nën një minutë</w:t>
             </w:r>
           </w:p>
         </w:tc>
@@ -16861,6 +17556,84 @@
                 <w:sz w:val="22"/>
               </w:rPr>
               <w:t>10</w:t>
+            </w:r>
+          </w:p>
+        </w:tc>
+        <w:tc>
+          <w:tcPr>
+            <w:tcW w:type="dxa" w:w="2160"/>
+          </w:tcPr>
+          <w:p>
+            <w:pPr>
+              <w:spacing w:line="240" w:lineRule="auto"/>
+            </w:pPr>
+            <w:r>
+              <w:rPr>
+                <w:rFonts w:ascii="Times New Roman" w:hAnsi="Times New Roman" w:eastAsia="Times New Roman"/>
+                <w:b w:val="0"/>
+                <w:caps w:val="0"/>
+                <w:sz w:val="22"/>
+              </w:rPr>
+              <w:t>export_system_reference.py</w:t>
+            </w:r>
+          </w:p>
+        </w:tc>
+        <w:tc>
+          <w:tcPr>
+            <w:tcW w:type="dxa" w:w="2160"/>
+          </w:tcPr>
+          <w:p>
+            <w:pPr>
+              <w:spacing w:line="240" w:lineRule="auto"/>
+            </w:pPr>
+            <w:r>
+              <w:rPr>
+                <w:rFonts w:ascii="Times New Roman" w:hAnsi="Times New Roman" w:eastAsia="Times New Roman"/>
+                <w:b w:val="0"/>
+                <w:caps w:val="0"/>
+                <w:sz w:val="22"/>
+              </w:rPr>
+              <w:t>tabelat e kësaj shtojce</w:t>
+            </w:r>
+          </w:p>
+        </w:tc>
+        <w:tc>
+          <w:tcPr>
+            <w:tcW w:type="dxa" w:w="2160"/>
+          </w:tcPr>
+          <w:p>
+            <w:pPr>
+              <w:spacing w:line="240" w:lineRule="auto"/>
+            </w:pPr>
+            <w:r>
+              <w:rPr>
+                <w:rFonts w:ascii="Times New Roman" w:hAnsi="Times New Roman" w:eastAsia="Times New Roman"/>
+                <w:b w:val="0"/>
+                <w:caps w:val="0"/>
+                <w:sz w:val="22"/>
+              </w:rPr>
+              <w:t>sekonda</w:t>
+            </w:r>
+          </w:p>
+        </w:tc>
+      </w:tr>
+      <w:tr>
+        <w:tc>
+          <w:tcPr>
+            <w:tcW w:type="dxa" w:w="2160"/>
+          </w:tcPr>
+          <w:p>
+            <w:pPr>
+              <w:spacing w:line="240" w:lineRule="auto"/>
+            </w:pPr>
+            <w:r>
+              <w:rPr>
+                <w:rFonts w:ascii="Times New Roman" w:hAnsi="Times New Roman" w:eastAsia="Times New Roman"/>
+                <w:b w:val="0"/>
+                <w:caps w:val="0"/>
+                <w:sz w:val="22"/>
+              </w:rPr>
+              <w:t>11</w:t>
             </w:r>
           </w:p>
         </w:tc>

</xml_diff>

<commit_message>
Raporto shpjegimin per-rast te modelit ne Kapitullin 5
</commit_message>
<xml_diff>
--- a/docs/thesis/Punim_Diplome_Florent_Latifi.docx
+++ b/docs/thesis/Punim_Diplome_Florent_Latifi.docx
@@ -907,7 +907,7 @@
           <w:caps w:val="0"/>
           <w:sz w:val="24"/>
         </w:rPr>
-        <w:t>Tabela 4. Pajtimi mes dy qasjeve</w:t>
+        <w:t>Tabela 4. Sa shpesh një matje e vetme e mban verdiktin</w:t>
       </w:r>
     </w:p>
     <w:p>
@@ -923,7 +923,7 @@
           <w:caps w:val="0"/>
           <w:sz w:val="24"/>
         </w:rPr>
-        <w:t>Tabela 5. Të dyja qasjet së bashku</w:t>
+        <w:t>Tabela 5. Pajtimi mes dy qasjeve</w:t>
       </w:r>
     </w:p>
     <w:p>
@@ -939,7 +939,7 @@
           <w:caps w:val="0"/>
           <w:sz w:val="24"/>
         </w:rPr>
-        <w:t>Tabela 6. Rezultati i motorit të refaktorimit</w:t>
+        <w:t>Tabela 6. Të dyja qasjet së bashku</w:t>
       </w:r>
     </w:p>
     <w:p>
@@ -955,7 +955,7 @@
           <w:caps w:val="0"/>
           <w:sz w:val="24"/>
         </w:rPr>
-        <w:t>Tabela 7. Pse u refuzuan</w:t>
+        <w:t>Tabela 7. Rezultati i motorit të refaktorimit</w:t>
       </w:r>
     </w:p>
     <w:p>
@@ -971,7 +971,7 @@
           <w:caps w:val="0"/>
           <w:sz w:val="24"/>
         </w:rPr>
-        <w:t>Tabela 8. Verifikimi i atyre që u aplikuan</w:t>
+        <w:t>Tabela 8. Pse u refuzuan</w:t>
       </w:r>
     </w:p>
     <w:p>
@@ -987,7 +987,7 @@
           <w:caps w:val="0"/>
           <w:sz w:val="24"/>
         </w:rPr>
-        <w:t>Tabela 9. Sa lëviz MCC-ja kur zhvendoset një prag</w:t>
+        <w:t>Tabela 9. Verifikimi i atyre që u aplikuan</w:t>
       </w:r>
     </w:p>
     <w:p>
@@ -1003,7 +1003,7 @@
           <w:caps w:val="0"/>
           <w:sz w:val="24"/>
         </w:rPr>
-        <w:t>Tabela 10. Rregullat me pragje të kalibruara, të pikëzuara jashtë fold-it</w:t>
+        <w:t>Tabela 10. Sa lëviz MCC-ja kur zhvendoset një prag</w:t>
       </w:r>
     </w:p>
     <w:p>
@@ -1019,7 +1019,7 @@
           <w:caps w:val="0"/>
           <w:sz w:val="24"/>
         </w:rPr>
-        <w:t>Tabela 11. Pajtimi i ashpërsisë me rishikuesit</w:t>
+        <w:t>Tabela 11. Rregullat me pragje të kalibruara, të pikëzuara jashtë fold-it</w:t>
       </w:r>
     </w:p>
     <w:p>
@@ -1035,7 +1035,7 @@
           <w:caps w:val="0"/>
           <w:sz w:val="24"/>
         </w:rPr>
-        <w:t>Tabela 12. Intervale besimi 95% për MCC-në</w:t>
+        <w:t>Tabela 12. Pajtimi i ashpërsisë me rishikuesit</w:t>
       </w:r>
     </w:p>
     <w:p>
@@ -1051,7 +1051,7 @@
           <w:caps w:val="0"/>
           <w:sz w:val="24"/>
         </w:rPr>
-        <w:t>Tabela 13. B − A kur rregullat marrin pragun e tyre më të mirë</w:t>
+        <w:t>Tabela 13. Intervale besimi 95% për MCC-në</w:t>
       </w:r>
     </w:p>
     <w:p>
@@ -1067,7 +1067,7 @@
           <w:caps w:val="0"/>
           <w:sz w:val="24"/>
         </w:rPr>
-        <w:t>Tabela 14. Sa pajtohen rishikuesit me njëri-tjetrin</w:t>
+        <w:t>Tabela 14. B − A kur rregullat marrin pragun e tyre më të mirë</w:t>
       </w:r>
     </w:p>
     <w:p>
@@ -1083,7 +1083,7 @@
           <w:caps w:val="0"/>
           <w:sz w:val="24"/>
         </w:rPr>
-        <w:t>Tabela 15. Strategjitë e detektimit dhe burimet e tyre</w:t>
+        <w:t>Tabela 15. Sa pajtohen rishikuesit me njëri-tjetrin</w:t>
       </w:r>
     </w:p>
     <w:p>
@@ -1099,7 +1099,7 @@
           <w:caps w:val="0"/>
           <w:sz w:val="24"/>
         </w:rPr>
-        <w:t>Tabela 16. Kuantifikuesit e përgjithshëm</w:t>
+        <w:t>Tabela 16. Strategjitë e detektimit dhe burimet e tyre</w:t>
       </w:r>
     </w:p>
     <w:p>
@@ -1115,7 +1115,7 @@
           <w:caps w:val="0"/>
           <w:sz w:val="24"/>
         </w:rPr>
-        <w:t>Tabela 17. Pragjet e përdorura</w:t>
+        <w:t>Tabela 17. Kuantifikuesit e përgjithshëm</w:t>
       </w:r>
     </w:p>
     <w:p>
@@ -1131,7 +1131,7 @@
           <w:caps w:val="0"/>
           <w:sz w:val="24"/>
         </w:rPr>
-        <w:t>Tabela 18. Metrikat sipas nivelit</w:t>
+        <w:t>Tabela 18. Pragjet e përdorura</w:t>
       </w:r>
     </w:p>
     <w:p>
@@ -1147,7 +1147,7 @@
           <w:caps w:val="0"/>
           <w:sz w:val="24"/>
         </w:rPr>
-        <w:t>Tabela 19. Çka propozohet dhe çka aplikohet</w:t>
+        <w:t>Tabela 19. Metrikat sipas nivelit</w:t>
       </w:r>
     </w:p>
     <w:p>
@@ -1163,7 +1163,7 @@
           <w:caps w:val="0"/>
           <w:sz w:val="24"/>
         </w:rPr>
-        <w:t>Tabela 20. Arsyet e refuzimit</w:t>
+        <w:t>Tabela 20. Çka propozohet dhe çka aplikohet</w:t>
       </w:r>
     </w:p>
     <w:p>
@@ -1179,7 +1179,23 @@
           <w:caps w:val="0"/>
           <w:sz w:val="24"/>
         </w:rPr>
-        <w:t>Tabela 21. Radha e ekzekutimit</w:t>
+        <w:t>Tabela 21. Arsyet e refuzimit</w:t>
+      </w:r>
+    </w:p>
+    <w:p>
+      <w:pPr>
+        <w:spacing w:line="360" w:lineRule="auto"/>
+        <w:ind w:firstLine="360"/>
+        <w:jc w:val="both"/>
+      </w:pPr>
+      <w:r>
+        <w:rPr>
+          <w:rFonts w:ascii="Times New Roman" w:hAnsi="Times New Roman" w:eastAsia="Times New Roman"/>
+          <w:b w:val="0"/>
+          <w:caps w:val="0"/>
+          <w:sz w:val="24"/>
+        </w:rPr>
+        <w:t>Tabela 22. Radha e ekzekutimit</w:t>
       </w:r>
     </w:p>
     <w:p>
@@ -5420,6 +5436,477 @@
     </w:p>
     <w:p>
       <w:pPr>
+        <w:spacing w:line="360" w:lineRule="auto"/>
+        <w:ind w:firstLine="360"/>
+        <w:jc w:val="both"/>
+      </w:pPr>
+      <w:r>
+        <w:rPr>
+          <w:rFonts w:ascii="Times New Roman" w:hAnsi="Times New Roman" w:eastAsia="Times New Roman"/>
+          <w:b w:val="0"/>
+          <w:caps w:val="0"/>
+          <w:sz w:val="24"/>
+        </w:rPr>
+        <w:t>Rëndësia e veçorive përgjigjet për korpusin, jo për rastin. Një zhvillues që ka përpara një klasë të shënuar nuk pyet cila metrikë ka peshë përgjithësisht; pyet pse kjo klasë. Qasja A i përgjigjet me ndërtim, sepse raporton kushtet me vlerat e matura; Qasja B fiton kudo dhe nuk thotë asgjë. Ky asimetri është kundërshtimi standard ndaj detektimit me mësim makine.</w:t>
+      </w:r>
+    </w:p>
+    <w:p>
+      <w:pPr>
+        <w:spacing w:line="360" w:lineRule="auto"/>
+        <w:ind w:firstLine="360"/>
+        <w:jc w:val="both"/>
+      </w:pPr>
+      <w:r>
+        <w:rPr>
+          <w:rFonts w:ascii="Times New Roman" w:hAnsi="Times New Roman" w:eastAsia="Times New Roman"/>
+          <w:b w:val="0"/>
+          <w:caps w:val="0"/>
+          <w:sz w:val="24"/>
+        </w:rPr>
+        <w:t>Prandaj çdo entitet i shënuar u pyet edhe një herë: secila matje, një nga një, u zëvendësua me vlerën tipike të bashkësisë së trajnimit dhe modeli u pyet sërish. Kur ai zëvendësim i vetëm e kthen verdiktin nën kufirin e vendimit, ajo matje e mban vetë shënimin — dhe kjo është një fjali që zhvilluesi mund ta lexojë: «po të ishte CLOC-u tipik, kjo klasë nuk do të shënohej».</w:t>
+      </w:r>
+    </w:p>
+    <w:p>
+      <w:pPr>
+        <w:spacing w:line="240" w:lineRule="auto"/>
+        <w:jc w:val="center"/>
+      </w:pPr>
+      <w:r>
+        <w:rPr>
+          <w:rFonts w:ascii="Times New Roman" w:hAnsi="Times New Roman" w:eastAsia="Times New Roman"/>
+          <w:b w:val="0"/>
+          <w:caps w:val="0"/>
+          <w:sz w:val="22"/>
+        </w:rPr>
+        <w:t>Tabela 4. Sa shpesh një matje e vetme e mban verdiktin</w:t>
+      </w:r>
+    </w:p>
+    <w:tbl>
+      <w:tblPr>
+        <w:tblStyle w:val="TableGrid"/>
+        <w:tblW w:type="auto" w:w="0"/>
+        <w:tblLook w:firstColumn="1" w:firstRow="1" w:lastColumn="0" w:lastRow="0" w:noHBand="0" w:noVBand="1" w:val="04A0"/>
+      </w:tblPr>
+      <w:tblGrid>
+        <w:gridCol w:w="2160"/>
+        <w:gridCol w:w="2160"/>
+        <w:gridCol w:w="2160"/>
+        <w:gridCol w:w="2160"/>
+      </w:tblGrid>
+      <w:tr>
+        <w:tc>
+          <w:tcPr>
+            <w:tcW w:type="dxa" w:w="2160"/>
+          </w:tcPr>
+          <w:p>
+            <w:pPr>
+              <w:spacing w:line="240" w:lineRule="auto"/>
+            </w:pPr>
+            <w:r>
+              <w:rPr>
+                <w:rFonts w:ascii="Times New Roman" w:hAnsi="Times New Roman" w:eastAsia="Times New Roman"/>
+                <w:b/>
+                <w:caps w:val="0"/>
+                <w:sz w:val="22"/>
+              </w:rPr>
+              <w:t>Erë</w:t>
+            </w:r>
+          </w:p>
+        </w:tc>
+        <w:tc>
+          <w:tcPr>
+            <w:tcW w:type="dxa" w:w="2160"/>
+          </w:tcPr>
+          <w:p>
+            <w:pPr>
+              <w:spacing w:line="240" w:lineRule="auto"/>
+            </w:pPr>
+            <w:r>
+              <w:rPr>
+                <w:rFonts w:ascii="Times New Roman" w:hAnsi="Times New Roman" w:eastAsia="Times New Roman"/>
+                <w:b/>
+                <w:caps w:val="0"/>
+                <w:sz w:val="22"/>
+              </w:rPr>
+              <w:t>Të shënuara</w:t>
+            </w:r>
+          </w:p>
+        </w:tc>
+        <w:tc>
+          <w:tcPr>
+            <w:tcW w:type="dxa" w:w="2160"/>
+          </w:tcPr>
+          <w:p>
+            <w:pPr>
+              <w:spacing w:line="240" w:lineRule="auto"/>
+            </w:pPr>
+            <w:r>
+              <w:rPr>
+                <w:rFonts w:ascii="Times New Roman" w:hAnsi="Times New Roman" w:eastAsia="Times New Roman"/>
+                <w:b/>
+                <w:caps w:val="0"/>
+                <w:sz w:val="22"/>
+              </w:rPr>
+              <w:t>Me shpjegim</w:t>
+            </w:r>
+          </w:p>
+        </w:tc>
+        <w:tc>
+          <w:tcPr>
+            <w:tcW w:type="dxa" w:w="2160"/>
+          </w:tcPr>
+          <w:p>
+            <w:pPr>
+              <w:spacing w:line="240" w:lineRule="auto"/>
+            </w:pPr>
+            <w:r>
+              <w:rPr>
+                <w:rFonts w:ascii="Times New Roman" w:hAnsi="Times New Roman" w:eastAsia="Times New Roman"/>
+                <w:b/>
+                <w:caps w:val="0"/>
+                <w:sz w:val="22"/>
+              </w:rPr>
+              <w:t>Matjet vendimtare</w:t>
+            </w:r>
+          </w:p>
+        </w:tc>
+      </w:tr>
+      <w:tr>
+        <w:tc>
+          <w:tcPr>
+            <w:tcW w:type="dxa" w:w="2160"/>
+          </w:tcPr>
+          <w:p>
+            <w:pPr>
+              <w:spacing w:line="240" w:lineRule="auto"/>
+            </w:pPr>
+            <w:r>
+              <w:rPr>
+                <w:rFonts w:ascii="Times New Roman" w:hAnsi="Times New Roman" w:eastAsia="Times New Roman"/>
+                <w:b w:val="0"/>
+                <w:caps w:val="0"/>
+                <w:sz w:val="22"/>
+              </w:rPr>
+              <w:t>Blob</w:t>
+            </w:r>
+          </w:p>
+        </w:tc>
+        <w:tc>
+          <w:tcPr>
+            <w:tcW w:type="dxa" w:w="2160"/>
+          </w:tcPr>
+          <w:p>
+            <w:pPr>
+              <w:spacing w:line="240" w:lineRule="auto"/>
+            </w:pPr>
+            <w:r>
+              <w:rPr>
+                <w:rFonts w:ascii="Times New Roman" w:hAnsi="Times New Roman" w:eastAsia="Times New Roman"/>
+                <w:b w:val="0"/>
+                <w:caps w:val="0"/>
+                <w:sz w:val="22"/>
+              </w:rPr>
+              <w:t>368</w:t>
+            </w:r>
+          </w:p>
+        </w:tc>
+        <w:tc>
+          <w:tcPr>
+            <w:tcW w:type="dxa" w:w="2160"/>
+          </w:tcPr>
+          <w:p>
+            <w:pPr>
+              <w:spacing w:line="240" w:lineRule="auto"/>
+            </w:pPr>
+            <w:r>
+              <w:rPr>
+                <w:rFonts w:ascii="Times New Roman" w:hAnsi="Times New Roman" w:eastAsia="Times New Roman"/>
+                <w:b w:val="0"/>
+                <w:caps w:val="0"/>
+                <w:sz w:val="22"/>
+              </w:rPr>
+              <w:t>73.1%</w:t>
+            </w:r>
+          </w:p>
+        </w:tc>
+        <w:tc>
+          <w:tcPr>
+            <w:tcW w:type="dxa" w:w="2160"/>
+          </w:tcPr>
+          <w:p>
+            <w:pPr>
+              <w:spacing w:line="240" w:lineRule="auto"/>
+            </w:pPr>
+            <w:r>
+              <w:rPr>
+                <w:rFonts w:ascii="Times New Roman" w:hAnsi="Times New Roman" w:eastAsia="Times New Roman"/>
+                <w:b w:val="0"/>
+                <w:caps w:val="0"/>
+                <w:sz w:val="22"/>
+              </w:rPr>
+              <w:t>c_CLOC (86), c_NOAM (83), c_CBO (41)</w:t>
+            </w:r>
+          </w:p>
+        </w:tc>
+      </w:tr>
+      <w:tr>
+        <w:tc>
+          <w:tcPr>
+            <w:tcW w:type="dxa" w:w="2160"/>
+          </w:tcPr>
+          <w:p>
+            <w:pPr>
+              <w:spacing w:line="240" w:lineRule="auto"/>
+            </w:pPr>
+            <w:r>
+              <w:rPr>
+                <w:rFonts w:ascii="Times New Roman" w:hAnsi="Times New Roman" w:eastAsia="Times New Roman"/>
+                <w:b w:val="0"/>
+                <w:caps w:val="0"/>
+                <w:sz w:val="22"/>
+              </w:rPr>
+              <w:t>Data Class</w:t>
+            </w:r>
+          </w:p>
+        </w:tc>
+        <w:tc>
+          <w:tcPr>
+            <w:tcW w:type="dxa" w:w="2160"/>
+          </w:tcPr>
+          <w:p>
+            <w:pPr>
+              <w:spacing w:line="240" w:lineRule="auto"/>
+            </w:pPr>
+            <w:r>
+              <w:rPr>
+                <w:rFonts w:ascii="Times New Roman" w:hAnsi="Times New Roman" w:eastAsia="Times New Roman"/>
+                <w:b w:val="0"/>
+                <w:caps w:val="0"/>
+                <w:sz w:val="22"/>
+              </w:rPr>
+              <w:t>175</w:t>
+            </w:r>
+          </w:p>
+        </w:tc>
+        <w:tc>
+          <w:tcPr>
+            <w:tcW w:type="dxa" w:w="2160"/>
+          </w:tcPr>
+          <w:p>
+            <w:pPr>
+              <w:spacing w:line="240" w:lineRule="auto"/>
+            </w:pPr>
+            <w:r>
+              <w:rPr>
+                <w:rFonts w:ascii="Times New Roman" w:hAnsi="Times New Roman" w:eastAsia="Times New Roman"/>
+                <w:b w:val="0"/>
+                <w:caps w:val="0"/>
+                <w:sz w:val="22"/>
+              </w:rPr>
+              <w:t>69.1%</w:t>
+            </w:r>
+          </w:p>
+        </w:tc>
+        <w:tc>
+          <w:tcPr>
+            <w:tcW w:type="dxa" w:w="2160"/>
+          </w:tcPr>
+          <w:p>
+            <w:pPr>
+              <w:spacing w:line="240" w:lineRule="auto"/>
+            </w:pPr>
+            <w:r>
+              <w:rPr>
+                <w:rFonts w:ascii="Times New Roman" w:hAnsi="Times New Roman" w:eastAsia="Times New Roman"/>
+                <w:b w:val="0"/>
+                <w:caps w:val="0"/>
+                <w:sz w:val="22"/>
+              </w:rPr>
+              <w:t>c_CLOC (48), c_WOC (21), c_CBO (20)</w:t>
+            </w:r>
+          </w:p>
+        </w:tc>
+      </w:tr>
+      <w:tr>
+        <w:tc>
+          <w:tcPr>
+            <w:tcW w:type="dxa" w:w="2160"/>
+          </w:tcPr>
+          <w:p>
+            <w:pPr>
+              <w:spacing w:line="240" w:lineRule="auto"/>
+            </w:pPr>
+            <w:r>
+              <w:rPr>
+                <w:rFonts w:ascii="Times New Roman" w:hAnsi="Times New Roman" w:eastAsia="Times New Roman"/>
+                <w:b w:val="0"/>
+                <w:caps w:val="0"/>
+                <w:sz w:val="22"/>
+              </w:rPr>
+              <w:t>Feature Envy</w:t>
+            </w:r>
+          </w:p>
+        </w:tc>
+        <w:tc>
+          <w:tcPr>
+            <w:tcW w:type="dxa" w:w="2160"/>
+          </w:tcPr>
+          <w:p>
+            <w:pPr>
+              <w:spacing w:line="240" w:lineRule="auto"/>
+            </w:pPr>
+            <w:r>
+              <w:rPr>
+                <w:rFonts w:ascii="Times New Roman" w:hAnsi="Times New Roman" w:eastAsia="Times New Roman"/>
+                <w:b w:val="0"/>
+                <w:caps w:val="0"/>
+                <w:sz w:val="22"/>
+              </w:rPr>
+              <w:t>66</w:t>
+            </w:r>
+          </w:p>
+        </w:tc>
+        <w:tc>
+          <w:tcPr>
+            <w:tcW w:type="dxa" w:w="2160"/>
+          </w:tcPr>
+          <w:p>
+            <w:pPr>
+              <w:spacing w:line="240" w:lineRule="auto"/>
+            </w:pPr>
+            <w:r>
+              <w:rPr>
+                <w:rFonts w:ascii="Times New Roman" w:hAnsi="Times New Roman" w:eastAsia="Times New Roman"/>
+                <w:b w:val="0"/>
+                <w:caps w:val="0"/>
+                <w:sz w:val="22"/>
+              </w:rPr>
+              <w:t>89.4%</w:t>
+            </w:r>
+          </w:p>
+        </w:tc>
+        <w:tc>
+          <w:tcPr>
+            <w:tcW w:type="dxa" w:w="2160"/>
+          </w:tcPr>
+          <w:p>
+            <w:pPr>
+              <w:spacing w:line="240" w:lineRule="auto"/>
+            </w:pPr>
+            <w:r>
+              <w:rPr>
+                <w:rFonts w:ascii="Times New Roman" w:hAnsi="Times New Roman" w:eastAsia="Times New Roman"/>
+                <w:b w:val="0"/>
+                <w:caps w:val="0"/>
+                <w:sz w:val="22"/>
+              </w:rPr>
+              <w:t>m_MLOC (53), m_NOAV (5), m_MAXNESTING (1)</w:t>
+            </w:r>
+          </w:p>
+        </w:tc>
+      </w:tr>
+      <w:tr>
+        <w:tc>
+          <w:tcPr>
+            <w:tcW w:type="dxa" w:w="2160"/>
+          </w:tcPr>
+          <w:p>
+            <w:pPr>
+              <w:spacing w:line="240" w:lineRule="auto"/>
+            </w:pPr>
+            <w:r>
+              <w:rPr>
+                <w:rFonts w:ascii="Times New Roman" w:hAnsi="Times New Roman" w:eastAsia="Times New Roman"/>
+                <w:b w:val="0"/>
+                <w:caps w:val="0"/>
+                <w:sz w:val="22"/>
+              </w:rPr>
+              <w:t>Long Method</w:t>
+            </w:r>
+          </w:p>
+        </w:tc>
+        <w:tc>
+          <w:tcPr>
+            <w:tcW w:type="dxa" w:w="2160"/>
+          </w:tcPr>
+          <w:p>
+            <w:pPr>
+              <w:spacing w:line="240" w:lineRule="auto"/>
+            </w:pPr>
+            <w:r>
+              <w:rPr>
+                <w:rFonts w:ascii="Times New Roman" w:hAnsi="Times New Roman" w:eastAsia="Times New Roman"/>
+                <w:b w:val="0"/>
+                <w:caps w:val="0"/>
+                <w:sz w:val="22"/>
+              </w:rPr>
+              <w:t>231</w:t>
+            </w:r>
+          </w:p>
+        </w:tc>
+        <w:tc>
+          <w:tcPr>
+            <w:tcW w:type="dxa" w:w="2160"/>
+          </w:tcPr>
+          <w:p>
+            <w:pPr>
+              <w:spacing w:line="240" w:lineRule="auto"/>
+            </w:pPr>
+            <w:r>
+              <w:rPr>
+                <w:rFonts w:ascii="Times New Roman" w:hAnsi="Times New Roman" w:eastAsia="Times New Roman"/>
+                <w:b w:val="0"/>
+                <w:caps w:val="0"/>
+                <w:sz w:val="22"/>
+              </w:rPr>
+              <w:t>96.1%</w:t>
+            </w:r>
+          </w:p>
+        </w:tc>
+        <w:tc>
+          <w:tcPr>
+            <w:tcW w:type="dxa" w:w="2160"/>
+          </w:tcPr>
+          <w:p>
+            <w:pPr>
+              <w:spacing w:line="240" w:lineRule="auto"/>
+            </w:pPr>
+            <w:r>
+              <w:rPr>
+                <w:rFonts w:ascii="Times New Roman" w:hAnsi="Times New Roman" w:eastAsia="Times New Roman"/>
+                <w:b w:val="0"/>
+                <w:caps w:val="0"/>
+                <w:sz w:val="22"/>
+              </w:rPr>
+              <w:t>m_MLOC (220), m_CC (2)</w:t>
+            </w:r>
+          </w:p>
+        </w:tc>
+      </w:tr>
+    </w:tbl>
+    <w:p>
+      <w:pPr>
+        <w:spacing w:line="240" w:lineRule="auto" w:after="0"/>
+      </w:pPr>
+    </w:p>
+    <w:p>
+      <w:pPr>
+        <w:spacing w:line="360" w:lineRule="auto"/>
+        <w:ind w:firstLine="360"/>
+        <w:jc w:val="both"/>
+      </w:pPr>
+      <w:r>
+        <w:rPr>
+          <w:rFonts w:ascii="Times New Roman" w:hAnsi="Times New Roman" w:eastAsia="Times New Roman"/>
+          <w:b w:val="0"/>
+          <w:caps w:val="0"/>
+          <w:sz w:val="24"/>
+        </w:rPr>
+        <w:t>Shpjegimi jepet jashtë fold-it, si vetë verdiktet: çdo entitet shpjegohet nga një model që nuk e ka parë depon e tij. Kufizimi i metodës është se e sheh një matje në një kohë dhe nuk dallon dot dy metrika që mbajnë të njëjtin informacion; aty ku CLOC dhe NOM thonë të dyja «e madhe», zëvendësimi i njërës mund të mos lëvizë asgjë dhe rasti del i pashpjeguar.</w:t>
+      </w:r>
+    </w:p>
+    <w:p>
+      <w:pPr>
         <w:pStyle w:val="Heading2"/>
       </w:pPr>
       <w:r>
@@ -5514,7 +6001,7 @@
           <w:caps w:val="0"/>
           <w:sz w:val="22"/>
         </w:rPr>
-        <w:t>Tabela 4. Pajtimi mes dy qasjeve</w:t>
+        <w:t>Tabela 5. Pajtimi mes dy qasjeve</w:t>
       </w:r>
     </w:p>
     <w:tbl>
@@ -6215,7 +6702,7 @@
           <w:caps w:val="0"/>
           <w:sz w:val="22"/>
         </w:rPr>
-        <w:t>Tabela 5. Të dyja qasjet së bashku</w:t>
+        <w:t>Tabela 6. Të dyja qasjet së bashku</w:t>
       </w:r>
     </w:p>
     <w:tbl>
@@ -6908,7 +7395,7 @@
           <w:caps w:val="0"/>
           <w:sz w:val="22"/>
         </w:rPr>
-        <w:t>Tabela 6. Rezultati i motorit të refaktorimit</w:t>
+        <w:t>Tabela 7. Rezultati i motorit të refaktorimit</w:t>
       </w:r>
     </w:p>
     <w:tbl>
@@ -7249,7 +7736,7 @@
           <w:caps w:val="0"/>
           <w:sz w:val="22"/>
         </w:rPr>
-        <w:t>Tabela 7. Pse u refuzuan</w:t>
+        <w:t>Tabela 8. Pse u refuzuan</w:t>
       </w:r>
     </w:p>
     <w:tbl>
@@ -7576,7 +8063,7 @@
           <w:caps w:val="0"/>
           <w:sz w:val="22"/>
         </w:rPr>
-        <w:t>Tabela 8. Verifikimi i atyre që u aplikuan</w:t>
+        <w:t>Tabela 9. Verifikimi i atyre që u aplikuan</w:t>
       </w:r>
     </w:p>
     <w:tbl>
@@ -7922,7 +8409,7 @@
           <w:caps w:val="0"/>
           <w:sz w:val="22"/>
         </w:rPr>
-        <w:t>Tabela 9. Sa lëviz MCC-ja kur zhvendoset një prag</w:t>
+        <w:t>Tabela 10. Sa lëviz MCC-ja kur zhvendoset një prag</w:t>
       </w:r>
     </w:p>
     <w:tbl>
@@ -9157,7 +9644,7 @@
           <w:caps w:val="0"/>
           <w:sz w:val="22"/>
         </w:rPr>
-        <w:t>Tabela 10. Rregullat me pragje të kalibruara, të pikëzuara jashtë fold-it</w:t>
+        <w:t>Tabela 11. Rregullat me pragje të kalibruara, të pikëzuara jashtë fold-it</w:t>
       </w:r>
     </w:p>
     <w:tbl>
@@ -9866,7 +10353,7 @@
           <w:caps w:val="0"/>
           <w:sz w:val="22"/>
         </w:rPr>
-        <w:t>Tabela 11. Pajtimi i ashpërsisë me rishikuesit</w:t>
+        <w:t>Tabela 12. Pajtimi i ashpërsisë me rishikuesit</w:t>
       </w:r>
     </w:p>
     <w:tbl>
@@ -10646,7 +11133,7 @@
           <w:caps w:val="0"/>
           <w:sz w:val="22"/>
         </w:rPr>
-        <w:t>Tabela 12. Intervale besimi 95% për MCC-në</w:t>
+        <w:t>Tabela 13. Intervale besimi 95% për MCC-në</w:t>
       </w:r>
     </w:p>
     <w:tbl>
@@ -11251,7 +11738,7 @@
           <w:caps w:val="0"/>
           <w:sz w:val="22"/>
         </w:rPr>
-        <w:t>Tabela 13. B − A kur rregullat marrin pragun e tyre më të mirë</w:t>
+        <w:t>Tabela 14. B − A kur rregullat marrin pragun e tyre më të mirë</w:t>
       </w:r>
     </w:p>
     <w:tbl>
@@ -11802,7 +12289,7 @@
           <w:caps w:val="0"/>
           <w:sz w:val="22"/>
         </w:rPr>
-        <w:t>Tabela 14. Sa pajtohen rishikuesit me njëri-tjetrin</w:t>
+        <w:t>Tabela 15. Sa pajtohen rishikuesit me njëri-tjetrin</w:t>
       </w:r>
     </w:p>
     <w:tbl>
@@ -13274,7 +13761,7 @@
           <w:caps w:val="0"/>
           <w:sz w:val="22"/>
         </w:rPr>
-        <w:t>Tabela 15. Strategjitë e detektimit dhe burimet e tyre</w:t>
+        <w:t>Tabela 16. Strategjitë e detektimit dhe burimet e tyre</w:t>
       </w:r>
     </w:p>
     <w:tbl>
@@ -14055,7 +14542,7 @@
           <w:caps w:val="0"/>
           <w:sz w:val="22"/>
         </w:rPr>
-        <w:t>Tabela 16. Kuantifikuesit e përgjithshëm</w:t>
+        <w:t>Tabela 17. Kuantifikuesit e përgjithshëm</w:t>
       </w:r>
     </w:p>
     <w:tbl>
@@ -14502,7 +14989,7 @@
           <w:caps w:val="0"/>
           <w:sz w:val="22"/>
         </w:rPr>
-        <w:t>Tabela 17. Pragjet e përdorura</w:t>
+        <w:t>Tabela 18. Pragjet e përdorura</w:t>
       </w:r>
     </w:p>
     <w:tbl>
@@ -15523,7 +16010,7 @@
           <w:caps w:val="0"/>
           <w:sz w:val="22"/>
         </w:rPr>
-        <w:t>Tabela 18. Metrikat sipas nivelit</w:t>
+        <w:t>Tabela 19. Metrikat sipas nivelit</w:t>
       </w:r>
     </w:p>
     <w:tbl>
@@ -15704,7 +16191,7 @@
           <w:caps w:val="0"/>
           <w:sz w:val="22"/>
         </w:rPr>
-        <w:t>Tabela 19. Çka propozohet dhe çka aplikohet</w:t>
+        <w:t>Tabela 20. Çka propozohet dhe çka aplikohet</w:t>
       </w:r>
     </w:p>
     <w:tbl>
@@ -16283,7 +16770,7 @@
           <w:caps w:val="0"/>
           <w:sz w:val="22"/>
         </w:rPr>
-        <w:t>Tabela 20. Arsyet e refuzimit</w:t>
+        <w:t>Tabela 21. Arsyet e refuzimit</w:t>
       </w:r>
     </w:p>
     <w:tbl>
@@ -16744,7 +17231,7 @@
           <w:caps w:val="0"/>
           <w:sz w:val="22"/>
         </w:rPr>
-        <w:t>Tabela 21. Radha e ekzekutimit</w:t>
+        <w:t>Tabela 22. Radha e ekzekutimit</w:t>
       </w:r>
     </w:p>
     <w:tbl>

</xml_diff>

<commit_message>
Rinderto punimin me numrat e plote te Qasjes C
</commit_message>
<xml_diff>
--- a/docs/thesis/Punim_Diplome_Florent_Latifi.docx
+++ b/docs/thesis/Punim_Diplome_Florent_Latifi.docx
@@ -600,7 +600,7 @@
           <w:caps w:val="0"/>
           <w:sz w:val="24"/>
         </w:rPr>
-        <w:t>Dy rezultate janë negative dhe raportohen si të tilla. Ashpërsia që sistemi e derivon nga teprica mbi pragje nuk e riprodhon gjykimin e rishikuesve: pajtimi i matur me kappa me peshë qëndron te 0.007 deri 0.293, dhe gabimi është i njëanshëm nga mbivlerësimi. Po ashtu, vetë rishikuesit pajtohen mes tyre me MCC 0.022 deri 0.238, çka tregon se një pjesë e pareduktueshme e gabimit të çdo detektori i takon përkufizimit të erës dhe jo detektorit. Motori i refaktorimit automatizon 3 transformime dhe transformoi 21.7% të vendeve të detektuara, ku shumica e refuzimeve vjen nga forma e kodit dhe nga rrjedha e kontrollit; refuzimi trajtohet si rezultat i saktë dhe numërohet. Kontributi kryesor nuk është një shifër e vetme, por një hark i plotë e i riprodhueshëm nga korpusi te rezultati.</w:t>
+        <w:t>Dy rezultate janë negative dhe raportohen si të tilla. Ashpërsia që sistemi e derivon nga teprica mbi pragje nuk e riprodhon gjykimin e rishikuesve: pajtimi i matur me kappa me peshë qëndron te 0.007 deri 0.293, dhe gabimi është i njëanshëm nga mbivlerësimi. Po ashtu, vetë rishikuesit pajtohen mes tyre me MCC 0.022 deri 0.238, çka tregon se një pjesë e pareduktueshme e gabimit të çdo detektori i takon përkufizimit të erës dhe jo detektorit. Motori i refaktorimit automatizon 3 transformime dhe transformoi 20.4% të vendeve të detektuara, ku shumica e refuzimeve vjen nga forma e kodit dhe nga rrjedha e kontrollit; refuzimi trajtohet si rezultat i saktë dhe numërohet. Kontributi kryesor nuk është një shifër e vetme, por një hark i plotë e i riprodhueshëm nga korpusi te rezultati.</w:t>
       </w:r>
     </w:p>
     <w:p>
@@ -1003,7 +1003,7 @@
           <w:caps w:val="0"/>
           <w:sz w:val="24"/>
         </w:rPr>
-        <w:t>Tabela 10. Sa lëviz MCC-ja kur zhvendoset një prag</w:t>
+        <w:t>Tabela 10. A u hoq era pas rishkrimit</w:t>
       </w:r>
     </w:p>
     <w:p>
@@ -1019,7 +1019,7 @@
           <w:caps w:val="0"/>
           <w:sz w:val="24"/>
         </w:rPr>
-        <w:t>Tabela 11. Rregullat me pragje të kalibruara, të pikëzuara jashtë fold-it</w:t>
+        <w:t>Tabela 11. Sa lëvizi matja pas rishkrimit</w:t>
       </w:r>
     </w:p>
     <w:p>
@@ -1035,7 +1035,7 @@
           <w:caps w:val="0"/>
           <w:sz w:val="24"/>
         </w:rPr>
-        <w:t>Tabela 12. Pajtimi i ashpërsisë me rishikuesit</w:t>
+        <w:t>Tabela 12. Sa lëviz MCC-ja kur zhvendoset një prag</w:t>
       </w:r>
     </w:p>
     <w:p>
@@ -1051,7 +1051,7 @@
           <w:caps w:val="0"/>
           <w:sz w:val="24"/>
         </w:rPr>
-        <w:t>Tabela 13. Intervale besimi 95% për MCC-në</w:t>
+        <w:t>Tabela 13. Rregullat me pragje të kalibruara, të pikëzuara jashtë fold-it</w:t>
       </w:r>
     </w:p>
     <w:p>
@@ -1067,7 +1067,7 @@
           <w:caps w:val="0"/>
           <w:sz w:val="24"/>
         </w:rPr>
-        <w:t>Tabela 14. B − A kur rregullat marrin pragun e tyre më të mirë</w:t>
+        <w:t>Tabela 14. Pajtimi i ashpërsisë me rishikuesit</w:t>
       </w:r>
     </w:p>
     <w:p>
@@ -1083,7 +1083,7 @@
           <w:caps w:val="0"/>
           <w:sz w:val="24"/>
         </w:rPr>
-        <w:t>Tabela 15. Sa pajtohen rishikuesit me njëri-tjetrin</w:t>
+        <w:t>Tabela 15. Intervale besimi 95% për MCC-në</w:t>
       </w:r>
     </w:p>
     <w:p>
@@ -1099,7 +1099,7 @@
           <w:caps w:val="0"/>
           <w:sz w:val="24"/>
         </w:rPr>
-        <w:t>Tabela 16. Strategjitë e detektimit dhe burimet e tyre</w:t>
+        <w:t>Tabela 16. B − A kur rregullat marrin pragun e tyre më të mirë</w:t>
       </w:r>
     </w:p>
     <w:p>
@@ -1115,7 +1115,7 @@
           <w:caps w:val="0"/>
           <w:sz w:val="24"/>
         </w:rPr>
-        <w:t>Tabela 17. Kuantifikuesit e përgjithshëm</w:t>
+        <w:t>Tabela 17. Sa pajtohen rishikuesit me njëri-tjetrin</w:t>
       </w:r>
     </w:p>
     <w:p>
@@ -1131,7 +1131,7 @@
           <w:caps w:val="0"/>
           <w:sz w:val="24"/>
         </w:rPr>
-        <w:t>Tabela 18. Pragjet e përdorura</w:t>
+        <w:t>Tabela 18. Strategjitë e detektimit dhe burimet e tyre</w:t>
       </w:r>
     </w:p>
     <w:p>
@@ -1147,7 +1147,7 @@
           <w:caps w:val="0"/>
           <w:sz w:val="24"/>
         </w:rPr>
-        <w:t>Tabela 19. Metrikat sipas nivelit</w:t>
+        <w:t>Tabela 19. Kuantifikuesit e përgjithshëm</w:t>
       </w:r>
     </w:p>
     <w:p>
@@ -1163,7 +1163,7 @@
           <w:caps w:val="0"/>
           <w:sz w:val="24"/>
         </w:rPr>
-        <w:t>Tabela 20. Çka propozohet dhe çka aplikohet</w:t>
+        <w:t>Tabela 20. Pragjet e përdorura</w:t>
       </w:r>
     </w:p>
     <w:p>
@@ -1179,7 +1179,7 @@
           <w:caps w:val="0"/>
           <w:sz w:val="24"/>
         </w:rPr>
-        <w:t>Tabela 21. Arsyet e refuzimit</w:t>
+        <w:t>Tabela 21. Metrikat sipas nivelit</w:t>
       </w:r>
     </w:p>
     <w:p>
@@ -1195,7 +1195,39 @@
           <w:caps w:val="0"/>
           <w:sz w:val="24"/>
         </w:rPr>
-        <w:t>Tabela 22. Radha e ekzekutimit</w:t>
+        <w:t>Tabela 22. Çka propozohet dhe çka aplikohet</w:t>
+      </w:r>
+    </w:p>
+    <w:p>
+      <w:pPr>
+        <w:spacing w:line="360" w:lineRule="auto"/>
+        <w:ind w:firstLine="360"/>
+        <w:jc w:val="both"/>
+      </w:pPr>
+      <w:r>
+        <w:rPr>
+          <w:rFonts w:ascii="Times New Roman" w:hAnsi="Times New Roman" w:eastAsia="Times New Roman"/>
+          <w:b w:val="0"/>
+          <w:caps w:val="0"/>
+          <w:sz w:val="24"/>
+        </w:rPr>
+        <w:t>Tabela 23. Arsyet e refuzimit</w:t>
+      </w:r>
+    </w:p>
+    <w:p>
+      <w:pPr>
+        <w:spacing w:line="360" w:lineRule="auto"/>
+        <w:ind w:firstLine="360"/>
+        <w:jc w:val="both"/>
+      </w:pPr>
+      <w:r>
+        <w:rPr>
+          <w:rFonts w:ascii="Times New Roman" w:hAnsi="Times New Roman" w:eastAsia="Times New Roman"/>
+          <w:b w:val="0"/>
+          <w:caps w:val="0"/>
+          <w:sz w:val="24"/>
+        </w:rPr>
+        <w:t>Tabela 24. Radha e ekzekutimit</w:t>
       </w:r>
     </w:p>
     <w:p>
@@ -7380,7 +7412,7 @@
           <w:caps w:val="0"/>
           <w:sz w:val="24"/>
         </w:rPr>
-        <w:t>Mbi 4409 skedarë të korpusit u detektuan 15991 vende ku motori ka një transformim; prej tyre 3478 u transformuan.</w:t>
+        <w:t>Mbi 4409 skedarë të korpusit u detektuan 17833 vende ku motori ka një transformim; prej tyre 3633 u transformuan.</w:t>
       </w:r>
     </w:p>
     <w:p>
@@ -7502,7 +7534,7 @@
                 <w:caps w:val="0"/>
                 <w:sz w:val="22"/>
               </w:rPr>
-              <w:t>15991</w:t>
+              <w:t>17833</w:t>
             </w:r>
           </w:p>
         </w:tc>
@@ -7561,7 +7593,7 @@
                 <w:caps w:val="0"/>
                 <w:sz w:val="22"/>
               </w:rPr>
-              <w:t>3478</w:t>
+              <w:t>3633</w:t>
             </w:r>
           </w:p>
         </w:tc>
@@ -7580,7 +7612,7 @@
                 <w:caps w:val="0"/>
                 <w:sz w:val="22"/>
               </w:rPr>
-              <w:t>21.7%</w:t>
+              <w:t>20.4%</w:t>
             </w:r>
           </w:p>
         </w:tc>
@@ -7620,7 +7652,7 @@
                 <w:caps w:val="0"/>
                 <w:sz w:val="22"/>
               </w:rPr>
-              <w:t>12496</w:t>
+              <w:t>14183</w:t>
             </w:r>
           </w:p>
         </w:tc>
@@ -7639,7 +7671,7 @@
                 <w:caps w:val="0"/>
                 <w:sz w:val="22"/>
               </w:rPr>
-              <w:t>78.1%</w:t>
+              <w:t>79.5%</w:t>
             </w:r>
           </w:p>
         </w:tc>
@@ -7844,7 +7876,7 @@
                 <w:caps w:val="0"/>
                 <w:sz w:val="22"/>
               </w:rPr>
-              <w:t>7315</w:t>
+              <w:t>8935</w:t>
             </w:r>
           </w:p>
         </w:tc>
@@ -7863,7 +7895,7 @@
                 <w:caps w:val="0"/>
                 <w:sz w:val="22"/>
               </w:rPr>
-              <w:t>45.7%</w:t>
+              <w:t>50.1%</w:t>
             </w:r>
           </w:p>
         </w:tc>
@@ -7922,7 +7954,7 @@
                 <w:caps w:val="0"/>
                 <w:sz w:val="22"/>
               </w:rPr>
-              <w:t>26.2%</w:t>
+              <w:t>23.5%</w:t>
             </w:r>
           </w:p>
         </w:tc>
@@ -7981,7 +8013,7 @@
                 <w:caps w:val="0"/>
                 <w:sz w:val="22"/>
               </w:rPr>
-              <w:t>3.9%</w:t>
+              <w:t>3.5%</w:t>
             </w:r>
           </w:p>
         </w:tc>
@@ -8040,7 +8072,125 @@
                 <w:caps w:val="0"/>
                 <w:sz w:val="22"/>
               </w:rPr>
-              <w:t>2.3%</w:t>
+              <w:t>2.1%</w:t>
+            </w:r>
+          </w:p>
+        </w:tc>
+      </w:tr>
+      <w:tr>
+        <w:tc>
+          <w:tcPr>
+            <w:tcW w:type="dxa" w:w="2880"/>
+          </w:tcPr>
+          <w:p>
+            <w:pPr>
+              <w:spacing w:line="240" w:lineRule="auto"/>
+            </w:pPr>
+            <w:r>
+              <w:rPr>
+                <w:rFonts w:ascii="Times New Roman" w:hAnsi="Times New Roman" w:eastAsia="Times New Roman"/>
+                <w:b w:val="0"/>
+                <w:caps w:val="0"/>
+                <w:sz w:val="22"/>
+              </w:rPr>
+              <w:t>ambiguous overload</w:t>
+            </w:r>
+          </w:p>
+        </w:tc>
+        <w:tc>
+          <w:tcPr>
+            <w:tcW w:type="dxa" w:w="2880"/>
+          </w:tcPr>
+          <w:p>
+            <w:pPr>
+              <w:spacing w:line="240" w:lineRule="auto"/>
+            </w:pPr>
+            <w:r>
+              <w:rPr>
+                <w:rFonts w:ascii="Times New Roman" w:hAnsi="Times New Roman" w:eastAsia="Times New Roman"/>
+                <w:b w:val="0"/>
+                <w:caps w:val="0"/>
+                <w:sz w:val="22"/>
+              </w:rPr>
+              <w:t>52</w:t>
+            </w:r>
+          </w:p>
+        </w:tc>
+        <w:tc>
+          <w:tcPr>
+            <w:tcW w:type="dxa" w:w="2880"/>
+          </w:tcPr>
+          <w:p>
+            <w:pPr>
+              <w:spacing w:line="240" w:lineRule="auto"/>
+            </w:pPr>
+            <w:r>
+              <w:rPr>
+                <w:rFonts w:ascii="Times New Roman" w:hAnsi="Times New Roman" w:eastAsia="Times New Roman"/>
+                <w:b w:val="0"/>
+                <w:caps w:val="0"/>
+                <w:sz w:val="22"/>
+              </w:rPr>
+              <w:t>0.3%</w:t>
+            </w:r>
+          </w:p>
+        </w:tc>
+      </w:tr>
+      <w:tr>
+        <w:tc>
+          <w:tcPr>
+            <w:tcW w:type="dxa" w:w="2880"/>
+          </w:tcPr>
+          <w:p>
+            <w:pPr>
+              <w:spacing w:line="240" w:lineRule="auto"/>
+            </w:pPr>
+            <w:r>
+              <w:rPr>
+                <w:rFonts w:ascii="Times New Roman" w:hAnsi="Times New Roman" w:eastAsia="Times New Roman"/>
+                <w:b w:val="0"/>
+                <w:caps w:val="0"/>
+                <w:sz w:val="22"/>
+              </w:rPr>
+              <w:t>unresolved name</w:t>
+            </w:r>
+          </w:p>
+        </w:tc>
+        <w:tc>
+          <w:tcPr>
+            <w:tcW w:type="dxa" w:w="2880"/>
+          </w:tcPr>
+          <w:p>
+            <w:pPr>
+              <w:spacing w:line="240" w:lineRule="auto"/>
+            </w:pPr>
+            <w:r>
+              <w:rPr>
+                <w:rFonts w:ascii="Times New Roman" w:hAnsi="Times New Roman" w:eastAsia="Times New Roman"/>
+                <w:b w:val="0"/>
+                <w:caps w:val="0"/>
+                <w:sz w:val="22"/>
+              </w:rPr>
+              <w:t>15</w:t>
+            </w:r>
+          </w:p>
+        </w:tc>
+        <w:tc>
+          <w:tcPr>
+            <w:tcW w:type="dxa" w:w="2880"/>
+          </w:tcPr>
+          <w:p>
+            <w:pPr>
+              <w:spacing w:line="240" w:lineRule="auto"/>
+            </w:pPr>
+            <w:r>
+              <w:rPr>
+                <w:rFonts w:ascii="Times New Roman" w:hAnsi="Times New Roman" w:eastAsia="Times New Roman"/>
+                <w:b w:val="0"/>
+                <w:caps w:val="0"/>
+                <w:sz w:val="22"/>
+              </w:rPr>
+              <w:t>0.1%</w:t>
             </w:r>
           </w:p>
         </w:tc>
@@ -8171,7 +8321,7 @@
                 <w:caps w:val="0"/>
                 <w:sz w:val="22"/>
               </w:rPr>
-              <w:t>3409</w:t>
+              <w:t>3558</w:t>
             </w:r>
           </w:p>
         </w:tc>
@@ -8190,7 +8340,7 @@
                 <w:caps w:val="0"/>
                 <w:sz w:val="22"/>
               </w:rPr>
-              <w:t>98.0%</w:t>
+              <w:t>97.9%</w:t>
             </w:r>
           </w:p>
         </w:tc>
@@ -8230,7 +8380,7 @@
                 <w:caps w:val="0"/>
                 <w:sz w:val="22"/>
               </w:rPr>
-              <w:t>56</w:t>
+              <w:t>58</w:t>
             </w:r>
           </w:p>
         </w:tc>
@@ -8309,6 +8459,65 @@
                 <w:sz w:val="22"/>
               </w:rPr>
               <w:t>0.4%</w:t>
+            </w:r>
+          </w:p>
+        </w:tc>
+      </w:tr>
+      <w:tr>
+        <w:tc>
+          <w:tcPr>
+            <w:tcW w:type="dxa" w:w="2880"/>
+          </w:tcPr>
+          <w:p>
+            <w:pPr>
+              <w:spacing w:line="240" w:lineRule="auto"/>
+            </w:pPr>
+            <w:r>
+              <w:rPr>
+                <w:rFonts w:ascii="Times New Roman" w:hAnsi="Times New Roman" w:eastAsia="Times New Roman"/>
+                <w:b w:val="0"/>
+                <w:caps w:val="0"/>
+                <w:sz w:val="22"/>
+              </w:rPr>
+              <w:t>parses</w:t>
+            </w:r>
+          </w:p>
+        </w:tc>
+        <w:tc>
+          <w:tcPr>
+            <w:tcW w:type="dxa" w:w="2880"/>
+          </w:tcPr>
+          <w:p>
+            <w:pPr>
+              <w:spacing w:line="240" w:lineRule="auto"/>
+            </w:pPr>
+            <w:r>
+              <w:rPr>
+                <w:rFonts w:ascii="Times New Roman" w:hAnsi="Times New Roman" w:eastAsia="Times New Roman"/>
+                <w:b w:val="0"/>
+                <w:caps w:val="0"/>
+                <w:sz w:val="22"/>
+              </w:rPr>
+              <w:t>4</w:t>
+            </w:r>
+          </w:p>
+        </w:tc>
+        <w:tc>
+          <w:tcPr>
+            <w:tcW w:type="dxa" w:w="2880"/>
+          </w:tcPr>
+          <w:p>
+            <w:pPr>
+              <w:spacing w:line="240" w:lineRule="auto"/>
+            </w:pPr>
+            <w:r>
+              <w:rPr>
+                <w:rFonts w:ascii="Times New Roman" w:hAnsi="Times New Roman" w:eastAsia="Times New Roman"/>
+                <w:b w:val="0"/>
+                <w:caps w:val="0"/>
+                <w:sz w:val="22"/>
+              </w:rPr>
+              <w:t>0.1%</w:t>
             </w:r>
           </w:p>
         </w:tc>
@@ -8332,7 +8541,842 @@
           <w:caps w:val="0"/>
           <w:sz w:val="24"/>
         </w:rPr>
-        <w:t>Nga 3478 rishkrime, 56 futën një gabim që nuk ishte aty më parë (1.61%). Pjesa tjetër ose kompiloi, ose nuk shtoi asnjë lloj të ri gabimi kundrejt skedarit origjinal.</w:t>
+        <w:t>Nga 3633 rishkrime, 58 futën një gabim që nuk ishte aty më parë (1.60%). Pjesa tjetër ose kompiloi, ose nuk shtoi asnjë lloj të ri gabimi kundrejt skedarit origjinal.</w:t>
+      </w:r>
+    </w:p>
+    <w:p>
+      <w:pPr>
+        <w:spacing w:line="360" w:lineRule="auto"/>
+        <w:ind w:firstLine="360"/>
+        <w:jc w:val="both"/>
+      </w:pPr>
+      <w:r>
+        <w:rPr>
+          <w:rFonts w:ascii="Times New Roman" w:hAnsi="Times New Roman" w:eastAsia="Times New Roman"/>
+          <w:b w:val="0"/>
+          <w:caps w:val="0"/>
+          <w:sz w:val="24"/>
+        </w:rPr>
+        <w:t>Që një rishkrim të kompilojë nuk do të thotë se e zgjidh problemin për të cilin u aplikua. Prandaj çdo entitet i rishkruar u mat sërish dhe u pyet nëse detektori ende ndez mbi të.</w:t>
+      </w:r>
+    </w:p>
+    <w:p>
+      <w:pPr>
+        <w:spacing w:line="240" w:lineRule="auto"/>
+        <w:jc w:val="center"/>
+      </w:pPr>
+      <w:r>
+        <w:rPr>
+          <w:rFonts w:ascii="Times New Roman" w:hAnsi="Times New Roman" w:eastAsia="Times New Roman"/>
+          <w:b w:val="0"/>
+          <w:caps w:val="0"/>
+          <w:sz w:val="22"/>
+        </w:rPr>
+        <w:t>Tabela 10. A u hoq era pas rishkrimit</w:t>
+      </w:r>
+    </w:p>
+    <w:tbl>
+      <w:tblPr>
+        <w:tblStyle w:val="TableGrid"/>
+        <w:tblW w:type="auto" w:w="0"/>
+        <w:tblLook w:firstColumn="1" w:firstRow="1" w:lastColumn="0" w:lastRow="0" w:noHBand="0" w:noVBand="1" w:val="04A0"/>
+      </w:tblPr>
+      <w:tblGrid>
+        <w:gridCol w:w="2880"/>
+        <w:gridCol w:w="2880"/>
+        <w:gridCol w:w="2880"/>
+      </w:tblGrid>
+      <w:tr>
+        <w:tc>
+          <w:tcPr>
+            <w:tcW w:type="dxa" w:w="2880"/>
+          </w:tcPr>
+          <w:p>
+            <w:pPr>
+              <w:spacing w:line="240" w:lineRule="auto"/>
+            </w:pPr>
+            <w:r>
+              <w:rPr>
+                <w:rFonts w:ascii="Times New Roman" w:hAnsi="Times New Roman" w:eastAsia="Times New Roman"/>
+                <w:b/>
+                <w:caps w:val="0"/>
+                <w:sz w:val="22"/>
+              </w:rPr>
+              <w:t>Rezultati</w:t>
+            </w:r>
+          </w:p>
+        </w:tc>
+        <w:tc>
+          <w:tcPr>
+            <w:tcW w:type="dxa" w:w="2880"/>
+          </w:tcPr>
+          <w:p>
+            <w:pPr>
+              <w:spacing w:line="240" w:lineRule="auto"/>
+            </w:pPr>
+            <w:r>
+              <w:rPr>
+                <w:rFonts w:ascii="Times New Roman" w:hAnsi="Times New Roman" w:eastAsia="Times New Roman"/>
+                <w:b/>
+                <w:caps w:val="0"/>
+                <w:sz w:val="22"/>
+              </w:rPr>
+              <w:t>Numri</w:t>
+            </w:r>
+          </w:p>
+        </w:tc>
+        <w:tc>
+          <w:tcPr>
+            <w:tcW w:type="dxa" w:w="2880"/>
+          </w:tcPr>
+          <w:p>
+            <w:pPr>
+              <w:spacing w:line="240" w:lineRule="auto"/>
+            </w:pPr>
+            <w:r>
+              <w:rPr>
+                <w:rFonts w:ascii="Times New Roman" w:hAnsi="Times New Roman" w:eastAsia="Times New Roman"/>
+                <w:b/>
+                <w:caps w:val="0"/>
+                <w:sz w:val="22"/>
+              </w:rPr>
+              <w:t>Pjesa e të aplikuarave</w:t>
+            </w:r>
+          </w:p>
+        </w:tc>
+      </w:tr>
+      <w:tr>
+        <w:tc>
+          <w:tcPr>
+            <w:tcW w:type="dxa" w:w="2880"/>
+          </w:tcPr>
+          <w:p>
+            <w:pPr>
+              <w:spacing w:line="240" w:lineRule="auto"/>
+            </w:pPr>
+            <w:r>
+              <w:rPr>
+                <w:rFonts w:ascii="Times New Roman" w:hAnsi="Times New Roman" w:eastAsia="Times New Roman"/>
+                <w:b w:val="0"/>
+                <w:caps w:val="0"/>
+                <w:sz w:val="22"/>
+              </w:rPr>
+              <w:t>era u hoq</w:t>
+            </w:r>
+          </w:p>
+        </w:tc>
+        <w:tc>
+          <w:tcPr>
+            <w:tcW w:type="dxa" w:w="2880"/>
+          </w:tcPr>
+          <w:p>
+            <w:pPr>
+              <w:spacing w:line="240" w:lineRule="auto"/>
+            </w:pPr>
+            <w:r>
+              <w:rPr>
+                <w:rFonts w:ascii="Times New Roman" w:hAnsi="Times New Roman" w:eastAsia="Times New Roman"/>
+                <w:b w:val="0"/>
+                <w:caps w:val="0"/>
+                <w:sz w:val="22"/>
+              </w:rPr>
+              <w:t>2341</w:t>
+            </w:r>
+          </w:p>
+        </w:tc>
+        <w:tc>
+          <w:tcPr>
+            <w:tcW w:type="dxa" w:w="2880"/>
+          </w:tcPr>
+          <w:p>
+            <w:pPr>
+              <w:spacing w:line="240" w:lineRule="auto"/>
+            </w:pPr>
+            <w:r>
+              <w:rPr>
+                <w:rFonts w:ascii="Times New Roman" w:hAnsi="Times New Roman" w:eastAsia="Times New Roman"/>
+                <w:b w:val="0"/>
+                <w:caps w:val="0"/>
+                <w:sz w:val="22"/>
+              </w:rPr>
+              <w:t>64.4%</w:t>
+            </w:r>
+          </w:p>
+        </w:tc>
+      </w:tr>
+      <w:tr>
+        <w:tc>
+          <w:tcPr>
+            <w:tcW w:type="dxa" w:w="2880"/>
+          </w:tcPr>
+          <w:p>
+            <w:pPr>
+              <w:spacing w:line="240" w:lineRule="auto"/>
+            </w:pPr>
+            <w:r>
+              <w:rPr>
+                <w:rFonts w:ascii="Times New Roman" w:hAnsi="Times New Roman" w:eastAsia="Times New Roman"/>
+                <w:b w:val="0"/>
+                <w:caps w:val="0"/>
+                <w:sz w:val="22"/>
+              </w:rPr>
+              <w:t>era mbeti</w:t>
+            </w:r>
+          </w:p>
+        </w:tc>
+        <w:tc>
+          <w:tcPr>
+            <w:tcW w:type="dxa" w:w="2880"/>
+          </w:tcPr>
+          <w:p>
+            <w:pPr>
+              <w:spacing w:line="240" w:lineRule="auto"/>
+            </w:pPr>
+            <w:r>
+              <w:rPr>
+                <w:rFonts w:ascii="Times New Roman" w:hAnsi="Times New Roman" w:eastAsia="Times New Roman"/>
+                <w:b w:val="0"/>
+                <w:caps w:val="0"/>
+                <w:sz w:val="22"/>
+              </w:rPr>
+              <w:t>825</w:t>
+            </w:r>
+          </w:p>
+        </w:tc>
+        <w:tc>
+          <w:tcPr>
+            <w:tcW w:type="dxa" w:w="2880"/>
+          </w:tcPr>
+          <w:p>
+            <w:pPr>
+              <w:spacing w:line="240" w:lineRule="auto"/>
+            </w:pPr>
+            <w:r>
+              <w:rPr>
+                <w:rFonts w:ascii="Times New Roman" w:hAnsi="Times New Roman" w:eastAsia="Times New Roman"/>
+                <w:b w:val="0"/>
+                <w:caps w:val="0"/>
+                <w:sz w:val="22"/>
+              </w:rPr>
+              <w:t>22.7%</w:t>
+            </w:r>
+          </w:p>
+        </w:tc>
+      </w:tr>
+      <w:tr>
+        <w:tc>
+          <w:tcPr>
+            <w:tcW w:type="dxa" w:w="2880"/>
+          </w:tcPr>
+          <w:p>
+            <w:pPr>
+              <w:spacing w:line="240" w:lineRule="auto"/>
+            </w:pPr>
+            <w:r>
+              <w:rPr>
+                <w:rFonts w:ascii="Times New Roman" w:hAnsi="Times New Roman" w:eastAsia="Times New Roman"/>
+                <w:b w:val="0"/>
+                <w:caps w:val="0"/>
+                <w:sz w:val="22"/>
+              </w:rPr>
+              <w:t>entiteti nuk u identifikua dot</w:t>
+            </w:r>
+          </w:p>
+        </w:tc>
+        <w:tc>
+          <w:tcPr>
+            <w:tcW w:type="dxa" w:w="2880"/>
+          </w:tcPr>
+          <w:p>
+            <w:pPr>
+              <w:spacing w:line="240" w:lineRule="auto"/>
+            </w:pPr>
+            <w:r>
+              <w:rPr>
+                <w:rFonts w:ascii="Times New Roman" w:hAnsi="Times New Roman" w:eastAsia="Times New Roman"/>
+                <w:b w:val="0"/>
+                <w:caps w:val="0"/>
+                <w:sz w:val="22"/>
+              </w:rPr>
+              <w:t>467</w:t>
+            </w:r>
+          </w:p>
+        </w:tc>
+        <w:tc>
+          <w:tcPr>
+            <w:tcW w:type="dxa" w:w="2880"/>
+          </w:tcPr>
+          <w:p>
+            <w:pPr>
+              <w:spacing w:line="240" w:lineRule="auto"/>
+            </w:pPr>
+            <w:r>
+              <w:rPr>
+                <w:rFonts w:ascii="Times New Roman" w:hAnsi="Times New Roman" w:eastAsia="Times New Roman"/>
+                <w:b w:val="0"/>
+                <w:caps w:val="0"/>
+                <w:sz w:val="22"/>
+              </w:rPr>
+              <w:t>12.9%</w:t>
+            </w:r>
+          </w:p>
+        </w:tc>
+      </w:tr>
+    </w:tbl>
+    <w:p>
+      <w:pPr>
+        <w:spacing w:line="240" w:lineRule="auto" w:after="0"/>
+      </w:pPr>
+    </w:p>
+    <w:p>
+      <w:pPr>
+        <w:spacing w:line="360" w:lineRule="auto"/>
+        <w:ind w:firstLine="360"/>
+        <w:jc w:val="both"/>
+      </w:pPr>
+      <w:r>
+        <w:rPr>
+          <w:rFonts w:ascii="Times New Roman" w:hAnsi="Times New Roman" w:eastAsia="Times New Roman"/>
+          <w:b w:val="0"/>
+          <w:caps w:val="0"/>
+          <w:sz w:val="24"/>
+        </w:rPr>
+        <w:t>Në 22.7% të rasteve era mbetet pas një rishkrimi krejtësisht të saktë. Kjo nuk është defekt i zbatimit por pasojë e vetë transformimeve, dhe rrjedh drejtpërdrejt nga përkufizimet e metrikave.</w:t>
+      </w:r>
+    </w:p>
+    <w:p>
+      <w:pPr>
+        <w:spacing w:line="360" w:lineRule="auto"/>
+        <w:ind w:firstLine="360"/>
+        <w:jc w:val="both"/>
+      </w:pPr>
+      <w:r>
+        <w:rPr>
+          <w:rFonts w:ascii="Times New Roman" w:hAnsi="Times New Roman" w:eastAsia="Times New Roman"/>
+          <w:b w:val="0"/>
+          <w:caps w:val="0"/>
+          <w:sz w:val="24"/>
+        </w:rPr>
+        <w:t>Guard Clauses heq saktësisht një nivel ndërfutjeje, ndërsa Deep Nesting ndez mbi tre: një metodë e ndërfutur katër nivele shërohet, një e ndërfutur gjashtë mbetet mbi kufirin. Extract Method e shkurton metodën duke nxjerrë bllokun më të madh, pa asnjë garanci se e kalon prapa pragun. Vetëm Introduce Parameter Object e zgjidh erën me ndërtim, sepse lista e parametrave bëhet një.</w:t>
+      </w:r>
+    </w:p>
+    <w:p>
+      <w:pPr>
+        <w:spacing w:line="360" w:lineRule="auto"/>
+        <w:ind w:firstLine="360"/>
+        <w:jc w:val="both"/>
+      </w:pPr>
+      <w:r>
+        <w:rPr>
+          <w:rFonts w:ascii="Times New Roman" w:hAnsi="Times New Roman" w:eastAsia="Times New Roman"/>
+          <w:b w:val="0"/>
+          <w:caps w:val="0"/>
+          <w:sz w:val="24"/>
+        </w:rPr>
+        <w:t>Të thuash vetëm nëse era mbeti do të thoshte t'i lexoje njësoj një rishkrim që nuk ndryshoi asgjë dhe një që e përgjysmoi metodën. Prandaj raportohet edhe sa lëvizi matja mbi të cilën ndez detektori, si mesore mbi vendet e aplikuara.</w:t>
+      </w:r>
+    </w:p>
+    <w:p>
+      <w:pPr>
+        <w:spacing w:line="240" w:lineRule="auto"/>
+        <w:jc w:val="center"/>
+      </w:pPr>
+      <w:r>
+        <w:rPr>
+          <w:rFonts w:ascii="Times New Roman" w:hAnsi="Times New Roman" w:eastAsia="Times New Roman"/>
+          <w:b w:val="0"/>
+          <w:caps w:val="0"/>
+          <w:sz w:val="22"/>
+        </w:rPr>
+        <w:t>Tabela 11. Sa lëvizi matja pas rishkrimit</w:t>
+      </w:r>
+    </w:p>
+    <w:tbl>
+      <w:tblPr>
+        <w:tblStyle w:val="TableGrid"/>
+        <w:tblW w:type="auto" w:w="0"/>
+        <w:tblLook w:firstColumn="1" w:firstRow="1" w:lastColumn="0" w:lastRow="0" w:noHBand="0" w:noVBand="1" w:val="04A0"/>
+      </w:tblPr>
+      <w:tblGrid>
+        <w:gridCol w:w="2160"/>
+        <w:gridCol w:w="2160"/>
+        <w:gridCol w:w="2160"/>
+        <w:gridCol w:w="2160"/>
+      </w:tblGrid>
+      <w:tr>
+        <w:tc>
+          <w:tcPr>
+            <w:tcW w:type="dxa" w:w="2160"/>
+          </w:tcPr>
+          <w:p>
+            <w:pPr>
+              <w:spacing w:line="240" w:lineRule="auto"/>
+            </w:pPr>
+            <w:r>
+              <w:rPr>
+                <w:rFonts w:ascii="Times New Roman" w:hAnsi="Times New Roman" w:eastAsia="Times New Roman"/>
+                <w:b/>
+                <w:caps w:val="0"/>
+                <w:sz w:val="22"/>
+              </w:rPr>
+              <w:t>Erë</w:t>
+            </w:r>
+          </w:p>
+        </w:tc>
+        <w:tc>
+          <w:tcPr>
+            <w:tcW w:type="dxa" w:w="2160"/>
+          </w:tcPr>
+          <w:p>
+            <w:pPr>
+              <w:spacing w:line="240" w:lineRule="auto"/>
+            </w:pPr>
+            <w:r>
+              <w:rPr>
+                <w:rFonts w:ascii="Times New Roman" w:hAnsi="Times New Roman" w:eastAsia="Times New Roman"/>
+                <w:b/>
+                <w:caps w:val="0"/>
+                <w:sz w:val="22"/>
+              </w:rPr>
+              <w:t>Para</w:t>
+            </w:r>
+          </w:p>
+        </w:tc>
+        <w:tc>
+          <w:tcPr>
+            <w:tcW w:type="dxa" w:w="2160"/>
+          </w:tcPr>
+          <w:p>
+            <w:pPr>
+              <w:spacing w:line="240" w:lineRule="auto"/>
+            </w:pPr>
+            <w:r>
+              <w:rPr>
+                <w:rFonts w:ascii="Times New Roman" w:hAnsi="Times New Roman" w:eastAsia="Times New Roman"/>
+                <w:b/>
+                <w:caps w:val="0"/>
+                <w:sz w:val="22"/>
+              </w:rPr>
+              <w:t>Pas</w:t>
+            </w:r>
+          </w:p>
+        </w:tc>
+        <w:tc>
+          <w:tcPr>
+            <w:tcW w:type="dxa" w:w="2160"/>
+          </w:tcPr>
+          <w:p>
+            <w:pPr>
+              <w:spacing w:line="240" w:lineRule="auto"/>
+            </w:pPr>
+            <w:r>
+              <w:rPr>
+                <w:rFonts w:ascii="Times New Roman" w:hAnsi="Times New Roman" w:eastAsia="Times New Roman"/>
+                <w:b/>
+                <w:caps w:val="0"/>
+                <w:sz w:val="22"/>
+              </w:rPr>
+              <w:t>Vende</w:t>
+            </w:r>
+          </w:p>
+        </w:tc>
+      </w:tr>
+      <w:tr>
+        <w:tc>
+          <w:tcPr>
+            <w:tcW w:type="dxa" w:w="2160"/>
+          </w:tcPr>
+          <w:p>
+            <w:pPr>
+              <w:spacing w:line="240" w:lineRule="auto"/>
+            </w:pPr>
+            <w:r>
+              <w:rPr>
+                <w:rFonts w:ascii="Times New Roman" w:hAnsi="Times New Roman" w:eastAsia="Times New Roman"/>
+                <w:b w:val="0"/>
+                <w:caps w:val="0"/>
+                <w:sz w:val="22"/>
+              </w:rPr>
+              <w:t>BrainMethod</w:t>
+            </w:r>
+          </w:p>
+        </w:tc>
+        <w:tc>
+          <w:tcPr>
+            <w:tcW w:type="dxa" w:w="2160"/>
+          </w:tcPr>
+          <w:p>
+            <w:pPr>
+              <w:spacing w:line="240" w:lineRule="auto"/>
+            </w:pPr>
+            <w:r>
+              <w:rPr>
+                <w:rFonts w:ascii="Times New Roman" w:hAnsi="Times New Roman" w:eastAsia="Times New Roman"/>
+                <w:b w:val="0"/>
+                <w:caps w:val="0"/>
+                <w:sz w:val="22"/>
+              </w:rPr>
+              <w:t>56</w:t>
+            </w:r>
+          </w:p>
+        </w:tc>
+        <w:tc>
+          <w:tcPr>
+            <w:tcW w:type="dxa" w:w="2160"/>
+          </w:tcPr>
+          <w:p>
+            <w:pPr>
+              <w:spacing w:line="240" w:lineRule="auto"/>
+            </w:pPr>
+            <w:r>
+              <w:rPr>
+                <w:rFonts w:ascii="Times New Roman" w:hAnsi="Times New Roman" w:eastAsia="Times New Roman"/>
+                <w:b w:val="0"/>
+                <w:caps w:val="0"/>
+                <w:sz w:val="22"/>
+              </w:rPr>
+              <w:t>19</w:t>
+            </w:r>
+          </w:p>
+        </w:tc>
+        <w:tc>
+          <w:tcPr>
+            <w:tcW w:type="dxa" w:w="2160"/>
+          </w:tcPr>
+          <w:p>
+            <w:pPr>
+              <w:spacing w:line="240" w:lineRule="auto"/>
+            </w:pPr>
+            <w:r>
+              <w:rPr>
+                <w:rFonts w:ascii="Times New Roman" w:hAnsi="Times New Roman" w:eastAsia="Times New Roman"/>
+                <w:b w:val="0"/>
+                <w:caps w:val="0"/>
+                <w:sz w:val="22"/>
+              </w:rPr>
+              <w:t>819</w:t>
+            </w:r>
+          </w:p>
+        </w:tc>
+      </w:tr>
+      <w:tr>
+        <w:tc>
+          <w:tcPr>
+            <w:tcW w:type="dxa" w:w="2160"/>
+          </w:tcPr>
+          <w:p>
+            <w:pPr>
+              <w:spacing w:line="240" w:lineRule="auto"/>
+            </w:pPr>
+            <w:r>
+              <w:rPr>
+                <w:rFonts w:ascii="Times New Roman" w:hAnsi="Times New Roman" w:eastAsia="Times New Roman"/>
+                <w:b w:val="0"/>
+                <w:caps w:val="0"/>
+                <w:sz w:val="22"/>
+              </w:rPr>
+              <w:t>DeepNesting</w:t>
+            </w:r>
+          </w:p>
+        </w:tc>
+        <w:tc>
+          <w:tcPr>
+            <w:tcW w:type="dxa" w:w="2160"/>
+          </w:tcPr>
+          <w:p>
+            <w:pPr>
+              <w:spacing w:line="240" w:lineRule="auto"/>
+            </w:pPr>
+            <w:r>
+              <w:rPr>
+                <w:rFonts w:ascii="Times New Roman" w:hAnsi="Times New Roman" w:eastAsia="Times New Roman"/>
+                <w:b w:val="0"/>
+                <w:caps w:val="0"/>
+                <w:sz w:val="22"/>
+              </w:rPr>
+              <w:t>4</w:t>
+            </w:r>
+          </w:p>
+        </w:tc>
+        <w:tc>
+          <w:tcPr>
+            <w:tcW w:type="dxa" w:w="2160"/>
+          </w:tcPr>
+          <w:p>
+            <w:pPr>
+              <w:spacing w:line="240" w:lineRule="auto"/>
+            </w:pPr>
+            <w:r>
+              <w:rPr>
+                <w:rFonts w:ascii="Times New Roman" w:hAnsi="Times New Roman" w:eastAsia="Times New Roman"/>
+                <w:b w:val="0"/>
+                <w:caps w:val="0"/>
+                <w:sz w:val="22"/>
+              </w:rPr>
+              <w:t>3</w:t>
+            </w:r>
+          </w:p>
+        </w:tc>
+        <w:tc>
+          <w:tcPr>
+            <w:tcW w:type="dxa" w:w="2160"/>
+          </w:tcPr>
+          <w:p>
+            <w:pPr>
+              <w:spacing w:line="240" w:lineRule="auto"/>
+            </w:pPr>
+            <w:r>
+              <w:rPr>
+                <w:rFonts w:ascii="Times New Roman" w:hAnsi="Times New Roman" w:eastAsia="Times New Roman"/>
+                <w:b w:val="0"/>
+                <w:caps w:val="0"/>
+                <w:sz w:val="22"/>
+              </w:rPr>
+              <w:t>100</w:t>
+            </w:r>
+          </w:p>
+        </w:tc>
+      </w:tr>
+      <w:tr>
+        <w:tc>
+          <w:tcPr>
+            <w:tcW w:type="dxa" w:w="2160"/>
+          </w:tcPr>
+          <w:p>
+            <w:pPr>
+              <w:spacing w:line="240" w:lineRule="auto"/>
+            </w:pPr>
+            <w:r>
+              <w:rPr>
+                <w:rFonts w:ascii="Times New Roman" w:hAnsi="Times New Roman" w:eastAsia="Times New Roman"/>
+                <w:b w:val="0"/>
+                <w:caps w:val="0"/>
+                <w:sz w:val="22"/>
+              </w:rPr>
+              <w:t>LongMethod</w:t>
+            </w:r>
+          </w:p>
+        </w:tc>
+        <w:tc>
+          <w:tcPr>
+            <w:tcW w:type="dxa" w:w="2160"/>
+          </w:tcPr>
+          <w:p>
+            <w:pPr>
+              <w:spacing w:line="240" w:lineRule="auto"/>
+            </w:pPr>
+            <w:r>
+              <w:rPr>
+                <w:rFonts w:ascii="Times New Roman" w:hAnsi="Times New Roman" w:eastAsia="Times New Roman"/>
+                <w:b w:val="0"/>
+                <w:caps w:val="0"/>
+                <w:sz w:val="22"/>
+              </w:rPr>
+              <w:t>45</w:t>
+            </w:r>
+          </w:p>
+        </w:tc>
+        <w:tc>
+          <w:tcPr>
+            <w:tcW w:type="dxa" w:w="2160"/>
+          </w:tcPr>
+          <w:p>
+            <w:pPr>
+              <w:spacing w:line="240" w:lineRule="auto"/>
+            </w:pPr>
+            <w:r>
+              <w:rPr>
+                <w:rFonts w:ascii="Times New Roman" w:hAnsi="Times New Roman" w:eastAsia="Times New Roman"/>
+                <w:b w:val="0"/>
+                <w:caps w:val="0"/>
+                <w:sz w:val="22"/>
+              </w:rPr>
+              <w:t>21</w:t>
+            </w:r>
+          </w:p>
+        </w:tc>
+        <w:tc>
+          <w:tcPr>
+            <w:tcW w:type="dxa" w:w="2160"/>
+          </w:tcPr>
+          <w:p>
+            <w:pPr>
+              <w:spacing w:line="240" w:lineRule="auto"/>
+            </w:pPr>
+            <w:r>
+              <w:rPr>
+                <w:rFonts w:ascii="Times New Roman" w:hAnsi="Times New Roman" w:eastAsia="Times New Roman"/>
+                <w:b w:val="0"/>
+                <w:caps w:val="0"/>
+                <w:sz w:val="22"/>
+              </w:rPr>
+              <w:t>2092</w:t>
+            </w:r>
+          </w:p>
+        </w:tc>
+      </w:tr>
+      <w:tr>
+        <w:tc>
+          <w:tcPr>
+            <w:tcW w:type="dxa" w:w="2160"/>
+          </w:tcPr>
+          <w:p>
+            <w:pPr>
+              <w:spacing w:line="240" w:lineRule="auto"/>
+            </w:pPr>
+            <w:r>
+              <w:rPr>
+                <w:rFonts w:ascii="Times New Roman" w:hAnsi="Times New Roman" w:eastAsia="Times New Roman"/>
+                <w:b w:val="0"/>
+                <w:caps w:val="0"/>
+                <w:sz w:val="22"/>
+              </w:rPr>
+              <w:t>LongParameterList</w:t>
+            </w:r>
+          </w:p>
+        </w:tc>
+        <w:tc>
+          <w:tcPr>
+            <w:tcW w:type="dxa" w:w="2160"/>
+          </w:tcPr>
+          <w:p>
+            <w:pPr>
+              <w:spacing w:line="240" w:lineRule="auto"/>
+            </w:pPr>
+            <w:r>
+              <w:rPr>
+                <w:rFonts w:ascii="Times New Roman" w:hAnsi="Times New Roman" w:eastAsia="Times New Roman"/>
+                <w:b w:val="0"/>
+                <w:caps w:val="0"/>
+                <w:sz w:val="22"/>
+              </w:rPr>
+              <w:t>7</w:t>
+            </w:r>
+          </w:p>
+        </w:tc>
+        <w:tc>
+          <w:tcPr>
+            <w:tcW w:type="dxa" w:w="2160"/>
+          </w:tcPr>
+          <w:p>
+            <w:pPr>
+              <w:spacing w:line="240" w:lineRule="auto"/>
+            </w:pPr>
+            <w:r>
+              <w:rPr>
+                <w:rFonts w:ascii="Times New Roman" w:hAnsi="Times New Roman" w:eastAsia="Times New Roman"/>
+                <w:b w:val="0"/>
+                <w:caps w:val="0"/>
+                <w:sz w:val="22"/>
+              </w:rPr>
+              <w:t>1</w:t>
+            </w:r>
+          </w:p>
+        </w:tc>
+        <w:tc>
+          <w:tcPr>
+            <w:tcW w:type="dxa" w:w="2160"/>
+          </w:tcPr>
+          <w:p>
+            <w:pPr>
+              <w:spacing w:line="240" w:lineRule="auto"/>
+            </w:pPr>
+            <w:r>
+              <w:rPr>
+                <w:rFonts w:ascii="Times New Roman" w:hAnsi="Times New Roman" w:eastAsia="Times New Roman"/>
+                <w:b w:val="0"/>
+                <w:caps w:val="0"/>
+                <w:sz w:val="22"/>
+              </w:rPr>
+              <w:t>155</w:t>
+            </w:r>
+          </w:p>
+        </w:tc>
+      </w:tr>
+    </w:tbl>
+    <w:p>
+      <w:pPr>
+        <w:spacing w:line="240" w:lineRule="auto" w:after="0"/>
+      </w:pPr>
+    </w:p>
+    <w:p>
+      <w:pPr>
+        <w:spacing w:line="360" w:lineRule="auto"/>
+        <w:ind w:firstLine="360"/>
+        <w:jc w:val="both"/>
+      </w:pPr>
+      <w:r>
+        <w:rPr>
+          <w:rFonts w:ascii="Times New Roman" w:hAnsi="Times New Roman" w:eastAsia="Times New Roman"/>
+          <w:b w:val="0"/>
+          <w:caps w:val="0"/>
+          <w:sz w:val="24"/>
+        </w:rPr>
+        <w:t>Lëvizja është e madhe atje ku transformimi ka hapësirë të veprojë dhe e vogël atje ku nuk ka: Guard Clauses heq një nivel të vetëm, dhe mesorja e tregon pikërisht atë. Pra edhe kur era mbetet, kodi nuk mbetet i pandryshuar.</w:t>
+      </w:r>
+    </w:p>
+    <w:p>
+      <w:pPr>
+        <w:spacing w:line="360" w:lineRule="auto"/>
+        <w:ind w:firstLine="360"/>
+        <w:jc w:val="both"/>
+      </w:pPr>
+      <w:r>
+        <w:rPr>
+          <w:rFonts w:ascii="Times New Roman" w:hAnsi="Times New Roman" w:eastAsia="Times New Roman"/>
+          <w:b w:val="0"/>
+          <w:caps w:val="0"/>
+          <w:sz w:val="24"/>
+        </w:rPr>
+        <w:t>Mbetet pyetja e fundit dhe më e pakëndshmja: a solli rishkrimi një erë që nuk ishte aty? Klasa u mat e tëra para dhe pas, sepse Extract Method krijon një metodë të re, dhe kod i ri është kod që askush nuk e ka matur ende. Përgjigjja është po, 937 herë: BrainMethod (63), DeepNesting (146), FeatureEnvy (134), GodClass (47), LargeClass (8), LongMethod (167), LongParameterList (372).</w:t>
+      </w:r>
+    </w:p>
+    <w:p>
+      <w:pPr>
+        <w:spacing w:line="360" w:lineRule="auto"/>
+        <w:ind w:firstLine="360"/>
+        <w:jc w:val="both"/>
+      </w:pPr>
+      <w:r>
+        <w:rPr>
+          <w:rFonts w:ascii="Times New Roman" w:hAnsi="Times New Roman" w:eastAsia="Times New Roman"/>
+          <w:b w:val="0"/>
+          <w:caps w:val="0"/>
+          <w:sz w:val="24"/>
+        </w:rPr>
+        <w:t>Shumica janë Long Parameter List, dhe shkaku është i drejtpërdrejtë: Extract Method ia kalon metodës së nxjerrë çdo vlerë që blloku lexonte, ndaj një bllok me gjashtë hyrje prodhon një metodë me gjashtë parametra — një mbi pragun. Transformimi është i saktë dhe kompilon; thjesht e zhvendos problemin.</w:t>
+      </w:r>
+    </w:p>
+    <w:p>
+      <w:pPr>
+        <w:spacing w:line="360" w:lineRule="auto"/>
+        <w:ind w:firstLine="360"/>
+        <w:jc w:val="both"/>
+      </w:pPr>
+      <w:r>
+        <w:rPr>
+          <w:rFonts w:ascii="Times New Roman" w:hAnsi="Times New Roman" w:eastAsia="Times New Roman"/>
+          <w:b w:val="0"/>
+          <w:caps w:val="0"/>
+          <w:sz w:val="24"/>
+        </w:rPr>
+        <w:t>Kjo është e njëjta formë me paradoksin e Encapsulate Field-it të Nënkapitullit 6.2: një refaktorim i rekomanduar gjerësisht që, i matur me vetë metrikat mbi të cilat ndërtohet detektimi, nuk përmirëson domosdo atë që mat detektori. Motori nuk e fsheh: numri raportohet krahas atyre të shëruara.</w:t>
+      </w:r>
+    </w:p>
+    <w:p>
+      <w:pPr>
+        <w:spacing w:line="360" w:lineRule="auto"/>
+        <w:ind w:firstLine="360"/>
+        <w:jc w:val="both"/>
+      </w:pPr>
+      <w:r>
+        <w:rPr>
+          <w:rFonts w:ascii="Times New Roman" w:hAnsi="Times New Roman" w:eastAsia="Times New Roman"/>
+          <w:b w:val="0"/>
+          <w:caps w:val="0"/>
+          <w:sz w:val="24"/>
+        </w:rPr>
+        <w:t>Pasoja praktike është se numri i vendeve të transformuara nuk duhet lexuar si numri i erërave të hequra. Të tria matjet duhen lexuar bashkë: sa raste u shëruan, sa lëvizi matja te ato që nuk u shëruan, dhe sa herë rishkrimi solli një problem të ri.</w:t>
       </w:r>
     </w:p>
     <w:p>
@@ -8409,7 +9453,7 @@
           <w:caps w:val="0"/>
           <w:sz w:val="22"/>
         </w:rPr>
-        <w:t>Tabela 10. Sa lëviz MCC-ja kur zhvendoset një prag</w:t>
+        <w:t>Tabela 12. Sa lëviz MCC-ja kur zhvendoset një prag</w:t>
       </w:r>
     </w:p>
     <w:tbl>
@@ -9644,7 +10688,7 @@
           <w:caps w:val="0"/>
           <w:sz w:val="22"/>
         </w:rPr>
-        <w:t>Tabela 11. Rregullat me pragje të kalibruara, të pikëzuara jashtë fold-it</w:t>
+        <w:t>Tabela 13. Rregullat me pragje të kalibruara, të pikëzuara jashtë fold-it</w:t>
       </w:r>
     </w:p>
     <w:tbl>
@@ -10353,7 +11397,7 @@
           <w:caps w:val="0"/>
           <w:sz w:val="22"/>
         </w:rPr>
-        <w:t>Tabela 12. Pajtimi i ashpërsisë me rishikuesit</w:t>
+        <w:t>Tabela 14. Pajtimi i ashpërsisë me rishikuesit</w:t>
       </w:r>
     </w:p>
     <w:tbl>
@@ -11133,7 +12177,7 @@
           <w:caps w:val="0"/>
           <w:sz w:val="22"/>
         </w:rPr>
-        <w:t>Tabela 13. Intervale besimi 95% për MCC-në</w:t>
+        <w:t>Tabela 15. Intervale besimi 95% për MCC-në</w:t>
       </w:r>
     </w:p>
     <w:tbl>
@@ -11738,7 +12782,7 @@
           <w:caps w:val="0"/>
           <w:sz w:val="22"/>
         </w:rPr>
-        <w:t>Tabela 14. B − A kur rregullat marrin pragun e tyre më të mirë</w:t>
+        <w:t>Tabela 16. B − A kur rregullat marrin pragun e tyre më të mirë</w:t>
       </w:r>
     </w:p>
     <w:tbl>
@@ -12289,7 +13333,7 @@
           <w:caps w:val="0"/>
           <w:sz w:val="22"/>
         </w:rPr>
-        <w:t>Tabela 15. Sa pajtohen rishikuesit me njëri-tjetrin</w:t>
+        <w:t>Tabela 17. Sa pajtohen rishikuesit me njëri-tjetrin</w:t>
       </w:r>
     </w:p>
     <w:tbl>
@@ -13761,7 +14805,7 @@
           <w:caps w:val="0"/>
           <w:sz w:val="22"/>
         </w:rPr>
-        <w:t>Tabela 16. Strategjitë e detektimit dhe burimet e tyre</w:t>
+        <w:t>Tabela 18. Strategjitë e detektimit dhe burimet e tyre</w:t>
       </w:r>
     </w:p>
     <w:tbl>
@@ -14542,7 +15586,7 @@
           <w:caps w:val="0"/>
           <w:sz w:val="22"/>
         </w:rPr>
-        <w:t>Tabela 17. Kuantifikuesit e përgjithshëm</w:t>
+        <w:t>Tabela 19. Kuantifikuesit e përgjithshëm</w:t>
       </w:r>
     </w:p>
     <w:tbl>
@@ -14989,7 +16033,7 @@
           <w:caps w:val="0"/>
           <w:sz w:val="22"/>
         </w:rPr>
-        <w:t>Tabela 18. Pragjet e përdorura</w:t>
+        <w:t>Tabela 20. Pragjet e përdorura</w:t>
       </w:r>
     </w:p>
     <w:tbl>
@@ -16010,7 +17054,7 @@
           <w:caps w:val="0"/>
           <w:sz w:val="22"/>
         </w:rPr>
-        <w:t>Tabela 19. Metrikat sipas nivelit</w:t>
+        <w:t>Tabela 21. Metrikat sipas nivelit</w:t>
       </w:r>
     </w:p>
     <w:tbl>
@@ -16191,7 +17235,7 @@
           <w:caps w:val="0"/>
           <w:sz w:val="22"/>
         </w:rPr>
-        <w:t>Tabela 20. Çka propozohet dhe çka aplikohet</w:t>
+        <w:t>Tabela 22. Çka propozohet dhe çka aplikohet</w:t>
       </w:r>
     </w:p>
     <w:tbl>
@@ -16770,7 +17814,7 @@
           <w:caps w:val="0"/>
           <w:sz w:val="22"/>
         </w:rPr>
-        <w:t>Tabela 21. Arsyet e refuzimit</w:t>
+        <w:t>Tabela 23. Arsyet e refuzimit</w:t>
       </w:r>
     </w:p>
     <w:tbl>
@@ -17231,7 +18275,7 @@
           <w:caps w:val="0"/>
           <w:sz w:val="22"/>
         </w:rPr>
-        <w:t>Tabela 22. Radha e ekzekutimit</w:t>
+        <w:t>Tabela 24. Radha e ekzekutimit</w:t>
       </w:r>
     </w:p>
     <w:tbl>

</xml_diff>

<commit_message>
Raporto refuzimet sipas ashpersise ne Kapitullin 5.4
</commit_message>
<xml_diff>
--- a/docs/thesis/Punim_Diplome_Florent_Latifi.docx
+++ b/docs/thesis/Punim_Diplome_Florent_Latifi.docx
@@ -1035,7 +1035,7 @@
           <w:caps w:val="0"/>
           <w:sz w:val="24"/>
         </w:rPr>
-        <w:t>Tabela 12. Sa lëviz MCC-ja kur zhvendoset një prag</w:t>
+        <w:t>Tabela 12. Norma e transformimit sipas erës dhe ashpërsisë</w:t>
       </w:r>
     </w:p>
     <w:p>
@@ -1051,7 +1051,7 @@
           <w:caps w:val="0"/>
           <w:sz w:val="24"/>
         </w:rPr>
-        <w:t>Tabela 13. Rregullat me pragje të kalibruara, të pikëzuara jashtë fold-it</w:t>
+        <w:t>Tabela 13. Përbërja e arsyeve të refuzimit brenda çdo niveli</w:t>
       </w:r>
     </w:p>
     <w:p>
@@ -1067,7 +1067,7 @@
           <w:caps w:val="0"/>
           <w:sz w:val="24"/>
         </w:rPr>
-        <w:t>Tabela 14. Pajtimi i ashpërsisë me rishikuesit</w:t>
+        <w:t>Tabela 14. Sa lëviz MCC-ja kur zhvendoset një prag</w:t>
       </w:r>
     </w:p>
     <w:p>
@@ -1083,7 +1083,7 @@
           <w:caps w:val="0"/>
           <w:sz w:val="24"/>
         </w:rPr>
-        <w:t>Tabela 15. Intervale besimi 95% për MCC-në</w:t>
+        <w:t>Tabela 15. Rregullat me pragje të kalibruara, të pikëzuara jashtë fold-it</w:t>
       </w:r>
     </w:p>
     <w:p>
@@ -1099,7 +1099,7 @@
           <w:caps w:val="0"/>
           <w:sz w:val="24"/>
         </w:rPr>
-        <w:t>Tabela 16. B − A kur rregullat marrin pragun e tyre më të mirë</w:t>
+        <w:t>Tabela 16. Pajtimi i ashpërsisë me rishikuesit</w:t>
       </w:r>
     </w:p>
     <w:p>
@@ -1115,7 +1115,7 @@
           <w:caps w:val="0"/>
           <w:sz w:val="24"/>
         </w:rPr>
-        <w:t>Tabela 17. Sa pajtohen rishikuesit me njëri-tjetrin</w:t>
+        <w:t>Tabela 17. Intervale besimi 95% për MCC-në</w:t>
       </w:r>
     </w:p>
     <w:p>
@@ -1131,7 +1131,7 @@
           <w:caps w:val="0"/>
           <w:sz w:val="24"/>
         </w:rPr>
-        <w:t>Tabela 18. Strategjitë e detektimit dhe burimet e tyre</w:t>
+        <w:t>Tabela 18. B − A kur rregullat marrin pragun e tyre më të mirë</w:t>
       </w:r>
     </w:p>
     <w:p>
@@ -1147,7 +1147,7 @@
           <w:caps w:val="0"/>
           <w:sz w:val="24"/>
         </w:rPr>
-        <w:t>Tabela 19. Kuantifikuesit e përgjithshëm</w:t>
+        <w:t>Tabela 19. Sa pajtohen rishikuesit me njëri-tjetrin</w:t>
       </w:r>
     </w:p>
     <w:p>
@@ -1163,7 +1163,7 @@
           <w:caps w:val="0"/>
           <w:sz w:val="24"/>
         </w:rPr>
-        <w:t>Tabela 20. Pragjet e përdorura</w:t>
+        <w:t>Tabela 20. Strategjitë e detektimit dhe burimet e tyre</w:t>
       </w:r>
     </w:p>
     <w:p>
@@ -1179,7 +1179,7 @@
           <w:caps w:val="0"/>
           <w:sz w:val="24"/>
         </w:rPr>
-        <w:t>Tabela 21. Metrikat sipas nivelit</w:t>
+        <w:t>Tabela 21. Kuantifikuesit e përgjithshëm</w:t>
       </w:r>
     </w:p>
     <w:p>
@@ -1195,7 +1195,7 @@
           <w:caps w:val="0"/>
           <w:sz w:val="24"/>
         </w:rPr>
-        <w:t>Tabela 22. Çka propozohet dhe çka aplikohet</w:t>
+        <w:t>Tabela 22. Pragjet e përdorura</w:t>
       </w:r>
     </w:p>
     <w:p>
@@ -1211,7 +1211,7 @@
           <w:caps w:val="0"/>
           <w:sz w:val="24"/>
         </w:rPr>
-        <w:t>Tabela 23. Arsyet e refuzimit</w:t>
+        <w:t>Tabela 23. Metrikat sipas nivelit</w:t>
       </w:r>
     </w:p>
     <w:p>
@@ -1227,7 +1227,39 @@
           <w:caps w:val="0"/>
           <w:sz w:val="24"/>
         </w:rPr>
-        <w:t>Tabela 24. Radha e ekzekutimit</w:t>
+        <w:t>Tabela 24. Çka propozohet dhe çka aplikohet</w:t>
+      </w:r>
+    </w:p>
+    <w:p>
+      <w:pPr>
+        <w:spacing w:line="360" w:lineRule="auto"/>
+        <w:ind w:firstLine="360"/>
+        <w:jc w:val="both"/>
+      </w:pPr>
+      <w:r>
+        <w:rPr>
+          <w:rFonts w:ascii="Times New Roman" w:hAnsi="Times New Roman" w:eastAsia="Times New Roman"/>
+          <w:b w:val="0"/>
+          <w:caps w:val="0"/>
+          <w:sz w:val="24"/>
+        </w:rPr>
+        <w:t>Tabela 25. Arsyet e refuzimit</w:t>
+      </w:r>
+    </w:p>
+    <w:p>
+      <w:pPr>
+        <w:spacing w:line="360" w:lineRule="auto"/>
+        <w:ind w:firstLine="360"/>
+        <w:jc w:val="both"/>
+      </w:pPr>
+      <w:r>
+        <w:rPr>
+          <w:rFonts w:ascii="Times New Roman" w:hAnsi="Times New Roman" w:eastAsia="Times New Roman"/>
+          <w:b w:val="0"/>
+          <w:caps w:val="0"/>
+          <w:sz w:val="24"/>
+        </w:rPr>
+        <w:t>Tabela 26. Radha e ekzekutimit</w:t>
       </w:r>
     </w:p>
     <w:p>
@@ -9392,6 +9424,1976 @@
           <w:caps w:val="0"/>
           <w:sz w:val="24"/>
         </w:rPr>
+        <w:t>Norma e përgjithshme nuk thotë cilat vende u refuzuan. Një mjet që rishkruan rastet e buta dhe tërhiqet nga ato të rënda vlen shumë më pak se sa sugjeron ajo shifër, ndaj çdo vend u nda edhe sipas ashpërsisë që i cakton vetë sistemi.</w:t>
+      </w:r>
+    </w:p>
+    <w:p>
+      <w:pPr>
+        <w:spacing w:line="240" w:lineRule="auto"/>
+        <w:jc w:val="center"/>
+      </w:pPr>
+      <w:r>
+        <w:rPr>
+          <w:rFonts w:ascii="Times New Roman" w:hAnsi="Times New Roman" w:eastAsia="Times New Roman"/>
+          <w:b w:val="0"/>
+          <w:caps w:val="0"/>
+          <w:sz w:val="22"/>
+        </w:rPr>
+        <w:t>Tabela 12. Norma e transformimit sipas erës dhe ashpërsisë</w:t>
+      </w:r>
+    </w:p>
+    <w:tbl>
+      <w:tblPr>
+        <w:tblStyle w:val="TableGrid"/>
+        <w:tblW w:type="auto" w:w="0"/>
+        <w:tblLook w:firstColumn="1" w:firstRow="1" w:lastColumn="0" w:lastRow="0" w:noHBand="0" w:noVBand="1" w:val="04A0"/>
+      </w:tblPr>
+      <w:tblGrid>
+        <w:gridCol w:w="1728"/>
+        <w:gridCol w:w="1728"/>
+        <w:gridCol w:w="1728"/>
+        <w:gridCol w:w="1728"/>
+        <w:gridCol w:w="1728"/>
+      </w:tblGrid>
+      <w:tr>
+        <w:tc>
+          <w:tcPr>
+            <w:tcW w:type="dxa" w:w="1728"/>
+          </w:tcPr>
+          <w:p>
+            <w:pPr>
+              <w:spacing w:line="240" w:lineRule="auto"/>
+            </w:pPr>
+            <w:r>
+              <w:rPr>
+                <w:rFonts w:ascii="Times New Roman" w:hAnsi="Times New Roman" w:eastAsia="Times New Roman"/>
+                <w:b/>
+                <w:caps w:val="0"/>
+                <w:sz w:val="22"/>
+              </w:rPr>
+              <w:t>Erë</w:t>
+            </w:r>
+          </w:p>
+        </w:tc>
+        <w:tc>
+          <w:tcPr>
+            <w:tcW w:type="dxa" w:w="1728"/>
+          </w:tcPr>
+          <w:p>
+            <w:pPr>
+              <w:spacing w:line="240" w:lineRule="auto"/>
+            </w:pPr>
+            <w:r>
+              <w:rPr>
+                <w:rFonts w:ascii="Times New Roman" w:hAnsi="Times New Roman" w:eastAsia="Times New Roman"/>
+                <w:b/>
+                <w:caps w:val="0"/>
+                <w:sz w:val="22"/>
+              </w:rPr>
+              <w:t>Ashpërsia</w:t>
+            </w:r>
+          </w:p>
+        </w:tc>
+        <w:tc>
+          <w:tcPr>
+            <w:tcW w:type="dxa" w:w="1728"/>
+          </w:tcPr>
+          <w:p>
+            <w:pPr>
+              <w:spacing w:line="240" w:lineRule="auto"/>
+            </w:pPr>
+            <w:r>
+              <w:rPr>
+                <w:rFonts w:ascii="Times New Roman" w:hAnsi="Times New Roman" w:eastAsia="Times New Roman"/>
+                <w:b/>
+                <w:caps w:val="0"/>
+                <w:sz w:val="22"/>
+              </w:rPr>
+              <w:t>Vende të gjykuara</w:t>
+            </w:r>
+          </w:p>
+        </w:tc>
+        <w:tc>
+          <w:tcPr>
+            <w:tcW w:type="dxa" w:w="1728"/>
+          </w:tcPr>
+          <w:p>
+            <w:pPr>
+              <w:spacing w:line="240" w:lineRule="auto"/>
+            </w:pPr>
+            <w:r>
+              <w:rPr>
+                <w:rFonts w:ascii="Times New Roman" w:hAnsi="Times New Roman" w:eastAsia="Times New Roman"/>
+                <w:b/>
+                <w:caps w:val="0"/>
+                <w:sz w:val="22"/>
+              </w:rPr>
+              <w:t>Të transformuara</w:t>
+            </w:r>
+          </w:p>
+        </w:tc>
+        <w:tc>
+          <w:tcPr>
+            <w:tcW w:type="dxa" w:w="1728"/>
+          </w:tcPr>
+          <w:p>
+            <w:pPr>
+              <w:spacing w:line="240" w:lineRule="auto"/>
+            </w:pPr>
+            <w:r>
+              <w:rPr>
+                <w:rFonts w:ascii="Times New Roman" w:hAnsi="Times New Roman" w:eastAsia="Times New Roman"/>
+                <w:b/>
+                <w:caps w:val="0"/>
+                <w:sz w:val="22"/>
+              </w:rPr>
+              <w:t>Norma</w:t>
+            </w:r>
+          </w:p>
+        </w:tc>
+      </w:tr>
+      <w:tr>
+        <w:tc>
+          <w:tcPr>
+            <w:tcW w:type="dxa" w:w="1728"/>
+          </w:tcPr>
+          <w:p>
+            <w:pPr>
+              <w:spacing w:line="240" w:lineRule="auto"/>
+            </w:pPr>
+            <w:r>
+              <w:rPr>
+                <w:rFonts w:ascii="Times New Roman" w:hAnsi="Times New Roman" w:eastAsia="Times New Roman"/>
+                <w:b w:val="0"/>
+                <w:caps w:val="0"/>
+                <w:sz w:val="22"/>
+              </w:rPr>
+              <w:t>BrainMethod</w:t>
+            </w:r>
+          </w:p>
+        </w:tc>
+        <w:tc>
+          <w:tcPr>
+            <w:tcW w:type="dxa" w:w="1728"/>
+          </w:tcPr>
+          <w:p>
+            <w:pPr>
+              <w:spacing w:line="240" w:lineRule="auto"/>
+            </w:pPr>
+            <w:r>
+              <w:rPr>
+                <w:rFonts w:ascii="Times New Roman" w:hAnsi="Times New Roman" w:eastAsia="Times New Roman"/>
+                <w:b w:val="0"/>
+                <w:caps w:val="0"/>
+                <w:sz w:val="22"/>
+              </w:rPr>
+              <w:t>critical</w:t>
+            </w:r>
+          </w:p>
+        </w:tc>
+        <w:tc>
+          <w:tcPr>
+            <w:tcW w:type="dxa" w:w="1728"/>
+          </w:tcPr>
+          <w:p>
+            <w:pPr>
+              <w:spacing w:line="240" w:lineRule="auto"/>
+            </w:pPr>
+            <w:r>
+              <w:rPr>
+                <w:rFonts w:ascii="Times New Roman" w:hAnsi="Times New Roman" w:eastAsia="Times New Roman"/>
+                <w:b w:val="0"/>
+                <w:caps w:val="0"/>
+                <w:sz w:val="22"/>
+              </w:rPr>
+              <w:t>1520</w:t>
+            </w:r>
+          </w:p>
+        </w:tc>
+        <w:tc>
+          <w:tcPr>
+            <w:tcW w:type="dxa" w:w="1728"/>
+          </w:tcPr>
+          <w:p>
+            <w:pPr>
+              <w:spacing w:line="240" w:lineRule="auto"/>
+            </w:pPr>
+            <w:r>
+              <w:rPr>
+                <w:rFonts w:ascii="Times New Roman" w:hAnsi="Times New Roman" w:eastAsia="Times New Roman"/>
+                <w:b w:val="0"/>
+                <w:caps w:val="0"/>
+                <w:sz w:val="22"/>
+              </w:rPr>
+              <w:t>381</w:t>
+            </w:r>
+          </w:p>
+        </w:tc>
+        <w:tc>
+          <w:tcPr>
+            <w:tcW w:type="dxa" w:w="1728"/>
+          </w:tcPr>
+          <w:p>
+            <w:pPr>
+              <w:spacing w:line="240" w:lineRule="auto"/>
+            </w:pPr>
+            <w:r>
+              <w:rPr>
+                <w:rFonts w:ascii="Times New Roman" w:hAnsi="Times New Roman" w:eastAsia="Times New Roman"/>
+                <w:b w:val="0"/>
+                <w:caps w:val="0"/>
+                <w:sz w:val="22"/>
+              </w:rPr>
+              <w:t>25.1%</w:t>
+            </w:r>
+          </w:p>
+        </w:tc>
+      </w:tr>
+      <w:tr>
+        <w:tc>
+          <w:tcPr>
+            <w:tcW w:type="dxa" w:w="1728"/>
+          </w:tcPr>
+          <w:p>
+            <w:pPr>
+              <w:spacing w:line="240" w:lineRule="auto"/>
+            </w:pPr>
+            <w:r>
+              <w:rPr>
+                <w:rFonts w:ascii="Times New Roman" w:hAnsi="Times New Roman" w:eastAsia="Times New Roman"/>
+                <w:b w:val="0"/>
+                <w:caps w:val="0"/>
+                <w:sz w:val="22"/>
+              </w:rPr>
+              <w:t>BrainMethod</w:t>
+            </w:r>
+          </w:p>
+        </w:tc>
+        <w:tc>
+          <w:tcPr>
+            <w:tcW w:type="dxa" w:w="1728"/>
+          </w:tcPr>
+          <w:p>
+            <w:pPr>
+              <w:spacing w:line="240" w:lineRule="auto"/>
+            </w:pPr>
+            <w:r>
+              <w:rPr>
+                <w:rFonts w:ascii="Times New Roman" w:hAnsi="Times New Roman" w:eastAsia="Times New Roman"/>
+                <w:b w:val="0"/>
+                <w:caps w:val="0"/>
+                <w:sz w:val="22"/>
+              </w:rPr>
+              <w:t>major</w:t>
+            </w:r>
+          </w:p>
+        </w:tc>
+        <w:tc>
+          <w:tcPr>
+            <w:tcW w:type="dxa" w:w="1728"/>
+          </w:tcPr>
+          <w:p>
+            <w:pPr>
+              <w:spacing w:line="240" w:lineRule="auto"/>
+            </w:pPr>
+            <w:r>
+              <w:rPr>
+                <w:rFonts w:ascii="Times New Roman" w:hAnsi="Times New Roman" w:eastAsia="Times New Roman"/>
+                <w:b w:val="0"/>
+                <w:caps w:val="0"/>
+                <w:sz w:val="22"/>
+              </w:rPr>
+              <w:t>1539</w:t>
+            </w:r>
+          </w:p>
+        </w:tc>
+        <w:tc>
+          <w:tcPr>
+            <w:tcW w:type="dxa" w:w="1728"/>
+          </w:tcPr>
+          <w:p>
+            <w:pPr>
+              <w:spacing w:line="240" w:lineRule="auto"/>
+            </w:pPr>
+            <w:r>
+              <w:rPr>
+                <w:rFonts w:ascii="Times New Roman" w:hAnsi="Times New Roman" w:eastAsia="Times New Roman"/>
+                <w:b w:val="0"/>
+                <w:caps w:val="0"/>
+                <w:sz w:val="22"/>
+              </w:rPr>
+              <w:t>525</w:t>
+            </w:r>
+          </w:p>
+        </w:tc>
+        <w:tc>
+          <w:tcPr>
+            <w:tcW w:type="dxa" w:w="1728"/>
+          </w:tcPr>
+          <w:p>
+            <w:pPr>
+              <w:spacing w:line="240" w:lineRule="auto"/>
+            </w:pPr>
+            <w:r>
+              <w:rPr>
+                <w:rFonts w:ascii="Times New Roman" w:hAnsi="Times New Roman" w:eastAsia="Times New Roman"/>
+                <w:b w:val="0"/>
+                <w:caps w:val="0"/>
+                <w:sz w:val="22"/>
+              </w:rPr>
+              <w:t>34.1%</w:t>
+            </w:r>
+          </w:p>
+        </w:tc>
+      </w:tr>
+      <w:tr>
+        <w:tc>
+          <w:tcPr>
+            <w:tcW w:type="dxa" w:w="1728"/>
+          </w:tcPr>
+          <w:p>
+            <w:pPr>
+              <w:spacing w:line="240" w:lineRule="auto"/>
+            </w:pPr>
+            <w:r>
+              <w:rPr>
+                <w:rFonts w:ascii="Times New Roman" w:hAnsi="Times New Roman" w:eastAsia="Times New Roman"/>
+                <w:b w:val="0"/>
+                <w:caps w:val="0"/>
+                <w:sz w:val="22"/>
+              </w:rPr>
+              <w:t>BrainMethod</w:t>
+            </w:r>
+          </w:p>
+        </w:tc>
+        <w:tc>
+          <w:tcPr>
+            <w:tcW w:type="dxa" w:w="1728"/>
+          </w:tcPr>
+          <w:p>
+            <w:pPr>
+              <w:spacing w:line="240" w:lineRule="auto"/>
+            </w:pPr>
+            <w:r>
+              <w:rPr>
+                <w:rFonts w:ascii="Times New Roman" w:hAnsi="Times New Roman" w:eastAsia="Times New Roman"/>
+                <w:b w:val="0"/>
+                <w:caps w:val="0"/>
+                <w:sz w:val="22"/>
+              </w:rPr>
+              <w:t>minor</w:t>
+            </w:r>
+          </w:p>
+        </w:tc>
+        <w:tc>
+          <w:tcPr>
+            <w:tcW w:type="dxa" w:w="1728"/>
+          </w:tcPr>
+          <w:p>
+            <w:pPr>
+              <w:spacing w:line="240" w:lineRule="auto"/>
+            </w:pPr>
+            <w:r>
+              <w:rPr>
+                <w:rFonts w:ascii="Times New Roman" w:hAnsi="Times New Roman" w:eastAsia="Times New Roman"/>
+                <w:b w:val="0"/>
+                <w:caps w:val="0"/>
+                <w:sz w:val="22"/>
+              </w:rPr>
+              <w:t>276</w:t>
+            </w:r>
+          </w:p>
+        </w:tc>
+        <w:tc>
+          <w:tcPr>
+            <w:tcW w:type="dxa" w:w="1728"/>
+          </w:tcPr>
+          <w:p>
+            <w:pPr>
+              <w:spacing w:line="240" w:lineRule="auto"/>
+            </w:pPr>
+            <w:r>
+              <w:rPr>
+                <w:rFonts w:ascii="Times New Roman" w:hAnsi="Times New Roman" w:eastAsia="Times New Roman"/>
+                <w:b w:val="0"/>
+                <w:caps w:val="0"/>
+                <w:sz w:val="22"/>
+              </w:rPr>
+              <w:t>63</w:t>
+            </w:r>
+          </w:p>
+        </w:tc>
+        <w:tc>
+          <w:tcPr>
+            <w:tcW w:type="dxa" w:w="1728"/>
+          </w:tcPr>
+          <w:p>
+            <w:pPr>
+              <w:spacing w:line="240" w:lineRule="auto"/>
+            </w:pPr>
+            <w:r>
+              <w:rPr>
+                <w:rFonts w:ascii="Times New Roman" w:hAnsi="Times New Roman" w:eastAsia="Times New Roman"/>
+                <w:b w:val="0"/>
+                <w:caps w:val="0"/>
+                <w:sz w:val="22"/>
+              </w:rPr>
+              <w:t>22.8%</w:t>
+            </w:r>
+          </w:p>
+        </w:tc>
+      </w:tr>
+      <w:tr>
+        <w:tc>
+          <w:tcPr>
+            <w:tcW w:type="dxa" w:w="1728"/>
+          </w:tcPr>
+          <w:p>
+            <w:pPr>
+              <w:spacing w:line="240" w:lineRule="auto"/>
+            </w:pPr>
+            <w:r>
+              <w:rPr>
+                <w:rFonts w:ascii="Times New Roman" w:hAnsi="Times New Roman" w:eastAsia="Times New Roman"/>
+                <w:b w:val="0"/>
+                <w:caps w:val="0"/>
+                <w:sz w:val="22"/>
+              </w:rPr>
+              <w:t>DeepNesting</w:t>
+            </w:r>
+          </w:p>
+        </w:tc>
+        <w:tc>
+          <w:tcPr>
+            <w:tcW w:type="dxa" w:w="1728"/>
+          </w:tcPr>
+          <w:p>
+            <w:pPr>
+              <w:spacing w:line="240" w:lineRule="auto"/>
+            </w:pPr>
+            <w:r>
+              <w:rPr>
+                <w:rFonts w:ascii="Times New Roman" w:hAnsi="Times New Roman" w:eastAsia="Times New Roman"/>
+                <w:b w:val="0"/>
+                <w:caps w:val="0"/>
+                <w:sz w:val="22"/>
+              </w:rPr>
+              <w:t>critical</w:t>
+            </w:r>
+          </w:p>
+        </w:tc>
+        <w:tc>
+          <w:tcPr>
+            <w:tcW w:type="dxa" w:w="1728"/>
+          </w:tcPr>
+          <w:p>
+            <w:pPr>
+              <w:spacing w:line="240" w:lineRule="auto"/>
+            </w:pPr>
+            <w:r>
+              <w:rPr>
+                <w:rFonts w:ascii="Times New Roman" w:hAnsi="Times New Roman" w:eastAsia="Times New Roman"/>
+                <w:b w:val="0"/>
+                <w:caps w:val="0"/>
+                <w:sz w:val="22"/>
+              </w:rPr>
+              <w:t>416</w:t>
+            </w:r>
+          </w:p>
+        </w:tc>
+        <w:tc>
+          <w:tcPr>
+            <w:tcW w:type="dxa" w:w="1728"/>
+          </w:tcPr>
+          <w:p>
+            <w:pPr>
+              <w:spacing w:line="240" w:lineRule="auto"/>
+            </w:pPr>
+            <w:r>
+              <w:rPr>
+                <w:rFonts w:ascii="Times New Roman" w:hAnsi="Times New Roman" w:eastAsia="Times New Roman"/>
+                <w:b w:val="0"/>
+                <w:caps w:val="0"/>
+                <w:sz w:val="22"/>
+              </w:rPr>
+              <w:t>4</w:t>
+            </w:r>
+          </w:p>
+        </w:tc>
+        <w:tc>
+          <w:tcPr>
+            <w:tcW w:type="dxa" w:w="1728"/>
+          </w:tcPr>
+          <w:p>
+            <w:pPr>
+              <w:spacing w:line="240" w:lineRule="auto"/>
+            </w:pPr>
+            <w:r>
+              <w:rPr>
+                <w:rFonts w:ascii="Times New Roman" w:hAnsi="Times New Roman" w:eastAsia="Times New Roman"/>
+                <w:b w:val="0"/>
+                <w:caps w:val="0"/>
+                <w:sz w:val="22"/>
+              </w:rPr>
+              <w:t>1.0%</w:t>
+            </w:r>
+          </w:p>
+        </w:tc>
+      </w:tr>
+      <w:tr>
+        <w:tc>
+          <w:tcPr>
+            <w:tcW w:type="dxa" w:w="1728"/>
+          </w:tcPr>
+          <w:p>
+            <w:pPr>
+              <w:spacing w:line="240" w:lineRule="auto"/>
+            </w:pPr>
+            <w:r>
+              <w:rPr>
+                <w:rFonts w:ascii="Times New Roman" w:hAnsi="Times New Roman" w:eastAsia="Times New Roman"/>
+                <w:b w:val="0"/>
+                <w:caps w:val="0"/>
+                <w:sz w:val="22"/>
+              </w:rPr>
+              <w:t>DeepNesting</w:t>
+            </w:r>
+          </w:p>
+        </w:tc>
+        <w:tc>
+          <w:tcPr>
+            <w:tcW w:type="dxa" w:w="1728"/>
+          </w:tcPr>
+          <w:p>
+            <w:pPr>
+              <w:spacing w:line="240" w:lineRule="auto"/>
+            </w:pPr>
+            <w:r>
+              <w:rPr>
+                <w:rFonts w:ascii="Times New Roman" w:hAnsi="Times New Roman" w:eastAsia="Times New Roman"/>
+                <w:b w:val="0"/>
+                <w:caps w:val="0"/>
+                <w:sz w:val="22"/>
+              </w:rPr>
+              <w:t>major</w:t>
+            </w:r>
+          </w:p>
+        </w:tc>
+        <w:tc>
+          <w:tcPr>
+            <w:tcW w:type="dxa" w:w="1728"/>
+          </w:tcPr>
+          <w:p>
+            <w:pPr>
+              <w:spacing w:line="240" w:lineRule="auto"/>
+            </w:pPr>
+            <w:r>
+              <w:rPr>
+                <w:rFonts w:ascii="Times New Roman" w:hAnsi="Times New Roman" w:eastAsia="Times New Roman"/>
+                <w:b w:val="0"/>
+                <w:caps w:val="0"/>
+                <w:sz w:val="22"/>
+              </w:rPr>
+              <w:t>2054</w:t>
+            </w:r>
+          </w:p>
+        </w:tc>
+        <w:tc>
+          <w:tcPr>
+            <w:tcW w:type="dxa" w:w="1728"/>
+          </w:tcPr>
+          <w:p>
+            <w:pPr>
+              <w:spacing w:line="240" w:lineRule="auto"/>
+            </w:pPr>
+            <w:r>
+              <w:rPr>
+                <w:rFonts w:ascii="Times New Roman" w:hAnsi="Times New Roman" w:eastAsia="Times New Roman"/>
+                <w:b w:val="0"/>
+                <w:caps w:val="0"/>
+                <w:sz w:val="22"/>
+              </w:rPr>
+              <w:t>42</w:t>
+            </w:r>
+          </w:p>
+        </w:tc>
+        <w:tc>
+          <w:tcPr>
+            <w:tcW w:type="dxa" w:w="1728"/>
+          </w:tcPr>
+          <w:p>
+            <w:pPr>
+              <w:spacing w:line="240" w:lineRule="auto"/>
+            </w:pPr>
+            <w:r>
+              <w:rPr>
+                <w:rFonts w:ascii="Times New Roman" w:hAnsi="Times New Roman" w:eastAsia="Times New Roman"/>
+                <w:b w:val="0"/>
+                <w:caps w:val="0"/>
+                <w:sz w:val="22"/>
+              </w:rPr>
+              <w:t>2.0%</w:t>
+            </w:r>
+          </w:p>
+        </w:tc>
+      </w:tr>
+      <w:tr>
+        <w:tc>
+          <w:tcPr>
+            <w:tcW w:type="dxa" w:w="1728"/>
+          </w:tcPr>
+          <w:p>
+            <w:pPr>
+              <w:spacing w:line="240" w:lineRule="auto"/>
+            </w:pPr>
+            <w:r>
+              <w:rPr>
+                <w:rFonts w:ascii="Times New Roman" w:hAnsi="Times New Roman" w:eastAsia="Times New Roman"/>
+                <w:b w:val="0"/>
+                <w:caps w:val="0"/>
+                <w:sz w:val="22"/>
+              </w:rPr>
+              <w:t>DeepNesting</w:t>
+            </w:r>
+          </w:p>
+        </w:tc>
+        <w:tc>
+          <w:tcPr>
+            <w:tcW w:type="dxa" w:w="1728"/>
+          </w:tcPr>
+          <w:p>
+            <w:pPr>
+              <w:spacing w:line="240" w:lineRule="auto"/>
+            </w:pPr>
+            <w:r>
+              <w:rPr>
+                <w:rFonts w:ascii="Times New Roman" w:hAnsi="Times New Roman" w:eastAsia="Times New Roman"/>
+                <w:b w:val="0"/>
+                <w:caps w:val="0"/>
+                <w:sz w:val="22"/>
+              </w:rPr>
+              <w:t>minor</w:t>
+            </w:r>
+          </w:p>
+        </w:tc>
+        <w:tc>
+          <w:tcPr>
+            <w:tcW w:type="dxa" w:w="1728"/>
+          </w:tcPr>
+          <w:p>
+            <w:pPr>
+              <w:spacing w:line="240" w:lineRule="auto"/>
+            </w:pPr>
+            <w:r>
+              <w:rPr>
+                <w:rFonts w:ascii="Times New Roman" w:hAnsi="Times New Roman" w:eastAsia="Times New Roman"/>
+                <w:b w:val="0"/>
+                <w:caps w:val="0"/>
+                <w:sz w:val="22"/>
+              </w:rPr>
+              <w:t>3019</w:t>
+            </w:r>
+          </w:p>
+        </w:tc>
+        <w:tc>
+          <w:tcPr>
+            <w:tcW w:type="dxa" w:w="1728"/>
+          </w:tcPr>
+          <w:p>
+            <w:pPr>
+              <w:spacing w:line="240" w:lineRule="auto"/>
+            </w:pPr>
+            <w:r>
+              <w:rPr>
+                <w:rFonts w:ascii="Times New Roman" w:hAnsi="Times New Roman" w:eastAsia="Times New Roman"/>
+                <w:b w:val="0"/>
+                <w:caps w:val="0"/>
+                <w:sz w:val="22"/>
+              </w:rPr>
+              <w:t>65</w:t>
+            </w:r>
+          </w:p>
+        </w:tc>
+        <w:tc>
+          <w:tcPr>
+            <w:tcW w:type="dxa" w:w="1728"/>
+          </w:tcPr>
+          <w:p>
+            <w:pPr>
+              <w:spacing w:line="240" w:lineRule="auto"/>
+            </w:pPr>
+            <w:r>
+              <w:rPr>
+                <w:rFonts w:ascii="Times New Roman" w:hAnsi="Times New Roman" w:eastAsia="Times New Roman"/>
+                <w:b w:val="0"/>
+                <w:caps w:val="0"/>
+                <w:sz w:val="22"/>
+              </w:rPr>
+              <w:t>2.1%</w:t>
+            </w:r>
+          </w:p>
+        </w:tc>
+      </w:tr>
+      <w:tr>
+        <w:tc>
+          <w:tcPr>
+            <w:tcW w:type="dxa" w:w="1728"/>
+          </w:tcPr>
+          <w:p>
+            <w:pPr>
+              <w:spacing w:line="240" w:lineRule="auto"/>
+            </w:pPr>
+            <w:r>
+              <w:rPr>
+                <w:rFonts w:ascii="Times New Roman" w:hAnsi="Times New Roman" w:eastAsia="Times New Roman"/>
+                <w:b w:val="0"/>
+                <w:caps w:val="0"/>
+                <w:sz w:val="22"/>
+              </w:rPr>
+              <w:t>LongMethod</w:t>
+            </w:r>
+          </w:p>
+        </w:tc>
+        <w:tc>
+          <w:tcPr>
+            <w:tcW w:type="dxa" w:w="1728"/>
+          </w:tcPr>
+          <w:p>
+            <w:pPr>
+              <w:spacing w:line="240" w:lineRule="auto"/>
+            </w:pPr>
+            <w:r>
+              <w:rPr>
+                <w:rFonts w:ascii="Times New Roman" w:hAnsi="Times New Roman" w:eastAsia="Times New Roman"/>
+                <w:b w:val="0"/>
+                <w:caps w:val="0"/>
+                <w:sz w:val="22"/>
+              </w:rPr>
+              <w:t>critical</w:t>
+            </w:r>
+          </w:p>
+        </w:tc>
+        <w:tc>
+          <w:tcPr>
+            <w:tcW w:type="dxa" w:w="1728"/>
+          </w:tcPr>
+          <w:p>
+            <w:pPr>
+              <w:spacing w:line="240" w:lineRule="auto"/>
+            </w:pPr>
+            <w:r>
+              <w:rPr>
+                <w:rFonts w:ascii="Times New Roman" w:hAnsi="Times New Roman" w:eastAsia="Times New Roman"/>
+                <w:b w:val="0"/>
+                <w:caps w:val="0"/>
+                <w:sz w:val="22"/>
+              </w:rPr>
+              <w:t>1363</w:t>
+            </w:r>
+          </w:p>
+        </w:tc>
+        <w:tc>
+          <w:tcPr>
+            <w:tcW w:type="dxa" w:w="1728"/>
+          </w:tcPr>
+          <w:p>
+            <w:pPr>
+              <w:spacing w:line="240" w:lineRule="auto"/>
+            </w:pPr>
+            <w:r>
+              <w:rPr>
+                <w:rFonts w:ascii="Times New Roman" w:hAnsi="Times New Roman" w:eastAsia="Times New Roman"/>
+                <w:b w:val="0"/>
+                <w:caps w:val="0"/>
+                <w:sz w:val="22"/>
+              </w:rPr>
+              <w:t>401</w:t>
+            </w:r>
+          </w:p>
+        </w:tc>
+        <w:tc>
+          <w:tcPr>
+            <w:tcW w:type="dxa" w:w="1728"/>
+          </w:tcPr>
+          <w:p>
+            <w:pPr>
+              <w:spacing w:line="240" w:lineRule="auto"/>
+            </w:pPr>
+            <w:r>
+              <w:rPr>
+                <w:rFonts w:ascii="Times New Roman" w:hAnsi="Times New Roman" w:eastAsia="Times New Roman"/>
+                <w:b w:val="0"/>
+                <w:caps w:val="0"/>
+                <w:sz w:val="22"/>
+              </w:rPr>
+              <w:t>29.4%</w:t>
+            </w:r>
+          </w:p>
+        </w:tc>
+      </w:tr>
+      <w:tr>
+        <w:tc>
+          <w:tcPr>
+            <w:tcW w:type="dxa" w:w="1728"/>
+          </w:tcPr>
+          <w:p>
+            <w:pPr>
+              <w:spacing w:line="240" w:lineRule="auto"/>
+            </w:pPr>
+            <w:r>
+              <w:rPr>
+                <w:rFonts w:ascii="Times New Roman" w:hAnsi="Times New Roman" w:eastAsia="Times New Roman"/>
+                <w:b w:val="0"/>
+                <w:caps w:val="0"/>
+                <w:sz w:val="22"/>
+              </w:rPr>
+              <w:t>LongMethod</w:t>
+            </w:r>
+          </w:p>
+        </w:tc>
+        <w:tc>
+          <w:tcPr>
+            <w:tcW w:type="dxa" w:w="1728"/>
+          </w:tcPr>
+          <w:p>
+            <w:pPr>
+              <w:spacing w:line="240" w:lineRule="auto"/>
+            </w:pPr>
+            <w:r>
+              <w:rPr>
+                <w:rFonts w:ascii="Times New Roman" w:hAnsi="Times New Roman" w:eastAsia="Times New Roman"/>
+                <w:b w:val="0"/>
+                <w:caps w:val="0"/>
+                <w:sz w:val="22"/>
+              </w:rPr>
+              <w:t>major</w:t>
+            </w:r>
+          </w:p>
+        </w:tc>
+        <w:tc>
+          <w:tcPr>
+            <w:tcW w:type="dxa" w:w="1728"/>
+          </w:tcPr>
+          <w:p>
+            <w:pPr>
+              <w:spacing w:line="240" w:lineRule="auto"/>
+            </w:pPr>
+            <w:r>
+              <w:rPr>
+                <w:rFonts w:ascii="Times New Roman" w:hAnsi="Times New Roman" w:eastAsia="Times New Roman"/>
+                <w:b w:val="0"/>
+                <w:caps w:val="0"/>
+                <w:sz w:val="22"/>
+              </w:rPr>
+              <w:t>2331</w:t>
+            </w:r>
+          </w:p>
+        </w:tc>
+        <w:tc>
+          <w:tcPr>
+            <w:tcW w:type="dxa" w:w="1728"/>
+          </w:tcPr>
+          <w:p>
+            <w:pPr>
+              <w:spacing w:line="240" w:lineRule="auto"/>
+            </w:pPr>
+            <w:r>
+              <w:rPr>
+                <w:rFonts w:ascii="Times New Roman" w:hAnsi="Times New Roman" w:eastAsia="Times New Roman"/>
+                <w:b w:val="0"/>
+                <w:caps w:val="0"/>
+                <w:sz w:val="22"/>
+              </w:rPr>
+              <w:t>821</w:t>
+            </w:r>
+          </w:p>
+        </w:tc>
+        <w:tc>
+          <w:tcPr>
+            <w:tcW w:type="dxa" w:w="1728"/>
+          </w:tcPr>
+          <w:p>
+            <w:pPr>
+              <w:spacing w:line="240" w:lineRule="auto"/>
+            </w:pPr>
+            <w:r>
+              <w:rPr>
+                <w:rFonts w:ascii="Times New Roman" w:hAnsi="Times New Roman" w:eastAsia="Times New Roman"/>
+                <w:b w:val="0"/>
+                <w:caps w:val="0"/>
+                <w:sz w:val="22"/>
+              </w:rPr>
+              <w:t>35.2%</w:t>
+            </w:r>
+          </w:p>
+        </w:tc>
+      </w:tr>
+      <w:tr>
+        <w:tc>
+          <w:tcPr>
+            <w:tcW w:type="dxa" w:w="1728"/>
+          </w:tcPr>
+          <w:p>
+            <w:pPr>
+              <w:spacing w:line="240" w:lineRule="auto"/>
+            </w:pPr>
+            <w:r>
+              <w:rPr>
+                <w:rFonts w:ascii="Times New Roman" w:hAnsi="Times New Roman" w:eastAsia="Times New Roman"/>
+                <w:b w:val="0"/>
+                <w:caps w:val="0"/>
+                <w:sz w:val="22"/>
+              </w:rPr>
+              <w:t>LongMethod</w:t>
+            </w:r>
+          </w:p>
+        </w:tc>
+        <w:tc>
+          <w:tcPr>
+            <w:tcW w:type="dxa" w:w="1728"/>
+          </w:tcPr>
+          <w:p>
+            <w:pPr>
+              <w:spacing w:line="240" w:lineRule="auto"/>
+            </w:pPr>
+            <w:r>
+              <w:rPr>
+                <w:rFonts w:ascii="Times New Roman" w:hAnsi="Times New Roman" w:eastAsia="Times New Roman"/>
+                <w:b w:val="0"/>
+                <w:caps w:val="0"/>
+                <w:sz w:val="22"/>
+              </w:rPr>
+              <w:t>minor</w:t>
+            </w:r>
+          </w:p>
+        </w:tc>
+        <w:tc>
+          <w:tcPr>
+            <w:tcW w:type="dxa" w:w="1728"/>
+          </w:tcPr>
+          <w:p>
+            <w:pPr>
+              <w:spacing w:line="240" w:lineRule="auto"/>
+            </w:pPr>
+            <w:r>
+              <w:rPr>
+                <w:rFonts w:ascii="Times New Roman" w:hAnsi="Times New Roman" w:eastAsia="Times New Roman"/>
+                <w:b w:val="0"/>
+                <w:caps w:val="0"/>
+                <w:sz w:val="22"/>
+              </w:rPr>
+              <w:t>3456</w:t>
+            </w:r>
+          </w:p>
+        </w:tc>
+        <w:tc>
+          <w:tcPr>
+            <w:tcW w:type="dxa" w:w="1728"/>
+          </w:tcPr>
+          <w:p>
+            <w:pPr>
+              <w:spacing w:line="240" w:lineRule="auto"/>
+            </w:pPr>
+            <w:r>
+              <w:rPr>
+                <w:rFonts w:ascii="Times New Roman" w:hAnsi="Times New Roman" w:eastAsia="Times New Roman"/>
+                <w:b w:val="0"/>
+                <w:caps w:val="0"/>
+                <w:sz w:val="22"/>
+              </w:rPr>
+              <w:t>1176</w:t>
+            </w:r>
+          </w:p>
+        </w:tc>
+        <w:tc>
+          <w:tcPr>
+            <w:tcW w:type="dxa" w:w="1728"/>
+          </w:tcPr>
+          <w:p>
+            <w:pPr>
+              <w:spacing w:line="240" w:lineRule="auto"/>
+            </w:pPr>
+            <w:r>
+              <w:rPr>
+                <w:rFonts w:ascii="Times New Roman" w:hAnsi="Times New Roman" w:eastAsia="Times New Roman"/>
+                <w:b w:val="0"/>
+                <w:caps w:val="0"/>
+                <w:sz w:val="22"/>
+              </w:rPr>
+              <w:t>34.0%</w:t>
+            </w:r>
+          </w:p>
+        </w:tc>
+      </w:tr>
+      <w:tr>
+        <w:tc>
+          <w:tcPr>
+            <w:tcW w:type="dxa" w:w="1728"/>
+          </w:tcPr>
+          <w:p>
+            <w:pPr>
+              <w:spacing w:line="240" w:lineRule="auto"/>
+            </w:pPr>
+            <w:r>
+              <w:rPr>
+                <w:rFonts w:ascii="Times New Roman" w:hAnsi="Times New Roman" w:eastAsia="Times New Roman"/>
+                <w:b w:val="0"/>
+                <w:caps w:val="0"/>
+                <w:sz w:val="22"/>
+              </w:rPr>
+              <w:t>LongParameterList</w:t>
+            </w:r>
+          </w:p>
+        </w:tc>
+        <w:tc>
+          <w:tcPr>
+            <w:tcW w:type="dxa" w:w="1728"/>
+          </w:tcPr>
+          <w:p>
+            <w:pPr>
+              <w:spacing w:line="240" w:lineRule="auto"/>
+            </w:pPr>
+            <w:r>
+              <w:rPr>
+                <w:rFonts w:ascii="Times New Roman" w:hAnsi="Times New Roman" w:eastAsia="Times New Roman"/>
+                <w:b w:val="0"/>
+                <w:caps w:val="0"/>
+                <w:sz w:val="22"/>
+              </w:rPr>
+              <w:t>critical</w:t>
+            </w:r>
+          </w:p>
+        </w:tc>
+        <w:tc>
+          <w:tcPr>
+            <w:tcW w:type="dxa" w:w="1728"/>
+          </w:tcPr>
+          <w:p>
+            <w:pPr>
+              <w:spacing w:line="240" w:lineRule="auto"/>
+            </w:pPr>
+            <w:r>
+              <w:rPr>
+                <w:rFonts w:ascii="Times New Roman" w:hAnsi="Times New Roman" w:eastAsia="Times New Roman"/>
+                <w:b w:val="0"/>
+                <w:caps w:val="0"/>
+                <w:sz w:val="22"/>
+              </w:rPr>
+              <w:t>91</w:t>
+            </w:r>
+          </w:p>
+        </w:tc>
+        <w:tc>
+          <w:tcPr>
+            <w:tcW w:type="dxa" w:w="1728"/>
+          </w:tcPr>
+          <w:p>
+            <w:pPr>
+              <w:spacing w:line="240" w:lineRule="auto"/>
+            </w:pPr>
+            <w:r>
+              <w:rPr>
+                <w:rFonts w:ascii="Times New Roman" w:hAnsi="Times New Roman" w:eastAsia="Times New Roman"/>
+                <w:b w:val="0"/>
+                <w:caps w:val="0"/>
+                <w:sz w:val="22"/>
+              </w:rPr>
+              <w:t>2</w:t>
+            </w:r>
+          </w:p>
+        </w:tc>
+        <w:tc>
+          <w:tcPr>
+            <w:tcW w:type="dxa" w:w="1728"/>
+          </w:tcPr>
+          <w:p>
+            <w:pPr>
+              <w:spacing w:line="240" w:lineRule="auto"/>
+            </w:pPr>
+            <w:r>
+              <w:rPr>
+                <w:rFonts w:ascii="Times New Roman" w:hAnsi="Times New Roman" w:eastAsia="Times New Roman"/>
+                <w:b w:val="0"/>
+                <w:caps w:val="0"/>
+                <w:sz w:val="22"/>
+              </w:rPr>
+              <w:t>2.2%</w:t>
+            </w:r>
+          </w:p>
+        </w:tc>
+      </w:tr>
+      <w:tr>
+        <w:tc>
+          <w:tcPr>
+            <w:tcW w:type="dxa" w:w="1728"/>
+          </w:tcPr>
+          <w:p>
+            <w:pPr>
+              <w:spacing w:line="240" w:lineRule="auto"/>
+            </w:pPr>
+            <w:r>
+              <w:rPr>
+                <w:rFonts w:ascii="Times New Roman" w:hAnsi="Times New Roman" w:eastAsia="Times New Roman"/>
+                <w:b w:val="0"/>
+                <w:caps w:val="0"/>
+                <w:sz w:val="22"/>
+              </w:rPr>
+              <w:t>LongParameterList</w:t>
+            </w:r>
+          </w:p>
+        </w:tc>
+        <w:tc>
+          <w:tcPr>
+            <w:tcW w:type="dxa" w:w="1728"/>
+          </w:tcPr>
+          <w:p>
+            <w:pPr>
+              <w:spacing w:line="240" w:lineRule="auto"/>
+            </w:pPr>
+            <w:r>
+              <w:rPr>
+                <w:rFonts w:ascii="Times New Roman" w:hAnsi="Times New Roman" w:eastAsia="Times New Roman"/>
+                <w:b w:val="0"/>
+                <w:caps w:val="0"/>
+                <w:sz w:val="22"/>
+              </w:rPr>
+              <w:t>major</w:t>
+            </w:r>
+          </w:p>
+        </w:tc>
+        <w:tc>
+          <w:tcPr>
+            <w:tcW w:type="dxa" w:w="1728"/>
+          </w:tcPr>
+          <w:p>
+            <w:pPr>
+              <w:spacing w:line="240" w:lineRule="auto"/>
+            </w:pPr>
+            <w:r>
+              <w:rPr>
+                <w:rFonts w:ascii="Times New Roman" w:hAnsi="Times New Roman" w:eastAsia="Times New Roman"/>
+                <w:b w:val="0"/>
+                <w:caps w:val="0"/>
+                <w:sz w:val="22"/>
+              </w:rPr>
+              <w:t>494</w:t>
+            </w:r>
+          </w:p>
+        </w:tc>
+        <w:tc>
+          <w:tcPr>
+            <w:tcW w:type="dxa" w:w="1728"/>
+          </w:tcPr>
+          <w:p>
+            <w:pPr>
+              <w:spacing w:line="240" w:lineRule="auto"/>
+            </w:pPr>
+            <w:r>
+              <w:rPr>
+                <w:rFonts w:ascii="Times New Roman" w:hAnsi="Times New Roman" w:eastAsia="Times New Roman"/>
+                <w:b w:val="0"/>
+                <w:caps w:val="0"/>
+                <w:sz w:val="22"/>
+              </w:rPr>
+              <w:t>40</w:t>
+            </w:r>
+          </w:p>
+        </w:tc>
+        <w:tc>
+          <w:tcPr>
+            <w:tcW w:type="dxa" w:w="1728"/>
+          </w:tcPr>
+          <w:p>
+            <w:pPr>
+              <w:spacing w:line="240" w:lineRule="auto"/>
+            </w:pPr>
+            <w:r>
+              <w:rPr>
+                <w:rFonts w:ascii="Times New Roman" w:hAnsi="Times New Roman" w:eastAsia="Times New Roman"/>
+                <w:b w:val="0"/>
+                <w:caps w:val="0"/>
+                <w:sz w:val="22"/>
+              </w:rPr>
+              <w:t>8.1%</w:t>
+            </w:r>
+          </w:p>
+        </w:tc>
+      </w:tr>
+      <w:tr>
+        <w:tc>
+          <w:tcPr>
+            <w:tcW w:type="dxa" w:w="1728"/>
+          </w:tcPr>
+          <w:p>
+            <w:pPr>
+              <w:spacing w:line="240" w:lineRule="auto"/>
+            </w:pPr>
+            <w:r>
+              <w:rPr>
+                <w:rFonts w:ascii="Times New Roman" w:hAnsi="Times New Roman" w:eastAsia="Times New Roman"/>
+                <w:b w:val="0"/>
+                <w:caps w:val="0"/>
+                <w:sz w:val="22"/>
+              </w:rPr>
+              <w:t>LongParameterList</w:t>
+            </w:r>
+          </w:p>
+        </w:tc>
+        <w:tc>
+          <w:tcPr>
+            <w:tcW w:type="dxa" w:w="1728"/>
+          </w:tcPr>
+          <w:p>
+            <w:pPr>
+              <w:spacing w:line="240" w:lineRule="auto"/>
+            </w:pPr>
+            <w:r>
+              <w:rPr>
+                <w:rFonts w:ascii="Times New Roman" w:hAnsi="Times New Roman" w:eastAsia="Times New Roman"/>
+                <w:b w:val="0"/>
+                <w:caps w:val="0"/>
+                <w:sz w:val="22"/>
+              </w:rPr>
+              <w:t>minor</w:t>
+            </w:r>
+          </w:p>
+        </w:tc>
+        <w:tc>
+          <w:tcPr>
+            <w:tcW w:type="dxa" w:w="1728"/>
+          </w:tcPr>
+          <w:p>
+            <w:pPr>
+              <w:spacing w:line="240" w:lineRule="auto"/>
+            </w:pPr>
+            <w:r>
+              <w:rPr>
+                <w:rFonts w:ascii="Times New Roman" w:hAnsi="Times New Roman" w:eastAsia="Times New Roman"/>
+                <w:b w:val="0"/>
+                <w:caps w:val="0"/>
+                <w:sz w:val="22"/>
+              </w:rPr>
+              <w:t>1257</w:t>
+            </w:r>
+          </w:p>
+        </w:tc>
+        <w:tc>
+          <w:tcPr>
+            <w:tcW w:type="dxa" w:w="1728"/>
+          </w:tcPr>
+          <w:p>
+            <w:pPr>
+              <w:spacing w:line="240" w:lineRule="auto"/>
+            </w:pPr>
+            <w:r>
+              <w:rPr>
+                <w:rFonts w:ascii="Times New Roman" w:hAnsi="Times New Roman" w:eastAsia="Times New Roman"/>
+                <w:b w:val="0"/>
+                <w:caps w:val="0"/>
+                <w:sz w:val="22"/>
+              </w:rPr>
+              <w:t>113</w:t>
+            </w:r>
+          </w:p>
+        </w:tc>
+        <w:tc>
+          <w:tcPr>
+            <w:tcW w:type="dxa" w:w="1728"/>
+          </w:tcPr>
+          <w:p>
+            <w:pPr>
+              <w:spacing w:line="240" w:lineRule="auto"/>
+            </w:pPr>
+            <w:r>
+              <w:rPr>
+                <w:rFonts w:ascii="Times New Roman" w:hAnsi="Times New Roman" w:eastAsia="Times New Roman"/>
+                <w:b w:val="0"/>
+                <w:caps w:val="0"/>
+                <w:sz w:val="22"/>
+              </w:rPr>
+              <w:t>9.0%</w:t>
+            </w:r>
+          </w:p>
+        </w:tc>
+      </w:tr>
+    </w:tbl>
+    <w:p>
+      <w:pPr>
+        <w:spacing w:line="240" w:lineRule="auto" w:after="0"/>
+      </w:pPr>
+    </w:p>
+    <w:p>
+      <w:pPr>
+        <w:spacing w:line="360" w:lineRule="auto"/>
+        <w:ind w:firstLine="360"/>
+        <w:jc w:val="both"/>
+      </w:pPr>
+      <w:r>
+        <w:rPr>
+          <w:rFonts w:ascii="Times New Roman" w:hAnsi="Times New Roman" w:eastAsia="Times New Roman"/>
+          <w:b w:val="0"/>
+          <w:caps w:val="0"/>
+          <w:sz w:val="24"/>
+        </w:rPr>
+        <w:t>Pritja se «sa më e rëndë, aq më pak rishkruhet» nuk qëndron si rregull. Niveli kritik ka normën më të ulët te 3 nga 4 erërat, por jo te të gjitha, dhe lidhja nuk është as monotone: te Brain Method dhe Long Method niveli i mesëm rri mbi atë të butin.</w:t>
+      </w:r>
+    </w:p>
+    <w:p>
+      <w:pPr>
+        <w:spacing w:line="360" w:lineRule="auto"/>
+        <w:ind w:firstLine="360"/>
+        <w:jc w:val="both"/>
+      </w:pPr>
+      <w:r>
+        <w:rPr>
+          <w:rFonts w:ascii="Times New Roman" w:hAnsi="Times New Roman" w:eastAsia="Times New Roman"/>
+          <w:b w:val="0"/>
+          <w:caps w:val="0"/>
+          <w:sz w:val="24"/>
+        </w:rPr>
+        <w:t>Kjo tabelë nuk bashkohet mbi erërat. E bashkuar, niveli kritik del me 23.2% kundrejt 19.7% të niveleve të tjera — pra e kundërta e asaj që shohin erërat veç e veç. Është paradoks i Simpson-it, dhe shkaku është përbërja: BrainMethod ka normë 29.1% dhe 45.6% të vendeve të veta kritike, ndërsa LongParameterList ka 8.4% dhe vetëm 4.9%. Bashkimi i jep nivelit kritik peshë nga erërat që rishkruhen lehtë dhe e përmbys shenjën, ndaj shifra e bashkuar nuk raportohet askund në këtë punim.</w:t>
+      </w:r>
+    </w:p>
+    <w:p>
+      <w:pPr>
+        <w:spacing w:line="360" w:lineRule="auto"/>
+        <w:ind w:firstLine="360"/>
+        <w:jc w:val="both"/>
+      </w:pPr>
+      <w:r>
+        <w:rPr>
+          <w:rFonts w:ascii="Times New Roman" w:hAnsi="Times New Roman" w:eastAsia="Times New Roman"/>
+          <w:b w:val="0"/>
+          <w:caps w:val="0"/>
+          <w:sz w:val="24"/>
+        </w:rPr>
+        <w:t>Ajo që lëviz me ashpërsinë nuk është sa shpesh refuzon motori, por përse.</w:t>
+      </w:r>
+    </w:p>
+    <w:p>
+      <w:pPr>
+        <w:spacing w:line="240" w:lineRule="auto"/>
+        <w:jc w:val="center"/>
+      </w:pPr>
+      <w:r>
+        <w:rPr>
+          <w:rFonts w:ascii="Times New Roman" w:hAnsi="Times New Roman" w:eastAsia="Times New Roman"/>
+          <w:b w:val="0"/>
+          <w:caps w:val="0"/>
+          <w:sz w:val="22"/>
+        </w:rPr>
+        <w:t>Tabela 13. Përbërja e arsyeve të refuzimit brenda çdo niveli</w:t>
+      </w:r>
+    </w:p>
+    <w:tbl>
+      <w:tblPr>
+        <w:tblStyle w:val="TableGrid"/>
+        <w:tblW w:type="auto" w:w="0"/>
+        <w:tblLook w:firstColumn="1" w:firstRow="1" w:lastColumn="0" w:lastRow="0" w:noHBand="0" w:noVBand="1" w:val="04A0"/>
+      </w:tblPr>
+      <w:tblGrid>
+        <w:gridCol w:w="2160"/>
+        <w:gridCol w:w="2160"/>
+        <w:gridCol w:w="2160"/>
+        <w:gridCol w:w="2160"/>
+      </w:tblGrid>
+      <w:tr>
+        <w:tc>
+          <w:tcPr>
+            <w:tcW w:type="dxa" w:w="2160"/>
+          </w:tcPr>
+          <w:p>
+            <w:pPr>
+              <w:spacing w:line="240" w:lineRule="auto"/>
+            </w:pPr>
+            <w:r>
+              <w:rPr>
+                <w:rFonts w:ascii="Times New Roman" w:hAnsi="Times New Roman" w:eastAsia="Times New Roman"/>
+                <w:b/>
+                <w:caps w:val="0"/>
+                <w:sz w:val="22"/>
+              </w:rPr>
+              <w:t>Arsyeja</w:t>
+            </w:r>
+          </w:p>
+        </w:tc>
+        <w:tc>
+          <w:tcPr>
+            <w:tcW w:type="dxa" w:w="2160"/>
+          </w:tcPr>
+          <w:p>
+            <w:pPr>
+              <w:spacing w:line="240" w:lineRule="auto"/>
+            </w:pPr>
+            <w:r>
+              <w:rPr>
+                <w:rFonts w:ascii="Times New Roman" w:hAnsi="Times New Roman" w:eastAsia="Times New Roman"/>
+                <w:b/>
+                <w:caps w:val="0"/>
+                <w:sz w:val="22"/>
+              </w:rPr>
+              <w:t>minor</w:t>
+            </w:r>
+          </w:p>
+        </w:tc>
+        <w:tc>
+          <w:tcPr>
+            <w:tcW w:type="dxa" w:w="2160"/>
+          </w:tcPr>
+          <w:p>
+            <w:pPr>
+              <w:spacing w:line="240" w:lineRule="auto"/>
+            </w:pPr>
+            <w:r>
+              <w:rPr>
+                <w:rFonts w:ascii="Times New Roman" w:hAnsi="Times New Roman" w:eastAsia="Times New Roman"/>
+                <w:b/>
+                <w:caps w:val="0"/>
+                <w:sz w:val="22"/>
+              </w:rPr>
+              <w:t>major</w:t>
+            </w:r>
+          </w:p>
+        </w:tc>
+        <w:tc>
+          <w:tcPr>
+            <w:tcW w:type="dxa" w:w="2160"/>
+          </w:tcPr>
+          <w:p>
+            <w:pPr>
+              <w:spacing w:line="240" w:lineRule="auto"/>
+            </w:pPr>
+            <w:r>
+              <w:rPr>
+                <w:rFonts w:ascii="Times New Roman" w:hAnsi="Times New Roman" w:eastAsia="Times New Roman"/>
+                <w:b/>
+                <w:caps w:val="0"/>
+                <w:sz w:val="22"/>
+              </w:rPr>
+              <w:t>critical</w:t>
+            </w:r>
+          </w:p>
+        </w:tc>
+      </w:tr>
+      <w:tr>
+        <w:tc>
+          <w:tcPr>
+            <w:tcW w:type="dxa" w:w="2160"/>
+          </w:tcPr>
+          <w:p>
+            <w:pPr>
+              <w:spacing w:line="240" w:lineRule="auto"/>
+            </w:pPr>
+            <w:r>
+              <w:rPr>
+                <w:rFonts w:ascii="Times New Roman" w:hAnsi="Times New Roman" w:eastAsia="Times New Roman"/>
+                <w:b w:val="0"/>
+                <w:caps w:val="0"/>
+                <w:sz w:val="22"/>
+              </w:rPr>
+              <w:t>shape not matched</w:t>
+            </w:r>
+          </w:p>
+        </w:tc>
+        <w:tc>
+          <w:tcPr>
+            <w:tcW w:type="dxa" w:w="2160"/>
+          </w:tcPr>
+          <w:p>
+            <w:pPr>
+              <w:spacing w:line="240" w:lineRule="auto"/>
+            </w:pPr>
+            <w:r>
+              <w:rPr>
+                <w:rFonts w:ascii="Times New Roman" w:hAnsi="Times New Roman" w:eastAsia="Times New Roman"/>
+                <w:b w:val="0"/>
+                <w:caps w:val="0"/>
+                <w:sz w:val="22"/>
+              </w:rPr>
+              <w:t>78%</w:t>
+            </w:r>
+          </w:p>
+        </w:tc>
+        <w:tc>
+          <w:tcPr>
+            <w:tcW w:type="dxa" w:w="2160"/>
+          </w:tcPr>
+          <w:p>
+            <w:pPr>
+              <w:spacing w:line="240" w:lineRule="auto"/>
+            </w:pPr>
+            <w:r>
+              <w:rPr>
+                <w:rFonts w:ascii="Times New Roman" w:hAnsi="Times New Roman" w:eastAsia="Times New Roman"/>
+                <w:b w:val="0"/>
+                <w:caps w:val="0"/>
+                <w:sz w:val="22"/>
+              </w:rPr>
+              <w:t>62%</w:t>
+            </w:r>
+          </w:p>
+        </w:tc>
+        <w:tc>
+          <w:tcPr>
+            <w:tcW w:type="dxa" w:w="2160"/>
+          </w:tcPr>
+          <w:p>
+            <w:pPr>
+              <w:spacing w:line="240" w:lineRule="auto"/>
+            </w:pPr>
+            <w:r>
+              <w:rPr>
+                <w:rFonts w:ascii="Times New Roman" w:hAnsi="Times New Roman" w:eastAsia="Times New Roman"/>
+                <w:b w:val="0"/>
+                <w:caps w:val="0"/>
+                <w:sz w:val="22"/>
+              </w:rPr>
+              <w:t>28%</w:t>
+            </w:r>
+          </w:p>
+        </w:tc>
+      </w:tr>
+      <w:tr>
+        <w:tc>
+          <w:tcPr>
+            <w:tcW w:type="dxa" w:w="2160"/>
+          </w:tcPr>
+          <w:p>
+            <w:pPr>
+              <w:spacing w:line="240" w:lineRule="auto"/>
+            </w:pPr>
+            <w:r>
+              <w:rPr>
+                <w:rFonts w:ascii="Times New Roman" w:hAnsi="Times New Roman" w:eastAsia="Times New Roman"/>
+                <w:b w:val="0"/>
+                <w:caps w:val="0"/>
+                <w:sz w:val="22"/>
+              </w:rPr>
+              <w:t>control flow escapes</w:t>
+            </w:r>
+          </w:p>
+        </w:tc>
+        <w:tc>
+          <w:tcPr>
+            <w:tcW w:type="dxa" w:w="2160"/>
+          </w:tcPr>
+          <w:p>
+            <w:pPr>
+              <w:spacing w:line="240" w:lineRule="auto"/>
+            </w:pPr>
+            <w:r>
+              <w:rPr>
+                <w:rFonts w:ascii="Times New Roman" w:hAnsi="Times New Roman" w:eastAsia="Times New Roman"/>
+                <w:b w:val="0"/>
+                <w:caps w:val="0"/>
+                <w:sz w:val="22"/>
+              </w:rPr>
+              <w:t>17%</w:t>
+            </w:r>
+          </w:p>
+        </w:tc>
+        <w:tc>
+          <w:tcPr>
+            <w:tcW w:type="dxa" w:w="2160"/>
+          </w:tcPr>
+          <w:p>
+            <w:pPr>
+              <w:spacing w:line="240" w:lineRule="auto"/>
+            </w:pPr>
+            <w:r>
+              <w:rPr>
+                <w:rFonts w:ascii="Times New Roman" w:hAnsi="Times New Roman" w:eastAsia="Times New Roman"/>
+                <w:b w:val="0"/>
+                <w:caps w:val="0"/>
+                <w:sz w:val="22"/>
+              </w:rPr>
+              <w:t>30%</w:t>
+            </w:r>
+          </w:p>
+        </w:tc>
+        <w:tc>
+          <w:tcPr>
+            <w:tcW w:type="dxa" w:w="2160"/>
+          </w:tcPr>
+          <w:p>
+            <w:pPr>
+              <w:spacing w:line="240" w:lineRule="auto"/>
+            </w:pPr>
+            <w:r>
+              <w:rPr>
+                <w:rFonts w:ascii="Times New Roman" w:hAnsi="Times New Roman" w:eastAsia="Times New Roman"/>
+                <w:b w:val="0"/>
+                <w:caps w:val="0"/>
+                <w:sz w:val="22"/>
+              </w:rPr>
+              <w:t>62%</w:t>
+            </w:r>
+          </w:p>
+        </w:tc>
+      </w:tr>
+      <w:tr>
+        <w:tc>
+          <w:tcPr>
+            <w:tcW w:type="dxa" w:w="2160"/>
+          </w:tcPr>
+          <w:p>
+            <w:pPr>
+              <w:spacing w:line="240" w:lineRule="auto"/>
+            </w:pPr>
+            <w:r>
+              <w:rPr>
+                <w:rFonts w:ascii="Times New Roman" w:hAnsi="Times New Roman" w:eastAsia="Times New Roman"/>
+                <w:b w:val="0"/>
+                <w:caps w:val="0"/>
+                <w:sz w:val="22"/>
+              </w:rPr>
+              <w:t>not definitely assigned</w:t>
+            </w:r>
+          </w:p>
+        </w:tc>
+        <w:tc>
+          <w:tcPr>
+            <w:tcW w:type="dxa" w:w="2160"/>
+          </w:tcPr>
+          <w:p>
+            <w:pPr>
+              <w:spacing w:line="240" w:lineRule="auto"/>
+            </w:pPr>
+            <w:r>
+              <w:rPr>
+                <w:rFonts w:ascii="Times New Roman" w:hAnsi="Times New Roman" w:eastAsia="Times New Roman"/>
+                <w:b w:val="0"/>
+                <w:caps w:val="0"/>
+                <w:sz w:val="22"/>
+              </w:rPr>
+              <w:t>4%</w:t>
+            </w:r>
+          </w:p>
+        </w:tc>
+        <w:tc>
+          <w:tcPr>
+            <w:tcW w:type="dxa" w:w="2160"/>
+          </w:tcPr>
+          <w:p>
+            <w:pPr>
+              <w:spacing w:line="240" w:lineRule="auto"/>
+            </w:pPr>
+            <w:r>
+              <w:rPr>
+                <w:rFonts w:ascii="Times New Roman" w:hAnsi="Times New Roman" w:eastAsia="Times New Roman"/>
+                <w:b w:val="0"/>
+                <w:caps w:val="0"/>
+                <w:sz w:val="22"/>
+              </w:rPr>
+              <w:t>5%</w:t>
+            </w:r>
+          </w:p>
+        </w:tc>
+        <w:tc>
+          <w:tcPr>
+            <w:tcW w:type="dxa" w:w="2160"/>
+          </w:tcPr>
+          <w:p>
+            <w:pPr>
+              <w:spacing w:line="240" w:lineRule="auto"/>
+            </w:pPr>
+            <w:r>
+              <w:rPr>
+                <w:rFonts w:ascii="Times New Roman" w:hAnsi="Times New Roman" w:eastAsia="Times New Roman"/>
+                <w:b w:val="0"/>
+                <w:caps w:val="0"/>
+                <w:sz w:val="22"/>
+              </w:rPr>
+              <w:t>5%</w:t>
+            </w:r>
+          </w:p>
+        </w:tc>
+      </w:tr>
+      <w:tr>
+        <w:tc>
+          <w:tcPr>
+            <w:tcW w:type="dxa" w:w="2160"/>
+          </w:tcPr>
+          <w:p>
+            <w:pPr>
+              <w:spacing w:line="240" w:lineRule="auto"/>
+            </w:pPr>
+            <w:r>
+              <w:rPr>
+                <w:rFonts w:ascii="Times New Roman" w:hAnsi="Times New Roman" w:eastAsia="Times New Roman"/>
+                <w:b w:val="0"/>
+                <w:caps w:val="0"/>
+                <w:sz w:val="22"/>
+              </w:rPr>
+              <w:t>multiple outputs</w:t>
+            </w:r>
+          </w:p>
+        </w:tc>
+        <w:tc>
+          <w:tcPr>
+            <w:tcW w:type="dxa" w:w="2160"/>
+          </w:tcPr>
+          <w:p>
+            <w:pPr>
+              <w:spacing w:line="240" w:lineRule="auto"/>
+            </w:pPr>
+            <w:r>
+              <w:rPr>
+                <w:rFonts w:ascii="Times New Roman" w:hAnsi="Times New Roman" w:eastAsia="Times New Roman"/>
+                <w:b w:val="0"/>
+                <w:caps w:val="0"/>
+                <w:sz w:val="22"/>
+              </w:rPr>
+              <w:t>1%</w:t>
+            </w:r>
+          </w:p>
+        </w:tc>
+        <w:tc>
+          <w:tcPr>
+            <w:tcW w:type="dxa" w:w="2160"/>
+          </w:tcPr>
+          <w:p>
+            <w:pPr>
+              <w:spacing w:line="240" w:lineRule="auto"/>
+            </w:pPr>
+            <w:r>
+              <w:rPr>
+                <w:rFonts w:ascii="Times New Roman" w:hAnsi="Times New Roman" w:eastAsia="Times New Roman"/>
+                <w:b w:val="0"/>
+                <w:caps w:val="0"/>
+                <w:sz w:val="22"/>
+              </w:rPr>
+              <w:t>3%</w:t>
+            </w:r>
+          </w:p>
+        </w:tc>
+        <w:tc>
+          <w:tcPr>
+            <w:tcW w:type="dxa" w:w="2160"/>
+          </w:tcPr>
+          <w:p>
+            <w:pPr>
+              <w:spacing w:line="240" w:lineRule="auto"/>
+            </w:pPr>
+            <w:r>
+              <w:rPr>
+                <w:rFonts w:ascii="Times New Roman" w:hAnsi="Times New Roman" w:eastAsia="Times New Roman"/>
+                <w:b w:val="0"/>
+                <w:caps w:val="0"/>
+                <w:sz w:val="22"/>
+              </w:rPr>
+              <w:t>6%</w:t>
+            </w:r>
+          </w:p>
+        </w:tc>
+      </w:tr>
+      <w:tr>
+        <w:tc>
+          <w:tcPr>
+            <w:tcW w:type="dxa" w:w="2160"/>
+          </w:tcPr>
+          <w:p>
+            <w:pPr>
+              <w:spacing w:line="240" w:lineRule="auto"/>
+            </w:pPr>
+            <w:r>
+              <w:rPr>
+                <w:rFonts w:ascii="Times New Roman" w:hAnsi="Times New Roman" w:eastAsia="Times New Roman"/>
+                <w:b w:val="0"/>
+                <w:caps w:val="0"/>
+                <w:sz w:val="22"/>
+              </w:rPr>
+              <w:t>ambiguous overload</w:t>
+            </w:r>
+          </w:p>
+        </w:tc>
+        <w:tc>
+          <w:tcPr>
+            <w:tcW w:type="dxa" w:w="2160"/>
+          </w:tcPr>
+          <w:p>
+            <w:pPr>
+              <w:spacing w:line="240" w:lineRule="auto"/>
+            </w:pPr>
+            <w:r>
+              <w:rPr>
+                <w:rFonts w:ascii="Times New Roman" w:hAnsi="Times New Roman" w:eastAsia="Times New Roman"/>
+                <w:b w:val="0"/>
+                <w:caps w:val="0"/>
+                <w:sz w:val="22"/>
+              </w:rPr>
+              <w:t>0%</w:t>
+            </w:r>
+          </w:p>
+        </w:tc>
+        <w:tc>
+          <w:tcPr>
+            <w:tcW w:type="dxa" w:w="2160"/>
+          </w:tcPr>
+          <w:p>
+            <w:pPr>
+              <w:spacing w:line="240" w:lineRule="auto"/>
+            </w:pPr>
+            <w:r>
+              <w:rPr>
+                <w:rFonts w:ascii="Times New Roman" w:hAnsi="Times New Roman" w:eastAsia="Times New Roman"/>
+                <w:b w:val="0"/>
+                <w:caps w:val="0"/>
+                <w:sz w:val="22"/>
+              </w:rPr>
+              <w:t>0%</w:t>
+            </w:r>
+          </w:p>
+        </w:tc>
+        <w:tc>
+          <w:tcPr>
+            <w:tcW w:type="dxa" w:w="2160"/>
+          </w:tcPr>
+          <w:p>
+            <w:pPr>
+              <w:spacing w:line="240" w:lineRule="auto"/>
+            </w:pPr>
+            <w:r>
+              <w:rPr>
+                <w:rFonts w:ascii="Times New Roman" w:hAnsi="Times New Roman" w:eastAsia="Times New Roman"/>
+                <w:b w:val="0"/>
+                <w:caps w:val="0"/>
+                <w:sz w:val="22"/>
+              </w:rPr>
+              <w:t>0%</w:t>
+            </w:r>
+          </w:p>
+        </w:tc>
+      </w:tr>
+      <w:tr>
+        <w:tc>
+          <w:tcPr>
+            <w:tcW w:type="dxa" w:w="2160"/>
+          </w:tcPr>
+          <w:p>
+            <w:pPr>
+              <w:spacing w:line="240" w:lineRule="auto"/>
+            </w:pPr>
+            <w:r>
+              <w:rPr>
+                <w:rFonts w:ascii="Times New Roman" w:hAnsi="Times New Roman" w:eastAsia="Times New Roman"/>
+                <w:b w:val="0"/>
+                <w:caps w:val="0"/>
+                <w:sz w:val="22"/>
+              </w:rPr>
+              <w:t>unresolved name</w:t>
+            </w:r>
+          </w:p>
+        </w:tc>
+        <w:tc>
+          <w:tcPr>
+            <w:tcW w:type="dxa" w:w="2160"/>
+          </w:tcPr>
+          <w:p>
+            <w:pPr>
+              <w:spacing w:line="240" w:lineRule="auto"/>
+            </w:pPr>
+            <w:r>
+              <w:rPr>
+                <w:rFonts w:ascii="Times New Roman" w:hAnsi="Times New Roman" w:eastAsia="Times New Roman"/>
+                <w:b w:val="0"/>
+                <w:caps w:val="0"/>
+                <w:sz w:val="22"/>
+              </w:rPr>
+              <w:t>0%</w:t>
+            </w:r>
+          </w:p>
+        </w:tc>
+        <w:tc>
+          <w:tcPr>
+            <w:tcW w:type="dxa" w:w="2160"/>
+          </w:tcPr>
+          <w:p>
+            <w:pPr>
+              <w:spacing w:line="240" w:lineRule="auto"/>
+            </w:pPr>
+            <w:r>
+              <w:rPr>
+                <w:rFonts w:ascii="Times New Roman" w:hAnsi="Times New Roman" w:eastAsia="Times New Roman"/>
+                <w:b w:val="0"/>
+                <w:caps w:val="0"/>
+                <w:sz w:val="22"/>
+              </w:rPr>
+              <w:t>0%</w:t>
+            </w:r>
+          </w:p>
+        </w:tc>
+        <w:tc>
+          <w:tcPr>
+            <w:tcW w:type="dxa" w:w="2160"/>
+          </w:tcPr>
+          <w:p>
+            <w:pPr>
+              <w:spacing w:line="240" w:lineRule="auto"/>
+            </w:pPr>
+            <w:r>
+              <w:rPr>
+                <w:rFonts w:ascii="Times New Roman" w:hAnsi="Times New Roman" w:eastAsia="Times New Roman"/>
+                <w:b w:val="0"/>
+                <w:caps w:val="0"/>
+                <w:sz w:val="22"/>
+              </w:rPr>
+              <w:t>0%</w:t>
+            </w:r>
+          </w:p>
+        </w:tc>
+      </w:tr>
+    </w:tbl>
+    <w:p>
+      <w:pPr>
+        <w:spacing w:line="240" w:lineRule="auto" w:after="0"/>
+      </w:pPr>
+    </w:p>
+    <w:p>
+      <w:pPr>
+        <w:spacing w:line="360" w:lineRule="auto"/>
+        <w:ind w:firstLine="360"/>
+        <w:jc w:val="both"/>
+      </w:pPr>
+      <w:r>
+        <w:rPr>
+          <w:rFonts w:ascii="Times New Roman" w:hAnsi="Times New Roman" w:eastAsia="Times New Roman"/>
+          <w:b w:val="0"/>
+          <w:caps w:val="0"/>
+          <w:sz w:val="24"/>
+        </w:rPr>
+        <w:t>Sa më e rëndë metoda, aq më rrallë refuzimi vjen nga forma e kodit dhe aq më shpesh nga rrjedha e kontrollit. Shpjegimi është mekanik: një metodë e gjatë ose e ndërfutur thellë mban më shumë return, break e continue brenda bllokut, dhe Extract Method nuk e ngre dot një bllok nga i cili rrjedha del. Motori nuk refuzon më shpesh te rastet e rënda; refuzon për një arsye tjetër, dhe ajo arsye është ajo që zgjidhet më vështirë.</w:t>
+      </w:r>
+    </w:p>
+    <w:p>
+      <w:pPr>
+        <w:spacing w:line="360" w:lineRule="auto"/>
+        <w:ind w:firstLine="360"/>
+        <w:jc w:val="both"/>
+      </w:pPr>
+      <w:r>
+        <w:rPr>
+          <w:rFonts w:ascii="Times New Roman" w:hAnsi="Times New Roman" w:eastAsia="Times New Roman"/>
+          <w:b w:val="0"/>
+          <w:caps w:val="0"/>
+          <w:sz w:val="24"/>
+        </w:rPr>
+        <w:t>Ashpërsia e përdorur këtu është ajo e derivuar nga teprica mbi pragje, të cilën seksioni i mëparshëm e tregoi se nuk e riprodhon gjykimin e rishikuesve. Prandaj ky rezultat flet për motorin kundrejt renditjes së vetë mjetit, dhe jo kundrejt asaj se sa i rëndë është kodi në gjykimin e një zhvilluesi.</w:t>
+      </w:r>
+    </w:p>
+    <w:p>
+      <w:pPr>
+        <w:spacing w:line="360" w:lineRule="auto"/>
+        <w:ind w:firstLine="360"/>
+        <w:jc w:val="both"/>
+      </w:pPr>
+      <w:r>
+        <w:rPr>
+          <w:rFonts w:ascii="Times New Roman" w:hAnsi="Times New Roman" w:eastAsia="Times New Roman"/>
+          <w:b w:val="0"/>
+          <w:caps w:val="0"/>
+          <w:sz w:val="24"/>
+        </w:rPr>
         <w:t>Verifikimi tregoi vlerën e vet menjëherë. Mbi ekzekutimet e para u shënuan si prishëse dhjetëra rishkrime, dhe hetimi i tyre nxori tri defekte të vërteta në motor: deklarimet brenda një cikli të mëparshëm numëroheshin si të dukshme, kllapat e stilit C pas emrit nuk hynin në tip, dhe një variabël e pacaktuar kalohej si parametër. Të treja prodhonin kod që nuk kompilon.</w:t>
       </w:r>
     </w:p>
@@ -9453,7 +11455,7 @@
           <w:caps w:val="0"/>
           <w:sz w:val="22"/>
         </w:rPr>
-        <w:t>Tabela 12. Sa lëviz MCC-ja kur zhvendoset një prag</w:t>
+        <w:t>Tabela 14. Sa lëviz MCC-ja kur zhvendoset një prag</w:t>
       </w:r>
     </w:p>
     <w:tbl>
@@ -10688,7 +12690,7 @@
           <w:caps w:val="0"/>
           <w:sz w:val="22"/>
         </w:rPr>
-        <w:t>Tabela 13. Rregullat me pragje të kalibruara, të pikëzuara jashtë fold-it</w:t>
+        <w:t>Tabela 15. Rregullat me pragje të kalibruara, të pikëzuara jashtë fold-it</w:t>
       </w:r>
     </w:p>
     <w:tbl>
@@ -11397,7 +13399,7 @@
           <w:caps w:val="0"/>
           <w:sz w:val="22"/>
         </w:rPr>
-        <w:t>Tabela 14. Pajtimi i ashpërsisë me rishikuesit</w:t>
+        <w:t>Tabela 16. Pajtimi i ashpërsisë me rishikuesit</w:t>
       </w:r>
     </w:p>
     <w:tbl>
@@ -12177,7 +14179,7 @@
           <w:caps w:val="0"/>
           <w:sz w:val="22"/>
         </w:rPr>
-        <w:t>Tabela 15. Intervale besimi 95% për MCC-në</w:t>
+        <w:t>Tabela 17. Intervale besimi 95% për MCC-në</w:t>
       </w:r>
     </w:p>
     <w:tbl>
@@ -12782,7 +14784,7 @@
           <w:caps w:val="0"/>
           <w:sz w:val="22"/>
         </w:rPr>
-        <w:t>Tabela 16. B − A kur rregullat marrin pragun e tyre më të mirë</w:t>
+        <w:t>Tabela 18. B − A kur rregullat marrin pragun e tyre më të mirë</w:t>
       </w:r>
     </w:p>
     <w:tbl>
@@ -13333,7 +15335,7 @@
           <w:caps w:val="0"/>
           <w:sz w:val="22"/>
         </w:rPr>
-        <w:t>Tabela 17. Sa pajtohen rishikuesit me njëri-tjetrin</w:t>
+        <w:t>Tabela 19. Sa pajtohen rishikuesit me njëri-tjetrin</w:t>
       </w:r>
     </w:p>
     <w:tbl>
@@ -14805,7 +16807,7 @@
           <w:caps w:val="0"/>
           <w:sz w:val="22"/>
         </w:rPr>
-        <w:t>Tabela 18. Strategjitë e detektimit dhe burimet e tyre</w:t>
+        <w:t>Tabela 20. Strategjitë e detektimit dhe burimet e tyre</w:t>
       </w:r>
     </w:p>
     <w:tbl>
@@ -15586,7 +17588,7 @@
           <w:caps w:val="0"/>
           <w:sz w:val="22"/>
         </w:rPr>
-        <w:t>Tabela 19. Kuantifikuesit e përgjithshëm</w:t>
+        <w:t>Tabela 21. Kuantifikuesit e përgjithshëm</w:t>
       </w:r>
     </w:p>
     <w:tbl>
@@ -16033,7 +18035,7 @@
           <w:caps w:val="0"/>
           <w:sz w:val="22"/>
         </w:rPr>
-        <w:t>Tabela 20. Pragjet e përdorura</w:t>
+        <w:t>Tabela 22. Pragjet e përdorura</w:t>
       </w:r>
     </w:p>
     <w:tbl>
@@ -17054,7 +19056,7 @@
           <w:caps w:val="0"/>
           <w:sz w:val="22"/>
         </w:rPr>
-        <w:t>Tabela 21. Metrikat sipas nivelit</w:t>
+        <w:t>Tabela 23. Metrikat sipas nivelit</w:t>
       </w:r>
     </w:p>
     <w:tbl>
@@ -17235,7 +19237,7 @@
           <w:caps w:val="0"/>
           <w:sz w:val="22"/>
         </w:rPr>
-        <w:t>Tabela 22. Çka propozohet dhe çka aplikohet</w:t>
+        <w:t>Tabela 24. Çka propozohet dhe çka aplikohet</w:t>
       </w:r>
     </w:p>
     <w:tbl>
@@ -17814,7 +19816,7 @@
           <w:caps w:val="0"/>
           <w:sz w:val="22"/>
         </w:rPr>
-        <w:t>Tabela 23. Arsyet e refuzimit</w:t>
+        <w:t>Tabela 25. Arsyet e refuzimit</w:t>
       </w:r>
     </w:p>
     <w:tbl>
@@ -18275,7 +20277,7 @@
           <w:caps w:val="0"/>
           <w:sz w:val="22"/>
         </w:rPr>
-        <w:t>Tabela 24. Radha e ekzekutimit</w:t>
+        <w:t>Tabela 26. Radha e ekzekutimit</w:t>
       </w:r>
     </w:p>
     <w:tbl>

</xml_diff>

<commit_message>
Shpjego ne Kapitullin 6 pse suitat e testeve nuk u ekzekutuan
</commit_message>
<xml_diff>
--- a/docs/thesis/Punim_Diplome_Florent_Latifi.docx
+++ b/docs/thesis/Punim_Diplome_Florent_Latifi.docx
@@ -16009,6 +16009,22 @@
           <w:sz w:val="24"/>
         </w:rPr>
         <w:t>Verifikimi i refaktorimeve është më i dobët se sa do të dëshirohej. Kompilimi i izoluar nuk është i mundur për shumicën e skedarëve, ndaj për ta pretendimi kufizohet te «nuk shton lloj të ri gabimi». Verifikimi me suitat e testeve të vetë projekteve mbetet punë e ardhshme.</w:t>
+      </w:r>
+    </w:p>
+    <w:p>
+      <w:pPr>
+        <w:spacing w:line="360" w:lineRule="auto"/>
+        <w:ind w:firstLine="360"/>
+        <w:jc w:val="both"/>
+      </w:pPr>
+      <w:r>
+        <w:rPr>
+          <w:rFonts w:ascii="Times New Roman" w:hAnsi="Times New Roman" w:eastAsia="Times New Roman"/>
+          <w:b w:val="0"/>
+          <w:caps w:val="0"/>
+          <w:sz w:val="24"/>
+        </w:rPr>
+        <w:t>Arsyeja pse ai verifikim nuk u bë është vetë ndërtimi i korpusit, jo mungesa e kohës. Shkarkuesi ruan me qëllim vetëm skedarët me prapashtesë «.java», sepse kjo është gjithçka që i duhet analizës dhe e mban korpusin të vogël. Pasoja është se korpusi nuk mban asnjë përkufizim ndërtimi dhe asnjë varësi: skedarët e testeve janë aty, por pa «pom.xml» ose «build.gradle» dhe pa bibliotekat e treta ata as kompilohen dhe as ekzekutohen. Ekzekutimi i tyre do të kërkonte rimarrjen e plotë të të gjitha arkivave dhe ndërtimin e secilës depo në commit-in e vet historik, ku ndërtimet e sotme dështojnë rëndom për shtojca të vjetruara.</w:t>
       </w:r>
     </w:p>
     <w:p>

</xml_diff>

<commit_message>
Raporto forcimin e verdiktit ne Kapitullin 5.4
</commit_message>
<xml_diff>
--- a/docs/thesis/Punim_Diplome_Florent_Latifi.docx
+++ b/docs/thesis/Punim_Diplome_Florent_Latifi.docx
@@ -1035,7 +1035,7 @@
           <w:caps w:val="0"/>
           <w:sz w:val="24"/>
         </w:rPr>
-        <w:t>Tabela 12. Norma e transformimit sipas erës dhe ashpërsisë</w:t>
+        <w:t>Tabela 12. Verdikti i të njëjtave rishkrime, të izoluara dhe brenda projektit</w:t>
       </w:r>
     </w:p>
     <w:p>
@@ -1051,7 +1051,7 @@
           <w:caps w:val="0"/>
           <w:sz w:val="24"/>
         </w:rPr>
-        <w:t>Tabela 13. Përbërja e arsyeve të refuzimit brenda çdo niveli</w:t>
+        <w:t>Tabela 13. Norma e transformimit sipas erës dhe ashpërsisë</w:t>
       </w:r>
     </w:p>
     <w:p>
@@ -1067,7 +1067,7 @@
           <w:caps w:val="0"/>
           <w:sz w:val="24"/>
         </w:rPr>
-        <w:t>Tabela 14. Sa lëviz MCC-ja kur zhvendoset një prag</w:t>
+        <w:t>Tabela 14. Përbërja e arsyeve të refuzimit brenda çdo niveli</w:t>
       </w:r>
     </w:p>
     <w:p>
@@ -1083,7 +1083,7 @@
           <w:caps w:val="0"/>
           <w:sz w:val="24"/>
         </w:rPr>
-        <w:t>Tabela 15. Rregullat me pragje të kalibruara, të pikëzuara jashtë fold-it</w:t>
+        <w:t>Tabela 15. Sa lëviz MCC-ja kur zhvendoset një prag</w:t>
       </w:r>
     </w:p>
     <w:p>
@@ -1099,7 +1099,7 @@
           <w:caps w:val="0"/>
           <w:sz w:val="24"/>
         </w:rPr>
-        <w:t>Tabela 16. Pajtimi i ashpërsisë me rishikuesit</w:t>
+        <w:t>Tabela 16. Rregullat me pragje të kalibruara, të pikëzuara jashtë fold-it</w:t>
       </w:r>
     </w:p>
     <w:p>
@@ -1115,7 +1115,7 @@
           <w:caps w:val="0"/>
           <w:sz w:val="24"/>
         </w:rPr>
-        <w:t>Tabela 17. Intervale besimi 95% për MCC-në</w:t>
+        <w:t>Tabela 17. Pajtimi i ashpërsisë me rishikuesit</w:t>
       </w:r>
     </w:p>
     <w:p>
@@ -1131,7 +1131,7 @@
           <w:caps w:val="0"/>
           <w:sz w:val="24"/>
         </w:rPr>
-        <w:t>Tabela 18. B − A kur rregullat marrin pragun e tyre më të mirë</w:t>
+        <w:t>Tabela 18. Intervale besimi 95% për MCC-në</w:t>
       </w:r>
     </w:p>
     <w:p>
@@ -1147,7 +1147,7 @@
           <w:caps w:val="0"/>
           <w:sz w:val="24"/>
         </w:rPr>
-        <w:t>Tabela 19. Sa pajtohen rishikuesit me njëri-tjetrin</w:t>
+        <w:t>Tabela 19. B − A kur rregullat marrin pragun e tyre më të mirë</w:t>
       </w:r>
     </w:p>
     <w:p>
@@ -1163,7 +1163,7 @@
           <w:caps w:val="0"/>
           <w:sz w:val="24"/>
         </w:rPr>
-        <w:t>Tabela 20. Strategjitë e detektimit dhe burimet e tyre</w:t>
+        <w:t>Tabela 20. Sa pajtohen rishikuesit me njëri-tjetrin</w:t>
       </w:r>
     </w:p>
     <w:p>
@@ -1179,7 +1179,7 @@
           <w:caps w:val="0"/>
           <w:sz w:val="24"/>
         </w:rPr>
-        <w:t>Tabela 21. Kuantifikuesit e përgjithshëm</w:t>
+        <w:t>Tabela 21. Strategjitë e detektimit dhe burimet e tyre</w:t>
       </w:r>
     </w:p>
     <w:p>
@@ -1195,7 +1195,7 @@
           <w:caps w:val="0"/>
           <w:sz w:val="24"/>
         </w:rPr>
-        <w:t>Tabela 22. Pragjet e përdorura</w:t>
+        <w:t>Tabela 22. Kuantifikuesit e përgjithshëm</w:t>
       </w:r>
     </w:p>
     <w:p>
@@ -1211,7 +1211,7 @@
           <w:caps w:val="0"/>
           <w:sz w:val="24"/>
         </w:rPr>
-        <w:t>Tabela 23. Metrikat sipas nivelit</w:t>
+        <w:t>Tabela 23. Pragjet e përdorura</w:t>
       </w:r>
     </w:p>
     <w:p>
@@ -1227,7 +1227,7 @@
           <w:caps w:val="0"/>
           <w:sz w:val="24"/>
         </w:rPr>
-        <w:t>Tabela 24. Çka propozohet dhe çka aplikohet</w:t>
+        <w:t>Tabela 24. Metrikat sipas nivelit</w:t>
       </w:r>
     </w:p>
     <w:p>
@@ -1243,7 +1243,7 @@
           <w:caps w:val="0"/>
           <w:sz w:val="24"/>
         </w:rPr>
-        <w:t>Tabela 25. Arsyet e refuzimit</w:t>
+        <w:t>Tabela 25. Çka propozohet dhe çka aplikohet</w:t>
       </w:r>
     </w:p>
     <w:p>
@@ -1259,7 +1259,23 @@
           <w:caps w:val="0"/>
           <w:sz w:val="24"/>
         </w:rPr>
-        <w:t>Tabela 26. Radha e ekzekutimit</w:t>
+        <w:t>Tabela 26. Arsyet e refuzimit</w:t>
+      </w:r>
+    </w:p>
+    <w:p>
+      <w:pPr>
+        <w:spacing w:line="360" w:lineRule="auto"/>
+        <w:ind w:firstLine="360"/>
+        <w:jc w:val="both"/>
+      </w:pPr>
+      <w:r>
+        <w:rPr>
+          <w:rFonts w:ascii="Times New Roman" w:hAnsi="Times New Roman" w:eastAsia="Times New Roman"/>
+          <w:b w:val="0"/>
+          <w:caps w:val="0"/>
+          <w:sz w:val="24"/>
+        </w:rPr>
+        <w:t>Tabela 27. Radha e ekzekutimit</w:t>
       </w:r>
     </w:p>
     <w:p>
@@ -9424,7 +9440,7 @@
           <w:caps w:val="0"/>
           <w:sz w:val="24"/>
         </w:rPr>
-        <w:t>Norma e përgjithshme nuk thotë cilat vende u refuzuan. Një mjet që rishkruan rastet e buta dhe tërhiqet nga ato të rënda vlen shumë më pak se sa sugjeron ajo shifër, ndaj çdo vend u nda edhe sipas ashpërsisë që i cakton vetë sistemi.</w:t>
+        <w:t>Kufiri i këtij verifikimi është izolimi, jo transformimi. Skedari kompilohet i vetëm, dhe një skedar i një depoje reale i importon fqinjët e vet, ndaj për shumicën pretendimi bie te «nuk shton lloj të ri gabimi». Sa do të fitohej po të mos ishte i izoluar u mat mbi një mostër: i njëjti rishkrim u kompilua dy herë, i vetëm dhe me burimet e vetë projektit të arritshme, mbi 30 skedarë dhe 152 rishkrime.</w:t>
       </w:r>
     </w:p>
     <w:p>
@@ -9439,7 +9455,339 @@
           <w:caps w:val="0"/>
           <w:sz w:val="22"/>
         </w:rPr>
-        <w:t>Tabela 12. Norma e transformimit sipas erës dhe ashpërsisë</w:t>
+        <w:t>Tabela 12. Verdikti i të njëjtave rishkrime, të izoluara dhe brenda projektit</w:t>
+      </w:r>
+    </w:p>
+    <w:tbl>
+      <w:tblPr>
+        <w:tblStyle w:val="TableGrid"/>
+        <w:tblW w:type="auto" w:w="0"/>
+        <w:tblLook w:firstColumn="1" w:firstRow="1" w:lastColumn="0" w:lastRow="0" w:noHBand="0" w:noVBand="1" w:val="04A0"/>
+      </w:tblPr>
+      <w:tblGrid>
+        <w:gridCol w:w="2880"/>
+        <w:gridCol w:w="2880"/>
+        <w:gridCol w:w="2880"/>
+      </w:tblGrid>
+      <w:tr>
+        <w:tc>
+          <w:tcPr>
+            <w:tcW w:type="dxa" w:w="2880"/>
+          </w:tcPr>
+          <w:p>
+            <w:pPr>
+              <w:spacing w:line="240" w:lineRule="auto"/>
+            </w:pPr>
+            <w:r>
+              <w:rPr>
+                <w:rFonts w:ascii="Times New Roman" w:hAnsi="Times New Roman" w:eastAsia="Times New Roman"/>
+                <w:b/>
+                <w:caps w:val="0"/>
+                <w:sz w:val="22"/>
+              </w:rPr>
+              <w:t>Verdikti</w:t>
+            </w:r>
+          </w:p>
+        </w:tc>
+        <w:tc>
+          <w:tcPr>
+            <w:tcW w:type="dxa" w:w="2880"/>
+          </w:tcPr>
+          <w:p>
+            <w:pPr>
+              <w:spacing w:line="240" w:lineRule="auto"/>
+            </w:pPr>
+            <w:r>
+              <w:rPr>
+                <w:rFonts w:ascii="Times New Roman" w:hAnsi="Times New Roman" w:eastAsia="Times New Roman"/>
+                <w:b/>
+                <w:caps w:val="0"/>
+                <w:sz w:val="22"/>
+              </w:rPr>
+              <w:t>I izoluar</w:t>
+            </w:r>
+          </w:p>
+        </w:tc>
+        <w:tc>
+          <w:tcPr>
+            <w:tcW w:type="dxa" w:w="2880"/>
+          </w:tcPr>
+          <w:p>
+            <w:pPr>
+              <w:spacing w:line="240" w:lineRule="auto"/>
+            </w:pPr>
+            <w:r>
+              <w:rPr>
+                <w:rFonts w:ascii="Times New Roman" w:hAnsi="Times New Roman" w:eastAsia="Times New Roman"/>
+                <w:b/>
+                <w:caps w:val="0"/>
+                <w:sz w:val="22"/>
+              </w:rPr>
+              <w:t>Brenda projektit</w:t>
+            </w:r>
+          </w:p>
+        </w:tc>
+      </w:tr>
+      <w:tr>
+        <w:tc>
+          <w:tcPr>
+            <w:tcW w:type="dxa" w:w="2880"/>
+          </w:tcPr>
+          <w:p>
+            <w:pPr>
+              <w:spacing w:line="240" w:lineRule="auto"/>
+            </w:pPr>
+            <w:r>
+              <w:rPr>
+                <w:rFonts w:ascii="Times New Roman" w:hAnsi="Times New Roman" w:eastAsia="Times New Roman"/>
+                <w:b w:val="0"/>
+                <w:caps w:val="0"/>
+                <w:sz w:val="22"/>
+              </w:rPr>
+              <w:t>compiles</w:t>
+            </w:r>
+          </w:p>
+        </w:tc>
+        <w:tc>
+          <w:tcPr>
+            <w:tcW w:type="dxa" w:w="2880"/>
+          </w:tcPr>
+          <w:p>
+            <w:pPr>
+              <w:spacing w:line="240" w:lineRule="auto"/>
+            </w:pPr>
+            <w:r>
+              <w:rPr>
+                <w:rFonts w:ascii="Times New Roman" w:hAnsi="Times New Roman" w:eastAsia="Times New Roman"/>
+                <w:b w:val="0"/>
+                <w:caps w:val="0"/>
+                <w:sz w:val="22"/>
+              </w:rPr>
+              <w:t>1</w:t>
+            </w:r>
+          </w:p>
+        </w:tc>
+        <w:tc>
+          <w:tcPr>
+            <w:tcW w:type="dxa" w:w="2880"/>
+          </w:tcPr>
+          <w:p>
+            <w:pPr>
+              <w:spacing w:line="240" w:lineRule="auto"/>
+            </w:pPr>
+            <w:r>
+              <w:rPr>
+                <w:rFonts w:ascii="Times New Roman" w:hAnsi="Times New Roman" w:eastAsia="Times New Roman"/>
+                <w:b w:val="0"/>
+                <w:caps w:val="0"/>
+                <w:sz w:val="22"/>
+              </w:rPr>
+              <w:t>20</w:t>
+            </w:r>
+          </w:p>
+        </w:tc>
+      </w:tr>
+      <w:tr>
+        <w:tc>
+          <w:tcPr>
+            <w:tcW w:type="dxa" w:w="2880"/>
+          </w:tcPr>
+          <w:p>
+            <w:pPr>
+              <w:spacing w:line="240" w:lineRule="auto"/>
+            </w:pPr>
+            <w:r>
+              <w:rPr>
+                <w:rFonts w:ascii="Times New Roman" w:hAnsi="Times New Roman" w:eastAsia="Times New Roman"/>
+                <w:b w:val="0"/>
+                <w:caps w:val="0"/>
+                <w:sz w:val="22"/>
+              </w:rPr>
+              <w:t>no new errors</w:t>
+            </w:r>
+          </w:p>
+        </w:tc>
+        <w:tc>
+          <w:tcPr>
+            <w:tcW w:type="dxa" w:w="2880"/>
+          </w:tcPr>
+          <w:p>
+            <w:pPr>
+              <w:spacing w:line="240" w:lineRule="auto"/>
+            </w:pPr>
+            <w:r>
+              <w:rPr>
+                <w:rFonts w:ascii="Times New Roman" w:hAnsi="Times New Roman" w:eastAsia="Times New Roman"/>
+                <w:b w:val="0"/>
+                <w:caps w:val="0"/>
+                <w:sz w:val="22"/>
+              </w:rPr>
+              <w:t>151</w:t>
+            </w:r>
+          </w:p>
+        </w:tc>
+        <w:tc>
+          <w:tcPr>
+            <w:tcW w:type="dxa" w:w="2880"/>
+          </w:tcPr>
+          <w:p>
+            <w:pPr>
+              <w:spacing w:line="240" w:lineRule="auto"/>
+            </w:pPr>
+            <w:r>
+              <w:rPr>
+                <w:rFonts w:ascii="Times New Roman" w:hAnsi="Times New Roman" w:eastAsia="Times New Roman"/>
+                <w:b w:val="0"/>
+                <w:caps w:val="0"/>
+                <w:sz w:val="22"/>
+              </w:rPr>
+              <w:t>127</w:t>
+            </w:r>
+          </w:p>
+        </w:tc>
+      </w:tr>
+      <w:tr>
+        <w:tc>
+          <w:tcPr>
+            <w:tcW w:type="dxa" w:w="2880"/>
+          </w:tcPr>
+          <w:p>
+            <w:pPr>
+              <w:spacing w:line="240" w:lineRule="auto"/>
+            </w:pPr>
+            <w:r>
+              <w:rPr>
+                <w:rFonts w:ascii="Times New Roman" w:hAnsi="Times New Roman" w:eastAsia="Times New Roman"/>
+                <w:b w:val="0"/>
+                <w:caps w:val="0"/>
+                <w:sz w:val="22"/>
+              </w:rPr>
+              <w:t>not checked</w:t>
+            </w:r>
+          </w:p>
+        </w:tc>
+        <w:tc>
+          <w:tcPr>
+            <w:tcW w:type="dxa" w:w="2880"/>
+          </w:tcPr>
+          <w:p>
+            <w:pPr>
+              <w:spacing w:line="240" w:lineRule="auto"/>
+            </w:pPr>
+            <w:r>
+              <w:rPr>
+                <w:rFonts w:ascii="Times New Roman" w:hAnsi="Times New Roman" w:eastAsia="Times New Roman"/>
+                <w:b w:val="0"/>
+                <w:caps w:val="0"/>
+                <w:sz w:val="22"/>
+              </w:rPr>
+              <w:t>0</w:t>
+            </w:r>
+          </w:p>
+        </w:tc>
+        <w:tc>
+          <w:tcPr>
+            <w:tcW w:type="dxa" w:w="2880"/>
+          </w:tcPr>
+          <w:p>
+            <w:pPr>
+              <w:spacing w:line="240" w:lineRule="auto"/>
+            </w:pPr>
+            <w:r>
+              <w:rPr>
+                <w:rFonts w:ascii="Times New Roman" w:hAnsi="Times New Roman" w:eastAsia="Times New Roman"/>
+                <w:b w:val="0"/>
+                <w:caps w:val="0"/>
+                <w:sz w:val="22"/>
+              </w:rPr>
+              <w:t>5</w:t>
+            </w:r>
+          </w:p>
+        </w:tc>
+      </w:tr>
+    </w:tbl>
+    <w:p>
+      <w:pPr>
+        <w:spacing w:line="240" w:lineRule="auto" w:after="0"/>
+      </w:pPr>
+    </w:p>
+    <w:p>
+      <w:pPr>
+        <w:spacing w:line="360" w:lineRule="auto"/>
+        <w:ind w:firstLine="360"/>
+        <w:jc w:val="both"/>
+      </w:pPr>
+      <w:r>
+        <w:rPr>
+          <w:rFonts w:ascii="Times New Roman" w:hAnsi="Times New Roman" w:eastAsia="Times New Roman"/>
+          <w:b w:val="0"/>
+          <w:caps w:val="0"/>
+          <w:sz w:val="24"/>
+        </w:rPr>
+        <w:t>Verdikti më i fortë kalon nga 1 te 20 nga 152 rishkrime, pra nga 0.7% në 13.2%. Kjo do të thotë se pjesa dërrmuese e rasteve ku sistemi thotë vetëm «nuk shtova gabim» janë raste ku ai nuk mund të thoshte më shumë për shkak të mënyrës së kompilimit, jo për shkak të rishkrimit.</w:t>
+      </w:r>
+    </w:p>
+    <w:p>
+      <w:pPr>
+        <w:spacing w:line="360" w:lineRule="auto"/>
+        <w:ind w:firstLine="360"/>
+        <w:jc w:val="both"/>
+      </w:pPr>
+      <w:r>
+        <w:rPr>
+          <w:rFonts w:ascii="Times New Roman" w:hAnsi="Times New Roman" w:eastAsia="Times New Roman"/>
+          <w:b w:val="0"/>
+          <w:caps w:val="0"/>
+          <w:sz w:val="24"/>
+        </w:rPr>
+        <w:t>Po aq me rëndësi është se asnjë verdikt nuk u përmbys: 0 rishkrime kaluan te «me gabim të ri». Asgjë që kalon e izoluar nuk dështon kur skedari kompilohet brenda projektit të vet, çka është arsyeja pse toleranca «pa lloj të ri gabimi» mbetet e përdorshme si dëshmi edhe atje ku kompilimi i plotë nuk arrihet. 5 kompilime e kaluan kufirin kohor dhe numërohen si të pakontrolluara, kurrë si sukses.</w:t>
+      </w:r>
+    </w:p>
+    <w:p>
+      <w:pPr>
+        <w:spacing w:line="360" w:lineRule="auto"/>
+        <w:ind w:firstLine="360"/>
+        <w:jc w:val="both"/>
+      </w:pPr>
+      <w:r>
+        <w:rPr>
+          <w:rFonts w:ascii="Times New Roman" w:hAnsi="Times New Roman" w:eastAsia="Times New Roman"/>
+          <w:b w:val="0"/>
+          <w:caps w:val="0"/>
+          <w:sz w:val="24"/>
+        </w:rPr>
+        <w:t>Mostra është e vogël dhe e mbjellë me farë: kompilimi në kontekst zgjat rreth gjashtë minuta për skedar, sepse detyron kompilimin e tërë mbylljes së varësive të tij. Verdiktet e raportuara më lart mbi tërë korpusin mbeten ato të izoluara; kjo matje nuk i zëvendëson, por tregon në ç'drejtim do të lëviznin.</w:t>
+      </w:r>
+    </w:p>
+    <w:p>
+      <w:pPr>
+        <w:spacing w:line="360" w:lineRule="auto"/>
+        <w:ind w:firstLine="360"/>
+        <w:jc w:val="both"/>
+      </w:pPr>
+      <w:r>
+        <w:rPr>
+          <w:rFonts w:ascii="Times New Roman" w:hAnsi="Times New Roman" w:eastAsia="Times New Roman"/>
+          <w:b w:val="0"/>
+          <w:caps w:val="0"/>
+          <w:sz w:val="24"/>
+        </w:rPr>
+        <w:t>Norma e përgjithshme nuk thotë cilat vende u refuzuan. Një mjet që rishkruan rastet e buta dhe tërhiqet nga ato të rënda vlen shumë më pak se sa sugjeron ajo shifër, ndaj çdo vend u nda edhe sipas ashpërsisë që i cakton vetë sistemi.</w:t>
+      </w:r>
+    </w:p>
+    <w:p>
+      <w:pPr>
+        <w:spacing w:line="240" w:lineRule="auto"/>
+        <w:jc w:val="center"/>
+      </w:pPr>
+      <w:r>
+        <w:rPr>
+          <w:rFonts w:ascii="Times New Roman" w:hAnsi="Times New Roman" w:eastAsia="Times New Roman"/>
+          <w:b w:val="0"/>
+          <w:caps w:val="0"/>
+          <w:sz w:val="22"/>
+        </w:rPr>
+        <w:t>Tabela 13. Norma e transformimit sipas erës dhe ashpërsisë</w:t>
       </w:r>
     </w:p>
     <w:tbl>
@@ -10782,7 +11130,7 @@
           <w:caps w:val="0"/>
           <w:sz w:val="22"/>
         </w:rPr>
-        <w:t>Tabela 13. Përbërja e arsyeve të refuzimit brenda çdo niveli</w:t>
+        <w:t>Tabela 14. Përbërja e arsyeve të refuzimit brenda çdo niveli</w:t>
       </w:r>
     </w:p>
     <w:tbl>
@@ -11455,7 +11803,7 @@
           <w:caps w:val="0"/>
           <w:sz w:val="22"/>
         </w:rPr>
-        <w:t>Tabela 14. Sa lëviz MCC-ja kur zhvendoset një prag</w:t>
+        <w:t>Tabela 15. Sa lëviz MCC-ja kur zhvendoset një prag</w:t>
       </w:r>
     </w:p>
     <w:tbl>
@@ -12690,7 +13038,7 @@
           <w:caps w:val="0"/>
           <w:sz w:val="22"/>
         </w:rPr>
-        <w:t>Tabela 15. Rregullat me pragje të kalibruara, të pikëzuara jashtë fold-it</w:t>
+        <w:t>Tabela 16. Rregullat me pragje të kalibruara, të pikëzuara jashtë fold-it</w:t>
       </w:r>
     </w:p>
     <w:tbl>
@@ -13399,7 +13747,7 @@
           <w:caps w:val="0"/>
           <w:sz w:val="22"/>
         </w:rPr>
-        <w:t>Tabela 16. Pajtimi i ashpërsisë me rishikuesit</w:t>
+        <w:t>Tabela 17. Pajtimi i ashpërsisë me rishikuesit</w:t>
       </w:r>
     </w:p>
     <w:tbl>
@@ -14179,7 +14527,7 @@
           <w:caps w:val="0"/>
           <w:sz w:val="22"/>
         </w:rPr>
-        <w:t>Tabela 17. Intervale besimi 95% për MCC-në</w:t>
+        <w:t>Tabela 18. Intervale besimi 95% për MCC-në</w:t>
       </w:r>
     </w:p>
     <w:tbl>
@@ -14784,7 +15132,7 @@
           <w:caps w:val="0"/>
           <w:sz w:val="22"/>
         </w:rPr>
-        <w:t>Tabela 18. B − A kur rregullat marrin pragun e tyre më të mirë</w:t>
+        <w:t>Tabela 19. B − A kur rregullat marrin pragun e tyre më të mirë</w:t>
       </w:r>
     </w:p>
     <w:tbl>
@@ -15335,7 +15683,7 @@
           <w:caps w:val="0"/>
           <w:sz w:val="22"/>
         </w:rPr>
-        <w:t>Tabela 19. Sa pajtohen rishikuesit me njëri-tjetrin</w:t>
+        <w:t>Tabela 20. Sa pajtohen rishikuesit me njëri-tjetrin</w:t>
       </w:r>
     </w:p>
     <w:tbl>
@@ -16823,7 +17171,7 @@
           <w:caps w:val="0"/>
           <w:sz w:val="22"/>
         </w:rPr>
-        <w:t>Tabela 20. Strategjitë e detektimit dhe burimet e tyre</w:t>
+        <w:t>Tabela 21. Strategjitë e detektimit dhe burimet e tyre</w:t>
       </w:r>
     </w:p>
     <w:tbl>
@@ -17604,7 +17952,7 @@
           <w:caps w:val="0"/>
           <w:sz w:val="22"/>
         </w:rPr>
-        <w:t>Tabela 21. Kuantifikuesit e përgjithshëm</w:t>
+        <w:t>Tabela 22. Kuantifikuesit e përgjithshëm</w:t>
       </w:r>
     </w:p>
     <w:tbl>
@@ -18051,7 +18399,7 @@
           <w:caps w:val="0"/>
           <w:sz w:val="22"/>
         </w:rPr>
-        <w:t>Tabela 22. Pragjet e përdorura</w:t>
+        <w:t>Tabela 23. Pragjet e përdorura</w:t>
       </w:r>
     </w:p>
     <w:tbl>
@@ -19072,7 +19420,7 @@
           <w:caps w:val="0"/>
           <w:sz w:val="22"/>
         </w:rPr>
-        <w:t>Tabela 23. Metrikat sipas nivelit</w:t>
+        <w:t>Tabela 24. Metrikat sipas nivelit</w:t>
       </w:r>
     </w:p>
     <w:tbl>
@@ -19253,7 +19601,7 @@
           <w:caps w:val="0"/>
           <w:sz w:val="22"/>
         </w:rPr>
-        <w:t>Tabela 24. Çka propozohet dhe çka aplikohet</w:t>
+        <w:t>Tabela 25. Çka propozohet dhe çka aplikohet</w:t>
       </w:r>
     </w:p>
     <w:tbl>
@@ -19832,7 +20180,7 @@
           <w:caps w:val="0"/>
           <w:sz w:val="22"/>
         </w:rPr>
-        <w:t>Tabela 25. Arsyet e refuzimit</w:t>
+        <w:t>Tabela 26. Arsyet e refuzimit</w:t>
       </w:r>
     </w:p>
     <w:tbl>
@@ -20293,7 +20641,7 @@
           <w:caps w:val="0"/>
           <w:sz w:val="22"/>
         </w:rPr>
-        <w:t>Tabela 26. Radha e ekzekutimit</w:t>
+        <w:t>Tabela 27. Radha e ekzekutimit</w:t>
       </w:r>
     </w:p>
     <w:tbl>

</xml_diff>

<commit_message>
Plotesa radhen e riprodhimit me te pesembedhjete skriptet
</commit_message>
<xml_diff>
--- a/docs/thesis/Punim_Diplome_Florent_Latifi.docx
+++ b/docs/thesis/Punim_Diplome_Florent_Latifi.docx
@@ -20847,7 +20847,7 @@
                 <w:caps w:val="0"/>
                 <w:sz w:val="22"/>
               </w:rPr>
-              <w:t>build_dataset.py</w:t>
+              <w:t>report_matching.py</w:t>
             </w:r>
           </w:p>
         </w:tc>
@@ -20866,7 +20866,7 @@
                 <w:caps w:val="0"/>
                 <w:sz w:val="22"/>
               </w:rPr>
-              <w:t>tabela e veçorive, e komituar</w:t>
+              <w:t>mbulimi i përputhjes MLCQ↔entitet</w:t>
             </w:r>
           </w:p>
         </w:tc>
@@ -20885,7 +20885,7 @@
                 <w:caps w:val="0"/>
                 <w:sz w:val="22"/>
               </w:rPr>
-              <w:t>~95 min</w:t>
+              <w:t>~2 min</w:t>
             </w:r>
           </w:p>
         </w:tc>
@@ -20925,7 +20925,7 @@
                 <w:caps w:val="0"/>
                 <w:sz w:val="22"/>
               </w:rPr>
-              <w:t>evaluate_rules.py --from-dataset</w:t>
+              <w:t>build_dataset.py</w:t>
             </w:r>
           </w:p>
         </w:tc>
@@ -20944,7 +20944,7 @@
                 <w:caps w:val="0"/>
                 <w:sz w:val="22"/>
               </w:rPr>
-              <w:t>numrat e Qasjes A</w:t>
+              <w:t>tabela e veçorive, e komituar</w:t>
             </w:r>
           </w:p>
         </w:tc>
@@ -20963,7 +20963,7 @@
                 <w:caps w:val="0"/>
                 <w:sz w:val="22"/>
               </w:rPr>
-              <w:t>sekonda</w:t>
+              <w:t>~95 min</w:t>
             </w:r>
           </w:p>
         </w:tc>
@@ -21003,7 +21003,7 @@
                 <w:caps w:val="0"/>
                 <w:sz w:val="22"/>
               </w:rPr>
-              <w:t>train_models.py</w:t>
+              <w:t>evaluate_rules.py --from-dataset</w:t>
             </w:r>
           </w:p>
         </w:tc>
@@ -21022,7 +21022,7 @@
                 <w:caps w:val="0"/>
                 <w:sz w:val="22"/>
               </w:rPr>
-              <w:t>numrat e Qasjes B dhe modelet</w:t>
+              <w:t>numrat e Qasjes A</w:t>
             </w:r>
           </w:p>
         </w:tc>
@@ -21081,7 +21081,7 @@
                 <w:caps w:val="0"/>
                 <w:sz w:val="22"/>
               </w:rPr>
-              <w:t>sweep_thresholds.py</w:t>
+              <w:t>train_models.py</w:t>
             </w:r>
           </w:p>
         </w:tc>
@@ -21100,7 +21100,7 @@
                 <w:caps w:val="0"/>
                 <w:sz w:val="22"/>
               </w:rPr>
-              <w:t>analiza e ndjeshmërisë</w:t>
+              <w:t>numrat e Qasjes B dhe modelet</w:t>
             </w:r>
           </w:p>
         </w:tc>
@@ -21159,7 +21159,7 @@
                 <w:caps w:val="0"/>
                 <w:sz w:val="22"/>
               </w:rPr>
-              <w:t>evaluate_refactorings.py</w:t>
+              <w:t>sweep_thresholds.py</w:t>
             </w:r>
           </w:p>
         </w:tc>
@@ -21178,7 +21178,7 @@
                 <w:caps w:val="0"/>
                 <w:sz w:val="22"/>
               </w:rPr>
-              <w:t>tabela N/M/K e Qasjes C</w:t>
+              <w:t>analiza e ndjeshmërisë</w:t>
             </w:r>
           </w:p>
         </w:tc>
@@ -21197,7 +21197,7 @@
                 <w:caps w:val="0"/>
                 <w:sz w:val="22"/>
               </w:rPr>
-              <w:t>orë</w:t>
+              <w:t>sekonda</w:t>
             </w:r>
           </w:p>
         </w:tc>
@@ -21237,7 +21237,7 @@
                 <w:caps w:val="0"/>
                 <w:sz w:val="22"/>
               </w:rPr>
-              <w:t>calibrate_thresholds.py</w:t>
+              <w:t>evaluate_refactorings.py</w:t>
             </w:r>
           </w:p>
         </w:tc>
@@ -21256,7 +21256,7 @@
                 <w:caps w:val="0"/>
                 <w:sz w:val="22"/>
               </w:rPr>
-              <w:t>pragjet e kalibruara jashtë fold-it</w:t>
+              <w:t>tabela N/M/K e Qasjes C</w:t>
             </w:r>
           </w:p>
         </w:tc>
@@ -21275,7 +21275,7 @@
                 <w:caps w:val="0"/>
                 <w:sz w:val="22"/>
               </w:rPr>
-              <w:t>~1 min</w:t>
+              <w:t>orë</w:t>
             </w:r>
           </w:p>
         </w:tc>
@@ -21315,7 +21315,7 @@
                 <w:caps w:val="0"/>
                 <w:sz w:val="22"/>
               </w:rPr>
-              <w:t>reviewer_agreement.py</w:t>
+              <w:t>calibrate_thresholds.py</w:t>
             </w:r>
           </w:p>
         </w:tc>
@@ -21334,7 +21334,7 @@
                 <w:caps w:val="0"/>
                 <w:sz w:val="22"/>
               </w:rPr>
-              <w:t>tavani i pajtimit mes rishikuesve</w:t>
+              <w:t>pragjet e kalibruara jashtë fold-it</w:t>
             </w:r>
           </w:p>
         </w:tc>
@@ -21353,7 +21353,7 @@
                 <w:caps w:val="0"/>
                 <w:sz w:val="22"/>
               </w:rPr>
-              <w:t>sekonda</w:t>
+              <w:t>~1 min</w:t>
             </w:r>
           </w:p>
         </w:tc>
@@ -21393,7 +21393,7 @@
                 <w:caps w:val="0"/>
                 <w:sz w:val="22"/>
               </w:rPr>
-              <w:t>bootstrap_intervals.py</w:t>
+              <w:t>reviewer_agreement.py</w:t>
             </w:r>
           </w:p>
         </w:tc>
@@ -21412,7 +21412,7 @@
                 <w:caps w:val="0"/>
                 <w:sz w:val="22"/>
               </w:rPr>
-              <w:t>intervalet e besimit</w:t>
+              <w:t>tavani i pajtimit mes rishikuesve</w:t>
             </w:r>
           </w:p>
         </w:tc>
@@ -21431,7 +21431,7 @@
                 <w:caps w:val="0"/>
                 <w:sz w:val="22"/>
               </w:rPr>
-              <w:t>nën një minutë</w:t>
+              <w:t>sekonda</w:t>
             </w:r>
           </w:p>
         </w:tc>
@@ -21471,7 +21471,7 @@
                 <w:caps w:val="0"/>
                 <w:sz w:val="22"/>
               </w:rPr>
-              <w:t>export_system_reference.py</w:t>
+              <w:t>bootstrap_intervals.py</w:t>
             </w:r>
           </w:p>
         </w:tc>
@@ -21490,7 +21490,7 @@
                 <w:caps w:val="0"/>
                 <w:sz w:val="22"/>
               </w:rPr>
-              <w:t>tabelat e kësaj shtojce</w:t>
+              <w:t>intervalet e besimit</w:t>
             </w:r>
           </w:p>
         </w:tc>
@@ -21509,7 +21509,7 @@
                 <w:caps w:val="0"/>
                 <w:sz w:val="22"/>
               </w:rPr>
-              <w:t>sekonda</w:t>
+              <w:t>nën një minutë</w:t>
             </w:r>
           </w:p>
         </w:tc>
@@ -21531,6 +21531,318 @@
                 <w:sz w:val="22"/>
               </w:rPr>
               <w:t>11</w:t>
+            </w:r>
+          </w:p>
+        </w:tc>
+        <w:tc>
+          <w:tcPr>
+            <w:tcW w:type="dxa" w:w="2160"/>
+          </w:tcPr>
+          <w:p>
+            <w:pPr>
+              <w:spacing w:line="240" w:lineRule="auto"/>
+            </w:pPr>
+            <w:r>
+              <w:rPr>
+                <w:rFonts w:ascii="Times New Roman" w:hAnsi="Times New Roman" w:eastAsia="Times New Roman"/>
+                <w:b w:val="0"/>
+                <w:caps w:val="0"/>
+                <w:sz w:val="22"/>
+              </w:rPr>
+              <w:t>refusals_by_severity.py</w:t>
+            </w:r>
+          </w:p>
+        </w:tc>
+        <w:tc>
+          <w:tcPr>
+            <w:tcW w:type="dxa" w:w="2160"/>
+          </w:tcPr>
+          <w:p>
+            <w:pPr>
+              <w:spacing w:line="240" w:lineRule="auto"/>
+            </w:pPr>
+            <w:r>
+              <w:rPr>
+                <w:rFonts w:ascii="Times New Roman" w:hAnsi="Times New Roman" w:eastAsia="Times New Roman"/>
+                <w:b w:val="0"/>
+                <w:caps w:val="0"/>
+                <w:sz w:val="22"/>
+              </w:rPr>
+              <w:t>refuzimet sipas erës dhe ashpërsisë</w:t>
+            </w:r>
+          </w:p>
+        </w:tc>
+        <w:tc>
+          <w:tcPr>
+            <w:tcW w:type="dxa" w:w="2160"/>
+          </w:tcPr>
+          <w:p>
+            <w:pPr>
+              <w:spacing w:line="240" w:lineRule="auto"/>
+            </w:pPr>
+            <w:r>
+              <w:rPr>
+                <w:rFonts w:ascii="Times New Roman" w:hAnsi="Times New Roman" w:eastAsia="Times New Roman"/>
+                <w:b w:val="0"/>
+                <w:caps w:val="0"/>
+                <w:sz w:val="22"/>
+              </w:rPr>
+              <w:t>~2 min</w:t>
+            </w:r>
+          </w:p>
+        </w:tc>
+      </w:tr>
+      <w:tr>
+        <w:tc>
+          <w:tcPr>
+            <w:tcW w:type="dxa" w:w="2160"/>
+          </w:tcPr>
+          <w:p>
+            <w:pPr>
+              <w:spacing w:line="240" w:lineRule="auto"/>
+            </w:pPr>
+            <w:r>
+              <w:rPr>
+                <w:rFonts w:ascii="Times New Roman" w:hAnsi="Times New Roman" w:eastAsia="Times New Roman"/>
+                <w:b w:val="0"/>
+                <w:caps w:val="0"/>
+                <w:sz w:val="22"/>
+              </w:rPr>
+              <w:t>12</w:t>
+            </w:r>
+          </w:p>
+        </w:tc>
+        <w:tc>
+          <w:tcPr>
+            <w:tcW w:type="dxa" w:w="2160"/>
+          </w:tcPr>
+          <w:p>
+            <w:pPr>
+              <w:spacing w:line="240" w:lineRule="auto"/>
+            </w:pPr>
+            <w:r>
+              <w:rPr>
+                <w:rFonts w:ascii="Times New Roman" w:hAnsi="Times New Roman" w:eastAsia="Times New Roman"/>
+                <w:b w:val="0"/>
+                <w:caps w:val="0"/>
+                <w:sz w:val="22"/>
+              </w:rPr>
+              <w:t>verify_with_project.py</w:t>
+            </w:r>
+          </w:p>
+        </w:tc>
+        <w:tc>
+          <w:tcPr>
+            <w:tcW w:type="dxa" w:w="2160"/>
+          </w:tcPr>
+          <w:p>
+            <w:pPr>
+              <w:spacing w:line="240" w:lineRule="auto"/>
+            </w:pPr>
+            <w:r>
+              <w:rPr>
+                <w:rFonts w:ascii="Times New Roman" w:hAnsi="Times New Roman" w:eastAsia="Times New Roman"/>
+                <w:b w:val="0"/>
+                <w:caps w:val="0"/>
+                <w:sz w:val="22"/>
+              </w:rPr>
+              <w:t>verdikti brenda kontekstit të projektit</w:t>
+            </w:r>
+          </w:p>
+        </w:tc>
+        <w:tc>
+          <w:tcPr>
+            <w:tcW w:type="dxa" w:w="2160"/>
+          </w:tcPr>
+          <w:p>
+            <w:pPr>
+              <w:spacing w:line="240" w:lineRule="auto"/>
+            </w:pPr>
+            <w:r>
+              <w:rPr>
+                <w:rFonts w:ascii="Times New Roman" w:hAnsi="Times New Roman" w:eastAsia="Times New Roman"/>
+                <w:b w:val="0"/>
+                <w:caps w:val="0"/>
+                <w:sz w:val="22"/>
+              </w:rPr>
+              <w:t>~18 min</w:t>
+            </w:r>
+          </w:p>
+        </w:tc>
+      </w:tr>
+      <w:tr>
+        <w:tc>
+          <w:tcPr>
+            <w:tcW w:type="dxa" w:w="2160"/>
+          </w:tcPr>
+          <w:p>
+            <w:pPr>
+              <w:spacing w:line="240" w:lineRule="auto"/>
+            </w:pPr>
+            <w:r>
+              <w:rPr>
+                <w:rFonts w:ascii="Times New Roman" w:hAnsi="Times New Roman" w:eastAsia="Times New Roman"/>
+                <w:b w:val="0"/>
+                <w:caps w:val="0"/>
+                <w:sz w:val="22"/>
+              </w:rPr>
+              <w:t>13</w:t>
+            </w:r>
+          </w:p>
+        </w:tc>
+        <w:tc>
+          <w:tcPr>
+            <w:tcW w:type="dxa" w:w="2160"/>
+          </w:tcPr>
+          <w:p>
+            <w:pPr>
+              <w:spacing w:line="240" w:lineRule="auto"/>
+            </w:pPr>
+            <w:r>
+              <w:rPr>
+                <w:rFonts w:ascii="Times New Roman" w:hAnsi="Times New Roman" w:eastAsia="Times New Roman"/>
+                <w:b w:val="0"/>
+                <w:caps w:val="0"/>
+                <w:sz w:val="22"/>
+              </w:rPr>
+              <w:t>model_without_project.py</w:t>
+            </w:r>
+          </w:p>
+        </w:tc>
+        <w:tc>
+          <w:tcPr>
+            <w:tcW w:type="dxa" w:w="2160"/>
+          </w:tcPr>
+          <w:p>
+            <w:pPr>
+              <w:spacing w:line="240" w:lineRule="auto"/>
+            </w:pPr>
+            <w:r>
+              <w:rPr>
+                <w:rFonts w:ascii="Times New Roman" w:hAnsi="Times New Roman" w:eastAsia="Times New Roman"/>
+                <w:b w:val="0"/>
+                <w:caps w:val="0"/>
+                <w:sz w:val="22"/>
+              </w:rPr>
+              <w:t>Qasja B pa kontekstin e projektit</w:t>
+            </w:r>
+          </w:p>
+        </w:tc>
+        <w:tc>
+          <w:tcPr>
+            <w:tcW w:type="dxa" w:w="2160"/>
+          </w:tcPr>
+          <w:p>
+            <w:pPr>
+              <w:spacing w:line="240" w:lineRule="auto"/>
+            </w:pPr>
+            <w:r>
+              <w:rPr>
+                <w:rFonts w:ascii="Times New Roman" w:hAnsi="Times New Roman" w:eastAsia="Times New Roman"/>
+                <w:b w:val="0"/>
+                <w:caps w:val="0"/>
+                <w:sz w:val="22"/>
+              </w:rPr>
+              <w:t>~2 min</w:t>
+            </w:r>
+          </w:p>
+        </w:tc>
+      </w:tr>
+      <w:tr>
+        <w:tc>
+          <w:tcPr>
+            <w:tcW w:type="dxa" w:w="2160"/>
+          </w:tcPr>
+          <w:p>
+            <w:pPr>
+              <w:spacing w:line="240" w:lineRule="auto"/>
+            </w:pPr>
+            <w:r>
+              <w:rPr>
+                <w:rFonts w:ascii="Times New Roman" w:hAnsi="Times New Roman" w:eastAsia="Times New Roman"/>
+                <w:b w:val="0"/>
+                <w:caps w:val="0"/>
+                <w:sz w:val="22"/>
+              </w:rPr>
+              <w:t>14</w:t>
+            </w:r>
+          </w:p>
+        </w:tc>
+        <w:tc>
+          <w:tcPr>
+            <w:tcW w:type="dxa" w:w="2160"/>
+          </w:tcPr>
+          <w:p>
+            <w:pPr>
+              <w:spacing w:line="240" w:lineRule="auto"/>
+            </w:pPr>
+            <w:r>
+              <w:rPr>
+                <w:rFonts w:ascii="Times New Roman" w:hAnsi="Times New Roman" w:eastAsia="Times New Roman"/>
+                <w:b w:val="0"/>
+                <w:caps w:val="0"/>
+                <w:sz w:val="22"/>
+              </w:rPr>
+              <w:t>export_system_reference.py</w:t>
+            </w:r>
+          </w:p>
+        </w:tc>
+        <w:tc>
+          <w:tcPr>
+            <w:tcW w:type="dxa" w:w="2160"/>
+          </w:tcPr>
+          <w:p>
+            <w:pPr>
+              <w:spacing w:line="240" w:lineRule="auto"/>
+            </w:pPr>
+            <w:r>
+              <w:rPr>
+                <w:rFonts w:ascii="Times New Roman" w:hAnsi="Times New Roman" w:eastAsia="Times New Roman"/>
+                <w:b w:val="0"/>
+                <w:caps w:val="0"/>
+                <w:sz w:val="22"/>
+              </w:rPr>
+              <w:t>tabelat e kësaj shtojce</w:t>
+            </w:r>
+          </w:p>
+        </w:tc>
+        <w:tc>
+          <w:tcPr>
+            <w:tcW w:type="dxa" w:w="2160"/>
+          </w:tcPr>
+          <w:p>
+            <w:pPr>
+              <w:spacing w:line="240" w:lineRule="auto"/>
+            </w:pPr>
+            <w:r>
+              <w:rPr>
+                <w:rFonts w:ascii="Times New Roman" w:hAnsi="Times New Roman" w:eastAsia="Times New Roman"/>
+                <w:b w:val="0"/>
+                <w:caps w:val="0"/>
+                <w:sz w:val="22"/>
+              </w:rPr>
+              <w:t>sekonda</w:t>
+            </w:r>
+          </w:p>
+        </w:tc>
+      </w:tr>
+      <w:tr>
+        <w:tc>
+          <w:tcPr>
+            <w:tcW w:type="dxa" w:w="2160"/>
+          </w:tcPr>
+          <w:p>
+            <w:pPr>
+              <w:spacing w:line="240" w:lineRule="auto"/>
+            </w:pPr>
+            <w:r>
+              <w:rPr>
+                <w:rFonts w:ascii="Times New Roman" w:hAnsi="Times New Roman" w:eastAsia="Times New Roman"/>
+                <w:b w:val="0"/>
+                <w:caps w:val="0"/>
+                <w:sz w:val="22"/>
+              </w:rPr>
+              <w:t>15</w:t>
             </w:r>
           </w:p>
         </w:tc>

</xml_diff>

<commit_message>
Nxirr shifrat e Kapitullit 5 nga rezultatet, jo nga teksti
</commit_message>
<xml_diff>
--- a/docs/thesis/Punim_Diplome_Florent_Latifi.docx
+++ b/docs/thesis/Punim_Diplome_Florent_Latifi.docx
@@ -7414,7 +7414,7 @@
           <w:caps w:val="0"/>
           <w:sz w:val="24"/>
         </w:rPr>
-        <w:t>Prerja tregon të kundërtën dhe është më e dobishmja e të dyjave. Kur të dyja qasjet pajtohen, precizioni ngrihet mbi 0.80 te çdo erë dhe deri në 0.905 te Long Method — dukshëm mbi secilën qasje veç. Recall-i bie ndjeshëm, ndaj MCC-ja del e ulët, por për një përdorues që kërkon pak alarme të rreme pajtimi i dy qasjeve të pavarura është sinjali më i fortë që sistemi prodhon.</w:t>
+        <w:t>Prerja tregon të kundërtën dhe është më e dobishmja e të dyjave. Kur të dyja qasjet pajtohen, precizioni ngrihet te ose mbi 0.80 te çdo erë dhe deri në 0.905 te Long Method — dukshëm mbi secilën qasje veç. Recall-i bie ndjeshëm, ndaj MCC-ja del e ulët, por për një përdorues që kërkon pak alarme të rreme pajtimi i dy qasjeve të pavarura është sinjali më i fortë që sistemi prodhon.</w:t>
       </w:r>
     </w:p>
     <w:p>
@@ -9772,7 +9772,7 @@
           <w:caps w:val="0"/>
           <w:sz w:val="24"/>
         </w:rPr>
-        <w:t>Norma e përgjithshme nuk thotë cilat vende u refuzuan. Një mjet që rishkruan rastet e buta dhe tërhiqet nga ato të rënda vlen shumë më pak se sa sugjeron ajo shifër, ndaj çdo vend u nda edhe sipas ashpërsisë që i cakton vetë sistemi.</w:t>
+        <w:t>Norma e përgjithshme prej 20.4% nuk thotë cilat vende u refuzuan. Një mjet që rishkruan rastet e buta dhe tërhiqet nga ato të rënda vlen shumë më pak se sa sugjeron ajo shifër, ndaj çdo vend u nda edhe sipas ashpërsisë që i cakton vetë sistemi.</w:t>
       </w:r>
     </w:p>
     <w:p>

</xml_diff>

<commit_message>
Pergjigju pyetjes se trete ne termat e vet
</commit_message>
<xml_diff>
--- a/docs/thesis/Punim_Diplome_Florent_Latifi.docx
+++ b/docs/thesis/Punim_Diplome_Florent_Latifi.docx
@@ -7398,7 +7398,25 @@
           <w:caps w:val="0"/>
           <w:sz w:val="24"/>
         </w:rPr>
-        <w:t>Përgjigjja është jo. Bashkimi e ngre recall-in ndjeshëm, por çmimi në precizion e fshin fitimin: MCC-ja mezi lëviz te Blob dhe Data Class, dhe **bie** te Long Method e Feature Envy. Ironia është se Feature Envy ishte pikërisht era ku vërejtja premtonte më shumë — dhe atje bashkimi del më keq, sepse bashkë me trembëdhjetë rastet që rregulli i kap vijnë edhe pozitivët e tij të rremë.</w:t>
+        <w:t xml:space="preserve">Përgjigjja është jo. Bashkimi e ngre recall-in ndjeshëm, por çmimi në precizion e fshin fitimin: MCC-ja mezi lëviz te Blob dhe Data Class, dhe </w:t>
+      </w:r>
+      <w:r>
+        <w:rPr>
+          <w:rFonts w:ascii="Times New Roman" w:hAnsi="Times New Roman" w:eastAsia="Times New Roman"/>
+          <w:b/>
+          <w:caps w:val="0"/>
+          <w:sz w:val="24"/>
+        </w:rPr>
+        <w:t>bie</w:t>
+      </w:r>
+      <w:r>
+        <w:rPr>
+          <w:rFonts w:ascii="Times New Roman" w:hAnsi="Times New Roman" w:eastAsia="Times New Roman"/>
+          <w:b w:val="0"/>
+          <w:caps w:val="0"/>
+          <w:sz w:val="24"/>
+        </w:rPr>
+        <w:t xml:space="preserve"> te Long Method e Feature Envy. Ironia është se Feature Envy ishte pikërisht era ku vërejtja premtonte më shumë — dhe atje bashkimi del më keq, sepse bashkë me trembëdhjetë rastet që rregulli i kap vijnë edhe pozitivët e tij të rremë.</w:t>
       </w:r>
     </w:p>
     <w:p>
@@ -13654,7 +13672,25 @@
           <w:caps w:val="0"/>
           <w:sz w:val="24"/>
         </w:rPr>
-        <w:t>Rezultati ndahet në dy pjesë. Për Feature Envy kalibrimi jep fitimin më të madh dhe më të besueshmin: **të pesë foldet zgjodhën të njëjtën vlerë**, dhe përmirësohen njëkohësisht edhe precizioni edhe recall-i. Kjo e forcon vërejtjen e mësipërme se klauzola e numrit të klasave-burim nuk e bën punën për të cilën është vendosur. Për Long Method fitimi është gjithashtu i qartë, por foldet ndahen mes dy vlerave dhe blihet me precizion.</w:t>
+        <w:t xml:space="preserve">Rezultati ndahet në dy pjesë. Për Feature Envy kalibrimi jep fitimin më të madh dhe më të besueshmin: </w:t>
+      </w:r>
+      <w:r>
+        <w:rPr>
+          <w:rFonts w:ascii="Times New Roman" w:hAnsi="Times New Roman" w:eastAsia="Times New Roman"/>
+          <w:b/>
+          <w:caps w:val="0"/>
+          <w:sz w:val="24"/>
+        </w:rPr>
+        <w:t>të pesë foldet zgjodhën të njëjtën vlerë</w:t>
+      </w:r>
+      <w:r>
+        <w:rPr>
+          <w:rFonts w:ascii="Times New Roman" w:hAnsi="Times New Roman" w:eastAsia="Times New Roman"/>
+          <w:b w:val="0"/>
+          <w:caps w:val="0"/>
+          <w:sz w:val="24"/>
+        </w:rPr>
+        <w:t>, dhe përmirësohen njëkohësisht edhe precizioni edhe recall-i. Kjo e forcon vërejtjen e mësipërme se klauzola e numrit të klasave-burim nuk e bën punën për të cilën është vendosur. Për Long Method fitimi është gjithashtu i qartë, por foldet ndahen mes dy vlerave dhe blihet me precizion.</w:t>
       </w:r>
     </w:p>
     <w:p>
@@ -14512,7 +14548,25 @@
           <w:caps w:val="0"/>
           <w:sz w:val="24"/>
         </w:rPr>
-        <w:t>Çdo shifër e mësipërme është një vlerësim i vetëm mbi një korpus të caktuar. Për të matur sa varet ajo nga korpusi, çdo tregues u riprodhua me bootstrap mbi 2000 rimostrime, duke rimostruar **depo** e jo rreshta: mostrat e së njëjtës depo ndajnë autorë dhe konvencione, ndaj rimostrimi i rreshtave do të prodhonte intervale artificialisht të ngushta, për të njëjtën arsye që ndarja e trajnimit është e grupuar.</w:t>
+        <w:t xml:space="preserve">Çdo shifër e mësipërme është një vlerësim i vetëm mbi një korpus të caktuar. Për të matur sa varet ajo nga korpusi, çdo tregues u riprodhua me bootstrap mbi 2000 rimostrime, duke rimostruar </w:t>
+      </w:r>
+      <w:r>
+        <w:rPr>
+          <w:rFonts w:ascii="Times New Roman" w:hAnsi="Times New Roman" w:eastAsia="Times New Roman"/>
+          <w:b/>
+          <w:caps w:val="0"/>
+          <w:sz w:val="24"/>
+        </w:rPr>
+        <w:t>depo</w:t>
+      </w:r>
+      <w:r>
+        <w:rPr>
+          <w:rFonts w:ascii="Times New Roman" w:hAnsi="Times New Roman" w:eastAsia="Times New Roman"/>
+          <w:b w:val="0"/>
+          <w:caps w:val="0"/>
+          <w:sz w:val="24"/>
+        </w:rPr>
+        <w:t xml:space="preserve"> e jo rreshta: mostrat e së njëjtës depo ndajnë autorë dhe konvencione, ndaj rimostrimi i rreshtave do të prodhonte intervale artificialisht të ngushta, për të njëjtën arsye që ndarja e trajnimit është e grupuar.</w:t>
       </w:r>
     </w:p>
     <w:p>
@@ -16561,6 +16615,40 @@
           <w:sz w:val="24"/>
         </w:rPr>
         <w:t>Përgjigjet e shkurtra ndaj tri pyetjeve kërkimore janë: strategjitë e publikuara janë të sakta por të kursyera; një klasifikues mbi të njëjtat metrika është dukshëm më i mirë dhe i rizbulon pjesërisht metrikat e strategjive; dhe një pjesë e vogël por reale e rasteve të detektuara mund të transformohet automatikisht, ku shumica e refuzimeve vjen nga forma e kodit dhe nga rrjedha e kontrollit.</w:t>
+      </w:r>
+    </w:p>
+    <w:p>
+      <w:pPr>
+        <w:spacing w:line="360" w:lineRule="auto"/>
+        <w:ind w:firstLine="360"/>
+        <w:jc w:val="both"/>
+      </w:pPr>
+      <w:r>
+        <w:rPr>
+          <w:rFonts w:ascii="Times New Roman" w:hAnsi="Times New Roman" w:eastAsia="Times New Roman"/>
+          <w:b w:val="0"/>
+          <w:caps w:val="0"/>
+          <w:sz w:val="24"/>
+        </w:rPr>
+        <w:t xml:space="preserve">Pyetja e tretë kërkon dy gjëra, dhe ato u arritën në shkallë të ndryshme. Kompilueshmëria u verifikua për çdo rishkrim të aplikuar: shumica nuk shton asnjë lloj të ri gabimi, një pakicë e vogël e shton dhe numërohet si e tillë, dhe kur skedari kompilohet brenda projektit të vet e jo i izoluar, pjesa që kompilon plotësisht rritet ndjeshëm pa asnjë verdikt të përmbysur. Ruajtja e sjelljes, përkundrazi, </w:t>
+      </w:r>
+      <w:r>
+        <w:rPr>
+          <w:rFonts w:ascii="Times New Roman" w:hAnsi="Times New Roman" w:eastAsia="Times New Roman"/>
+          <w:b/>
+          <w:caps w:val="0"/>
+          <w:sz w:val="24"/>
+        </w:rPr>
+        <w:t>nuk u mat</w:t>
+      </w:r>
+      <w:r>
+        <w:rPr>
+          <w:rFonts w:ascii="Times New Roman" w:hAnsi="Times New Roman" w:eastAsia="Times New Roman"/>
+          <w:b w:val="0"/>
+          <w:caps w:val="0"/>
+          <w:sz w:val="24"/>
+        </w:rPr>
+        <w:t>: ajo do të kërkonte ekzekutimin e suitave të testeve të vetë depove, të cilat korpusi nuk i mban. Prandaj përgjigjja ndaj asaj pyetjeje është e plotë për gjysmën e parë dhe e hapur për të dytën, dhe kjo deklarohet këtu me po aq qartësi sa te Nënkapitulli 6.3.</w:t>
       </w:r>
     </w:p>
     <w:p>

</xml_diff>

<commit_message>
Kontrollo tabelen e riprodhimit kundrejt skripteve
</commit_message>
<xml_diff>
--- a/docs/thesis/Punim_Diplome_Florent_Latifi.docx
+++ b/docs/thesis/Punim_Diplome_Florent_Latifi.docx
@@ -21091,7 +21091,7 @@
                 <w:caps w:val="0"/>
                 <w:sz w:val="22"/>
               </w:rPr>
-              <w:t>evaluate_rules.py --from-dataset</w:t>
+              <w:t>evaluate_rules.py --from-dataset data/results/mlcq_dataset.csv</w:t>
             </w:r>
           </w:p>
         </w:tc>
@@ -21207,7 +21207,7 @@
                 <w:caps w:val="0"/>
                 <w:sz w:val="22"/>
               </w:rPr>
-              <w:t>sekonda</w:t>
+              <w:t>~3 min</w:t>
             </w:r>
           </w:p>
         </w:tc>
@@ -21441,7 +21441,7 @@
                 <w:caps w:val="0"/>
                 <w:sz w:val="22"/>
               </w:rPr>
-              <w:t>~1 min</w:t>
+              <w:t>sekonda</w:t>
             </w:r>
           </w:p>
         </w:tc>
@@ -22011,7 +22011,7 @@
           <w:caps w:val="0"/>
           <w:sz w:val="24"/>
         </w:rPr>
-        <w:t>Çdo skript shkruan rezultatin si CSV ose JSON në data/results/, bashkë me commit-in, versionin e Python-it dhe platformën që e prodhuan. Numrat e këtij punimi u prodhuan me commit-in 1ee9f0ecd9, Python 3.13.1, Windows-11-10.0.26200-SP0.</w:t>
+        <w:t>Çdo skript shkruan rezultatin si CSV ose JSON në data/results/, bashkë me commit-in, versionin e Python-it dhe platformën që e prodhuan. Numrat e këtij punimi u prodhuan me commit-in 40b3d7b240, Python 3.13.1, Windows-11-10.0.26200-SP0.</w:t>
       </w:r>
     </w:p>
     <w:p>
@@ -22028,6 +22028,22 @@
           <w:sz w:val="24"/>
         </w:rPr>
         <w:t>Kapitulli 5 dhe kjo shtojcë ndërtohen nga ata skedarë, ndaj rigjenerimi i eksperimentit dhe rigjenerimi i dokumentit japin gjithmonë të njëjtat vlera.</w:t>
+      </w:r>
+    </w:p>
+    <w:p>
+      <w:pPr>
+        <w:spacing w:line="360" w:lineRule="auto"/>
+        <w:ind w:firstLine="360"/>
+        <w:jc w:val="both"/>
+      </w:pPr>
+      <w:r>
+        <w:rPr>
+          <w:rFonts w:ascii="Times New Roman" w:hAnsi="Times New Roman" w:eastAsia="Times New Roman"/>
+          <w:b w:val="0"/>
+          <w:caps w:val="0"/>
+          <w:sz w:val="24"/>
+        </w:rPr>
+        <w:t>Ky premtim u vu në provë më 3 shtator 2026. Njëmbëdhjetë nga të pesëmbëdhjetë hapat — të gjithë ata që mbarojnë brenda pak minutash — u ri-ekzekutuan mbi të njëjtat hyrje. Çdo skedar rezultati doli identik me atë të komituar, përveç commit-it dhe kohëzgjatjes që secili regjistron; të katër modelet e stërvitura dolën identike bajt për bajt; dhe asnjëra prej figurave nuk ndryshoi. Hapat 1, 3, 7 dhe 12 kërkojnë nga dhjetëra minuta deri në orë dhe nuk u ri-ekzekutuan atë ditë: për ta, riprodhimi mbetet pretendim i pakontrolluar, dhe thuhet këtu si i tillë.</w:t>
       </w:r>
     </w:p>
     <w:sectPr>

</xml_diff>

<commit_message>
Raporto commit-in e cdo skedari rezultati, jo nje te vetem
</commit_message>
<xml_diff>
--- a/docs/thesis/Punim_Diplome_Florent_Latifi.docx
+++ b/docs/thesis/Punim_Diplome_Florent_Latifi.docx
@@ -1280,6 +1280,22 @@
     </w:p>
     <w:p>
       <w:pPr>
+        <w:spacing w:line="360" w:lineRule="auto"/>
+        <w:ind w:firstLine="360"/>
+        <w:jc w:val="both"/>
+      </w:pPr>
+      <w:r>
+        <w:rPr>
+          <w:rFonts w:ascii="Times New Roman" w:hAnsi="Times New Roman" w:eastAsia="Times New Roman"/>
+          <w:b w:val="0"/>
+          <w:caps w:val="0"/>
+          <w:sz w:val="24"/>
+        </w:rPr>
+        <w:t>Tabela 28. Commit-i që prodhoi çdo skedar rezultati</w:t>
+      </w:r>
+    </w:p>
+    <w:p>
+      <w:pPr>
         <w:pStyle w:val="Heading1"/>
         <w:pageBreakBefore/>
       </w:pPr>
@@ -22011,8 +22027,599 @@
           <w:caps w:val="0"/>
           <w:sz w:val="24"/>
         </w:rPr>
-        <w:t>Çdo skript shkruan rezultatin si CSV ose JSON në data/results/, bashkë me commit-in, versionin e Python-it dhe platformën që e prodhuan. Numrat e këtij punimi u prodhuan me commit-in 40b3d7b240, Python 3.13.1, Windows-11-10.0.26200-SP0.</w:t>
+        <w:t>Çdo skript shkruan rezultatin si CSV ose JSON në data/results/, bashkë me commit-in, versionin e Python-it dhe platformën që e prodhuan. Interpretuesi dhe platforma janë të njëjtët për të gjithë: Python 3.13.1, Windows-11-10.0.26200-SP0. Commit-i jo. Eksperimentet u ekzekutuan sipas radhës në të cilën u shkruan, ndaj secili skedar mban commit-in e vet, dhe ai është commit-i që duhet përdorur nëse dikush do të riprodhojë pikërisht atë skedar. Një commit i vetëm i deklaruar për të gjithë punimin do të lexohej më mirë dhe do të ishte i pasaktë për të gjithë skedarët veç njërit.</w:t>
       </w:r>
+    </w:p>
+    <w:p>
+      <w:pPr>
+        <w:spacing w:line="240" w:lineRule="auto"/>
+        <w:jc w:val="center"/>
+      </w:pPr>
+      <w:r>
+        <w:rPr>
+          <w:rFonts w:ascii="Times New Roman" w:hAnsi="Times New Roman" w:eastAsia="Times New Roman"/>
+          <w:b w:val="0"/>
+          <w:caps w:val="0"/>
+          <w:sz w:val="22"/>
+        </w:rPr>
+        <w:t>Tabela 28. Commit-i që prodhoi çdo skedar rezultati</w:t>
+      </w:r>
+    </w:p>
+    <w:tbl>
+      <w:tblPr>
+        <w:tblStyle w:val="TableGrid"/>
+        <w:tblW w:type="auto" w:w="0"/>
+        <w:tblLook w:firstColumn="1" w:firstRow="1" w:lastColumn="0" w:lastRow="0" w:noHBand="0" w:noVBand="1" w:val="04A0"/>
+      </w:tblPr>
+      <w:tblGrid>
+        <w:gridCol w:w="4320"/>
+        <w:gridCol w:w="4320"/>
+      </w:tblGrid>
+      <w:tr>
+        <w:tc>
+          <w:tcPr>
+            <w:tcW w:type="dxa" w:w="4320"/>
+          </w:tcPr>
+          <w:p>
+            <w:pPr>
+              <w:spacing w:line="240" w:lineRule="auto"/>
+            </w:pPr>
+            <w:r>
+              <w:rPr>
+                <w:rFonts w:ascii="Times New Roman" w:hAnsi="Times New Roman" w:eastAsia="Times New Roman"/>
+                <w:b/>
+                <w:caps w:val="0"/>
+                <w:sz w:val="22"/>
+              </w:rPr>
+              <w:t>Skedari</w:t>
+            </w:r>
+          </w:p>
+        </w:tc>
+        <w:tc>
+          <w:tcPr>
+            <w:tcW w:type="dxa" w:w="4320"/>
+          </w:tcPr>
+          <w:p>
+            <w:pPr>
+              <w:spacing w:line="240" w:lineRule="auto"/>
+            </w:pPr>
+            <w:r>
+              <w:rPr>
+                <w:rFonts w:ascii="Times New Roman" w:hAnsi="Times New Roman" w:eastAsia="Times New Roman"/>
+                <w:b/>
+                <w:caps w:val="0"/>
+                <w:sz w:val="22"/>
+              </w:rPr>
+              <w:t>Commit-i</w:t>
+            </w:r>
+          </w:p>
+        </w:tc>
+      </w:tr>
+      <w:tr>
+        <w:tc>
+          <w:tcPr>
+            <w:tcW w:type="dxa" w:w="4320"/>
+          </w:tcPr>
+          <w:p>
+            <w:pPr>
+              <w:spacing w:line="240" w:lineRule="auto"/>
+            </w:pPr>
+            <w:r>
+              <w:rPr>
+                <w:rFonts w:ascii="Times New Roman" w:hAnsi="Times New Roman" w:eastAsia="Times New Roman"/>
+                <w:b w:val="0"/>
+                <w:caps w:val="0"/>
+                <w:sz w:val="22"/>
+              </w:rPr>
+              <w:t>bootstrap_intervals.json</w:t>
+            </w:r>
+          </w:p>
+        </w:tc>
+        <w:tc>
+          <w:tcPr>
+            <w:tcW w:type="dxa" w:w="4320"/>
+          </w:tcPr>
+          <w:p>
+            <w:pPr>
+              <w:spacing w:line="240" w:lineRule="auto"/>
+            </w:pPr>
+            <w:r>
+              <w:rPr>
+                <w:rFonts w:ascii="Times New Roman" w:hAnsi="Times New Roman" w:eastAsia="Times New Roman"/>
+                <w:b w:val="0"/>
+                <w:caps w:val="0"/>
+                <w:sz w:val="22"/>
+              </w:rPr>
+              <w:t>40b3d7b240</w:t>
+            </w:r>
+          </w:p>
+        </w:tc>
+      </w:tr>
+      <w:tr>
+        <w:tc>
+          <w:tcPr>
+            <w:tcW w:type="dxa" w:w="4320"/>
+          </w:tcPr>
+          <w:p>
+            <w:pPr>
+              <w:spacing w:line="240" w:lineRule="auto"/>
+            </w:pPr>
+            <w:r>
+              <w:rPr>
+                <w:rFonts w:ascii="Times New Roman" w:hAnsi="Times New Roman" w:eastAsia="Times New Roman"/>
+                <w:b w:val="0"/>
+                <w:caps w:val="0"/>
+                <w:sz w:val="22"/>
+              </w:rPr>
+              <w:t>ml_evaluation.json</w:t>
+            </w:r>
+          </w:p>
+        </w:tc>
+        <w:tc>
+          <w:tcPr>
+            <w:tcW w:type="dxa" w:w="4320"/>
+          </w:tcPr>
+          <w:p>
+            <w:pPr>
+              <w:spacing w:line="240" w:lineRule="auto"/>
+            </w:pPr>
+            <w:r>
+              <w:rPr>
+                <w:rFonts w:ascii="Times New Roman" w:hAnsi="Times New Roman" w:eastAsia="Times New Roman"/>
+                <w:b w:val="0"/>
+                <w:caps w:val="0"/>
+                <w:sz w:val="22"/>
+              </w:rPr>
+              <w:t>40b3d7b240</w:t>
+            </w:r>
+          </w:p>
+        </w:tc>
+      </w:tr>
+      <w:tr>
+        <w:tc>
+          <w:tcPr>
+            <w:tcW w:type="dxa" w:w="4320"/>
+          </w:tcPr>
+          <w:p>
+            <w:pPr>
+              <w:spacing w:line="240" w:lineRule="auto"/>
+            </w:pPr>
+            <w:r>
+              <w:rPr>
+                <w:rFonts w:ascii="Times New Roman" w:hAnsi="Times New Roman" w:eastAsia="Times New Roman"/>
+                <w:b w:val="0"/>
+                <w:caps w:val="0"/>
+                <w:sz w:val="22"/>
+              </w:rPr>
+              <w:t>mlcq_dataset.json</w:t>
+            </w:r>
+          </w:p>
+        </w:tc>
+        <w:tc>
+          <w:tcPr>
+            <w:tcW w:type="dxa" w:w="4320"/>
+          </w:tcPr>
+          <w:p>
+            <w:pPr>
+              <w:spacing w:line="240" w:lineRule="auto"/>
+            </w:pPr>
+            <w:r>
+              <w:rPr>
+                <w:rFonts w:ascii="Times New Roman" w:hAnsi="Times New Roman" w:eastAsia="Times New Roman"/>
+                <w:b w:val="0"/>
+                <w:caps w:val="0"/>
+                <w:sz w:val="22"/>
+              </w:rPr>
+              <w:t>55d9f8463d</w:t>
+            </w:r>
+          </w:p>
+        </w:tc>
+      </w:tr>
+      <w:tr>
+        <w:tc>
+          <w:tcPr>
+            <w:tcW w:type="dxa" w:w="4320"/>
+          </w:tcPr>
+          <w:p>
+            <w:pPr>
+              <w:spacing w:line="240" w:lineRule="auto"/>
+            </w:pPr>
+            <w:r>
+              <w:rPr>
+                <w:rFonts w:ascii="Times New Roman" w:hAnsi="Times New Roman" w:eastAsia="Times New Roman"/>
+                <w:b w:val="0"/>
+                <w:caps w:val="0"/>
+                <w:sz w:val="22"/>
+              </w:rPr>
+              <w:t>mlcq_matching.json</w:t>
+            </w:r>
+          </w:p>
+        </w:tc>
+        <w:tc>
+          <w:tcPr>
+            <w:tcW w:type="dxa" w:w="4320"/>
+          </w:tcPr>
+          <w:p>
+            <w:pPr>
+              <w:spacing w:line="240" w:lineRule="auto"/>
+            </w:pPr>
+            <w:r>
+              <w:rPr>
+                <w:rFonts w:ascii="Times New Roman" w:hAnsi="Times New Roman" w:eastAsia="Times New Roman"/>
+                <w:b w:val="0"/>
+                <w:caps w:val="0"/>
+                <w:sz w:val="22"/>
+              </w:rPr>
+              <w:t>40b3d7b240</w:t>
+            </w:r>
+          </w:p>
+        </w:tc>
+      </w:tr>
+      <w:tr>
+        <w:tc>
+          <w:tcPr>
+            <w:tcW w:type="dxa" w:w="4320"/>
+          </w:tcPr>
+          <w:p>
+            <w:pPr>
+              <w:spacing w:line="240" w:lineRule="auto"/>
+            </w:pPr>
+            <w:r>
+              <w:rPr>
+                <w:rFonts w:ascii="Times New Roman" w:hAnsi="Times New Roman" w:eastAsia="Times New Roman"/>
+                <w:b w:val="0"/>
+                <w:caps w:val="0"/>
+                <w:sz w:val="22"/>
+              </w:rPr>
+              <w:t>model_without_project.json</w:t>
+            </w:r>
+          </w:p>
+        </w:tc>
+        <w:tc>
+          <w:tcPr>
+            <w:tcW w:type="dxa" w:w="4320"/>
+          </w:tcPr>
+          <w:p>
+            <w:pPr>
+              <w:spacing w:line="240" w:lineRule="auto"/>
+            </w:pPr>
+            <w:r>
+              <w:rPr>
+                <w:rFonts w:ascii="Times New Roman" w:hAnsi="Times New Roman" w:eastAsia="Times New Roman"/>
+                <w:b w:val="0"/>
+                <w:caps w:val="0"/>
+                <w:sz w:val="22"/>
+              </w:rPr>
+              <w:t>fb8c2d4167</w:t>
+            </w:r>
+          </w:p>
+        </w:tc>
+      </w:tr>
+      <w:tr>
+        <w:tc>
+          <w:tcPr>
+            <w:tcW w:type="dxa" w:w="4320"/>
+          </w:tcPr>
+          <w:p>
+            <w:pPr>
+              <w:spacing w:line="240" w:lineRule="auto"/>
+            </w:pPr>
+            <w:r>
+              <w:rPr>
+                <w:rFonts w:ascii="Times New Roman" w:hAnsi="Times New Roman" w:eastAsia="Times New Roman"/>
+                <w:b w:val="0"/>
+                <w:caps w:val="0"/>
+                <w:sz w:val="22"/>
+              </w:rPr>
+              <w:t>refactoring_evaluation.json</w:t>
+            </w:r>
+          </w:p>
+        </w:tc>
+        <w:tc>
+          <w:tcPr>
+            <w:tcW w:type="dxa" w:w="4320"/>
+          </w:tcPr>
+          <w:p>
+            <w:pPr>
+              <w:spacing w:line="240" w:lineRule="auto"/>
+            </w:pPr>
+            <w:r>
+              <w:rPr>
+                <w:rFonts w:ascii="Times New Roman" w:hAnsi="Times New Roman" w:eastAsia="Times New Roman"/>
+                <w:b w:val="0"/>
+                <w:caps w:val="0"/>
+                <w:sz w:val="22"/>
+              </w:rPr>
+              <w:t>5f62b7b790</w:t>
+            </w:r>
+          </w:p>
+        </w:tc>
+      </w:tr>
+      <w:tr>
+        <w:tc>
+          <w:tcPr>
+            <w:tcW w:type="dxa" w:w="4320"/>
+          </w:tcPr>
+          <w:p>
+            <w:pPr>
+              <w:spacing w:line="240" w:lineRule="auto"/>
+            </w:pPr>
+            <w:r>
+              <w:rPr>
+                <w:rFonts w:ascii="Times New Roman" w:hAnsi="Times New Roman" w:eastAsia="Times New Roman"/>
+                <w:b w:val="0"/>
+                <w:caps w:val="0"/>
+                <w:sz w:val="22"/>
+              </w:rPr>
+              <w:t>refusals_by_severity.json</w:t>
+            </w:r>
+          </w:p>
+        </w:tc>
+        <w:tc>
+          <w:tcPr>
+            <w:tcW w:type="dxa" w:w="4320"/>
+          </w:tcPr>
+          <w:p>
+            <w:pPr>
+              <w:spacing w:line="240" w:lineRule="auto"/>
+            </w:pPr>
+            <w:r>
+              <w:rPr>
+                <w:rFonts w:ascii="Times New Roman" w:hAnsi="Times New Roman" w:eastAsia="Times New Roman"/>
+                <w:b w:val="0"/>
+                <w:caps w:val="0"/>
+                <w:sz w:val="22"/>
+              </w:rPr>
+              <w:t>fb8c2d4167</w:t>
+            </w:r>
+          </w:p>
+        </w:tc>
+      </w:tr>
+      <w:tr>
+        <w:tc>
+          <w:tcPr>
+            <w:tcW w:type="dxa" w:w="4320"/>
+          </w:tcPr>
+          <w:p>
+            <w:pPr>
+              <w:spacing w:line="240" w:lineRule="auto"/>
+            </w:pPr>
+            <w:r>
+              <w:rPr>
+                <w:rFonts w:ascii="Times New Roman" w:hAnsi="Times New Roman" w:eastAsia="Times New Roman"/>
+                <w:b w:val="0"/>
+                <w:caps w:val="0"/>
+                <w:sz w:val="22"/>
+              </w:rPr>
+              <w:t>reviewer_agreement.json</w:t>
+            </w:r>
+          </w:p>
+        </w:tc>
+        <w:tc>
+          <w:tcPr>
+            <w:tcW w:type="dxa" w:w="4320"/>
+          </w:tcPr>
+          <w:p>
+            <w:pPr>
+              <w:spacing w:line="240" w:lineRule="auto"/>
+            </w:pPr>
+            <w:r>
+              <w:rPr>
+                <w:rFonts w:ascii="Times New Roman" w:hAnsi="Times New Roman" w:eastAsia="Times New Roman"/>
+                <w:b w:val="0"/>
+                <w:caps w:val="0"/>
+                <w:sz w:val="22"/>
+              </w:rPr>
+              <w:t>40b3d7b240</w:t>
+            </w:r>
+          </w:p>
+        </w:tc>
+      </w:tr>
+      <w:tr>
+        <w:tc>
+          <w:tcPr>
+            <w:tcW w:type="dxa" w:w="4320"/>
+          </w:tcPr>
+          <w:p>
+            <w:pPr>
+              <w:spacing w:line="240" w:lineRule="auto"/>
+            </w:pPr>
+            <w:r>
+              <w:rPr>
+                <w:rFonts w:ascii="Times New Roman" w:hAnsi="Times New Roman" w:eastAsia="Times New Roman"/>
+                <w:b w:val="0"/>
+                <w:caps w:val="0"/>
+                <w:sz w:val="22"/>
+              </w:rPr>
+              <w:t>rules_evaluation.json</w:t>
+            </w:r>
+          </w:p>
+        </w:tc>
+        <w:tc>
+          <w:tcPr>
+            <w:tcW w:type="dxa" w:w="4320"/>
+          </w:tcPr>
+          <w:p>
+            <w:pPr>
+              <w:spacing w:line="240" w:lineRule="auto"/>
+            </w:pPr>
+            <w:r>
+              <w:rPr>
+                <w:rFonts w:ascii="Times New Roman" w:hAnsi="Times New Roman" w:eastAsia="Times New Roman"/>
+                <w:b w:val="0"/>
+                <w:caps w:val="0"/>
+                <w:sz w:val="22"/>
+              </w:rPr>
+              <w:t>40b3d7b240</w:t>
+            </w:r>
+          </w:p>
+        </w:tc>
+      </w:tr>
+      <w:tr>
+        <w:tc>
+          <w:tcPr>
+            <w:tcW w:type="dxa" w:w="4320"/>
+          </w:tcPr>
+          <w:p>
+            <w:pPr>
+              <w:spacing w:line="240" w:lineRule="auto"/>
+            </w:pPr>
+            <w:r>
+              <w:rPr>
+                <w:rFonts w:ascii="Times New Roman" w:hAnsi="Times New Roman" w:eastAsia="Times New Roman"/>
+                <w:b w:val="0"/>
+                <w:caps w:val="0"/>
+                <w:sz w:val="22"/>
+              </w:rPr>
+              <w:t>system_reference.json</w:t>
+            </w:r>
+          </w:p>
+        </w:tc>
+        <w:tc>
+          <w:tcPr>
+            <w:tcW w:type="dxa" w:w="4320"/>
+          </w:tcPr>
+          <w:p>
+            <w:pPr>
+              <w:spacing w:line="240" w:lineRule="auto"/>
+            </w:pPr>
+            <w:r>
+              <w:rPr>
+                <w:rFonts w:ascii="Times New Roman" w:hAnsi="Times New Roman" w:eastAsia="Times New Roman"/>
+                <w:b w:val="0"/>
+                <w:caps w:val="0"/>
+                <w:sz w:val="22"/>
+              </w:rPr>
+              <w:t>40b3d7b240</w:t>
+            </w:r>
+          </w:p>
+        </w:tc>
+      </w:tr>
+      <w:tr>
+        <w:tc>
+          <w:tcPr>
+            <w:tcW w:type="dxa" w:w="4320"/>
+          </w:tcPr>
+          <w:p>
+            <w:pPr>
+              <w:spacing w:line="240" w:lineRule="auto"/>
+            </w:pPr>
+            <w:r>
+              <w:rPr>
+                <w:rFonts w:ascii="Times New Roman" w:hAnsi="Times New Roman" w:eastAsia="Times New Roman"/>
+                <w:b w:val="0"/>
+                <w:caps w:val="0"/>
+                <w:sz w:val="22"/>
+              </w:rPr>
+              <w:t>threshold_calibration.json</w:t>
+            </w:r>
+          </w:p>
+        </w:tc>
+        <w:tc>
+          <w:tcPr>
+            <w:tcW w:type="dxa" w:w="4320"/>
+          </w:tcPr>
+          <w:p>
+            <w:pPr>
+              <w:spacing w:line="240" w:lineRule="auto"/>
+            </w:pPr>
+            <w:r>
+              <w:rPr>
+                <w:rFonts w:ascii="Times New Roman" w:hAnsi="Times New Roman" w:eastAsia="Times New Roman"/>
+                <w:b w:val="0"/>
+                <w:caps w:val="0"/>
+                <w:sz w:val="22"/>
+              </w:rPr>
+              <w:t>40b3d7b240</w:t>
+            </w:r>
+          </w:p>
+        </w:tc>
+      </w:tr>
+      <w:tr>
+        <w:tc>
+          <w:tcPr>
+            <w:tcW w:type="dxa" w:w="4320"/>
+          </w:tcPr>
+          <w:p>
+            <w:pPr>
+              <w:spacing w:line="240" w:lineRule="auto"/>
+            </w:pPr>
+            <w:r>
+              <w:rPr>
+                <w:rFonts w:ascii="Times New Roman" w:hAnsi="Times New Roman" w:eastAsia="Times New Roman"/>
+                <w:b w:val="0"/>
+                <w:caps w:val="0"/>
+                <w:sz w:val="22"/>
+              </w:rPr>
+              <w:t>threshold_sweep.json</w:t>
+            </w:r>
+          </w:p>
+        </w:tc>
+        <w:tc>
+          <w:tcPr>
+            <w:tcW w:type="dxa" w:w="4320"/>
+          </w:tcPr>
+          <w:p>
+            <w:pPr>
+              <w:spacing w:line="240" w:lineRule="auto"/>
+            </w:pPr>
+            <w:r>
+              <w:rPr>
+                <w:rFonts w:ascii="Times New Roman" w:hAnsi="Times New Roman" w:eastAsia="Times New Roman"/>
+                <w:b w:val="0"/>
+                <w:caps w:val="0"/>
+                <w:sz w:val="22"/>
+              </w:rPr>
+              <w:t>40b3d7b240</w:t>
+            </w:r>
+          </w:p>
+        </w:tc>
+      </w:tr>
+      <w:tr>
+        <w:tc>
+          <w:tcPr>
+            <w:tcW w:type="dxa" w:w="4320"/>
+          </w:tcPr>
+          <w:p>
+            <w:pPr>
+              <w:spacing w:line="240" w:lineRule="auto"/>
+            </w:pPr>
+            <w:r>
+              <w:rPr>
+                <w:rFonts w:ascii="Times New Roman" w:hAnsi="Times New Roman" w:eastAsia="Times New Roman"/>
+                <w:b w:val="0"/>
+                <w:caps w:val="0"/>
+                <w:sz w:val="22"/>
+              </w:rPr>
+              <w:t>verify_with_project.json</w:t>
+            </w:r>
+          </w:p>
+        </w:tc>
+        <w:tc>
+          <w:tcPr>
+            <w:tcW w:type="dxa" w:w="4320"/>
+          </w:tcPr>
+          <w:p>
+            <w:pPr>
+              <w:spacing w:line="240" w:lineRule="auto"/>
+            </w:pPr>
+            <w:r>
+              <w:rPr>
+                <w:rFonts w:ascii="Times New Roman" w:hAnsi="Times New Roman" w:eastAsia="Times New Roman"/>
+                <w:b w:val="0"/>
+                <w:caps w:val="0"/>
+                <w:sz w:val="22"/>
+              </w:rPr>
+              <w:t>c6eee8ef8d</w:t>
+            </w:r>
+          </w:p>
+        </w:tc>
+      </w:tr>
+    </w:tbl>
+    <w:p>
+      <w:pPr>
+        <w:spacing w:line="240" w:lineRule="auto" w:after="0"/>
+      </w:pPr>
     </w:p>
     <w:p>
       <w:pPr>

</xml_diff>

<commit_message>
Shkruaj kufizimet e korpusit dhe te verifikimit te fushveprimi
</commit_message>
<xml_diff>
--- a/docs/thesis/Punim_Diplome_Florent_Latifi.docx
+++ b/docs/thesis/Punim_Diplome_Florent_Latifi.docx
@@ -2299,7 +2299,41 @@
           <w:caps w:val="0"/>
           <w:sz w:val="24"/>
         </w:rPr>
-        <w:t>[PLOTËSO]: Shto këtu çdo kufizim tjetër që dalin gjatë punës, për shembull madhësia e korpusit ose kufizimet e verifikimit.</w:t>
+        <w:t>Korpusi mbi të cilin matet gjithçka ndërtohet duke shkarkuar depot që përmend MLCQ-ja dhe duke ruajtur prej tyre vetëm skedarët me prapashtesë «.java». Rrjedhimisht ai nuk përmban as skedarë ndërtimi, as varësi: asnjë projekt në të nuk kompilohet si i tërë dhe asnjë suitë testesh e tij nuk ekzekutohet dot pa u rishkarkuar çdo arkiv i plotë. Një pjesë e depove nuk ishte më e arritshme në kohën e shkarkimit, ndaj mbulimi i mostrave të MLCQ-së nuk është i plotë; shifra e saktë jepet te Kapitulli 5.</w:t>
+      </w:r>
+    </w:p>
+    <w:p>
+      <w:pPr>
+        <w:spacing w:line="360" w:lineRule="auto"/>
+        <w:ind w:firstLine="360"/>
+        <w:jc w:val="both"/>
+      </w:pPr>
+      <w:r>
+        <w:rPr>
+          <w:rFonts w:ascii="Times New Roman" w:hAnsi="Times New Roman" w:eastAsia="Times New Roman"/>
+          <w:b w:val="0"/>
+          <w:caps w:val="0"/>
+          <w:sz w:val="24"/>
+        </w:rPr>
+        <w:t xml:space="preserve">Nga ky kufizim rrjedh drejtpërdrejt fusha e pretendimit për refaktorimet. Çdo rishkrim kontrollohet me kompilator, por kontrolli mund të thotë vetëm nëse skedari kompilon apo nëse nuk shton një lloj të ri gabimi — jo nëse programi vazhdon të sillet si më parë. Ruajtja e sjelljes, që përmendet te pyetja e tretë kërkimore, </w:t>
+      </w:r>
+      <w:r>
+        <w:rPr>
+          <w:rFonts w:ascii="Times New Roman" w:hAnsi="Times New Roman" w:eastAsia="Times New Roman"/>
+          <w:b/>
+          <w:caps w:val="0"/>
+          <w:sz w:val="24"/>
+        </w:rPr>
+        <w:t>nuk verifikohet empirikisht në këtë punim</w:t>
+      </w:r>
+      <w:r>
+        <w:rPr>
+          <w:rFonts w:ascii="Times New Roman" w:hAnsi="Times New Roman" w:eastAsia="Times New Roman"/>
+          <w:b w:val="0"/>
+          <w:caps w:val="0"/>
+          <w:sz w:val="24"/>
+        </w:rPr>
+        <w:t xml:space="preserve"> dhe mbetet e tillë me vetëdije: ajo kërkon ekzekutimin e testeve të vetë projektit para dhe pas ndryshimit, çka korpusi i përshkruar më sipër nuk e lejon. Kapitulli 6 e rimerr këtë dallim kur i përgjigjet asaj pyetjeje.</w:t>
       </w:r>
     </w:p>
     <w:p>

</xml_diff>

<commit_message>
Riprodho hapin 12 dhe raporto kufirin qe zbuloi
</commit_message>
<xml_diff>
--- a/docs/thesis/Punim_Diplome_Florent_Latifi.docx
+++ b/docs/thesis/Punim_Diplome_Florent_Latifi.docx
@@ -9709,66 +9709,7 @@
                 <w:caps w:val="0"/>
                 <w:sz w:val="22"/>
               </w:rPr>
-              <w:t>127</w:t>
-            </w:r>
-          </w:p>
-        </w:tc>
-      </w:tr>
-      <w:tr>
-        <w:tc>
-          <w:tcPr>
-            <w:tcW w:type="dxa" w:w="2880"/>
-          </w:tcPr>
-          <w:p>
-            <w:pPr>
-              <w:spacing w:line="240" w:lineRule="auto"/>
-            </w:pPr>
-            <w:r>
-              <w:rPr>
-                <w:rFonts w:ascii="Times New Roman" w:hAnsi="Times New Roman" w:eastAsia="Times New Roman"/>
-                <w:b w:val="0"/>
-                <w:caps w:val="0"/>
-                <w:sz w:val="22"/>
-              </w:rPr>
-              <w:t>not checked</w:t>
-            </w:r>
-          </w:p>
-        </w:tc>
-        <w:tc>
-          <w:tcPr>
-            <w:tcW w:type="dxa" w:w="2880"/>
-          </w:tcPr>
-          <w:p>
-            <w:pPr>
-              <w:spacing w:line="240" w:lineRule="auto"/>
-            </w:pPr>
-            <w:r>
-              <w:rPr>
-                <w:rFonts w:ascii="Times New Roman" w:hAnsi="Times New Roman" w:eastAsia="Times New Roman"/>
-                <w:b w:val="0"/>
-                <w:caps w:val="0"/>
-                <w:sz w:val="22"/>
-              </w:rPr>
-              <w:t>0</w:t>
-            </w:r>
-          </w:p>
-        </w:tc>
-        <w:tc>
-          <w:tcPr>
-            <w:tcW w:type="dxa" w:w="2880"/>
-          </w:tcPr>
-          <w:p>
-            <w:pPr>
-              <w:spacing w:line="240" w:lineRule="auto"/>
-            </w:pPr>
-            <w:r>
-              <w:rPr>
-                <w:rFonts w:ascii="Times New Roman" w:hAnsi="Times New Roman" w:eastAsia="Times New Roman"/>
-                <w:b w:val="0"/>
-                <w:caps w:val="0"/>
-                <w:sz w:val="22"/>
-              </w:rPr>
-              <w:t>5</w:t>
+              <w:t>132</w:t>
             </w:r>
           </w:p>
         </w:tc>
@@ -9808,7 +9749,7 @@
           <w:caps w:val="0"/>
           <w:sz w:val="24"/>
         </w:rPr>
-        <w:t>Po aq me rëndësi është se asnjë verdikt nuk u përmbys: 0 rishkrime kaluan te «me gabim të ri». Asgjë që kalon e izoluar nuk dështon kur skedari kompilohet brenda projektit të vet, çka është arsyeja pse toleranca «pa lloj të ri gabimi» mbetet e përdorshme si dëshmi edhe atje ku kompilimi i plotë nuk arrihet. 5 kompilime e kaluan kufirin kohor dhe numërohen si të pakontrolluara, kurrë si sukses.</w:t>
+        <w:t>Po aq me rëndësi është se asnjë verdikt nuk u përmbys: 0 rishkrime kaluan te «me gabim të ri». Asgjë që kalon e izoluar nuk dështon kur skedari kompilohet brenda projektit të vet, çka është arsyeja pse toleranca «pa lloj të ri gabimi» mbetet e përdorshme si dëshmi edhe atje ku kompilimi i plotë nuk arrihet.</w:t>
       </w:r>
     </w:p>
     <w:p>
@@ -9824,7 +9765,7 @@
           <w:caps w:val="0"/>
           <w:sz w:val="24"/>
         </w:rPr>
-        <w:t>Mostra është e vogël dhe e mbjellë me farë: kompilimi në kontekst zgjat rreth gjashtë minuta për skedar, sepse detyron kompilimin e tërë mbylljes së varësive të tij. Verdiktet e raportuara më lart mbi tërë korpusin mbeten ato të izoluara; kjo matje nuk i zëvendëson, por tregon në ç'drejtim do të lëviznin.</w:t>
+        <w:t>Mostra është e vogël dhe e mbjellë me farë, sepse kompilimi në kontekst është i shtrenjtë: rreth 155 sekonda për skedar në ekzekutimin që prodhoi këto shifra, pasi detyron kompilimin e tërë mbylljes së varësive të tij. Kostoja për skedar varion shumë mes ekzekutimeve, sepse varet nga sa prej korpusit ndodhet tashmë në cache-in e sistemit të skedarëve. Verdiktet e raportuara më lart mbi tërë korpusin mbeten ato të izoluara; kjo matje nuk i zëvendëson, por tregon në ç'drejtim do të lëviznin.</w:t>
       </w:r>
     </w:p>
     <w:p>
@@ -21803,7 +21744,7 @@
                 <w:caps w:val="0"/>
                 <w:sz w:val="22"/>
               </w:rPr>
-              <w:t>~18 min</w:t>
+              <w:t>18–78 min</w:t>
             </w:r>
           </w:p>
         </w:tc>
@@ -22644,7 +22585,7 @@
                 <w:caps w:val="0"/>
                 <w:sz w:val="22"/>
               </w:rPr>
-              <w:t>c6eee8ef8d</w:t>
+              <w:t>7a200751de</w:t>
             </w:r>
           </w:p>
         </w:tc>
@@ -22684,7 +22625,39 @@
           <w:caps w:val="0"/>
           <w:sz w:val="24"/>
         </w:rPr>
-        <w:t>Ky premtim u vu në provë më 3 shtator 2026. Njëmbëdhjetë nga të pesëmbëdhjetë hapat — të gjithë ata që mbarojnë brenda pak minutash — u ri-ekzekutuan mbi të njëjtat hyrje. Çdo skedar rezultati doli identik me atë të komituar, përveç commit-it dhe kohëzgjatjes që secili regjistron; të katër modelet e stërvitura dolën identike bajt për bajt; dhe asnjëra prej figurave nuk ndryshoi. Hapat 1, 3, 7 dhe 12 kërkojnë nga dhjetëra minuta deri në orë dhe nuk u ri-ekzekutuan atë ditë: për ta, riprodhimi mbetet pretendim i pakontrolluar, dhe thuhet këtu si i tillë.</w:t>
+        <w:t>Ky premtim u vu në provë më 3 shtator 2026. Dymbëdhjetë nga të pesëmbëdhjetë hapat u ri-ekzekutuan mbi të njëjtat hyrje. Njëmbëdhjetë prej tyre dhanë skedarë identikë me ata të komituarit, përveç commit-it dhe kohëzgjatjes që secili regjistron; të katër modelet e stërvitura dolën identike bajt për bajt; dhe asnjëra prej figurave nuk ndryshoi.</w:t>
+      </w:r>
+    </w:p>
+    <w:p>
+      <w:pPr>
+        <w:spacing w:line="360" w:lineRule="auto"/>
+        <w:ind w:firstLine="360"/>
+        <w:jc w:val="both"/>
+      </w:pPr>
+      <w:r>
+        <w:rPr>
+          <w:rFonts w:ascii="Times New Roman" w:hAnsi="Times New Roman" w:eastAsia="Times New Roman"/>
+          <w:b w:val="0"/>
+          <w:caps w:val="0"/>
+          <w:sz w:val="24"/>
+        </w:rPr>
+        <w:t>Hapi i dymbëdhjetë nuk dha skedar identik, dhe arsyeja i përket vetë matjes. Numrat që mbajnë pretendimin u riprodhuan saktësisht — po aq rishkrime, po aq verdikte «kompilon», asnjë përmbysje — por pesë kompilime që në ekzekutimin e parë e kishin kaluar kufirin kohor të kompilatorit, në të dytin përfunduan brenda tij dhe morën verdikt. Ky hap, pra, varet nga ngarkesa e makinës: verdiktet e tij janë të qëndrueshme, ndërsa ndarja mes «i kontrolluar» dhe «i pakontrolluar» nuk është. Edhe kohëzgjatja e tij ndryshoi katërfish mes dy ekzekutimeve, prej të njëjtës arsye.</w:t>
+      </w:r>
+    </w:p>
+    <w:p>
+      <w:pPr>
+        <w:spacing w:line="360" w:lineRule="auto"/>
+        <w:ind w:firstLine="360"/>
+        <w:jc w:val="both"/>
+      </w:pPr>
+      <w:r>
+        <w:rPr>
+          <w:rFonts w:ascii="Times New Roman" w:hAnsi="Times New Roman" w:eastAsia="Times New Roman"/>
+          <w:b w:val="0"/>
+          <w:caps w:val="0"/>
+          <w:sz w:val="24"/>
+        </w:rPr>
+        <w:t>Hapat 1, 3 dhe 7 kërkojnë nga një orë e lart, dhe nuk u ri-ekzekutuan: për ta riprodhimi mbetet pretendim i pakontrolluar, dhe thuhet këtu si i tillë.</w:t>
       </w:r>
     </w:p>
     <w:sectPr>

</xml_diff>

<commit_message>
Riprodho tabelen e vecorive bajt per bajt
</commit_message>
<xml_diff>
--- a/docs/thesis/Punim_Diplome_Florent_Latifi.docx
+++ b/docs/thesis/Punim_Diplome_Florent_Latifi.docx
@@ -21042,7 +21042,7 @@
                 <w:caps w:val="0"/>
                 <w:sz w:val="22"/>
               </w:rPr>
-              <w:t>~95 min</w:t>
+              <w:t>~56 min</w:t>
             </w:r>
           </w:p>
         </w:tc>
@@ -22185,7 +22185,7 @@
                 <w:caps w:val="0"/>
                 <w:sz w:val="22"/>
               </w:rPr>
-              <w:t>55d9f8463d</w:t>
+              <w:t>9b87962978</w:t>
             </w:r>
           </w:p>
         </w:tc>
@@ -22625,7 +22625,7 @@
           <w:caps w:val="0"/>
           <w:sz w:val="24"/>
         </w:rPr>
-        <w:t>Ky premtim u vu në provë më 3 shtator 2026. Dymbëdhjetë nga të pesëmbëdhjetë hapat u ri-ekzekutuan mbi të njëjtat hyrje. Njëmbëdhjetë prej tyre dhanë skedarë identikë me ata të komituarit, përveç commit-it dhe kohëzgjatjes që secili regjistron; të katër modelet e stërvitura dolën identike bajt për bajt; dhe asnjëra prej figurave nuk ndryshoi.</w:t>
+        <w:t>Ky premtim u vu në provë më 3 shtator 2026. Trembëdhjetë nga të pesëmbëdhjetë hapat u ri-ekzekutuan mbi të njëjtat hyrje, përfshirë hapin që ndërton vetë tabelën e veçorive nga korpusi — ankora prej së cilës rrjedhin të gjithë numrat e mëpasshëm. Ai skedar CSV, 4.534 rreshta, doli bajt për bajt identik me atë të komituarin. Dymbëdhjetë hapa të tjerë dhanë po ashtu skedarë identikë me ata të komituarit, përveç commit-it dhe kohëzgjatjes që secili regjistron; të katër modelet e stërvitura dolën identike bajt për bajt; dhe asnjëra prej figurave nuk ndryshoi.</w:t>
       </w:r>
     </w:p>
     <w:p>
@@ -22657,7 +22657,7 @@
           <w:caps w:val="0"/>
           <w:sz w:val="24"/>
         </w:rPr>
-        <w:t>Hapat 1, 3 dhe 7 kërkojnë nga një orë e lart, dhe nuk u ri-ekzekutuan: për ta riprodhimi mbetet pretendim i pakontrolluar, dhe thuhet këtu si i tillë.</w:t>
+        <w:t>Hapat 1 dhe 7 mbeten të pariekzekutuar: i pari kërkon rishkarkimin e korpusit të plotë, i dyti disa orë ekzekutimi mbi të. Për ta riprodhimi mbetet pretendim i pakontrolluar, dhe thuhet këtu si i tillë.</w:t>
       </w:r>
     </w:p>
     <w:sectPr>

</xml_diff>

<commit_message>
Dyfisho mostren e verifikimit ne kontekst dhe raporto regresin
</commit_message>
<xml_diff>
--- a/docs/thesis/Punim_Diplome_Florent_Latifi.docx
+++ b/docs/thesis/Punim_Diplome_Florent_Latifi.docx
@@ -9508,7 +9508,7 @@
           <w:caps w:val="0"/>
           <w:sz w:val="24"/>
         </w:rPr>
-        <w:t>Kufiri i këtij verifikimi është izolimi, jo transformimi. Skedari kompilohet i vetëm, dhe një skedar i një depoje reale i importon fqinjët e vet, ndaj për shumicën pretendimi bie te «nuk shton lloj të ri gabimi». Sa do të fitohej po të mos ishte i izoluar u mat mbi një mostër: i njëjti rishkrim u kompilua dy herë, i vetëm dhe me burimet e vetë projektit të arritshme, mbi 30 skedarë dhe 152 rishkrime.</w:t>
+        <w:t>Kufiri i këtij verifikimi është izolimi, jo transformimi. Skedari kompilohet i vetëm, dhe një skedar i një depoje reale i importon fqinjët e vet, ndaj për shumicën pretendimi bie te «nuk shton lloj të ri gabimi». Sa do të fitohej po të mos ishte i izoluar u mat mbi një mostër: i njëjti rishkrim u kompilua dy herë, i vetëm dhe me burimet e vetë projektit të arritshme, mbi 60 skedarë dhe 405 rishkrime.</w:t>
       </w:r>
     </w:p>
     <w:p>
@@ -9631,7 +9631,7 @@
                 <w:caps w:val="0"/>
                 <w:sz w:val="22"/>
               </w:rPr>
-              <w:t>1</w:t>
+              <w:t>2</w:t>
             </w:r>
           </w:p>
         </w:tc>
@@ -9650,7 +9650,7 @@
                 <w:caps w:val="0"/>
                 <w:sz w:val="22"/>
               </w:rPr>
-              <w:t>20</w:t>
+              <w:t>46</w:t>
             </w:r>
           </w:p>
         </w:tc>
@@ -9671,6 +9671,65 @@
                 <w:caps w:val="0"/>
                 <w:sz w:val="22"/>
               </w:rPr>
+              <w:t>new errors</w:t>
+            </w:r>
+          </w:p>
+        </w:tc>
+        <w:tc>
+          <w:tcPr>
+            <w:tcW w:type="dxa" w:w="2946"/>
+          </w:tcPr>
+          <w:p>
+            <w:pPr>
+              <w:spacing w:line="240" w:lineRule="auto"/>
+            </w:pPr>
+            <w:r>
+              <w:rPr>
+                <w:rFonts w:ascii="Times New Roman" w:hAnsi="Times New Roman" w:eastAsia="Times New Roman"/>
+                <w:b w:val="0"/>
+                <w:caps w:val="0"/>
+                <w:sz w:val="22"/>
+              </w:rPr>
+              <w:t>0</w:t>
+            </w:r>
+          </w:p>
+        </w:tc>
+        <w:tc>
+          <w:tcPr>
+            <w:tcW w:type="dxa" w:w="2946"/>
+          </w:tcPr>
+          <w:p>
+            <w:pPr>
+              <w:spacing w:line="240" w:lineRule="auto"/>
+            </w:pPr>
+            <w:r>
+              <w:rPr>
+                <w:rFonts w:ascii="Times New Roman" w:hAnsi="Times New Roman" w:eastAsia="Times New Roman"/>
+                <w:b w:val="0"/>
+                <w:caps w:val="0"/>
+                <w:sz w:val="22"/>
+              </w:rPr>
+              <w:t>1</w:t>
+            </w:r>
+          </w:p>
+        </w:tc>
+      </w:tr>
+      <w:tr>
+        <w:tc>
+          <w:tcPr>
+            <w:tcW w:type="dxa" w:w="2946"/>
+          </w:tcPr>
+          <w:p>
+            <w:pPr>
+              <w:spacing w:line="240" w:lineRule="auto"/>
+            </w:pPr>
+            <w:r>
+              <w:rPr>
+                <w:rFonts w:ascii="Times New Roman" w:hAnsi="Times New Roman" w:eastAsia="Times New Roman"/>
+                <w:b w:val="0"/>
+                <w:caps w:val="0"/>
+                <w:sz w:val="22"/>
+              </w:rPr>
               <w:t>no new errors</w:t>
             </w:r>
           </w:p>
@@ -9690,7 +9749,7 @@
                 <w:caps w:val="0"/>
                 <w:sz w:val="22"/>
               </w:rPr>
-              <w:t>151</w:t>
+              <w:t>403</w:t>
             </w:r>
           </w:p>
         </w:tc>
@@ -9709,7 +9768,66 @@
                 <w:caps w:val="0"/>
                 <w:sz w:val="22"/>
               </w:rPr>
-              <w:t>132</w:t>
+              <w:t>343</w:t>
+            </w:r>
+          </w:p>
+        </w:tc>
+      </w:tr>
+      <w:tr>
+        <w:tc>
+          <w:tcPr>
+            <w:tcW w:type="dxa" w:w="2946"/>
+          </w:tcPr>
+          <w:p>
+            <w:pPr>
+              <w:spacing w:line="240" w:lineRule="auto"/>
+            </w:pPr>
+            <w:r>
+              <w:rPr>
+                <w:rFonts w:ascii="Times New Roman" w:hAnsi="Times New Roman" w:eastAsia="Times New Roman"/>
+                <w:b w:val="0"/>
+                <w:caps w:val="0"/>
+                <w:sz w:val="22"/>
+              </w:rPr>
+              <w:t>not checked</w:t>
+            </w:r>
+          </w:p>
+        </w:tc>
+        <w:tc>
+          <w:tcPr>
+            <w:tcW w:type="dxa" w:w="2946"/>
+          </w:tcPr>
+          <w:p>
+            <w:pPr>
+              <w:spacing w:line="240" w:lineRule="auto"/>
+            </w:pPr>
+            <w:r>
+              <w:rPr>
+                <w:rFonts w:ascii="Times New Roman" w:hAnsi="Times New Roman" w:eastAsia="Times New Roman"/>
+                <w:b w:val="0"/>
+                <w:caps w:val="0"/>
+                <w:sz w:val="22"/>
+              </w:rPr>
+              <w:t>0</w:t>
+            </w:r>
+          </w:p>
+        </w:tc>
+        <w:tc>
+          <w:tcPr>
+            <w:tcW w:type="dxa" w:w="2946"/>
+          </w:tcPr>
+          <w:p>
+            <w:pPr>
+              <w:spacing w:line="240" w:lineRule="auto"/>
+            </w:pPr>
+            <w:r>
+              <w:rPr>
+                <w:rFonts w:ascii="Times New Roman" w:hAnsi="Times New Roman" w:eastAsia="Times New Roman"/>
+                <w:b w:val="0"/>
+                <w:caps w:val="0"/>
+                <w:sz w:val="22"/>
+              </w:rPr>
+              <w:t>15</w:t>
             </w:r>
           </w:p>
         </w:tc>
@@ -9733,7 +9851,7 @@
           <w:caps w:val="0"/>
           <w:sz w:val="24"/>
         </w:rPr>
-        <w:t>Verdikti më i fortë kalon nga 1 te 20 nga 152 rishkrime, pra nga 0.7% në 13.2%. Kjo do të thotë se pjesa dërrmuese e rasteve ku sistemi thotë vetëm «nuk shtova gabim» janë raste ku ai nuk mund të thoshte më shumë për shkak të mënyrës së kompilimit, jo për shkak të rishkrimit.</w:t>
+        <w:t>Verdikti më i fortë kalon nga 2 te 46 nga 405 rishkrime, pra nga 0.5% në 11.4%. Kjo do të thotë se pjesa dërrmuese e rasteve ku sistemi thotë vetëm «nuk shtova gabim» janë raste ku ai nuk mund të thoshte më shumë për shkak të mënyrës së kompilimit, jo për shkak të rishkrimit.</w:t>
       </w:r>
     </w:p>
     <w:p>
@@ -9749,7 +9867,7 @@
           <w:caps w:val="0"/>
           <w:sz w:val="24"/>
         </w:rPr>
-        <w:t>Po aq me rëndësi është se asnjë verdikt nuk u përmbys: 0 rishkrime kaluan te «me gabim të ri». Asgjë që kalon e izoluar nuk dështon kur skedari kompilohet brenda projektit të vet, çka është arsyeja pse toleranca «pa lloj të ri gabimi» mbetet e përdorshme si dëshmi edhe atje ku kompilimi i plotë nuk arrihet.</w:t>
+        <w:t>Përmbysjet nuk janë zero. 1 nga 405 rishkrime e ndryshojnë verdiktin në drejtimin e keq: të izoluara nuk shtonin lloj të ri gabimi, brenda projektit të vet shtojnë. Numri është i vogël dhe pjesa dërrmuese e rishkrimeve nuk sillet kështu, por ekzistenca e tij e kufizon pretendimin që mund të bëhet. Toleranca «pa lloj të ri gabimi» mbetet dëshmi e përdorshme atje ku kompilimi i plotë nuk arrihet; ajo nuk është garanci se kompilimi me kontekstin e projektit do të pajtohej me të. Rasti nuk u veçua: matja mban numra të grumbulluar, ndaj identifikimi i tij kërkon një ekzekutim të synuar dhe mbetet punë e pabërë. 15 kompilime e kaluan kufirin kohor dhe numërohen si të pakontrolluara, kurrë si sukses.</w:t>
       </w:r>
     </w:p>
     <w:p>
@@ -9765,7 +9883,7 @@
           <w:caps w:val="0"/>
           <w:sz w:val="24"/>
         </w:rPr>
-        <w:t>Mostra është e vogël dhe e mbjellë me farë, sepse kompilimi në kontekst është i shtrenjtë: rreth 155 sekonda për skedar në ekzekutimin që prodhoi këto shifra, pasi detyron kompilimin e tërë mbylljes së varësive të tij. Kostoja për skedar varion shumë mes ekzekutimeve, sepse varet nga sa prej korpusit ndodhet tashmë në cache-in e sistemit të skedarëve. Verdiktet e raportuara më lart mbi tërë korpusin mbeten ato të izoluara; kjo matje nuk i zëvendëson, por tregon në ç'drejtim do të lëviznin.</w:t>
+        <w:t>Mostra është e vogël dhe e mbjellë me farë, sepse kompilimi në kontekst është i shtrenjtë: çdo rishkrim detyron kompilimin e tërë mbylljes së varësive të skedarit, dhe seanca e fundit e kësaj matjeje zgjati rreth 7 orë. Kohëzgjatja e regjistruar mbulon vetëm atë seancë e jo tërë matjen, sepse ekzekutimi është i rifillueshëm. Kostoja nuk ndahet baraz mbi skedarët: ajo paguhet një herë për çdo rishkrim, dhe skedarët janë tepër të pabarabartë — njëri në këtë mostër mban 118 rishkrime, ndërsa shumica mbajnë disa. Verdiktet e raportuara më lart mbi tërë korpusin mbeten ato të izoluara; kjo matje nuk i zëvendëson, por tregon në ç'drejtim do të lëviznin.</w:t>
       </w:r>
     </w:p>
     <w:p>
@@ -21744,7 +21862,7 @@
                 <w:caps w:val="0"/>
                 <w:sz w:val="22"/>
               </w:rPr>
-              <w:t>18–78 min</w:t>
+              <w:t>orë</w:t>
             </w:r>
           </w:p>
         </w:tc>
@@ -22585,7 +22703,7 @@
                 <w:caps w:val="0"/>
                 <w:sz w:val="22"/>
               </w:rPr>
-              <w:t>7a200751de</w:t>
+              <w:t>195c22ef45</w:t>
             </w:r>
           </w:p>
         </w:tc>

</xml_diff>

<commit_message>
Shto matjen e cilesise se rishkrimeve
Motori pretendon vetem se rishkrimi kompilon, ose se nuk shton lloj te ri
gabimi. Gjysma e dyte e perkufizimit te Fowler-it -- a permireson struktura --
nuk matet askund.

review_rewrites.py nxjerr nje moster te shtresuar me fare te fiksuar nga vendet
e aplikuara, e rigjeneron cdo rishkrim, dhe shkruan tufen e diff-eve bashke me
nje flete te verber: pa verdiktin e javac-ut, qe gjykimi te mos ankorohet.
--score e permbledh fleten, me interval Wilson dhe ripeshim sipas madhesise se
vertete te shtresave.

Ecja e vendeve u zhvendos te javasmell/evaluation/sites.py, sepse celesi i
vendit eshte pozicioni brenda skedarit dhe nje kopje e dyte e atij rendi do te
rreshqiste.
</commit_message>
<xml_diff>
--- a/docs/thesis/Punim_Diplome_Florent_Latifi.docx
+++ b/docs/thesis/Punim_Diplome_Florent_Latifi.docx
@@ -22078,6 +22078,162 @@
                 <w:sz w:val="22"/>
               </w:rPr>
               <w:t>figurat e Kapitullit 5</w:t>
+            </w:r>
+          </w:p>
+        </w:tc>
+        <w:tc>
+          <w:tcPr>
+            <w:tcW w:type="dxa" w:w="2209"/>
+          </w:tcPr>
+          <w:p>
+            <w:pPr>
+              <w:spacing w:line="240" w:lineRule="auto"/>
+            </w:pPr>
+            <w:r>
+              <w:rPr>
+                <w:rFonts w:ascii="Times New Roman" w:hAnsi="Times New Roman" w:eastAsia="Times New Roman"/>
+                <w:b w:val="0"/>
+                <w:caps w:val="0"/>
+                <w:sz w:val="22"/>
+              </w:rPr>
+              <w:t>sekonda</w:t>
+            </w:r>
+          </w:p>
+        </w:tc>
+      </w:tr>
+      <w:tr>
+        <w:tc>
+          <w:tcPr>
+            <w:tcW w:type="dxa" w:w="2209"/>
+          </w:tcPr>
+          <w:p>
+            <w:pPr>
+              <w:spacing w:line="240" w:lineRule="auto"/>
+            </w:pPr>
+            <w:r>
+              <w:rPr>
+                <w:rFonts w:ascii="Times New Roman" w:hAnsi="Times New Roman" w:eastAsia="Times New Roman"/>
+                <w:b w:val="0"/>
+                <w:caps w:val="0"/>
+                <w:sz w:val="22"/>
+              </w:rPr>
+              <w:t>16</w:t>
+            </w:r>
+          </w:p>
+        </w:tc>
+        <w:tc>
+          <w:tcPr>
+            <w:tcW w:type="dxa" w:w="2209"/>
+          </w:tcPr>
+          <w:p>
+            <w:pPr>
+              <w:spacing w:line="240" w:lineRule="auto"/>
+            </w:pPr>
+            <w:r>
+              <w:rPr>
+                <w:rFonts w:ascii="Times New Roman" w:hAnsi="Times New Roman" w:eastAsia="Times New Roman"/>
+                <w:b w:val="0"/>
+                <w:caps w:val="0"/>
+                <w:sz w:val="22"/>
+              </w:rPr>
+              <w:t>review_rewrites.py --sample</w:t>
+            </w:r>
+          </w:p>
+        </w:tc>
+        <w:tc>
+          <w:tcPr>
+            <w:tcW w:type="dxa" w:w="2209"/>
+          </w:tcPr>
+          <w:p>
+            <w:pPr>
+              <w:spacing w:line="240" w:lineRule="auto"/>
+            </w:pPr>
+            <w:r>
+              <w:rPr>
+                <w:rFonts w:ascii="Times New Roman" w:hAnsi="Times New Roman" w:eastAsia="Times New Roman"/>
+                <w:b w:val="0"/>
+                <w:caps w:val="0"/>
+                <w:sz w:val="22"/>
+              </w:rPr>
+              <w:t>mostra e rishkrimeve dhe fleta e vlerësimit</w:t>
+            </w:r>
+          </w:p>
+        </w:tc>
+        <w:tc>
+          <w:tcPr>
+            <w:tcW w:type="dxa" w:w="2209"/>
+          </w:tcPr>
+          <w:p>
+            <w:pPr>
+              <w:spacing w:line="240" w:lineRule="auto"/>
+            </w:pPr>
+            <w:r>
+              <w:rPr>
+                <w:rFonts w:ascii="Times New Roman" w:hAnsi="Times New Roman" w:eastAsia="Times New Roman"/>
+                <w:b w:val="0"/>
+                <w:caps w:val="0"/>
+                <w:sz w:val="22"/>
+              </w:rPr>
+              <w:t>sekonda</w:t>
+            </w:r>
+          </w:p>
+        </w:tc>
+      </w:tr>
+      <w:tr>
+        <w:tc>
+          <w:tcPr>
+            <w:tcW w:type="dxa" w:w="2209"/>
+          </w:tcPr>
+          <w:p>
+            <w:pPr>
+              <w:spacing w:line="240" w:lineRule="auto"/>
+            </w:pPr>
+            <w:r>
+              <w:rPr>
+                <w:rFonts w:ascii="Times New Roman" w:hAnsi="Times New Roman" w:eastAsia="Times New Roman"/>
+                <w:b w:val="0"/>
+                <w:caps w:val="0"/>
+                <w:sz w:val="22"/>
+              </w:rPr>
+              <w:t>17</w:t>
+            </w:r>
+          </w:p>
+        </w:tc>
+        <w:tc>
+          <w:tcPr>
+            <w:tcW w:type="dxa" w:w="2209"/>
+          </w:tcPr>
+          <w:p>
+            <w:pPr>
+              <w:spacing w:line="240" w:lineRule="auto"/>
+            </w:pPr>
+            <w:r>
+              <w:rPr>
+                <w:rFonts w:ascii="Times New Roman" w:hAnsi="Times New Roman" w:eastAsia="Times New Roman"/>
+                <w:b w:val="0"/>
+                <w:caps w:val="0"/>
+                <w:sz w:val="22"/>
+              </w:rPr>
+              <w:t>review_rewrites.py --score</w:t>
+            </w:r>
+          </w:p>
+        </w:tc>
+        <w:tc>
+          <w:tcPr>
+            <w:tcW w:type="dxa" w:w="2209"/>
+          </w:tcPr>
+          <w:p>
+            <w:pPr>
+              <w:spacing w:line="240" w:lineRule="auto"/>
+            </w:pPr>
+            <w:r>
+              <w:rPr>
+                <w:rFonts w:ascii="Times New Roman" w:hAnsi="Times New Roman" w:eastAsia="Times New Roman"/>
+                <w:b w:val="0"/>
+                <w:caps w:val="0"/>
+                <w:sz w:val="22"/>
+              </w:rPr>
+              <w:t>cilësia e rishkrimeve sipas rishikuesit</w:t>
             </w:r>
           </w:p>
         </w:tc>

</xml_diff>

<commit_message>
Lexo perfundimin nga rezultatet, jo nga proza
</commit_message>
<xml_diff>
--- a/docs/thesis/Punim_Diplome_Florent_Latifi.docx
+++ b/docs/thesis/Punim_Diplome_Florent_Latifi.docx
@@ -16739,7 +16739,7 @@
           <w:caps w:val="0"/>
           <w:sz w:val="24"/>
         </w:rPr>
-        <w:t xml:space="preserve">Pyetja e tretë kërkon dy gjëra, dhe ato u arritën në shkallë të ndryshme. Kompilueshmëria u verifikua për çdo rishkrim të aplikuar: shumica nuk shton asnjë lloj të ri gabimi, një pakicë e vogël e shton dhe numërohet si e tillë, dhe kur skedari kompilohet brenda projektit të vet e jo i izoluar, pjesa që kompilon plotësisht rritet ndjeshëm pa asnjë verdikt të përmbysur. Ruajtja e sjelljes, përkundrazi, </w:t>
+        <w:t xml:space="preserve">Pyetja e tretë kërkon dy gjëra, dhe ato u arritën në shkallë të ndryshme. Kompilueshmëria u verifikua për çdo rishkrim të aplikuar: shumica nuk shton asnjë lloj të ri gabimi, një pakicë e vogël e shton dhe numërohet si e tillë, dhe kur skedari kompilohet brenda projektit të vet e jo i izoluar, pjesa që kompilon plotësisht rritet ndjeshëm, ndërsa një rishkrim i vetëm nga 405 e përmbys verdiktin në drejtimin e kundërt dhe e kufizon pretendimin. Ruajtja e sjelljes, përkundrazi, </w:t>
       </w:r>
       <w:r>
         <w:rPr>
@@ -22916,6 +22916,22 @@
           <w:sz w:val="24"/>
         </w:rPr>
         <w:t>Hapi i dymbëdhjetë nuk dha skedar identik, dhe arsyeja i përket vetë matjes. Numrat që mbajnë pretendimin u riprodhuan saktësisht — po aq rishkrime, po aq verdikte «kompilon», asnjë përmbysje — por pesë kompilime që në ekzekutimin e parë e kishin kaluar kufirin kohor të kompilatorit, në të dytin përfunduan brenda tij dhe morën verdikt. Ky hap, pra, varet nga ngarkesa e makinës: verdiktet e tij janë të qëndrueshme, ndërsa ndarja mes «i kontrolluar» dhe «i pakontrolluar» nuk është. Edhe kohëzgjatja e tij ndryshoi katërfish mes dy ekzekutimeve, prej të njëjtës arsye.</w:t>
+      </w:r>
+    </w:p>
+    <w:p>
+      <w:pPr>
+        <w:spacing w:line="360" w:lineRule="auto"/>
+        <w:ind w:firstLine="360"/>
+        <w:jc w:val="both"/>
+      </w:pPr>
+      <w:r>
+        <w:rPr>
+          <w:rFonts w:ascii="Times New Roman" w:hAnsi="Times New Roman" w:eastAsia="Times New Roman"/>
+          <w:b w:val="0"/>
+          <w:caps w:val="0"/>
+          <w:sz w:val="24"/>
+        </w:rPr>
+        <w:t>Riprodhimi i mësipërm i përket matjes ashtu si ishte atëherë: mostra e saj prej 30 skedarësh, ku asnjë verdikt nuk ishte përmbysur. Tri ditë më vonë ajo mostër u dyfishua, dhe pikërisht dyfishimi nxori përmbysjen e vetme që raporton Kapitulli 5. Skedari i komituar sot është ai i dytë. Pra fjalia e mësipërme thotë se hapi riprodhohet, jo se rezultati i tij nuk ndryshoi kurrë — dallim që do të humbte po të mos shkruhej këtu.</w:t>
       </w:r>
     </w:p>
     <w:p>

</xml_diff>

<commit_message>
Shkruaj rubriken ne punim para se te mbushet fleta
</commit_message>
<xml_diff>
--- a/docs/thesis/Punim_Diplome_Florent_Latifi.docx
+++ b/docs/thesis/Punim_Diplome_Florent_Latifi.docx
@@ -3377,6 +3377,174 @@
     </w:p>
     <w:p>
       <w:pPr>
+        <w:spacing w:line="360" w:lineRule="auto"/>
+        <w:ind w:firstLine="360"/>
+        <w:jc w:val="both"/>
+      </w:pPr>
+      <w:r>
+        <w:rPr>
+          <w:rFonts w:ascii="Times New Roman" w:hAnsi="Times New Roman" w:eastAsia="Times New Roman"/>
+          <w:b w:val="0"/>
+          <w:caps w:val="0"/>
+          <w:sz w:val="24"/>
+        </w:rPr>
+        <w:t xml:space="preserve">Të tria nivelet i përgjigjen pyetjes së kompilatorit. Fowler (2018) e përkufizon refaktorimin si ndryshim që ruan sjelljen e vëzhgueshme </w:t>
+      </w:r>
+      <w:r>
+        <w:rPr>
+          <w:rFonts w:ascii="Times New Roman" w:hAnsi="Times New Roman" w:eastAsia="Times New Roman"/>
+          <w:b/>
+          <w:caps w:val="0"/>
+          <w:sz w:val="24"/>
+        </w:rPr>
+        <w:t>dhe</w:t>
+      </w:r>
+      <w:r>
+        <w:rPr>
+          <w:rFonts w:ascii="Times New Roman" w:hAnsi="Times New Roman" w:eastAsia="Times New Roman"/>
+          <w:b w:val="0"/>
+          <w:caps w:val="0"/>
+          <w:sz w:val="24"/>
+        </w:rPr>
+        <w:t xml:space="preserve"> përmirëson strukturën e brendshme; kompilimi flet vetëm për gjysmën e parë. Një metodë mund të nxirret në mënyrë krejt të saktë dhe prapëseprapë të mos jetë diçka që dikush do ta mbante: e ndarë në një kufi arbitrar, e emërtuar për asgjë, me shtatë parametra. Prandaj gjysma e dytë matet veçmas, dhe në të vetmen mënyrë që mundet pa një motor të dytë: një njeri lexon një mostër diff-esh dhe i gjykon sipas një rubrike të fiksuar.</w:t>
+      </w:r>
+    </w:p>
+    <w:p>
+      <w:pPr>
+        <w:spacing w:line="360" w:lineRule="auto"/>
+        <w:ind w:firstLine="360"/>
+        <w:jc w:val="both"/>
+      </w:pPr>
+      <w:r>
+        <w:rPr>
+          <w:rFonts w:ascii="Times New Roman" w:hAnsi="Times New Roman" w:eastAsia="Times New Roman"/>
+          <w:b w:val="0"/>
+          <w:caps w:val="0"/>
+          <w:sz w:val="24"/>
+        </w:rPr>
+        <w:t xml:space="preserve">Rubrika ka tri përmasa, secila me tri vlera. </w:t>
+      </w:r>
+      <w:r>
+        <w:rPr>
+          <w:rFonts w:ascii="Times New Roman" w:hAnsi="Times New Roman" w:eastAsia="Times New Roman"/>
+          <w:b/>
+          <w:caps w:val="0"/>
+          <w:sz w:val="24"/>
+        </w:rPr>
+        <w:t>Sjellja</w:t>
+      </w:r>
+      <w:r>
+        <w:rPr>
+          <w:rFonts w:ascii="Times New Roman" w:hAnsi="Times New Roman" w:eastAsia="Times New Roman"/>
+          <w:b w:val="0"/>
+          <w:caps w:val="0"/>
+          <w:sz w:val="24"/>
+        </w:rPr>
+        <w:t xml:space="preserve">: e ruajtur, e paqartë, e ndryshuar — «e paqartë» është përgjigje reale, sepse një rishikues që s'e dallon dot nuk do ta pranonte. </w:t>
+      </w:r>
+      <w:r>
+        <w:rPr>
+          <w:rFonts w:ascii="Times New Roman" w:hAnsi="Times New Roman" w:eastAsia="Times New Roman"/>
+          <w:b/>
+          <w:caps w:val="0"/>
+          <w:sz w:val="24"/>
+        </w:rPr>
+        <w:t>Përfitimi</w:t>
+      </w:r>
+      <w:r>
+        <w:rPr>
+          <w:rFonts w:ascii="Times New Roman" w:hAnsi="Times New Roman" w:eastAsia="Times New Roman"/>
+          <w:b w:val="0"/>
+          <w:caps w:val="0"/>
+          <w:sz w:val="24"/>
+        </w:rPr>
+        <w:t xml:space="preserve">: përmirëson, asnjanës, përkeqëson — «asnjanës» është pikërisht rasti që çdo kontroll automatik e numëron si sukses. </w:t>
+      </w:r>
+      <w:r>
+        <w:rPr>
+          <w:rFonts w:ascii="Times New Roman" w:hAnsi="Times New Roman" w:eastAsia="Times New Roman"/>
+          <w:b/>
+          <w:caps w:val="0"/>
+          <w:sz w:val="24"/>
+        </w:rPr>
+        <w:t>Pranueshmëria</w:t>
+      </w:r>
+      <w:r>
+        <w:rPr>
+          <w:rFonts w:ascii="Times New Roman" w:hAnsi="Times New Roman" w:eastAsia="Times New Roman"/>
+          <w:b w:val="0"/>
+          <w:caps w:val="0"/>
+          <w:sz w:val="24"/>
+        </w:rPr>
+        <w:t>: ashtu si është, pas një ndreqjeje, e refuzuar — mesi ndahet veç sepse emërtimi është pjesa që një motor deterministik nuk e bën dhe që njeriu e ndreq për një minutë.</w:t>
+      </w:r>
+    </w:p>
+    <w:p>
+      <w:pPr>
+        <w:spacing w:line="360" w:lineRule="auto"/>
+        <w:ind w:firstLine="360"/>
+        <w:jc w:val="both"/>
+      </w:pPr>
+      <w:r>
+        <w:rPr>
+          <w:rFonts w:ascii="Times New Roman" w:hAnsi="Times New Roman" w:eastAsia="Times New Roman"/>
+          <w:b w:val="0"/>
+          <w:caps w:val="0"/>
+          <w:sz w:val="24"/>
+        </w:rPr>
+        <w:t>Mostra është e mbjellë me farë dhe e shtresuar sipas transformimit, jo proporcionale: ExtractMethod përbën 93% të vendeve të rishkruara, ndaj një mostër proporcionale do të mbante dy ose tre raste nga secili transformim tjetër dhe nuk do të thoshte asgjë për to. Secili transformim merret në të njëjtën thellësi dhe raportohet veç; shifra e bashkuar ripeshohet me madhësitë reale të shtresave, sepse vetë mostra është qëllimisht jopërfaqësuese e popullatës nga e cila u nxor.</w:t>
+      </w:r>
+    </w:p>
+    <w:p>
+      <w:pPr>
+        <w:spacing w:line="360" w:lineRule="auto"/>
+        <w:ind w:firstLine="360"/>
+        <w:jc w:val="both"/>
+      </w:pPr>
+      <w:r>
+        <w:rPr>
+          <w:rFonts w:ascii="Times New Roman" w:hAnsi="Times New Roman" w:eastAsia="Times New Roman"/>
+          <w:b w:val="0"/>
+          <w:caps w:val="0"/>
+          <w:sz w:val="24"/>
+        </w:rPr>
+        <w:t>Fleta që plotësohet nuk mban asnjë verdikt të kompilatorit. Bashkimi me verdiktet bëhet vetëm në pikëzim, sepse një rishikues që sheh se rishkrimi kompiloi e ka marrë gjysmën e përgjigjes para se ta jepte, dhe tabela e kryqëzuar mes dy verdikteve është ndër gjërat më të dobishme që kjo matje prodhon: ajo thotë nëse kontrolli automatik është zëvendësues i pranimit apo thjesht i korreluar me të.</w:t>
+      </w:r>
+    </w:p>
+    <w:p>
+      <w:pPr>
+        <w:spacing w:line="360" w:lineRule="auto"/>
+        <w:ind w:firstLine="360"/>
+        <w:jc w:val="both"/>
+      </w:pPr>
+      <w:r>
+        <w:rPr>
+          <w:rFonts w:ascii="Times New Roman" w:hAnsi="Times New Roman" w:eastAsia="Times New Roman"/>
+          <w:b w:val="0"/>
+          <w:caps w:val="0"/>
+          <w:sz w:val="24"/>
+        </w:rPr>
+        <w:t>Intervalet janë Wilson (1927) e jo përafrimi normal. Me njëzet vëzhgime dhe një përpjesë pranë skajit, përafrimi normal jep kufij jashtë intervalit [0, 1] dhe mbulim dukshëm nën 95% — rasti për të cilin Brown et al. (2001) e këshillojnë kundër tij, dhe pikërisht rasti këtu.</w:t>
+      </w:r>
+    </w:p>
+    <w:p>
+      <w:pPr>
+        <w:spacing w:line="360" w:lineRule="auto"/>
+        <w:ind w:firstLine="360"/>
+        <w:jc w:val="both"/>
+      </w:pPr>
+      <w:r>
+        <w:rPr>
+          <w:rFonts w:ascii="Times New Roman" w:hAnsi="Times New Roman" w:eastAsia="Times New Roman"/>
+          <w:b w:val="0"/>
+          <w:caps w:val="0"/>
+          <w:sz w:val="24"/>
+        </w:rPr>
+        <w:t>Vlerësuesi është autori i punimit, dhe kjo është kufizim e jo veçori. Një rishikues i vetëm, njëkohësisht autor i motorit që po gjykon, është forma më e dobët që kjo matje mund të marrë; është forma e disponueshme. Punimi e raporton si gjykim të një rishikuesi, me rubrikën e fiksuar para se të shihej qoftë edhe një diff dhe me fletën e komituar, që lexuesi të mund të mos pajtohet me një rresht të emërtuar e jo me një numër. Pajtimi mes rishikuesve, që Nënkapitulli 5 e mat për etiketat e MLCQ-së, këtu nuk mund të matet fare.</w:t>
+      </w:r>
+    </w:p>
+    <w:p>
+      <w:pPr>
         <w:pStyle w:val="Heading2"/>
       </w:pPr>
       <w:r>
@@ -9899,6 +10067,22 @@
           <w:caps w:val="0"/>
           <w:sz w:val="24"/>
         </w:rPr>
+        <w:t>[PLOTËSO: fleta e vlerësimit të cilësisë është nxjerrë me hapin 16 të Shtojcës 8.5 dhe pret gjykimin e rishikuesit; kjo tabelë gjenerohet automatikisht sapo ajo të mbushet dhe të pikëzohet me hapin 17.]</w:t>
+      </w:r>
+    </w:p>
+    <w:p>
+      <w:pPr>
+        <w:spacing w:line="360" w:lineRule="auto"/>
+        <w:ind w:firstLine="360"/>
+        <w:jc w:val="both"/>
+      </w:pPr>
+      <w:r>
+        <w:rPr>
+          <w:rFonts w:ascii="Times New Roman" w:hAnsi="Times New Roman" w:eastAsia="Times New Roman"/>
+          <w:b w:val="0"/>
+          <w:caps w:val="0"/>
+          <w:sz w:val="24"/>
+        </w:rPr>
         <w:t>Norma e përgjithshme prej 20.4% nuk thotë cilat vende u refuzuan. Një mjet që rishkruan rastet e buta dhe tërhiqet nga ato të rënda vlen shumë më pak se sa sugjeron ajo shifër, ndaj çdo vend u nda edhe sipas ashpërsisë që i cakton vetë sistemi.</w:t>
       </w:r>
     </w:p>
@@ -16551,6 +16735,22 @@
           <w:caps w:val="0"/>
           <w:sz w:val="24"/>
         </w:rPr>
+        <w:t>Cilësia e rishkrimeve u vlerësua nga një rishikues i vetëm, i cili është autori i motorit. Rubrika u fiksua para se të shihej qoftë edhe një diff dhe fleta është e komituar rresht për rresht, por asnjëra prej të dyjave nuk e zëvendëson pavarësinë. Pajtimi mes rishikuesve, që për etiketat e MLCQ-së matet dhe raportohet, për këtë matje nuk mund të matet fare, ndaj ajo është e vetmja shifër e Kapitullit 5 pa tavan të njohur mbi të.</w:t>
+      </w:r>
+    </w:p>
+    <w:p>
+      <w:pPr>
+        <w:spacing w:line="360" w:lineRule="auto"/>
+        <w:ind w:firstLine="360"/>
+        <w:jc w:val="both"/>
+      </w:pPr>
+      <w:r>
+        <w:rPr>
+          <w:rFonts w:ascii="Times New Roman" w:hAnsi="Times New Roman" w:eastAsia="Times New Roman"/>
+          <w:b w:val="0"/>
+          <w:caps w:val="0"/>
+          <w:sz w:val="24"/>
+        </w:rPr>
         <w:t>Analizuesi nuk zgjidh simbole, ndaj dy nga pesë transformimet e planifikuara nuk automatizohen. Kjo nuk është mangësi implementimi por pasojë e drejtpërdrejtë e një zgjedhjeje arkitekturore të deklaruar.</w:t>
       </w:r>
     </w:p>
@@ -16894,7 +17094,7 @@
         </w:rPr>
         <w:t>[5]</w:t>
         <w:tab/>
-        <w:t>Brunsfeld, M. et al. tree-sitter: An incremental parsing system for programming tools. [https://tree-sitter.github.io/tree-sitter/], data e qasjes: 30.08.2026.</w:t>
+        <w:t>Brown, L. D., Cai, T. T. &amp; DasGupta, A. 2001. “Interval Estimation for a Binomial Proportion.” Statistical Science, 16(2), pp. 101-133.</w:t>
       </w:r>
     </w:p>
     <w:p>
@@ -16912,7 +17112,7 @@
         </w:rPr>
         <w:t>[6]</w:t>
         <w:tab/>
-        <w:t>Chidamber, S. R. &amp; Kemerer, C. F. 1994. “A Metrics Suite for Object Oriented Design.” IEEE Transactions on Software Engineering, 20(6), pp. 476-493.</w:t>
+        <w:t>Brunsfeld, M. et al. tree-sitter: An incremental parsing system for programming tools. [https://tree-sitter.github.io/tree-sitter/], data e qasjes: 30.08.2026.</w:t>
       </w:r>
     </w:p>
     <w:p>
@@ -16930,7 +17130,7 @@
         </w:rPr>
         <w:t>[7]</w:t>
         <w:tab/>
-        <w:t>Cohen, J. 1960. “A Coefficient of Agreement for Nominal Scales.” Educational and Psychological Measurement, 20(1), pp. 37-46.</w:t>
+        <w:t>Chidamber, S. R. &amp; Kemerer, C. F. 1994. “A Metrics Suite for Object Oriented Design.” IEEE Transactions on Software Engineering, 20(6), pp. 476-493.</w:t>
       </w:r>
     </w:p>
     <w:p>
@@ -16948,7 +17148,7 @@
         </w:rPr>
         <w:t>[8]</w:t>
         <w:tab/>
-        <w:t>Cunningham, W. 1992. “The WyCash Portfolio Management System.” OOPSLA ’92 Experience Report. Addendum to the Proceedings on Object-Oriented Programming Systems, Languages, and Applications, pp. 29-30.</w:t>
+        <w:t>Cohen, J. 1960. “A Coefficient of Agreement for Nominal Scales.” Educational and Psychological Measurement, 20(1), pp. 37-46.</w:t>
       </w:r>
     </w:p>
     <w:p>
@@ -16966,7 +17166,7 @@
         </w:rPr>
         <w:t>[9]</w:t>
         <w:tab/>
-        <w:t>Di Nucci, D., Palomba, F., Tamburri, D. A., Serebrenik, A. &amp; De Lucia, A. 2018. “Detecting code smells using machine learning techniques: Are we there yet?” Proceedings of the 25th IEEE International Conference on Software Analysis, Evolution and Reengineering (SANER ’18), pp. 612-621.</w:t>
+        <w:t>Cunningham, W. 1992. “The WyCash Portfolio Management System.” OOPSLA ’92 Experience Report. Addendum to the Proceedings on Object-Oriented Programming Systems, Languages, and Applications, pp. 29-30.</w:t>
       </w:r>
     </w:p>
     <w:p>
@@ -16984,7 +17184,7 @@
         </w:rPr>
         <w:t>[10]</w:t>
         <w:tab/>
-        <w:t>Fowler, M. 2018. Refactoring: Improving the Design of Existing Code, 2nd edn. Boston: Addison-Wesley.</w:t>
+        <w:t>Di Nucci, D., Palomba, F., Tamburri, D. A., Serebrenik, A. &amp; De Lucia, A. 2018. “Detecting code smells using machine learning techniques: Are we there yet?” Proceedings of the 25th IEEE International Conference on Software Analysis, Evolution and Reengineering (SANER ’18), pp. 612-621.</w:t>
       </w:r>
     </w:p>
     <w:p>
@@ -17002,7 +17202,7 @@
         </w:rPr>
         <w:t>[11]</w:t>
         <w:tab/>
-        <w:t>Friedman, J. H. 2001. “Greedy Function Approximation: A Gradient Boosting Machine.” The Annals of Statistics, 29(5), pp. 1189-1232.</w:t>
+        <w:t>Fowler, M. 2018. Refactoring: Improving the Design of Existing Code, 2nd edn. Boston: Addison-Wesley.</w:t>
       </w:r>
     </w:p>
     <w:p>
@@ -17020,7 +17220,7 @@
         </w:rPr>
         <w:t>[12]</w:t>
         <w:tab/>
-        <w:t>Henderson-Sellers, B. 1996. Object-Oriented Metrics: Measures of Complexity. Upper Saddle River, NJ: Prentice Hall.</w:t>
+        <w:t>Friedman, J. H. 2001. “Greedy Function Approximation: A Gradient Boosting Machine.” The Annals of Statistics, 29(5), pp. 1189-1232.</w:t>
       </w:r>
     </w:p>
     <w:p>
@@ -17038,7 +17238,7 @@
         </w:rPr>
         <w:t>[13]</w:t>
         <w:tab/>
-        <w:t>Lanza, M. &amp; Marinescu, R. 2006. Object-Oriented Metrics in Practice: Using Software Metrics to Characterize, Evaluate, and Improve the Design of Object-Oriented Systems. Berlin: Springer.</w:t>
+        <w:t>Henderson-Sellers, B. 1996. Object-Oriented Metrics: Measures of Complexity. Upper Saddle River, NJ: Prentice Hall.</w:t>
       </w:r>
     </w:p>
     <w:p>
@@ -17056,7 +17256,7 @@
         </w:rPr>
         <w:t>[14]</w:t>
         <w:tab/>
-        <w:t>Lehman, M. M. 1980. “Programs, Life Cycles, and Laws of Software Evolution.” Proceedings of the IEEE, 68(9), pp. 1060-1076.</w:t>
+        <w:t>Lanza, M. &amp; Marinescu, R. 2006. Object-Oriented Metrics in Practice: Using Software Metrics to Characterize, Evaluate, and Improve the Design of Object-Oriented Systems. Berlin: Springer.</w:t>
       </w:r>
     </w:p>
     <w:p>
@@ -17074,7 +17274,7 @@
         </w:rPr>
         <w:t>[15]</w:t>
         <w:tab/>
-        <w:t>Madeyski, L. &amp; Lewowski, T. 2020. “MLCQ: Industry-relevant code smell data set.” Proceedings of the 24th International Conference on Evaluation and Assessment in Software Engineering (EASE ’20), pp. 342-347.</w:t>
+        <w:t>Lehman, M. M. 1980. “Programs, Life Cycles, and Laws of Software Evolution.” Proceedings of the IEEE, 68(9), pp. 1060-1076.</w:t>
       </w:r>
     </w:p>
     <w:p>
@@ -17092,7 +17292,7 @@
         </w:rPr>
         <w:t>[16]</w:t>
         <w:tab/>
-        <w:t>Mäntylä, M. V. &amp; Lassenius, C. 2006. “Subjective evaluation of software evolvability using code smells: An empirical study.” Empirical Software Engineering, 11(3), pp. 395-431.</w:t>
+        <w:t>Madeyski, L. &amp; Lewowski, T. 2020. “MLCQ: Industry-relevant code smell data set.” Proceedings of the 24th International Conference on Evaluation and Assessment in Software Engineering (EASE ’20), pp. 342-347.</w:t>
       </w:r>
     </w:p>
     <w:p>
@@ -17110,7 +17310,7 @@
         </w:rPr>
         <w:t>[17]</w:t>
         <w:tab/>
-        <w:t>Marinescu, R. 2004. “Detection Strategies: Metrics-Based Rules for Detecting Design Flaws.” Proceedings of the 20th IEEE International Conference on Software Maintenance (ICSM ’04), pp. 350-359.</w:t>
+        <w:t>Mäntylä, M. V. &amp; Lassenius, C. 2006. “Subjective evaluation of software evolvability using code smells: An empirical study.” Empirical Software Engineering, 11(3), pp. 395-431.</w:t>
       </w:r>
     </w:p>
     <w:p>
@@ -17128,7 +17328,7 @@
         </w:rPr>
         <w:t>[18]</w:t>
         <w:tab/>
-        <w:t>Matthews, B. W. 1975. “Comparison of the predicted and observed secondary structure of T4 phage lysozyme.” Biochimica et Biophysica Acta (BBA) - Protein Structure, 405(2), pp. 442-451.</w:t>
+        <w:t>Marinescu, R. 2004. “Detection Strategies: Metrics-Based Rules for Detecting Design Flaws.” Proceedings of the 20th IEEE International Conference on Software Maintenance (ICSM ’04), pp. 350-359.</w:t>
       </w:r>
     </w:p>
     <w:p>
@@ -17146,7 +17346,7 @@
         </w:rPr>
         <w:t>[19]</w:t>
         <w:tab/>
-        <w:t>McCabe, T. J. 1976. “A Complexity Measure.” IEEE Transactions on Software Engineering, SE-2(4), pp. 308-320.</w:t>
+        <w:t>Matthews, B. W. 1975. “Comparison of the predicted and observed secondary structure of T4 phage lysozyme.” Biochimica et Biophysica Acta (BBA) - Protein Structure, 405(2), pp. 442-451.</w:t>
       </w:r>
     </w:p>
     <w:p>
@@ -17164,7 +17364,7 @@
         </w:rPr>
         <w:t>[20]</w:t>
         <w:tab/>
-        <w:t>Moha, N., Guéhéneuc, Y.-G., Duchien, L. &amp; Le Meur, A.-F. 2010. “DECOR: A Method for the Specification and Detection of Code and Design Smells.” IEEE Transactions on Software Engineering, 36(1), pp. 20-36.</w:t>
+        <w:t>McCabe, T. J. 1976. “A Complexity Measure.” IEEE Transactions on Software Engineering, SE-2(4), pp. 308-320.</w:t>
       </w:r>
     </w:p>
     <w:p>
@@ -17182,7 +17382,7 @@
         </w:rPr>
         <w:t>[21]</w:t>
         <w:tab/>
-        <w:t>Murphy-Hill, E., Parnin, C. &amp; Black, A. P. 2012. “How We Refactor, and How We Know It.” IEEE Transactions on Software Engineering, 38(1), pp. 5-18.</w:t>
+        <w:t>Moha, N., Guéhéneuc, Y.-G., Duchien, L. &amp; Le Meur, A.-F. 2010. “DECOR: A Method for the Specification and Detection of Code and Design Smells.” IEEE Transactions on Software Engineering, 36(1), pp. 20-36.</w:t>
       </w:r>
     </w:p>
     <w:p>
@@ -17200,7 +17400,7 @@
         </w:rPr>
         <w:t>[22]</w:t>
         <w:tab/>
-        <w:t>Opdyke, W. F. 1992. Refactoring Object-Oriented Frameworks. PhD thesis. University of Illinois at Urbana-Champaign.</w:t>
+        <w:t>Murphy-Hill, E., Parnin, C. &amp; Black, A. P. 2012. “How We Refactor, and How We Know It.” IEEE Transactions on Software Engineering, 38(1), pp. 5-18.</w:t>
       </w:r>
     </w:p>
     <w:p>
@@ -17218,7 +17418,7 @@
         </w:rPr>
         <w:t>[23]</w:t>
         <w:tab/>
-        <w:t>Palomba, F., Bavota, G., Di Penta, M., Oliveto, R., Poshyvanyk, D. &amp; De Lucia, A. 2015. “Mining Version Histories for Detecting Code Smells.” IEEE Transactions on Software Engineering, 41(5), pp. 462-489.</w:t>
+        <w:t>Opdyke, W. F. 1992. Refactoring Object-Oriented Frameworks. PhD thesis. University of Illinois at Urbana-Champaign.</w:t>
       </w:r>
     </w:p>
     <w:p>
@@ -17236,7 +17436,7 @@
         </w:rPr>
         <w:t>[24]</w:t>
         <w:tab/>
-        <w:t>Park, R. E. 1992. Software Size Measurement: A Framework for Counting Source Statements. Technical Report CMU/SEI-92-TR-020. Pittsburgh: Software Engineering Institute, Carnegie Mellon University.</w:t>
+        <w:t>Palomba, F., Bavota, G., Di Penta, M., Oliveto, R., Poshyvanyk, D. &amp; De Lucia, A. 2015. “Mining Version Histories for Detecting Code Smells.” IEEE Transactions on Software Engineering, 41(5), pp. 462-489.</w:t>
       </w:r>
     </w:p>
     <w:p>
@@ -17254,7 +17454,7 @@
         </w:rPr>
         <w:t>[25]</w:t>
         <w:tab/>
-        <w:t>Pedregosa, F., Varoquaux, G., Gramfort, A., Michel, V., Thirion, B., Grisel, O., et al. 2011. “Scikit-learn: Machine Learning in Python.” Journal of Machine Learning Research, 12, pp. 2825-2830.</w:t>
+        <w:t>Park, R. E. 1992. Software Size Measurement: A Framework for Counting Source Statements. Technical Report CMU/SEI-92-TR-020. Pittsburgh: Software Engineering Institute, Carnegie Mellon University.</w:t>
       </w:r>
     </w:p>
     <w:p>
@@ -17272,7 +17472,7 @@
         </w:rPr>
         <w:t>[26]</w:t>
         <w:tab/>
-        <w:t>Sharma, T. &amp; Spinellis, D. 2018. “A survey on software smells.” Journal of Systems and Software, 138, pp. 158-173.</w:t>
+        <w:t>Pedregosa, F., Varoquaux, G., Gramfort, A., Michel, V., Thirion, B., Grisel, O., et al. 2011. “Scikit-learn: Machine Learning in Python.” Journal of Machine Learning Research, 12, pp. 2825-2830.</w:t>
       </w:r>
     </w:p>
     <w:p>
@@ -17290,7 +17490,7 @@
         </w:rPr>
         <w:t>[27]</w:t>
         <w:tab/>
-        <w:t>Silva, D., Tsantalis, N. &amp; Valente, M. T. 2016. “Why We Refactor? Confessions of GitHub Contributors.” Proceedings of the 24th ACM SIGSOFT International Symposium on Foundations of Software Engineering (FSE ’16), pp. 858-870.</w:t>
+        <w:t>Sharma, T. &amp; Spinellis, D. 2018. “A survey on software smells.” Journal of Systems and Software, 138, pp. 158-173.</w:t>
       </w:r>
     </w:p>
     <w:p>
@@ -17308,7 +17508,43 @@
         </w:rPr>
         <w:t>[28]</w:t>
         <w:tab/>
+        <w:t>Silva, D., Tsantalis, N. &amp; Valente, M. T. 2016. “Why We Refactor? Confessions of GitHub Contributors.” Proceedings of the 24th ACM SIGSOFT International Symposium on Foundations of Software Engineering (FSE ’16), pp. 858-870.</w:t>
+      </w:r>
+    </w:p>
+    <w:p>
+      <w:pPr>
+        <w:spacing w:line="360" w:lineRule="auto"/>
+        <w:ind w:left="720" w:hanging="720"/>
+        <w:jc w:val="both"/>
+      </w:pPr>
+      <w:r>
+        <w:rPr>
+          <w:rFonts w:ascii="Times New Roman" w:hAnsi="Times New Roman" w:eastAsia="Times New Roman"/>
+          <w:b w:val="0"/>
+          <w:caps w:val="0"/>
+          <w:sz w:val="24"/>
+        </w:rPr>
+        <w:t>[29]</w:t>
+        <w:tab/>
         <w:t>Tsantalis, N. &amp; Chatzigeorgiou, A. 2009. “Identification of Move Method Refactoring Opportunities.” IEEE Transactions on Software Engineering, 35(3), pp. 347-367.</w:t>
+      </w:r>
+    </w:p>
+    <w:p>
+      <w:pPr>
+        <w:spacing w:line="360" w:lineRule="auto"/>
+        <w:ind w:left="720" w:hanging="720"/>
+        <w:jc w:val="both"/>
+      </w:pPr>
+      <w:r>
+        <w:rPr>
+          <w:rFonts w:ascii="Times New Roman" w:hAnsi="Times New Roman" w:eastAsia="Times New Roman"/>
+          <w:b w:val="0"/>
+          <w:caps w:val="0"/>
+          <w:sz w:val="24"/>
+        </w:rPr>
+        <w:t>[30]</w:t>
+        <w:tab/>
+        <w:t>Wilson, E. B. 1927. “Probable Inference, the Law of Succession, and Statistical Inference.” Journal of the American Statistical Association, 22(158), pp. 209-212.</w:t>
       </w:r>
     </w:p>
     <w:p>

</xml_diff>

<commit_message>
Shto krahasimin me PMD-ne, me pragjet e tij
</commit_message>
<xml_diff>
--- a/docs/thesis/Punim_Diplome_Florent_Latifi.docx
+++ b/docs/thesis/Punim_Diplome_Florent_Latifi.docx
@@ -3639,6 +3639,86 @@
     </w:p>
     <w:p>
       <w:pPr>
+        <w:spacing w:line="360" w:lineRule="auto"/>
+        <w:ind w:firstLine="360"/>
+        <w:jc w:val="both"/>
+      </w:pPr>
+      <w:r>
+        <w:rPr>
+          <w:rFonts w:ascii="Times New Roman" w:hAnsi="Times New Roman" w:eastAsia="Times New Roman"/>
+          <w:b w:val="0"/>
+          <w:caps w:val="0"/>
+          <w:sz w:val="24"/>
+        </w:rPr>
+        <w:t>Të gjitha shifrat e mësipërme e krahasojnë Qasjen A me Qasjen B dhe të dyja me MLCQ-në. Ato thonë cila prej të dyjave është më e mirë brenda këtij punimi; nuk thonë nëse ndonjëra ia vlen përballë një mjeti që zhvilluesi e instalon sot. Prandaj i njëjti vlerësim i zbatohet edhe një detektori të jashtëm: PMD-së (PMD Team, 2026), version 7.27.0, i fiksuar dhe me shumën e tij kontrolluese të regjistruar.</w:t>
+      </w:r>
+    </w:p>
+    <w:p>
+      <w:pPr>
+        <w:spacing w:line="360" w:lineRule="auto"/>
+        <w:ind w:firstLine="360"/>
+        <w:jc w:val="both"/>
+      </w:pPr>
+      <w:r>
+        <w:rPr>
+          <w:rFonts w:ascii="Times New Roman" w:hAnsi="Times New Roman" w:eastAsia="Times New Roman"/>
+          <w:b w:val="0"/>
+          <w:caps w:val="0"/>
+          <w:sz w:val="24"/>
+        </w:rPr>
+        <w:t>PMD u zgjodh sepse rregullat e tij GodClass dhe DataClass zbatojnë strategjitë e detektimit të Lanza-s dhe Marinescu-t (Lanza &amp; Marinescu, 2006) — të njëjtat burime që citojnë detektorët e këtij punimi. Krahasimi është pra mes dy zbatimeve të një strategjie të botuar, jo mes këtij punimi dhe një mjeti të palidhur me të.</w:t>
+      </w:r>
+    </w:p>
+    <w:p>
+      <w:pPr>
+        <w:spacing w:line="360" w:lineRule="auto"/>
+        <w:ind w:firstLine="360"/>
+        <w:jc w:val="both"/>
+      </w:pPr>
+      <w:r>
+        <w:rPr>
+          <w:rFonts w:ascii="Times New Roman" w:hAnsi="Times New Roman" w:eastAsia="Times New Roman"/>
+          <w:b w:val="0"/>
+          <w:caps w:val="0"/>
+          <w:sz w:val="24"/>
+        </w:rPr>
+        <w:t>PMD ekzekutohet me pragjet e veta të parazgjedhura, pa asnjë veti të mbishkruar. Përshtatja e tyre ndaj MLCQ-së do të maste një mjet që askush nuk e përdor, dhe do të ishte i njëjti gabim me akordimin e pragjeve tona për ta kaluar një test.</w:t>
+      </w:r>
+    </w:p>
+    <w:p>
+      <w:pPr>
+        <w:spacing w:line="360" w:lineRule="auto"/>
+        <w:ind w:firstLine="360"/>
+        <w:jc w:val="both"/>
+      </w:pPr>
+      <w:r>
+        <w:rPr>
+          <w:rFonts w:ascii="Times New Roman" w:hAnsi="Times New Roman" w:eastAsia="Times New Roman"/>
+          <w:b w:val="0"/>
+          <w:caps w:val="0"/>
+          <w:sz w:val="24"/>
+        </w:rPr>
+        <w:t>Krahasimi bëhet mbi të njëjtat mostra, me të njëjtin kod pikëzimi dhe të njëjtin agregim, dhe të dyja kolonat rillogariten nga i njëjti skedar në të njëjtin ekzekutim, që të mos rrëshqasin nga njëra-tjetra. Përputhja mes një shkeljeje të PMD-së dhe një entiteti të MLCQ-së bëhet me emrin e klasës dhe të metodës që raporti i PMD-së i mban vetë, e jo me numra rreshtash: numri i rreshtit do të kërkonte të merrej me mend nëse një mjet e numëron anotimin ose Javadoc-un pjesë të deklarimit.</w:t>
+      </w:r>
+    </w:p>
+    <w:p>
+      <w:pPr>
+        <w:spacing w:line="360" w:lineRule="auto"/>
+        <w:ind w:firstLine="360"/>
+        <w:jc w:val="both"/>
+      </w:pPr>
+      <w:r>
+        <w:rPr>
+          <w:rFonts w:ascii="Times New Roman" w:hAnsi="Times New Roman" w:eastAsia="Times New Roman"/>
+          <w:b w:val="0"/>
+          <w:caps w:val="0"/>
+          <w:sz w:val="24"/>
+        </w:rPr>
+        <w:t>Dy kufizime deklarohen para se të shihet ndonjë shifër. PMD analizon një njësi kompilimi në një kohë dhe nuk merr classpath të kompiluar, sepse korpusi nuk mban skedarë ndërtimi; ATFD-ja e GodClass-it, e përkufizuar kundrejt tipave të tjerë të projektit, i llogaritet pra nga sa duket brenda një skedari, ndërsa detektorët e këtij punimi e marrin projektin e plotë. Handikapi është real dhe e favorizon këtë punim. Së dyti, PMD nuk ka fare rregull për Feature Envy-n; rregulli i tij më i afërt, LawOfDemeter, mat zinxhirë mesazhesh e jo qasje në të dhëna të huaja, ndaj raportohet nën emrin e vet dhe kurrë si detektor i Feature Envy-së.</w:t>
+      </w:r>
+    </w:p>
+    <w:p>
+      <w:pPr>
         <w:pStyle w:val="Heading2"/>
       </w:pPr>
       <w:r>
@@ -14029,6 +14109,52 @@
           <w:caps w:val="0"/>
           <w:sz w:val="24"/>
         </w:rPr>
+        <w:t>5.6 Krahasimi me një mjet ekzistues</w:t>
+      </w:r>
+    </w:p>
+    <w:p>
+      <w:pPr>
+        <w:spacing w:line="360" w:lineRule="auto"/>
+        <w:ind w:firstLine="360"/>
+        <w:jc w:val="both"/>
+      </w:pPr>
+      <w:r>
+        <w:rPr>
+          <w:rFonts w:ascii="Times New Roman" w:hAnsi="Times New Roman" w:eastAsia="Times New Roman"/>
+          <w:b w:val="0"/>
+          <w:caps w:val="0"/>
+          <w:sz w:val="24"/>
+        </w:rPr>
+        <w:t>Nënkapitujt e mësipërm i vënë dy qasjet e këtij punimi përballë njëra-tjetrës. Ky i vë përballë një mjeti që zhvilluesi e instalon sot, sepse pyetja nuk është vetëm cila prej të dyjave është më e mirë, por a ia vlen ndonjëra.</w:t>
+      </w:r>
+    </w:p>
+    <w:p>
+      <w:pPr>
+        <w:spacing w:line="360" w:lineRule="auto"/>
+        <w:ind w:firstLine="360"/>
+        <w:jc w:val="both"/>
+      </w:pPr>
+      <w:r>
+        <w:rPr>
+          <w:rFonts w:ascii="Times New Roman" w:hAnsi="Times New Roman" w:eastAsia="Times New Roman"/>
+          <w:b w:val="0"/>
+          <w:caps w:val="0"/>
+          <w:sz w:val="24"/>
+        </w:rPr>
+        <w:t>[PLOTËSO: krahasimi me mjetin e jashtëm gjenerohet nga hapi 19 i Shtojcës 8.5; tabela shfaqet sapo ai ekzekutim të përfundojë.]</w:t>
+      </w:r>
+    </w:p>
+    <w:p>
+      <w:pPr>
+        <w:pStyle w:val="Heading2"/>
+      </w:pPr>
+      <w:r>
+        <w:rPr>
+          <w:rFonts w:ascii="Times New Roman" w:hAnsi="Times New Roman" w:eastAsia="Times New Roman"/>
+          <w:b/>
+          <w:caps w:val="0"/>
+          <w:sz w:val="24"/>
+        </w:rPr>
         <w:t>5.6 Ashpërsia e derivuar kundrejt gjykimit të rishikuesve</w:t>
       </w:r>
     </w:p>
@@ -17490,7 +17616,7 @@
         </w:rPr>
         <w:t>[27]</w:t>
         <w:tab/>
-        <w:t>Sharma, T. &amp; Spinellis, D. 2018. “A survey on software smells.” Journal of Systems and Software, 138, pp. 158-173.</w:t>
+        <w:t>PMD Team, 2026. PMD: An Extensible Cross-Language Static Code Analyzer, versioni 7.27.0. https://pmd.github.io/ (data e qasjes: 8 shtator 2026).</w:t>
       </w:r>
     </w:p>
     <w:p>
@@ -17508,7 +17634,7 @@
         </w:rPr>
         <w:t>[28]</w:t>
         <w:tab/>
-        <w:t>Silva, D., Tsantalis, N. &amp; Valente, M. T. 2016. “Why We Refactor? Confessions of GitHub Contributors.” Proceedings of the 24th ACM SIGSOFT International Symposium on Foundations of Software Engineering (FSE ’16), pp. 858-870.</w:t>
+        <w:t>Sharma, T. &amp; Spinellis, D. 2018. “A survey on software smells.” Journal of Systems and Software, 138, pp. 158-173.</w:t>
       </w:r>
     </w:p>
     <w:p>
@@ -17526,7 +17652,7 @@
         </w:rPr>
         <w:t>[29]</w:t>
         <w:tab/>
-        <w:t>Tsantalis, N. &amp; Chatzigeorgiou, A. 2009. “Identification of Move Method Refactoring Opportunities.” IEEE Transactions on Software Engineering, 35(3), pp. 347-367.</w:t>
+        <w:t>Silva, D., Tsantalis, N. &amp; Valente, M. T. 2016. “Why We Refactor? Confessions of GitHub Contributors.” Proceedings of the 24th ACM SIGSOFT International Symposium on Foundations of Software Engineering (FSE ’16), pp. 858-870.</w:t>
       </w:r>
     </w:p>
     <w:p>
@@ -17543,6 +17669,24 @@
           <w:sz w:val="24"/>
         </w:rPr>
         <w:t>[30]</w:t>
+        <w:tab/>
+        <w:t>Tsantalis, N. &amp; Chatzigeorgiou, A. 2009. “Identification of Move Method Refactoring Opportunities.” IEEE Transactions on Software Engineering, 35(3), pp. 347-367.</w:t>
+      </w:r>
+    </w:p>
+    <w:p>
+      <w:pPr>
+        <w:spacing w:line="360" w:lineRule="auto"/>
+        <w:ind w:left="720" w:hanging="720"/>
+        <w:jc w:val="both"/>
+      </w:pPr>
+      <w:r>
+        <w:rPr>
+          <w:rFonts w:ascii="Times New Roman" w:hAnsi="Times New Roman" w:eastAsia="Times New Roman"/>
+          <w:b w:val="0"/>
+          <w:caps w:val="0"/>
+          <w:sz w:val="24"/>
+        </w:rPr>
+        <w:t>[31]</w:t>
         <w:tab/>
         <w:t>Wilson, E. B. 1927. “Probable Inference, the Law of Succession, and Statistical Inference.” Journal of the American Statistical Association, 22(158), pp. 209-212.</w:t>
       </w:r>
@@ -22489,6 +22633,162 @@
                 <w:sz w:val="22"/>
               </w:rPr>
               <w:t>sekonda</w:t>
+            </w:r>
+          </w:p>
+        </w:tc>
+      </w:tr>
+      <w:tr>
+        <w:tc>
+          <w:tcPr>
+            <w:tcW w:type="dxa" w:w="2209"/>
+          </w:tcPr>
+          <w:p>
+            <w:pPr>
+              <w:spacing w:line="240" w:lineRule="auto"/>
+            </w:pPr>
+            <w:r>
+              <w:rPr>
+                <w:rFonts w:ascii="Times New Roman" w:hAnsi="Times New Roman" w:eastAsia="Times New Roman"/>
+                <w:b w:val="0"/>
+                <w:caps w:val="0"/>
+                <w:sz w:val="22"/>
+              </w:rPr>
+              <w:t>18</w:t>
+            </w:r>
+          </w:p>
+        </w:tc>
+        <w:tc>
+          <w:tcPr>
+            <w:tcW w:type="dxa" w:w="2209"/>
+          </w:tcPr>
+          <w:p>
+            <w:pPr>
+              <w:spacing w:line="240" w:lineRule="auto"/>
+            </w:pPr>
+            <w:r>
+              <w:rPr>
+                <w:rFonts w:ascii="Times New Roman" w:hAnsi="Times New Roman" w:eastAsia="Times New Roman"/>
+                <w:b w:val="0"/>
+                <w:caps w:val="0"/>
+                <w:sz w:val="22"/>
+              </w:rPr>
+              <w:t>fetch_pmd.py</w:t>
+            </w:r>
+          </w:p>
+        </w:tc>
+        <w:tc>
+          <w:tcPr>
+            <w:tcW w:type="dxa" w:w="2209"/>
+          </w:tcPr>
+          <w:p>
+            <w:pPr>
+              <w:spacing w:line="240" w:lineRule="auto"/>
+            </w:pPr>
+            <w:r>
+              <w:rPr>
+                <w:rFonts w:ascii="Times New Roman" w:hAnsi="Times New Roman" w:eastAsia="Times New Roman"/>
+                <w:b w:val="0"/>
+                <w:caps w:val="0"/>
+                <w:sz w:val="22"/>
+              </w:rPr>
+              <w:t>mjeti i jashtëm i krahasimit, jashtë git-it</w:t>
+            </w:r>
+          </w:p>
+        </w:tc>
+        <w:tc>
+          <w:tcPr>
+            <w:tcW w:type="dxa" w:w="2209"/>
+          </w:tcPr>
+          <w:p>
+            <w:pPr>
+              <w:spacing w:line="240" w:lineRule="auto"/>
+            </w:pPr>
+            <w:r>
+              <w:rPr>
+                <w:rFonts w:ascii="Times New Roman" w:hAnsi="Times New Roman" w:eastAsia="Times New Roman"/>
+                <w:b w:val="0"/>
+                <w:caps w:val="0"/>
+                <w:sz w:val="22"/>
+              </w:rPr>
+              <w:t>minuta, një herë</w:t>
+            </w:r>
+          </w:p>
+        </w:tc>
+      </w:tr>
+      <w:tr>
+        <w:tc>
+          <w:tcPr>
+            <w:tcW w:type="dxa" w:w="2209"/>
+          </w:tcPr>
+          <w:p>
+            <w:pPr>
+              <w:spacing w:line="240" w:lineRule="auto"/>
+            </w:pPr>
+            <w:r>
+              <w:rPr>
+                <w:rFonts w:ascii="Times New Roman" w:hAnsi="Times New Roman" w:eastAsia="Times New Roman"/>
+                <w:b w:val="0"/>
+                <w:caps w:val="0"/>
+                <w:sz w:val="22"/>
+              </w:rPr>
+              <w:t>19</w:t>
+            </w:r>
+          </w:p>
+        </w:tc>
+        <w:tc>
+          <w:tcPr>
+            <w:tcW w:type="dxa" w:w="2209"/>
+          </w:tcPr>
+          <w:p>
+            <w:pPr>
+              <w:spacing w:line="240" w:lineRule="auto"/>
+            </w:pPr>
+            <w:r>
+              <w:rPr>
+                <w:rFonts w:ascii="Times New Roman" w:hAnsi="Times New Roman" w:eastAsia="Times New Roman"/>
+                <w:b w:val="0"/>
+                <w:caps w:val="0"/>
+                <w:sz w:val="22"/>
+              </w:rPr>
+              <w:t>compare_with_pmd.py</w:t>
+            </w:r>
+          </w:p>
+        </w:tc>
+        <w:tc>
+          <w:tcPr>
+            <w:tcW w:type="dxa" w:w="2209"/>
+          </w:tcPr>
+          <w:p>
+            <w:pPr>
+              <w:spacing w:line="240" w:lineRule="auto"/>
+            </w:pPr>
+            <w:r>
+              <w:rPr>
+                <w:rFonts w:ascii="Times New Roman" w:hAnsi="Times New Roman" w:eastAsia="Times New Roman"/>
+                <w:b w:val="0"/>
+                <w:caps w:val="0"/>
+                <w:sz w:val="22"/>
+              </w:rPr>
+              <w:t>krahasimi me PMD-në mbi të njëjtat mostra</w:t>
+            </w:r>
+          </w:p>
+        </w:tc>
+        <w:tc>
+          <w:tcPr>
+            <w:tcW w:type="dxa" w:w="2209"/>
+          </w:tcPr>
+          <w:p>
+            <w:pPr>
+              <w:spacing w:line="240" w:lineRule="auto"/>
+            </w:pPr>
+            <w:r>
+              <w:rPr>
+                <w:rFonts w:ascii="Times New Roman" w:hAnsi="Times New Roman" w:eastAsia="Times New Roman"/>
+                <w:b w:val="0"/>
+                <w:caps w:val="0"/>
+                <w:sz w:val="22"/>
+              </w:rPr>
+              <w:t>~3 orë</w:t>
             </w:r>
           </w:p>
         </w:tc>

</xml_diff>

<commit_message>
Vendos fitoren me interval te ciftuar e jo me prag te shpikur
</commit_message>
<xml_diff>
--- a/docs/thesis/Punim_Diplome_Florent_Latifi.docx
+++ b/docs/thesis/Punim_Diplome_Florent_Latifi.docx
@@ -1115,7 +1115,7 @@
           <w:caps w:val="0"/>
           <w:sz w:val="24"/>
         </w:rPr>
-        <w:t>Tabela 17. Pajtimi i ashpërsisë me rishikuesit</w:t>
+        <w:t>Tabela 17. Detektorët e këtij punimi kundrejt PMD-së, mbi të njëjtat mostra</w:t>
       </w:r>
     </w:p>
     <w:p>
@@ -1131,7 +1131,7 @@
           <w:caps w:val="0"/>
           <w:sz w:val="24"/>
         </w:rPr>
-        <w:t>Tabela 18. Intervale besimi 95% për MCC-në</w:t>
+        <w:t>Tabela 18. Pajtimi i ashpërsisë me rishikuesit</w:t>
       </w:r>
     </w:p>
     <w:p>
@@ -1147,7 +1147,7 @@
           <w:caps w:val="0"/>
           <w:sz w:val="24"/>
         </w:rPr>
-        <w:t>Tabela 19. B − A kur rregullat marrin pragun e tyre më të mirë</w:t>
+        <w:t>Tabela 19. Intervale besimi 95% për MCC-në</w:t>
       </w:r>
     </w:p>
     <w:p>
@@ -1163,7 +1163,7 @@
           <w:caps w:val="0"/>
           <w:sz w:val="24"/>
         </w:rPr>
-        <w:t>Tabela 20. Sa pajtohen rishikuesit me njëri-tjetrin</w:t>
+        <w:t>Tabela 20. B − A kur rregullat marrin pragun e tyre më të mirë</w:t>
       </w:r>
     </w:p>
     <w:p>
@@ -1179,7 +1179,7 @@
           <w:caps w:val="0"/>
           <w:sz w:val="24"/>
         </w:rPr>
-        <w:t>Tabela 21. Strategjitë e detektimit dhe burimet e tyre</w:t>
+        <w:t>Tabela 21. Sa pajtohen rishikuesit me njëri-tjetrin</w:t>
       </w:r>
     </w:p>
     <w:p>
@@ -1195,7 +1195,7 @@
           <w:caps w:val="0"/>
           <w:sz w:val="24"/>
         </w:rPr>
-        <w:t>Tabela 22. Kuantifikuesit e përgjithshëm</w:t>
+        <w:t>Tabela 22. Strategjitë e detektimit dhe burimet e tyre</w:t>
       </w:r>
     </w:p>
     <w:p>
@@ -1211,7 +1211,7 @@
           <w:caps w:val="0"/>
           <w:sz w:val="24"/>
         </w:rPr>
-        <w:t>Tabela 23. Pragjet e përdorura</w:t>
+        <w:t>Tabela 23. Kuantifikuesit e përgjithshëm</w:t>
       </w:r>
     </w:p>
     <w:p>
@@ -1227,7 +1227,7 @@
           <w:caps w:val="0"/>
           <w:sz w:val="24"/>
         </w:rPr>
-        <w:t>Tabela 24. Metrikat sipas nivelit</w:t>
+        <w:t>Tabela 24. Pragjet e përdorura</w:t>
       </w:r>
     </w:p>
     <w:p>
@@ -1243,7 +1243,7 @@
           <w:caps w:val="0"/>
           <w:sz w:val="24"/>
         </w:rPr>
-        <w:t>Tabela 25. Çka propozohet dhe çka aplikohet</w:t>
+        <w:t>Tabela 25. Metrikat sipas nivelit</w:t>
       </w:r>
     </w:p>
     <w:p>
@@ -1259,7 +1259,7 @@
           <w:caps w:val="0"/>
           <w:sz w:val="24"/>
         </w:rPr>
-        <w:t>Tabela 26. Arsyet e refuzimit</w:t>
+        <w:t>Tabela 26. Çka propozohet dhe çka aplikohet</w:t>
       </w:r>
     </w:p>
     <w:p>
@@ -1275,7 +1275,7 @@
           <w:caps w:val="0"/>
           <w:sz w:val="24"/>
         </w:rPr>
-        <w:t>Tabela 27. Radha e ekzekutimit</w:t>
+        <w:t>Tabela 27. Arsyet e refuzimit</w:t>
       </w:r>
     </w:p>
     <w:p>
@@ -1291,7 +1291,23 @@
           <w:caps w:val="0"/>
           <w:sz w:val="24"/>
         </w:rPr>
-        <w:t>Tabela 28. Commit-i që prodhoi çdo skedar rezultati</w:t>
+        <w:t>Tabela 28. Radha e ekzekutimit</w:t>
+      </w:r>
+    </w:p>
+    <w:p>
+      <w:pPr>
+        <w:spacing w:line="360" w:lineRule="auto"/>
+        <w:ind w:firstLine="360"/>
+        <w:jc w:val="both"/>
+      </w:pPr>
+      <w:r>
+        <w:rPr>
+          <w:rFonts w:ascii="Times New Roman" w:hAnsi="Times New Roman" w:eastAsia="Times New Roman"/>
+          <w:b w:val="0"/>
+          <w:caps w:val="0"/>
+          <w:sz w:val="24"/>
+        </w:rPr>
+        <w:t>Tabela 29. Commit-i që prodhoi çdo skedar rezultati</w:t>
       </w:r>
     </w:p>
     <w:p>
@@ -14141,7 +14157,687 @@
           <w:caps w:val="0"/>
           <w:sz w:val="24"/>
         </w:rPr>
-        <w:t>[PLOTËSO: krahasimi me mjetin e jashtëm gjenerohet nga hapi 19 i Shtojcës 8.5; tabela shfaqet sapo ai ekzekutim të përfundojë.]</w:t>
+        <w:t>PMD 7.27.0 u ekzekutua mbi të njëjtat 512 depo, me pragjet e veta të parazgjedhura, dhe u pikëzua me të njëjtin kod dhe të njëjtin agregim si Qasja A. Të dyja kolonat rillogariten nga i njëjti skedar në të njëjtin ekzekutim.</w:t>
+      </w:r>
+    </w:p>
+    <w:p>
+      <w:pPr>
+        <w:spacing w:line="240" w:lineRule="auto"/>
+        <w:jc w:val="center"/>
+      </w:pPr>
+      <w:r>
+        <w:rPr>
+          <w:rFonts w:ascii="Times New Roman" w:hAnsi="Times New Roman" w:eastAsia="Times New Roman"/>
+          <w:b w:val="0"/>
+          <w:caps w:val="0"/>
+          <w:sz w:val="22"/>
+        </w:rPr>
+        <w:t>Tabela 17. Detektorët e këtij punimi kundrejt PMD-së, mbi të njëjtat mostra</w:t>
+      </w:r>
+    </w:p>
+    <w:tbl>
+      <w:tblPr>
+        <w:tblStyle w:val="TableGrid"/>
+        <w:tblW w:type="auto" w:w="0"/>
+        <w:tblLook w:firstColumn="1" w:firstRow="1" w:lastColumn="0" w:lastRow="0" w:noHBand="0" w:noVBand="1" w:val="04A0"/>
+      </w:tblPr>
+      <w:tblGrid>
+        <w:gridCol w:w="1768"/>
+        <w:gridCol w:w="1768"/>
+        <w:gridCol w:w="1768"/>
+        <w:gridCol w:w="1768"/>
+        <w:gridCol w:w="1768"/>
+      </w:tblGrid>
+      <w:tr>
+        <w:tc>
+          <w:tcPr>
+            <w:tcW w:type="dxa" w:w="1768"/>
+          </w:tcPr>
+          <w:p>
+            <w:pPr>
+              <w:spacing w:line="240" w:lineRule="auto"/>
+            </w:pPr>
+            <w:r>
+              <w:rPr>
+                <w:rFonts w:ascii="Times New Roman" w:hAnsi="Times New Roman" w:eastAsia="Times New Roman"/>
+                <w:b/>
+                <w:caps w:val="0"/>
+                <w:sz w:val="22"/>
+              </w:rPr>
+              <w:t>Era</w:t>
+            </w:r>
+          </w:p>
+        </w:tc>
+        <w:tc>
+          <w:tcPr>
+            <w:tcW w:type="dxa" w:w="1768"/>
+          </w:tcPr>
+          <w:p>
+            <w:pPr>
+              <w:spacing w:line="240" w:lineRule="auto"/>
+            </w:pPr>
+            <w:r>
+              <w:rPr>
+                <w:rFonts w:ascii="Times New Roman" w:hAnsi="Times New Roman" w:eastAsia="Times New Roman"/>
+                <w:b/>
+                <w:caps w:val="0"/>
+                <w:sz w:val="22"/>
+              </w:rPr>
+              <w:t>Mostra</w:t>
+            </w:r>
+          </w:p>
+        </w:tc>
+        <w:tc>
+          <w:tcPr>
+            <w:tcW w:type="dxa" w:w="1768"/>
+          </w:tcPr>
+          <w:p>
+            <w:pPr>
+              <w:spacing w:line="240" w:lineRule="auto"/>
+            </w:pPr>
+            <w:r>
+              <w:rPr>
+                <w:rFonts w:ascii="Times New Roman" w:hAnsi="Times New Roman" w:eastAsia="Times New Roman"/>
+                <w:b/>
+                <w:caps w:val="0"/>
+                <w:sz w:val="22"/>
+              </w:rPr>
+              <w:t>MCC i PMD-së</w:t>
+            </w:r>
+          </w:p>
+        </w:tc>
+        <w:tc>
+          <w:tcPr>
+            <w:tcW w:type="dxa" w:w="1768"/>
+          </w:tcPr>
+          <w:p>
+            <w:pPr>
+              <w:spacing w:line="240" w:lineRule="auto"/>
+            </w:pPr>
+            <w:r>
+              <w:rPr>
+                <w:rFonts w:ascii="Times New Roman" w:hAnsi="Times New Roman" w:eastAsia="Times New Roman"/>
+                <w:b/>
+                <w:caps w:val="0"/>
+                <w:sz w:val="22"/>
+              </w:rPr>
+              <w:t>MCC ynë</w:t>
+            </w:r>
+          </w:p>
+        </w:tc>
+        <w:tc>
+          <w:tcPr>
+            <w:tcW w:type="dxa" w:w="1768"/>
+          </w:tcPr>
+          <w:p>
+            <w:pPr>
+              <w:spacing w:line="240" w:lineRule="auto"/>
+            </w:pPr>
+            <w:r>
+              <w:rPr>
+                <w:rFonts w:ascii="Times New Roman" w:hAnsi="Times New Roman" w:eastAsia="Times New Roman"/>
+                <w:b/>
+                <w:caps w:val="0"/>
+                <w:sz w:val="22"/>
+              </w:rPr>
+              <w:t>Ndryshimi, IB 95%</w:t>
+            </w:r>
+          </w:p>
+        </w:tc>
+      </w:tr>
+      <w:tr>
+        <w:tc>
+          <w:tcPr>
+            <w:tcW w:type="dxa" w:w="1768"/>
+          </w:tcPr>
+          <w:p>
+            <w:pPr>
+              <w:spacing w:line="240" w:lineRule="auto"/>
+            </w:pPr>
+            <w:r>
+              <w:rPr>
+                <w:rFonts w:ascii="Times New Roman" w:hAnsi="Times New Roman" w:eastAsia="Times New Roman"/>
+                <w:b w:val="0"/>
+                <w:caps w:val="0"/>
+                <w:sz w:val="22"/>
+              </w:rPr>
+              <w:t>Blob, strategjia</w:t>
+            </w:r>
+          </w:p>
+        </w:tc>
+        <w:tc>
+          <w:tcPr>
+            <w:tcW w:type="dxa" w:w="1768"/>
+          </w:tcPr>
+          <w:p>
+            <w:pPr>
+              <w:spacing w:line="240" w:lineRule="auto"/>
+            </w:pPr>
+            <w:r>
+              <w:rPr>
+                <w:rFonts w:ascii="Times New Roman" w:hAnsi="Times New Roman" w:eastAsia="Times New Roman"/>
+                <w:b w:val="0"/>
+                <w:caps w:val="0"/>
+                <w:sz w:val="22"/>
+              </w:rPr>
+              <w:t>1291</w:t>
+            </w:r>
+          </w:p>
+        </w:tc>
+        <w:tc>
+          <w:tcPr>
+            <w:tcW w:type="dxa" w:w="1768"/>
+          </w:tcPr>
+          <w:p>
+            <w:pPr>
+              <w:spacing w:line="240" w:lineRule="auto"/>
+            </w:pPr>
+            <w:r>
+              <w:rPr>
+                <w:rFonts w:ascii="Times New Roman" w:hAnsi="Times New Roman" w:eastAsia="Times New Roman"/>
+                <w:b w:val="0"/>
+                <w:caps w:val="0"/>
+                <w:sz w:val="22"/>
+              </w:rPr>
+              <w:t>0.266</w:t>
+            </w:r>
+          </w:p>
+        </w:tc>
+        <w:tc>
+          <w:tcPr>
+            <w:tcW w:type="dxa" w:w="1768"/>
+          </w:tcPr>
+          <w:p>
+            <w:pPr>
+              <w:spacing w:line="240" w:lineRule="auto"/>
+            </w:pPr>
+            <w:r>
+              <w:rPr>
+                <w:rFonts w:ascii="Times New Roman" w:hAnsi="Times New Roman" w:eastAsia="Times New Roman"/>
+                <w:b w:val="0"/>
+                <w:caps w:val="0"/>
+                <w:sz w:val="22"/>
+              </w:rPr>
+              <w:t>0.231</w:t>
+            </w:r>
+          </w:p>
+        </w:tc>
+        <w:tc>
+          <w:tcPr>
+            <w:tcW w:type="dxa" w:w="1768"/>
+          </w:tcPr>
+          <w:p>
+            <w:pPr>
+              <w:spacing w:line="240" w:lineRule="auto"/>
+            </w:pPr>
+            <w:r>
+              <w:rPr>
+                <w:rFonts w:ascii="Times New Roman" w:hAnsi="Times New Roman" w:eastAsia="Times New Roman"/>
+                <w:b w:val="0"/>
+                <w:caps w:val="0"/>
+                <w:sz w:val="22"/>
+              </w:rPr>
+              <w:t>-0.086 deri +0.014</w:t>
+            </w:r>
+          </w:p>
+        </w:tc>
+      </w:tr>
+      <w:tr>
+        <w:tc>
+          <w:tcPr>
+            <w:tcW w:type="dxa" w:w="1768"/>
+          </w:tcPr>
+          <w:p>
+            <w:pPr>
+              <w:spacing w:line="240" w:lineRule="auto"/>
+            </w:pPr>
+            <w:r>
+              <w:rPr>
+                <w:rFonts w:ascii="Times New Roman" w:hAnsi="Times New Roman" w:eastAsia="Times New Roman"/>
+                <w:b w:val="0"/>
+                <w:caps w:val="0"/>
+                <w:sz w:val="22"/>
+              </w:rPr>
+              <w:t>Blob, me madhësinë</w:t>
+            </w:r>
+          </w:p>
+        </w:tc>
+        <w:tc>
+          <w:tcPr>
+            <w:tcW w:type="dxa" w:w="1768"/>
+          </w:tcPr>
+          <w:p>
+            <w:pPr>
+              <w:spacing w:line="240" w:lineRule="auto"/>
+            </w:pPr>
+            <w:r>
+              <w:rPr>
+                <w:rFonts w:ascii="Times New Roman" w:hAnsi="Times New Roman" w:eastAsia="Times New Roman"/>
+                <w:b w:val="0"/>
+                <w:caps w:val="0"/>
+                <w:sz w:val="22"/>
+              </w:rPr>
+              <w:t>1291</w:t>
+            </w:r>
+          </w:p>
+        </w:tc>
+        <w:tc>
+          <w:tcPr>
+            <w:tcW w:type="dxa" w:w="1768"/>
+          </w:tcPr>
+          <w:p>
+            <w:pPr>
+              <w:spacing w:line="240" w:lineRule="auto"/>
+            </w:pPr>
+            <w:r>
+              <w:rPr>
+                <w:rFonts w:ascii="Times New Roman" w:hAnsi="Times New Roman" w:eastAsia="Times New Roman"/>
+                <w:b w:val="0"/>
+                <w:caps w:val="0"/>
+                <w:sz w:val="22"/>
+              </w:rPr>
+              <w:t>0.266</w:t>
+            </w:r>
+          </w:p>
+        </w:tc>
+        <w:tc>
+          <w:tcPr>
+            <w:tcW w:type="dxa" w:w="1768"/>
+          </w:tcPr>
+          <w:p>
+            <w:pPr>
+              <w:spacing w:line="240" w:lineRule="auto"/>
+            </w:pPr>
+            <w:r>
+              <w:rPr>
+                <w:rFonts w:ascii="Times New Roman" w:hAnsi="Times New Roman" w:eastAsia="Times New Roman"/>
+                <w:b w:val="0"/>
+                <w:caps w:val="0"/>
+                <w:sz w:val="22"/>
+              </w:rPr>
+              <w:t>0.341</w:t>
+            </w:r>
+          </w:p>
+        </w:tc>
+        <w:tc>
+          <w:tcPr>
+            <w:tcW w:type="dxa" w:w="1768"/>
+          </w:tcPr>
+          <w:p>
+            <w:pPr>
+              <w:spacing w:line="240" w:lineRule="auto"/>
+            </w:pPr>
+            <w:r>
+              <w:rPr>
+                <w:rFonts w:ascii="Times New Roman" w:hAnsi="Times New Roman" w:eastAsia="Times New Roman"/>
+                <w:b w:val="0"/>
+                <w:caps w:val="0"/>
+                <w:sz w:val="22"/>
+              </w:rPr>
+              <w:t>+0.021 deri +0.130</w:t>
+            </w:r>
+          </w:p>
+        </w:tc>
+      </w:tr>
+      <w:tr>
+        <w:tc>
+          <w:tcPr>
+            <w:tcW w:type="dxa" w:w="1768"/>
+          </w:tcPr>
+          <w:p>
+            <w:pPr>
+              <w:spacing w:line="240" w:lineRule="auto"/>
+            </w:pPr>
+            <w:r>
+              <w:rPr>
+                <w:rFonts w:ascii="Times New Roman" w:hAnsi="Times New Roman" w:eastAsia="Times New Roman"/>
+                <w:b w:val="0"/>
+                <w:caps w:val="0"/>
+                <w:sz w:val="22"/>
+              </w:rPr>
+              <w:t>Data Class</w:t>
+            </w:r>
+          </w:p>
+        </w:tc>
+        <w:tc>
+          <w:tcPr>
+            <w:tcW w:type="dxa" w:w="1768"/>
+          </w:tcPr>
+          <w:p>
+            <w:pPr>
+              <w:spacing w:line="240" w:lineRule="auto"/>
+            </w:pPr>
+            <w:r>
+              <w:rPr>
+                <w:rFonts w:ascii="Times New Roman" w:hAnsi="Times New Roman" w:eastAsia="Times New Roman"/>
+                <w:b w:val="0"/>
+                <w:caps w:val="0"/>
+                <w:sz w:val="22"/>
+              </w:rPr>
+              <w:t>737</w:t>
+            </w:r>
+          </w:p>
+        </w:tc>
+        <w:tc>
+          <w:tcPr>
+            <w:tcW w:type="dxa" w:w="1768"/>
+          </w:tcPr>
+          <w:p>
+            <w:pPr>
+              <w:spacing w:line="240" w:lineRule="auto"/>
+            </w:pPr>
+            <w:r>
+              <w:rPr>
+                <w:rFonts w:ascii="Times New Roman" w:hAnsi="Times New Roman" w:eastAsia="Times New Roman"/>
+                <w:b w:val="0"/>
+                <w:caps w:val="0"/>
+                <w:sz w:val="22"/>
+              </w:rPr>
+              <w:t>0.272</w:t>
+            </w:r>
+          </w:p>
+        </w:tc>
+        <w:tc>
+          <w:tcPr>
+            <w:tcW w:type="dxa" w:w="1768"/>
+          </w:tcPr>
+          <w:p>
+            <w:pPr>
+              <w:spacing w:line="240" w:lineRule="auto"/>
+            </w:pPr>
+            <w:r>
+              <w:rPr>
+                <w:rFonts w:ascii="Times New Roman" w:hAnsi="Times New Roman" w:eastAsia="Times New Roman"/>
+                <w:b w:val="0"/>
+                <w:caps w:val="0"/>
+                <w:sz w:val="22"/>
+              </w:rPr>
+              <w:t>0.281</w:t>
+            </w:r>
+          </w:p>
+        </w:tc>
+        <w:tc>
+          <w:tcPr>
+            <w:tcW w:type="dxa" w:w="1768"/>
+          </w:tcPr>
+          <w:p>
+            <w:pPr>
+              <w:spacing w:line="240" w:lineRule="auto"/>
+            </w:pPr>
+            <w:r>
+              <w:rPr>
+                <w:rFonts w:ascii="Times New Roman" w:hAnsi="Times New Roman" w:eastAsia="Times New Roman"/>
+                <w:b w:val="0"/>
+                <w:caps w:val="0"/>
+                <w:sz w:val="22"/>
+              </w:rPr>
+              <w:t>-0.077 deri +0.104</w:t>
+            </w:r>
+          </w:p>
+        </w:tc>
+      </w:tr>
+      <w:tr>
+        <w:tc>
+          <w:tcPr>
+            <w:tcW w:type="dxa" w:w="1768"/>
+          </w:tcPr>
+          <w:p>
+            <w:pPr>
+              <w:spacing w:line="240" w:lineRule="auto"/>
+            </w:pPr>
+            <w:r>
+              <w:rPr>
+                <w:rFonts w:ascii="Times New Roman" w:hAnsi="Times New Roman" w:eastAsia="Times New Roman"/>
+                <w:b w:val="0"/>
+                <w:caps w:val="0"/>
+                <w:sz w:val="22"/>
+              </w:rPr>
+              <w:t>Feature Envy (LawOfDemeter)</w:t>
+            </w:r>
+          </w:p>
+        </w:tc>
+        <w:tc>
+          <w:tcPr>
+            <w:tcW w:type="dxa" w:w="1768"/>
+          </w:tcPr>
+          <w:p>
+            <w:pPr>
+              <w:spacing w:line="240" w:lineRule="auto"/>
+            </w:pPr>
+            <w:r>
+              <w:rPr>
+                <w:rFonts w:ascii="Times New Roman" w:hAnsi="Times New Roman" w:eastAsia="Times New Roman"/>
+                <w:b w:val="0"/>
+                <w:caps w:val="0"/>
+                <w:sz w:val="22"/>
+              </w:rPr>
+              <w:t>733</w:t>
+            </w:r>
+          </w:p>
+        </w:tc>
+        <w:tc>
+          <w:tcPr>
+            <w:tcW w:type="dxa" w:w="1768"/>
+          </w:tcPr>
+          <w:p>
+            <w:pPr>
+              <w:spacing w:line="240" w:lineRule="auto"/>
+            </w:pPr>
+            <w:r>
+              <w:rPr>
+                <w:rFonts w:ascii="Times New Roman" w:hAnsi="Times New Roman" w:eastAsia="Times New Roman"/>
+                <w:b w:val="0"/>
+                <w:caps w:val="0"/>
+                <w:sz w:val="22"/>
+              </w:rPr>
+              <w:t>0.160</w:t>
+            </w:r>
+          </w:p>
+        </w:tc>
+        <w:tc>
+          <w:tcPr>
+            <w:tcW w:type="dxa" w:w="1768"/>
+          </w:tcPr>
+          <w:p>
+            <w:pPr>
+              <w:spacing w:line="240" w:lineRule="auto"/>
+            </w:pPr>
+            <w:r>
+              <w:rPr>
+                <w:rFonts w:ascii="Times New Roman" w:hAnsi="Times New Roman" w:eastAsia="Times New Roman"/>
+                <w:b w:val="0"/>
+                <w:caps w:val="0"/>
+                <w:sz w:val="22"/>
+              </w:rPr>
+              <w:t>—</w:t>
+            </w:r>
+          </w:p>
+        </w:tc>
+        <w:tc>
+          <w:tcPr>
+            <w:tcW w:type="dxa" w:w="1768"/>
+          </w:tcPr>
+          <w:p>
+            <w:pPr>
+              <w:spacing w:line="240" w:lineRule="auto"/>
+            </w:pPr>
+            <w:r>
+              <w:rPr>
+                <w:rFonts w:ascii="Times New Roman" w:hAnsi="Times New Roman" w:eastAsia="Times New Roman"/>
+                <w:b w:val="0"/>
+                <w:caps w:val="0"/>
+                <w:sz w:val="22"/>
+              </w:rPr>
+              <w:t>—</w:t>
+            </w:r>
+          </w:p>
+        </w:tc>
+      </w:tr>
+      <w:tr>
+        <w:tc>
+          <w:tcPr>
+            <w:tcW w:type="dxa" w:w="1768"/>
+          </w:tcPr>
+          <w:p>
+            <w:pPr>
+              <w:spacing w:line="240" w:lineRule="auto"/>
+            </w:pPr>
+            <w:r>
+              <w:rPr>
+                <w:rFonts w:ascii="Times New Roman" w:hAnsi="Times New Roman" w:eastAsia="Times New Roman"/>
+                <w:b w:val="0"/>
+                <w:caps w:val="0"/>
+                <w:sz w:val="22"/>
+              </w:rPr>
+              <w:t>Long Method</w:t>
+            </w:r>
+          </w:p>
+        </w:tc>
+        <w:tc>
+          <w:tcPr>
+            <w:tcW w:type="dxa" w:w="1768"/>
+          </w:tcPr>
+          <w:p>
+            <w:pPr>
+              <w:spacing w:line="240" w:lineRule="auto"/>
+            </w:pPr>
+            <w:r>
+              <w:rPr>
+                <w:rFonts w:ascii="Times New Roman" w:hAnsi="Times New Roman" w:eastAsia="Times New Roman"/>
+                <w:b w:val="0"/>
+                <w:caps w:val="0"/>
+                <w:sz w:val="22"/>
+              </w:rPr>
+              <w:t>1324</w:t>
+            </w:r>
+          </w:p>
+        </w:tc>
+        <w:tc>
+          <w:tcPr>
+            <w:tcW w:type="dxa" w:w="1768"/>
+          </w:tcPr>
+          <w:p>
+            <w:pPr>
+              <w:spacing w:line="240" w:lineRule="auto"/>
+            </w:pPr>
+            <w:r>
+              <w:rPr>
+                <w:rFonts w:ascii="Times New Roman" w:hAnsi="Times New Roman" w:eastAsia="Times New Roman"/>
+                <w:b w:val="0"/>
+                <w:caps w:val="0"/>
+                <w:sz w:val="22"/>
+              </w:rPr>
+              <w:t>0.230</w:t>
+            </w:r>
+          </w:p>
+        </w:tc>
+        <w:tc>
+          <w:tcPr>
+            <w:tcW w:type="dxa" w:w="1768"/>
+          </w:tcPr>
+          <w:p>
+            <w:pPr>
+              <w:spacing w:line="240" w:lineRule="auto"/>
+            </w:pPr>
+            <w:r>
+              <w:rPr>
+                <w:rFonts w:ascii="Times New Roman" w:hAnsi="Times New Roman" w:eastAsia="Times New Roman"/>
+                <w:b w:val="0"/>
+                <w:caps w:val="0"/>
+                <w:sz w:val="22"/>
+              </w:rPr>
+              <w:t>0.581</w:t>
+            </w:r>
+          </w:p>
+        </w:tc>
+        <w:tc>
+          <w:tcPr>
+            <w:tcW w:type="dxa" w:w="1768"/>
+          </w:tcPr>
+          <w:p>
+            <w:pPr>
+              <w:spacing w:line="240" w:lineRule="auto"/>
+            </w:pPr>
+            <w:r>
+              <w:rPr>
+                <w:rFonts w:ascii="Times New Roman" w:hAnsi="Times New Roman" w:eastAsia="Times New Roman"/>
+                <w:b w:val="0"/>
+                <w:caps w:val="0"/>
+                <w:sz w:val="22"/>
+              </w:rPr>
+              <w:t>+0.264 deri +0.442</w:t>
+            </w:r>
+          </w:p>
+        </w:tc>
+      </w:tr>
+    </w:tbl>
+    <w:p>
+      <w:pPr>
+        <w:spacing w:line="240" w:lineRule="auto" w:after="0"/>
+      </w:pPr>
+    </w:p>
+    <w:p>
+      <w:pPr>
+        <w:spacing w:line="360" w:lineRule="auto"/>
+        <w:ind w:firstLine="360"/>
+        <w:jc w:val="both"/>
+      </w:pPr>
+      <w:r>
+        <w:rPr>
+          <w:rFonts w:ascii="Times New Roman" w:hAnsi="Times New Roman" w:eastAsia="Times New Roman"/>
+          <w:b w:val="0"/>
+          <w:caps w:val="0"/>
+          <w:sz w:val="24"/>
+        </w:rPr>
+        <w:t>Nga 4 krahasimet me përgjigje, detektorët e këtij punimi dalin përpara te 2 dhe PMD te asnjëri. Te 2 prej tyre intervali e përmban zeron, pra dy anët nuk dallohen mbi këtë dëshmi.</w:t>
+      </w:r>
+    </w:p>
+    <w:p>
+      <w:pPr>
+        <w:spacing w:line="360" w:lineRule="auto"/>
+        <w:ind w:firstLine="360"/>
+        <w:jc w:val="both"/>
+      </w:pPr>
+      <w:r>
+        <w:rPr>
+          <w:rFonts w:ascii="Times New Roman" w:hAnsi="Times New Roman" w:eastAsia="Times New Roman"/>
+          <w:b w:val="0"/>
+          <w:caps w:val="0"/>
+          <w:sz w:val="24"/>
+        </w:rPr>
+        <w:t>Feature Envy nuk ka rresht krahasimi sepse PMD nuk ka rregull për të. LawOfDemeter është më i afërti dhe mat zinxhirë mesazhesh e jo qasje në të dhëna të huaja; shifra e tij raportohet për ta pasur të matur e jo të supozuar, dhe nuk është matje e Feature Envy-së. Mbulimi i pjesshëm i një mjeti të përhapur është vetë gjetje: tri nga katër erërat e MLCQ-së kanë një rregull të gatshme, e katërta jo.</w:t>
+      </w:r>
+    </w:p>
+    <w:p>
+      <w:pPr>
+        <w:spacing w:line="360" w:lineRule="auto"/>
+        <w:ind w:firstLine="360"/>
+        <w:jc w:val="both"/>
+      </w:pPr>
+      <w:r>
+        <w:rPr>
+          <w:rFonts w:ascii="Times New Roman" w:hAnsi="Times New Roman" w:eastAsia="Times New Roman"/>
+          <w:b w:val="0"/>
+          <w:caps w:val="0"/>
+          <w:sz w:val="24"/>
+        </w:rPr>
+        <w:t>Krahasimi e favorizon këtë punim në një drejtim të deklaruar që në Nënkapitullin 4.6: PMD analizon një skedar në një kohë dhe pa classpath të kompiluar, ndaj ATFD-në e llogarit nga sa duket brenda një skedari, ndërsa detektorët e këtij punimi e marrin projektin e plotë. Heqja e këtij handikapi do të kërkonte ndërtimin e 513 depove në commit-et e tyre historike, çka korpusi nuk e lejon (Nënkapitulli 6.3).</w:t>
+      </w:r>
+    </w:p>
+    <w:p>
+      <w:pPr>
+        <w:spacing w:line="360" w:lineRule="auto"/>
+        <w:ind w:firstLine="360"/>
+        <w:jc w:val="both"/>
+      </w:pPr>
+      <w:r>
+        <w:rPr>
+          <w:rFonts w:ascii="Times New Roman" w:hAnsi="Times New Roman" w:eastAsia="Times New Roman"/>
+          <w:b w:val="0"/>
+          <w:caps w:val="0"/>
+          <w:sz w:val="24"/>
+        </w:rPr>
+        <w:t>Nga ekzekutimi, 538 skedarë nuk u lexuan dot nga PMD dhe 14 depo nuk u përpunuan fare. Këto numërohen këtu dhe nuk lexohen si «PMD nuk gjeti asgjë»: dështimi dhe mosgjetja janë pohime të kundërta. Mostrat e atyre depove dalin nga tabela e mësipërme, dhe dalin nga të dyja kolonat njësoj, ndaj dy anët mbeten të krahasueshme. Emëruesi që mbetet është ai i tabelës; Qasja A vlerësoi 4534 mostra, dhe krahasimi mbulon ato që u përpunuan.</w:t>
       </w:r>
     </w:p>
     <w:p>
@@ -14202,7 +14898,7 @@
           <w:caps w:val="0"/>
           <w:sz w:val="22"/>
         </w:rPr>
-        <w:t>Tabela 17. Pajtimi i ashpërsisë me rishikuesit</w:t>
+        <w:t>Tabela 18. Pajtimi i ashpërsisë me rishikuesit</w:t>
       </w:r>
     </w:p>
     <w:tbl>
@@ -15000,7 +15696,7 @@
           <w:caps w:val="0"/>
           <w:sz w:val="22"/>
         </w:rPr>
-        <w:t>Tabela 18. Intervale besimi 95% për MCC-në</w:t>
+        <w:t>Tabela 19. Intervale besimi 95% për MCC-në</w:t>
       </w:r>
     </w:p>
     <w:tbl>
@@ -15605,7 +16301,7 @@
           <w:caps w:val="0"/>
           <w:sz w:val="22"/>
         </w:rPr>
-        <w:t>Tabela 19. B − A kur rregullat marrin pragun e tyre më të mirë</w:t>
+        <w:t>Tabela 20. B − A kur rregullat marrin pragun e tyre më të mirë</w:t>
       </w:r>
     </w:p>
     <w:tbl>
@@ -16156,7 +16852,7 @@
           <w:caps w:val="0"/>
           <w:sz w:val="22"/>
         </w:rPr>
-        <w:t>Tabela 20. Sa pajtohen rishikuesit me njëri-tjetrin</w:t>
+        <w:t>Tabela 21. Sa pajtohen rishikuesit me njëri-tjetrin</w:t>
       </w:r>
     </w:p>
     <w:tbl>
@@ -17748,7 +18444,7 @@
           <w:caps w:val="0"/>
           <w:sz w:val="22"/>
         </w:rPr>
-        <w:t>Tabela 21. Strategjitë e detektimit dhe burimet e tyre</w:t>
+        <w:t>Tabela 22. Strategjitë e detektimit dhe burimet e tyre</w:t>
       </w:r>
     </w:p>
     <w:tbl>
@@ -18529,7 +19225,7 @@
           <w:caps w:val="0"/>
           <w:sz w:val="22"/>
         </w:rPr>
-        <w:t>Tabela 22. Kuantifikuesit e përgjithshëm</w:t>
+        <w:t>Tabela 23. Kuantifikuesit e përgjithshëm</w:t>
       </w:r>
     </w:p>
     <w:tbl>
@@ -18976,7 +19672,7 @@
           <w:caps w:val="0"/>
           <w:sz w:val="22"/>
         </w:rPr>
-        <w:t>Tabela 23. Pragjet e përdorura</w:t>
+        <w:t>Tabela 24. Pragjet e përdorura</w:t>
       </w:r>
     </w:p>
     <w:tbl>
@@ -19997,7 +20693,7 @@
           <w:caps w:val="0"/>
           <w:sz w:val="22"/>
         </w:rPr>
-        <w:t>Tabela 24. Metrikat sipas nivelit</w:t>
+        <w:t>Tabela 25. Metrikat sipas nivelit</w:t>
       </w:r>
     </w:p>
     <w:tbl>
@@ -20178,7 +20874,7 @@
           <w:caps w:val="0"/>
           <w:sz w:val="22"/>
         </w:rPr>
-        <w:t>Tabela 25. Çka propozohet dhe çka aplikohet</w:t>
+        <w:t>Tabela 26. Çka propozohet dhe çka aplikohet</w:t>
       </w:r>
     </w:p>
     <w:tbl>
@@ -20757,7 +21453,7 @@
           <w:caps w:val="0"/>
           <w:sz w:val="22"/>
         </w:rPr>
-        <w:t>Tabela 26. Arsyet e refuzimit</w:t>
+        <w:t>Tabela 27. Arsyet e refuzimit</w:t>
       </w:r>
     </w:p>
     <w:tbl>
@@ -21218,7 +21914,7 @@
           <w:caps w:val="0"/>
           <w:sz w:val="22"/>
         </w:rPr>
-        <w:t>Tabela 27. Radha e ekzekutimit</w:t>
+        <w:t>Tabela 28. Radha e ekzekutimit</w:t>
       </w:r>
     </w:p>
     <w:tbl>
@@ -22827,7 +23523,7 @@
           <w:caps w:val="0"/>
           <w:sz w:val="22"/>
         </w:rPr>
-        <w:t>Tabela 28. Commit-i që prodhoi çdo skedar rezultati</w:t>
+        <w:t>Tabela 29. Commit-i që prodhoi çdo skedar rezultati</w:t>
       </w:r>
     </w:p>
     <w:tbl>
@@ -23076,6 +23772,46 @@
                 <w:sz w:val="22"/>
               </w:rPr>
               <w:t>fb8c2d4167</w:t>
+            </w:r>
+          </w:p>
+        </w:tc>
+      </w:tr>
+      <w:tr>
+        <w:tc>
+          <w:tcPr>
+            <w:tcW w:type="dxa" w:w="4419"/>
+          </w:tcPr>
+          <w:p>
+            <w:pPr>
+              <w:spacing w:line="240" w:lineRule="auto"/>
+            </w:pPr>
+            <w:r>
+              <w:rPr>
+                <w:rFonts w:ascii="Times New Roman" w:hAnsi="Times New Roman" w:eastAsia="Times New Roman"/>
+                <w:b w:val="0"/>
+                <w:caps w:val="0"/>
+                <w:sz w:val="22"/>
+              </w:rPr>
+              <w:t>pmd_comparison.json</w:t>
+            </w:r>
+          </w:p>
+        </w:tc>
+        <w:tc>
+          <w:tcPr>
+            <w:tcW w:type="dxa" w:w="4419"/>
+          </w:tcPr>
+          <w:p>
+            <w:pPr>
+              <w:spacing w:line="240" w:lineRule="auto"/>
+            </w:pPr>
+            <w:r>
+              <w:rPr>
+                <w:rFonts w:ascii="Times New Roman" w:hAnsi="Times New Roman" w:eastAsia="Times New Roman"/>
+                <w:b w:val="0"/>
+                <w:caps w:val="0"/>
+                <w:sz w:val="22"/>
+              </w:rPr>
+              <w:t>e34b32a8c8</w:t>
             </w:r>
           </w:p>
         </w:tc>

</xml_diff>

<commit_message>
Trego cila klauzole e ndal secilen strategji
</commit_message>
<xml_diff>
--- a/docs/thesis/Punim_Diplome_Florent_Latifi.docx
+++ b/docs/thesis/Punim_Diplome_Florent_Latifi.docx
@@ -1131,7 +1131,7 @@
           <w:caps w:val="0"/>
           <w:sz w:val="24"/>
         </w:rPr>
-        <w:t>Tabela 18. Pajtimi i ashpërsisë me rishikuesit</w:t>
+        <w:t>Tabela 18. Sa klauzola dështuan te secila mospërputhje</w:t>
       </w:r>
     </w:p>
     <w:p>
@@ -1147,7 +1147,7 @@
           <w:caps w:val="0"/>
           <w:sz w:val="24"/>
         </w:rPr>
-        <w:t>Tabela 19. Intervale besimi 95% për MCC-në</w:t>
+        <w:t>Tabela 19. Kur një klauzolë e vetme e ndal strategjinë</w:t>
       </w:r>
     </w:p>
     <w:p>
@@ -1163,7 +1163,7 @@
           <w:caps w:val="0"/>
           <w:sz w:val="24"/>
         </w:rPr>
-        <w:t>Tabela 20. B − A kur rregullat marrin pragun e tyre më të mirë</w:t>
+        <w:t>Tabela 20. Pajtimi i ashpërsisë me rishikuesit</w:t>
       </w:r>
     </w:p>
     <w:p>
@@ -1179,7 +1179,7 @@
           <w:caps w:val="0"/>
           <w:sz w:val="24"/>
         </w:rPr>
-        <w:t>Tabela 21. Sa pajtohen rishikuesit me njëri-tjetrin</w:t>
+        <w:t>Tabela 21. Intervale besimi 95% për MCC-në</w:t>
       </w:r>
     </w:p>
     <w:p>
@@ -1195,7 +1195,7 @@
           <w:caps w:val="0"/>
           <w:sz w:val="24"/>
         </w:rPr>
-        <w:t>Tabela 22. Strategjitë e detektimit dhe burimet e tyre</w:t>
+        <w:t>Tabela 22. B − A kur rregullat marrin pragun e tyre më të mirë</w:t>
       </w:r>
     </w:p>
     <w:p>
@@ -1211,7 +1211,7 @@
           <w:caps w:val="0"/>
           <w:sz w:val="24"/>
         </w:rPr>
-        <w:t>Tabela 23. Kuantifikuesit e përgjithshëm</w:t>
+        <w:t>Tabela 23. Sa pajtohen rishikuesit me njëri-tjetrin</w:t>
       </w:r>
     </w:p>
     <w:p>
@@ -1227,7 +1227,7 @@
           <w:caps w:val="0"/>
           <w:sz w:val="24"/>
         </w:rPr>
-        <w:t>Tabela 24. Pragjet e përdorura</w:t>
+        <w:t>Tabela 24. Strategjitë e detektimit dhe burimet e tyre</w:t>
       </w:r>
     </w:p>
     <w:p>
@@ -1243,7 +1243,7 @@
           <w:caps w:val="0"/>
           <w:sz w:val="24"/>
         </w:rPr>
-        <w:t>Tabela 25. Metrikat sipas nivelit</w:t>
+        <w:t>Tabela 25. Kuantifikuesit e përgjithshëm</w:t>
       </w:r>
     </w:p>
     <w:p>
@@ -1259,7 +1259,7 @@
           <w:caps w:val="0"/>
           <w:sz w:val="24"/>
         </w:rPr>
-        <w:t>Tabela 26. Çka propozohet dhe çka aplikohet</w:t>
+        <w:t>Tabela 26. Pragjet e përdorura</w:t>
       </w:r>
     </w:p>
     <w:p>
@@ -1275,7 +1275,7 @@
           <w:caps w:val="0"/>
           <w:sz w:val="24"/>
         </w:rPr>
-        <w:t>Tabela 27. Arsyet e refuzimit</w:t>
+        <w:t>Tabela 27. Metrikat sipas nivelit</w:t>
       </w:r>
     </w:p>
     <w:p>
@@ -1291,7 +1291,7 @@
           <w:caps w:val="0"/>
           <w:sz w:val="24"/>
         </w:rPr>
-        <w:t>Tabela 28. Radha e ekzekutimit</w:t>
+        <w:t>Tabela 28. Çka propozohet dhe çka aplikohet</w:t>
       </w:r>
     </w:p>
     <w:p>
@@ -1307,7 +1307,39 @@
           <w:caps w:val="0"/>
           <w:sz w:val="24"/>
         </w:rPr>
-        <w:t>Tabela 29. Commit-i që prodhoi çdo skedar rezultati</w:t>
+        <w:t>Tabela 29. Arsyet e refuzimit</w:t>
+      </w:r>
+    </w:p>
+    <w:p>
+      <w:pPr>
+        <w:spacing w:line="360" w:lineRule="auto"/>
+        <w:ind w:firstLine="360"/>
+        <w:jc w:val="both"/>
+      </w:pPr>
+      <w:r>
+        <w:rPr>
+          <w:rFonts w:ascii="Times New Roman" w:hAnsi="Times New Roman" w:eastAsia="Times New Roman"/>
+          <w:b w:val="0"/>
+          <w:caps w:val="0"/>
+          <w:sz w:val="24"/>
+        </w:rPr>
+        <w:t>Tabela 30. Radha e ekzekutimit</w:t>
+      </w:r>
+    </w:p>
+    <w:p>
+      <w:pPr>
+        <w:spacing w:line="360" w:lineRule="auto"/>
+        <w:ind w:firstLine="360"/>
+        <w:jc w:val="both"/>
+      </w:pPr>
+      <w:r>
+        <w:rPr>
+          <w:rFonts w:ascii="Times New Roman" w:hAnsi="Times New Roman" w:eastAsia="Times New Roman"/>
+          <w:b w:val="0"/>
+          <w:caps w:val="0"/>
+          <w:sz w:val="24"/>
+        </w:rPr>
+        <w:t>Tabela 31. Commit-i që prodhoi çdo skedar rezultati</w:t>
       </w:r>
     </w:p>
     <w:p>
@@ -14851,7 +14883,907 @@
           <w:caps w:val="0"/>
           <w:sz w:val="24"/>
         </w:rPr>
-        <w:t>5.6 Ashpërsia e derivuar kundrejt gjykimit të rishikuesve</w:t>
+        <w:t>5.7 Pse nuk ndezin strategjitë</w:t>
+      </w:r>
+    </w:p>
+    <w:p>
+      <w:pPr>
+        <w:spacing w:line="360" w:lineRule="auto"/>
+        <w:ind w:firstLine="360"/>
+        <w:jc w:val="both"/>
+      </w:pPr>
+      <w:r>
+        <w:rPr>
+          <w:rFonts w:ascii="Times New Roman" w:hAnsi="Times New Roman" w:eastAsia="Times New Roman"/>
+          <w:b w:val="0"/>
+          <w:caps w:val="0"/>
+          <w:sz w:val="24"/>
+        </w:rPr>
+        <w:t>Një strategji e Lanza &amp; Marinescu-t është konjunksion, ndaj çdo mospërputhje ka shkak të emërtueshëm: një klauzolë, ose dy, ose të tria nuk qëndruan. Matjet për ta thënë këtë ekzistojnë tashmë te tabela e veçorive, ndaj pyetja «pse nuk ndezi» ka përgjigje pa asnjë ekzekutim të ri.</w:t>
+      </w:r>
+    </w:p>
+    <w:p>
+      <w:pPr>
+        <w:spacing w:line="240" w:lineRule="auto"/>
+        <w:jc w:val="center"/>
+      </w:pPr>
+      <w:r>
+        <w:rPr>
+          <w:rFonts w:ascii="Times New Roman" w:hAnsi="Times New Roman" w:eastAsia="Times New Roman"/>
+          <w:b w:val="0"/>
+          <w:caps w:val="0"/>
+          <w:sz w:val="22"/>
+        </w:rPr>
+        <w:t>Tabela 18. Sa klauzola dështuan te secila mospërputhje</w:t>
+      </w:r>
+    </w:p>
+    <w:tbl>
+      <w:tblPr>
+        <w:tblStyle w:val="TableGrid"/>
+        <w:tblW w:type="auto" w:w="0"/>
+        <w:tblLook w:firstColumn="1" w:firstRow="1" w:lastColumn="0" w:lastRow="0" w:noHBand="0" w:noVBand="1" w:val="04A0"/>
+      </w:tblPr>
+      <w:tblGrid>
+        <w:gridCol w:w="2946"/>
+        <w:gridCol w:w="2946"/>
+        <w:gridCol w:w="2946"/>
+      </w:tblGrid>
+      <w:tr>
+        <w:tc>
+          <w:tcPr>
+            <w:tcW w:type="dxa" w:w="2946"/>
+          </w:tcPr>
+          <w:p>
+            <w:pPr>
+              <w:spacing w:line="240" w:lineRule="auto"/>
+            </w:pPr>
+            <w:r>
+              <w:rPr>
+                <w:rFonts w:ascii="Times New Roman" w:hAnsi="Times New Roman" w:eastAsia="Times New Roman"/>
+                <w:b/>
+                <w:caps w:val="0"/>
+                <w:sz w:val="22"/>
+              </w:rPr>
+              <w:t>Era</w:t>
+            </w:r>
+          </w:p>
+        </w:tc>
+        <w:tc>
+          <w:tcPr>
+            <w:tcW w:type="dxa" w:w="2946"/>
+          </w:tcPr>
+          <w:p>
+            <w:pPr>
+              <w:spacing w:line="240" w:lineRule="auto"/>
+            </w:pPr>
+            <w:r>
+              <w:rPr>
+                <w:rFonts w:ascii="Times New Roman" w:hAnsi="Times New Roman" w:eastAsia="Times New Roman"/>
+                <w:b/>
+                <w:caps w:val="0"/>
+                <w:sz w:val="22"/>
+              </w:rPr>
+              <w:t>Të humbura</w:t>
+            </w:r>
+          </w:p>
+        </w:tc>
+        <w:tc>
+          <w:tcPr>
+            <w:tcW w:type="dxa" w:w="2946"/>
+          </w:tcPr>
+          <w:p>
+            <w:pPr>
+              <w:spacing w:line="240" w:lineRule="auto"/>
+            </w:pPr>
+            <w:r>
+              <w:rPr>
+                <w:rFonts w:ascii="Times New Roman" w:hAnsi="Times New Roman" w:eastAsia="Times New Roman"/>
+                <w:b/>
+                <w:caps w:val="0"/>
+                <w:sz w:val="22"/>
+              </w:rPr>
+              <w:t>Shpërndarja</w:t>
+            </w:r>
+          </w:p>
+        </w:tc>
+      </w:tr>
+      <w:tr>
+        <w:tc>
+          <w:tcPr>
+            <w:tcW w:type="dxa" w:w="2946"/>
+          </w:tcPr>
+          <w:p>
+            <w:pPr>
+              <w:spacing w:line="240" w:lineRule="auto"/>
+            </w:pPr>
+            <w:r>
+              <w:rPr>
+                <w:rFonts w:ascii="Times New Roman" w:hAnsi="Times New Roman" w:eastAsia="Times New Roman"/>
+                <w:b w:val="0"/>
+                <w:caps w:val="0"/>
+                <w:sz w:val="22"/>
+              </w:rPr>
+              <w:t>Blob</w:t>
+            </w:r>
+          </w:p>
+        </w:tc>
+        <w:tc>
+          <w:tcPr>
+            <w:tcW w:type="dxa" w:w="2946"/>
+          </w:tcPr>
+          <w:p>
+            <w:pPr>
+              <w:spacing w:line="240" w:lineRule="auto"/>
+            </w:pPr>
+            <w:r>
+              <w:rPr>
+                <w:rFonts w:ascii="Times New Roman" w:hAnsi="Times New Roman" w:eastAsia="Times New Roman"/>
+                <w:b w:val="0"/>
+                <w:caps w:val="0"/>
+                <w:sz w:val="22"/>
+              </w:rPr>
+              <w:t>315</w:t>
+            </w:r>
+          </w:p>
+        </w:tc>
+        <w:tc>
+          <w:tcPr>
+            <w:tcW w:type="dxa" w:w="2946"/>
+          </w:tcPr>
+          <w:p>
+            <w:pPr>
+              <w:spacing w:line="240" w:lineRule="auto"/>
+            </w:pPr>
+            <w:r>
+              <w:rPr>
+                <w:rFonts w:ascii="Times New Roman" w:hAnsi="Times New Roman" w:eastAsia="Times New Roman"/>
+                <w:b w:val="0"/>
+                <w:caps w:val="0"/>
+                <w:sz w:val="22"/>
+              </w:rPr>
+              <w:t>61 me 1 klauzolë, 127 me 2 klauzola, 127 me 3 klauzola</w:t>
+            </w:r>
+          </w:p>
+        </w:tc>
+      </w:tr>
+      <w:tr>
+        <w:tc>
+          <w:tcPr>
+            <w:tcW w:type="dxa" w:w="2946"/>
+          </w:tcPr>
+          <w:p>
+            <w:pPr>
+              <w:spacing w:line="240" w:lineRule="auto"/>
+            </w:pPr>
+            <w:r>
+              <w:rPr>
+                <w:rFonts w:ascii="Times New Roman" w:hAnsi="Times New Roman" w:eastAsia="Times New Roman"/>
+                <w:b w:val="0"/>
+                <w:caps w:val="0"/>
+                <w:sz w:val="22"/>
+              </w:rPr>
+              <w:t>Feature Envy</w:t>
+            </w:r>
+          </w:p>
+        </w:tc>
+        <w:tc>
+          <w:tcPr>
+            <w:tcW w:type="dxa" w:w="2946"/>
+          </w:tcPr>
+          <w:p>
+            <w:pPr>
+              <w:spacing w:line="240" w:lineRule="auto"/>
+            </w:pPr>
+            <w:r>
+              <w:rPr>
+                <w:rFonts w:ascii="Times New Roman" w:hAnsi="Times New Roman" w:eastAsia="Times New Roman"/>
+                <w:b w:val="0"/>
+                <w:caps w:val="0"/>
+                <w:sz w:val="22"/>
+              </w:rPr>
+              <w:t>58</w:t>
+            </w:r>
+          </w:p>
+        </w:tc>
+        <w:tc>
+          <w:tcPr>
+            <w:tcW w:type="dxa" w:w="2946"/>
+          </w:tcPr>
+          <w:p>
+            <w:pPr>
+              <w:spacing w:line="240" w:lineRule="auto"/>
+            </w:pPr>
+            <w:r>
+              <w:rPr>
+                <w:rFonts w:ascii="Times New Roman" w:hAnsi="Times New Roman" w:eastAsia="Times New Roman"/>
+                <w:b w:val="0"/>
+                <w:caps w:val="0"/>
+                <w:sz w:val="22"/>
+              </w:rPr>
+              <w:t>24 me 1 klauzolë, 34 me 2 klauzola</w:t>
+            </w:r>
+          </w:p>
+        </w:tc>
+      </w:tr>
+    </w:tbl>
+    <w:p>
+      <w:pPr>
+        <w:spacing w:line="240" w:lineRule="auto" w:after="0"/>
+      </w:pPr>
+    </w:p>
+    <w:p>
+      <w:pPr>
+        <w:spacing w:line="240" w:lineRule="auto"/>
+        <w:jc w:val="center"/>
+      </w:pPr>
+      <w:r>
+        <w:rPr>
+          <w:rFonts w:ascii="Times New Roman" w:hAnsi="Times New Roman" w:eastAsia="Times New Roman"/>
+          <w:b w:val="0"/>
+          <w:caps w:val="0"/>
+          <w:sz w:val="22"/>
+        </w:rPr>
+        <w:t>Tabela 19. Kur një klauzolë e vetme e ndal strategjinë</w:t>
+      </w:r>
+    </w:p>
+    <w:tbl>
+      <w:tblPr>
+        <w:tblStyle w:val="TableGrid"/>
+        <w:tblW w:type="auto" w:w="0"/>
+        <w:tblLook w:firstColumn="1" w:firstRow="1" w:lastColumn="0" w:lastRow="0" w:noHBand="0" w:noVBand="1" w:val="04A0"/>
+      </w:tblPr>
+      <w:tblGrid>
+        <w:gridCol w:w="2209"/>
+        <w:gridCol w:w="2209"/>
+        <w:gridCol w:w="2209"/>
+        <w:gridCol w:w="2209"/>
+      </w:tblGrid>
+      <w:tr>
+        <w:tc>
+          <w:tcPr>
+            <w:tcW w:type="dxa" w:w="2209"/>
+          </w:tcPr>
+          <w:p>
+            <w:pPr>
+              <w:spacing w:line="240" w:lineRule="auto"/>
+            </w:pPr>
+            <w:r>
+              <w:rPr>
+                <w:rFonts w:ascii="Times New Roman" w:hAnsi="Times New Roman" w:eastAsia="Times New Roman"/>
+                <w:b/>
+                <w:caps w:val="0"/>
+                <w:sz w:val="22"/>
+              </w:rPr>
+              <w:t>Era</w:t>
+            </w:r>
+          </w:p>
+        </w:tc>
+        <w:tc>
+          <w:tcPr>
+            <w:tcW w:type="dxa" w:w="2209"/>
+          </w:tcPr>
+          <w:p>
+            <w:pPr>
+              <w:spacing w:line="240" w:lineRule="auto"/>
+            </w:pPr>
+            <w:r>
+              <w:rPr>
+                <w:rFonts w:ascii="Times New Roman" w:hAnsi="Times New Roman" w:eastAsia="Times New Roman"/>
+                <w:b/>
+                <w:caps w:val="0"/>
+                <w:sz w:val="22"/>
+              </w:rPr>
+              <w:t>Klauzola</w:t>
+            </w:r>
+          </w:p>
+        </w:tc>
+        <w:tc>
+          <w:tcPr>
+            <w:tcW w:type="dxa" w:w="2209"/>
+          </w:tcPr>
+          <w:p>
+            <w:pPr>
+              <w:spacing w:line="240" w:lineRule="auto"/>
+            </w:pPr>
+            <w:r>
+              <w:rPr>
+                <w:rFonts w:ascii="Times New Roman" w:hAnsi="Times New Roman" w:eastAsia="Times New Roman"/>
+                <w:b/>
+                <w:caps w:val="0"/>
+                <w:sz w:val="22"/>
+              </w:rPr>
+              <w:t>Rastet</w:t>
+            </w:r>
+          </w:p>
+        </w:tc>
+        <w:tc>
+          <w:tcPr>
+            <w:tcW w:type="dxa" w:w="2209"/>
+          </w:tcPr>
+          <w:p>
+            <w:pPr>
+              <w:spacing w:line="240" w:lineRule="auto"/>
+            </w:pPr>
+            <w:r>
+              <w:rPr>
+                <w:rFonts w:ascii="Times New Roman" w:hAnsi="Times New Roman" w:eastAsia="Times New Roman"/>
+                <w:b/>
+                <w:caps w:val="0"/>
+                <w:sz w:val="22"/>
+              </w:rPr>
+              <w:t>Mediana e afrisë</w:t>
+            </w:r>
+          </w:p>
+        </w:tc>
+      </w:tr>
+      <w:tr>
+        <w:tc>
+          <w:tcPr>
+            <w:tcW w:type="dxa" w:w="2209"/>
+          </w:tcPr>
+          <w:p>
+            <w:pPr>
+              <w:spacing w:line="240" w:lineRule="auto"/>
+            </w:pPr>
+            <w:r>
+              <w:rPr>
+                <w:rFonts w:ascii="Times New Roman" w:hAnsi="Times New Roman" w:eastAsia="Times New Roman"/>
+                <w:b w:val="0"/>
+                <w:caps w:val="0"/>
+                <w:sz w:val="22"/>
+              </w:rPr>
+              <w:t>Blob</w:t>
+            </w:r>
+          </w:p>
+        </w:tc>
+        <w:tc>
+          <w:tcPr>
+            <w:tcW w:type="dxa" w:w="2209"/>
+          </w:tcPr>
+          <w:p>
+            <w:pPr>
+              <w:spacing w:line="240" w:lineRule="auto"/>
+            </w:pPr>
+            <w:r>
+              <w:rPr>
+                <w:rFonts w:ascii="Times New Roman" w:hAnsi="Times New Roman" w:eastAsia="Times New Roman"/>
+                <w:b w:val="0"/>
+                <w:caps w:val="0"/>
+                <w:sz w:val="22"/>
+              </w:rPr>
+              <w:t>ATFD, qasja në të dhëna të huaja</w:t>
+            </w:r>
+          </w:p>
+        </w:tc>
+        <w:tc>
+          <w:tcPr>
+            <w:tcW w:type="dxa" w:w="2209"/>
+          </w:tcPr>
+          <w:p>
+            <w:pPr>
+              <w:spacing w:line="240" w:lineRule="auto"/>
+            </w:pPr>
+            <w:r>
+              <w:rPr>
+                <w:rFonts w:ascii="Times New Roman" w:hAnsi="Times New Roman" w:eastAsia="Times New Roman"/>
+                <w:b w:val="0"/>
+                <w:caps w:val="0"/>
+                <w:sz w:val="22"/>
+              </w:rPr>
+              <w:t>9</w:t>
+            </w:r>
+          </w:p>
+        </w:tc>
+        <w:tc>
+          <w:tcPr>
+            <w:tcW w:type="dxa" w:w="2209"/>
+          </w:tcPr>
+          <w:p>
+            <w:pPr>
+              <w:spacing w:line="240" w:lineRule="auto"/>
+            </w:pPr>
+            <w:r>
+              <w:rPr>
+                <w:rFonts w:ascii="Times New Roman" w:hAnsi="Times New Roman" w:eastAsia="Times New Roman"/>
+                <w:b w:val="0"/>
+                <w:caps w:val="0"/>
+                <w:sz w:val="22"/>
+              </w:rPr>
+              <w:t>0.40</w:t>
+            </w:r>
+          </w:p>
+        </w:tc>
+      </w:tr>
+      <w:tr>
+        <w:tc>
+          <w:tcPr>
+            <w:tcW w:type="dxa" w:w="2209"/>
+          </w:tcPr>
+          <w:p>
+            <w:pPr>
+              <w:spacing w:line="240" w:lineRule="auto"/>
+            </w:pPr>
+            <w:r>
+              <w:rPr>
+                <w:rFonts w:ascii="Times New Roman" w:hAnsi="Times New Roman" w:eastAsia="Times New Roman"/>
+                <w:b w:val="0"/>
+                <w:caps w:val="0"/>
+                <w:sz w:val="22"/>
+              </w:rPr>
+              <w:t>Blob</w:t>
+            </w:r>
+          </w:p>
+        </w:tc>
+        <w:tc>
+          <w:tcPr>
+            <w:tcW w:type="dxa" w:w="2209"/>
+          </w:tcPr>
+          <w:p>
+            <w:pPr>
+              <w:spacing w:line="240" w:lineRule="auto"/>
+            </w:pPr>
+            <w:r>
+              <w:rPr>
+                <w:rFonts w:ascii="Times New Roman" w:hAnsi="Times New Roman" w:eastAsia="Times New Roman"/>
+                <w:b w:val="0"/>
+                <w:caps w:val="0"/>
+                <w:sz w:val="22"/>
+              </w:rPr>
+              <w:t>TCC, kohezioni</w:t>
+            </w:r>
+          </w:p>
+        </w:tc>
+        <w:tc>
+          <w:tcPr>
+            <w:tcW w:type="dxa" w:w="2209"/>
+          </w:tcPr>
+          <w:p>
+            <w:pPr>
+              <w:spacing w:line="240" w:lineRule="auto"/>
+            </w:pPr>
+            <w:r>
+              <w:rPr>
+                <w:rFonts w:ascii="Times New Roman" w:hAnsi="Times New Roman" w:eastAsia="Times New Roman"/>
+                <w:b w:val="0"/>
+                <w:caps w:val="0"/>
+                <w:sz w:val="22"/>
+              </w:rPr>
+              <w:t>22</w:t>
+            </w:r>
+          </w:p>
+        </w:tc>
+        <w:tc>
+          <w:tcPr>
+            <w:tcW w:type="dxa" w:w="2209"/>
+          </w:tcPr>
+          <w:p>
+            <w:pPr>
+              <w:spacing w:line="240" w:lineRule="auto"/>
+            </w:pPr>
+            <w:r>
+              <w:rPr>
+                <w:rFonts w:ascii="Times New Roman" w:hAnsi="Times New Roman" w:eastAsia="Times New Roman"/>
+                <w:b w:val="0"/>
+                <w:caps w:val="0"/>
+                <w:sz w:val="22"/>
+              </w:rPr>
+              <w:t>0.33</w:t>
+            </w:r>
+          </w:p>
+        </w:tc>
+      </w:tr>
+      <w:tr>
+        <w:tc>
+          <w:tcPr>
+            <w:tcW w:type="dxa" w:w="2209"/>
+          </w:tcPr>
+          <w:p>
+            <w:pPr>
+              <w:spacing w:line="240" w:lineRule="auto"/>
+            </w:pPr>
+            <w:r>
+              <w:rPr>
+                <w:rFonts w:ascii="Times New Roman" w:hAnsi="Times New Roman" w:eastAsia="Times New Roman"/>
+                <w:b w:val="0"/>
+                <w:caps w:val="0"/>
+                <w:sz w:val="22"/>
+              </w:rPr>
+              <w:t>Blob</w:t>
+            </w:r>
+          </w:p>
+        </w:tc>
+        <w:tc>
+          <w:tcPr>
+            <w:tcW w:type="dxa" w:w="2209"/>
+          </w:tcPr>
+          <w:p>
+            <w:pPr>
+              <w:spacing w:line="240" w:lineRule="auto"/>
+            </w:pPr>
+            <w:r>
+              <w:rPr>
+                <w:rFonts w:ascii="Times New Roman" w:hAnsi="Times New Roman" w:eastAsia="Times New Roman"/>
+                <w:b w:val="0"/>
+                <w:caps w:val="0"/>
+                <w:sz w:val="22"/>
+              </w:rPr>
+              <w:t>WMC, kompleksiteti i peshuar</w:t>
+            </w:r>
+          </w:p>
+        </w:tc>
+        <w:tc>
+          <w:tcPr>
+            <w:tcW w:type="dxa" w:w="2209"/>
+          </w:tcPr>
+          <w:p>
+            <w:pPr>
+              <w:spacing w:line="240" w:lineRule="auto"/>
+            </w:pPr>
+            <w:r>
+              <w:rPr>
+                <w:rFonts w:ascii="Times New Roman" w:hAnsi="Times New Roman" w:eastAsia="Times New Roman"/>
+                <w:b w:val="0"/>
+                <w:caps w:val="0"/>
+                <w:sz w:val="22"/>
+              </w:rPr>
+              <w:t>30</w:t>
+            </w:r>
+          </w:p>
+        </w:tc>
+        <w:tc>
+          <w:tcPr>
+            <w:tcW w:type="dxa" w:w="2209"/>
+          </w:tcPr>
+          <w:p>
+            <w:pPr>
+              <w:spacing w:line="240" w:lineRule="auto"/>
+            </w:pPr>
+            <w:r>
+              <w:rPr>
+                <w:rFonts w:ascii="Times New Roman" w:hAnsi="Times New Roman" w:eastAsia="Times New Roman"/>
+                <w:b w:val="0"/>
+                <w:caps w:val="0"/>
+                <w:sz w:val="22"/>
+              </w:rPr>
+              <w:t>0.52</w:t>
+            </w:r>
+          </w:p>
+        </w:tc>
+      </w:tr>
+      <w:tr>
+        <w:tc>
+          <w:tcPr>
+            <w:tcW w:type="dxa" w:w="2209"/>
+          </w:tcPr>
+          <w:p>
+            <w:pPr>
+              <w:spacing w:line="240" w:lineRule="auto"/>
+            </w:pPr>
+            <w:r>
+              <w:rPr>
+                <w:rFonts w:ascii="Times New Roman" w:hAnsi="Times New Roman" w:eastAsia="Times New Roman"/>
+                <w:b w:val="0"/>
+                <w:caps w:val="0"/>
+                <w:sz w:val="22"/>
+              </w:rPr>
+              <w:t>Feature Envy</w:t>
+            </w:r>
+          </w:p>
+        </w:tc>
+        <w:tc>
+          <w:tcPr>
+            <w:tcW w:type="dxa" w:w="2209"/>
+          </w:tcPr>
+          <w:p>
+            <w:pPr>
+              <w:spacing w:line="240" w:lineRule="auto"/>
+            </w:pPr>
+            <w:r>
+              <w:rPr>
+                <w:rFonts w:ascii="Times New Roman" w:hAnsi="Times New Roman" w:eastAsia="Times New Roman"/>
+                <w:b w:val="0"/>
+                <w:caps w:val="0"/>
+                <w:sz w:val="22"/>
+              </w:rPr>
+              <w:t>ATFD, qasja në të dhëna të huaja</w:t>
+            </w:r>
+          </w:p>
+        </w:tc>
+        <w:tc>
+          <w:tcPr>
+            <w:tcW w:type="dxa" w:w="2209"/>
+          </w:tcPr>
+          <w:p>
+            <w:pPr>
+              <w:spacing w:line="240" w:lineRule="auto"/>
+            </w:pPr>
+            <w:r>
+              <w:rPr>
+                <w:rFonts w:ascii="Times New Roman" w:hAnsi="Times New Roman" w:eastAsia="Times New Roman"/>
+                <w:b w:val="0"/>
+                <w:caps w:val="0"/>
+                <w:sz w:val="22"/>
+              </w:rPr>
+              <w:t>13</w:t>
+            </w:r>
+          </w:p>
+        </w:tc>
+        <w:tc>
+          <w:tcPr>
+            <w:tcW w:type="dxa" w:w="2209"/>
+          </w:tcPr>
+          <w:p>
+            <w:pPr>
+              <w:spacing w:line="240" w:lineRule="auto"/>
+            </w:pPr>
+            <w:r>
+              <w:rPr>
+                <w:rFonts w:ascii="Times New Roman" w:hAnsi="Times New Roman" w:eastAsia="Times New Roman"/>
+                <w:b w:val="0"/>
+                <w:caps w:val="0"/>
+                <w:sz w:val="22"/>
+              </w:rPr>
+              <w:t>0.80</w:t>
+            </w:r>
+          </w:p>
+        </w:tc>
+      </w:tr>
+      <w:tr>
+        <w:tc>
+          <w:tcPr>
+            <w:tcW w:type="dxa" w:w="2209"/>
+          </w:tcPr>
+          <w:p>
+            <w:pPr>
+              <w:spacing w:line="240" w:lineRule="auto"/>
+            </w:pPr>
+            <w:r>
+              <w:rPr>
+                <w:rFonts w:ascii="Times New Roman" w:hAnsi="Times New Roman" w:eastAsia="Times New Roman"/>
+                <w:b w:val="0"/>
+                <w:caps w:val="0"/>
+                <w:sz w:val="22"/>
+              </w:rPr>
+              <w:t>Feature Envy</w:t>
+            </w:r>
+          </w:p>
+        </w:tc>
+        <w:tc>
+          <w:tcPr>
+            <w:tcW w:type="dxa" w:w="2209"/>
+          </w:tcPr>
+          <w:p>
+            <w:pPr>
+              <w:spacing w:line="240" w:lineRule="auto"/>
+            </w:pPr>
+            <w:r>
+              <w:rPr>
+                <w:rFonts w:ascii="Times New Roman" w:hAnsi="Times New Roman" w:eastAsia="Times New Roman"/>
+                <w:b w:val="0"/>
+                <w:caps w:val="0"/>
+                <w:sz w:val="22"/>
+              </w:rPr>
+              <w:t>FDP, sa klasa të huaja</w:t>
+            </w:r>
+          </w:p>
+        </w:tc>
+        <w:tc>
+          <w:tcPr>
+            <w:tcW w:type="dxa" w:w="2209"/>
+          </w:tcPr>
+          <w:p>
+            <w:pPr>
+              <w:spacing w:line="240" w:lineRule="auto"/>
+            </w:pPr>
+            <w:r>
+              <w:rPr>
+                <w:rFonts w:ascii="Times New Roman" w:hAnsi="Times New Roman" w:eastAsia="Times New Roman"/>
+                <w:b w:val="0"/>
+                <w:caps w:val="0"/>
+                <w:sz w:val="22"/>
+              </w:rPr>
+              <w:t>9</w:t>
+            </w:r>
+          </w:p>
+        </w:tc>
+        <w:tc>
+          <w:tcPr>
+            <w:tcW w:type="dxa" w:w="2209"/>
+          </w:tcPr>
+          <w:p>
+            <w:pPr>
+              <w:spacing w:line="240" w:lineRule="auto"/>
+            </w:pPr>
+            <w:r>
+              <w:rPr>
+                <w:rFonts w:ascii="Times New Roman" w:hAnsi="Times New Roman" w:eastAsia="Times New Roman"/>
+                <w:b w:val="0"/>
+                <w:caps w:val="0"/>
+                <w:sz w:val="22"/>
+              </w:rPr>
+              <w:t>0.71</w:t>
+            </w:r>
+          </w:p>
+        </w:tc>
+      </w:tr>
+      <w:tr>
+        <w:tc>
+          <w:tcPr>
+            <w:tcW w:type="dxa" w:w="2209"/>
+          </w:tcPr>
+          <w:p>
+            <w:pPr>
+              <w:spacing w:line="240" w:lineRule="auto"/>
+            </w:pPr>
+            <w:r>
+              <w:rPr>
+                <w:rFonts w:ascii="Times New Roman" w:hAnsi="Times New Roman" w:eastAsia="Times New Roman"/>
+                <w:b w:val="0"/>
+                <w:caps w:val="0"/>
+                <w:sz w:val="22"/>
+              </w:rPr>
+              <w:t>Feature Envy</w:t>
+            </w:r>
+          </w:p>
+        </w:tc>
+        <w:tc>
+          <w:tcPr>
+            <w:tcW w:type="dxa" w:w="2209"/>
+          </w:tcPr>
+          <w:p>
+            <w:pPr>
+              <w:spacing w:line="240" w:lineRule="auto"/>
+            </w:pPr>
+            <w:r>
+              <w:rPr>
+                <w:rFonts w:ascii="Times New Roman" w:hAnsi="Times New Roman" w:eastAsia="Times New Roman"/>
+                <w:b w:val="0"/>
+                <w:caps w:val="0"/>
+                <w:sz w:val="22"/>
+              </w:rPr>
+              <w:t>LAA, qasja te të vetat</w:t>
+            </w:r>
+          </w:p>
+        </w:tc>
+        <w:tc>
+          <w:tcPr>
+            <w:tcW w:type="dxa" w:w="2209"/>
+          </w:tcPr>
+          <w:p>
+            <w:pPr>
+              <w:spacing w:line="240" w:lineRule="auto"/>
+            </w:pPr>
+            <w:r>
+              <w:rPr>
+                <w:rFonts w:ascii="Times New Roman" w:hAnsi="Times New Roman" w:eastAsia="Times New Roman"/>
+                <w:b w:val="0"/>
+                <w:caps w:val="0"/>
+                <w:sz w:val="22"/>
+              </w:rPr>
+              <w:t>2</w:t>
+            </w:r>
+          </w:p>
+        </w:tc>
+        <w:tc>
+          <w:tcPr>
+            <w:tcW w:type="dxa" w:w="2209"/>
+          </w:tcPr>
+          <w:p>
+            <w:pPr>
+              <w:spacing w:line="240" w:lineRule="auto"/>
+            </w:pPr>
+            <w:r>
+              <w:rPr>
+                <w:rFonts w:ascii="Times New Roman" w:hAnsi="Times New Roman" w:eastAsia="Times New Roman"/>
+                <w:b w:val="0"/>
+                <w:caps w:val="0"/>
+                <w:sz w:val="22"/>
+              </w:rPr>
+              <w:t>0.83</w:t>
+            </w:r>
+          </w:p>
+        </w:tc>
+      </w:tr>
+    </w:tbl>
+    <w:p>
+      <w:pPr>
+        <w:spacing w:line="240" w:lineRule="auto" w:after="0"/>
+      </w:pPr>
+    </w:p>
+    <w:p>
+      <w:pPr>
+        <w:spacing w:line="360" w:lineRule="auto"/>
+        <w:ind w:firstLine="360"/>
+        <w:jc w:val="both"/>
+      </w:pPr>
+      <w:r>
+        <w:rPr>
+          <w:rFonts w:ascii="Times New Roman" w:hAnsi="Times New Roman" w:eastAsia="Times New Roman"/>
+          <w:b w:val="0"/>
+          <w:caps w:val="0"/>
+          <w:sz w:val="24"/>
+        </w:rPr>
+        <w:t>Kolona e fundit është distanca nga pragu si raport: 1.00 do të thoshte saktësisht mbi prag, 0.50 gjysma e rrugës. Të dy drejtimet lexohen njësoj, sepse një klauzolë që kërkon vlerë të madhe matet si e matura mbi pragun dhe një që kërkon vlerë të vogël si pragu mbi të maturën.</w:t>
+      </w:r>
+    </w:p>
+    <w:p>
+      <w:pPr>
+        <w:spacing w:line="360" w:lineRule="auto"/>
+        <w:ind w:firstLine="360"/>
+        <w:jc w:val="both"/>
+      </w:pPr>
+      <w:r>
+        <w:rPr>
+          <w:rFonts w:ascii="Times New Roman" w:hAnsi="Times New Roman" w:eastAsia="Times New Roman"/>
+          <w:b/>
+          <w:caps w:val="0"/>
+          <w:sz w:val="24"/>
+        </w:rPr>
+        <w:t>Blob.</w:t>
+      </w:r>
+      <w:r>
+        <w:rPr>
+          <w:rFonts w:ascii="Times New Roman" w:hAnsi="Times New Roman" w:eastAsia="Times New Roman"/>
+          <w:b w:val="0"/>
+          <w:caps w:val="0"/>
+          <w:sz w:val="24"/>
+        </w:rPr>
+        <w:t xml:space="preserve"> 254 nga 315 i dështojnë dy ose tri klauzola njëkohësisht, pra shumica nuk janë raste që një prag pak më i butë do t'i kapte: janë entitete që, të matura me këto metrika, nuk i ngjajnë erës nga disa anë njëherësh. Aty ku bllokuesi është një i vetëm, medianat e afrisë shkojnë nga 0.33 te 0.52 e pragut.</w:t>
+      </w:r>
+    </w:p>
+    <w:p>
+      <w:pPr>
+        <w:spacing w:line="360" w:lineRule="auto"/>
+        <w:ind w:firstLine="360"/>
+        <w:jc w:val="both"/>
+      </w:pPr>
+      <w:r>
+        <w:rPr>
+          <w:rFonts w:ascii="Times New Roman" w:hAnsi="Times New Roman" w:eastAsia="Times New Roman"/>
+          <w:b/>
+          <w:caps w:val="0"/>
+          <w:sz w:val="24"/>
+        </w:rPr>
+        <w:t>Feature Envy.</w:t>
+      </w:r>
+      <w:r>
+        <w:rPr>
+          <w:rFonts w:ascii="Times New Roman" w:hAnsi="Times New Roman" w:eastAsia="Times New Roman"/>
+          <w:b w:val="0"/>
+          <w:caps w:val="0"/>
+          <w:sz w:val="24"/>
+        </w:rPr>
+        <w:t xml:space="preserve"> 34 nga 58 i dështojnë dy ose tri klauzola njëkohësisht, pra shumica nuk janë raste që një prag pak më i butë do t'i kapte: janë entitete që, të matura me këto metrika, nuk i ngjajnë erës nga disa anë njëherësh. Aty ku bllokuesi është një i vetëm, medianat e afrisë shkojnë nga 0.71 te 0.83 e pragut.</w:t>
+      </w:r>
+    </w:p>
+    <w:p>
+      <w:pPr>
+        <w:spacing w:line="360" w:lineRule="auto"/>
+        <w:ind w:firstLine="360"/>
+        <w:jc w:val="both"/>
+      </w:pPr>
+      <w:r>
+        <w:rPr>
+          <w:rFonts w:ascii="Times New Roman" w:hAnsi="Times New Roman" w:eastAsia="Times New Roman"/>
+          <w:b w:val="0"/>
+          <w:caps w:val="0"/>
+          <w:sz w:val="24"/>
+        </w:rPr>
+        <w:t>Kjo analizë kufizohet te dy strategjitë që janë konjunksione të pastra. Long Method-i ka një klauzolë të vetme, ndaj pyetja ka një përgjigje të vetme dhe të parashikueshme; Data Class-i përzien konjunksion me disjunksion, ku «klauzola bllokuese» nuk përcaktohet pa vendosur se cila degë ishte më afër, dhe ai vendim do të prodhonte një numër që varet nga vetë vendimi.</w:t>
+      </w:r>
+    </w:p>
+    <w:p>
+      <w:pPr>
+        <w:pStyle w:val="Heading2"/>
+      </w:pPr>
+      <w:r>
+        <w:rPr>
+          <w:rFonts w:ascii="Times New Roman" w:hAnsi="Times New Roman" w:eastAsia="Times New Roman"/>
+          <w:b/>
+          <w:caps w:val="0"/>
+          <w:sz w:val="24"/>
+        </w:rPr>
+        <w:t>5.8 Ashpërsia e derivuar kundrejt gjykimit të rishikuesve</w:t>
       </w:r>
     </w:p>
     <w:p>
@@ -14898,7 +15830,7 @@
           <w:caps w:val="0"/>
           <w:sz w:val="22"/>
         </w:rPr>
-        <w:t>Tabela 18. Pajtimi i ashpërsisë me rishikuesit</w:t>
+        <w:t>Tabela 20. Pajtimi i ashpërsisë me rishikuesit</w:t>
       </w:r>
     </w:p>
     <w:tbl>
@@ -15647,7 +16579,7 @@
           <w:caps w:val="0"/>
           <w:sz w:val="24"/>
         </w:rPr>
-        <w:t>5.7 Sa peshë mban një shifër e vetme</w:t>
+        <w:t>5.9 Sa peshë mban një shifër e vetme</w:t>
       </w:r>
     </w:p>
     <w:p>
@@ -15696,7 +16628,7 @@
           <w:caps w:val="0"/>
           <w:sz w:val="22"/>
         </w:rPr>
-        <w:t>Tabela 19. Intervale besimi 95% për MCC-në</w:t>
+        <w:t>Tabela 21. Intervale besimi 95% për MCC-në</w:t>
       </w:r>
     </w:p>
     <w:tbl>
@@ -16301,7 +17233,7 @@
           <w:caps w:val="0"/>
           <w:sz w:val="22"/>
         </w:rPr>
-        <w:t>Tabela 20. B − A kur rregullat marrin pragun e tyre më të mirë</w:t>
+        <w:t>Tabela 22. B − A kur rregullat marrin pragun e tyre më të mirë</w:t>
       </w:r>
     </w:p>
     <w:tbl>
@@ -16852,7 +17784,7 @@
           <w:caps w:val="0"/>
           <w:sz w:val="22"/>
         </w:rPr>
-        <w:t>Tabela 21. Sa pajtohen rishikuesit me njëri-tjetrin</w:t>
+        <w:t>Tabela 23. Sa pajtohen rishikuesit me njëri-tjetrin</w:t>
       </w:r>
     </w:p>
     <w:tbl>
@@ -17447,7 +18379,23 @@
           <w:caps w:val="0"/>
           <w:sz w:val="24"/>
         </w:rPr>
-        <w:t>Të dyja sugjerojnë se ajo që rishikuesit e MLCQ-së e quajnë «blob» shpjegohet më mirë me madhësi sesa me kushtin e kohezionit që strategjia e publikuar e vendos në qendër. Kjo nuk e zhvlerëson strategjinë, por tregon se ajo mat diçka pak më ndryshe nga ajo që emërton.</w:t>
+        <w:t>E treta vjen nga vetë mospërputhjet. Nga 315 raste që rishikuesit i quajtën Blob dhe strategjia nuk i ndezi, 254 nuk e kalojnë as dy nga tri klauzolat. Nuk janë raste kufitare që një prag pak më i butë do t'i kapte: janë entitete që, të matura me këto metrika, nuk i ngjajnë erës nga disa anë njëherësh. Kjo e ndan pyetjen e kalibrimit nga pyetja e përkufizimit, dhe e vendos këtë rast te e dyta.</w:t>
+      </w:r>
+    </w:p>
+    <w:p>
+      <w:pPr>
+        <w:spacing w:line="360" w:lineRule="auto"/>
+        <w:ind w:firstLine="360"/>
+        <w:jc w:val="both"/>
+      </w:pPr>
+      <w:r>
+        <w:rPr>
+          <w:rFonts w:ascii="Times New Roman" w:hAnsi="Times New Roman" w:eastAsia="Times New Roman"/>
+          <w:b w:val="0"/>
+          <w:caps w:val="0"/>
+          <w:sz w:val="24"/>
+        </w:rPr>
+        <w:t>Këto sugjerojnë se ajo që rishikuesit e MLCQ-së e quajnë «blob» shpjegohet më mirë me madhësi sesa me kushtin e kohezionit që strategjia e publikuar e vendos në qendër. Kjo nuk e zhvlerëson strategjinë, por tregon se ajo mat diçka pak më ndryshe nga ajo që emërton.</w:t>
       </w:r>
     </w:p>
     <w:p>
@@ -18444,7 +19392,7 @@
           <w:caps w:val="0"/>
           <w:sz w:val="22"/>
         </w:rPr>
-        <w:t>Tabela 22. Strategjitë e detektimit dhe burimet e tyre</w:t>
+        <w:t>Tabela 24. Strategjitë e detektimit dhe burimet e tyre</w:t>
       </w:r>
     </w:p>
     <w:tbl>
@@ -19225,7 +20173,7 @@
           <w:caps w:val="0"/>
           <w:sz w:val="22"/>
         </w:rPr>
-        <w:t>Tabela 23. Kuantifikuesit e përgjithshëm</w:t>
+        <w:t>Tabela 25. Kuantifikuesit e përgjithshëm</w:t>
       </w:r>
     </w:p>
     <w:tbl>
@@ -19672,7 +20620,7 @@
           <w:caps w:val="0"/>
           <w:sz w:val="22"/>
         </w:rPr>
-        <w:t>Tabela 24. Pragjet e përdorura</w:t>
+        <w:t>Tabela 26. Pragjet e përdorura</w:t>
       </w:r>
     </w:p>
     <w:tbl>
@@ -20693,7 +21641,7 @@
           <w:caps w:val="0"/>
           <w:sz w:val="22"/>
         </w:rPr>
-        <w:t>Tabela 25. Metrikat sipas nivelit</w:t>
+        <w:t>Tabela 27. Metrikat sipas nivelit</w:t>
       </w:r>
     </w:p>
     <w:tbl>
@@ -20874,7 +21822,7 @@
           <w:caps w:val="0"/>
           <w:sz w:val="22"/>
         </w:rPr>
-        <w:t>Tabela 26. Çka propozohet dhe çka aplikohet</w:t>
+        <w:t>Tabela 28. Çka propozohet dhe çka aplikohet</w:t>
       </w:r>
     </w:p>
     <w:tbl>
@@ -21453,7 +22401,7 @@
           <w:caps w:val="0"/>
           <w:sz w:val="22"/>
         </w:rPr>
-        <w:t>Tabela 27. Arsyet e refuzimit</w:t>
+        <w:t>Tabela 29. Arsyet e refuzimit</w:t>
       </w:r>
     </w:p>
     <w:tbl>
@@ -21914,7 +22862,7 @@
           <w:caps w:val="0"/>
           <w:sz w:val="22"/>
         </w:rPr>
-        <w:t>Tabela 28. Radha e ekzekutimit</w:t>
+        <w:t>Tabela 30. Radha e ekzekutimit</w:t>
       </w:r>
     </w:p>
     <w:tbl>
@@ -23484,7 +24432,85 @@
                 <w:caps w:val="0"/>
                 <w:sz w:val="22"/>
               </w:rPr>
-              <w:t>~3 orë</w:t>
+              <w:t>orë</w:t>
+            </w:r>
+          </w:p>
+        </w:tc>
+      </w:tr>
+      <w:tr>
+        <w:tc>
+          <w:tcPr>
+            <w:tcW w:type="dxa" w:w="2209"/>
+          </w:tcPr>
+          <w:p>
+            <w:pPr>
+              <w:spacing w:line="240" w:lineRule="auto"/>
+            </w:pPr>
+            <w:r>
+              <w:rPr>
+                <w:rFonts w:ascii="Times New Roman" w:hAnsi="Times New Roman" w:eastAsia="Times New Roman"/>
+                <w:b w:val="0"/>
+                <w:caps w:val="0"/>
+                <w:sz w:val="22"/>
+              </w:rPr>
+              <w:t>20</w:t>
+            </w:r>
+          </w:p>
+        </w:tc>
+        <w:tc>
+          <w:tcPr>
+            <w:tcW w:type="dxa" w:w="2209"/>
+          </w:tcPr>
+          <w:p>
+            <w:pPr>
+              <w:spacing w:line="240" w:lineRule="auto"/>
+            </w:pPr>
+            <w:r>
+              <w:rPr>
+                <w:rFonts w:ascii="Times New Roman" w:hAnsi="Times New Roman" w:eastAsia="Times New Roman"/>
+                <w:b w:val="0"/>
+                <w:caps w:val="0"/>
+                <w:sz w:val="22"/>
+              </w:rPr>
+              <w:t>blocking_conditions.py</w:t>
+            </w:r>
+          </w:p>
+        </w:tc>
+        <w:tc>
+          <w:tcPr>
+            <w:tcW w:type="dxa" w:w="2209"/>
+          </w:tcPr>
+          <w:p>
+            <w:pPr>
+              <w:spacing w:line="240" w:lineRule="auto"/>
+            </w:pPr>
+            <w:r>
+              <w:rPr>
+                <w:rFonts w:ascii="Times New Roman" w:hAnsi="Times New Roman" w:eastAsia="Times New Roman"/>
+                <w:b w:val="0"/>
+                <w:caps w:val="0"/>
+                <w:sz w:val="22"/>
+              </w:rPr>
+              <w:t>cila klauzolë e ndal secilën strategji</w:t>
+            </w:r>
+          </w:p>
+        </w:tc>
+        <w:tc>
+          <w:tcPr>
+            <w:tcW w:type="dxa" w:w="2209"/>
+          </w:tcPr>
+          <w:p>
+            <w:pPr>
+              <w:spacing w:line="240" w:lineRule="auto"/>
+            </w:pPr>
+            <w:r>
+              <w:rPr>
+                <w:rFonts w:ascii="Times New Roman" w:hAnsi="Times New Roman" w:eastAsia="Times New Roman"/>
+                <w:b w:val="0"/>
+                <w:caps w:val="0"/>
+                <w:sz w:val="22"/>
+              </w:rPr>
+              <w:t>sekonda</w:t>
             </w:r>
           </w:p>
         </w:tc>
@@ -23523,7 +24549,7 @@
           <w:caps w:val="0"/>
           <w:sz w:val="22"/>
         </w:rPr>
-        <w:t>Tabela 29. Commit-i që prodhoi çdo skedar rezultati</w:t>
+        <w:t>Tabela 31. Commit-i që prodhoi çdo skedar rezultati</w:t>
       </w:r>
     </w:p>
     <w:tbl>
@@ -23572,6 +24598,46 @@
                 <w:sz w:val="22"/>
               </w:rPr>
               <w:t>Commit-i</w:t>
+            </w:r>
+          </w:p>
+        </w:tc>
+      </w:tr>
+      <w:tr>
+        <w:tc>
+          <w:tcPr>
+            <w:tcW w:type="dxa" w:w="4419"/>
+          </w:tcPr>
+          <w:p>
+            <w:pPr>
+              <w:spacing w:line="240" w:lineRule="auto"/>
+            </w:pPr>
+            <w:r>
+              <w:rPr>
+                <w:rFonts w:ascii="Times New Roman" w:hAnsi="Times New Roman" w:eastAsia="Times New Roman"/>
+                <w:b w:val="0"/>
+                <w:caps w:val="0"/>
+                <w:sz w:val="22"/>
+              </w:rPr>
+              <w:t>blocking_conditions.json</w:t>
+            </w:r>
+          </w:p>
+        </w:tc>
+        <w:tc>
+          <w:tcPr>
+            <w:tcW w:type="dxa" w:w="4419"/>
+          </w:tcPr>
+          <w:p>
+            <w:pPr>
+              <w:spacing w:line="240" w:lineRule="auto"/>
+            </w:pPr>
+            <w:r>
+              <w:rPr>
+                <w:rFonts w:ascii="Times New Roman" w:hAnsi="Times New Roman" w:eastAsia="Times New Roman"/>
+                <w:b w:val="0"/>
+                <w:caps w:val="0"/>
+                <w:sz w:val="22"/>
+              </w:rPr>
+              <w:t>1e0e249e67</w:t>
             </w:r>
           </w:p>
         </w:tc>

</xml_diff>

<commit_message>
Ndreq punen e ardhshme qe premtonte ate qe ishte bere
</commit_message>
<xml_diff>
--- a/docs/thesis/Punim_Diplome_Florent_Latifi.docx
+++ b/docs/thesis/Punim_Diplome_Florent_Latifi.docx
@@ -15769,6 +15769,22 @@
           <w:caps w:val="0"/>
           <w:sz w:val="24"/>
         </w:rPr>
+        <w:t>Kjo llogari bën një parashikim që një matje tjetër e provon në mënyrë të pavarur. Te Blob-i mospërputhjet janë larg pragjeve (mediana mesatare 0.42), ndaj kalibrimi nuk duhet të ndihmojë shumë; te Feature Envy janë afër (0.78), ndaj duhet. Kalibrimi jashtë-fold-it i Nënkapitullit 5.5, i matur veç dhe pa e parë këtë analizë, jep +0.021 MCC për të parin dhe +0.140 për të dytin. Dy erëra nuk provojnë një rregull, por drejtimi është ai që llogaria e klauzolave e priste, dhe kjo e bën atë shpjegim me vlerë parashikuese e jo përshkrim të mëpasshëm.</w:t>
+      </w:r>
+    </w:p>
+    <w:p>
+      <w:pPr>
+        <w:spacing w:line="360" w:lineRule="auto"/>
+        <w:ind w:firstLine="360"/>
+        <w:jc w:val="both"/>
+      </w:pPr>
+      <w:r>
+        <w:rPr>
+          <w:rFonts w:ascii="Times New Roman" w:hAnsi="Times New Roman" w:eastAsia="Times New Roman"/>
+          <w:b w:val="0"/>
+          <w:caps w:val="0"/>
+          <w:sz w:val="24"/>
+        </w:rPr>
         <w:t>Kjo analizë kufizohet te dy strategjitë që janë konjunksione të pastra. Long Method-i ka një klauzolë të vetme, ndaj pyetja ka një përgjigje të vetme dhe të parashikueshme; Data Class-i përzien konjunksion me disjunksion, ku «klauzola bllokuese» nuk përcaktohet pa vendosur se cila degë ishte më afër, dhe ai vendim do të prodhonte një numër që varet nga vetë vendimi.</w:t>
       </w:r>
     </w:p>
@@ -18631,7 +18647,7 @@
           <w:caps w:val="0"/>
           <w:sz w:val="24"/>
         </w:rPr>
-        <w:t>Kalibrim i pragjeve mbi një bashkësi të ndarë dhe vlerësim mbi një tjetër të paprekur. Fshirja tregoi se dy pragje e ndryshojnë ndjeshëm rezultatin, por adoptimi i tyre pa këtë ndarje do të ishte thjesht përshtatje ndaj të dhënave të testimit.</w:t>
+        <w:t>Adoptimi i pragjeve të kalibruara si të parazgjedhura. Kalibrimi jashtë-fold-it është bërë dhe raportohet te Nënkapitulli 5.5; ajo që mbetet është vendimi nëse një vlerë e zgjedhur mbi këtë korpus përgjithësohet, dhe foldet nuk pajtohen për të njëjtën vlerë te 3 nga 4 erërat, çka është arsye për të mos e marrë ende.</w:t>
       </w:r>
     </w:p>
     <w:p>

</xml_diff>

<commit_message>
Shkruaj pse Feature Envy mbetet pa reference te jashtme
</commit_message>
<xml_diff>
--- a/docs/thesis/Punim_Diplome_Florent_Latifi.docx
+++ b/docs/thesis/Punim_Diplome_Florent_Latifi.docx
@@ -14838,6 +14838,38 @@
           <w:sz w:val="24"/>
         </w:rPr>
         <w:t>Feature Envy nuk ka rresht krahasimi sepse PMD nuk ka rregull për të. LawOfDemeter është më i afërti dhe mat zinxhirë mesazhesh e jo qasje në të dhëna të huaja; shifra e tij raportohet për ta pasur të matur e jo të supozuar, dhe nuk është matje e Feature Envy-së. Mbulimi i pjesshëm i një mjeti të përhapur është vetë gjetje: tri nga katër erërat e MLCQ-së kanë një rregull të gatshme, e katërta jo.</w:t>
+      </w:r>
+    </w:p>
+    <w:p>
+      <w:pPr>
+        <w:spacing w:line="360" w:lineRule="auto"/>
+        <w:ind w:firstLine="360"/>
+        <w:jc w:val="both"/>
+      </w:pPr>
+      <w:r>
+        <w:rPr>
+          <w:rFonts w:ascii="Times New Roman" w:hAnsi="Times New Roman" w:eastAsia="Times New Roman"/>
+          <w:b w:val="0"/>
+          <w:caps w:val="0"/>
+          <w:sz w:val="24"/>
+        </w:rPr>
+        <w:t>Mungesa nuk është veti vetëm e PMD-së, dhe u kërkua një mjet i dytë para se të pranohej. Katalogu i rregullave të PMD-së për Java u numërua nga vetë shpërndarja e tij dhe nuk përmban asnjë rregull për Feature Envy. DesigniteJava, mjeti tjetër i lirë me përhapje krahasuese, dokumenton shtatëmbëdhjetë design smells dhe dhjetë implementation smells, dhe Feature Envy nuk është ndër to. Mjeti që e zbulon vërtet është JDeodorant, i cili ndërtohet mbi pikërisht identifikimin e mundësive për Move Method (Tsantalis &amp; Chatzigeorgiou, 2009), por ai është shtojcë e mjedisit të zhvillimit dhe varianti i tij në rresht komande nuk mban licencë, çka e përjashton nga kufizimi i varësive që ky punim ndjek.</w:t>
+      </w:r>
+    </w:p>
+    <w:p>
+      <w:pPr>
+        <w:spacing w:line="360" w:lineRule="auto"/>
+        <w:ind w:firstLine="360"/>
+        <w:jc w:val="both"/>
+      </w:pPr>
+      <w:r>
+        <w:rPr>
+          <w:rFonts w:ascii="Times New Roman" w:hAnsi="Times New Roman" w:eastAsia="Times New Roman"/>
+          <w:b w:val="0"/>
+          <w:caps w:val="0"/>
+          <w:sz w:val="24"/>
+        </w:rPr>
+        <w:t>Prandaj erës që literatura e trajton më shpesh si objektiv refaktorimi i mungon mbështetja në mjetet që një zhvillues i instalon lehtë. Kjo raportohet si gjendje e verifikuar e jo si supozim: dy katalogë u numëruan, dhe i treti u përjashtua për arsye licence e jo për mungesë aftësie.</w:t>
       </w:r>
     </w:p>
     <w:p>

</xml_diff>

<commit_message>
Vecoje permbysjen e vetme dhe trego se shkaku eshte korpusi
</commit_message>
<xml_diff>
--- a/docs/thesis/Punim_Diplome_Florent_Latifi.docx
+++ b/docs/thesis/Punim_Diplome_Florent_Latifi.docx
@@ -9927,7 +9927,7 @@
                 <w:caps w:val="0"/>
                 <w:sz w:val="22"/>
               </w:rPr>
-              <w:t>2</w:t>
+              <w:t>1</w:t>
             </w:r>
           </w:p>
         </w:tc>
@@ -10045,7 +10045,7 @@
                 <w:caps w:val="0"/>
                 <w:sz w:val="22"/>
               </w:rPr>
-              <w:t>403</w:t>
+              <w:t>404</w:t>
             </w:r>
           </w:p>
         </w:tc>
@@ -10064,7 +10064,7 @@
                 <w:caps w:val="0"/>
                 <w:sz w:val="22"/>
               </w:rPr>
-              <w:t>343</w:t>
+              <w:t>351</w:t>
             </w:r>
           </w:p>
         </w:tc>
@@ -10123,7 +10123,7 @@
                 <w:caps w:val="0"/>
                 <w:sz w:val="22"/>
               </w:rPr>
-              <w:t>15</w:t>
+              <w:t>7</w:t>
             </w:r>
           </w:p>
         </w:tc>
@@ -10147,7 +10147,7 @@
           <w:caps w:val="0"/>
           <w:sz w:val="24"/>
         </w:rPr>
-        <w:t>Verdikti më i fortë kalon nga 2 te 46 nga 405 rishkrime, pra nga 0.5% në 11.4%. Kjo do të thotë se pjesa dërrmuese e rasteve ku sistemi thotë vetëm «nuk shtova gabim» janë raste ku ai nuk mund të thoshte më shumë për shkak të mënyrës së kompilimit, jo për shkak të rishkrimit.</w:t>
+        <w:t>Verdikti më i fortë kalon nga 1 te 46 nga 405 rishkrime, pra nga 0.2% në 11.4%. Kjo do të thotë se pjesa dërrmuese e rasteve ku sistemi thotë vetëm «nuk shtova gabim» janë raste ku ai nuk mund të thoshte më shumë për shkak të mënyrës së kompilimit, jo për shkak të rishkrimit.</w:t>
       </w:r>
     </w:p>
     <w:p>
@@ -10163,7 +10163,7 @@
           <w:caps w:val="0"/>
           <w:sz w:val="24"/>
         </w:rPr>
-        <w:t>Përmbysjet nuk janë zero. 1 nga 405 rishkrime e ndryshojnë verdiktin në drejtimin e keq: të izoluara nuk shtonin lloj të ri gabimi, brenda projektit të vet shtojnë. Numri është i vogël dhe pjesa dërrmuese e rishkrimeve nuk sillet kështu, por ekzistenca e tij e kufizon pretendimin që mund të bëhet. Toleranca «pa lloj të ri gabimi» mbetet dëshmi e përdorshme atje ku kompilimi i plotë nuk arrihet; ajo nuk është garanci se kompilimi me kontekstin e projektit do të pajtohej me të. Rasti nuk u veçua: matja mban numra të grumbulluar, ndaj identifikimi i tij kërkon një ekzekutim të synuar dhe mbetet punë e pabërë. 15 kompilime e kaluan kufirin kohor dhe numërohen si të pakontrolluara, kurrë si sukses.</w:t>
+        <w:t>Përmbysjet nuk janë zero. 1 nga 405 rishkrime e ndryshojnë verdiktin në drejtimin e keq: të izoluara nuk shtonin lloj të ri gabimi, brenda projektit të vet shtojnë. Numri është i vogël dhe pjesa dërrmuese e rishkrimeve nuk sillet kështu, por ekzistenca e tij e kufizon pretendimin që mund të bëhet. Toleranca «pa lloj të ri gabimi» mbetet dëshmi e përdorshme atje ku kompilimi i plotë nuk arrihet; ajo nuk është garanci se kompilimi me kontekstin e projektit do të pajtohej me të. Rasti u veçua. Është një Extract Method mbi AlertSummaryRenderer.finalizeResult(Result) te «AlertSummaryRenderer.java» e projektit Ambari, dhe të tria gabimet që shton janë të të njëjtit lloj: paketa të palëve të treta që nuk ekzistojnë. Shkaku nuk është transformimi por korpusi. Nxjerrja e bllokut e kalon një tip nga trupi i metodës te nënshkrimi i saj, dhe një tip te nënshkrimi duhet zgjidhur i plotë, bashkë me anotacionet e veta; ato anotacione vijnë nga një bibliotekë që korpusi nuk e mban, sepse ai ruan vetëm skedarë «.java» dhe asnjë jar (Nënkapitulli 6.3). Në një projekt me varësitë e veta i njëjti rishkrim nuk do të kishte çfarë të shtonte. 7 kompilime e kaluan kufirin kohor dhe numërohen si të pakontrolluara, kurrë si sukses.</w:t>
       </w:r>
     </w:p>
     <w:p>
@@ -10179,7 +10179,7 @@
           <w:caps w:val="0"/>
           <w:sz w:val="24"/>
         </w:rPr>
-        <w:t>Mostra është e vogël dhe e mbjellë me farë, sepse kompilimi në kontekst është i shtrenjtë: çdo rishkrim detyron kompilimin e tërë mbylljes së varësive të skedarit, dhe seanca e fundit e kësaj matjeje zgjati rreth 7 orë. Kohëzgjatja e regjistruar mbulon vetëm atë seancë e jo tërë matjen, sepse ekzekutimi është i rifillueshëm. Kostoja nuk ndahet baraz mbi skedarët: ajo paguhet një herë për çdo rishkrim, dhe skedarët janë tepër të pabarabartë — njëri në këtë mostër mban 118 rishkrime, ndërsa shumica mbajnë disa. Verdiktet e raportuara më lart mbi tërë korpusin mbeten ato të izoluara; kjo matje nuk i zëvendëson, por tregon në ç'drejtim do të lëviznin.</w:t>
+        <w:t>Mostra është e vogël dhe e mbjellë me farë, sepse kompilimi në kontekst është i shtrenjtë: çdo rishkrim detyron kompilimin e tërë mbylljes së varësive të skedarit, dhe seanca e fundit e kësaj matjeje zgjati rreth 4 orë. Kohëzgjatja e regjistruar mbulon vetëm atë seancë e jo tërë matjen, sepse ekzekutimi është i rifillueshëm. Kostoja nuk ndahet baraz mbi skedarët: ajo paguhet një herë për çdo rishkrim, dhe skedarët janë tepër të pabarabartë — njëri në këtë mostër mban 118 rishkrime, ndërsa shumica mbajnë disa. Verdiktet e raportuara më lart mbi tërë korpusin mbeten ato të izoluara; kjo matje nuk i zëvendëson, por tregon në ç'drejtim do të lëviznin.</w:t>
       </w:r>
     </w:p>
     <w:p>
@@ -25245,7 +25245,7 @@
                 <w:caps w:val="0"/>
                 <w:sz w:val="22"/>
               </w:rPr>
-              <w:t>195c22ef45</w:t>
+              <w:t>6dedb127db</w:t>
             </w:r>
           </w:p>
         </w:tc>

</xml_diff>

<commit_message>
Shto analizen e recall-it te Blob-it
Mospërputhjet e Blob-it jane klasa te vogla e jo nje permase e pamatur:
tre te katertat rrine nen cerekun me te vogel te kapjeve, dhe ndarja me e
mire mes tyre dhe klasave te pastra eshte NOF me 0.773. Tavani i vetem i
matjes eshte TCC-ja e ngopur te klasat statike, 19 raste, e raportuar dhe
jo e ndryshuar (VD-88).
</commit_message>
<xml_diff>
--- a/docs/thesis/Punim_Diplome_Florent_Latifi.docx
+++ b/docs/thesis/Punim_Diplome_Florent_Latifi.docx
@@ -1227,7 +1227,7 @@
           <w:caps w:val="0"/>
           <w:sz w:val="24"/>
         </w:rPr>
-        <w:t>Tabela 24. Strategjitë e detektimit dhe burimet e tyre</w:t>
+        <w:t>Tabela 24. Madhësia e klasave në secilën qelizë, si kuartil i poshtëm–mesatare–i sipërm</w:t>
       </w:r>
     </w:p>
     <w:p>
@@ -1243,7 +1243,7 @@
           <w:caps w:val="0"/>
           <w:sz w:val="24"/>
         </w:rPr>
-        <w:t>Tabela 25. Kuantifikuesit e përgjithshëm</w:t>
+        <w:t>Tabela 25. Recall-i sipas ashpërsisë që caktuan rishikuesit, agregim MAX</w:t>
       </w:r>
     </w:p>
     <w:p>
@@ -1259,7 +1259,7 @@
           <w:caps w:val="0"/>
           <w:sz w:val="24"/>
         </w:rPr>
-        <w:t>Tabela 26. Pragjet e përdorura</w:t>
+        <w:t>Tabela 26. Klasat që klauzola e kohezionit nuk i arrin dot</w:t>
       </w:r>
     </w:p>
     <w:p>
@@ -1275,7 +1275,7 @@
           <w:caps w:val="0"/>
           <w:sz w:val="24"/>
         </w:rPr>
-        <w:t>Tabela 27. Metrikat sipas nivelit</w:t>
+        <w:t>Tabela 27. Strategjitë e detektimit dhe burimet e tyre</w:t>
       </w:r>
     </w:p>
     <w:p>
@@ -1291,7 +1291,7 @@
           <w:caps w:val="0"/>
           <w:sz w:val="24"/>
         </w:rPr>
-        <w:t>Tabela 28. Çka propozohet dhe çka aplikohet</w:t>
+        <w:t>Tabela 28. Kuantifikuesit e përgjithshëm</w:t>
       </w:r>
     </w:p>
     <w:p>
@@ -1307,7 +1307,7 @@
           <w:caps w:val="0"/>
           <w:sz w:val="24"/>
         </w:rPr>
-        <w:t>Tabela 29. Arsyet e refuzimit</w:t>
+        <w:t>Tabela 29. Pragjet e përdorura</w:t>
       </w:r>
     </w:p>
     <w:p>
@@ -1323,7 +1323,7 @@
           <w:caps w:val="0"/>
           <w:sz w:val="24"/>
         </w:rPr>
-        <w:t>Tabela 30. Radha e ekzekutimit</w:t>
+        <w:t>Tabela 30. Metrikat sipas nivelit</w:t>
       </w:r>
     </w:p>
     <w:p>
@@ -1339,7 +1339,55 @@
           <w:caps w:val="0"/>
           <w:sz w:val="24"/>
         </w:rPr>
-        <w:t>Tabela 31. Commit-i që prodhoi çdo skedar rezultati</w:t>
+        <w:t>Tabela 31. Çka propozohet dhe çka aplikohet</w:t>
+      </w:r>
+    </w:p>
+    <w:p>
+      <w:pPr>
+        <w:spacing w:line="360" w:lineRule="auto"/>
+        <w:ind w:firstLine="360"/>
+        <w:jc w:val="both"/>
+      </w:pPr>
+      <w:r>
+        <w:rPr>
+          <w:rFonts w:ascii="Times New Roman" w:hAnsi="Times New Roman" w:eastAsia="Times New Roman"/>
+          <w:b w:val="0"/>
+          <w:caps w:val="0"/>
+          <w:sz w:val="24"/>
+        </w:rPr>
+        <w:t>Tabela 32. Arsyet e refuzimit</w:t>
+      </w:r>
+    </w:p>
+    <w:p>
+      <w:pPr>
+        <w:spacing w:line="360" w:lineRule="auto"/>
+        <w:ind w:firstLine="360"/>
+        <w:jc w:val="both"/>
+      </w:pPr>
+      <w:r>
+        <w:rPr>
+          <w:rFonts w:ascii="Times New Roman" w:hAnsi="Times New Roman" w:eastAsia="Times New Roman"/>
+          <w:b w:val="0"/>
+          <w:caps w:val="0"/>
+          <w:sz w:val="24"/>
+        </w:rPr>
+        <w:t>Tabela 33. Radha e ekzekutimit</w:t>
+      </w:r>
+    </w:p>
+    <w:p>
+      <w:pPr>
+        <w:spacing w:line="360" w:lineRule="auto"/>
+        <w:ind w:firstLine="360"/>
+        <w:jc w:val="both"/>
+      </w:pPr>
+      <w:r>
+        <w:rPr>
+          <w:rFonts w:ascii="Times New Roman" w:hAnsi="Times New Roman" w:eastAsia="Times New Roman"/>
+          <w:b w:val="0"/>
+          <w:caps w:val="0"/>
+          <w:sz w:val="24"/>
+        </w:rPr>
+        <w:t>Tabela 34. Commit-i që prodhoi çdo skedar rezultati</w:t>
       </w:r>
     </w:p>
     <w:p>
@@ -18277,6 +18325,2531 @@
     </w:p>
     <w:p>
       <w:pPr>
+        <w:pStyle w:val="Heading2"/>
+      </w:pPr>
+      <w:r>
+        <w:rPr>
+          <w:rFonts w:ascii="Times New Roman" w:hAnsi="Times New Roman" w:eastAsia="Times New Roman"/>
+          <w:b/>
+          <w:caps w:val="0"/>
+          <w:sz w:val="24"/>
+        </w:rPr>
+        <w:t>5.10 Çfarë mbetet pa u kapur te Blob-i</w:t>
+      </w:r>
+    </w:p>
+    <w:p>
+      <w:pPr>
+        <w:spacing w:line="360" w:lineRule="auto"/>
+        <w:ind w:firstLine="360"/>
+        <w:jc w:val="both"/>
+      </w:pPr>
+      <w:r>
+        <w:rPr>
+          <w:rFonts w:ascii="Times New Roman" w:hAnsi="Times New Roman" w:eastAsia="Times New Roman"/>
+          <w:b w:val="0"/>
+          <w:caps w:val="0"/>
+          <w:sz w:val="24"/>
+        </w:rPr>
+        <w:t>Nënkapitulli 5.7 numëron klauzolat që ndalën secilën mospërputhje dhe e lë të hapur pyetjen që vjen menjëherë pas saj: si duket klasa që rishikuesi e quajti blob ndërsa strategjia nuk e quajti? Përgjigjja ka vetëm dy forma, dhe të dyja kërkojnë punë të kundërt. Ose klasat e humbura u ngjajnë atyre të kapura në një përmasë që strategjia nuk e lexon fare, dhe atëherë asaj i mungon një klauzolë; ose u ngjajnë klasave që rishikuesit i quajtën të pastra në çdo përmasë të matur, dhe atëherë asnjë prag e asnjë klauzolë nuk i arrin dot.</w:t>
+      </w:r>
+    </w:p>
+    <w:p>
+      <w:pPr>
+        <w:spacing w:line="240" w:lineRule="auto"/>
+        <w:jc w:val="center"/>
+      </w:pPr>
+      <w:r>
+        <w:rPr>
+          <w:rFonts w:ascii="Times New Roman" w:hAnsi="Times New Roman" w:eastAsia="Times New Roman"/>
+          <w:b w:val="0"/>
+          <w:caps w:val="0"/>
+          <w:sz w:val="22"/>
+        </w:rPr>
+        <w:t>Tabela 24. Madhësia e klasave në secilën qelizë, si kuartil i poshtëm–mesatare–i sipërm</w:t>
+      </w:r>
+    </w:p>
+    <w:tbl>
+      <w:tblPr>
+        <w:tblStyle w:val="TableGrid"/>
+        <w:tblW w:type="auto" w:w="0"/>
+        <w:tblLook w:firstColumn="1" w:firstRow="1" w:lastColumn="0" w:lastRow="0" w:noHBand="0" w:noVBand="1" w:val="04A0"/>
+      </w:tblPr>
+      <w:tblGrid>
+        <w:gridCol w:w="1768"/>
+        <w:gridCol w:w="1768"/>
+        <w:gridCol w:w="1768"/>
+        <w:gridCol w:w="1768"/>
+        <w:gridCol w:w="1768"/>
+      </w:tblGrid>
+      <w:tr>
+        <w:tc>
+          <w:tcPr>
+            <w:tcW w:type="dxa" w:w="1768"/>
+          </w:tcPr>
+          <w:p>
+            <w:pPr>
+              <w:spacing w:line="240" w:lineRule="auto"/>
+            </w:pPr>
+            <w:r>
+              <w:rPr>
+                <w:rFonts w:ascii="Times New Roman" w:hAnsi="Times New Roman" w:eastAsia="Times New Roman"/>
+                <w:b/>
+                <w:caps w:val="0"/>
+                <w:sz w:val="22"/>
+              </w:rPr>
+              <w:t>Varianti</w:t>
+            </w:r>
+          </w:p>
+        </w:tc>
+        <w:tc>
+          <w:tcPr>
+            <w:tcW w:type="dxa" w:w="1768"/>
+          </w:tcPr>
+          <w:p>
+            <w:pPr>
+              <w:spacing w:line="240" w:lineRule="auto"/>
+            </w:pPr>
+            <w:r>
+              <w:rPr>
+                <w:rFonts w:ascii="Times New Roman" w:hAnsi="Times New Roman" w:eastAsia="Times New Roman"/>
+                <w:b/>
+                <w:caps w:val="0"/>
+                <w:sz w:val="22"/>
+              </w:rPr>
+              <w:t>Metrika</w:t>
+            </w:r>
+          </w:p>
+        </w:tc>
+        <w:tc>
+          <w:tcPr>
+            <w:tcW w:type="dxa" w:w="1768"/>
+          </w:tcPr>
+          <w:p>
+            <w:pPr>
+              <w:spacing w:line="240" w:lineRule="auto"/>
+            </w:pPr>
+            <w:r>
+              <w:rPr>
+                <w:rFonts w:ascii="Times New Roman" w:hAnsi="Times New Roman" w:eastAsia="Times New Roman"/>
+                <w:b/>
+                <w:caps w:val="0"/>
+                <w:sz w:val="22"/>
+              </w:rPr>
+              <w:t>Të kapura</w:t>
+            </w:r>
+          </w:p>
+        </w:tc>
+        <w:tc>
+          <w:tcPr>
+            <w:tcW w:type="dxa" w:w="1768"/>
+          </w:tcPr>
+          <w:p>
+            <w:pPr>
+              <w:spacing w:line="240" w:lineRule="auto"/>
+            </w:pPr>
+            <w:r>
+              <w:rPr>
+                <w:rFonts w:ascii="Times New Roman" w:hAnsi="Times New Roman" w:eastAsia="Times New Roman"/>
+                <w:b/>
+                <w:caps w:val="0"/>
+                <w:sz w:val="22"/>
+              </w:rPr>
+              <w:t>Të humbura</w:t>
+            </w:r>
+          </w:p>
+        </w:tc>
+        <w:tc>
+          <w:tcPr>
+            <w:tcW w:type="dxa" w:w="1768"/>
+          </w:tcPr>
+          <w:p>
+            <w:pPr>
+              <w:spacing w:line="240" w:lineRule="auto"/>
+            </w:pPr>
+            <w:r>
+              <w:rPr>
+                <w:rFonts w:ascii="Times New Roman" w:hAnsi="Times New Roman" w:eastAsia="Times New Roman"/>
+                <w:b/>
+                <w:caps w:val="0"/>
+                <w:sz w:val="22"/>
+              </w:rPr>
+              <w:t>Të pastra</w:t>
+            </w:r>
+          </w:p>
+        </w:tc>
+      </w:tr>
+      <w:tr>
+        <w:tc>
+          <w:tcPr>
+            <w:tcW w:type="dxa" w:w="1768"/>
+          </w:tcPr>
+          <w:p>
+            <w:pPr>
+              <w:spacing w:line="240" w:lineRule="auto"/>
+            </w:pPr>
+            <w:r>
+              <w:rPr>
+                <w:rFonts w:ascii="Times New Roman" w:hAnsi="Times New Roman" w:eastAsia="Times New Roman"/>
+                <w:b w:val="0"/>
+                <w:caps w:val="0"/>
+                <w:sz w:val="22"/>
+              </w:rPr>
+              <w:t>Blob, strategjia</w:t>
+            </w:r>
+          </w:p>
+        </w:tc>
+        <w:tc>
+          <w:tcPr>
+            <w:tcW w:type="dxa" w:w="1768"/>
+          </w:tcPr>
+          <w:p>
+            <w:pPr>
+              <w:spacing w:line="240" w:lineRule="auto"/>
+            </w:pPr>
+            <w:r>
+              <w:rPr>
+                <w:rFonts w:ascii="Times New Roman" w:hAnsi="Times New Roman" w:eastAsia="Times New Roman"/>
+                <w:b w:val="0"/>
+                <w:caps w:val="0"/>
+                <w:sz w:val="22"/>
+              </w:rPr>
+              <w:t>CLOC</w:t>
+            </w:r>
+          </w:p>
+        </w:tc>
+        <w:tc>
+          <w:tcPr>
+            <w:tcW w:type="dxa" w:w="1768"/>
+          </w:tcPr>
+          <w:p>
+            <w:pPr>
+              <w:spacing w:line="240" w:lineRule="auto"/>
+            </w:pPr>
+            <w:r>
+              <w:rPr>
+                <w:rFonts w:ascii="Times New Roman" w:hAnsi="Times New Roman" w:eastAsia="Times New Roman"/>
+                <w:b w:val="0"/>
+                <w:caps w:val="0"/>
+                <w:sz w:val="22"/>
+              </w:rPr>
+              <w:t>261–285–746</w:t>
+            </w:r>
+          </w:p>
+        </w:tc>
+        <w:tc>
+          <w:tcPr>
+            <w:tcW w:type="dxa" w:w="1768"/>
+          </w:tcPr>
+          <w:p>
+            <w:pPr>
+              <w:spacing w:line="240" w:lineRule="auto"/>
+            </w:pPr>
+            <w:r>
+              <w:rPr>
+                <w:rFonts w:ascii="Times New Roman" w:hAnsi="Times New Roman" w:eastAsia="Times New Roman"/>
+                <w:b w:val="0"/>
+                <w:caps w:val="0"/>
+                <w:sz w:val="22"/>
+              </w:rPr>
+              <w:t>24–55–123</w:t>
+            </w:r>
+          </w:p>
+        </w:tc>
+        <w:tc>
+          <w:tcPr>
+            <w:tcW w:type="dxa" w:w="1768"/>
+          </w:tcPr>
+          <w:p>
+            <w:pPr>
+              <w:spacing w:line="240" w:lineRule="auto"/>
+            </w:pPr>
+            <w:r>
+              <w:rPr>
+                <w:rFonts w:ascii="Times New Roman" w:hAnsi="Times New Roman" w:eastAsia="Times New Roman"/>
+                <w:b w:val="0"/>
+                <w:caps w:val="0"/>
+                <w:sz w:val="22"/>
+              </w:rPr>
+              <w:t>9–21–45</w:t>
+            </w:r>
+          </w:p>
+        </w:tc>
+      </w:tr>
+      <w:tr>
+        <w:tc>
+          <w:tcPr>
+            <w:tcW w:type="dxa" w:w="1768"/>
+          </w:tcPr>
+          <w:p>
+            <w:pPr>
+              <w:spacing w:line="240" w:lineRule="auto"/>
+            </w:pPr>
+            <w:r>
+              <w:rPr>
+                <w:rFonts w:ascii="Times New Roman" w:hAnsi="Times New Roman" w:eastAsia="Times New Roman"/>
+                <w:b w:val="0"/>
+                <w:caps w:val="0"/>
+                <w:sz w:val="22"/>
+              </w:rPr>
+              <w:t>Blob, strategjia</w:t>
+            </w:r>
+          </w:p>
+        </w:tc>
+        <w:tc>
+          <w:tcPr>
+            <w:tcW w:type="dxa" w:w="1768"/>
+          </w:tcPr>
+          <w:p>
+            <w:pPr>
+              <w:spacing w:line="240" w:lineRule="auto"/>
+            </w:pPr>
+            <w:r>
+              <w:rPr>
+                <w:rFonts w:ascii="Times New Roman" w:hAnsi="Times New Roman" w:eastAsia="Times New Roman"/>
+                <w:b w:val="0"/>
+                <w:caps w:val="0"/>
+                <w:sz w:val="22"/>
+              </w:rPr>
+              <w:t>NOM</w:t>
+            </w:r>
+          </w:p>
+        </w:tc>
+        <w:tc>
+          <w:tcPr>
+            <w:tcW w:type="dxa" w:w="1768"/>
+          </w:tcPr>
+          <w:p>
+            <w:pPr>
+              <w:spacing w:line="240" w:lineRule="auto"/>
+            </w:pPr>
+            <w:r>
+              <w:rPr>
+                <w:rFonts w:ascii="Times New Roman" w:hAnsi="Times New Roman" w:eastAsia="Times New Roman"/>
+                <w:b w:val="0"/>
+                <w:caps w:val="0"/>
+                <w:sz w:val="22"/>
+              </w:rPr>
+              <w:t>17–25–46</w:t>
+            </w:r>
+          </w:p>
+        </w:tc>
+        <w:tc>
+          <w:tcPr>
+            <w:tcW w:type="dxa" w:w="1768"/>
+          </w:tcPr>
+          <w:p>
+            <w:pPr>
+              <w:spacing w:line="240" w:lineRule="auto"/>
+            </w:pPr>
+            <w:r>
+              <w:rPr>
+                <w:rFonts w:ascii="Times New Roman" w:hAnsi="Times New Roman" w:eastAsia="Times New Roman"/>
+                <w:b w:val="0"/>
+                <w:caps w:val="0"/>
+                <w:sz w:val="22"/>
+              </w:rPr>
+              <w:t>4–8–14</w:t>
+            </w:r>
+          </w:p>
+        </w:tc>
+        <w:tc>
+          <w:tcPr>
+            <w:tcW w:type="dxa" w:w="1768"/>
+          </w:tcPr>
+          <w:p>
+            <w:pPr>
+              <w:spacing w:line="240" w:lineRule="auto"/>
+            </w:pPr>
+            <w:r>
+              <w:rPr>
+                <w:rFonts w:ascii="Times New Roman" w:hAnsi="Times New Roman" w:eastAsia="Times New Roman"/>
+                <w:b w:val="0"/>
+                <w:caps w:val="0"/>
+                <w:sz w:val="22"/>
+              </w:rPr>
+              <w:t>1–3–6</w:t>
+            </w:r>
+          </w:p>
+        </w:tc>
+      </w:tr>
+      <w:tr>
+        <w:tc>
+          <w:tcPr>
+            <w:tcW w:type="dxa" w:w="1768"/>
+          </w:tcPr>
+          <w:p>
+            <w:pPr>
+              <w:spacing w:line="240" w:lineRule="auto"/>
+            </w:pPr>
+            <w:r>
+              <w:rPr>
+                <w:rFonts w:ascii="Times New Roman" w:hAnsi="Times New Roman" w:eastAsia="Times New Roman"/>
+                <w:b w:val="0"/>
+                <w:caps w:val="0"/>
+                <w:sz w:val="22"/>
+              </w:rPr>
+              <w:t>Blob, strategjia</w:t>
+            </w:r>
+          </w:p>
+        </w:tc>
+        <w:tc>
+          <w:tcPr>
+            <w:tcW w:type="dxa" w:w="1768"/>
+          </w:tcPr>
+          <w:p>
+            <w:pPr>
+              <w:spacing w:line="240" w:lineRule="auto"/>
+            </w:pPr>
+            <w:r>
+              <w:rPr>
+                <w:rFonts w:ascii="Times New Roman" w:hAnsi="Times New Roman" w:eastAsia="Times New Roman"/>
+                <w:b w:val="0"/>
+                <w:caps w:val="0"/>
+                <w:sz w:val="22"/>
+              </w:rPr>
+              <w:t>WMC</w:t>
+            </w:r>
+          </w:p>
+        </w:tc>
+        <w:tc>
+          <w:tcPr>
+            <w:tcW w:type="dxa" w:w="1768"/>
+          </w:tcPr>
+          <w:p>
+            <w:pPr>
+              <w:spacing w:line="240" w:lineRule="auto"/>
+            </w:pPr>
+            <w:r>
+              <w:rPr>
+                <w:rFonts w:ascii="Times New Roman" w:hAnsi="Times New Roman" w:eastAsia="Times New Roman"/>
+                <w:b w:val="0"/>
+                <w:caps w:val="0"/>
+                <w:sz w:val="22"/>
+              </w:rPr>
+              <w:t>55–81–156</w:t>
+            </w:r>
+          </w:p>
+        </w:tc>
+        <w:tc>
+          <w:tcPr>
+            <w:tcW w:type="dxa" w:w="1768"/>
+          </w:tcPr>
+          <w:p>
+            <w:pPr>
+              <w:spacing w:line="240" w:lineRule="auto"/>
+            </w:pPr>
+            <w:r>
+              <w:rPr>
+                <w:rFonts w:ascii="Times New Roman" w:hAnsi="Times New Roman" w:eastAsia="Times New Roman"/>
+                <w:b w:val="0"/>
+                <w:caps w:val="0"/>
+                <w:sz w:val="22"/>
+              </w:rPr>
+              <w:t>7–15–29</w:t>
+            </w:r>
+          </w:p>
+        </w:tc>
+        <w:tc>
+          <w:tcPr>
+            <w:tcW w:type="dxa" w:w="1768"/>
+          </w:tcPr>
+          <w:p>
+            <w:pPr>
+              <w:spacing w:line="240" w:lineRule="auto"/>
+            </w:pPr>
+            <w:r>
+              <w:rPr>
+                <w:rFonts w:ascii="Times New Roman" w:hAnsi="Times New Roman" w:eastAsia="Times New Roman"/>
+                <w:b w:val="0"/>
+                <w:caps w:val="0"/>
+                <w:sz w:val="22"/>
+              </w:rPr>
+              <w:t>3–6–11</w:t>
+            </w:r>
+          </w:p>
+        </w:tc>
+      </w:tr>
+      <w:tr>
+        <w:tc>
+          <w:tcPr>
+            <w:tcW w:type="dxa" w:w="1768"/>
+          </w:tcPr>
+          <w:p>
+            <w:pPr>
+              <w:spacing w:line="240" w:lineRule="auto"/>
+            </w:pPr>
+            <w:r>
+              <w:rPr>
+                <w:rFonts w:ascii="Times New Roman" w:hAnsi="Times New Roman" w:eastAsia="Times New Roman"/>
+                <w:b w:val="0"/>
+                <w:caps w:val="0"/>
+                <w:sz w:val="22"/>
+              </w:rPr>
+              <w:t>Blob, me madhësinë</w:t>
+            </w:r>
+          </w:p>
+        </w:tc>
+        <w:tc>
+          <w:tcPr>
+            <w:tcW w:type="dxa" w:w="1768"/>
+          </w:tcPr>
+          <w:p>
+            <w:pPr>
+              <w:spacing w:line="240" w:lineRule="auto"/>
+            </w:pPr>
+            <w:r>
+              <w:rPr>
+                <w:rFonts w:ascii="Times New Roman" w:hAnsi="Times New Roman" w:eastAsia="Times New Roman"/>
+                <w:b w:val="0"/>
+                <w:caps w:val="0"/>
+                <w:sz w:val="22"/>
+              </w:rPr>
+              <w:t>CLOC</w:t>
+            </w:r>
+          </w:p>
+        </w:tc>
+        <w:tc>
+          <w:tcPr>
+            <w:tcW w:type="dxa" w:w="1768"/>
+          </w:tcPr>
+          <w:p>
+            <w:pPr>
+              <w:spacing w:line="240" w:lineRule="auto"/>
+            </w:pPr>
+            <w:r>
+              <w:rPr>
+                <w:rFonts w:ascii="Times New Roman" w:hAnsi="Times New Roman" w:eastAsia="Times New Roman"/>
+                <w:b w:val="0"/>
+                <w:caps w:val="0"/>
+                <w:sz w:val="22"/>
+              </w:rPr>
+              <w:t>194–276–470</w:t>
+            </w:r>
+          </w:p>
+        </w:tc>
+        <w:tc>
+          <w:tcPr>
+            <w:tcW w:type="dxa" w:w="1768"/>
+          </w:tcPr>
+          <w:p>
+            <w:pPr>
+              <w:spacing w:line="240" w:lineRule="auto"/>
+            </w:pPr>
+            <w:r>
+              <w:rPr>
+                <w:rFonts w:ascii="Times New Roman" w:hAnsi="Times New Roman" w:eastAsia="Times New Roman"/>
+                <w:b w:val="0"/>
+                <w:caps w:val="0"/>
+                <w:sz w:val="22"/>
+              </w:rPr>
+              <w:t>22–48–81</w:t>
+            </w:r>
+          </w:p>
+        </w:tc>
+        <w:tc>
+          <w:tcPr>
+            <w:tcW w:type="dxa" w:w="1768"/>
+          </w:tcPr>
+          <w:p>
+            <w:pPr>
+              <w:spacing w:line="240" w:lineRule="auto"/>
+            </w:pPr>
+            <w:r>
+              <w:rPr>
+                <w:rFonts w:ascii="Times New Roman" w:hAnsi="Times New Roman" w:eastAsia="Times New Roman"/>
+                <w:b w:val="0"/>
+                <w:caps w:val="0"/>
+                <w:sz w:val="22"/>
+              </w:rPr>
+              <w:t>9–19–41</w:t>
+            </w:r>
+          </w:p>
+        </w:tc>
+      </w:tr>
+      <w:tr>
+        <w:tc>
+          <w:tcPr>
+            <w:tcW w:type="dxa" w:w="1768"/>
+          </w:tcPr>
+          <w:p>
+            <w:pPr>
+              <w:spacing w:line="240" w:lineRule="auto"/>
+            </w:pPr>
+            <w:r>
+              <w:rPr>
+                <w:rFonts w:ascii="Times New Roman" w:hAnsi="Times New Roman" w:eastAsia="Times New Roman"/>
+                <w:b w:val="0"/>
+                <w:caps w:val="0"/>
+                <w:sz w:val="22"/>
+              </w:rPr>
+              <w:t>Blob, me madhësinë</w:t>
+            </w:r>
+          </w:p>
+        </w:tc>
+        <w:tc>
+          <w:tcPr>
+            <w:tcW w:type="dxa" w:w="1768"/>
+          </w:tcPr>
+          <w:p>
+            <w:pPr>
+              <w:spacing w:line="240" w:lineRule="auto"/>
+            </w:pPr>
+            <w:r>
+              <w:rPr>
+                <w:rFonts w:ascii="Times New Roman" w:hAnsi="Times New Roman" w:eastAsia="Times New Roman"/>
+                <w:b w:val="0"/>
+                <w:caps w:val="0"/>
+                <w:sz w:val="22"/>
+              </w:rPr>
+              <w:t>NOM</w:t>
+            </w:r>
+          </w:p>
+        </w:tc>
+        <w:tc>
+          <w:tcPr>
+            <w:tcW w:type="dxa" w:w="1768"/>
+          </w:tcPr>
+          <w:p>
+            <w:pPr>
+              <w:spacing w:line="240" w:lineRule="auto"/>
+            </w:pPr>
+            <w:r>
+              <w:rPr>
+                <w:rFonts w:ascii="Times New Roman" w:hAnsi="Times New Roman" w:eastAsia="Times New Roman"/>
+                <w:b w:val="0"/>
+                <w:caps w:val="0"/>
+                <w:sz w:val="22"/>
+              </w:rPr>
+              <w:t>15–25–35</w:t>
+            </w:r>
+          </w:p>
+        </w:tc>
+        <w:tc>
+          <w:tcPr>
+            <w:tcW w:type="dxa" w:w="1768"/>
+          </w:tcPr>
+          <w:p>
+            <w:pPr>
+              <w:spacing w:line="240" w:lineRule="auto"/>
+            </w:pPr>
+            <w:r>
+              <w:rPr>
+                <w:rFonts w:ascii="Times New Roman" w:hAnsi="Times New Roman" w:eastAsia="Times New Roman"/>
+                <w:b w:val="0"/>
+                <w:caps w:val="0"/>
+                <w:sz w:val="22"/>
+              </w:rPr>
+              <w:t>3–7–12</w:t>
+            </w:r>
+          </w:p>
+        </w:tc>
+        <w:tc>
+          <w:tcPr>
+            <w:tcW w:type="dxa" w:w="1768"/>
+          </w:tcPr>
+          <w:p>
+            <w:pPr>
+              <w:spacing w:line="240" w:lineRule="auto"/>
+            </w:pPr>
+            <w:r>
+              <w:rPr>
+                <w:rFonts w:ascii="Times New Roman" w:hAnsi="Times New Roman" w:eastAsia="Times New Roman"/>
+                <w:b w:val="0"/>
+                <w:caps w:val="0"/>
+                <w:sz w:val="22"/>
+              </w:rPr>
+              <w:t>1–3–5</w:t>
+            </w:r>
+          </w:p>
+        </w:tc>
+      </w:tr>
+      <w:tr>
+        <w:tc>
+          <w:tcPr>
+            <w:tcW w:type="dxa" w:w="1768"/>
+          </w:tcPr>
+          <w:p>
+            <w:pPr>
+              <w:spacing w:line="240" w:lineRule="auto"/>
+            </w:pPr>
+            <w:r>
+              <w:rPr>
+                <w:rFonts w:ascii="Times New Roman" w:hAnsi="Times New Roman" w:eastAsia="Times New Roman"/>
+                <w:b w:val="0"/>
+                <w:caps w:val="0"/>
+                <w:sz w:val="22"/>
+              </w:rPr>
+              <w:t>Blob, me madhësinë</w:t>
+            </w:r>
+          </w:p>
+        </w:tc>
+        <w:tc>
+          <w:tcPr>
+            <w:tcW w:type="dxa" w:w="1768"/>
+          </w:tcPr>
+          <w:p>
+            <w:pPr>
+              <w:spacing w:line="240" w:lineRule="auto"/>
+            </w:pPr>
+            <w:r>
+              <w:rPr>
+                <w:rFonts w:ascii="Times New Roman" w:hAnsi="Times New Roman" w:eastAsia="Times New Roman"/>
+                <w:b w:val="0"/>
+                <w:caps w:val="0"/>
+                <w:sz w:val="22"/>
+              </w:rPr>
+              <w:t>WMC</w:t>
+            </w:r>
+          </w:p>
+        </w:tc>
+        <w:tc>
+          <w:tcPr>
+            <w:tcW w:type="dxa" w:w="1768"/>
+          </w:tcPr>
+          <w:p>
+            <w:pPr>
+              <w:spacing w:line="240" w:lineRule="auto"/>
+            </w:pPr>
+            <w:r>
+              <w:rPr>
+                <w:rFonts w:ascii="Times New Roman" w:hAnsi="Times New Roman" w:eastAsia="Times New Roman"/>
+                <w:b w:val="0"/>
+                <w:caps w:val="0"/>
+                <w:sz w:val="22"/>
+              </w:rPr>
+              <w:t>43–62–130</w:t>
+            </w:r>
+          </w:p>
+        </w:tc>
+        <w:tc>
+          <w:tcPr>
+            <w:tcW w:type="dxa" w:w="1768"/>
+          </w:tcPr>
+          <w:p>
+            <w:pPr>
+              <w:spacing w:line="240" w:lineRule="auto"/>
+            </w:pPr>
+            <w:r>
+              <w:rPr>
+                <w:rFonts w:ascii="Times New Roman" w:hAnsi="Times New Roman" w:eastAsia="Times New Roman"/>
+                <w:b w:val="0"/>
+                <w:caps w:val="0"/>
+                <w:sz w:val="22"/>
+              </w:rPr>
+              <w:t>6–12–21</w:t>
+            </w:r>
+          </w:p>
+        </w:tc>
+        <w:tc>
+          <w:tcPr>
+            <w:tcW w:type="dxa" w:w="1768"/>
+          </w:tcPr>
+          <w:p>
+            <w:pPr>
+              <w:spacing w:line="240" w:lineRule="auto"/>
+            </w:pPr>
+            <w:r>
+              <w:rPr>
+                <w:rFonts w:ascii="Times New Roman" w:hAnsi="Times New Roman" w:eastAsia="Times New Roman"/>
+                <w:b w:val="0"/>
+                <w:caps w:val="0"/>
+                <w:sz w:val="22"/>
+              </w:rPr>
+              <w:t>3–5–11</w:t>
+            </w:r>
+          </w:p>
+        </w:tc>
+      </w:tr>
+    </w:tbl>
+    <w:p>
+      <w:pPr>
+        <w:spacing w:line="240" w:lineRule="auto" w:after="0"/>
+      </w:pPr>
+    </w:p>
+    <w:p>
+      <w:pPr>
+        <w:spacing w:line="360" w:lineRule="auto"/>
+        <w:ind w:firstLine="360"/>
+        <w:jc w:val="both"/>
+      </w:pPr>
+      <w:r>
+        <w:rPr>
+          <w:rFonts w:ascii="Times New Roman" w:hAnsi="Times New Roman" w:eastAsia="Times New Roman"/>
+          <w:b w:val="0"/>
+          <w:caps w:val="0"/>
+          <w:sz w:val="24"/>
+        </w:rPr>
+        <w:t>Tabela lexohet vetëm në një drejtim. Klasa mesatare e humbur është shumë më afër një klase që rishikuesit e pastruan sesa një blob-i që strategjia e kapi. Shtrirjet madje nuk mbivendosen fare te kuartilet: tre të katërtat e mospërputhjeve rrinë nën çerekun më të vogël të klasave të kapura, te secila prej tri metrikave dhe te të dy variantet. Nga 315 mospërputhje të strategjisë së botuar, 65 nuk janë më të mëdha se klasa mesatare që vetë rishikuesit e quajtën të pastër.</w:t>
+      </w:r>
+    </w:p>
+    <w:p>
+      <w:pPr>
+        <w:spacing w:line="360" w:lineRule="auto"/>
+        <w:ind w:firstLine="360"/>
+        <w:jc w:val="both"/>
+      </w:pPr>
+      <w:r>
+        <w:rPr>
+          <w:rFonts w:ascii="Times New Roman" w:hAnsi="Times New Roman" w:eastAsia="Times New Roman"/>
+          <w:b w:val="0"/>
+          <w:caps w:val="0"/>
+          <w:sz w:val="24"/>
+        </w:rPr>
+        <w:t>Asnjë metrikë e vetme nuk e mban dot ndarjen. Për secilën metrikë klase u mat gjasa që një mospërputhje e marrë rastësisht të renditet mbi një klasë të pastër të marrë rastësisht, që është statistika e Mann-Whitney-t dhe lexohet si sipërfaqja nën kurbën ROC: 0.50 do të thotë asnjë informacion, 1.00 renditje e përsosur. Më e mira nga 17 metrikat e klasës është NOF me 0.773, e cila nuk mban dot as prag as klauzolë. Pra përmasa që mungon nuk gjendet mes atyre që ky sistem di të masë.</w:t>
+      </w:r>
+    </w:p>
+    <w:p>
+      <w:pPr>
+        <w:spacing w:line="360" w:lineRule="auto"/>
+        <w:ind w:firstLine="360"/>
+        <w:jc w:val="both"/>
+      </w:pPr>
+      <w:r>
+        <w:rPr>
+          <w:rFonts w:ascii="Times New Roman" w:hAnsi="Times New Roman" w:eastAsia="Times New Roman"/>
+          <w:b w:val="0"/>
+          <w:caps w:val="0"/>
+          <w:sz w:val="24"/>
+        </w:rPr>
+        <w:t>Kjo renditje përputhet me një matje krejt tjetër. Veçoritë që modeli i Qasjes B zgjodhi vetë për Blob-in, të raportuara te Nënkapitulli 5.2, ndajnë 3 nga katër vendet e para me renditjen sipas ndarjes: NOF, CLOC, NOAM. As TCC-ja dhe as WMC-ja, të dy kushtet mbi të cilat është ndërtuar strategjia e botuar, nuk hyjnë te asnjëra prej dy listave. Një statistikë renditëse dhe një model i trajnuar nuk janë e njëjta llogari, ndaj pajtimi i tyre është provë më shumë se përsëritje.</w:t>
+      </w:r>
+    </w:p>
+    <w:p>
+      <w:pPr>
+        <w:spacing w:line="240" w:lineRule="auto"/>
+        <w:jc w:val="center"/>
+      </w:pPr>
+      <w:r>
+        <w:rPr>
+          <w:rFonts w:ascii="Times New Roman" w:hAnsi="Times New Roman" w:eastAsia="Times New Roman"/>
+          <w:b w:val="0"/>
+          <w:caps w:val="0"/>
+          <w:sz w:val="22"/>
+        </w:rPr>
+        <w:t>Tabela 25. Recall-i sipas ashpërsisë që caktuan rishikuesit, agregim MAX</w:t>
+      </w:r>
+    </w:p>
+    <w:tbl>
+      <w:tblPr>
+        <w:tblStyle w:val="TableGrid"/>
+        <w:tblW w:type="auto" w:w="0"/>
+        <w:tblLook w:firstColumn="1" w:firstRow="1" w:lastColumn="0" w:lastRow="0" w:noHBand="0" w:noVBand="1" w:val="04A0"/>
+      </w:tblPr>
+      <w:tblGrid>
+        <w:gridCol w:w="1768"/>
+        <w:gridCol w:w="1768"/>
+        <w:gridCol w:w="1768"/>
+        <w:gridCol w:w="1768"/>
+        <w:gridCol w:w="1768"/>
+      </w:tblGrid>
+      <w:tr>
+        <w:tc>
+          <w:tcPr>
+            <w:tcW w:type="dxa" w:w="1768"/>
+          </w:tcPr>
+          <w:p>
+            <w:pPr>
+              <w:spacing w:line="240" w:lineRule="auto"/>
+            </w:pPr>
+            <w:r>
+              <w:rPr>
+                <w:rFonts w:ascii="Times New Roman" w:hAnsi="Times New Roman" w:eastAsia="Times New Roman"/>
+                <w:b/>
+                <w:caps w:val="0"/>
+                <w:sz w:val="22"/>
+              </w:rPr>
+              <w:t>Varianti</w:t>
+            </w:r>
+          </w:p>
+        </w:tc>
+        <w:tc>
+          <w:tcPr>
+            <w:tcW w:type="dxa" w:w="1768"/>
+          </w:tcPr>
+          <w:p>
+            <w:pPr>
+              <w:spacing w:line="240" w:lineRule="auto"/>
+            </w:pPr>
+            <w:r>
+              <w:rPr>
+                <w:rFonts w:ascii="Times New Roman" w:hAnsi="Times New Roman" w:eastAsia="Times New Roman"/>
+                <w:b/>
+                <w:caps w:val="0"/>
+                <w:sz w:val="22"/>
+              </w:rPr>
+              <w:t>Ashpërsia</w:t>
+            </w:r>
+          </w:p>
+        </w:tc>
+        <w:tc>
+          <w:tcPr>
+            <w:tcW w:type="dxa" w:w="1768"/>
+          </w:tcPr>
+          <w:p>
+            <w:pPr>
+              <w:spacing w:line="240" w:lineRule="auto"/>
+            </w:pPr>
+            <w:r>
+              <w:rPr>
+                <w:rFonts w:ascii="Times New Roman" w:hAnsi="Times New Roman" w:eastAsia="Times New Roman"/>
+                <w:b/>
+                <w:caps w:val="0"/>
+                <w:sz w:val="22"/>
+              </w:rPr>
+              <w:t>Mbështetja</w:t>
+            </w:r>
+          </w:p>
+        </w:tc>
+        <w:tc>
+          <w:tcPr>
+            <w:tcW w:type="dxa" w:w="1768"/>
+          </w:tcPr>
+          <w:p>
+            <w:pPr>
+              <w:spacing w:line="240" w:lineRule="auto"/>
+            </w:pPr>
+            <w:r>
+              <w:rPr>
+                <w:rFonts w:ascii="Times New Roman" w:hAnsi="Times New Roman" w:eastAsia="Times New Roman"/>
+                <w:b/>
+                <w:caps w:val="0"/>
+                <w:sz w:val="22"/>
+              </w:rPr>
+              <w:t>Të kapura</w:t>
+            </w:r>
+          </w:p>
+        </w:tc>
+        <w:tc>
+          <w:tcPr>
+            <w:tcW w:type="dxa" w:w="1768"/>
+          </w:tcPr>
+          <w:p>
+            <w:pPr>
+              <w:spacing w:line="240" w:lineRule="auto"/>
+            </w:pPr>
+            <w:r>
+              <w:rPr>
+                <w:rFonts w:ascii="Times New Roman" w:hAnsi="Times New Roman" w:eastAsia="Times New Roman"/>
+                <w:b/>
+                <w:caps w:val="0"/>
+                <w:sz w:val="22"/>
+              </w:rPr>
+              <w:t>Recall</w:t>
+            </w:r>
+          </w:p>
+        </w:tc>
+      </w:tr>
+      <w:tr>
+        <w:tc>
+          <w:tcPr>
+            <w:tcW w:type="dxa" w:w="1768"/>
+          </w:tcPr>
+          <w:p>
+            <w:pPr>
+              <w:spacing w:line="240" w:lineRule="auto"/>
+            </w:pPr>
+            <w:r>
+              <w:rPr>
+                <w:rFonts w:ascii="Times New Roman" w:hAnsi="Times New Roman" w:eastAsia="Times New Roman"/>
+                <w:b w:val="0"/>
+                <w:caps w:val="0"/>
+                <w:sz w:val="22"/>
+              </w:rPr>
+              <w:t>Blob, strategjia</w:t>
+            </w:r>
+          </w:p>
+        </w:tc>
+        <w:tc>
+          <w:tcPr>
+            <w:tcW w:type="dxa" w:w="1768"/>
+          </w:tcPr>
+          <w:p>
+            <w:pPr>
+              <w:spacing w:line="240" w:lineRule="auto"/>
+            </w:pPr>
+            <w:r>
+              <w:rPr>
+                <w:rFonts w:ascii="Times New Roman" w:hAnsi="Times New Roman" w:eastAsia="Times New Roman"/>
+                <w:b w:val="0"/>
+                <w:caps w:val="0"/>
+                <w:sz w:val="22"/>
+              </w:rPr>
+              <w:t>minor</w:t>
+            </w:r>
+          </w:p>
+        </w:tc>
+        <w:tc>
+          <w:tcPr>
+            <w:tcW w:type="dxa" w:w="1768"/>
+          </w:tcPr>
+          <w:p>
+            <w:pPr>
+              <w:spacing w:line="240" w:lineRule="auto"/>
+            </w:pPr>
+            <w:r>
+              <w:rPr>
+                <w:rFonts w:ascii="Times New Roman" w:hAnsi="Times New Roman" w:eastAsia="Times New Roman"/>
+                <w:b w:val="0"/>
+                <w:caps w:val="0"/>
+                <w:sz w:val="22"/>
+              </w:rPr>
+              <w:t>143</w:t>
+            </w:r>
+          </w:p>
+        </w:tc>
+        <w:tc>
+          <w:tcPr>
+            <w:tcW w:type="dxa" w:w="1768"/>
+          </w:tcPr>
+          <w:p>
+            <w:pPr>
+              <w:spacing w:line="240" w:lineRule="auto"/>
+            </w:pPr>
+            <w:r>
+              <w:rPr>
+                <w:rFonts w:ascii="Times New Roman" w:hAnsi="Times New Roman" w:eastAsia="Times New Roman"/>
+                <w:b w:val="0"/>
+                <w:caps w:val="0"/>
+                <w:sz w:val="22"/>
+              </w:rPr>
+              <w:t>1</w:t>
+            </w:r>
+          </w:p>
+        </w:tc>
+        <w:tc>
+          <w:tcPr>
+            <w:tcW w:type="dxa" w:w="1768"/>
+          </w:tcPr>
+          <w:p>
+            <w:pPr>
+              <w:spacing w:line="240" w:lineRule="auto"/>
+            </w:pPr>
+            <w:r>
+              <w:rPr>
+                <w:rFonts w:ascii="Times New Roman" w:hAnsi="Times New Roman" w:eastAsia="Times New Roman"/>
+                <w:b w:val="0"/>
+                <w:caps w:val="0"/>
+                <w:sz w:val="22"/>
+              </w:rPr>
+              <w:t>0.007</w:t>
+            </w:r>
+          </w:p>
+        </w:tc>
+      </w:tr>
+      <w:tr>
+        <w:tc>
+          <w:tcPr>
+            <w:tcW w:type="dxa" w:w="1768"/>
+          </w:tcPr>
+          <w:p>
+            <w:pPr>
+              <w:spacing w:line="240" w:lineRule="auto"/>
+            </w:pPr>
+            <w:r>
+              <w:rPr>
+                <w:rFonts w:ascii="Times New Roman" w:hAnsi="Times New Roman" w:eastAsia="Times New Roman"/>
+                <w:b w:val="0"/>
+                <w:caps w:val="0"/>
+                <w:sz w:val="22"/>
+              </w:rPr>
+              <w:t>Blob, strategjia</w:t>
+            </w:r>
+          </w:p>
+        </w:tc>
+        <w:tc>
+          <w:tcPr>
+            <w:tcW w:type="dxa" w:w="1768"/>
+          </w:tcPr>
+          <w:p>
+            <w:pPr>
+              <w:spacing w:line="240" w:lineRule="auto"/>
+            </w:pPr>
+            <w:r>
+              <w:rPr>
+                <w:rFonts w:ascii="Times New Roman" w:hAnsi="Times New Roman" w:eastAsia="Times New Roman"/>
+                <w:b w:val="0"/>
+                <w:caps w:val="0"/>
+                <w:sz w:val="22"/>
+              </w:rPr>
+              <w:t>major</w:t>
+            </w:r>
+          </w:p>
+        </w:tc>
+        <w:tc>
+          <w:tcPr>
+            <w:tcW w:type="dxa" w:w="1768"/>
+          </w:tcPr>
+          <w:p>
+            <w:pPr>
+              <w:spacing w:line="240" w:lineRule="auto"/>
+            </w:pPr>
+            <w:r>
+              <w:rPr>
+                <w:rFonts w:ascii="Times New Roman" w:hAnsi="Times New Roman" w:eastAsia="Times New Roman"/>
+                <w:b w:val="0"/>
+                <w:caps w:val="0"/>
+                <w:sz w:val="22"/>
+              </w:rPr>
+              <w:t>182</w:t>
+            </w:r>
+          </w:p>
+        </w:tc>
+        <w:tc>
+          <w:tcPr>
+            <w:tcW w:type="dxa" w:w="1768"/>
+          </w:tcPr>
+          <w:p>
+            <w:pPr>
+              <w:spacing w:line="240" w:lineRule="auto"/>
+            </w:pPr>
+            <w:r>
+              <w:rPr>
+                <w:rFonts w:ascii="Times New Roman" w:hAnsi="Times New Roman" w:eastAsia="Times New Roman"/>
+                <w:b w:val="0"/>
+                <w:caps w:val="0"/>
+                <w:sz w:val="22"/>
+              </w:rPr>
+              <w:t>13</w:t>
+            </w:r>
+          </w:p>
+        </w:tc>
+        <w:tc>
+          <w:tcPr>
+            <w:tcW w:type="dxa" w:w="1768"/>
+          </w:tcPr>
+          <w:p>
+            <w:pPr>
+              <w:spacing w:line="240" w:lineRule="auto"/>
+            </w:pPr>
+            <w:r>
+              <w:rPr>
+                <w:rFonts w:ascii="Times New Roman" w:hAnsi="Times New Roman" w:eastAsia="Times New Roman"/>
+                <w:b w:val="0"/>
+                <w:caps w:val="0"/>
+                <w:sz w:val="22"/>
+              </w:rPr>
+              <w:t>0.071</w:t>
+            </w:r>
+          </w:p>
+        </w:tc>
+      </w:tr>
+      <w:tr>
+        <w:tc>
+          <w:tcPr>
+            <w:tcW w:type="dxa" w:w="1768"/>
+          </w:tcPr>
+          <w:p>
+            <w:pPr>
+              <w:spacing w:line="240" w:lineRule="auto"/>
+            </w:pPr>
+            <w:r>
+              <w:rPr>
+                <w:rFonts w:ascii="Times New Roman" w:hAnsi="Times New Roman" w:eastAsia="Times New Roman"/>
+                <w:b w:val="0"/>
+                <w:caps w:val="0"/>
+                <w:sz w:val="22"/>
+              </w:rPr>
+              <w:t>Blob, strategjia</w:t>
+            </w:r>
+          </w:p>
+        </w:tc>
+        <w:tc>
+          <w:tcPr>
+            <w:tcW w:type="dxa" w:w="1768"/>
+          </w:tcPr>
+          <w:p>
+            <w:pPr>
+              <w:spacing w:line="240" w:lineRule="auto"/>
+            </w:pPr>
+            <w:r>
+              <w:rPr>
+                <w:rFonts w:ascii="Times New Roman" w:hAnsi="Times New Roman" w:eastAsia="Times New Roman"/>
+                <w:b w:val="0"/>
+                <w:caps w:val="0"/>
+                <w:sz w:val="22"/>
+              </w:rPr>
+              <w:t>critical</w:t>
+            </w:r>
+          </w:p>
+        </w:tc>
+        <w:tc>
+          <w:tcPr>
+            <w:tcW w:type="dxa" w:w="1768"/>
+          </w:tcPr>
+          <w:p>
+            <w:pPr>
+              <w:spacing w:line="240" w:lineRule="auto"/>
+            </w:pPr>
+            <w:r>
+              <w:rPr>
+                <w:rFonts w:ascii="Times New Roman" w:hAnsi="Times New Roman" w:eastAsia="Times New Roman"/>
+                <w:b w:val="0"/>
+                <w:caps w:val="0"/>
+                <w:sz w:val="22"/>
+              </w:rPr>
+              <w:t>132</w:t>
+            </w:r>
+          </w:p>
+        </w:tc>
+        <w:tc>
+          <w:tcPr>
+            <w:tcW w:type="dxa" w:w="1768"/>
+          </w:tcPr>
+          <w:p>
+            <w:pPr>
+              <w:spacing w:line="240" w:lineRule="auto"/>
+            </w:pPr>
+            <w:r>
+              <w:rPr>
+                <w:rFonts w:ascii="Times New Roman" w:hAnsi="Times New Roman" w:eastAsia="Times New Roman"/>
+                <w:b w:val="0"/>
+                <w:caps w:val="0"/>
+                <w:sz w:val="22"/>
+              </w:rPr>
+              <w:t>21</w:t>
+            </w:r>
+          </w:p>
+        </w:tc>
+        <w:tc>
+          <w:tcPr>
+            <w:tcW w:type="dxa" w:w="1768"/>
+          </w:tcPr>
+          <w:p>
+            <w:pPr>
+              <w:spacing w:line="240" w:lineRule="auto"/>
+            </w:pPr>
+            <w:r>
+              <w:rPr>
+                <w:rFonts w:ascii="Times New Roman" w:hAnsi="Times New Roman" w:eastAsia="Times New Roman"/>
+                <w:b w:val="0"/>
+                <w:caps w:val="0"/>
+                <w:sz w:val="22"/>
+              </w:rPr>
+              <w:t>0.159</w:t>
+            </w:r>
+          </w:p>
+        </w:tc>
+      </w:tr>
+      <w:tr>
+        <w:tc>
+          <w:tcPr>
+            <w:tcW w:type="dxa" w:w="1768"/>
+          </w:tcPr>
+          <w:p>
+            <w:pPr>
+              <w:spacing w:line="240" w:lineRule="auto"/>
+            </w:pPr>
+            <w:r>
+              <w:rPr>
+                <w:rFonts w:ascii="Times New Roman" w:hAnsi="Times New Roman" w:eastAsia="Times New Roman"/>
+                <w:b w:val="0"/>
+                <w:caps w:val="0"/>
+                <w:sz w:val="22"/>
+              </w:rPr>
+              <w:t>Blob, me madhësinë</w:t>
+            </w:r>
+          </w:p>
+        </w:tc>
+        <w:tc>
+          <w:tcPr>
+            <w:tcW w:type="dxa" w:w="1768"/>
+          </w:tcPr>
+          <w:p>
+            <w:pPr>
+              <w:spacing w:line="240" w:lineRule="auto"/>
+            </w:pPr>
+            <w:r>
+              <w:rPr>
+                <w:rFonts w:ascii="Times New Roman" w:hAnsi="Times New Roman" w:eastAsia="Times New Roman"/>
+                <w:b w:val="0"/>
+                <w:caps w:val="0"/>
+                <w:sz w:val="22"/>
+              </w:rPr>
+              <w:t>minor</w:t>
+            </w:r>
+          </w:p>
+        </w:tc>
+        <w:tc>
+          <w:tcPr>
+            <w:tcW w:type="dxa" w:w="1768"/>
+          </w:tcPr>
+          <w:p>
+            <w:pPr>
+              <w:spacing w:line="240" w:lineRule="auto"/>
+            </w:pPr>
+            <w:r>
+              <w:rPr>
+                <w:rFonts w:ascii="Times New Roman" w:hAnsi="Times New Roman" w:eastAsia="Times New Roman"/>
+                <w:b w:val="0"/>
+                <w:caps w:val="0"/>
+                <w:sz w:val="22"/>
+              </w:rPr>
+              <w:t>143</w:t>
+            </w:r>
+          </w:p>
+        </w:tc>
+        <w:tc>
+          <w:tcPr>
+            <w:tcW w:type="dxa" w:w="1768"/>
+          </w:tcPr>
+          <w:p>
+            <w:pPr>
+              <w:spacing w:line="240" w:lineRule="auto"/>
+            </w:pPr>
+            <w:r>
+              <w:rPr>
+                <w:rFonts w:ascii="Times New Roman" w:hAnsi="Times New Roman" w:eastAsia="Times New Roman"/>
+                <w:b w:val="0"/>
+                <w:caps w:val="0"/>
+                <w:sz w:val="22"/>
+              </w:rPr>
+              <w:t>5</w:t>
+            </w:r>
+          </w:p>
+        </w:tc>
+        <w:tc>
+          <w:tcPr>
+            <w:tcW w:type="dxa" w:w="1768"/>
+          </w:tcPr>
+          <w:p>
+            <w:pPr>
+              <w:spacing w:line="240" w:lineRule="auto"/>
+            </w:pPr>
+            <w:r>
+              <w:rPr>
+                <w:rFonts w:ascii="Times New Roman" w:hAnsi="Times New Roman" w:eastAsia="Times New Roman"/>
+                <w:b w:val="0"/>
+                <w:caps w:val="0"/>
+                <w:sz w:val="22"/>
+              </w:rPr>
+              <w:t>0.035</w:t>
+            </w:r>
+          </w:p>
+        </w:tc>
+      </w:tr>
+      <w:tr>
+        <w:tc>
+          <w:tcPr>
+            <w:tcW w:type="dxa" w:w="1768"/>
+          </w:tcPr>
+          <w:p>
+            <w:pPr>
+              <w:spacing w:line="240" w:lineRule="auto"/>
+            </w:pPr>
+            <w:r>
+              <w:rPr>
+                <w:rFonts w:ascii="Times New Roman" w:hAnsi="Times New Roman" w:eastAsia="Times New Roman"/>
+                <w:b w:val="0"/>
+                <w:caps w:val="0"/>
+                <w:sz w:val="22"/>
+              </w:rPr>
+              <w:t>Blob, me madhësinë</w:t>
+            </w:r>
+          </w:p>
+        </w:tc>
+        <w:tc>
+          <w:tcPr>
+            <w:tcW w:type="dxa" w:w="1768"/>
+          </w:tcPr>
+          <w:p>
+            <w:pPr>
+              <w:spacing w:line="240" w:lineRule="auto"/>
+            </w:pPr>
+            <w:r>
+              <w:rPr>
+                <w:rFonts w:ascii="Times New Roman" w:hAnsi="Times New Roman" w:eastAsia="Times New Roman"/>
+                <w:b w:val="0"/>
+                <w:caps w:val="0"/>
+                <w:sz w:val="22"/>
+              </w:rPr>
+              <w:t>major</w:t>
+            </w:r>
+          </w:p>
+        </w:tc>
+        <w:tc>
+          <w:tcPr>
+            <w:tcW w:type="dxa" w:w="1768"/>
+          </w:tcPr>
+          <w:p>
+            <w:pPr>
+              <w:spacing w:line="240" w:lineRule="auto"/>
+            </w:pPr>
+            <w:r>
+              <w:rPr>
+                <w:rFonts w:ascii="Times New Roman" w:hAnsi="Times New Roman" w:eastAsia="Times New Roman"/>
+                <w:b w:val="0"/>
+                <w:caps w:val="0"/>
+                <w:sz w:val="22"/>
+              </w:rPr>
+              <w:t>182</w:t>
+            </w:r>
+          </w:p>
+        </w:tc>
+        <w:tc>
+          <w:tcPr>
+            <w:tcW w:type="dxa" w:w="1768"/>
+          </w:tcPr>
+          <w:p>
+            <w:pPr>
+              <w:spacing w:line="240" w:lineRule="auto"/>
+            </w:pPr>
+            <w:r>
+              <w:rPr>
+                <w:rFonts w:ascii="Times New Roman" w:hAnsi="Times New Roman" w:eastAsia="Times New Roman"/>
+                <w:b w:val="0"/>
+                <w:caps w:val="0"/>
+                <w:sz w:val="22"/>
+              </w:rPr>
+              <w:t>32</w:t>
+            </w:r>
+          </w:p>
+        </w:tc>
+        <w:tc>
+          <w:tcPr>
+            <w:tcW w:type="dxa" w:w="1768"/>
+          </w:tcPr>
+          <w:p>
+            <w:pPr>
+              <w:spacing w:line="240" w:lineRule="auto"/>
+            </w:pPr>
+            <w:r>
+              <w:rPr>
+                <w:rFonts w:ascii="Times New Roman" w:hAnsi="Times New Roman" w:eastAsia="Times New Roman"/>
+                <w:b w:val="0"/>
+                <w:caps w:val="0"/>
+                <w:sz w:val="22"/>
+              </w:rPr>
+              <w:t>0.176</w:t>
+            </w:r>
+          </w:p>
+        </w:tc>
+      </w:tr>
+      <w:tr>
+        <w:tc>
+          <w:tcPr>
+            <w:tcW w:type="dxa" w:w="1768"/>
+          </w:tcPr>
+          <w:p>
+            <w:pPr>
+              <w:spacing w:line="240" w:lineRule="auto"/>
+            </w:pPr>
+            <w:r>
+              <w:rPr>
+                <w:rFonts w:ascii="Times New Roman" w:hAnsi="Times New Roman" w:eastAsia="Times New Roman"/>
+                <w:b w:val="0"/>
+                <w:caps w:val="0"/>
+                <w:sz w:val="22"/>
+              </w:rPr>
+              <w:t>Blob, me madhësinë</w:t>
+            </w:r>
+          </w:p>
+        </w:tc>
+        <w:tc>
+          <w:tcPr>
+            <w:tcW w:type="dxa" w:w="1768"/>
+          </w:tcPr>
+          <w:p>
+            <w:pPr>
+              <w:spacing w:line="240" w:lineRule="auto"/>
+            </w:pPr>
+            <w:r>
+              <w:rPr>
+                <w:rFonts w:ascii="Times New Roman" w:hAnsi="Times New Roman" w:eastAsia="Times New Roman"/>
+                <w:b w:val="0"/>
+                <w:caps w:val="0"/>
+                <w:sz w:val="22"/>
+              </w:rPr>
+              <w:t>critical</w:t>
+            </w:r>
+          </w:p>
+        </w:tc>
+        <w:tc>
+          <w:tcPr>
+            <w:tcW w:type="dxa" w:w="1768"/>
+          </w:tcPr>
+          <w:p>
+            <w:pPr>
+              <w:spacing w:line="240" w:lineRule="auto"/>
+            </w:pPr>
+            <w:r>
+              <w:rPr>
+                <w:rFonts w:ascii="Times New Roman" w:hAnsi="Times New Roman" w:eastAsia="Times New Roman"/>
+                <w:b w:val="0"/>
+                <w:caps w:val="0"/>
+                <w:sz w:val="22"/>
+              </w:rPr>
+              <w:t>132</w:t>
+            </w:r>
+          </w:p>
+        </w:tc>
+        <w:tc>
+          <w:tcPr>
+            <w:tcW w:type="dxa" w:w="1768"/>
+          </w:tcPr>
+          <w:p>
+            <w:pPr>
+              <w:spacing w:line="240" w:lineRule="auto"/>
+            </w:pPr>
+            <w:r>
+              <w:rPr>
+                <w:rFonts w:ascii="Times New Roman" w:hAnsi="Times New Roman" w:eastAsia="Times New Roman"/>
+                <w:b w:val="0"/>
+                <w:caps w:val="0"/>
+                <w:sz w:val="22"/>
+              </w:rPr>
+              <w:t>55</w:t>
+            </w:r>
+          </w:p>
+        </w:tc>
+        <w:tc>
+          <w:tcPr>
+            <w:tcW w:type="dxa" w:w="1768"/>
+          </w:tcPr>
+          <w:p>
+            <w:pPr>
+              <w:spacing w:line="240" w:lineRule="auto"/>
+            </w:pPr>
+            <w:r>
+              <w:rPr>
+                <w:rFonts w:ascii="Times New Roman" w:hAnsi="Times New Roman" w:eastAsia="Times New Roman"/>
+                <w:b w:val="0"/>
+                <w:caps w:val="0"/>
+                <w:sz w:val="22"/>
+              </w:rPr>
+              <w:t>0.417</w:t>
+            </w:r>
+          </w:p>
+        </w:tc>
+      </w:tr>
+    </w:tbl>
+    <w:p>
+      <w:pPr>
+        <w:spacing w:line="240" w:lineRule="auto" w:after="0"/>
+      </w:pPr>
+    </w:p>
+    <w:p>
+      <w:pPr>
+        <w:spacing w:line="360" w:lineRule="auto"/>
+        <w:ind w:firstLine="360"/>
+        <w:jc w:val="both"/>
+      </w:pPr>
+      <w:r>
+        <w:rPr>
+          <w:rFonts w:ascii="Times New Roman" w:hAnsi="Times New Roman" w:eastAsia="Times New Roman"/>
+          <w:b w:val="0"/>
+          <w:caps w:val="0"/>
+          <w:sz w:val="24"/>
+        </w:rPr>
+        <w:t>Agregimi këtu është MAX e jo mesatarja e përdorur gjetiu, dhe zgjedhja është e qëllimshme. Gjashtë rishikues prej të cilëve katër thonë «asnjë» e tërheqin mesataren te «minor» pothuajse pavarësisht se çfarë thanë dy të tjerët, ndaj nën mesatare skaji i rëndë i shkallës mbetet bosh dhe gradienti nuk shihet dot. Nën MAX etiketat e ruajnë shtrirjen.</w:t>
+      </w:r>
+    </w:p>
+    <w:p>
+      <w:pPr>
+        <w:spacing w:line="360" w:lineRule="auto"/>
+        <w:ind w:firstLine="360"/>
+        <w:jc w:val="both"/>
+      </w:pPr>
+      <w:r>
+        <w:rPr>
+          <w:rFonts w:ascii="Times New Roman" w:hAnsi="Times New Roman" w:eastAsia="Times New Roman"/>
+          <w:b w:val="0"/>
+          <w:caps w:val="0"/>
+          <w:sz w:val="24"/>
+        </w:rPr>
+        <w:t>Te strategjia e botuar recall-i ngjitet nga 0.007 te rastet që vetëm një rishikues i quajti të lehta, në 0.159 te ato që dikush i quajti kritike, pra rreth 23 herë më i lartë. Mospërputhja nuk është e rastësishme: strategjia nuk pajton me rishikuesit pikërisht atje ku rishikuesit vetë ishin më pak të bindur.</w:t>
+      </w:r>
+    </w:p>
+    <w:p>
+      <w:pPr>
+        <w:spacing w:line="360" w:lineRule="auto"/>
+        <w:ind w:firstLine="360"/>
+        <w:jc w:val="both"/>
+      </w:pPr>
+      <w:r>
+        <w:rPr>
+          <w:rFonts w:ascii="Times New Roman" w:hAnsi="Times New Roman" w:eastAsia="Times New Roman"/>
+          <w:b w:val="0"/>
+          <w:caps w:val="0"/>
+          <w:sz w:val="24"/>
+        </w:rPr>
+        <w:t xml:space="preserve">Një pjesë e vogël e mospërputhjeve ka shkak krejt tjetër, dhe është e vetmja pjesë ku faji bie mbi matjen e jo mbi etiketat. TCC-ja e Bieman &amp; Kang-ut (1995) mat pjesën e çifteve të metodave publike të instancës që ndajnë një fushë. Një klasë me më pak se dy metoda të tilla nuk ka çift fare, ndaj metrika është e papërcaktuar dhe llogaritësi e zgjidh boshllëkun nga ana e «plotësisht kohezive», domethënë 1.0. Çdo klauzolë e God Class-it e kërkon TCC-në </w:t>
+      </w:r>
+      <w:r>
+        <w:rPr>
+          <w:rFonts w:ascii="Times New Roman" w:hAnsi="Times New Roman" w:eastAsia="Times New Roman"/>
+          <w:b/>
+          <w:caps w:val="0"/>
+          <w:sz w:val="24"/>
+        </w:rPr>
+        <w:t>nën</w:t>
+      </w:r>
+      <w:r>
+        <w:rPr>
+          <w:rFonts w:ascii="Times New Roman" w:hAnsi="Times New Roman" w:eastAsia="Times New Roman"/>
+          <w:b w:val="0"/>
+          <w:caps w:val="0"/>
+          <w:sz w:val="24"/>
+        </w:rPr>
+        <w:t xml:space="preserve"> një prag, ndaj një klasë që mbart atë vlerë mbetet jashtë mundësive të strategjisë sado të zhvendosen pragjet.</w:t>
+      </w:r>
+    </w:p>
+    <w:p>
+      <w:pPr>
+        <w:spacing w:line="240" w:lineRule="auto"/>
+        <w:jc w:val="center"/>
+      </w:pPr>
+      <w:r>
+        <w:rPr>
+          <w:rFonts w:ascii="Times New Roman" w:hAnsi="Times New Roman" w:eastAsia="Times New Roman"/>
+          <w:b w:val="0"/>
+          <w:caps w:val="0"/>
+          <w:sz w:val="22"/>
+        </w:rPr>
+        <w:t>Tabela 26. Klasat që klauzola e kohezionit nuk i arrin dot</w:t>
+      </w:r>
+    </w:p>
+    <w:tbl>
+      <w:tblPr>
+        <w:tblStyle w:val="TableGrid"/>
+        <w:tblW w:type="auto" w:w="0"/>
+        <w:tblLook w:firstColumn="1" w:firstRow="1" w:lastColumn="0" w:lastRow="0" w:noHBand="0" w:noVBand="1" w:val="04A0"/>
+      </w:tblPr>
+      <w:tblGrid>
+        <w:gridCol w:w="1768"/>
+        <w:gridCol w:w="1768"/>
+        <w:gridCol w:w="1768"/>
+        <w:gridCol w:w="1768"/>
+        <w:gridCol w:w="1768"/>
+      </w:tblGrid>
+      <w:tr>
+        <w:tc>
+          <w:tcPr>
+            <w:tcW w:type="dxa" w:w="1768"/>
+          </w:tcPr>
+          <w:p>
+            <w:pPr>
+              <w:spacing w:line="240" w:lineRule="auto"/>
+            </w:pPr>
+            <w:r>
+              <w:rPr>
+                <w:rFonts w:ascii="Times New Roman" w:hAnsi="Times New Roman" w:eastAsia="Times New Roman"/>
+                <w:b/>
+                <w:caps w:val="0"/>
+                <w:sz w:val="22"/>
+              </w:rPr>
+              <w:t>Klasa</w:t>
+            </w:r>
+          </w:p>
+        </w:tc>
+        <w:tc>
+          <w:tcPr>
+            <w:tcW w:type="dxa" w:w="1768"/>
+          </w:tcPr>
+          <w:p>
+            <w:pPr>
+              <w:spacing w:line="240" w:lineRule="auto"/>
+            </w:pPr>
+            <w:r>
+              <w:rPr>
+                <w:rFonts w:ascii="Times New Roman" w:hAnsi="Times New Roman" w:eastAsia="Times New Roman"/>
+                <w:b/>
+                <w:caps w:val="0"/>
+                <w:sz w:val="22"/>
+              </w:rPr>
+              <w:t>CLOC</w:t>
+            </w:r>
+          </w:p>
+        </w:tc>
+        <w:tc>
+          <w:tcPr>
+            <w:tcW w:type="dxa" w:w="1768"/>
+          </w:tcPr>
+          <w:p>
+            <w:pPr>
+              <w:spacing w:line="240" w:lineRule="auto"/>
+            </w:pPr>
+            <w:r>
+              <w:rPr>
+                <w:rFonts w:ascii="Times New Roman" w:hAnsi="Times New Roman" w:eastAsia="Times New Roman"/>
+                <w:b/>
+                <w:caps w:val="0"/>
+                <w:sz w:val="22"/>
+              </w:rPr>
+              <w:t>NOM</w:t>
+            </w:r>
+          </w:p>
+        </w:tc>
+        <w:tc>
+          <w:tcPr>
+            <w:tcW w:type="dxa" w:w="1768"/>
+          </w:tcPr>
+          <w:p>
+            <w:pPr>
+              <w:spacing w:line="240" w:lineRule="auto"/>
+            </w:pPr>
+            <w:r>
+              <w:rPr>
+                <w:rFonts w:ascii="Times New Roman" w:hAnsi="Times New Roman" w:eastAsia="Times New Roman"/>
+                <w:b/>
+                <w:caps w:val="0"/>
+                <w:sz w:val="22"/>
+              </w:rPr>
+              <w:t>WMC</w:t>
+            </w:r>
+          </w:p>
+        </w:tc>
+        <w:tc>
+          <w:tcPr>
+            <w:tcW w:type="dxa" w:w="1768"/>
+          </w:tcPr>
+          <w:p>
+            <w:pPr>
+              <w:spacing w:line="240" w:lineRule="auto"/>
+            </w:pPr>
+            <w:r>
+              <w:rPr>
+                <w:rFonts w:ascii="Times New Roman" w:hAnsi="Times New Roman" w:eastAsia="Times New Roman"/>
+                <w:b/>
+                <w:caps w:val="0"/>
+                <w:sz w:val="22"/>
+              </w:rPr>
+              <w:t>Metoda publike instance</w:t>
+            </w:r>
+          </w:p>
+        </w:tc>
+      </w:tr>
+      <w:tr>
+        <w:tc>
+          <w:tcPr>
+            <w:tcW w:type="dxa" w:w="1768"/>
+          </w:tcPr>
+          <w:p>
+            <w:pPr>
+              <w:spacing w:line="240" w:lineRule="auto"/>
+            </w:pPr>
+            <w:r>
+              <w:rPr>
+                <w:rFonts w:ascii="Times New Roman" w:hAnsi="Times New Roman" w:eastAsia="Times New Roman"/>
+                <w:b w:val="0"/>
+                <w:caps w:val="0"/>
+                <w:sz w:val="22"/>
+              </w:rPr>
+              <w:t>FormatParser</w:t>
+            </w:r>
+          </w:p>
+        </w:tc>
+        <w:tc>
+          <w:tcPr>
+            <w:tcW w:type="dxa" w:w="1768"/>
+          </w:tcPr>
+          <w:p>
+            <w:pPr>
+              <w:spacing w:line="240" w:lineRule="auto"/>
+            </w:pPr>
+            <w:r>
+              <w:rPr>
+                <w:rFonts w:ascii="Times New Roman" w:hAnsi="Times New Roman" w:eastAsia="Times New Roman"/>
+                <w:b w:val="0"/>
+                <w:caps w:val="0"/>
+                <w:sz w:val="22"/>
+              </w:rPr>
+              <w:t>968</w:t>
+            </w:r>
+          </w:p>
+        </w:tc>
+        <w:tc>
+          <w:tcPr>
+            <w:tcW w:type="dxa" w:w="1768"/>
+          </w:tcPr>
+          <w:p>
+            <w:pPr>
+              <w:spacing w:line="240" w:lineRule="auto"/>
+            </w:pPr>
+            <w:r>
+              <w:rPr>
+                <w:rFonts w:ascii="Times New Roman" w:hAnsi="Times New Roman" w:eastAsia="Times New Roman"/>
+                <w:b w:val="0"/>
+                <w:caps w:val="0"/>
+                <w:sz w:val="22"/>
+              </w:rPr>
+              <w:t>22</w:t>
+            </w:r>
+          </w:p>
+        </w:tc>
+        <w:tc>
+          <w:tcPr>
+            <w:tcW w:type="dxa" w:w="1768"/>
+          </w:tcPr>
+          <w:p>
+            <w:pPr>
+              <w:spacing w:line="240" w:lineRule="auto"/>
+            </w:pPr>
+            <w:r>
+              <w:rPr>
+                <w:rFonts w:ascii="Times New Roman" w:hAnsi="Times New Roman" w:eastAsia="Times New Roman"/>
+                <w:b w:val="0"/>
+                <w:caps w:val="0"/>
+                <w:sz w:val="22"/>
+              </w:rPr>
+              <w:t>529</w:t>
+            </w:r>
+          </w:p>
+        </w:tc>
+        <w:tc>
+          <w:tcPr>
+            <w:tcW w:type="dxa" w:w="1768"/>
+          </w:tcPr>
+          <w:p>
+            <w:pPr>
+              <w:spacing w:line="240" w:lineRule="auto"/>
+            </w:pPr>
+            <w:r>
+              <w:rPr>
+                <w:rFonts w:ascii="Times New Roman" w:hAnsi="Times New Roman" w:eastAsia="Times New Roman"/>
+                <w:b w:val="0"/>
+                <w:caps w:val="0"/>
+                <w:sz w:val="22"/>
+              </w:rPr>
+              <w:t>0</w:t>
+            </w:r>
+          </w:p>
+        </w:tc>
+      </w:tr>
+      <w:tr>
+        <w:tc>
+          <w:tcPr>
+            <w:tcW w:type="dxa" w:w="1768"/>
+          </w:tcPr>
+          <w:p>
+            <w:pPr>
+              <w:spacing w:line="240" w:lineRule="auto"/>
+            </w:pPr>
+            <w:r>
+              <w:rPr>
+                <w:rFonts w:ascii="Times New Roman" w:hAnsi="Times New Roman" w:eastAsia="Times New Roman"/>
+                <w:b w:val="0"/>
+                <w:caps w:val="0"/>
+                <w:sz w:val="22"/>
+              </w:rPr>
+              <w:t>GenericsUtils</w:t>
+            </w:r>
+          </w:p>
+        </w:tc>
+        <w:tc>
+          <w:tcPr>
+            <w:tcW w:type="dxa" w:w="1768"/>
+          </w:tcPr>
+          <w:p>
+            <w:pPr>
+              <w:spacing w:line="240" w:lineRule="auto"/>
+            </w:pPr>
+            <w:r>
+              <w:rPr>
+                <w:rFonts w:ascii="Times New Roman" w:hAnsi="Times New Roman" w:eastAsia="Times New Roman"/>
+                <w:b w:val="0"/>
+                <w:caps w:val="0"/>
+                <w:sz w:val="22"/>
+              </w:rPr>
+              <w:t>540</w:t>
+            </w:r>
+          </w:p>
+        </w:tc>
+        <w:tc>
+          <w:tcPr>
+            <w:tcW w:type="dxa" w:w="1768"/>
+          </w:tcPr>
+          <w:p>
+            <w:pPr>
+              <w:spacing w:line="240" w:lineRule="auto"/>
+            </w:pPr>
+            <w:r>
+              <w:rPr>
+                <w:rFonts w:ascii="Times New Roman" w:hAnsi="Times New Roman" w:eastAsia="Times New Roman"/>
+                <w:b w:val="0"/>
+                <w:caps w:val="0"/>
+                <w:sz w:val="22"/>
+              </w:rPr>
+              <w:t>46</w:t>
+            </w:r>
+          </w:p>
+        </w:tc>
+        <w:tc>
+          <w:tcPr>
+            <w:tcW w:type="dxa" w:w="1768"/>
+          </w:tcPr>
+          <w:p>
+            <w:pPr>
+              <w:spacing w:line="240" w:lineRule="auto"/>
+            </w:pPr>
+            <w:r>
+              <w:rPr>
+                <w:rFonts w:ascii="Times New Roman" w:hAnsi="Times New Roman" w:eastAsia="Times New Roman"/>
+                <w:b w:val="0"/>
+                <w:caps w:val="0"/>
+                <w:sz w:val="22"/>
+              </w:rPr>
+              <w:t>220</w:t>
+            </w:r>
+          </w:p>
+        </w:tc>
+        <w:tc>
+          <w:tcPr>
+            <w:tcW w:type="dxa" w:w="1768"/>
+          </w:tcPr>
+          <w:p>
+            <w:pPr>
+              <w:spacing w:line="240" w:lineRule="auto"/>
+            </w:pPr>
+            <w:r>
+              <w:rPr>
+                <w:rFonts w:ascii="Times New Roman" w:hAnsi="Times New Roman" w:eastAsia="Times New Roman"/>
+                <w:b w:val="0"/>
+                <w:caps w:val="0"/>
+                <w:sz w:val="22"/>
+              </w:rPr>
+              <w:t>0</w:t>
+            </w:r>
+          </w:p>
+        </w:tc>
+      </w:tr>
+      <w:tr>
+        <w:tc>
+          <w:tcPr>
+            <w:tcW w:type="dxa" w:w="1768"/>
+          </w:tcPr>
+          <w:p>
+            <w:pPr>
+              <w:spacing w:line="240" w:lineRule="auto"/>
+            </w:pPr>
+            <w:r>
+              <w:rPr>
+                <w:rFonts w:ascii="Times New Roman" w:hAnsi="Times New Roman" w:eastAsia="Times New Roman"/>
+                <w:b w:val="0"/>
+                <w:caps w:val="0"/>
+                <w:sz w:val="22"/>
+              </w:rPr>
+              <w:t>PipelineOptionsFactory</w:t>
+            </w:r>
+          </w:p>
+        </w:tc>
+        <w:tc>
+          <w:tcPr>
+            <w:tcW w:type="dxa" w:w="1768"/>
+          </w:tcPr>
+          <w:p>
+            <w:pPr>
+              <w:spacing w:line="240" w:lineRule="auto"/>
+            </w:pPr>
+            <w:r>
+              <w:rPr>
+                <w:rFonts w:ascii="Times New Roman" w:hAnsi="Times New Roman" w:eastAsia="Times New Roman"/>
+                <w:b w:val="0"/>
+                <w:caps w:val="0"/>
+                <w:sz w:val="22"/>
+              </w:rPr>
+              <w:t>1031</w:t>
+            </w:r>
+          </w:p>
+        </w:tc>
+        <w:tc>
+          <w:tcPr>
+            <w:tcW w:type="dxa" w:w="1768"/>
+          </w:tcPr>
+          <w:p>
+            <w:pPr>
+              <w:spacing w:line="240" w:lineRule="auto"/>
+            </w:pPr>
+            <w:r>
+              <w:rPr>
+                <w:rFonts w:ascii="Times New Roman" w:hAnsi="Times New Roman" w:eastAsia="Times New Roman"/>
+                <w:b w:val="0"/>
+                <w:caps w:val="0"/>
+                <w:sz w:val="22"/>
+              </w:rPr>
+              <w:t>39</w:t>
+            </w:r>
+          </w:p>
+        </w:tc>
+        <w:tc>
+          <w:tcPr>
+            <w:tcW w:type="dxa" w:w="1768"/>
+          </w:tcPr>
+          <w:p>
+            <w:pPr>
+              <w:spacing w:line="240" w:lineRule="auto"/>
+            </w:pPr>
+            <w:r>
+              <w:rPr>
+                <w:rFonts w:ascii="Times New Roman" w:hAnsi="Times New Roman" w:eastAsia="Times New Roman"/>
+                <w:b w:val="0"/>
+                <w:caps w:val="0"/>
+                <w:sz w:val="22"/>
+              </w:rPr>
+              <w:t>189</w:t>
+            </w:r>
+          </w:p>
+        </w:tc>
+        <w:tc>
+          <w:tcPr>
+            <w:tcW w:type="dxa" w:w="1768"/>
+          </w:tcPr>
+          <w:p>
+            <w:pPr>
+              <w:spacing w:line="240" w:lineRule="auto"/>
+            </w:pPr>
+            <w:r>
+              <w:rPr>
+                <w:rFonts w:ascii="Times New Roman" w:hAnsi="Times New Roman" w:eastAsia="Times New Roman"/>
+                <w:b w:val="0"/>
+                <w:caps w:val="0"/>
+                <w:sz w:val="22"/>
+              </w:rPr>
+              <w:t>1</w:t>
+            </w:r>
+          </w:p>
+        </w:tc>
+      </w:tr>
+      <w:tr>
+        <w:tc>
+          <w:tcPr>
+            <w:tcW w:type="dxa" w:w="1768"/>
+          </w:tcPr>
+          <w:p>
+            <w:pPr>
+              <w:spacing w:line="240" w:lineRule="auto"/>
+            </w:pPr>
+            <w:r>
+              <w:rPr>
+                <w:rFonts w:ascii="Times New Roman" w:hAnsi="Times New Roman" w:eastAsia="Times New Roman"/>
+                <w:b w:val="0"/>
+                <w:caps w:val="0"/>
+                <w:sz w:val="22"/>
+              </w:rPr>
+              <w:t>BaseScriptEvalUtil</w:t>
+            </w:r>
+          </w:p>
+        </w:tc>
+        <w:tc>
+          <w:tcPr>
+            <w:tcW w:type="dxa" w:w="1768"/>
+          </w:tcPr>
+          <w:p>
+            <w:pPr>
+              <w:spacing w:line="240" w:lineRule="auto"/>
+            </w:pPr>
+            <w:r>
+              <w:rPr>
+                <w:rFonts w:ascii="Times New Roman" w:hAnsi="Times New Roman" w:eastAsia="Times New Roman"/>
+                <w:b w:val="0"/>
+                <w:caps w:val="0"/>
+                <w:sz w:val="22"/>
+              </w:rPr>
+              <w:t>593</w:t>
+            </w:r>
+          </w:p>
+        </w:tc>
+        <w:tc>
+          <w:tcPr>
+            <w:tcW w:type="dxa" w:w="1768"/>
+          </w:tcPr>
+          <w:p>
+            <w:pPr>
+              <w:spacing w:line="240" w:lineRule="auto"/>
+            </w:pPr>
+            <w:r>
+              <w:rPr>
+                <w:rFonts w:ascii="Times New Roman" w:hAnsi="Times New Roman" w:eastAsia="Times New Roman"/>
+                <w:b w:val="0"/>
+                <w:caps w:val="0"/>
+                <w:sz w:val="22"/>
+              </w:rPr>
+              <w:t>21</w:t>
+            </w:r>
+          </w:p>
+        </w:tc>
+        <w:tc>
+          <w:tcPr>
+            <w:tcW w:type="dxa" w:w="1768"/>
+          </w:tcPr>
+          <w:p>
+            <w:pPr>
+              <w:spacing w:line="240" w:lineRule="auto"/>
+            </w:pPr>
+            <w:r>
+              <w:rPr>
+                <w:rFonts w:ascii="Times New Roman" w:hAnsi="Times New Roman" w:eastAsia="Times New Roman"/>
+                <w:b w:val="0"/>
+                <w:caps w:val="0"/>
+                <w:sz w:val="22"/>
+              </w:rPr>
+              <w:t>177</w:t>
+            </w:r>
+          </w:p>
+        </w:tc>
+        <w:tc>
+          <w:tcPr>
+            <w:tcW w:type="dxa" w:w="1768"/>
+          </w:tcPr>
+          <w:p>
+            <w:pPr>
+              <w:spacing w:line="240" w:lineRule="auto"/>
+            </w:pPr>
+            <w:r>
+              <w:rPr>
+                <w:rFonts w:ascii="Times New Roman" w:hAnsi="Times New Roman" w:eastAsia="Times New Roman"/>
+                <w:b w:val="0"/>
+                <w:caps w:val="0"/>
+                <w:sz w:val="22"/>
+              </w:rPr>
+              <w:t>0</w:t>
+            </w:r>
+          </w:p>
+        </w:tc>
+      </w:tr>
+      <w:tr>
+        <w:tc>
+          <w:tcPr>
+            <w:tcW w:type="dxa" w:w="1768"/>
+          </w:tcPr>
+          <w:p>
+            <w:pPr>
+              <w:spacing w:line="240" w:lineRule="auto"/>
+            </w:pPr>
+            <w:r>
+              <w:rPr>
+                <w:rFonts w:ascii="Times New Roman" w:hAnsi="Times New Roman" w:eastAsia="Times New Roman"/>
+                <w:b w:val="0"/>
+                <w:caps w:val="0"/>
+                <w:sz w:val="22"/>
+              </w:rPr>
+              <w:t>MetadataTableUtil</w:t>
+            </w:r>
+          </w:p>
+        </w:tc>
+        <w:tc>
+          <w:tcPr>
+            <w:tcW w:type="dxa" w:w="1768"/>
+          </w:tcPr>
+          <w:p>
+            <w:pPr>
+              <w:spacing w:line="240" w:lineRule="auto"/>
+            </w:pPr>
+            <w:r>
+              <w:rPr>
+                <w:rFonts w:ascii="Times New Roman" w:hAnsi="Times New Roman" w:eastAsia="Times New Roman"/>
+                <w:b w:val="0"/>
+                <w:caps w:val="0"/>
+                <w:sz w:val="22"/>
+              </w:rPr>
+              <w:t>668</w:t>
+            </w:r>
+          </w:p>
+        </w:tc>
+        <w:tc>
+          <w:tcPr>
+            <w:tcW w:type="dxa" w:w="1768"/>
+          </w:tcPr>
+          <w:p>
+            <w:pPr>
+              <w:spacing w:line="240" w:lineRule="auto"/>
+            </w:pPr>
+            <w:r>
+              <w:rPr>
+                <w:rFonts w:ascii="Times New Roman" w:hAnsi="Times New Roman" w:eastAsia="Times New Roman"/>
+                <w:b w:val="0"/>
+                <w:caps w:val="0"/>
+                <w:sz w:val="22"/>
+              </w:rPr>
+              <w:t>52</w:t>
+            </w:r>
+          </w:p>
+        </w:tc>
+        <w:tc>
+          <w:tcPr>
+            <w:tcW w:type="dxa" w:w="1768"/>
+          </w:tcPr>
+          <w:p>
+            <w:pPr>
+              <w:spacing w:line="240" w:lineRule="auto"/>
+            </w:pPr>
+            <w:r>
+              <w:rPr>
+                <w:rFonts w:ascii="Times New Roman" w:hAnsi="Times New Roman" w:eastAsia="Times New Roman"/>
+                <w:b w:val="0"/>
+                <w:caps w:val="0"/>
+                <w:sz w:val="22"/>
+              </w:rPr>
+              <w:t>167</w:t>
+            </w:r>
+          </w:p>
+        </w:tc>
+        <w:tc>
+          <w:tcPr>
+            <w:tcW w:type="dxa" w:w="1768"/>
+          </w:tcPr>
+          <w:p>
+            <w:pPr>
+              <w:spacing w:line="240" w:lineRule="auto"/>
+            </w:pPr>
+            <w:r>
+              <w:rPr>
+                <w:rFonts w:ascii="Times New Roman" w:hAnsi="Times New Roman" w:eastAsia="Times New Roman"/>
+                <w:b w:val="0"/>
+                <w:caps w:val="0"/>
+                <w:sz w:val="22"/>
+              </w:rPr>
+              <w:t>0</w:t>
+            </w:r>
+          </w:p>
+        </w:tc>
+      </w:tr>
+      <w:tr>
+        <w:tc>
+          <w:tcPr>
+            <w:tcW w:type="dxa" w:w="1768"/>
+          </w:tcPr>
+          <w:p>
+            <w:pPr>
+              <w:spacing w:line="240" w:lineRule="auto"/>
+            </w:pPr>
+            <w:r>
+              <w:rPr>
+                <w:rFonts w:ascii="Times New Roman" w:hAnsi="Times New Roman" w:eastAsia="Times New Roman"/>
+                <w:b w:val="0"/>
+                <w:caps w:val="0"/>
+                <w:sz w:val="22"/>
+              </w:rPr>
+              <w:t>PhTypeUtil</w:t>
+            </w:r>
+          </w:p>
+        </w:tc>
+        <w:tc>
+          <w:tcPr>
+            <w:tcW w:type="dxa" w:w="1768"/>
+          </w:tcPr>
+          <w:p>
+            <w:pPr>
+              <w:spacing w:line="240" w:lineRule="auto"/>
+            </w:pPr>
+            <w:r>
+              <w:rPr>
+                <w:rFonts w:ascii="Times New Roman" w:hAnsi="Times New Roman" w:eastAsia="Times New Roman"/>
+                <w:b w:val="0"/>
+                <w:caps w:val="0"/>
+                <w:sz w:val="22"/>
+              </w:rPr>
+              <w:t>452</w:t>
+            </w:r>
+          </w:p>
+        </w:tc>
+        <w:tc>
+          <w:tcPr>
+            <w:tcW w:type="dxa" w:w="1768"/>
+          </w:tcPr>
+          <w:p>
+            <w:pPr>
+              <w:spacing w:line="240" w:lineRule="auto"/>
+            </w:pPr>
+            <w:r>
+              <w:rPr>
+                <w:rFonts w:ascii="Times New Roman" w:hAnsi="Times New Roman" w:eastAsia="Times New Roman"/>
+                <w:b w:val="0"/>
+                <w:caps w:val="0"/>
+                <w:sz w:val="22"/>
+              </w:rPr>
+              <w:t>35</w:t>
+            </w:r>
+          </w:p>
+        </w:tc>
+        <w:tc>
+          <w:tcPr>
+            <w:tcW w:type="dxa" w:w="1768"/>
+          </w:tcPr>
+          <w:p>
+            <w:pPr>
+              <w:spacing w:line="240" w:lineRule="auto"/>
+            </w:pPr>
+            <w:r>
+              <w:rPr>
+                <w:rFonts w:ascii="Times New Roman" w:hAnsi="Times New Roman" w:eastAsia="Times New Roman"/>
+                <w:b w:val="0"/>
+                <w:caps w:val="0"/>
+                <w:sz w:val="22"/>
+              </w:rPr>
+              <w:t>142</w:t>
+            </w:r>
+          </w:p>
+        </w:tc>
+        <w:tc>
+          <w:tcPr>
+            <w:tcW w:type="dxa" w:w="1768"/>
+          </w:tcPr>
+          <w:p>
+            <w:pPr>
+              <w:spacing w:line="240" w:lineRule="auto"/>
+            </w:pPr>
+            <w:r>
+              <w:rPr>
+                <w:rFonts w:ascii="Times New Roman" w:hAnsi="Times New Roman" w:eastAsia="Times New Roman"/>
+                <w:b w:val="0"/>
+                <w:caps w:val="0"/>
+                <w:sz w:val="22"/>
+              </w:rPr>
+              <w:t>0</w:t>
+            </w:r>
+          </w:p>
+        </w:tc>
+      </w:tr>
+      <w:tr>
+        <w:tc>
+          <w:tcPr>
+            <w:tcW w:type="dxa" w:w="1768"/>
+          </w:tcPr>
+          <w:p>
+            <w:pPr>
+              <w:spacing w:line="240" w:lineRule="auto"/>
+            </w:pPr>
+            <w:r>
+              <w:rPr>
+                <w:rFonts w:ascii="Times New Roman" w:hAnsi="Times New Roman" w:eastAsia="Times New Roman"/>
+                <w:b w:val="0"/>
+                <w:caps w:val="0"/>
+                <w:sz w:val="22"/>
+              </w:rPr>
+              <w:t>Strings</w:t>
+            </w:r>
+          </w:p>
+        </w:tc>
+        <w:tc>
+          <w:tcPr>
+            <w:tcW w:type="dxa" w:w="1768"/>
+          </w:tcPr>
+          <w:p>
+            <w:pPr>
+              <w:spacing w:line="240" w:lineRule="auto"/>
+            </w:pPr>
+            <w:r>
+              <w:rPr>
+                <w:rFonts w:ascii="Times New Roman" w:hAnsi="Times New Roman" w:eastAsia="Times New Roman"/>
+                <w:b w:val="0"/>
+                <w:caps w:val="0"/>
+                <w:sz w:val="22"/>
+              </w:rPr>
+              <w:t>241</w:t>
+            </w:r>
+          </w:p>
+        </w:tc>
+        <w:tc>
+          <w:tcPr>
+            <w:tcW w:type="dxa" w:w="1768"/>
+          </w:tcPr>
+          <w:p>
+            <w:pPr>
+              <w:spacing w:line="240" w:lineRule="auto"/>
+            </w:pPr>
+            <w:r>
+              <w:rPr>
+                <w:rFonts w:ascii="Times New Roman" w:hAnsi="Times New Roman" w:eastAsia="Times New Roman"/>
+                <w:b w:val="0"/>
+                <w:caps w:val="0"/>
+                <w:sz w:val="22"/>
+              </w:rPr>
+              <w:t>33</w:t>
+            </w:r>
+          </w:p>
+        </w:tc>
+        <w:tc>
+          <w:tcPr>
+            <w:tcW w:type="dxa" w:w="1768"/>
+          </w:tcPr>
+          <w:p>
+            <w:pPr>
+              <w:spacing w:line="240" w:lineRule="auto"/>
+            </w:pPr>
+            <w:r>
+              <w:rPr>
+                <w:rFonts w:ascii="Times New Roman" w:hAnsi="Times New Roman" w:eastAsia="Times New Roman"/>
+                <w:b w:val="0"/>
+                <w:caps w:val="0"/>
+                <w:sz w:val="22"/>
+              </w:rPr>
+              <w:t>98</w:t>
+            </w:r>
+          </w:p>
+        </w:tc>
+        <w:tc>
+          <w:tcPr>
+            <w:tcW w:type="dxa" w:w="1768"/>
+          </w:tcPr>
+          <w:p>
+            <w:pPr>
+              <w:spacing w:line="240" w:lineRule="auto"/>
+            </w:pPr>
+            <w:r>
+              <w:rPr>
+                <w:rFonts w:ascii="Times New Roman" w:hAnsi="Times New Roman" w:eastAsia="Times New Roman"/>
+                <w:b w:val="0"/>
+                <w:caps w:val="0"/>
+                <w:sz w:val="22"/>
+              </w:rPr>
+              <w:t>0</w:t>
+            </w:r>
+          </w:p>
+        </w:tc>
+      </w:tr>
+      <w:tr>
+        <w:tc>
+          <w:tcPr>
+            <w:tcW w:type="dxa" w:w="1768"/>
+          </w:tcPr>
+          <w:p>
+            <w:pPr>
+              <w:spacing w:line="240" w:lineRule="auto"/>
+            </w:pPr>
+            <w:r>
+              <w:rPr>
+                <w:rFonts w:ascii="Times New Roman" w:hAnsi="Times New Roman" w:eastAsia="Times New Roman"/>
+                <w:b w:val="0"/>
+                <w:caps w:val="0"/>
+                <w:sz w:val="22"/>
+              </w:rPr>
+              <w:t>TezClientUtils</w:t>
+            </w:r>
+          </w:p>
+        </w:tc>
+        <w:tc>
+          <w:tcPr>
+            <w:tcW w:type="dxa" w:w="1768"/>
+          </w:tcPr>
+          <w:p>
+            <w:pPr>
+              <w:spacing w:line="240" w:lineRule="auto"/>
+            </w:pPr>
+            <w:r>
+              <w:rPr>
+                <w:rFonts w:ascii="Times New Roman" w:hAnsi="Times New Roman" w:eastAsia="Times New Roman"/>
+                <w:b w:val="0"/>
+                <w:caps w:val="0"/>
+                <w:sz w:val="22"/>
+              </w:rPr>
+              <w:t>470</w:t>
+            </w:r>
+          </w:p>
+        </w:tc>
+        <w:tc>
+          <w:tcPr>
+            <w:tcW w:type="dxa" w:w="1768"/>
+          </w:tcPr>
+          <w:p>
+            <w:pPr>
+              <w:spacing w:line="240" w:lineRule="auto"/>
+            </w:pPr>
+            <w:r>
+              <w:rPr>
+                <w:rFonts w:ascii="Times New Roman" w:hAnsi="Times New Roman" w:eastAsia="Times New Roman"/>
+                <w:b w:val="0"/>
+                <w:caps w:val="0"/>
+                <w:sz w:val="22"/>
+              </w:rPr>
+              <w:t>16</w:t>
+            </w:r>
+          </w:p>
+        </w:tc>
+        <w:tc>
+          <w:tcPr>
+            <w:tcW w:type="dxa" w:w="1768"/>
+          </w:tcPr>
+          <w:p>
+            <w:pPr>
+              <w:spacing w:line="240" w:lineRule="auto"/>
+            </w:pPr>
+            <w:r>
+              <w:rPr>
+                <w:rFonts w:ascii="Times New Roman" w:hAnsi="Times New Roman" w:eastAsia="Times New Roman"/>
+                <w:b w:val="0"/>
+                <w:caps w:val="0"/>
+                <w:sz w:val="22"/>
+              </w:rPr>
+              <w:t>93</w:t>
+            </w:r>
+          </w:p>
+        </w:tc>
+        <w:tc>
+          <w:tcPr>
+            <w:tcW w:type="dxa" w:w="1768"/>
+          </w:tcPr>
+          <w:p>
+            <w:pPr>
+              <w:spacing w:line="240" w:lineRule="auto"/>
+            </w:pPr>
+            <w:r>
+              <w:rPr>
+                <w:rFonts w:ascii="Times New Roman" w:hAnsi="Times New Roman" w:eastAsia="Times New Roman"/>
+                <w:b w:val="0"/>
+                <w:caps w:val="0"/>
+                <w:sz w:val="22"/>
+              </w:rPr>
+              <w:t>0</w:t>
+            </w:r>
+          </w:p>
+        </w:tc>
+      </w:tr>
+    </w:tbl>
+    <w:p>
+      <w:pPr>
+        <w:spacing w:line="240" w:lineRule="auto" w:after="0"/>
+      </w:pPr>
+    </w:p>
+    <w:p>
+      <w:pPr>
+        <w:spacing w:line="360" w:lineRule="auto"/>
+        <w:ind w:firstLine="360"/>
+        <w:jc w:val="both"/>
+      </w:pPr>
+      <w:r>
+        <w:rPr>
+          <w:rFonts w:ascii="Times New Roman" w:hAnsi="Times New Roman" w:eastAsia="Times New Roman"/>
+          <w:b w:val="0"/>
+          <w:caps w:val="0"/>
+          <w:sz w:val="24"/>
+        </w:rPr>
+        <w:t>Janë 19 mospërputhje të tilla: klasa që e kalojnë klauzolën e kompleksitetit dhe ndalen vetëm te kohezioni. Prej tyre 19 u riparsuan nga korpusi dhe 17 dolën me më pak se dy metoda publike të instancës, pra me TCC të papërcaktuar e jo me kohezion të matur. Emrat e tregojnë vetë llojin: klasa ndihmëse krejt statike, ku kolona e fundit është zero. Këto janë pikërisht klasat që një rishikues i quan blob pa hezitim, dhe janë të paarritshme nga një strategji e ndërtuar mbi kohezionin mes metodave të instancës.</w:t>
+      </w:r>
+    </w:p>
+    <w:p>
+      <w:pPr>
+        <w:spacing w:line="360" w:lineRule="auto"/>
+        <w:ind w:firstLine="360"/>
+        <w:jc w:val="both"/>
+      </w:pPr>
+      <w:r>
+        <w:rPr>
+          <w:rFonts w:ascii="Times New Roman" w:hAnsi="Times New Roman" w:eastAsia="Times New Roman"/>
+          <w:b w:val="0"/>
+          <w:caps w:val="0"/>
+          <w:sz w:val="24"/>
+        </w:rPr>
+        <w:t>Numri mbetet i vogël përballë tërësisë, 19 nga 315, ndaj nuk e shpjegon recall-in e ulët dhe nuk u trajtua si defekt për t'u riparuar. Ndryshimi i TCC-së do të shkëpuste përkufizimin nga burimi i tij dhe do të detyronte rigjenerimin e çdo numri të raportuar, për një fitim që nuk e kalon 0.054 te recall-i. Kufizimi raportohet i tillë siç është te Nënkapitulli 6.3.</w:t>
+      </w:r>
+    </w:p>
+    <w:p>
+      <w:pPr>
+        <w:spacing w:line="360" w:lineRule="auto"/>
+        <w:ind w:firstLine="360"/>
+        <w:jc w:val="both"/>
+      </w:pPr>
+      <w:r>
+        <w:rPr>
+          <w:rFonts w:ascii="Times New Roman" w:hAnsi="Times New Roman" w:eastAsia="Times New Roman"/>
+          <w:b w:val="0"/>
+          <w:caps w:val="0"/>
+          <w:sz w:val="24"/>
+        </w:rPr>
+        <w:t>Përfundimi i këtij nënkapitulli është për të vërtetën bazë dhe jo për detektorin, dhe pikërisht prandaj duhet lexuar me kujdes. Ai nuk thotë se rishikuesit gabuan: një zhvillues që e njeh kodin mund ta quajë me plot të drejtë problematike një klasë të vogël, për arsye që asnjë metrikë strukturore nuk i mat. Thotë diçka më të ngushtë e më të dobishme, që recall-i i matur kundrejt MLCQ-së nuk është i njëjti krahasim që një lexues supozon: ai mat sa shpesh një strategji e madhësisë dhe e kohezionit përputhet me një gjykim njerëzor që, në shumicën e rasteve të etiketuara, nuk është marrë mbi bazën e madhësisë.</w:t>
+      </w:r>
+    </w:p>
+    <w:p>
+      <w:pPr>
         <w:pStyle w:val="Heading1"/>
         <w:pageBreakBefore/>
       </w:pPr>
@@ -18586,6 +21159,38 @@
           <w:sz w:val="24"/>
         </w:rPr>
         <w:t>Ashpërsia që sistemi e derivon nuk e riprodhon gjykimin e rishikuesve. Ajo u ndërtua në shkallën e MLCQ-së pikërisht që të krahasohej me ta pa hap përkthimi, dhe kur krahasimi u bë, pajtimi doli pranë rastësisë për tri nga katër erërat, me mbivlerësim sistematik. Pretendimi hiqet: ajo mbetet renditje e brendshme e mjetit dhe jo riprodhim i gjykimit njerëzor.</w:t>
+      </w:r>
+    </w:p>
+    <w:p>
+      <w:pPr>
+        <w:spacing w:line="360" w:lineRule="auto"/>
+        <w:ind w:firstLine="360"/>
+        <w:jc w:val="both"/>
+      </w:pPr>
+      <w:r>
+        <w:rPr>
+          <w:rFonts w:ascii="Times New Roman" w:hAnsi="Times New Roman" w:eastAsia="Times New Roman"/>
+          <w:b w:val="0"/>
+          <w:caps w:val="0"/>
+          <w:sz w:val="24"/>
+        </w:rPr>
+        <w:t>Recall-i i raportuar kundrejt MLCQ-së për Blob-in nuk mat atë që emri i tij sugjeron. Nga 315 raste që rishikuesit i quajtën Blob dhe strategjia nuk i ndezi, 65 nuk janë më të mëdha se klasa mesatare që vetë rishikuesit e quajtën të pastër, dhe shtrirja e mospërputhjeve nuk mbivendoset fare me atë të kapjeve te asnjëra prej metrikave të madhësisë. Asnjë metrikë e vetme klase nuk i ndan dot mospërputhjet nga klasat e pastra: më e mira arrin 0.773 aty ku 0.50 do të thoshte asnjë informacion. Pasoja është se shifra mat sa shpesh një strategji e madhësisë dhe e kohezionit përputhet me një gjykim njerëzor që, te shumica e rasteve të etiketuara, nuk është marrë mbi bazën e madhësisë. Kjo nuk e përmirëson detektorin dhe nuk e fajëson rishikuesin; e ndryshon atë që shifra provon.</w:t>
+      </w:r>
+    </w:p>
+    <w:p>
+      <w:pPr>
+        <w:spacing w:line="360" w:lineRule="auto"/>
+        <w:ind w:firstLine="360"/>
+        <w:jc w:val="both"/>
+      </w:pPr>
+      <w:r>
+        <w:rPr>
+          <w:rFonts w:ascii="Times New Roman" w:hAnsi="Times New Roman" w:eastAsia="Times New Roman"/>
+          <w:b w:val="0"/>
+          <w:caps w:val="0"/>
+          <w:sz w:val="24"/>
+        </w:rPr>
+        <w:t>Një tavan i dytë është i matjes dhe jo i etiketave, dhe u raportua në vend që të riparohej. TCC-ja është e papërcaktuar për një klasë me më pak se dy metoda publike të instancës, dhe llogaritësi e zgjidh boshllëkun me vlerën maksimale, të cilën asnjë klauzolë e God Class-it nuk e pranon. Klasat ndihmëse krejt statike e mbartin atë vlerë nga vetë ndërtimi: 17 nga 19 rastet e tilla u riparsuan dhe dolën pikërisht të asaj forme. Ndreqja do të kërkonte shkëputjen e TCC-së nga përkufizimi i botuar që e citon, ndaj u zgjodh raportimi.</w:t>
       </w:r>
     </w:p>
     <w:p>
@@ -19440,7 +22045,7 @@
           <w:caps w:val="0"/>
           <w:sz w:val="22"/>
         </w:rPr>
-        <w:t>Tabela 24. Strategjitë e detektimit dhe burimet e tyre</w:t>
+        <w:t>Tabela 27. Strategjitë e detektimit dhe burimet e tyre</w:t>
       </w:r>
     </w:p>
     <w:tbl>
@@ -20221,7 +22826,7 @@
           <w:caps w:val="0"/>
           <w:sz w:val="22"/>
         </w:rPr>
-        <w:t>Tabela 25. Kuantifikuesit e përgjithshëm</w:t>
+        <w:t>Tabela 28. Kuantifikuesit e përgjithshëm</w:t>
       </w:r>
     </w:p>
     <w:tbl>
@@ -20668,7 +23273,7 @@
           <w:caps w:val="0"/>
           <w:sz w:val="22"/>
         </w:rPr>
-        <w:t>Tabela 26. Pragjet e përdorura</w:t>
+        <w:t>Tabela 29. Pragjet e përdorura</w:t>
       </w:r>
     </w:p>
     <w:tbl>
@@ -21689,7 +24294,7 @@
           <w:caps w:val="0"/>
           <w:sz w:val="22"/>
         </w:rPr>
-        <w:t>Tabela 27. Metrikat sipas nivelit</w:t>
+        <w:t>Tabela 30. Metrikat sipas nivelit</w:t>
       </w:r>
     </w:p>
     <w:tbl>
@@ -21870,7 +24475,7 @@
           <w:caps w:val="0"/>
           <w:sz w:val="22"/>
         </w:rPr>
-        <w:t>Tabela 28. Çka propozohet dhe çka aplikohet</w:t>
+        <w:t>Tabela 31. Çka propozohet dhe çka aplikohet</w:t>
       </w:r>
     </w:p>
     <w:tbl>
@@ -22449,7 +25054,7 @@
           <w:caps w:val="0"/>
           <w:sz w:val="22"/>
         </w:rPr>
-        <w:t>Tabela 29. Arsyet e refuzimit</w:t>
+        <w:t>Tabela 32. Arsyet e refuzimit</w:t>
       </w:r>
     </w:p>
     <w:tbl>
@@ -22910,7 +25515,7 @@
           <w:caps w:val="0"/>
           <w:sz w:val="22"/>
         </w:rPr>
-        <w:t>Tabela 30. Radha e ekzekutimit</w:t>
+        <w:t>Tabela 33. Radha e ekzekutimit</w:t>
       </w:r>
     </w:p>
     <w:tbl>
@@ -24563,6 +27168,84 @@
           </w:p>
         </w:tc>
       </w:tr>
+      <w:tr>
+        <w:tc>
+          <w:tcPr>
+            <w:tcW w:type="dxa" w:w="2209"/>
+          </w:tcPr>
+          <w:p>
+            <w:pPr>
+              <w:spacing w:line="240" w:lineRule="auto"/>
+            </w:pPr>
+            <w:r>
+              <w:rPr>
+                <w:rFonts w:ascii="Times New Roman" w:hAnsi="Times New Roman" w:eastAsia="Times New Roman"/>
+                <w:b w:val="0"/>
+                <w:caps w:val="0"/>
+                <w:sz w:val="22"/>
+              </w:rPr>
+              <w:t>21</w:t>
+            </w:r>
+          </w:p>
+        </w:tc>
+        <w:tc>
+          <w:tcPr>
+            <w:tcW w:type="dxa" w:w="2209"/>
+          </w:tcPr>
+          <w:p>
+            <w:pPr>
+              <w:spacing w:line="240" w:lineRule="auto"/>
+            </w:pPr>
+            <w:r>
+              <w:rPr>
+                <w:rFonts w:ascii="Times New Roman" w:hAnsi="Times New Roman" w:eastAsia="Times New Roman"/>
+                <w:b w:val="0"/>
+                <w:caps w:val="0"/>
+                <w:sz w:val="22"/>
+              </w:rPr>
+              <w:t>blob_recall.py</w:t>
+            </w:r>
+          </w:p>
+        </w:tc>
+        <w:tc>
+          <w:tcPr>
+            <w:tcW w:type="dxa" w:w="2209"/>
+          </w:tcPr>
+          <w:p>
+            <w:pPr>
+              <w:spacing w:line="240" w:lineRule="auto"/>
+            </w:pPr>
+            <w:r>
+              <w:rPr>
+                <w:rFonts w:ascii="Times New Roman" w:hAnsi="Times New Roman" w:eastAsia="Times New Roman"/>
+                <w:b w:val="0"/>
+                <w:caps w:val="0"/>
+                <w:sz w:val="22"/>
+              </w:rPr>
+              <w:t>çfarë mbetet pa u kapur te Blob-i</w:t>
+            </w:r>
+          </w:p>
+        </w:tc>
+        <w:tc>
+          <w:tcPr>
+            <w:tcW w:type="dxa" w:w="2209"/>
+          </w:tcPr>
+          <w:p>
+            <w:pPr>
+              <w:spacing w:line="240" w:lineRule="auto"/>
+            </w:pPr>
+            <w:r>
+              <w:rPr>
+                <w:rFonts w:ascii="Times New Roman" w:hAnsi="Times New Roman" w:eastAsia="Times New Roman"/>
+                <w:b w:val="0"/>
+                <w:caps w:val="0"/>
+                <w:sz w:val="22"/>
+              </w:rPr>
+              <w:t>sekonda</w:t>
+            </w:r>
+          </w:p>
+        </w:tc>
+      </w:tr>
     </w:tbl>
     <w:p>
       <w:pPr>
@@ -24597,7 +27280,7 @@
           <w:caps w:val="0"/>
           <w:sz w:val="22"/>
         </w:rPr>
-        <w:t>Tabela 31. Commit-i që prodhoi çdo skedar rezultati</w:t>
+        <w:t>Tabela 34. Commit-i që prodhoi çdo skedar rezultati</w:t>
       </w:r>
     </w:p>
     <w:tbl>
@@ -24646,6 +27329,46 @@
                 <w:sz w:val="22"/>
               </w:rPr>
               <w:t>Commit-i</w:t>
+            </w:r>
+          </w:p>
+        </w:tc>
+      </w:tr>
+      <w:tr>
+        <w:tc>
+          <w:tcPr>
+            <w:tcW w:type="dxa" w:w="4419"/>
+          </w:tcPr>
+          <w:p>
+            <w:pPr>
+              <w:spacing w:line="240" w:lineRule="auto"/>
+            </w:pPr>
+            <w:r>
+              <w:rPr>
+                <w:rFonts w:ascii="Times New Roman" w:hAnsi="Times New Roman" w:eastAsia="Times New Roman"/>
+                <w:b w:val="0"/>
+                <w:caps w:val="0"/>
+                <w:sz w:val="22"/>
+              </w:rPr>
+              <w:t>blob_recall.json</w:t>
+            </w:r>
+          </w:p>
+        </w:tc>
+        <w:tc>
+          <w:tcPr>
+            <w:tcW w:type="dxa" w:w="4419"/>
+          </w:tcPr>
+          <w:p>
+            <w:pPr>
+              <w:spacing w:line="240" w:lineRule="auto"/>
+            </w:pPr>
+            <w:r>
+              <w:rPr>
+                <w:rFonts w:ascii="Times New Roman" w:hAnsi="Times New Roman" w:eastAsia="Times New Roman"/>
+                <w:b w:val="0"/>
+                <w:caps w:val="0"/>
+                <w:sz w:val="22"/>
+              </w:rPr>
+              <w:t>1b96a94105</w:t>
             </w:r>
           </w:p>
         </w:tc>

</xml_diff>

<commit_message>
Pershtate punimin me udhezimet dhe udhezuesin e UBT-se
Permbajtja ishte bosh ne dokument dhe do te listonte abstraktin dhe mirenjohjen,
abstrakti zinte dy faqe, dhe lista e tabelave fillonte ne faqe te re. Kapitulli 3
emerton tani situaten ideale, realitetin dhe fokusin, dhe metodologjia ka
konsideratat etike. Kontrolli i formatimit i mban rregullat e reja. VD-112.
</commit_message>
<xml_diff>
--- a/docs/thesis/Punim_Diplome_Florent_Latifi.docx
+++ b/docs/thesis/Punim_Diplome_Florent_Latifi.docx
@@ -349,7 +349,7 @@
           <w:caps w:val="0"/>
           <w:sz w:val="24"/>
         </w:rPr>
-        <w:t>Viti akademik 2025 - 2026</w:t>
+        <w:t>Viti akademik 2025 – 2026</w:t>
       </w:r>
     </w:p>
     <w:p>
@@ -526,7 +526,7 @@
     </w:p>
     <w:p>
       <w:pPr>
-        <w:pStyle w:val="Heading1"/>
+        <w:pStyle w:val="Titullballinë"/>
         <w:pageBreakBefore/>
       </w:pPr>
       <w:r>
@@ -552,7 +552,7 @@
           <w:caps w:val="0"/>
           <w:sz w:val="24"/>
         </w:rPr>
-        <w:t>Cilësia e brendshme e kodit burimor përcakton sa lehtë një sistem softuerik mund të kuptohet, të ndryshohet dhe të zgjerohet gjatë gjithë jetës së tij. Code smells janë simptoma të strukturës së dobët të dizajnit që nuk shkaktojnë gabime të drejtpërdrejta, por e rrisin ndjeshëm koston e ndryshimeve të ardhshme. Identifikimi manual i tyre nuk është i realizueshëm në sisteme të mëdha, ndërsa mjetet ekzistuese të analizës statike mbështeten kryesisht në pragje fikse mbi metrika të veçuara, çka prodhon numër të konsiderueshëm alarmesh të rreme dhe ndalet te identifikimi i problemit pa propozuar zgjidhje.</w:t>
+        <w:t>Code smells janë simptoma të dizajnit të dobët që nuk shkaktojnë gabime, por e rrisin koston e çdo ndryshimi të ardhshëm. Identifikimi manual i tyre nuk shkallëzohet në sisteme të mëdha, ndërsa mjetet ekzistuese të analizës statike mbështeten kryesisht në pragje fikse mbi metrika të veçuara dhe ndalen te njoftimi, pa propozuar zgjidhje.</w:t>
       </w:r>
     </w:p>
     <w:p>
@@ -584,7 +584,7 @@
           <w:caps w:val="0"/>
           <w:sz w:val="24"/>
         </w:rPr>
-        <w:t>Strategjitë e publikuara dolën të sakta por të kursyera: precizion 0.520 deri 0.872 me recall 0.100 deri 0.440. Të ndara sipas ashpërsisë, ato degradojnë me hijeshi, duke i kapur rastet e rënda shumë më mirë se ato të lehtat. Klasifikuesit i tejkaluan qartë, me MCC 0.488 deri 0.713 kundrejt 0.232 deri 0.580, dhe i rizbuluan pjesërisht metrikat që përdorin vetë strategjitë. Intervalet e besimit me bootstrap sipas depos tregojnë se ajo përparësi e kalon zeron te të katër erërat.</w:t>
+        <w:t>Strategjitë e publikuara dolën të sakta por të kursyera: precizion 0.520 deri 0.872 me recall 0.100 deri 0.440. Klasifikuesit i tejkaluan qartë, me MCC 0.488 deri 0.713 kundrejt 0.232 deri 0.580. Intervalet e besimit me bootstrap sipas depos tregojnë se ajo përparësi e kalon zeron te të katër erërat.</w:t>
       </w:r>
     </w:p>
     <w:p>
@@ -600,7 +600,7 @@
           <w:caps w:val="0"/>
           <w:sz w:val="24"/>
         </w:rPr>
-        <w:t>Dy rezultate janë negative dhe raportohen si të tilla. Ashpërsia që sistemi e derivon nga teprica mbi pragje nuk e riprodhon gjykimin e rishikuesve: pajtimi i matur me kappa me peshë qëndron te 0.007 deri 0.293, dhe gabimi është i njëanshëm nga mbivlerësimi. Po ashtu, vetë rishikuesit pajtohen mes tyre me MCC 0.022 deri 0.238, çka tregon se një pjesë e pareduktueshme e gabimit të çdo detektori i takon përkufizimit të erës dhe jo detektorit. Motori i refaktorimit automatizon 3 transformime dhe transformoi 20.4% të vendeve të detektuara, ku shumica e refuzimeve vjen nga forma e kodit dhe nga rrjedha e kontrollit; refuzimi trajtohet si rezultat i saktë dhe numërohet. Kontributi kryesor nuk është një shifër e vetme, por një hark i plotë e i riprodhueshëm nga korpusi te rezultati.</w:t>
+        <w:t>Dy rezultate janë negative dhe raportohen si të tilla. Ashpërsia që sistemi e derivon nga teprica mbi pragje nuk e riprodhon gjykimin e rishikuesve: pajtimi i matur me kappa me peshë qëndron te 0.007 deri 0.293, dhe gabimi është i njëanshëm nga mbivlerësimi. Po ashtu, vetë rishikuesit pajtohen mes tyre me MCC 0.022 deri 0.238, çka tregon se një pjesë e pareduktueshme e gabimit të çdo detektori i takon përkufizimit të erës dhe jo detektorit. Motori i refaktorimit automatizon 3 transformime dhe transformoi 20.4% të vendeve të detektuara; refuzimi trajtohet si rezultat i saktë dhe numërohet. Kontributi kryesor nuk është një shifër e vetme, por një hark i plotë e i riprodhueshëm nga korpusi te rezultati.</w:t>
       </w:r>
     </w:p>
     <w:p>
@@ -626,7 +626,7 @@
     </w:p>
     <w:p>
       <w:pPr>
-        <w:pStyle w:val="Heading1"/>
+        <w:pStyle w:val="Titullballinë"/>
         <w:pageBreakBefore/>
       </w:pPr>
       <w:r>
@@ -657,7 +657,7 @@
     </w:p>
     <w:p>
       <w:pPr>
-        <w:pStyle w:val="Heading1"/>
+        <w:pStyle w:val="Titullballinë"/>
         <w:pageBreakBefore/>
       </w:pPr>
       <w:r>
@@ -834,7 +834,7 @@
     <w:p>
       <w:pPr>
         <w:pStyle w:val="Heading1"/>
-        <w:pageBreakBefore/>
+        <w:pageBreakBefore w:val="0"/>
       </w:pPr>
       <w:r>
         <w:rPr>
@@ -2862,6 +2862,81 @@
           <w:sz w:val="28"/>
         </w:rPr>
         <w:t>3 Deklarimi i problemit</w:t>
+      </w:r>
+    </w:p>
+    <w:p>
+      <w:pPr>
+        <w:spacing w:line="360" w:lineRule="auto"/>
+        <w:ind w:firstLine="360"/>
+        <w:jc w:val="both"/>
+      </w:pPr>
+      <w:r>
+        <w:rPr>
+          <w:rFonts w:ascii="Times New Roman" w:hAnsi="Times New Roman" w:eastAsia="Times New Roman"/>
+          <w:b/>
+          <w:caps w:val="0"/>
+          <w:sz w:val="24"/>
+        </w:rPr>
+        <w:t>Situata ideale.</w:t>
+      </w:r>
+      <w:r>
+        <w:rPr>
+          <w:rFonts w:ascii="Times New Roman" w:hAnsi="Times New Roman" w:eastAsia="Times New Roman"/>
+          <w:b w:val="0"/>
+          <w:caps w:val="0"/>
+          <w:sz w:val="24"/>
+        </w:rPr>
+        <w:t xml:space="preserve"> Për çdo pjesë të kodit, një ekip zhvillimi do të duhej të dinte nëse ajo mban një problem dizajni, sa i rëndë është ai, dhe cili transformim e heq pa ndryshuar sjelljen. Ky gjykim do të duhej të ishte i përsëritshëm dhe i matur kundrejt vlerësimit të zhvilluesve me përvojë.</w:t>
+      </w:r>
+    </w:p>
+    <w:p>
+      <w:pPr>
+        <w:spacing w:line="360" w:lineRule="auto"/>
+        <w:ind w:firstLine="360"/>
+        <w:jc w:val="both"/>
+      </w:pPr>
+      <w:r>
+        <w:rPr>
+          <w:rFonts w:ascii="Times New Roman" w:hAnsi="Times New Roman" w:eastAsia="Times New Roman"/>
+          <w:b/>
+          <w:caps w:val="0"/>
+          <w:sz w:val="24"/>
+        </w:rPr>
+        <w:t>Realiteti.</w:t>
+      </w:r>
+      <w:r>
+        <w:rPr>
+          <w:rFonts w:ascii="Times New Roman" w:hAnsi="Times New Roman" w:eastAsia="Times New Roman"/>
+          <w:b w:val="0"/>
+          <w:caps w:val="0"/>
+          <w:sz w:val="24"/>
+        </w:rPr>
+        <w:t xml:space="preserve"> Identifikimi manual nuk shkallëzohet dhe varet nga shqyrtuesi (Nënkapitulli 1.2). Mjetet ekzistuese mbështeten në pragje fikse mbi metrika të veçuara dhe ndalen te njoftimi. Qasjet me rregulla dhe ato me mësim makine rrallë vlerësohen mbi të njëjtën të vërtetë bazë, dhe pyetja nëse një erë e detektuar mund edhe të ndreqet automatikisht mbetet pa përgjigje empirike (Nënkapitulli 2.6).</w:t>
+      </w:r>
+    </w:p>
+    <w:p>
+      <w:pPr>
+        <w:spacing w:line="360" w:lineRule="auto"/>
+        <w:ind w:firstLine="360"/>
+        <w:jc w:val="both"/>
+      </w:pPr>
+      <w:r>
+        <w:rPr>
+          <w:rFonts w:ascii="Times New Roman" w:hAnsi="Times New Roman" w:eastAsia="Times New Roman"/>
+          <w:b/>
+          <w:caps w:val="0"/>
+          <w:sz w:val="24"/>
+        </w:rPr>
+        <w:t>Fokusi i punës.</w:t>
+      </w:r>
+      <w:r>
+        <w:rPr>
+          <w:rFonts w:ascii="Times New Roman" w:hAnsi="Times New Roman" w:eastAsia="Times New Roman"/>
+          <w:b w:val="0"/>
+          <w:caps w:val="0"/>
+          <w:sz w:val="24"/>
+        </w:rPr>
+        <w:t xml:space="preserve"> Ky punim i krahason dy qasjet e detektimit mbi të njëjtin korpus të etiketuar nga profesionistë, me ndarje sipas depos dhe me të njëjtin kod pikëzimi, dhe mat sa nga vendet e detektuara mund të rishkruhen automatikisht pa sjellë gabime të reja kompilimi.</w:t>
       </w:r>
     </w:p>
     <w:p>
@@ -3857,6 +3932,68 @@
           <w:sz w:val="24"/>
         </w:rPr>
         <w:t>Kalimi i shtrenjtë mbi korpusin — rreth 95 minuta për 690 mijë skedarë — bëhet një herë dhe prodhon një tabelë veçorish që komitohet. Pragjet nuk hyjnë në atë kalim, ndaj analiza e ndjeshmërisë rirendit detektorët mbi rreshtat e ruajtur në sekonda. Pa këtë ndarje, një fshirje me njëzet konfigurime do të kushtonte mbi tridhjetë orë dhe nuk do të bëhej.</w:t>
+      </w:r>
+    </w:p>
+    <w:p>
+      <w:pPr>
+        <w:pStyle w:val="Heading2"/>
+      </w:pPr>
+      <w:r>
+        <w:rPr>
+          <w:rFonts w:ascii="Times New Roman" w:hAnsi="Times New Roman" w:eastAsia="Times New Roman"/>
+          <w:b/>
+          <w:caps w:val="0"/>
+          <w:sz w:val="24"/>
+        </w:rPr>
+        <w:t>4.8 Konsideratat etike</w:t>
+      </w:r>
+    </w:p>
+    <w:p>
+      <w:pPr>
+        <w:spacing w:line="360" w:lineRule="auto"/>
+        <w:ind w:firstLine="360"/>
+        <w:jc w:val="both"/>
+      </w:pPr>
+      <w:r>
+        <w:rPr>
+          <w:rFonts w:ascii="Times New Roman" w:hAnsi="Times New Roman" w:eastAsia="Times New Roman"/>
+          <w:b w:val="0"/>
+          <w:caps w:val="0"/>
+          <w:sz w:val="24"/>
+        </w:rPr>
+        <w:t>Punimi nuk mbledh të dhëna nga njerëz. Të gjitha të dhënat që përdor janë publike: gjykimet e dataset-it MLCQ, të mbledhura dhe të publikuara nga autorët e tij (Madeyski &amp; Lewowski, 2020), dhe kodi i depove Java me burim të hapur të cilave u referohen mostrat.</w:t>
+      </w:r>
+    </w:p>
+    <w:p>
+      <w:pPr>
+        <w:spacing w:line="360" w:lineRule="auto"/>
+        <w:ind w:firstLine="360"/>
+        <w:jc w:val="both"/>
+      </w:pPr>
+      <w:r>
+        <w:rPr>
+          <w:rFonts w:ascii="Times New Roman" w:hAnsi="Times New Roman" w:eastAsia="Times New Roman"/>
+          <w:b w:val="0"/>
+          <w:caps w:val="0"/>
+          <w:sz w:val="24"/>
+        </w:rPr>
+        <w:t>Kodi i këtyre depove përdoret vetëm si objekt matjeje. Ai nuk ekzekutohet kurrë: analiza e lexon si tekst, dhe verifikimi e kompilon me javac pa e nisur. Korpusi nuk shpërndahet bashkë me punimin, sepse mbahet jashtë depos së kodit; kush do t'i riprodhojë rezultatet e shkarkon nga burimet origjinale me skriptin e parë të Shtojcës 8.5.</w:t>
+      </w:r>
+    </w:p>
+    <w:p>
+      <w:pPr>
+        <w:spacing w:line="360" w:lineRule="auto"/>
+        <w:ind w:firstLine="360"/>
+        <w:jc w:val="both"/>
+      </w:pPr>
+      <w:r>
+        <w:rPr>
+          <w:rFonts w:ascii="Times New Roman" w:hAnsi="Times New Roman" w:eastAsia="Times New Roman"/>
+          <w:b w:val="0"/>
+          <w:caps w:val="0"/>
+          <w:sz w:val="24"/>
+        </w:rPr>
+        <w:t>Rezultatet negative raportohen njësoj si ato pozitive, dhe asnjë prag, metrikë apo detektor nuk është rregulluar që një rezultat të dalë më mirë. Ky është kushti që numrat e Kapitullit 5 të lexohen si matje dhe jo si argument.</w:t>
       </w:r>
     </w:p>
     <w:p>
@@ -40192,6 +40329,21 @@
       </w:tcPr>
     </w:tblStylePr>
   </w:style>
+  <w:style w:type="paragraph" w:customStyle="1" w:styleId="Titullballinë">
+    <w:name w:val="Titull ballinë"/>
+    <w:basedOn w:val="Normal"/>
+    <w:pPr>
+      <w:keepNext/>
+      <w:spacing w:line="360" w:lineRule="auto" w:before="240" w:after="120"/>
+      <w:jc w:val="left"/>
+    </w:pPr>
+    <w:rPr>
+      <w:rFonts w:ascii="Times New Roman" w:hAnsi="Times New Roman" w:eastAsia="Times New Roman"/>
+      <w:b/>
+      <w:caps/>
+      <w:sz w:val="28"/>
+    </w:rPr>
+  </w:style>
 </w:styles>
 </file>
 

</xml_diff>